<commit_message>
fix: regen offer formatting — recompose with docxcompose (preserve body styles)
The raw element-copy kept the regen body text but not its styles, so it rendered
in the cover template's Calibri 11 instead of RegenOffer1's Times New Roman 12
(and wrong heading/table styles) — 'terrible formatting'. Rebuild the template
with docxcompose, which merges the two docs' styles/numbering/images with
collision renaming: the blower cover letter keeps Calibri, the regen technical
body keeps its Times New Roman styling, headings, and tables.

Verified: body now renders 909 Times-New-Roman runs (was Calibri), diagrams +
price/burner templatization intact, offer fills correctly.

Co-Authored-By: Claude Opus 4.8 (1M context) <noreply@anthropic.com>
</commit_message>
<xml_diff>
--- a/Regen_Offer_Template.docx
+++ b/Regen_Offer_Template.docx
@@ -12,7 +12,7 @@
           <wp:inline distT="0" distB="0" distL="0" distR="0">
             <wp:extent cx="3619500" cy="4680000"/>
             <wp:effectExtent t="0" r="0" b="0" l="0"/>
-            <wp:docPr id="1001" name="ENCON" descr="ENCON logo" title="ENCON"/>
+            <wp:docPr id="1" name="ENCON" descr="ENCON logo" title="ENCON"/>
             <wp:cNvGraphicFramePr>
               <a:graphicFrameLocks xmlns:a="http://schemas.openxmlformats.org/drawingml/2006/main" noChangeAspect="1"/>
             </wp:cNvGraphicFramePr>
@@ -20,7 +20,7 @@
               <a:graphicData uri="http://schemas.openxmlformats.org/drawingml/2006/picture">
                 <pic:pic xmlns:pic="http://schemas.openxmlformats.org/drawingml/2006/picture">
                   <pic:nvPicPr>
-                    <pic:cNvPr id="0" name="" descr=""/>
+                    <pic:cNvPr id="1" name="" descr=""/>
                     <pic:cNvPicPr>
                       <a:picLocks noChangeAspect="1" noChangeArrowheads="1"/>
                     </pic:cNvPicPr>
@@ -793,7 +793,7 @@
         <w:drawing>
           <wp:inline xmlns:a="http://schemas.openxmlformats.org/drawingml/2006/main" xmlns:pic="http://schemas.openxmlformats.org/drawingml/2006/picture">
             <wp:extent cx="1800000" cy="1166834"/>
-            <wp:docPr id="1002" name="Picture 1002"/>
+            <wp:docPr id="2" name="Picture 1002"/>
             <wp:cNvGraphicFramePr>
               <a:graphicFrameLocks noChangeAspect="1"/>
             </wp:cNvGraphicFramePr>
@@ -801,7 +801,7 @@
               <a:graphicData uri="http://schemas.openxmlformats.org/drawingml/2006/picture">
                 <pic:pic>
                   <pic:nvPicPr>
-                    <pic:cNvPr id="0" name="cand3.jpg"/>
+                    <pic:cNvPr id="2" name="cand3.jpg"/>
                     <pic:cNvPicPr/>
                   </pic:nvPicPr>
                   <pic:blipFill>
@@ -985,7 +985,7 @@
                 <wp:lineTo x="0" y="0"/>
               </wp:wrapPolygon>
             </wp:wrapTight>
-            <wp:docPr id="6" name="Picture 6" descr="A close up of a map&#10;&#10;Description automatically generated"/>
+            <wp:docPr id="3" name="Picture 6" descr="A close up of a map&#10;&#10;Description automatically generated"/>
             <wp:cNvGraphicFramePr>
               <a:graphicFrameLocks xmlns:a="http://schemas.openxmlformats.org/drawingml/2006/main" noChangeAspect="1"/>
             </wp:cNvGraphicFramePr>
@@ -993,7 +993,7 @@
               <a:graphicData uri="http://schemas.openxmlformats.org/drawingml/2006/picture">
                 <pic:pic xmlns:pic="http://schemas.openxmlformats.org/drawingml/2006/picture">
                   <pic:nvPicPr>
-                    <pic:cNvPr id="4" name="Image 06-05-20 at 2.09 PM.jpg"/>
+                    <pic:cNvPr id="3" name="Image 06-05-20 at 2.09 PM.jpg"/>
                     <pic:cNvPicPr/>
                   </pic:nvPicPr>
                   <pic:blipFill>
@@ -2162,7 +2162,7 @@
                 <wp:lineTo x="0" y="0"/>
               </wp:wrapPolygon>
             </wp:wrapTight>
-            <wp:docPr id="5" name="Picture 5" descr="A close up of a device&#10;&#10;Description automatically generated"/>
+            <wp:docPr id="4" name="Picture 5" descr="A close up of a device&#10;&#10;Description automatically generated"/>
             <wp:cNvGraphicFramePr>
               <a:graphicFrameLocks xmlns:a="http://schemas.openxmlformats.org/drawingml/2006/main" noChangeAspect="1"/>
             </wp:cNvGraphicFramePr>
@@ -2170,7 +2170,7 @@
               <a:graphicData uri="http://schemas.openxmlformats.org/drawingml/2006/picture">
                 <pic:pic xmlns:pic="http://schemas.openxmlformats.org/drawingml/2006/picture">
                   <pic:nvPicPr>
-                    <pic:cNvPr id="5" name="Image 07-03-20 at 3.28 PM.jpg"/>
+                    <pic:cNvPr id="4" name="Image 07-03-20 at 3.28 PM.jpg"/>
                     <pic:cNvPicPr/>
                   </pic:nvPicPr>
                   <pic:blipFill>
@@ -2641,7 +2641,7 @@
         <w:pStyle w:val="NoSpacing"/>
         <w:numPr>
           <w:ilvl w:val="0"/>
-          <w:numId w:val="11"/>
+          <w:numId w:val="4"/>
         </w:numPr>
         <w:spacing w:line="276" w:lineRule="auto"/>
         <w:rPr>
@@ -2664,7 +2664,7 @@
         <w:pStyle w:val="NoSpacing"/>
         <w:numPr>
           <w:ilvl w:val="0"/>
-          <w:numId w:val="11"/>
+          <w:numId w:val="4"/>
         </w:numPr>
         <w:spacing w:line="276" w:lineRule="auto"/>
         <w:rPr>
@@ -2695,7 +2695,7 @@
         <w:pStyle w:val="NoSpacing"/>
         <w:numPr>
           <w:ilvl w:val="0"/>
-          <w:numId w:val="11"/>
+          <w:numId w:val="4"/>
         </w:numPr>
         <w:spacing w:line="276" w:lineRule="auto"/>
         <w:rPr>
@@ -2718,7 +2718,7 @@
         <w:pStyle w:val="NoSpacing"/>
         <w:numPr>
           <w:ilvl w:val="0"/>
-          <w:numId w:val="11"/>
+          <w:numId w:val="4"/>
         </w:numPr>
         <w:spacing w:line="276" w:lineRule="auto"/>
         <w:rPr>
@@ -2757,7 +2757,7 @@
         <w:pStyle w:val="NoSpacing"/>
         <w:numPr>
           <w:ilvl w:val="0"/>
-          <w:numId w:val="11"/>
+          <w:numId w:val="4"/>
         </w:numPr>
         <w:spacing w:line="276" w:lineRule="auto"/>
         <w:rPr>
@@ -2788,7 +2788,7 @@
         <w:pStyle w:val="NoSpacing"/>
         <w:numPr>
           <w:ilvl w:val="0"/>
-          <w:numId w:val="11"/>
+          <w:numId w:val="4"/>
         </w:numPr>
         <w:spacing w:line="276" w:lineRule="auto"/>
         <w:rPr>
@@ -2811,7 +2811,7 @@
         <w:pStyle w:val="NoSpacing"/>
         <w:numPr>
           <w:ilvl w:val="0"/>
-          <w:numId w:val="11"/>
+          <w:numId w:val="4"/>
         </w:numPr>
         <w:spacing w:line="276" w:lineRule="auto"/>
         <w:rPr>
@@ -2842,7 +2842,7 @@
         <w:pStyle w:val="NoSpacing"/>
         <w:numPr>
           <w:ilvl w:val="0"/>
-          <w:numId w:val="11"/>
+          <w:numId w:val="4"/>
         </w:numPr>
         <w:spacing w:line="276" w:lineRule="auto"/>
         <w:rPr>
@@ -2873,7 +2873,7 @@
         <w:pStyle w:val="NoSpacing"/>
         <w:numPr>
           <w:ilvl w:val="0"/>
-          <w:numId w:val="11"/>
+          <w:numId w:val="4"/>
         </w:numPr>
         <w:spacing w:line="276" w:lineRule="auto"/>
         <w:rPr>
@@ -2896,7 +2896,7 @@
         <w:pStyle w:val="NoSpacing"/>
         <w:numPr>
           <w:ilvl w:val="0"/>
-          <w:numId w:val="11"/>
+          <w:numId w:val="4"/>
         </w:numPr>
         <w:spacing w:line="276" w:lineRule="auto"/>
         <w:rPr>
@@ -2919,7 +2919,7 @@
         <w:pStyle w:val="NoSpacing"/>
         <w:numPr>
           <w:ilvl w:val="0"/>
-          <w:numId w:val="11"/>
+          <w:numId w:val="4"/>
         </w:numPr>
         <w:spacing w:line="276" w:lineRule="auto"/>
         <w:rPr>
@@ -2950,7 +2950,7 @@
         <w:pStyle w:val="NoSpacing"/>
         <w:numPr>
           <w:ilvl w:val="0"/>
-          <w:numId w:val="11"/>
+          <w:numId w:val="4"/>
         </w:numPr>
         <w:spacing w:line="276" w:lineRule="auto"/>
         <w:rPr>
@@ -3036,7 +3036,7 @@
         <w:pStyle w:val="NoSpacing"/>
         <w:numPr>
           <w:ilvl w:val="0"/>
-          <w:numId w:val="11"/>
+          <w:numId w:val="4"/>
         </w:numPr>
         <w:rPr>
           <w:rFonts w:ascii="Times New Roman" w:hAnsi="Times New Roman" w:cs="Times New Roman"/>
@@ -3058,7 +3058,7 @@
         <w:pStyle w:val="NoSpacing"/>
         <w:numPr>
           <w:ilvl w:val="0"/>
-          <w:numId w:val="11"/>
+          <w:numId w:val="4"/>
         </w:numPr>
         <w:rPr>
           <w:rFonts w:ascii="Times New Roman" w:hAnsi="Times New Roman" w:cs="Times New Roman"/>
@@ -3080,7 +3080,7 @@
         <w:pStyle w:val="NoSpacing"/>
         <w:numPr>
           <w:ilvl w:val="0"/>
-          <w:numId w:val="11"/>
+          <w:numId w:val="4"/>
         </w:numPr>
         <w:rPr>
           <w:rFonts w:ascii="Times New Roman" w:hAnsi="Times New Roman" w:cs="Times New Roman"/>
@@ -3102,7 +3102,7 @@
         <w:pStyle w:val="NoSpacing"/>
         <w:numPr>
           <w:ilvl w:val="0"/>
-          <w:numId w:val="11"/>
+          <w:numId w:val="4"/>
         </w:numPr>
         <w:rPr>
           <w:rFonts w:ascii="Times New Roman" w:hAnsi="Times New Roman" w:cs="Times New Roman"/>
@@ -3124,7 +3124,7 @@
         <w:pStyle w:val="NoSpacing"/>
         <w:numPr>
           <w:ilvl w:val="0"/>
-          <w:numId w:val="11"/>
+          <w:numId w:val="4"/>
         </w:numPr>
         <w:rPr>
           <w:rFonts w:ascii="Times New Roman" w:hAnsi="Times New Roman" w:cs="Times New Roman"/>
@@ -3579,6 +3579,294 @@
           <w:szCs w:val="24"/>
         </w:rPr>
         <w:t>:</w:t>
+      </w:r>
+    </w:p>
+    <w:p>
+      <w:pPr>
+        <w:pStyle w:val="ListParagraph"/>
+        <w:widowControl w:val="0"/>
+        <w:numPr>
+          <w:ilvl w:val="0"/>
+          <w:numId w:val="5"/>
+        </w:numPr>
+        <w:spacing w:after="200" w:line="276" w:lineRule="auto"/>
+        <w:jc w:val="both"/>
+      </w:pPr>
+      <w:r>
+        <w:t>PLC</w:t>
+      </w:r>
+      <w:r>
+        <w:t xml:space="preserve"> S</w:t>
+      </w:r>
+      <w:r>
+        <w:t xml:space="preserve">7 – 1200 </w:t>
+      </w:r>
+    </w:p>
+    <w:p>
+      <w:pPr>
+        <w:pStyle w:val="ListParagraph"/>
+        <w:widowControl w:val="0"/>
+        <w:numPr>
+          <w:ilvl w:val="0"/>
+          <w:numId w:val="5"/>
+        </w:numPr>
+        <w:spacing w:after="200" w:line="276" w:lineRule="auto"/>
+        <w:jc w:val="both"/>
+      </w:pPr>
+      <w:r>
+        <w:t xml:space="preserve">One </w:t>
+      </w:r>
+      <w:r>
+        <w:t xml:space="preserve">Thermocouple with Temperature Transmitter </w:t>
+      </w:r>
+    </w:p>
+    <w:p>
+      <w:pPr>
+        <w:pStyle w:val="ListParagraph"/>
+        <w:widowControl w:val="0"/>
+        <w:numPr>
+          <w:ilvl w:val="0"/>
+          <w:numId w:val="5"/>
+        </w:numPr>
+        <w:spacing w:after="200" w:line="276" w:lineRule="auto"/>
+        <w:jc w:val="both"/>
+      </w:pPr>
+      <w:r>
+        <w:t xml:space="preserve">One </w:t>
+      </w:r>
+      <w:r>
+        <w:t xml:space="preserve">Orifice </w:t>
+      </w:r>
+      <w:r>
+        <w:t xml:space="preserve">with DPT </w:t>
+      </w:r>
+      <w:r>
+        <w:t xml:space="preserve">Volumetric flow meter for Air </w:t>
+      </w:r>
+    </w:p>
+    <w:p>
+      <w:pPr>
+        <w:pStyle w:val="ListParagraph"/>
+        <w:widowControl w:val="0"/>
+        <w:numPr>
+          <w:ilvl w:val="0"/>
+          <w:numId w:val="5"/>
+        </w:numPr>
+        <w:spacing w:after="200" w:line="276" w:lineRule="auto"/>
+        <w:jc w:val="both"/>
+      </w:pPr>
+      <w:r>
+        <w:t xml:space="preserve">One </w:t>
+      </w:r>
+      <w:r>
+        <w:t xml:space="preserve">Orifice </w:t>
+      </w:r>
+      <w:r>
+        <w:t>with DPT</w:t>
+      </w:r>
+      <w:r>
+        <w:t xml:space="preserve"> Volumetric flow meter for Gas </w:t>
+      </w:r>
+    </w:p>
+    <w:p>
+      <w:pPr>
+        <w:pStyle w:val="ListParagraph"/>
+        <w:widowControl w:val="0"/>
+        <w:numPr>
+          <w:ilvl w:val="0"/>
+          <w:numId w:val="5"/>
+        </w:numPr>
+        <w:spacing w:after="200" w:line="276" w:lineRule="auto"/>
+        <w:jc w:val="both"/>
+        <w:rPr>
+          <w:lang w:val="en-IN"/>
+        </w:rPr>
+      </w:pPr>
+      <w:r>
+        <w:rPr>
+          <w:lang w:val="en-IN"/>
+        </w:rPr>
+        <w:t>One Pneumatic Flow</w:t>
+      </w:r>
+      <w:r>
+        <w:rPr>
+          <w:lang w:val="en-IN"/>
+        </w:rPr>
+        <w:t xml:space="preserve"> </w:t>
+      </w:r>
+      <w:r>
+        <w:rPr>
+          <w:lang w:val="en-IN"/>
+        </w:rPr>
+        <w:t xml:space="preserve">Air Control Valve </w:t>
+      </w:r>
+    </w:p>
+    <w:p>
+      <w:pPr>
+        <w:pStyle w:val="ListParagraph"/>
+        <w:widowControl w:val="0"/>
+        <w:numPr>
+          <w:ilvl w:val="0"/>
+          <w:numId w:val="5"/>
+        </w:numPr>
+        <w:spacing w:after="200" w:line="276" w:lineRule="auto"/>
+        <w:jc w:val="both"/>
+        <w:rPr>
+          <w:lang w:val="en-IN"/>
+        </w:rPr>
+      </w:pPr>
+      <w:r>
+        <w:rPr>
+          <w:lang w:val="en-IN"/>
+        </w:rPr>
+        <w:t>One Pneumatic Flow</w:t>
+      </w:r>
+      <w:r>
+        <w:rPr>
+          <w:lang w:val="en-IN"/>
+        </w:rPr>
+        <w:t xml:space="preserve"> </w:t>
+      </w:r>
+      <w:r>
+        <w:rPr>
+          <w:lang w:val="en-IN"/>
+        </w:rPr>
+        <w:t xml:space="preserve">Gas Control </w:t>
+      </w:r>
+      <w:r>
+        <w:rPr>
+          <w:lang w:val="en-IN"/>
+        </w:rPr>
+        <w:t>V</w:t>
+      </w:r>
+      <w:r>
+        <w:rPr>
+          <w:lang w:val="en-IN"/>
+        </w:rPr>
+        <w:t>alve</w:t>
+      </w:r>
+    </w:p>
+    <w:p>
+      <w:pPr>
+        <w:pStyle w:val="ListParagraph"/>
+        <w:widowControl w:val="0"/>
+        <w:numPr>
+          <w:ilvl w:val="0"/>
+          <w:numId w:val="5"/>
+        </w:numPr>
+        <w:spacing w:after="200" w:line="276" w:lineRule="auto"/>
+        <w:jc w:val="both"/>
+        <w:rPr>
+          <w:lang w:val="en-IN"/>
+        </w:rPr>
+      </w:pPr>
+      <w:r>
+        <w:rPr>
+          <w:lang w:val="en-IN"/>
+        </w:rPr>
+        <w:t xml:space="preserve">One </w:t>
+      </w:r>
+      <w:r>
+        <w:rPr>
+          <w:lang w:val="en-IN"/>
+        </w:rPr>
+        <w:t>Pneumatic</w:t>
+      </w:r>
+      <w:r>
+        <w:rPr>
+          <w:lang w:val="en-IN"/>
+        </w:rPr>
+        <w:t xml:space="preserve"> Flow</w:t>
+      </w:r>
+      <w:r>
+        <w:rPr>
+          <w:lang w:val="en-IN"/>
+        </w:rPr>
+        <w:t xml:space="preserve"> </w:t>
+      </w:r>
+      <w:r>
+        <w:rPr>
+          <w:lang w:val="en-IN"/>
+        </w:rPr>
+        <w:t xml:space="preserve">Flue Control Valve </w:t>
+      </w:r>
+    </w:p>
+    <w:p>
+      <w:pPr>
+        <w:spacing w:before="240"/>
+        <w:jc w:val="both"/>
+        <w:rPr>
+          <w:b/>
+          <w:u w:val="single"/>
+        </w:rPr>
+      </w:pPr>
+    </w:p>
+    <w:p>
+      <w:pPr>
+        <w:jc w:val="both"/>
+        <w:rPr>
+          <w:b/>
+          <w:u w:val="single"/>
+        </w:rPr>
+      </w:pPr>
+    </w:p>
+    <w:p>
+      <w:pPr>
+        <w:jc w:val="both"/>
+        <w:rPr>
+          <w:b/>
+          <w:u w:val="single"/>
+        </w:rPr>
+      </w:pPr>
+      <w:r>
+        <w:rPr>
+          <w:b/>
+          <w:u w:val="single"/>
+        </w:rPr>
+        <w:t>OPERATIONAL SEQUENCE</w:t>
+      </w:r>
+    </w:p>
+    <w:p>
+      <w:pPr>
+        <w:jc w:val="both"/>
+      </w:pPr>
+      <w:r>
+        <w:t>The Sequence of temperature of each zone in the furnace will be as following:</w:t>
+      </w:r>
+    </w:p>
+    <w:p>
+      <w:pPr>
+        <w:pStyle w:val="ListParagraph"/>
+        <w:widowControl w:val="0"/>
+        <w:spacing w:after="200" w:line="276" w:lineRule="auto"/>
+        <w:jc w:val="both"/>
+      </w:pPr>
+      <w:r>
+        <w:t>A thermocouple</w:t>
+      </w:r>
+      <w:r>
+        <w:t xml:space="preserve"> fitted in the </w:t>
+      </w:r>
+      <w:r>
+        <w:t>furnace</w:t>
+      </w:r>
+      <w:r>
+        <w:t xml:space="preserve"> will sense the </w:t>
+      </w:r>
+      <w:r>
+        <w:t>temperature,</w:t>
+      </w:r>
+      <w:r>
+        <w:t xml:space="preserve"> and give </w:t>
+      </w:r>
+      <w:r>
+        <w:t>temperature feedback</w:t>
+      </w:r>
+      <w:r>
+        <w:t xml:space="preserve"> to the P.L.C</w:t>
+      </w:r>
+      <w:r>
+        <w:t>.</w:t>
       </w:r>
     </w:p>
     <w:p>
@@ -3593,13 +3881,10 @@
         <w:jc w:val="both"/>
       </w:pPr>
       <w:r>
-        <w:t>PLC</w:t>
-      </w:r>
-      <w:r>
-        <w:t xml:space="preserve"> S</w:t>
-      </w:r>
-      <w:r>
-        <w:t xml:space="preserve">7 – 1200 </w:t>
+        <w:t>DPT</w:t>
+      </w:r>
+      <w:r>
+        <w:t xml:space="preserve"> on the airline and gas line will give a signal indicating the flow in the Air &amp; Gas header. </w:t>
       </w:r>
     </w:p>
     <w:p>
@@ -3614,10 +3899,19 @@
         <w:jc w:val="both"/>
       </w:pPr>
       <w:r>
-        <w:t xml:space="preserve">One </w:t>
-      </w:r>
-      <w:r>
-        <w:t xml:space="preserve">Thermocouple with Temperature Transmitter </w:t>
+        <w:t xml:space="preserve">The Flow of Air &amp; Gas </w:t>
+      </w:r>
+      <w:r>
+        <w:t xml:space="preserve">entering </w:t>
+      </w:r>
+      <w:r>
+        <w:t xml:space="preserve">to burner </w:t>
+      </w:r>
+      <w:r>
+        <w:t>will</w:t>
+      </w:r>
+      <w:r>
+        <w:t xml:space="preserve"> be governed by the ratio set in the PLC.</w:t>
       </w:r>
     </w:p>
     <w:p>
@@ -3632,16 +3926,95 @@
         <w:jc w:val="both"/>
       </w:pPr>
       <w:r>
-        <w:t xml:space="preserve">One </w:t>
-      </w:r>
-      <w:r>
-        <w:t xml:space="preserve">Orifice </w:t>
-      </w:r>
-      <w:r>
-        <w:t xml:space="preserve">with DPT </w:t>
-      </w:r>
-      <w:r>
-        <w:t xml:space="preserve">Volumetric flow meter for Air </w:t>
+        <w:t xml:space="preserve">If the temperature needs to increase the PLC will give signal to increase the flow of Air by </w:t>
+      </w:r>
+      <w:r>
+        <w:t>modulating</w:t>
+      </w:r>
+      <w:r>
+        <w:t xml:space="preserve"> </w:t>
+      </w:r>
+      <w:r>
+        <w:t>the Air</w:t>
+      </w:r>
+      <w:r>
+        <w:t xml:space="preserve"> control valve. Once the Air control valve </w:t>
+      </w:r>
+      <w:r>
+        <w:t>modulated</w:t>
+      </w:r>
+      <w:r>
+        <w:t xml:space="preserve"> the Gas control </w:t>
+      </w:r>
+      <w:r>
+        <w:t xml:space="preserve">valve </w:t>
+      </w:r>
+      <w:r>
+        <w:t xml:space="preserve">will open according to the </w:t>
+      </w:r>
+      <w:r>
+        <w:t>r</w:t>
+      </w:r>
+      <w:r>
+        <w:t xml:space="preserve">atio set on the PLC (the flow meters will continuously monitor the flow of air &amp; gas), thus increasing the gas flow while maintaining the air to gas ratio in </w:t>
+      </w:r>
+      <w:r>
+        <w:t>burner</w:t>
+      </w:r>
+      <w:r>
+        <w:t>. Similarly</w:t>
+      </w:r>
+      <w:r>
+        <w:t>,</w:t>
+      </w:r>
+      <w:r>
+        <w:t xml:space="preserve"> </w:t>
+      </w:r>
+      <w:r>
+        <w:t>if</w:t>
+      </w:r>
+      <w:r>
+        <w:t xml:space="preserve"> the temperature has to </w:t>
+      </w:r>
+      <w:r>
+        <w:t>reduce</w:t>
+      </w:r>
+      <w:r>
+        <w:t>,</w:t>
+      </w:r>
+      <w:r>
+        <w:t xml:space="preserve"> the PLC will give a signal to reduce the flow of Air and flow of gas will be reduced accordingly</w:t>
+      </w:r>
+      <w:r>
+        <w:t xml:space="preserve"> maintaining air gas ratio as per set point</w:t>
+      </w:r>
+      <w:r>
+        <w:t xml:space="preserve">. </w:t>
+      </w:r>
+    </w:p>
+    <w:p>
+      <w:pPr>
+        <w:rPr>
+          <w:b/>
+          <w:color w:val="000000"/>
+          <w:u w:val="single"/>
+        </w:rPr>
+      </w:pPr>
+      <w:r>
+        <w:rPr>
+          <w:b/>
+          <w:color w:val="000000"/>
+          <w:u w:val="single"/>
+        </w:rPr>
+        <w:t xml:space="preserve">FURNACE PRESSURE CONTROL SYSTEM </w:t>
+      </w:r>
+    </w:p>
+    <w:p>
+      <w:pPr>
+        <w:jc w:val="both"/>
+      </w:pPr>
+      <w:r>
+        <w:t>The furnace pressure control system will be consisting of the following main component:</w:t>
       </w:r>
     </w:p>
     <w:p>
@@ -3650,22 +4023,21 @@
         <w:widowControl w:val="0"/>
         <w:numPr>
           <w:ilvl w:val="0"/>
-          <w:numId w:val="6"/>
+          <w:numId w:val="7"/>
         </w:numPr>
         <w:spacing w:after="200" w:line="276" w:lineRule="auto"/>
-        <w:jc w:val="both"/>
-      </w:pPr>
-      <w:r>
-        <w:t xml:space="preserve">One </w:t>
-      </w:r>
-      <w:r>
-        <w:t xml:space="preserve">Orifice </w:t>
-      </w:r>
-      <w:r>
-        <w:t>with DPT</w:t>
-      </w:r>
-      <w:r>
-        <w:t xml:space="preserve"> Volumetric flow meter for Gas </w:t>
+      </w:pPr>
+      <w:r>
+        <w:t>P.L.C</w:t>
+      </w:r>
+      <w:r>
+        <w:t xml:space="preserve"> S7</w:t>
+      </w:r>
+      <w:r>
+        <w:t xml:space="preserve"> – </w:t>
+      </w:r>
+      <w:r>
+        <w:t>1200</w:t>
       </w:r>
     </w:p>
     <w:p>
@@ -3674,31 +4046,21 @@
         <w:widowControl w:val="0"/>
         <w:numPr>
           <w:ilvl w:val="0"/>
-          <w:numId w:val="6"/>
+          <w:numId w:val="7"/>
         </w:numPr>
         <w:spacing w:after="200" w:line="276" w:lineRule="auto"/>
-        <w:jc w:val="both"/>
-        <w:rPr>
-          <w:lang w:val="en-IN"/>
-        </w:rPr>
-      </w:pPr>
-      <w:r>
-        <w:rPr>
-          <w:lang w:val="en-IN"/>
-        </w:rPr>
-        <w:t>One Pneumatic Flow</w:t>
-      </w:r>
-      <w:r>
-        <w:rPr>
-          <w:lang w:val="en-IN"/>
-        </w:rPr>
+      </w:pPr>
+      <w:r>
+        <w:t>1</w:t>
+      </w:r>
+      <w:r>
         <w:t xml:space="preserve"> </w:t>
       </w:r>
       <w:r>
-        <w:rPr>
-          <w:lang w:val="en-IN"/>
-        </w:rPr>
-        <w:t xml:space="preserve">Air Control Valve </w:t>
+        <w:t xml:space="preserve">Pressure Sensing Tube with Pressure Transmitter be installed in the </w:t>
+      </w:r>
+      <w:r>
+        <w:t>furnace.</w:t>
       </w:r>
     </w:p>
     <w:p>
@@ -3707,43 +4069,44 @@
         <w:widowControl w:val="0"/>
         <w:numPr>
           <w:ilvl w:val="0"/>
-          <w:numId w:val="6"/>
+          <w:numId w:val="7"/>
         </w:numPr>
         <w:spacing w:after="200" w:line="276" w:lineRule="auto"/>
+      </w:pPr>
+      <w:r>
+        <w:t>1 Damper type F</w:t>
+      </w:r>
+      <w:r>
+        <w:t xml:space="preserve">lue control Valves </w:t>
+      </w:r>
+    </w:p>
+    <w:p>
+      <w:pPr>
+        <w:widowControl w:val="0"/>
+        <w:spacing w:line="276" w:lineRule="auto"/>
+        <w:rPr>
+          <w:b/>
+          <w:iCs/>
+          <w:color w:val="000000"/>
+          <w:u w:val="single"/>
+        </w:rPr>
+      </w:pPr>
+      <w:r>
+        <w:rPr>
+          <w:b/>
+          <w:iCs/>
+          <w:color w:val="000000"/>
+          <w:u w:val="single"/>
+        </w:rPr>
+        <w:t>OPERATIONAL SEQUENCE</w:t>
+      </w:r>
+    </w:p>
+    <w:p>
+      <w:pPr>
         <w:jc w:val="both"/>
-        <w:rPr>
-          <w:lang w:val="en-IN"/>
-        </w:rPr>
-      </w:pPr>
-      <w:r>
-        <w:rPr>
-          <w:lang w:val="en-IN"/>
-        </w:rPr>
-        <w:t>One Pneumatic Flow</w:t>
-      </w:r>
-      <w:r>
-        <w:rPr>
-          <w:lang w:val="en-IN"/>
-        </w:rPr>
-        <w:t xml:space="preserve"> </w:t>
-      </w:r>
-      <w:r>
-        <w:rPr>
-          <w:lang w:val="en-IN"/>
-        </w:rPr>
-        <w:t xml:space="preserve">Gas Control </w:t>
-      </w:r>
-      <w:r>
-        <w:rPr>
-          <w:lang w:val="en-IN"/>
-        </w:rPr>
-        <w:t>V</w:t>
-      </w:r>
-      <w:r>
-        <w:rPr>
-          <w:lang w:val="en-IN"/>
-        </w:rPr>
-        <w:t>alve</w:t>
+      </w:pPr>
+      <w:r>
+        <w:t>The Sequence of Pressure control in the furnace will be as following:</w:t>
       </w:r>
     </w:p>
     <w:p>
@@ -3752,121 +4115,13 @@
         <w:widowControl w:val="0"/>
         <w:numPr>
           <w:ilvl w:val="0"/>
-          <w:numId w:val="6"/>
+          <w:numId w:val="8"/>
         </w:numPr>
         <w:spacing w:after="200" w:line="276" w:lineRule="auto"/>
         <w:jc w:val="both"/>
-        <w:rPr>
-          <w:lang w:val="en-IN"/>
-        </w:rPr>
-      </w:pPr>
-      <w:r>
-        <w:rPr>
-          <w:lang w:val="en-IN"/>
-        </w:rPr>
-        <w:t xml:space="preserve">One </w:t>
-      </w:r>
-      <w:r>
-        <w:rPr>
-          <w:lang w:val="en-IN"/>
-        </w:rPr>
-        <w:t>Pneumatic</w:t>
-      </w:r>
-      <w:r>
-        <w:rPr>
-          <w:lang w:val="en-IN"/>
-        </w:rPr>
-        <w:t xml:space="preserve"> Flow</w:t>
-      </w:r>
-      <w:r>
-        <w:rPr>
-          <w:lang w:val="en-IN"/>
-        </w:rPr>
-        <w:t xml:space="preserve"> </w:t>
-      </w:r>
-      <w:r>
-        <w:rPr>
-          <w:lang w:val="en-IN"/>
-        </w:rPr>
-        <w:t xml:space="preserve">Flue Control Valve </w:t>
-      </w:r>
-    </w:p>
-    <w:p>
-      <w:pPr>
-        <w:spacing w:before="240"/>
-        <w:jc w:val="both"/>
-        <w:rPr>
-          <w:b/>
-          <w:u w:val="single"/>
-        </w:rPr>
-      </w:pPr>
-    </w:p>
-    <w:p>
-      <w:pPr>
-        <w:jc w:val="both"/>
-        <w:rPr>
-          <w:b/>
-          <w:u w:val="single"/>
-        </w:rPr>
-      </w:pPr>
-    </w:p>
-    <w:p>
-      <w:pPr>
-        <w:jc w:val="both"/>
-        <w:rPr>
-          <w:b/>
-          <w:u w:val="single"/>
-        </w:rPr>
-      </w:pPr>
-      <w:r>
-        <w:rPr>
-          <w:b/>
-          <w:u w:val="single"/>
-        </w:rPr>
-        <w:t>OPERATIONAL SEQUENCE</w:t>
-      </w:r>
-    </w:p>
-    <w:p>
-      <w:pPr>
-        <w:jc w:val="both"/>
-      </w:pPr>
-      <w:r>
-        <w:t>The Sequence of temperature of each zone in the furnace will be as following:</w:t>
-      </w:r>
-    </w:p>
-    <w:p>
-      <w:pPr>
-        <w:pStyle w:val="ListParagraph"/>
-        <w:widowControl w:val="0"/>
-        <w:spacing w:after="200" w:line="276" w:lineRule="auto"/>
-        <w:jc w:val="both"/>
-      </w:pPr>
-      <w:r>
-        <w:t>A thermocouple</w:t>
-      </w:r>
-      <w:r>
-        <w:t xml:space="preserve"> fitted in the </w:t>
-      </w:r>
-      <w:r>
-        <w:t>furnace</w:t>
-      </w:r>
-      <w:r>
-        <w:t xml:space="preserve"> will sense the </w:t>
-      </w:r>
-      <w:r>
-        <w:t>temperature,</w:t>
-      </w:r>
-      <w:r>
-        <w:t xml:space="preserve"> and give </w:t>
-      </w:r>
-      <w:r>
-        <w:t>temperature feedback</w:t>
-      </w:r>
-      <w:r>
-        <w:t xml:space="preserve"> to the P.L.C</w:t>
-      </w:r>
-      <w:r>
-        <w:t>.</w:t>
+      </w:pPr>
+      <w:r>
+        <w:t>The sensing tube fitted in the furnace, will give the Pressure differential and that will be sensed by the Pressure Transmitter</w:t>
       </w:r>
     </w:p>
     <w:p>
@@ -3875,16 +4130,22 @@
         <w:widowControl w:val="0"/>
         <w:numPr>
           <w:ilvl w:val="0"/>
-          <w:numId w:val="14"/>
+          <w:numId w:val="8"/>
         </w:numPr>
         <w:spacing w:after="200" w:line="276" w:lineRule="auto"/>
         <w:jc w:val="both"/>
       </w:pPr>
       <w:r>
-        <w:t>DPT</w:t>
-      </w:r>
-      <w:r>
-        <w:t xml:space="preserve"> on the airline and gas line will give a signal indicating the flow in the Air &amp; Gas header. </w:t>
+        <w:t xml:space="preserve">The pressure transmitter will give </w:t>
+      </w:r>
+      <w:r>
+        <w:t>a signal</w:t>
+      </w:r>
+      <w:r>
+        <w:t xml:space="preserve"> to the P.L.C indicating the furnace </w:t>
+      </w:r>
+      <w:r>
+        <w:t>pressure.</w:t>
       </w:r>
     </w:p>
     <w:p>
@@ -3893,268 +4154,7 @@
         <w:widowControl w:val="0"/>
         <w:numPr>
           <w:ilvl w:val="0"/>
-          <w:numId w:val="14"/>
-        </w:numPr>
-        <w:spacing w:after="200" w:line="276" w:lineRule="auto"/>
-        <w:jc w:val="both"/>
-      </w:pPr>
-      <w:r>
-        <w:t xml:space="preserve">The Flow of Air &amp; Gas </w:t>
-      </w:r>
-      <w:r>
-        <w:t xml:space="preserve">entering </w:t>
-      </w:r>
-      <w:r>
-        <w:t xml:space="preserve">to burner </w:t>
-      </w:r>
-      <w:r>
-        <w:t>will</w:t>
-      </w:r>
-      <w:r>
-        <w:t xml:space="preserve"> be governed by the ratio set in the PLC.</w:t>
-      </w:r>
-    </w:p>
-    <w:p>
-      <w:pPr>
-        <w:pStyle w:val="ListParagraph"/>
-        <w:widowControl w:val="0"/>
-        <w:numPr>
-          <w:ilvl w:val="0"/>
-          <w:numId w:val="14"/>
-        </w:numPr>
-        <w:spacing w:after="200" w:line="276" w:lineRule="auto"/>
-        <w:jc w:val="both"/>
-      </w:pPr>
-      <w:r>
-        <w:t xml:space="preserve">If the temperature needs to increase the PLC will give signal to increase the flow of Air by </w:t>
-      </w:r>
-      <w:r>
-        <w:t>modulating</w:t>
-      </w:r>
-      <w:r>
-        <w:t xml:space="preserve"> </w:t>
-      </w:r>
-      <w:r>
-        <w:t>the Air</w:t>
-      </w:r>
-      <w:r>
-        <w:t xml:space="preserve"> control valve. Once the Air control valve </w:t>
-      </w:r>
-      <w:r>
-        <w:t>modulated</w:t>
-      </w:r>
-      <w:r>
-        <w:t xml:space="preserve"> the Gas control </w:t>
-      </w:r>
-      <w:r>
-        <w:t xml:space="preserve">valve </w:t>
-      </w:r>
-      <w:r>
-        <w:t xml:space="preserve">will open according to the </w:t>
-      </w:r>
-      <w:r>
-        <w:t>r</w:t>
-      </w:r>
-      <w:r>
-        <w:t xml:space="preserve">atio set on the PLC (the flow meters will continuously monitor the flow of air &amp; gas), thus increasing the gas flow while maintaining the air to gas ratio in </w:t>
-      </w:r>
-      <w:r>
-        <w:t>burner</w:t>
-      </w:r>
-      <w:r>
-        <w:t>. Similarly</w:t>
-      </w:r>
-      <w:r>
-        <w:t>,</w:t>
-      </w:r>
-      <w:r>
-        <w:t xml:space="preserve"> </w:t>
-      </w:r>
-      <w:r>
-        <w:t>if</w:t>
-      </w:r>
-      <w:r>
-        <w:t xml:space="preserve"> the temperature has to </w:t>
-      </w:r>
-      <w:r>
-        <w:t>reduce</w:t>
-      </w:r>
-      <w:r>
-        <w:t>,</w:t>
-      </w:r>
-      <w:r>
-        <w:t xml:space="preserve"> the PLC will give a signal to reduce the flow of Air and flow of gas will be reduced accordingly</w:t>
-      </w:r>
-      <w:r>
-        <w:t xml:space="preserve"> maintaining air gas ratio as per set point</w:t>
-      </w:r>
-      <w:r>
-        <w:t xml:space="preserve">. </w:t>
-      </w:r>
-    </w:p>
-    <w:p>
-      <w:pPr>
-        <w:rPr>
-          <w:b/>
-          <w:color w:val="000000"/>
-          <w:u w:val="single"/>
-        </w:rPr>
-      </w:pPr>
-      <w:r>
-        <w:rPr>
-          <w:b/>
-          <w:color w:val="000000"/>
-          <w:u w:val="single"/>
-        </w:rPr>
-        <w:t xml:space="preserve">FURNACE PRESSURE CONTROL SYSTEM </w:t>
-      </w:r>
-    </w:p>
-    <w:p>
-      <w:pPr>
-        <w:jc w:val="both"/>
-      </w:pPr>
-      <w:r>
-        <w:t>The furnace pressure control system will be consisting of the following main component:</w:t>
-      </w:r>
-    </w:p>
-    <w:p>
-      <w:pPr>
-        <w:pStyle w:val="ListParagraph"/>
-        <w:widowControl w:val="0"/>
-        <w:numPr>
-          <w:ilvl w:val="0"/>
-          <w:numId w:val="13"/>
-        </w:numPr>
-        <w:spacing w:after="200" w:line="276" w:lineRule="auto"/>
-      </w:pPr>
-      <w:r>
-        <w:t>P.L.C</w:t>
-      </w:r>
-      <w:r>
-        <w:t xml:space="preserve"> S7</w:t>
-      </w:r>
-      <w:r>
-        <w:t xml:space="preserve"> – </w:t>
-      </w:r>
-      <w:r>
-        <w:t>1200</w:t>
-      </w:r>
-    </w:p>
-    <w:p>
-      <w:pPr>
-        <w:pStyle w:val="ListParagraph"/>
-        <w:widowControl w:val="0"/>
-        <w:numPr>
-          <w:ilvl w:val="0"/>
-          <w:numId w:val="13"/>
-        </w:numPr>
-        <w:spacing w:after="200" w:line="276" w:lineRule="auto"/>
-      </w:pPr>
-      <w:r>
-        <w:t>1</w:t>
-      </w:r>
-      <w:r>
-        <w:t xml:space="preserve"> </w:t>
-      </w:r>
-      <w:r>
-        <w:t xml:space="preserve">Pressure Sensing Tube with Pressure Transmitter be installed in the </w:t>
-      </w:r>
-      <w:r>
-        <w:t>furnace.</w:t>
-      </w:r>
-    </w:p>
-    <w:p>
-      <w:pPr>
-        <w:pStyle w:val="ListParagraph"/>
-        <w:widowControl w:val="0"/>
-        <w:numPr>
-          <w:ilvl w:val="0"/>
-          <w:numId w:val="13"/>
-        </w:numPr>
-        <w:spacing w:after="200" w:line="276" w:lineRule="auto"/>
-      </w:pPr>
-      <w:r>
-        <w:t>1 Damper type F</w:t>
-      </w:r>
-      <w:r>
-        <w:t xml:space="preserve">lue control Valves </w:t>
-      </w:r>
-    </w:p>
-    <w:p>
-      <w:pPr>
-        <w:widowControl w:val="0"/>
-        <w:spacing w:line="276" w:lineRule="auto"/>
-        <w:rPr>
-          <w:b/>
-          <w:iCs/>
-          <w:color w:val="000000"/>
-          <w:u w:val="single"/>
-        </w:rPr>
-      </w:pPr>
-      <w:r>
-        <w:rPr>
-          <w:b/>
-          <w:iCs/>
-          <w:color w:val="000000"/>
-          <w:u w:val="single"/>
-        </w:rPr>
-        <w:t>OPERATIONAL SEQUENCE</w:t>
-      </w:r>
-    </w:p>
-    <w:p>
-      <w:pPr>
-        <w:jc w:val="both"/>
-      </w:pPr>
-      <w:r>
-        <w:t>The Sequence of Pressure control in the furnace will be as following:</w:t>
-      </w:r>
-    </w:p>
-    <w:p>
-      <w:pPr>
-        <w:pStyle w:val="ListParagraph"/>
-        <w:widowControl w:val="0"/>
-        <w:numPr>
-          <w:ilvl w:val="0"/>
-          <w:numId w:val="9"/>
-        </w:numPr>
-        <w:spacing w:after="200" w:line="276" w:lineRule="auto"/>
-        <w:jc w:val="both"/>
-      </w:pPr>
-      <w:r>
-        <w:t>The sensing tube fitted in the furnace, will give the Pressure differential and that will be sensed by the Pressure Transmitter</w:t>
-      </w:r>
-    </w:p>
-    <w:p>
-      <w:pPr>
-        <w:pStyle w:val="ListParagraph"/>
-        <w:widowControl w:val="0"/>
-        <w:numPr>
-          <w:ilvl w:val="0"/>
-          <w:numId w:val="9"/>
-        </w:numPr>
-        <w:spacing w:after="200" w:line="276" w:lineRule="auto"/>
-        <w:jc w:val="both"/>
-      </w:pPr>
-      <w:r>
-        <w:t xml:space="preserve">The pressure transmitter will give </w:t>
-      </w:r>
-      <w:r>
-        <w:t>a signal</w:t>
-      </w:r>
-      <w:r>
-        <w:t xml:space="preserve"> to the P.L.C indicating the furnace </w:t>
-      </w:r>
-      <w:r>
-        <w:t>pressure.</w:t>
-      </w:r>
-    </w:p>
-    <w:p>
-      <w:pPr>
-        <w:pStyle w:val="ListParagraph"/>
-        <w:widowControl w:val="0"/>
-        <w:numPr>
-          <w:ilvl w:val="0"/>
-          <w:numId w:val="9"/>
+          <w:numId w:val="8"/>
         </w:numPr>
         <w:spacing w:after="200" w:line="276" w:lineRule="auto"/>
         <w:jc w:val="both"/>
@@ -16875,7 +16875,7 @@
         <w:pStyle w:val="ListParagraph"/>
         <w:numPr>
           <w:ilvl w:val="0"/>
-          <w:numId w:val="17"/>
+          <w:numId w:val="10"/>
         </w:numPr>
         <w:spacing w:before="120"/>
         <w:jc w:val="both"/>
@@ -16898,7 +16898,7 @@
         <w:pStyle w:val="ListParagraph"/>
         <w:numPr>
           <w:ilvl w:val="0"/>
-          <w:numId w:val="17"/>
+          <w:numId w:val="10"/>
         </w:numPr>
         <w:spacing w:before="120"/>
         <w:ind w:left="714" w:hanging="357"/>
@@ -17332,7 +17332,7 @@
         <w:widowControl w:val="0"/>
         <w:numPr>
           <w:ilvl w:val="0"/>
-          <w:numId w:val="10"/>
+          <w:numId w:val="12"/>
         </w:numPr>
         <w:spacing w:before="180" w:line="276" w:lineRule="auto"/>
         <w:ind w:left="714" w:hanging="357"/>
@@ -17998,7 +17998,7 @@
         <w:widowControl w:val="0"/>
         <w:numPr>
           <w:ilvl w:val="0"/>
-          <w:numId w:val="10"/>
+          <w:numId w:val="12"/>
         </w:numPr>
         <w:spacing w:before="120" w:line="276" w:lineRule="auto"/>
         <w:ind w:left="714" w:hanging="357"/>
@@ -18420,7 +18420,7 @@
         <w:widowControl w:val="0"/>
         <w:numPr>
           <w:ilvl w:val="0"/>
-          <w:numId w:val="10"/>
+          <w:numId w:val="12"/>
         </w:numPr>
         <w:spacing w:before="120" w:line="276" w:lineRule="auto"/>
         <w:ind w:left="714" w:hanging="357"/>
@@ -18734,7 +18734,7 @@
         <w:widowControl w:val="0"/>
         <w:numPr>
           <w:ilvl w:val="0"/>
-          <w:numId w:val="10"/>
+          <w:numId w:val="12"/>
         </w:numPr>
         <w:spacing w:before="120" w:line="276" w:lineRule="auto"/>
         <w:ind w:left="714" w:hanging="357"/>
@@ -18907,7 +18907,7 @@
         <w:widowControl w:val="0"/>
         <w:numPr>
           <w:ilvl w:val="1"/>
-          <w:numId w:val="10"/>
+          <w:numId w:val="12"/>
         </w:numPr>
         <w:spacing w:line="276" w:lineRule="auto"/>
         <w:jc w:val="both"/>
@@ -20361,7 +20361,7 @@
         <w:widowControl w:val="0"/>
         <w:numPr>
           <w:ilvl w:val="1"/>
-          <w:numId w:val="10"/>
+          <w:numId w:val="12"/>
         </w:numPr>
         <w:spacing w:line="276" w:lineRule="auto"/>
         <w:jc w:val="both"/>
@@ -20814,7 +20814,7 @@
         <w:widowControl w:val="0"/>
         <w:numPr>
           <w:ilvl w:val="1"/>
-          <w:numId w:val="10"/>
+          <w:numId w:val="12"/>
         </w:numPr>
         <w:spacing w:line="276" w:lineRule="auto"/>
         <w:jc w:val="both"/>
@@ -21979,7 +21979,7 @@
         <w:widowControl w:val="0"/>
         <w:numPr>
           <w:ilvl w:val="0"/>
-          <w:numId w:val="10"/>
+          <w:numId w:val="12"/>
         </w:numPr>
         <w:spacing w:before="120" w:line="276" w:lineRule="auto"/>
         <w:ind w:left="714" w:hanging="357"/>
@@ -22613,7 +22613,7 @@
         <w:widowControl w:val="0"/>
         <w:numPr>
           <w:ilvl w:val="0"/>
-          <w:numId w:val="10"/>
+          <w:numId w:val="12"/>
         </w:numPr>
         <w:spacing w:before="120" w:line="276" w:lineRule="auto"/>
         <w:ind w:left="714" w:hanging="357"/>
@@ -22655,7 +22655,7 @@
         <w:widowControl w:val="0"/>
         <w:numPr>
           <w:ilvl w:val="0"/>
-          <w:numId w:val="10"/>
+          <w:numId w:val="12"/>
         </w:numPr>
         <w:spacing w:before="120" w:line="276" w:lineRule="auto"/>
         <w:ind w:left="714" w:hanging="357"/>
@@ -22721,7 +22721,7 @@
         <w:widowControl w:val="0"/>
         <w:numPr>
           <w:ilvl w:val="1"/>
-          <w:numId w:val="10"/>
+          <w:numId w:val="12"/>
         </w:numPr>
         <w:spacing w:line="276" w:lineRule="auto"/>
         <w:jc w:val="both"/>
@@ -22943,7 +22943,7 @@
         <w:widowControl w:val="0"/>
         <w:numPr>
           <w:ilvl w:val="1"/>
-          <w:numId w:val="10"/>
+          <w:numId w:val="12"/>
         </w:numPr>
         <w:spacing w:line="276" w:lineRule="auto"/>
         <w:jc w:val="both"/>
@@ -23405,7 +23405,7 @@
         <w:widowControl w:val="0"/>
         <w:numPr>
           <w:ilvl w:val="0"/>
-          <w:numId w:val="10"/>
+          <w:numId w:val="12"/>
         </w:numPr>
         <w:spacing w:before="120" w:line="276" w:lineRule="auto"/>
         <w:ind w:left="714" w:hanging="357"/>
@@ -23567,7 +23567,7 @@
         <w:widowControl w:val="0"/>
         <w:numPr>
           <w:ilvl w:val="0"/>
-          <w:numId w:val="10"/>
+          <w:numId w:val="12"/>
         </w:numPr>
         <w:spacing w:before="120" w:line="276" w:lineRule="auto"/>
         <w:ind w:left="714" w:hanging="357"/>
@@ -24900,7 +24900,7 @@
         <w:pStyle w:val="ListParagraph"/>
         <w:numPr>
           <w:ilvl w:val="0"/>
-          <w:numId w:val="18"/>
+          <w:numId w:val="13"/>
         </w:numPr>
       </w:pPr>
       <w:r>
@@ -24915,7 +24915,7 @@
         <w:pStyle w:val="ListParagraph"/>
         <w:numPr>
           <w:ilvl w:val="0"/>
-          <w:numId w:val="18"/>
+          <w:numId w:val="13"/>
         </w:numPr>
       </w:pPr>
       <w:r>
@@ -24964,7 +24964,7 @@
         <w:pStyle w:val="ListParagraph"/>
         <w:numPr>
           <w:ilvl w:val="0"/>
-          <w:numId w:val="18"/>
+          <w:numId w:val="13"/>
         </w:numPr>
       </w:pPr>
       <w:r>
@@ -25401,7 +25401,7 @@
               <wp:inline distT="0" distB="0" distL="0" distR="0">
                 <wp:extent cx="1029600" cy="1260000"/>
                 <wp:effectExtent t="0" r="0" b="0" l="0"/>
-                <wp:docPr id="1" name="ENCON" descr="ENCON logo" title="ENCON"/>
+                <wp:docPr id="5" name="ENCON" descr="ENCON logo" title="ENCON"/>
                 <wp:cNvGraphicFramePr>
                   <a:graphicFrameLocks xmlns:a="http://schemas.openxmlformats.org/drawingml/2006/main" noChangeAspect="0"/>
                 </wp:cNvGraphicFramePr>
@@ -25409,7 +25409,7 @@
                   <a:graphicData uri="http://schemas.openxmlformats.org/drawingml/2006/picture">
                     <pic:pic xmlns:pic="http://schemas.openxmlformats.org/drawingml/2006/picture">
                       <pic:nvPicPr>
-                        <pic:cNvPr id="0" name="" descr=""/>
+                        <pic:cNvPr id="5" name="" descr=""/>
                         <pic:cNvPicPr>
                           <a:picLocks noChangeAspect="0" noChangeArrowheads="1"/>
                         </pic:cNvPicPr>
@@ -25609,6 +25609,880 @@
       </w:pPr>
     </w:lvl>
   </w:abstractNum>
+  <w:abstractNum w:abstractNumId="4">
+    <w:nsid w:val="038C17D9"/>
+    <w:multiLevelType w:val="hybridMultilevel"/>
+    <w:tmpl w:val="4A727438"/>
+    <w:lvl w:ilvl="0" w:tplc="4009000D">
+      <w:start w:val="1"/>
+      <w:numFmt w:val="bullet"/>
+      <w:lvlText w:val=""/>
+      <w:lvlJc w:val="left"/>
+      <w:pPr>
+        <w:ind w:left="720" w:hanging="360"/>
+      </w:pPr>
+      <w:rPr>
+        <w:rFonts w:ascii="Wingdings" w:hAnsi="Wingdings" w:hint="default"/>
+      </w:rPr>
+    </w:lvl>
+    <w:lvl w:ilvl="1" w:tplc="08090003" w:tentative="1">
+      <w:start w:val="1"/>
+      <w:numFmt w:val="bullet"/>
+      <w:lvlText w:val="o"/>
+      <w:lvlJc w:val="left"/>
+      <w:pPr>
+        <w:ind w:left="1440" w:hanging="360"/>
+      </w:pPr>
+      <w:rPr>
+        <w:rFonts w:ascii="Courier New" w:hAnsi="Courier New" w:cs="Courier New" w:hint="default"/>
+      </w:rPr>
+    </w:lvl>
+    <w:lvl w:ilvl="2" w:tplc="08090005" w:tentative="1">
+      <w:start w:val="1"/>
+      <w:numFmt w:val="bullet"/>
+      <w:lvlText w:val=""/>
+      <w:lvlJc w:val="left"/>
+      <w:pPr>
+        <w:ind w:left="2160" w:hanging="360"/>
+      </w:pPr>
+      <w:rPr>
+        <w:rFonts w:ascii="Wingdings" w:hAnsi="Wingdings" w:hint="default"/>
+      </w:rPr>
+    </w:lvl>
+    <w:lvl w:ilvl="3" w:tplc="08090001" w:tentative="1">
+      <w:start w:val="1"/>
+      <w:numFmt w:val="bullet"/>
+      <w:lvlText w:val=""/>
+      <w:lvlJc w:val="left"/>
+      <w:pPr>
+        <w:ind w:left="2880" w:hanging="360"/>
+      </w:pPr>
+      <w:rPr>
+        <w:rFonts w:ascii="Symbol" w:hAnsi="Symbol" w:hint="default"/>
+      </w:rPr>
+    </w:lvl>
+    <w:lvl w:ilvl="4" w:tplc="08090003" w:tentative="1">
+      <w:start w:val="1"/>
+      <w:numFmt w:val="bullet"/>
+      <w:lvlText w:val="o"/>
+      <w:lvlJc w:val="left"/>
+      <w:pPr>
+        <w:ind w:left="3600" w:hanging="360"/>
+      </w:pPr>
+      <w:rPr>
+        <w:rFonts w:ascii="Courier New" w:hAnsi="Courier New" w:cs="Courier New" w:hint="default"/>
+      </w:rPr>
+    </w:lvl>
+    <w:lvl w:ilvl="5" w:tplc="08090005" w:tentative="1">
+      <w:start w:val="1"/>
+      <w:numFmt w:val="bullet"/>
+      <w:lvlText w:val=""/>
+      <w:lvlJc w:val="left"/>
+      <w:pPr>
+        <w:ind w:left="4320" w:hanging="360"/>
+      </w:pPr>
+      <w:rPr>
+        <w:rFonts w:ascii="Wingdings" w:hAnsi="Wingdings" w:hint="default"/>
+      </w:rPr>
+    </w:lvl>
+    <w:lvl w:ilvl="6" w:tplc="08090001" w:tentative="1">
+      <w:start w:val="1"/>
+      <w:numFmt w:val="bullet"/>
+      <w:lvlText w:val=""/>
+      <w:lvlJc w:val="left"/>
+      <w:pPr>
+        <w:ind w:left="5040" w:hanging="360"/>
+      </w:pPr>
+      <w:rPr>
+        <w:rFonts w:ascii="Symbol" w:hAnsi="Symbol" w:hint="default"/>
+      </w:rPr>
+    </w:lvl>
+    <w:lvl w:ilvl="7" w:tplc="08090003" w:tentative="1">
+      <w:start w:val="1"/>
+      <w:numFmt w:val="bullet"/>
+      <w:lvlText w:val="o"/>
+      <w:lvlJc w:val="left"/>
+      <w:pPr>
+        <w:ind w:left="5760" w:hanging="360"/>
+      </w:pPr>
+      <w:rPr>
+        <w:rFonts w:ascii="Courier New" w:hAnsi="Courier New" w:cs="Courier New" w:hint="default"/>
+      </w:rPr>
+    </w:lvl>
+    <w:lvl w:ilvl="8" w:tplc="08090005" w:tentative="1">
+      <w:start w:val="1"/>
+      <w:numFmt w:val="bullet"/>
+      <w:lvlText w:val=""/>
+      <w:lvlJc w:val="left"/>
+      <w:pPr>
+        <w:ind w:left="6480" w:hanging="360"/>
+      </w:pPr>
+      <w:rPr>
+        <w:rFonts w:ascii="Wingdings" w:hAnsi="Wingdings" w:hint="default"/>
+      </w:rPr>
+    </w:lvl>
+  </w:abstractNum>
+  <w:abstractNum w:abstractNumId="5">
+    <w:nsid w:val="02FDB066"/>
+    <w:multiLevelType w:val="multilevel"/>
+    <w:tmpl w:val="F49ED6D4"/>
+    <w:lvl w:ilvl="0">
+      <w:start w:val="1"/>
+      <w:numFmt w:val="bullet"/>
+      <w:lvlText w:val=""/>
+      <w:lvlJc w:val="left"/>
+      <w:pPr>
+        <w:ind w:left="720" w:hanging="360"/>
+      </w:pPr>
+      <w:rPr>
+        <w:rFonts w:ascii="Wingdings" w:hAnsi="Wingdings" w:hint="default"/>
+      </w:rPr>
+    </w:lvl>
+    <w:lvl w:ilvl="1">
+      <w:numFmt w:val="decimal"/>
+      <w:isLgl/>
+      <w:lvlText w:val="%1.%2"/>
+      <w:lvlJc w:val="left"/>
+      <w:pPr>
+        <w:ind w:left="1080" w:hanging="720"/>
+      </w:pPr>
+      <w:rPr>
+        <w:rFonts w:hint="default"/>
+      </w:rPr>
+    </w:lvl>
+    <w:lvl w:ilvl="2">
+      <w:start w:val="1"/>
+      <w:numFmt w:val="decimal"/>
+      <w:isLgl/>
+      <w:lvlText w:val="%1.%2.%3"/>
+      <w:lvlJc w:val="left"/>
+      <w:pPr>
+        <w:ind w:left="1080" w:hanging="720"/>
+      </w:pPr>
+      <w:rPr>
+        <w:rFonts w:hint="default"/>
+      </w:rPr>
+    </w:lvl>
+    <w:lvl w:ilvl="3">
+      <w:start w:val="1"/>
+      <w:numFmt w:val="decimal"/>
+      <w:isLgl/>
+      <w:lvlText w:val="%1.%2.%3.%4"/>
+      <w:lvlJc w:val="left"/>
+      <w:pPr>
+        <w:ind w:left="1440" w:hanging="1080"/>
+      </w:pPr>
+      <w:rPr>
+        <w:rFonts w:hint="default"/>
+      </w:rPr>
+    </w:lvl>
+    <w:lvl w:ilvl="4">
+      <w:start w:val="1"/>
+      <w:numFmt w:val="decimal"/>
+      <w:isLgl/>
+      <w:lvlText w:val="%1.%2.%3.%4.%5"/>
+      <w:lvlJc w:val="left"/>
+      <w:pPr>
+        <w:ind w:left="1440" w:hanging="1080"/>
+      </w:pPr>
+      <w:rPr>
+        <w:rFonts w:hint="default"/>
+      </w:rPr>
+    </w:lvl>
+    <w:lvl w:ilvl="5">
+      <w:start w:val="1"/>
+      <w:numFmt w:val="decimal"/>
+      <w:isLgl/>
+      <w:lvlText w:val="%1.%2.%3.%4.%5.%6"/>
+      <w:lvlJc w:val="left"/>
+      <w:pPr>
+        <w:ind w:left="1800" w:hanging="1440"/>
+      </w:pPr>
+      <w:rPr>
+        <w:rFonts w:hint="default"/>
+      </w:rPr>
+    </w:lvl>
+    <w:lvl w:ilvl="6">
+      <w:start w:val="1"/>
+      <w:numFmt w:val="decimal"/>
+      <w:isLgl/>
+      <w:lvlText w:val="%1.%2.%3.%4.%5.%6.%7"/>
+      <w:lvlJc w:val="left"/>
+      <w:pPr>
+        <w:ind w:left="1800" w:hanging="1440"/>
+      </w:pPr>
+      <w:rPr>
+        <w:rFonts w:hint="default"/>
+      </w:rPr>
+    </w:lvl>
+    <w:lvl w:ilvl="7">
+      <w:start w:val="1"/>
+      <w:numFmt w:val="decimal"/>
+      <w:isLgl/>
+      <w:lvlText w:val="%1.%2.%3.%4.%5.%6.%7.%8"/>
+      <w:lvlJc w:val="left"/>
+      <w:pPr>
+        <w:ind w:left="2160" w:hanging="1800"/>
+      </w:pPr>
+      <w:rPr>
+        <w:rFonts w:hint="default"/>
+      </w:rPr>
+    </w:lvl>
+    <w:lvl w:ilvl="8">
+      <w:start w:val="1"/>
+      <w:numFmt w:val="decimal"/>
+      <w:isLgl/>
+      <w:lvlText w:val="%1.%2.%3.%4.%5.%6.%7.%8.%9"/>
+      <w:lvlJc w:val="left"/>
+      <w:pPr>
+        <w:ind w:left="2520" w:hanging="2160"/>
+      </w:pPr>
+      <w:rPr>
+        <w:rFonts w:hint="default"/>
+      </w:rPr>
+    </w:lvl>
+  </w:abstractNum>
+  <w:abstractNum w:abstractNumId="6">
+    <w:nsid w:val="035CFB70"/>
+    <w:multiLevelType w:val="multilevel"/>
+    <w:tmpl w:val="F49ED6D4"/>
+    <w:lvl w:ilvl="0">
+      <w:start w:val="1"/>
+      <w:numFmt w:val="bullet"/>
+      <w:lvlText w:val=""/>
+      <w:lvlJc w:val="left"/>
+      <w:pPr>
+        <w:ind w:left="720" w:hanging="360"/>
+      </w:pPr>
+      <w:rPr>
+        <w:rFonts w:ascii="Wingdings" w:hAnsi="Wingdings" w:hint="default"/>
+      </w:rPr>
+    </w:lvl>
+    <w:lvl w:ilvl="1">
+      <w:numFmt w:val="decimal"/>
+      <w:isLgl/>
+      <w:lvlText w:val="%1.%2"/>
+      <w:lvlJc w:val="left"/>
+      <w:pPr>
+        <w:ind w:left="1080" w:hanging="720"/>
+      </w:pPr>
+      <w:rPr>
+        <w:rFonts w:hint="default"/>
+      </w:rPr>
+    </w:lvl>
+    <w:lvl w:ilvl="2">
+      <w:start w:val="1"/>
+      <w:numFmt w:val="decimal"/>
+      <w:isLgl/>
+      <w:lvlText w:val="%1.%2.%3"/>
+      <w:lvlJc w:val="left"/>
+      <w:pPr>
+        <w:ind w:left="1080" w:hanging="720"/>
+      </w:pPr>
+      <w:rPr>
+        <w:rFonts w:hint="default"/>
+      </w:rPr>
+    </w:lvl>
+    <w:lvl w:ilvl="3">
+      <w:start w:val="1"/>
+      <w:numFmt w:val="decimal"/>
+      <w:isLgl/>
+      <w:lvlText w:val="%1.%2.%3.%4"/>
+      <w:lvlJc w:val="left"/>
+      <w:pPr>
+        <w:ind w:left="1440" w:hanging="1080"/>
+      </w:pPr>
+      <w:rPr>
+        <w:rFonts w:hint="default"/>
+      </w:rPr>
+    </w:lvl>
+    <w:lvl w:ilvl="4">
+      <w:start w:val="1"/>
+      <w:numFmt w:val="decimal"/>
+      <w:isLgl/>
+      <w:lvlText w:val="%1.%2.%3.%4.%5"/>
+      <w:lvlJc w:val="left"/>
+      <w:pPr>
+        <w:ind w:left="1440" w:hanging="1080"/>
+      </w:pPr>
+      <w:rPr>
+        <w:rFonts w:hint="default"/>
+      </w:rPr>
+    </w:lvl>
+    <w:lvl w:ilvl="5">
+      <w:start w:val="1"/>
+      <w:numFmt w:val="decimal"/>
+      <w:isLgl/>
+      <w:lvlText w:val="%1.%2.%3.%4.%5.%6"/>
+      <w:lvlJc w:val="left"/>
+      <w:pPr>
+        <w:ind w:left="1800" w:hanging="1440"/>
+      </w:pPr>
+      <w:rPr>
+        <w:rFonts w:hint="default"/>
+      </w:rPr>
+    </w:lvl>
+    <w:lvl w:ilvl="6">
+      <w:start w:val="1"/>
+      <w:numFmt w:val="decimal"/>
+      <w:isLgl/>
+      <w:lvlText w:val="%1.%2.%3.%4.%5.%6.%7"/>
+      <w:lvlJc w:val="left"/>
+      <w:pPr>
+        <w:ind w:left="1800" w:hanging="1440"/>
+      </w:pPr>
+      <w:rPr>
+        <w:rFonts w:hint="default"/>
+      </w:rPr>
+    </w:lvl>
+    <w:lvl w:ilvl="7">
+      <w:start w:val="1"/>
+      <w:numFmt w:val="decimal"/>
+      <w:isLgl/>
+      <w:lvlText w:val="%1.%2.%3.%4.%5.%6.%7.%8"/>
+      <w:lvlJc w:val="left"/>
+      <w:pPr>
+        <w:ind w:left="2160" w:hanging="1800"/>
+      </w:pPr>
+      <w:rPr>
+        <w:rFonts w:hint="default"/>
+      </w:rPr>
+    </w:lvl>
+    <w:lvl w:ilvl="8">
+      <w:start w:val="1"/>
+      <w:numFmt w:val="decimal"/>
+      <w:isLgl/>
+      <w:lvlText w:val="%1.%2.%3.%4.%5.%6.%7.%8.%9"/>
+      <w:lvlJc w:val="left"/>
+      <w:pPr>
+        <w:ind w:left="2520" w:hanging="2160"/>
+      </w:pPr>
+      <w:rPr>
+        <w:rFonts w:hint="default"/>
+      </w:rPr>
+    </w:lvl>
+  </w:abstractNum>
+  <w:abstractNum w:abstractNumId="7">
+    <w:nsid w:val="0324E6A4"/>
+    <w:multiLevelType w:val="hybridMultilevel"/>
+    <w:tmpl w:val="5942A26A"/>
+    <w:lvl w:ilvl="0" w:tplc="4009000D">
+      <w:start w:val="1"/>
+      <w:numFmt w:val="bullet"/>
+      <w:lvlText w:val=""/>
+      <w:lvlJc w:val="left"/>
+      <w:pPr>
+        <w:ind w:left="720" w:hanging="360"/>
+      </w:pPr>
+      <w:rPr>
+        <w:rFonts w:ascii="Wingdings" w:hAnsi="Wingdings" w:hint="default"/>
+      </w:rPr>
+    </w:lvl>
+    <w:lvl w:ilvl="1" w:tplc="08090003" w:tentative="1">
+      <w:start w:val="1"/>
+      <w:numFmt w:val="bullet"/>
+      <w:lvlText w:val="o"/>
+      <w:lvlJc w:val="left"/>
+      <w:pPr>
+        <w:ind w:left="1440" w:hanging="360"/>
+      </w:pPr>
+      <w:rPr>
+        <w:rFonts w:ascii="Courier New" w:hAnsi="Courier New" w:cs="Courier New" w:hint="default"/>
+      </w:rPr>
+    </w:lvl>
+    <w:lvl w:ilvl="2" w:tplc="08090005" w:tentative="1">
+      <w:start w:val="1"/>
+      <w:numFmt w:val="bullet"/>
+      <w:lvlText w:val=""/>
+      <w:lvlJc w:val="left"/>
+      <w:pPr>
+        <w:ind w:left="2160" w:hanging="360"/>
+      </w:pPr>
+      <w:rPr>
+        <w:rFonts w:ascii="Wingdings" w:hAnsi="Wingdings" w:hint="default"/>
+      </w:rPr>
+    </w:lvl>
+    <w:lvl w:ilvl="3" w:tplc="08090001" w:tentative="1">
+      <w:start w:val="1"/>
+      <w:numFmt w:val="bullet"/>
+      <w:lvlText w:val=""/>
+      <w:lvlJc w:val="left"/>
+      <w:pPr>
+        <w:ind w:left="2880" w:hanging="360"/>
+      </w:pPr>
+      <w:rPr>
+        <w:rFonts w:ascii="Symbol" w:hAnsi="Symbol" w:hint="default"/>
+      </w:rPr>
+    </w:lvl>
+    <w:lvl w:ilvl="4" w:tplc="08090003" w:tentative="1">
+      <w:start w:val="1"/>
+      <w:numFmt w:val="bullet"/>
+      <w:lvlText w:val="o"/>
+      <w:lvlJc w:val="left"/>
+      <w:pPr>
+        <w:ind w:left="3600" w:hanging="360"/>
+      </w:pPr>
+      <w:rPr>
+        <w:rFonts w:ascii="Courier New" w:hAnsi="Courier New" w:cs="Courier New" w:hint="default"/>
+      </w:rPr>
+    </w:lvl>
+    <w:lvl w:ilvl="5" w:tplc="08090005" w:tentative="1">
+      <w:start w:val="1"/>
+      <w:numFmt w:val="bullet"/>
+      <w:lvlText w:val=""/>
+      <w:lvlJc w:val="left"/>
+      <w:pPr>
+        <w:ind w:left="4320" w:hanging="360"/>
+      </w:pPr>
+      <w:rPr>
+        <w:rFonts w:ascii="Wingdings" w:hAnsi="Wingdings" w:hint="default"/>
+      </w:rPr>
+    </w:lvl>
+    <w:lvl w:ilvl="6" w:tplc="08090001" w:tentative="1">
+      <w:start w:val="1"/>
+      <w:numFmt w:val="bullet"/>
+      <w:lvlText w:val=""/>
+      <w:lvlJc w:val="left"/>
+      <w:pPr>
+        <w:ind w:left="5040" w:hanging="360"/>
+      </w:pPr>
+      <w:rPr>
+        <w:rFonts w:ascii="Symbol" w:hAnsi="Symbol" w:hint="default"/>
+      </w:rPr>
+    </w:lvl>
+    <w:lvl w:ilvl="7" w:tplc="08090003" w:tentative="1">
+      <w:start w:val="1"/>
+      <w:numFmt w:val="bullet"/>
+      <w:lvlText w:val="o"/>
+      <w:lvlJc w:val="left"/>
+      <w:pPr>
+        <w:ind w:left="5760" w:hanging="360"/>
+      </w:pPr>
+      <w:rPr>
+        <w:rFonts w:ascii="Courier New" w:hAnsi="Courier New" w:cs="Courier New" w:hint="default"/>
+      </w:rPr>
+    </w:lvl>
+    <w:lvl w:ilvl="8" w:tplc="08090005" w:tentative="1">
+      <w:start w:val="1"/>
+      <w:numFmt w:val="bullet"/>
+      <w:lvlText w:val=""/>
+      <w:lvlJc w:val="left"/>
+      <w:pPr>
+        <w:ind w:left="6480" w:hanging="360"/>
+      </w:pPr>
+      <w:rPr>
+        <w:rFonts w:ascii="Wingdings" w:hAnsi="Wingdings" w:hint="default"/>
+      </w:rPr>
+    </w:lvl>
+  </w:abstractNum>
+  <w:abstractNum w:abstractNumId="8">
+    <w:nsid w:val="02CAE8D3"/>
+    <w:multiLevelType w:val="multilevel"/>
+    <w:tmpl w:val="F49ED6D4"/>
+    <w:lvl w:ilvl="0">
+      <w:start w:val="1"/>
+      <w:numFmt w:val="bullet"/>
+      <w:lvlText w:val=""/>
+      <w:lvlJc w:val="left"/>
+      <w:pPr>
+        <w:ind w:left="720" w:hanging="360"/>
+      </w:pPr>
+      <w:rPr>
+        <w:rFonts w:ascii="Wingdings" w:hAnsi="Wingdings" w:hint="default"/>
+      </w:rPr>
+    </w:lvl>
+    <w:lvl w:ilvl="1">
+      <w:numFmt w:val="decimal"/>
+      <w:isLgl/>
+      <w:lvlText w:val="%1.%2"/>
+      <w:lvlJc w:val="left"/>
+      <w:pPr>
+        <w:ind w:left="1080" w:hanging="720"/>
+      </w:pPr>
+      <w:rPr>
+        <w:rFonts w:hint="default"/>
+      </w:rPr>
+    </w:lvl>
+    <w:lvl w:ilvl="2">
+      <w:start w:val="1"/>
+      <w:numFmt w:val="decimal"/>
+      <w:isLgl/>
+      <w:lvlText w:val="%1.%2.%3"/>
+      <w:lvlJc w:val="left"/>
+      <w:pPr>
+        <w:ind w:left="1080" w:hanging="720"/>
+      </w:pPr>
+      <w:rPr>
+        <w:rFonts w:hint="default"/>
+      </w:rPr>
+    </w:lvl>
+    <w:lvl w:ilvl="3">
+      <w:start w:val="1"/>
+      <w:numFmt w:val="decimal"/>
+      <w:isLgl/>
+      <w:lvlText w:val="%1.%2.%3.%4"/>
+      <w:lvlJc w:val="left"/>
+      <w:pPr>
+        <w:ind w:left="1440" w:hanging="1080"/>
+      </w:pPr>
+      <w:rPr>
+        <w:rFonts w:hint="default"/>
+      </w:rPr>
+    </w:lvl>
+    <w:lvl w:ilvl="4">
+      <w:start w:val="1"/>
+      <w:numFmt w:val="decimal"/>
+      <w:isLgl/>
+      <w:lvlText w:val="%1.%2.%3.%4.%5"/>
+      <w:lvlJc w:val="left"/>
+      <w:pPr>
+        <w:ind w:left="1440" w:hanging="1080"/>
+      </w:pPr>
+      <w:rPr>
+        <w:rFonts w:hint="default"/>
+      </w:rPr>
+    </w:lvl>
+    <w:lvl w:ilvl="5">
+      <w:start w:val="1"/>
+      <w:numFmt w:val="decimal"/>
+      <w:isLgl/>
+      <w:lvlText w:val="%1.%2.%3.%4.%5.%6"/>
+      <w:lvlJc w:val="left"/>
+      <w:pPr>
+        <w:ind w:left="1800" w:hanging="1440"/>
+      </w:pPr>
+      <w:rPr>
+        <w:rFonts w:hint="default"/>
+      </w:rPr>
+    </w:lvl>
+    <w:lvl w:ilvl="6">
+      <w:start w:val="1"/>
+      <w:numFmt w:val="decimal"/>
+      <w:isLgl/>
+      <w:lvlText w:val="%1.%2.%3.%4.%5.%6.%7"/>
+      <w:lvlJc w:val="left"/>
+      <w:pPr>
+        <w:ind w:left="1800" w:hanging="1440"/>
+      </w:pPr>
+      <w:rPr>
+        <w:rFonts w:hint="default"/>
+      </w:rPr>
+    </w:lvl>
+    <w:lvl w:ilvl="7">
+      <w:start w:val="1"/>
+      <w:numFmt w:val="decimal"/>
+      <w:isLgl/>
+      <w:lvlText w:val="%1.%2.%3.%4.%5.%6.%7.%8"/>
+      <w:lvlJc w:val="left"/>
+      <w:pPr>
+        <w:ind w:left="2160" w:hanging="1800"/>
+      </w:pPr>
+      <w:rPr>
+        <w:rFonts w:hint="default"/>
+      </w:rPr>
+    </w:lvl>
+    <w:lvl w:ilvl="8">
+      <w:start w:val="1"/>
+      <w:numFmt w:val="decimal"/>
+      <w:isLgl/>
+      <w:lvlText w:val="%1.%2.%3.%4.%5.%6.%7.%8.%9"/>
+      <w:lvlJc w:val="left"/>
+      <w:pPr>
+        <w:ind w:left="2520" w:hanging="2160"/>
+      </w:pPr>
+      <w:rPr>
+        <w:rFonts w:hint="default"/>
+      </w:rPr>
+    </w:lvl>
+  </w:abstractNum>
+  <w:abstractNum w:abstractNumId="9">
+    <w:nsid w:val="04204405"/>
+    <w:multiLevelType w:val="hybridMultilevel"/>
+    <w:tmpl w:val="18A27DAE"/>
+    <w:lvl w:ilvl="0" w:tplc="4009000F">
+      <w:start w:val="1"/>
+      <w:numFmt w:val="decimal"/>
+      <w:lvlText w:val="%1."/>
+      <w:lvlJc w:val="left"/>
+      <w:pPr>
+        <w:ind w:left="720" w:hanging="360"/>
+      </w:pPr>
+      <w:rPr>
+        <w:rFonts w:hint="default"/>
+      </w:rPr>
+    </w:lvl>
+    <w:lvl w:ilvl="1" w:tplc="40090019" w:tentative="1">
+      <w:start w:val="1"/>
+      <w:numFmt w:val="lowerLetter"/>
+      <w:lvlText w:val="%2."/>
+      <w:lvlJc w:val="left"/>
+      <w:pPr>
+        <w:ind w:left="1440" w:hanging="360"/>
+      </w:pPr>
+    </w:lvl>
+    <w:lvl w:ilvl="2" w:tplc="4009001B" w:tentative="1">
+      <w:start w:val="1"/>
+      <w:numFmt w:val="lowerRoman"/>
+      <w:lvlText w:val="%3."/>
+      <w:lvlJc w:val="right"/>
+      <w:pPr>
+        <w:ind w:left="2160" w:hanging="180"/>
+      </w:pPr>
+    </w:lvl>
+    <w:lvl w:ilvl="3" w:tplc="4009000F" w:tentative="1">
+      <w:start w:val="1"/>
+      <w:numFmt w:val="decimal"/>
+      <w:lvlText w:val="%4."/>
+      <w:lvlJc w:val="left"/>
+      <w:pPr>
+        <w:ind w:left="2880" w:hanging="360"/>
+      </w:pPr>
+    </w:lvl>
+    <w:lvl w:ilvl="4" w:tplc="40090019" w:tentative="1">
+      <w:start w:val="1"/>
+      <w:numFmt w:val="lowerLetter"/>
+      <w:lvlText w:val="%5."/>
+      <w:lvlJc w:val="left"/>
+      <w:pPr>
+        <w:ind w:left="3600" w:hanging="360"/>
+      </w:pPr>
+    </w:lvl>
+    <w:lvl w:ilvl="5" w:tplc="4009001B" w:tentative="1">
+      <w:start w:val="1"/>
+      <w:numFmt w:val="lowerRoman"/>
+      <w:lvlText w:val="%6."/>
+      <w:lvlJc w:val="right"/>
+      <w:pPr>
+        <w:ind w:left="4320" w:hanging="180"/>
+      </w:pPr>
+    </w:lvl>
+    <w:lvl w:ilvl="6" w:tplc="4009000F" w:tentative="1">
+      <w:start w:val="1"/>
+      <w:numFmt w:val="decimal"/>
+      <w:lvlText w:val="%7."/>
+      <w:lvlJc w:val="left"/>
+      <w:pPr>
+        <w:ind w:left="5040" w:hanging="360"/>
+      </w:pPr>
+    </w:lvl>
+    <w:lvl w:ilvl="7" w:tplc="40090019" w:tentative="1">
+      <w:start w:val="1"/>
+      <w:numFmt w:val="lowerLetter"/>
+      <w:lvlText w:val="%8."/>
+      <w:lvlJc w:val="left"/>
+      <w:pPr>
+        <w:ind w:left="5760" w:hanging="360"/>
+      </w:pPr>
+    </w:lvl>
+    <w:lvl w:ilvl="8" w:tplc="4009001B" w:tentative="1">
+      <w:start w:val="1"/>
+      <w:numFmt w:val="lowerRoman"/>
+      <w:lvlText w:val="%9."/>
+      <w:lvlJc w:val="right"/>
+      <w:pPr>
+        <w:ind w:left="6480" w:hanging="180"/>
+      </w:pPr>
+    </w:lvl>
+  </w:abstractNum>
+  <w:abstractNum w:abstractNumId="10">
+    <w:nsid w:val="020BBA6F"/>
+    <w:multiLevelType w:val="hybridMultilevel"/>
+    <w:tmpl w:val="F418E50A"/>
+    <w:lvl w:ilvl="0" w:tplc="0809000F">
+      <w:start w:val="1"/>
+      <w:numFmt w:val="decimal"/>
+      <w:lvlText w:val="%1."/>
+      <w:lvlJc w:val="left"/>
+      <w:pPr>
+        <w:ind w:left="720" w:hanging="360"/>
+      </w:pPr>
+    </w:lvl>
+    <w:lvl w:ilvl="1" w:tplc="08090019">
+      <w:start w:val="1"/>
+      <w:numFmt w:val="lowerLetter"/>
+      <w:lvlText w:val="%2."/>
+      <w:lvlJc w:val="left"/>
+      <w:pPr>
+        <w:ind w:left="1440" w:hanging="360"/>
+      </w:pPr>
+    </w:lvl>
+    <w:lvl w:ilvl="2" w:tplc="0809001B" w:tentative="1">
+      <w:start w:val="1"/>
+      <w:numFmt w:val="lowerRoman"/>
+      <w:lvlText w:val="%3."/>
+      <w:lvlJc w:val="right"/>
+      <w:pPr>
+        <w:ind w:left="2160" w:hanging="180"/>
+      </w:pPr>
+    </w:lvl>
+    <w:lvl w:ilvl="3" w:tplc="0809000F" w:tentative="1">
+      <w:start w:val="1"/>
+      <w:numFmt w:val="decimal"/>
+      <w:lvlText w:val="%4."/>
+      <w:lvlJc w:val="left"/>
+      <w:pPr>
+        <w:ind w:left="2880" w:hanging="360"/>
+      </w:pPr>
+    </w:lvl>
+    <w:lvl w:ilvl="4" w:tplc="08090019" w:tentative="1">
+      <w:start w:val="1"/>
+      <w:numFmt w:val="lowerLetter"/>
+      <w:lvlText w:val="%5."/>
+      <w:lvlJc w:val="left"/>
+      <w:pPr>
+        <w:ind w:left="3600" w:hanging="360"/>
+      </w:pPr>
+    </w:lvl>
+    <w:lvl w:ilvl="5" w:tplc="0809001B" w:tentative="1">
+      <w:start w:val="1"/>
+      <w:numFmt w:val="lowerRoman"/>
+      <w:lvlText w:val="%6."/>
+      <w:lvlJc w:val="right"/>
+      <w:pPr>
+        <w:ind w:left="4320" w:hanging="180"/>
+      </w:pPr>
+    </w:lvl>
+    <w:lvl w:ilvl="6" w:tplc="0809000F" w:tentative="1">
+      <w:start w:val="1"/>
+      <w:numFmt w:val="decimal"/>
+      <w:lvlText w:val="%7."/>
+      <w:lvlJc w:val="left"/>
+      <w:pPr>
+        <w:ind w:left="5040" w:hanging="360"/>
+      </w:pPr>
+    </w:lvl>
+    <w:lvl w:ilvl="7" w:tplc="08090019" w:tentative="1">
+      <w:start w:val="1"/>
+      <w:numFmt w:val="lowerLetter"/>
+      <w:lvlText w:val="%8."/>
+      <w:lvlJc w:val="left"/>
+      <w:pPr>
+        <w:ind w:left="5760" w:hanging="360"/>
+      </w:pPr>
+    </w:lvl>
+    <w:lvl w:ilvl="8" w:tplc="0809001B" w:tentative="1">
+      <w:start w:val="1"/>
+      <w:numFmt w:val="lowerRoman"/>
+      <w:lvlText w:val="%9."/>
+      <w:lvlJc w:val="right"/>
+      <w:pPr>
+        <w:ind w:left="6480" w:hanging="180"/>
+      </w:pPr>
+    </w:lvl>
+  </w:abstractNum>
+  <w:abstractNum w:abstractNumId="11">
+    <w:nsid w:val="04BC1E6A"/>
+    <w:multiLevelType w:val="hybridMultilevel"/>
+    <w:tmpl w:val="B43CDD9C"/>
+    <w:lvl w:ilvl="0" w:tplc="04090001">
+      <w:start w:val="1"/>
+      <w:numFmt w:val="bullet"/>
+      <w:lvlText w:val=""/>
+      <w:lvlJc w:val="left"/>
+      <w:pPr>
+        <w:ind w:left="720" w:hanging="360"/>
+      </w:pPr>
+      <w:rPr>
+        <w:rFonts w:ascii="Symbol" w:hAnsi="Symbol" w:hint="default"/>
+      </w:rPr>
+    </w:lvl>
+    <w:lvl w:ilvl="1" w:tplc="04090003" w:tentative="1">
+      <w:start w:val="1"/>
+      <w:numFmt w:val="bullet"/>
+      <w:lvlText w:val="o"/>
+      <w:lvlJc w:val="left"/>
+      <w:pPr>
+        <w:ind w:left="1440" w:hanging="360"/>
+      </w:pPr>
+      <w:rPr>
+        <w:rFonts w:ascii="Courier New" w:hAnsi="Courier New" w:cs="Courier New" w:hint="default"/>
+      </w:rPr>
+    </w:lvl>
+    <w:lvl w:ilvl="2" w:tplc="04090005" w:tentative="1">
+      <w:start w:val="1"/>
+      <w:numFmt w:val="bullet"/>
+      <w:lvlText w:val=""/>
+      <w:lvlJc w:val="left"/>
+      <w:pPr>
+        <w:ind w:left="2160" w:hanging="360"/>
+      </w:pPr>
+      <w:rPr>
+        <w:rFonts w:ascii="Wingdings" w:hAnsi="Wingdings" w:hint="default"/>
+      </w:rPr>
+    </w:lvl>
+    <w:lvl w:ilvl="3" w:tplc="04090001" w:tentative="1">
+      <w:start w:val="1"/>
+      <w:numFmt w:val="bullet"/>
+      <w:lvlText w:val=""/>
+      <w:lvlJc w:val="left"/>
+      <w:pPr>
+        <w:ind w:left="2880" w:hanging="360"/>
+      </w:pPr>
+      <w:rPr>
+        <w:rFonts w:ascii="Symbol" w:hAnsi="Symbol" w:hint="default"/>
+      </w:rPr>
+    </w:lvl>
+    <w:lvl w:ilvl="4" w:tplc="04090003" w:tentative="1">
+      <w:start w:val="1"/>
+      <w:numFmt w:val="bullet"/>
+      <w:lvlText w:val="o"/>
+      <w:lvlJc w:val="left"/>
+      <w:pPr>
+        <w:ind w:left="3600" w:hanging="360"/>
+      </w:pPr>
+      <w:rPr>
+        <w:rFonts w:ascii="Courier New" w:hAnsi="Courier New" w:cs="Courier New" w:hint="default"/>
+      </w:rPr>
+    </w:lvl>
+    <w:lvl w:ilvl="5" w:tplc="04090005" w:tentative="1">
+      <w:start w:val="1"/>
+      <w:numFmt w:val="bullet"/>
+      <w:lvlText w:val=""/>
+      <w:lvlJc w:val="left"/>
+      <w:pPr>
+        <w:ind w:left="4320" w:hanging="360"/>
+      </w:pPr>
+      <w:rPr>
+        <w:rFonts w:ascii="Wingdings" w:hAnsi="Wingdings" w:hint="default"/>
+      </w:rPr>
+    </w:lvl>
+    <w:lvl w:ilvl="6" w:tplc="04090001" w:tentative="1">
+      <w:start w:val="1"/>
+      <w:numFmt w:val="bullet"/>
+      <w:lvlText w:val=""/>
+      <w:lvlJc w:val="left"/>
+      <w:pPr>
+        <w:ind w:left="5040" w:hanging="360"/>
+      </w:pPr>
+      <w:rPr>
+        <w:rFonts w:ascii="Symbol" w:hAnsi="Symbol" w:hint="default"/>
+      </w:rPr>
+    </w:lvl>
+    <w:lvl w:ilvl="7" w:tplc="04090003" w:tentative="1">
+      <w:start w:val="1"/>
+      <w:numFmt w:val="bullet"/>
+      <w:lvlText w:val="o"/>
+      <w:lvlJc w:val="left"/>
+      <w:pPr>
+        <w:ind w:left="5760" w:hanging="360"/>
+      </w:pPr>
+      <w:rPr>
+        <w:rFonts w:ascii="Courier New" w:hAnsi="Courier New" w:cs="Courier New" w:hint="default"/>
+      </w:rPr>
+    </w:lvl>
+    <w:lvl w:ilvl="8" w:tplc="04090005" w:tentative="1">
+      <w:start w:val="1"/>
+      <w:numFmt w:val="bullet"/>
+      <w:lvlText w:val=""/>
+      <w:lvlJc w:val="left"/>
+      <w:pPr>
+        <w:ind w:left="6480" w:hanging="360"/>
+      </w:pPr>
+      <w:rPr>
+        <w:rFonts w:ascii="Wingdings" w:hAnsi="Wingdings" w:hint="default"/>
+      </w:rPr>
+    </w:lvl>
+  </w:abstractNum>
   <w:num w:numId="1">
     <w:abstractNumId w:val="1"/>
     <w:lvlOverride w:ilvl="0">
@@ -25620,6 +26494,42 @@
     <w:lvlOverride w:ilvl="0">
       <w:startOverride w:val="1"/>
     </w:lvlOverride>
+  </w:num>
+  <w:num w:numId="4">
+    <w:abstractNumId w:val="4"/>
+  </w:num>
+  <w:num w:numId="5">
+    <w:abstractNumId w:val="5"/>
+  </w:num>
+  <w:num w:numId="6">
+    <w:abstractNumId w:val="6"/>
+  </w:num>
+  <w:num w:numId="7">
+    <w:abstractNumId w:val="7"/>
+  </w:num>
+  <w:num w:numId="8">
+    <w:abstractNumId w:val="8"/>
+  </w:num>
+  <w:num w:numId="9">
+    <w:abstractNumId w:val="9"/>
+  </w:num>
+  <w:num w:numId="10">
+    <w:abstractNumId w:val="9"/>
+    <w:lvlOverride w:ilvl="0">
+      <w:startOverride w:val="1"/>
+    </w:lvlOverride>
+  </w:num>
+  <w:num w:numId="11">
+    <w:abstractNumId w:val="10"/>
+  </w:num>
+  <w:num w:numId="12">
+    <w:abstractNumId w:val="10"/>
+    <w:lvlOverride w:ilvl="0">
+      <w:startOverride w:val="1"/>
+    </w:lvlOverride>
+  </w:num>
+  <w:num w:numId="13">
+    <w:abstractNumId w:val="11"/>
   </w:num>
   <w:num w:numId="3">
     <w:abstractNumId w:val="3"/>
@@ -25833,5 +26743,57 @@
       <w:u w:val="single"/>
     </w:rPr>
   </w:style>
+  <w:style w:type="paragraph" w:styleId="NoSpacing">
+    <w:name w:val="No Spacing"/>
+    <w:uiPriority w:val="1"/>
+    <w:qFormat/>
+    <w:rsid w:val="00BB5E58"/>
+    <w:rPr>
+      <w:rFonts w:asciiTheme="minorHAnsi" w:eastAsiaTheme="minorHAnsi" w:hAnsiTheme="minorHAnsi" w:cstheme="minorBidi"/>
+      <w:sz w:val="22"/>
+      <w:szCs w:val="22"/>
+      <w:lang w:val="en-US"/>
+    </w:rPr>
+  </w:style>
+  <w:style w:type="table" w:styleId="TableGrid">
+    <w:name w:val="Table Grid"/>
+    <w:basedOn w:val="TableNormal"/>
+    <w:rsid w:val="00EF2819"/>
+    <w:tblPr>
+      <w:tblInd w:w="0" w:type="dxa"/>
+      <w:tblBorders>
+        <w:top w:val="single" w:sz="4" w:space="0" w:color="auto"/>
+        <w:left w:val="single" w:sz="4" w:space="0" w:color="auto"/>
+        <w:bottom w:val="single" w:sz="4" w:space="0" w:color="auto"/>
+        <w:right w:val="single" w:sz="4" w:space="0" w:color="auto"/>
+        <w:insideH w:val="single" w:sz="4" w:space="0" w:color="auto"/>
+        <w:insideV w:val="single" w:sz="4" w:space="0" w:color="auto"/>
+      </w:tblBorders>
+      <w:tblCellMar>
+        <w:top w:w="0" w:type="dxa"/>
+        <w:left w:w="108" w:type="dxa"/>
+        <w:bottom w:w="0" w:type="dxa"/>
+        <w:right w:w="108" w:type="dxa"/>
+      </w:tblCellMar>
+    </w:tblPr>
+  </w:style>
+  <w:style w:type="paragraph" w:customStyle="1" w:styleId="TableParagraph">
+    <w:name w:val="Table Paragraph"/>
+    <w:basedOn w:val="Normal"/>
+    <w:uiPriority w:val="1"/>
+    <w:qFormat/>
+    <w:rsid w:val="003A6EAC"/>
+    <w:pPr>
+      <w:widowControl w:val="0"/>
+      <w:autoSpaceDE w:val="0"/>
+      <w:autoSpaceDN w:val="0"/>
+      <w:ind w:left="107"/>
+    </w:pPr>
+    <w:rPr>
+      <w:sz w:val="22"/>
+      <w:szCs w:val="22"/>
+      <w:lang w:val="en-US" w:eastAsia="en-US" w:bidi="ar-SA"/>
+    </w:rPr>
+  </w:style>
 </w:styles>
 </file>
</xml_diff>

<commit_message>
fix: remove blank page in regen offer (cover→PART-A double break)
After composing, the cover ended with a page break + two empty spacer paragraphs
and PART-A carried its own page break — stacking into a blank page between the
cover and the technical offer. Drop the redundant break + spacers so PART-A
starts cleanly on the next page. Remaining breaks (BOM / Make List / PART-B) are
single intended section starts.

Co-Authored-By: Claude Opus 4.8 (1M context) <noreply@anthropic.com>
</commit_message>
<xml_diff>
--- a/Regen_Offer_Template.docx
+++ b/Regen_Offer_Template.docx
@@ -822,25 +822,6 @@
             </a:graphic>
           </wp:inline>
         </w:drawing>
-      </w:r>
-    </w:p>
-    <w:p>
-      <w:r>
-        <w:br w:type="page"/>
-      </w:r>
-    </w:p>
-    <w:p/>
-    <w:p>
-      <w:pPr>
-        <w:jc w:val="left"/>
-      </w:pPr>
-      <w:r>
-        <w:rPr>
-          <w:rFonts w:ascii="Calibri" w:hAnsi="Calibri"/>
-          <w:b w:val="0"/>
-          <w:sz w:val="22"/>
-          <w:u w:val="none"/>
-        </w:rPr>
       </w:r>
     </w:p>
     <w:p>

</xml_diff>

<commit_message>
fix: correct spelling/typos in the regen offer template
Inherited typos from the reference offer:
- 'PART OR REGENERTAIVE BURNER' -> 'PART OF REGENERATIVE BURNER'
- ROI: 'Regnerative'->'Regenerative', 'Maintainace'->'Maintenance',
  'Additioanl'->'Additional'
- Terms: 'which fall in your preview' -> 'purview'
- Exclusions: 'earthling materials' -> 'earthing materials'
- Make list: 'Contractor/MCB' -> 'Contactor/MCB'
- Degree symbol lost as '0': '4000C'->'400 °C', '10000C'->'1000 °C',
  '3000C'->'300 °C'

Co-Authored-By: Claude Opus 4.8 (1M context) <noreply@anthropic.com>
</commit_message>
<xml_diff>
--- a/Regen_Offer_Template.docx
+++ b/Regen_Offer_Template.docx
@@ -1326,7 +1326,7 @@
           <w:sz w:val="24"/>
           <w:szCs w:val="24"/>
         </w:rPr>
-        <w:t>The chart shows the Saving in natural gas in a furnace compared to a system with no recuperator, a system with a recuperator giving a preheat temperature of 400</w:t>
+        <w:t>The chart shows the Saving in natural gas in a furnace compared to a system with no recuperator, a system with a recuperator giving a preheat temperature of 400 °C</w:t>
       </w:r>
       <w:r>
         <w:rPr>
@@ -1335,31 +1335,28 @@
           <w:szCs w:val="24"/>
           <w:vertAlign w:val="superscript"/>
         </w:rPr>
-        <w:t>0</w:t>
-      </w:r>
-      <w:r>
-        <w:rPr>
-          <w:rFonts w:ascii="Times New Roman" w:hAnsi="Times New Roman" w:cs="Times New Roman"/>
-          <w:sz w:val="24"/>
-          <w:szCs w:val="24"/>
-        </w:rPr>
-        <w:t xml:space="preserve">C and with Regenerative burners operating with a preheat temperature of </w:t>
-      </w:r>
-      <w:r>
-        <w:rPr>
-          <w:rFonts w:ascii="Times New Roman" w:hAnsi="Times New Roman" w:cs="Times New Roman"/>
-          <w:sz w:val="24"/>
-          <w:szCs w:val="24"/>
-        </w:rPr>
-        <w:t>10</w:t>
-      </w:r>
-      <w:r>
-        <w:rPr>
-          <w:rFonts w:ascii="Times New Roman" w:hAnsi="Times New Roman" w:cs="Times New Roman"/>
-          <w:sz w:val="24"/>
-          <w:szCs w:val="24"/>
-        </w:rPr>
-        <w:t>00</w:t>
+      </w:r>
+      <w:r>
+        <w:rPr>
+          <w:rFonts w:ascii="Times New Roman" w:hAnsi="Times New Roman" w:cs="Times New Roman"/>
+          <w:sz w:val="24"/>
+          <w:szCs w:val="24"/>
+        </w:rPr>
+        <w:t xml:space="preserve"> and with Regenerative burners operating with a preheat temperature of 1000 °C</w:t>
+      </w:r>
+      <w:r>
+        <w:rPr>
+          <w:rFonts w:ascii="Times New Roman" w:hAnsi="Times New Roman" w:cs="Times New Roman"/>
+          <w:sz w:val="24"/>
+          <w:szCs w:val="24"/>
+        </w:rPr>
+      </w:r>
+      <w:r>
+        <w:rPr>
+          <w:rFonts w:ascii="Times New Roman" w:hAnsi="Times New Roman" w:cs="Times New Roman"/>
+          <w:sz w:val="24"/>
+          <w:szCs w:val="24"/>
+        </w:rPr>
       </w:r>
       <w:r>
         <w:rPr>
@@ -1368,15 +1365,14 @@
           <w:szCs w:val="24"/>
           <w:vertAlign w:val="superscript"/>
         </w:rPr>
-        <w:t>0</w:t>
-      </w:r>
-      <w:r>
-        <w:rPr>
-          <w:rFonts w:ascii="Times New Roman" w:hAnsi="Times New Roman" w:cs="Times New Roman"/>
-          <w:sz w:val="24"/>
-          <w:szCs w:val="24"/>
-        </w:rPr>
-        <w:t xml:space="preserve">C.  </w:t>
+      </w:r>
+      <w:r>
+        <w:rPr>
+          <w:rFonts w:ascii="Times New Roman" w:hAnsi="Times New Roman" w:cs="Times New Roman"/>
+          <w:sz w:val="24"/>
+          <w:szCs w:val="24"/>
+        </w:rPr>
+        <w:t xml:space="preserve">.  </w:t>
       </w:r>
     </w:p>
     <w:tbl>
@@ -2192,7 +2188,7 @@
           <w:b/>
           <w:u w:val="single"/>
         </w:rPr>
-        <w:t>PART OR REGENERTAIVE BURNER</w:t>
+        <w:t>PART OF REGENERATIVE BURNER</w:t>
       </w:r>
       <w:r>
         <w:rPr>
@@ -3363,7 +3359,7 @@
           <w:sz w:val="24"/>
           <w:szCs w:val="24"/>
         </w:rPr>
-        <w:t xml:space="preserve"> &amp; pressure, max. temp 300</w:t>
+        <w:t xml:space="preserve"> &amp; pressure, max. temp 300 °C</w:t>
       </w:r>
       <w:r>
         <w:rPr>
@@ -3372,15 +3368,14 @@
           <w:szCs w:val="24"/>
           <w:vertAlign w:val="superscript"/>
         </w:rPr>
-        <w:t>0</w:t>
-      </w:r>
-      <w:r>
-        <w:rPr>
-          <w:rFonts w:ascii="Times New Roman" w:hAnsi="Times New Roman" w:cs="Times New Roman"/>
-          <w:sz w:val="24"/>
-          <w:szCs w:val="24"/>
-        </w:rPr>
-        <w:t xml:space="preserve">C and the </w:t>
+      </w:r>
+      <w:r>
+        <w:rPr>
+          <w:rFonts w:ascii="Times New Roman" w:hAnsi="Times New Roman" w:cs="Times New Roman"/>
+          <w:sz w:val="24"/>
+          <w:szCs w:val="24"/>
+        </w:rPr>
+        <w:t xml:space="preserve"> and the </w:t>
       </w:r>
       <w:r>
         <w:rPr>
@@ -13402,15 +13397,14 @@
                 <w:sz w:val="24"/>
                 <w:szCs w:val="24"/>
               </w:rPr>
-              <w:t>a</w:t>
-            </w:r>
-            <w:r>
-              <w:rPr>
-                <w:rFonts w:ascii="Times New Roman" w:hAnsi="Times New Roman" w:cs="Times New Roman"/>
-                <w:sz w:val="24"/>
-                <w:szCs w:val="24"/>
-              </w:rPr>
-              <w:t>nd</w:t>
+              <w:t>and earthing materials</w:t>
+            </w:r>
+            <w:r>
+              <w:rPr>
+                <w:rFonts w:ascii="Times New Roman" w:hAnsi="Times New Roman" w:cs="Times New Roman"/>
+                <w:sz w:val="24"/>
+                <w:szCs w:val="24"/>
+              </w:rPr>
             </w:r>
             <w:r>
               <w:rPr>
@@ -13419,7 +13413,6 @@
                 <w:sz w:val="24"/>
                 <w:szCs w:val="24"/>
               </w:rPr>
-              <w:t xml:space="preserve"> </w:t>
             </w:r>
             <w:r>
               <w:rPr>
@@ -13428,7 +13421,6 @@
                 <w:sz w:val="24"/>
                 <w:szCs w:val="24"/>
               </w:rPr>
-              <w:t>e</w:t>
             </w:r>
             <w:r>
               <w:rPr>
@@ -13437,15 +13429,13 @@
                 <w:sz w:val="24"/>
                 <w:szCs w:val="24"/>
               </w:rPr>
-              <w:t>a</w:t>
-            </w:r>
-            <w:r>
-              <w:rPr>
-                <w:rFonts w:ascii="Times New Roman" w:hAnsi="Times New Roman" w:cs="Times New Roman"/>
-                <w:sz w:val="24"/>
-                <w:szCs w:val="24"/>
-              </w:rPr>
-              <w:t>rt</w:t>
+            </w:r>
+            <w:r>
+              <w:rPr>
+                <w:rFonts w:ascii="Times New Roman" w:hAnsi="Times New Roman" w:cs="Times New Roman"/>
+                <w:sz w:val="24"/>
+                <w:szCs w:val="24"/>
+              </w:rPr>
             </w:r>
             <w:r>
               <w:rPr>
@@ -13454,15 +13444,13 @@
                 <w:sz w:val="24"/>
                 <w:szCs w:val="24"/>
               </w:rPr>
-              <w:t>h</w:t>
-            </w:r>
-            <w:r>
-              <w:rPr>
-                <w:rFonts w:ascii="Times New Roman" w:hAnsi="Times New Roman" w:cs="Times New Roman"/>
-                <w:sz w:val="24"/>
-                <w:szCs w:val="24"/>
-              </w:rPr>
-              <w:t>ling</w:t>
+            </w:r>
+            <w:r>
+              <w:rPr>
+                <w:rFonts w:ascii="Times New Roman" w:hAnsi="Times New Roman" w:cs="Times New Roman"/>
+                <w:sz w:val="24"/>
+                <w:szCs w:val="24"/>
+              </w:rPr>
             </w:r>
             <w:r>
               <w:rPr>
@@ -13471,15 +13459,13 @@
                 <w:sz w:val="24"/>
                 <w:szCs w:val="24"/>
               </w:rPr>
-              <w:t xml:space="preserve"> </w:t>
-            </w:r>
-            <w:r>
-              <w:rPr>
-                <w:rFonts w:ascii="Times New Roman" w:hAnsi="Times New Roman" w:cs="Times New Roman"/>
-                <w:sz w:val="24"/>
-                <w:szCs w:val="24"/>
-              </w:rPr>
-              <w:t>mat</w:t>
+            </w:r>
+            <w:r>
+              <w:rPr>
+                <w:rFonts w:ascii="Times New Roman" w:hAnsi="Times New Roman" w:cs="Times New Roman"/>
+                <w:sz w:val="24"/>
+                <w:szCs w:val="24"/>
+              </w:rPr>
             </w:r>
             <w:r>
               <w:rPr>
@@ -13488,15 +13474,13 @@
                 <w:sz w:val="24"/>
                 <w:szCs w:val="24"/>
               </w:rPr>
-              <w:t>e</w:t>
-            </w:r>
-            <w:r>
-              <w:rPr>
-                <w:rFonts w:ascii="Times New Roman" w:hAnsi="Times New Roman" w:cs="Times New Roman"/>
-                <w:sz w:val="24"/>
-                <w:szCs w:val="24"/>
-              </w:rPr>
-              <w:t>ri</w:t>
+            </w:r>
+            <w:r>
+              <w:rPr>
+                <w:rFonts w:ascii="Times New Roman" w:hAnsi="Times New Roman" w:cs="Times New Roman"/>
+                <w:sz w:val="24"/>
+                <w:szCs w:val="24"/>
+              </w:rPr>
             </w:r>
             <w:r>
               <w:rPr>
@@ -13505,15 +13489,13 @@
                 <w:sz w:val="24"/>
                 <w:szCs w:val="24"/>
               </w:rPr>
-              <w:t>a</w:t>
-            </w:r>
-            <w:r>
-              <w:rPr>
-                <w:rFonts w:ascii="Times New Roman" w:hAnsi="Times New Roman" w:cs="Times New Roman"/>
-                <w:sz w:val="24"/>
-                <w:szCs w:val="24"/>
-              </w:rPr>
-              <w:t>ls</w:t>
+            </w:r>
+            <w:r>
+              <w:rPr>
+                <w:rFonts w:ascii="Times New Roman" w:hAnsi="Times New Roman" w:cs="Times New Roman"/>
+                <w:sz w:val="24"/>
+                <w:szCs w:val="24"/>
+              </w:rPr>
             </w:r>
             <w:r>
               <w:rPr>
@@ -15362,7 +15344,7 @@
                 <w:sz w:val="24"/>
                 <w:szCs w:val="24"/>
               </w:rPr>
-              <w:t>Contractor/MCB</w:t>
+              <w:t>Contactor/MCB</w:t>
             </w:r>
           </w:p>
         </w:tc>
@@ -21814,7 +21796,7 @@
           <w:sz w:val="24"/>
           <w:szCs w:val="24"/>
         </w:rPr>
-        <w:t>wh</w:t>
+        <w:t>which fall in your purview</w:t>
       </w:r>
       <w:r>
         <w:rPr>
@@ -21823,7 +21805,6 @@
           <w:sz w:val="24"/>
           <w:szCs w:val="24"/>
         </w:rPr>
-        <w:t>i</w:t>
       </w:r>
       <w:r>
         <w:rPr>
@@ -21832,15 +21813,13 @@
           <w:sz w:val="24"/>
           <w:szCs w:val="24"/>
         </w:rPr>
-        <w:t>c</w:t>
-      </w:r>
-      <w:r>
-        <w:rPr>
-          <w:rFonts w:ascii="Times New Roman" w:hAnsi="Times New Roman" w:cs="Times New Roman"/>
-          <w:sz w:val="24"/>
-          <w:szCs w:val="24"/>
-        </w:rPr>
-        <w:t>h f</w:t>
+      </w:r>
+      <w:r>
+        <w:rPr>
+          <w:rFonts w:ascii="Times New Roman" w:hAnsi="Times New Roman" w:cs="Times New Roman"/>
+          <w:sz w:val="24"/>
+          <w:szCs w:val="24"/>
+        </w:rPr>
       </w:r>
       <w:r>
         <w:rPr>
@@ -21849,15 +21828,13 @@
           <w:sz w:val="24"/>
           <w:szCs w:val="24"/>
         </w:rPr>
-        <w:t>a</w:t>
-      </w:r>
-      <w:r>
-        <w:rPr>
-          <w:rFonts w:ascii="Times New Roman" w:hAnsi="Times New Roman" w:cs="Times New Roman"/>
-          <w:sz w:val="24"/>
-          <w:szCs w:val="24"/>
-        </w:rPr>
-        <w:t>ll</w:t>
+      </w:r>
+      <w:r>
+        <w:rPr>
+          <w:rFonts w:ascii="Times New Roman" w:hAnsi="Times New Roman" w:cs="Times New Roman"/>
+          <w:sz w:val="24"/>
+          <w:szCs w:val="24"/>
+        </w:rPr>
       </w:r>
       <w:r>
         <w:rPr>
@@ -21866,15 +21843,13 @@
           <w:sz w:val="24"/>
           <w:szCs w:val="24"/>
         </w:rPr>
-        <w:t xml:space="preserve"> </w:t>
-      </w:r>
-      <w:r>
-        <w:rPr>
-          <w:rFonts w:ascii="Times New Roman" w:hAnsi="Times New Roman" w:cs="Times New Roman"/>
-          <w:sz w:val="24"/>
-          <w:szCs w:val="24"/>
-        </w:rPr>
-        <w:t>in</w:t>
+      </w:r>
+      <w:r>
+        <w:rPr>
+          <w:rFonts w:ascii="Times New Roman" w:hAnsi="Times New Roman" w:cs="Times New Roman"/>
+          <w:sz w:val="24"/>
+          <w:szCs w:val="24"/>
+        </w:rPr>
       </w:r>
       <w:r>
         <w:rPr>
@@ -21883,7 +21858,6 @@
           <w:sz w:val="24"/>
           <w:szCs w:val="24"/>
         </w:rPr>
-        <w:t xml:space="preserve"> </w:t>
       </w:r>
       <w:r>
         <w:rPr>
@@ -21892,15 +21866,13 @@
           <w:sz w:val="24"/>
           <w:szCs w:val="24"/>
         </w:rPr>
-        <w:t>y</w:t>
-      </w:r>
-      <w:r>
-        <w:rPr>
-          <w:rFonts w:ascii="Times New Roman" w:hAnsi="Times New Roman" w:cs="Times New Roman"/>
-          <w:sz w:val="24"/>
-          <w:szCs w:val="24"/>
-        </w:rPr>
-        <w:t xml:space="preserve">our </w:t>
+      </w:r>
+      <w:r>
+        <w:rPr>
+          <w:rFonts w:ascii="Times New Roman" w:hAnsi="Times New Roman" w:cs="Times New Roman"/>
+          <w:sz w:val="24"/>
+          <w:szCs w:val="24"/>
+        </w:rPr>
       </w:r>
       <w:r>
         <w:rPr>
@@ -21909,15 +21881,13 @@
           <w:sz w:val="24"/>
           <w:szCs w:val="24"/>
         </w:rPr>
-        <w:t>p</w:t>
-      </w:r>
-      <w:r>
-        <w:rPr>
-          <w:rFonts w:ascii="Times New Roman" w:hAnsi="Times New Roman" w:cs="Times New Roman"/>
-          <w:sz w:val="24"/>
-          <w:szCs w:val="24"/>
-        </w:rPr>
-        <w:t>r</w:t>
+      </w:r>
+      <w:r>
+        <w:rPr>
+          <w:rFonts w:ascii="Times New Roman" w:hAnsi="Times New Roman" w:cs="Times New Roman"/>
+          <w:sz w:val="24"/>
+          <w:szCs w:val="24"/>
+        </w:rPr>
       </w:r>
       <w:r>
         <w:rPr>
@@ -21926,15 +21896,13 @@
           <w:sz w:val="24"/>
           <w:szCs w:val="24"/>
         </w:rPr>
-        <w:t>e</w:t>
-      </w:r>
-      <w:r>
-        <w:rPr>
-          <w:rFonts w:ascii="Times New Roman" w:hAnsi="Times New Roman" w:cs="Times New Roman"/>
-          <w:sz w:val="24"/>
-          <w:szCs w:val="24"/>
-        </w:rPr>
-        <w:t>vie</w:t>
+      </w:r>
+      <w:r>
+        <w:rPr>
+          <w:rFonts w:ascii="Times New Roman" w:hAnsi="Times New Roman" w:cs="Times New Roman"/>
+          <w:sz w:val="24"/>
+          <w:szCs w:val="24"/>
+        </w:rPr>
       </w:r>
       <w:r>
         <w:rPr>
@@ -21943,7 +21911,6 @@
           <w:sz w:val="24"/>
           <w:szCs w:val="24"/>
         </w:rPr>
-        <w:t>w</w:t>
       </w:r>
       <w:r>
         <w:rPr>
@@ -24202,15 +24169,13 @@
           </w:tcPr>
           <w:p>
             <w:r>
-              <w:t xml:space="preserve">Cost of </w:t>
+              <w:t>Cost of Regenerative Burner System</w:t>
             </w:r>
             <w:proofErr w:type="spellStart"/>
-            <w:r>
-              <w:t>Regnerative</w:t>
-            </w:r>
+            <w:r/>
             <w:proofErr w:type="spellEnd"/>
             <w:r>
-              <w:t xml:space="preserve"> Burner System </w:t>
+              <w:t xml:space="preserve"> </w:t>
             </w:r>
           </w:p>
         </w:tc>
@@ -24515,12 +24480,10 @@
           <w:p>
             <w:proofErr w:type="spellStart"/>
             <w:r>
-              <w:t>Maintainace</w:t>
+              <w:t>Maintenance Cost</w:t>
             </w:r>
             <w:proofErr w:type="spellEnd"/>
-            <w:r>
-              <w:t xml:space="preserve"> Cost</w:t>
-            </w:r>
+            <w:r/>
           </w:p>
         </w:tc>
         <w:tc>
@@ -24634,11 +24597,11 @@
           <w:p>
             <w:proofErr w:type="spellStart"/>
             <w:r>
-              <w:t>Additioanl</w:t>
+              <w:t>Additional Costs</w:t>
             </w:r>
             <w:proofErr w:type="spellEnd"/>
             <w:r>
-              <w:t xml:space="preserve"> Costs </w:t>
+              <w:t xml:space="preserve"> </w:t>
             </w:r>
           </w:p>
         </w:tc>

</xml_diff>

<commit_message>
style: remove black run-underlines from the regen offer (keep orange rules)
The regen headings carried RegenOffer1's run-level text underline (w:u) which sat
as a black line under the text, below the new orange section rule. Strip all 29
run underlines document-wide; the orange (E87722) heading rules remain.

Co-Authored-By: Claude Opus 4.8 (1M context) <noreply@anthropic.com>
</commit_message>
<xml_diff>
--- a/Regen_Offer_Template.docx
+++ b/Regen_Offer_Template.docx
@@ -784,7 +784,6 @@
           <w:b w:val="0"/>
           <w:color w:val="0000FF"/>
           <w:sz w:val="22"/>
-          <w:u w:val="single"/>
         </w:rPr>
         <w:t>www.encon.co.in</w:t>
       </w:r>
@@ -905,7 +904,6 @@
           <w:bCs/>
           <w:color w:val="1F2937"/>
           <w:sz w:val="30"/>
-          <w:u w:val="single"/>
         </w:rPr>
         <w:t>TECHNICAL</w:t>
       </w:r>
@@ -915,7 +913,6 @@
           <w:b/>
           <w:bCs/>
           <w:spacing w:val="-2"/>
-          <w:u w:val="single"/>
         </w:rPr>
         <w:t xml:space="preserve"> </w:t>
       </w:r>
@@ -926,7 +923,6 @@
           <w:bCs/>
           <w:color w:val="1F2937"/>
           <w:sz w:val="30"/>
-          <w:u w:val="single"/>
         </w:rPr>
         <w:t>OFFER</w:t>
       </w:r>
@@ -957,7 +953,6 @@
           <w:b/>
           <w:color w:val="1F2937"/>
           <w:sz w:val="30"/>
-          <w:u w:val="single"/>
         </w:rPr>
         <w:t xml:space="preserve">REGENERATIVE BURNERS </w:t>
       </w:r>
@@ -1345,7 +1340,6 @@
           <w:b/>
           <w:color w:val="1F2937"/>
           <w:sz w:val="30"/>
-          <w:u w:val="single"/>
         </w:rPr>
         <w:t>ENERGY SAVING</w:t>
       </w:r>
@@ -2257,7 +2251,6 @@
         <w:rPr>
           <w:rFonts w:ascii="Calibri" w:hAnsi="Calibri" w:cs="Calibri"/>
           <w:b/>
-          <w:u w:val="single"/>
         </w:rPr>
         <w:t>PART OF REGENERATIVE BURNER</w:t>
       </w:r>
@@ -2390,7 +2383,6 @@
         <w:rPr>
           <w:rFonts w:ascii="Calibri" w:hAnsi="Calibri" w:cs="Calibri"/>
           <w:b/>
-          <w:u w:val="single"/>
         </w:rPr>
         <w:t>ENCON REGENERATIVE {{ fuel_word }} BURNERS – {{ burner_count }}</w:t>
       </w:r>
@@ -2588,7 +2580,6 @@
           <w:bCs/>
           <w:color w:val="1F2937"/>
           <w:sz w:val="30"/>
-          <w:u w:val="single"/>
         </w:rPr>
         <w:t>PNG</w:t>
       </w:r>
@@ -2597,7 +2588,6 @@
           <w:rFonts w:ascii="Calibri" w:hAnsi="Calibri" w:cs="Calibri"/>
           <w:b/>
           <w:bCs/>
-          <w:u w:val="single"/>
         </w:rPr>
         <w:t xml:space="preserve"> </w:t>
       </w:r>
@@ -2608,7 +2598,6 @@
           <w:bCs/>
           <w:color w:val="1F2937"/>
           <w:sz w:val="30"/>
-          <w:u w:val="single"/>
         </w:rPr>
         <w:t xml:space="preserve">GAS TRAIN FOR MAIN BURNERS </w:t>
       </w:r>
@@ -3074,7 +3063,6 @@
           <w:b/>
           <w:color w:val="1F2937"/>
           <w:sz w:val="30"/>
-          <w:u w:val="single"/>
         </w:rPr>
         <w:t xml:space="preserve">GAS </w:t>
       </w:r>
@@ -3084,7 +3072,6 @@
           <w:b/>
           <w:color w:val="1F2937"/>
           <w:sz w:val="30"/>
-          <w:u w:val="single"/>
         </w:rPr>
         <w:t>LINE</w:t>
       </w:r>
@@ -3094,7 +3081,6 @@
           <w:b/>
           <w:color w:val="1F2937"/>
           <w:sz w:val="30"/>
-          <w:u w:val="single"/>
         </w:rPr>
         <w:t xml:space="preserve"> FOR PILOT BURNER </w:t>
       </w:r>
@@ -3284,7 +3270,6 @@
           <w:b/>
           <w:color w:val="1F2937"/>
           <w:sz w:val="30"/>
-          <w:u w:val="single"/>
         </w:rPr>
         <w:t xml:space="preserve">COMBUSTION AIR BLOWER </w:t>
       </w:r>
@@ -3424,7 +3409,6 @@
           <w:b/>
           <w:color w:val="1F2937"/>
           <w:sz w:val="30"/>
-          <w:u w:val="single"/>
         </w:rPr>
         <w:t xml:space="preserve">SUCTION BLOWER FOR FLUE GAS </w:t>
       </w:r>
@@ -3617,7 +3601,6 @@
           <w:b/>
           <w:color w:val="1F2937"/>
           <w:sz w:val="30"/>
-          <w:u w:val="single"/>
         </w:rPr>
         <w:t xml:space="preserve">TEMPERATURE CONTROL </w:t>
       </w:r>
@@ -4021,7 +4004,6 @@
           <w:b/>
           <w:color w:val="1F2937"/>
           <w:sz w:val="30"/>
-          <w:u w:val="single"/>
         </w:rPr>
         <w:t>OPERATIONAL SEQUENCE</w:t>
       </w:r>
@@ -4326,7 +4308,6 @@
           <w:b/>
           <w:color w:val="1F2937"/>
           <w:sz w:val="30"/>
-          <w:u w:val="single"/>
         </w:rPr>
         <w:t xml:space="preserve">FURNACE PRESSURE CONTROL SYSTEM </w:t>
       </w:r>
@@ -4456,7 +4437,6 @@
           <w:iCs/>
           <w:color w:val="1F2937"/>
           <w:sz w:val="30"/>
-          <w:u w:val="single"/>
         </w:rPr>
         <w:t>OPERATIONAL SEQUENCE</w:t>
       </w:r>
@@ -9416,7 +9396,6 @@
           <w:color w:val="1F2937"/>
           <w:sz w:val="30"/>
           <w:szCs w:val="24"/>
-          <w:u w:val="single"/>
         </w:rPr>
         <w:t>EX</w:t>
       </w:r>
@@ -9429,7 +9408,6 @@
           <w:spacing w:val="-1"/>
           <w:sz w:val="30"/>
           <w:szCs w:val="24"/>
-          <w:u w:val="single"/>
         </w:rPr>
         <w:t>C</w:t>
       </w:r>
@@ -9441,7 +9419,6 @@
           <w:color w:val="1F2937"/>
           <w:sz w:val="30"/>
           <w:szCs w:val="24"/>
-          <w:u w:val="single"/>
         </w:rPr>
         <w:t>LUSI</w:t>
       </w:r>
@@ -9454,7 +9431,6 @@
           <w:spacing w:val="1"/>
           <w:sz w:val="30"/>
           <w:szCs w:val="24"/>
-          <w:u w:val="single"/>
         </w:rPr>
         <w:t>O</w:t>
       </w:r>
@@ -9466,7 +9442,6 @@
           <w:color w:val="1F2937"/>
           <w:sz w:val="30"/>
           <w:szCs w:val="24"/>
-          <w:u w:val="single"/>
         </w:rPr>
         <w:t>NS</w:t>
       </w:r>
@@ -14735,7 +14710,6 @@
           <w:bCs/>
           <w:color w:val="1F2937"/>
           <w:sz w:val="30"/>
-          <w:u w:val="single"/>
         </w:rPr>
         <w:t>MAKE LIST</w:t>
       </w:r>
@@ -17259,7 +17233,6 @@
           <w:color w:val="1F2937"/>
           <w:sz w:val="30"/>
           <w:szCs w:val="24"/>
-          <w:u w:val="single"/>
           <w:lang w:val="en-GB"/>
         </w:rPr>
         <w:t>PRICE SCHEDULE</w:t>
@@ -17823,7 +17796,6 @@
           <w:bCs/>
           <w:color w:val="1F2937"/>
           <w:sz w:val="30"/>
-          <w:u w:val="single"/>
         </w:rPr>
         <w:t>SUPERVISION CHARGES FOR ERECTION &amp; COMMISSIONING</w:t>
       </w:r>
@@ -18319,7 +18291,6 @@
           <w:color w:val="1F2937"/>
           <w:spacing w:val="-1"/>
           <w:sz w:val="30"/>
-          <w:u w:val="single"/>
         </w:rPr>
         <w:t>TERMS AND CONDITIONS</w:t>
       </w:r>

</xml_diff>

<commit_message>
style: strip 124 blank spacer paragraphs from the regen body + heading spacing
RegenOffer1 padded the body with empty paragraphs (too many blank lines). Remove
all 124 empty spacer paragraphs (keeping page breaks + images), and instead give
each section heading proper space-before (14pt) / after (4pt) so sections stay
separated without the blank lines. Cover unchanged.

Co-Authored-By: Claude Opus 4.8 (1M context) <noreply@anthropic.com>
</commit_message>
<xml_diff>
--- a/Regen_Offer_Template.docx
+++ b/Regen_Offer_Template.docx
@@ -443,7 +443,7 @@
         <w:pBdr>
           <w:bottom w:val="single" w:color="E87722" w:sz="12" w:space="4"/>
         </w:pBdr>
-        <w:spacing w:after="200" w:before="360"/>
+        <w:spacing w:after="80" w:before="280"/>
       </w:pPr>
       <w:r>
         <w:rPr>
@@ -837,6 +837,7 @@
     </w:p>
     <w:p>
       <w:pPr>
+        <w:spacing w:before="280" w:after="80"/>
         <w:jc w:val="center"/>
         <w:rPr>
           <w:b/>
@@ -887,7 +888,7 @@
     <w:p>
       <w:pPr>
         <w:pStyle w:val="Heading2"/>
-        <w:spacing w:before="90"/>
+        <w:spacing w:before="280" w:after="80"/>
         <w:ind w:left="402" w:right="193"/>
         <w:jc w:val="center"/>
         <w:rPr>
@@ -929,15 +930,7 @@
     </w:p>
     <w:p>
       <w:pPr>
-        <w:jc w:val="both"/>
-        <w:rPr>
-          <w:b/>
-          <w:u w:val="single"/>
-        </w:rPr>
-      </w:pPr>
-    </w:p>
-    <w:p>
-      <w:pPr>
+        <w:spacing w:before="280" w:after="80"/>
         <w:jc w:val="both"/>
         <w:rPr>
           <w:b/>
@@ -1223,7 +1216,6 @@
         <w:t xml:space="preserve">chimney, The Media box or Regenerator is filled with Ceramic balls which absorbs up to 85% of the heat of the flue gases. </w:t>
       </w:r>
     </w:p>
-    <w:p/>
     <w:p>
       <w:pPr>
         <w:pStyle w:val="NoSpacing"/>
@@ -1279,52 +1271,7 @@
     </w:p>
     <w:p>
       <w:pPr>
-        <w:rPr>
-          <w:b/>
-          <w:sz w:val="28"/>
-          <w:szCs w:val="28"/>
-          <w:u w:val="single"/>
-        </w:rPr>
-      </w:pPr>
-    </w:p>
-    <w:p>
-      <w:pPr>
-        <w:jc w:val="both"/>
-        <w:rPr>
-          <w:b/>
-          <w:u w:val="single"/>
-        </w:rPr>
-      </w:pPr>
-    </w:p>
-    <w:p>
-      <w:pPr>
-        <w:jc w:val="both"/>
-        <w:rPr>
-          <w:b/>
-          <w:u w:val="single"/>
-        </w:rPr>
-      </w:pPr>
-    </w:p>
-    <w:p>
-      <w:pPr>
-        <w:jc w:val="both"/>
-        <w:rPr>
-          <w:b/>
-          <w:u w:val="single"/>
-        </w:rPr>
-      </w:pPr>
-    </w:p>
-    <w:p>
-      <w:pPr>
-        <w:jc w:val="both"/>
-        <w:rPr>
-          <w:b/>
-          <w:u w:val="single"/>
-        </w:rPr>
-      </w:pPr>
-    </w:p>
-    <w:p>
-      <w:pPr>
+        <w:spacing w:before="280" w:after="80"/>
         <w:jc w:val="both"/>
         <w:rPr>
           <w:b/>
@@ -2160,16 +2107,6 @@
         </w:tc>
       </w:tr>
     </w:tbl>
-    <w:p>
-      <w:pPr>
-        <w:rPr>
-          <w:b/>
-          <w:sz w:val="28"/>
-          <w:szCs w:val="28"/>
-          <w:u w:val="single"/>
-        </w:rPr>
-      </w:pPr>
-    </w:p>
     <w:p>
       <w:pPr>
         <w:rPr>
@@ -2283,102 +2220,6 @@
           <w:u w:val="single"/>
         </w:rPr>
       </w:pPr>
-    </w:p>
-    <w:p>
-      <w:pPr>
-        <w:rPr>
-          <w:b/>
-          <w:u w:val="single"/>
-        </w:rPr>
-      </w:pPr>
-    </w:p>
-    <w:p>
-      <w:pPr>
-        <w:rPr>
-          <w:b/>
-          <w:u w:val="single"/>
-        </w:rPr>
-      </w:pPr>
-    </w:p>
-    <w:p>
-      <w:pPr>
-        <w:rPr>
-          <w:b/>
-          <w:u w:val="single"/>
-        </w:rPr>
-      </w:pPr>
-    </w:p>
-    <w:p>
-      <w:pPr>
-        <w:rPr>
-          <w:b/>
-          <w:u w:val="single"/>
-        </w:rPr>
-      </w:pPr>
-    </w:p>
-    <w:p>
-      <w:pPr>
-        <w:rPr>
-          <w:b/>
-          <w:u w:val="single"/>
-        </w:rPr>
-      </w:pPr>
-    </w:p>
-    <w:p>
-      <w:pPr>
-        <w:rPr>
-          <w:b/>
-          <w:u w:val="single"/>
-        </w:rPr>
-      </w:pPr>
-    </w:p>
-    <w:p>
-      <w:pPr>
-        <w:rPr>
-          <w:b/>
-          <w:u w:val="single"/>
-        </w:rPr>
-      </w:pPr>
-    </w:p>
-    <w:p>
-      <w:pPr>
-        <w:rPr>
-          <w:b/>
-          <w:u w:val="single"/>
-        </w:rPr>
-      </w:pPr>
-    </w:p>
-    <w:p>
-      <w:pPr>
-        <w:rPr>
-          <w:b/>
-          <w:u w:val="single"/>
-        </w:rPr>
-      </w:pPr>
-    </w:p>
-    <w:p>
-      <w:pPr>
-        <w:rPr>
-          <w:b/>
-          <w:u w:val="single"/>
-        </w:rPr>
-      </w:pPr>
-    </w:p>
-    <w:p>
-      <w:pPr>
-        <w:rPr>
-          <w:b/>
-          <w:u w:val="single"/>
-        </w:rPr>
-      </w:pPr>
-    </w:p>
-    <w:p>
-      <w:pPr>
-        <w:rPr>
-          <w:b/>
-          <w:u w:val="single"/>
-        </w:rPr>
-      </w:pPr>
       <w:r>
         <w:rPr>
           <w:rFonts w:ascii="Calibri" w:hAnsi="Calibri" w:cs="Calibri"/>
@@ -2562,7 +2403,7 @@
     </w:p>
     <w:p>
       <w:pPr>
-        <w:spacing w:before="180"/>
+        <w:spacing w:before="280" w:after="80"/>
         <w:jc w:val="both"/>
         <w:rPr>
           <w:b/>
@@ -2703,6 +2544,377 @@
           <w:bCs/>
         </w:rPr>
         <w:t>inimum pressure as 1 bar is considered.</w:t>
+      </w:r>
+    </w:p>
+    <w:p>
+      <w:pPr>
+        <w:pStyle w:val="NoSpacing"/>
+        <w:numPr>
+          <w:ilvl w:val="0"/>
+          <w:numId w:val="4"/>
+        </w:numPr>
+        <w:spacing w:line="276" w:lineRule="auto"/>
+        <w:rPr>
+          <w:rFonts w:ascii="Times New Roman" w:hAnsi="Times New Roman" w:cs="Times New Roman"/>
+          <w:sz w:val="24"/>
+          <w:szCs w:val="24"/>
+        </w:rPr>
+      </w:pPr>
+      <w:r>
+        <w:rPr>
+          <w:rFonts w:ascii="Calibri" w:hAnsi="Calibri" w:cs="Calibri"/>
+          <w:sz w:val="24"/>
+          <w:szCs w:val="24"/>
+        </w:rPr>
+        <w:t>Ball valve</w:t>
+      </w:r>
+    </w:p>
+    <w:p>
+      <w:pPr>
+        <w:pStyle w:val="NoSpacing"/>
+        <w:numPr>
+          <w:ilvl w:val="0"/>
+          <w:numId w:val="4"/>
+        </w:numPr>
+        <w:spacing w:line="276" w:lineRule="auto"/>
+        <w:rPr>
+          <w:rFonts w:ascii="Times New Roman" w:hAnsi="Times New Roman" w:cs="Times New Roman"/>
+          <w:sz w:val="24"/>
+          <w:szCs w:val="24"/>
+        </w:rPr>
+      </w:pPr>
+      <w:r>
+        <w:rPr>
+          <w:rFonts w:ascii="Calibri" w:hAnsi="Calibri" w:cs="Calibri"/>
+          <w:sz w:val="24"/>
+          <w:szCs w:val="24"/>
+        </w:rPr>
+        <w:t xml:space="preserve">Inlet Pressure Gauge </w:t>
+      </w:r>
+      <w:r>
+        <w:rPr>
+          <w:rFonts w:ascii="Calibri" w:hAnsi="Calibri" w:cs="Calibri"/>
+          <w:sz w:val="24"/>
+          <w:szCs w:val="24"/>
+        </w:rPr>
+        <w:t>with TNV</w:t>
+      </w:r>
+    </w:p>
+    <w:p>
+      <w:pPr>
+        <w:pStyle w:val="NoSpacing"/>
+        <w:numPr>
+          <w:ilvl w:val="0"/>
+          <w:numId w:val="4"/>
+        </w:numPr>
+        <w:spacing w:line="276" w:lineRule="auto"/>
+        <w:rPr>
+          <w:rFonts w:ascii="Times New Roman" w:hAnsi="Times New Roman" w:cs="Times New Roman"/>
+          <w:sz w:val="24"/>
+          <w:szCs w:val="24"/>
+        </w:rPr>
+      </w:pPr>
+      <w:r>
+        <w:rPr>
+          <w:rFonts w:ascii="Calibri" w:hAnsi="Calibri" w:cs="Calibri"/>
+          <w:sz w:val="24"/>
+          <w:szCs w:val="24"/>
+        </w:rPr>
+        <w:t>Gas filter</w:t>
+      </w:r>
+    </w:p>
+    <w:p>
+      <w:pPr>
+        <w:pStyle w:val="NoSpacing"/>
+        <w:numPr>
+          <w:ilvl w:val="0"/>
+          <w:numId w:val="4"/>
+        </w:numPr>
+        <w:spacing w:line="276" w:lineRule="auto"/>
+        <w:rPr>
+          <w:rFonts w:ascii="Times New Roman" w:hAnsi="Times New Roman" w:cs="Times New Roman"/>
+          <w:sz w:val="24"/>
+          <w:szCs w:val="24"/>
+        </w:rPr>
+      </w:pPr>
+      <w:r>
+        <w:rPr>
+          <w:rFonts w:ascii="Calibri" w:hAnsi="Calibri" w:cs="Calibri"/>
+          <w:sz w:val="24"/>
+          <w:szCs w:val="24"/>
+        </w:rPr>
+        <w:t>RPD</w:t>
+      </w:r>
+      <w:r>
+        <w:rPr>
+          <w:rFonts w:ascii="Calibri" w:hAnsi="Calibri" w:cs="Calibri"/>
+          <w:sz w:val="24"/>
+          <w:szCs w:val="24"/>
+        </w:rPr>
+        <w:t xml:space="preserve"> Flowmeter with communication</w:t>
+      </w:r>
+      <w:r>
+        <w:rPr>
+          <w:rFonts w:ascii="Calibri" w:hAnsi="Calibri" w:cs="Calibri"/>
+          <w:sz w:val="24"/>
+          <w:szCs w:val="24"/>
+        </w:rPr>
+        <w:t xml:space="preserve"> </w:t>
+      </w:r>
+    </w:p>
+    <w:p>
+      <w:pPr>
+        <w:pStyle w:val="NoSpacing"/>
+        <w:numPr>
+          <w:ilvl w:val="0"/>
+          <w:numId w:val="4"/>
+        </w:numPr>
+        <w:spacing w:line="276" w:lineRule="auto"/>
+        <w:rPr>
+          <w:rFonts w:ascii="Times New Roman" w:hAnsi="Times New Roman" w:cs="Times New Roman"/>
+          <w:sz w:val="24"/>
+          <w:szCs w:val="24"/>
+        </w:rPr>
+      </w:pPr>
+      <w:r>
+        <w:rPr>
+          <w:rFonts w:ascii="Calibri" w:hAnsi="Calibri" w:cs="Calibri"/>
+          <w:sz w:val="24"/>
+          <w:szCs w:val="24"/>
+        </w:rPr>
+        <w:t xml:space="preserve">Slam Shut off </w:t>
+      </w:r>
+      <w:r>
+        <w:rPr>
+          <w:rFonts w:ascii="Calibri" w:hAnsi="Calibri" w:cs="Calibri"/>
+          <w:sz w:val="24"/>
+          <w:szCs w:val="24"/>
+        </w:rPr>
+        <w:t>Valve.</w:t>
+      </w:r>
+    </w:p>
+    <w:p>
+      <w:pPr>
+        <w:pStyle w:val="NoSpacing"/>
+        <w:numPr>
+          <w:ilvl w:val="0"/>
+          <w:numId w:val="4"/>
+        </w:numPr>
+        <w:spacing w:line="276" w:lineRule="auto"/>
+        <w:rPr>
+          <w:rFonts w:ascii="Times New Roman" w:hAnsi="Times New Roman" w:cs="Times New Roman"/>
+          <w:sz w:val="24"/>
+          <w:szCs w:val="24"/>
+        </w:rPr>
+      </w:pPr>
+      <w:r>
+        <w:rPr>
+          <w:rFonts w:ascii="Calibri" w:hAnsi="Calibri" w:cs="Calibri"/>
+          <w:sz w:val="24"/>
+          <w:szCs w:val="24"/>
+        </w:rPr>
+        <w:t>Pressure Regulator/ Gas governor</w:t>
+      </w:r>
+    </w:p>
+    <w:p>
+      <w:pPr>
+        <w:pStyle w:val="NoSpacing"/>
+        <w:numPr>
+          <w:ilvl w:val="0"/>
+          <w:numId w:val="4"/>
+        </w:numPr>
+        <w:spacing w:line="276" w:lineRule="auto"/>
+        <w:rPr>
+          <w:rFonts w:ascii="Times New Roman" w:hAnsi="Times New Roman" w:cs="Times New Roman"/>
+          <w:sz w:val="24"/>
+          <w:szCs w:val="24"/>
+        </w:rPr>
+      </w:pPr>
+      <w:r>
+        <w:rPr>
+          <w:rFonts w:ascii="Calibri" w:hAnsi="Calibri" w:cs="Calibri"/>
+          <w:sz w:val="24"/>
+          <w:szCs w:val="24"/>
+        </w:rPr>
+        <w:t xml:space="preserve">Safety </w:t>
+      </w:r>
+      <w:r>
+        <w:rPr>
+          <w:rFonts w:ascii="Calibri" w:hAnsi="Calibri" w:cs="Calibri"/>
+          <w:sz w:val="24"/>
+          <w:szCs w:val="24"/>
+        </w:rPr>
+        <w:t>Relief Valve</w:t>
+      </w:r>
+    </w:p>
+    <w:p>
+      <w:pPr>
+        <w:pStyle w:val="NoSpacing"/>
+        <w:numPr>
+          <w:ilvl w:val="0"/>
+          <w:numId w:val="4"/>
+        </w:numPr>
+        <w:spacing w:line="276" w:lineRule="auto"/>
+        <w:rPr>
+          <w:rFonts w:ascii="Times New Roman" w:hAnsi="Times New Roman" w:cs="Times New Roman"/>
+          <w:sz w:val="24"/>
+          <w:szCs w:val="24"/>
+        </w:rPr>
+      </w:pPr>
+      <w:r>
+        <w:rPr>
+          <w:rFonts w:ascii="Calibri" w:hAnsi="Calibri" w:cs="Calibri"/>
+          <w:sz w:val="24"/>
+          <w:szCs w:val="24"/>
+        </w:rPr>
+        <w:t>Outlet Pressure Gauge</w:t>
+      </w:r>
+      <w:r>
+        <w:rPr>
+          <w:rFonts w:ascii="Calibri" w:hAnsi="Calibri" w:cs="Calibri"/>
+          <w:sz w:val="24"/>
+          <w:szCs w:val="24"/>
+        </w:rPr>
+        <w:t xml:space="preserve"> with TNV</w:t>
+      </w:r>
+    </w:p>
+    <w:p>
+      <w:pPr>
+        <w:pStyle w:val="NoSpacing"/>
+        <w:numPr>
+          <w:ilvl w:val="0"/>
+          <w:numId w:val="4"/>
+        </w:numPr>
+        <w:spacing w:line="276" w:lineRule="auto"/>
+        <w:rPr>
+          <w:rFonts w:ascii="Times New Roman" w:hAnsi="Times New Roman" w:cs="Times New Roman"/>
+          <w:sz w:val="24"/>
+          <w:szCs w:val="24"/>
+        </w:rPr>
+      </w:pPr>
+      <w:r>
+        <w:rPr>
+          <w:rFonts w:ascii="Calibri" w:hAnsi="Calibri" w:cs="Calibri"/>
+          <w:sz w:val="24"/>
+          <w:szCs w:val="24"/>
+        </w:rPr>
+        <w:t>High &amp; low-pressure switches with manual valve</w:t>
+      </w:r>
+    </w:p>
+    <w:p>
+      <w:pPr>
+        <w:pStyle w:val="NoSpacing"/>
+        <w:numPr>
+          <w:ilvl w:val="0"/>
+          <w:numId w:val="4"/>
+        </w:numPr>
+        <w:spacing w:line="276" w:lineRule="auto"/>
+        <w:rPr>
+          <w:rFonts w:ascii="Times New Roman" w:hAnsi="Times New Roman" w:cs="Times New Roman"/>
+          <w:sz w:val="24"/>
+          <w:szCs w:val="24"/>
+        </w:rPr>
+      </w:pPr>
+      <w:r>
+        <w:rPr>
+          <w:rFonts w:ascii="Calibri" w:hAnsi="Calibri" w:cs="Calibri"/>
+          <w:sz w:val="24"/>
+          <w:szCs w:val="24"/>
+        </w:rPr>
+        <w:t>Solenoid Valve</w:t>
+      </w:r>
+    </w:p>
+    <w:p>
+      <w:pPr>
+        <w:pStyle w:val="NoSpacing"/>
+        <w:numPr>
+          <w:ilvl w:val="0"/>
+          <w:numId w:val="4"/>
+        </w:numPr>
+        <w:spacing w:line="276" w:lineRule="auto"/>
+        <w:rPr>
+          <w:rFonts w:ascii="Times New Roman" w:hAnsi="Times New Roman" w:cs="Times New Roman"/>
+          <w:sz w:val="24"/>
+          <w:szCs w:val="24"/>
+        </w:rPr>
+      </w:pPr>
+      <w:r>
+        <w:rPr>
+          <w:rFonts w:ascii="Calibri" w:hAnsi="Calibri" w:cs="Calibri"/>
+          <w:sz w:val="24"/>
+          <w:szCs w:val="24"/>
+        </w:rPr>
+        <w:t xml:space="preserve">Safety </w:t>
+      </w:r>
+      <w:r>
+        <w:rPr>
+          <w:rFonts w:ascii="Calibri" w:hAnsi="Calibri" w:cs="Calibri"/>
+          <w:sz w:val="24"/>
+          <w:szCs w:val="24"/>
+        </w:rPr>
+        <w:t>Solenoid Valve</w:t>
+      </w:r>
+    </w:p>
+    <w:p>
+      <w:pPr>
+        <w:pStyle w:val="NoSpacing"/>
+        <w:numPr>
+          <w:ilvl w:val="0"/>
+          <w:numId w:val="4"/>
+        </w:numPr>
+        <w:spacing w:line="276" w:lineRule="auto"/>
+        <w:rPr>
+          <w:rFonts w:ascii="Times New Roman" w:hAnsi="Times New Roman" w:cs="Times New Roman"/>
+          <w:sz w:val="24"/>
+          <w:szCs w:val="24"/>
+        </w:rPr>
+      </w:pPr>
+      <w:r>
+        <w:rPr>
+          <w:rFonts w:ascii="Calibri" w:hAnsi="Calibri" w:cs="Calibri"/>
+          <w:sz w:val="24"/>
+          <w:szCs w:val="24"/>
+        </w:rPr>
+        <w:t>Ball Valve</w:t>
+      </w:r>
+    </w:p>
+    <w:p>
+      <w:pPr>
+        <w:spacing w:before="280" w:after="80"/>
+        <w:rPr>
+          <w:b/>
+          <w:u w:val="single"/>
+        </w:rPr>
+        <w:pBdr>
+          <w:bottom w:val="single" w:color="E87722" w:sz="12" w:space="4"/>
+        </w:pBdr>
+      </w:pPr>
+      <w:r>
+        <w:rPr>
+          <w:rFonts w:ascii="Calibri" w:hAnsi="Calibri" w:cs="Calibri"/>
+          <w:b/>
+          <w:color w:val="1F2937"/>
+          <w:sz w:val="30"/>
+        </w:rPr>
+        <w:t xml:space="preserve">GAS </w:t>
+      </w:r>
+      <w:r>
+        <w:rPr>
+          <w:rFonts w:ascii="Calibri" w:hAnsi="Calibri" w:cs="Calibri"/>
+          <w:b/>
+          <w:color w:val="1F2937"/>
+          <w:sz w:val="30"/>
+        </w:rPr>
+        <w:t>LINE</w:t>
+      </w:r>
+      <w:r>
+        <w:rPr>
+          <w:rFonts w:ascii="Calibri" w:hAnsi="Calibri" w:cs="Calibri"/>
+          <w:b/>
+          <w:color w:val="1F2937"/>
+          <w:sz w:val="30"/>
+        </w:rPr>
+        <w:t xml:space="preserve"> FOR PILOT BURNER </w:t>
       </w:r>
     </w:p>
     <w:p>
@@ -2713,6 +2925,54 @@
         <w:adjustRightInd w:val="0"/>
         <w:jc w:val="both"/>
       </w:pPr>
+      <w:r>
+        <w:rPr>
+          <w:rFonts w:ascii="Calibri" w:hAnsi="Calibri" w:cs="Calibri"/>
+        </w:rPr>
+        <w:t xml:space="preserve">The gas </w:t>
+      </w:r>
+      <w:r>
+        <w:rPr>
+          <w:rFonts w:ascii="Calibri" w:hAnsi="Calibri" w:cs="Calibri"/>
+        </w:rPr>
+        <w:t>line for pilot burner shall be routed from main gas train and</w:t>
+      </w:r>
+      <w:r>
+        <w:rPr>
+          <w:rFonts w:ascii="Calibri" w:hAnsi="Calibri" w:cs="Calibri"/>
+        </w:rPr>
+        <w:t xml:space="preserve"> will be consisting of following main components:</w:t>
+      </w:r>
+      <w:r>
+        <w:rPr>
+          <w:rFonts w:ascii="Calibri" w:hAnsi="Calibri" w:cs="Calibri"/>
+        </w:rPr>
+        <w:t xml:space="preserve"> The tube of Pilot burner shall be </w:t>
+      </w:r>
+      <w:r>
+        <w:rPr>
+          <w:rFonts w:ascii="Calibri" w:hAnsi="Calibri" w:cs="Calibri"/>
+        </w:rPr>
+        <w:t>SS – 304</w:t>
+      </w:r>
+      <w:r>
+        <w:rPr>
+          <w:rFonts w:ascii="Calibri" w:hAnsi="Calibri" w:cs="Calibri"/>
+        </w:rPr>
+        <w:t xml:space="preserve"> We have supplied the same tube and it’s working well as per the requirement</w:t>
+      </w:r>
+      <w:r>
+        <w:rPr>
+          <w:rFonts w:ascii="Calibri" w:hAnsi="Calibri" w:cs="Calibri"/>
+        </w:rPr>
+        <w:t>.</w:t>
+      </w:r>
+      <w:r>
+        <w:rPr>
+          <w:rFonts w:ascii="Calibri" w:hAnsi="Calibri" w:cs="Calibri"/>
+        </w:rPr>
+        <w:t xml:space="preserve"> </w:t>
+      </w:r>
     </w:p>
     <w:p>
       <w:pPr>
@@ -2721,7 +2981,6 @@
           <w:ilvl w:val="0"/>
           <w:numId w:val="4"/>
         </w:numPr>
-        <w:spacing w:line="276" w:lineRule="auto"/>
         <w:rPr>
           <w:rFonts w:ascii="Times New Roman" w:hAnsi="Times New Roman" w:cs="Times New Roman"/>
           <w:sz w:val="24"/>
@@ -2744,7 +3003,6 @@
           <w:ilvl w:val="0"/>
           <w:numId w:val="4"/>
         </w:numPr>
-        <w:spacing w:line="276" w:lineRule="auto"/>
         <w:rPr>
           <w:rFonts w:ascii="Times New Roman" w:hAnsi="Times New Roman" w:cs="Times New Roman"/>
           <w:sz w:val="24"/>
@@ -2757,15 +3015,7 @@
           <w:sz w:val="24"/>
           <w:szCs w:val="24"/>
         </w:rPr>
-        <w:t xml:space="preserve">Inlet Pressure Gauge </w:t>
-      </w:r>
-      <w:r>
-        <w:rPr>
-          <w:rFonts w:ascii="Calibri" w:hAnsi="Calibri" w:cs="Calibri"/>
-          <w:sz w:val="24"/>
-          <w:szCs w:val="24"/>
-        </w:rPr>
-        <w:t>with TNV</w:t>
+        <w:t>Pressure gauge with manual cock</w:t>
       </w:r>
     </w:p>
     <w:p>
@@ -2775,7 +3025,6 @@
           <w:ilvl w:val="0"/>
           <w:numId w:val="4"/>
         </w:numPr>
-        <w:spacing w:line="276" w:lineRule="auto"/>
         <w:rPr>
           <w:rFonts w:ascii="Times New Roman" w:hAnsi="Times New Roman" w:cs="Times New Roman"/>
           <w:sz w:val="24"/>
@@ -2788,7 +3037,7 @@
           <w:sz w:val="24"/>
           <w:szCs w:val="24"/>
         </w:rPr>
-        <w:t>Gas filter</w:t>
+        <w:t>Pressure regulator</w:t>
       </w:r>
     </w:p>
     <w:p>
@@ -2798,7 +3047,6 @@
           <w:ilvl w:val="0"/>
           <w:numId w:val="4"/>
         </w:numPr>
-        <w:spacing w:line="276" w:lineRule="auto"/>
         <w:rPr>
           <w:rFonts w:ascii="Times New Roman" w:hAnsi="Times New Roman" w:cs="Times New Roman"/>
           <w:sz w:val="24"/>
@@ -2811,23 +3059,7 @@
           <w:sz w:val="24"/>
           <w:szCs w:val="24"/>
         </w:rPr>
-        <w:t>RPD</w:t>
-      </w:r>
-      <w:r>
-        <w:rPr>
-          <w:rFonts w:ascii="Calibri" w:hAnsi="Calibri" w:cs="Calibri"/>
-          <w:sz w:val="24"/>
-          <w:szCs w:val="24"/>
-        </w:rPr>
-        <w:t xml:space="preserve"> Flowmeter with communication</w:t>
-      </w:r>
-      <w:r>
-        <w:rPr>
-          <w:rFonts w:ascii="Calibri" w:hAnsi="Calibri" w:cs="Calibri"/>
-          <w:sz w:val="24"/>
-          <w:szCs w:val="24"/>
-        </w:rPr>
-        <w:t xml:space="preserve"> </w:t>
+        <w:t>Solenoid Valve</w:t>
       </w:r>
     </w:p>
     <w:p>
@@ -2837,7 +3069,6 @@
           <w:ilvl w:val="0"/>
           <w:numId w:val="4"/>
         </w:numPr>
-        <w:spacing w:line="276" w:lineRule="auto"/>
         <w:rPr>
           <w:rFonts w:ascii="Times New Roman" w:hAnsi="Times New Roman" w:cs="Times New Roman"/>
           <w:sz w:val="24"/>
@@ -2850,411 +3081,12 @@
           <w:sz w:val="24"/>
           <w:szCs w:val="24"/>
         </w:rPr>
-        <w:t xml:space="preserve">Slam Shut off </w:t>
-      </w:r>
-      <w:r>
-        <w:rPr>
-          <w:rFonts w:ascii="Calibri" w:hAnsi="Calibri" w:cs="Calibri"/>
-          <w:sz w:val="24"/>
-          <w:szCs w:val="24"/>
-        </w:rPr>
-        <w:t>Valve.</w:t>
+        <w:t>Flexible Hoses</w:t>
       </w:r>
     </w:p>
     <w:p>
       <w:pPr>
-        <w:pStyle w:val="NoSpacing"/>
-        <w:numPr>
-          <w:ilvl w:val="0"/>
-          <w:numId w:val="4"/>
-        </w:numPr>
-        <w:spacing w:line="276" w:lineRule="auto"/>
-        <w:rPr>
-          <w:rFonts w:ascii="Times New Roman" w:hAnsi="Times New Roman" w:cs="Times New Roman"/>
-          <w:sz w:val="24"/>
-          <w:szCs w:val="24"/>
-        </w:rPr>
-      </w:pPr>
-      <w:r>
-        <w:rPr>
-          <w:rFonts w:ascii="Calibri" w:hAnsi="Calibri" w:cs="Calibri"/>
-          <w:sz w:val="24"/>
-          <w:szCs w:val="24"/>
-        </w:rPr>
-        <w:t>Pressure Regulator/ Gas governor</w:t>
-      </w:r>
-    </w:p>
-    <w:p>
-      <w:pPr>
-        <w:pStyle w:val="NoSpacing"/>
-        <w:numPr>
-          <w:ilvl w:val="0"/>
-          <w:numId w:val="4"/>
-        </w:numPr>
-        <w:spacing w:line="276" w:lineRule="auto"/>
-        <w:rPr>
-          <w:rFonts w:ascii="Times New Roman" w:hAnsi="Times New Roman" w:cs="Times New Roman"/>
-          <w:sz w:val="24"/>
-          <w:szCs w:val="24"/>
-        </w:rPr>
-      </w:pPr>
-      <w:r>
-        <w:rPr>
-          <w:rFonts w:ascii="Calibri" w:hAnsi="Calibri" w:cs="Calibri"/>
-          <w:sz w:val="24"/>
-          <w:szCs w:val="24"/>
-        </w:rPr>
-        <w:t xml:space="preserve">Safety </w:t>
-      </w:r>
-      <w:r>
-        <w:rPr>
-          <w:rFonts w:ascii="Calibri" w:hAnsi="Calibri" w:cs="Calibri"/>
-          <w:sz w:val="24"/>
-          <w:szCs w:val="24"/>
-        </w:rPr>
-        <w:t>Relief Valve</w:t>
-      </w:r>
-    </w:p>
-    <w:p>
-      <w:pPr>
-        <w:pStyle w:val="NoSpacing"/>
-        <w:numPr>
-          <w:ilvl w:val="0"/>
-          <w:numId w:val="4"/>
-        </w:numPr>
-        <w:spacing w:line="276" w:lineRule="auto"/>
-        <w:rPr>
-          <w:rFonts w:ascii="Times New Roman" w:hAnsi="Times New Roman" w:cs="Times New Roman"/>
-          <w:sz w:val="24"/>
-          <w:szCs w:val="24"/>
-        </w:rPr>
-      </w:pPr>
-      <w:r>
-        <w:rPr>
-          <w:rFonts w:ascii="Calibri" w:hAnsi="Calibri" w:cs="Calibri"/>
-          <w:sz w:val="24"/>
-          <w:szCs w:val="24"/>
-        </w:rPr>
-        <w:t>Outlet Pressure Gauge</w:t>
-      </w:r>
-      <w:r>
-        <w:rPr>
-          <w:rFonts w:ascii="Calibri" w:hAnsi="Calibri" w:cs="Calibri"/>
-          <w:sz w:val="24"/>
-          <w:szCs w:val="24"/>
-        </w:rPr>
-        <w:t xml:space="preserve"> with TNV</w:t>
-      </w:r>
-    </w:p>
-    <w:p>
-      <w:pPr>
-        <w:pStyle w:val="NoSpacing"/>
-        <w:numPr>
-          <w:ilvl w:val="0"/>
-          <w:numId w:val="4"/>
-        </w:numPr>
-        <w:spacing w:line="276" w:lineRule="auto"/>
-        <w:rPr>
-          <w:rFonts w:ascii="Times New Roman" w:hAnsi="Times New Roman" w:cs="Times New Roman"/>
-          <w:sz w:val="24"/>
-          <w:szCs w:val="24"/>
-        </w:rPr>
-      </w:pPr>
-      <w:r>
-        <w:rPr>
-          <w:rFonts w:ascii="Calibri" w:hAnsi="Calibri" w:cs="Calibri"/>
-          <w:sz w:val="24"/>
-          <w:szCs w:val="24"/>
-        </w:rPr>
-        <w:t>High &amp; low-pressure switches with manual valve</w:t>
-      </w:r>
-    </w:p>
-    <w:p>
-      <w:pPr>
-        <w:pStyle w:val="NoSpacing"/>
-        <w:numPr>
-          <w:ilvl w:val="0"/>
-          <w:numId w:val="4"/>
-        </w:numPr>
-        <w:spacing w:line="276" w:lineRule="auto"/>
-        <w:rPr>
-          <w:rFonts w:ascii="Times New Roman" w:hAnsi="Times New Roman" w:cs="Times New Roman"/>
-          <w:sz w:val="24"/>
-          <w:szCs w:val="24"/>
-        </w:rPr>
-      </w:pPr>
-      <w:r>
-        <w:rPr>
-          <w:rFonts w:ascii="Calibri" w:hAnsi="Calibri" w:cs="Calibri"/>
-          <w:sz w:val="24"/>
-          <w:szCs w:val="24"/>
-        </w:rPr>
-        <w:t>Solenoid Valve</w:t>
-      </w:r>
-    </w:p>
-    <w:p>
-      <w:pPr>
-        <w:pStyle w:val="NoSpacing"/>
-        <w:numPr>
-          <w:ilvl w:val="0"/>
-          <w:numId w:val="4"/>
-        </w:numPr>
-        <w:spacing w:line="276" w:lineRule="auto"/>
-        <w:rPr>
-          <w:rFonts w:ascii="Times New Roman" w:hAnsi="Times New Roman" w:cs="Times New Roman"/>
-          <w:sz w:val="24"/>
-          <w:szCs w:val="24"/>
-        </w:rPr>
-      </w:pPr>
-      <w:r>
-        <w:rPr>
-          <w:rFonts w:ascii="Calibri" w:hAnsi="Calibri" w:cs="Calibri"/>
-          <w:sz w:val="24"/>
-          <w:szCs w:val="24"/>
-        </w:rPr>
-        <w:t xml:space="preserve">Safety </w:t>
-      </w:r>
-      <w:r>
-        <w:rPr>
-          <w:rFonts w:ascii="Calibri" w:hAnsi="Calibri" w:cs="Calibri"/>
-          <w:sz w:val="24"/>
-          <w:szCs w:val="24"/>
-        </w:rPr>
-        <w:t>Solenoid Valve</w:t>
-      </w:r>
-    </w:p>
-    <w:p>
-      <w:pPr>
-        <w:pStyle w:val="NoSpacing"/>
-        <w:numPr>
-          <w:ilvl w:val="0"/>
-          <w:numId w:val="4"/>
-        </w:numPr>
-        <w:spacing w:line="276" w:lineRule="auto"/>
-        <w:rPr>
-          <w:rFonts w:ascii="Times New Roman" w:hAnsi="Times New Roman" w:cs="Times New Roman"/>
-          <w:sz w:val="24"/>
-          <w:szCs w:val="24"/>
-        </w:rPr>
-      </w:pPr>
-      <w:r>
-        <w:rPr>
-          <w:rFonts w:ascii="Calibri" w:hAnsi="Calibri" w:cs="Calibri"/>
-          <w:sz w:val="24"/>
-          <w:szCs w:val="24"/>
-        </w:rPr>
-        <w:t>Ball Valve</w:t>
-      </w:r>
-    </w:p>
-    <w:p>
-      <w:pPr>
-        <w:spacing w:before="180"/>
-        <w:rPr>
-          <w:b/>
-          <w:u w:val="single"/>
-        </w:rPr>
-        <w:pBdr>
-          <w:bottom w:val="single" w:color="E87722" w:sz="12" w:space="4"/>
-        </w:pBdr>
-      </w:pPr>
-      <w:r>
-        <w:rPr>
-          <w:rFonts w:ascii="Calibri" w:hAnsi="Calibri" w:cs="Calibri"/>
-          <w:b/>
-          <w:color w:val="1F2937"/>
-          <w:sz w:val="30"/>
-        </w:rPr>
-        <w:t xml:space="preserve">GAS </w:t>
-      </w:r>
-      <w:r>
-        <w:rPr>
-          <w:rFonts w:ascii="Calibri" w:hAnsi="Calibri" w:cs="Calibri"/>
-          <w:b/>
-          <w:color w:val="1F2937"/>
-          <w:sz w:val="30"/>
-        </w:rPr>
-        <w:t>LINE</w:t>
-      </w:r>
-      <w:r>
-        <w:rPr>
-          <w:rFonts w:ascii="Calibri" w:hAnsi="Calibri" w:cs="Calibri"/>
-          <w:b/>
-          <w:color w:val="1F2937"/>
-          <w:sz w:val="30"/>
-        </w:rPr>
-        <w:t xml:space="preserve"> FOR PILOT BURNER </w:t>
-      </w:r>
-    </w:p>
-    <w:p>
-      <w:pPr>
-        <w:widowControl w:val="0"/>
-        <w:autoSpaceDE w:val="0"/>
-        <w:autoSpaceDN w:val="0"/>
-        <w:adjustRightInd w:val="0"/>
-        <w:jc w:val="both"/>
-      </w:pPr>
-      <w:r>
-        <w:rPr>
-          <w:rFonts w:ascii="Calibri" w:hAnsi="Calibri" w:cs="Calibri"/>
-        </w:rPr>
-        <w:t xml:space="preserve">The gas </w:t>
-      </w:r>
-      <w:r>
-        <w:rPr>
-          <w:rFonts w:ascii="Calibri" w:hAnsi="Calibri" w:cs="Calibri"/>
-        </w:rPr>
-        <w:t>line for pilot burner shall be routed from main gas train and</w:t>
-      </w:r>
-      <w:r>
-        <w:rPr>
-          <w:rFonts w:ascii="Calibri" w:hAnsi="Calibri" w:cs="Calibri"/>
-        </w:rPr>
-        <w:t xml:space="preserve"> will be consisting of following main components:</w:t>
-      </w:r>
-      <w:r>
-        <w:rPr>
-          <w:rFonts w:ascii="Calibri" w:hAnsi="Calibri" w:cs="Calibri"/>
-        </w:rPr>
-        <w:t xml:space="preserve"> The tube of Pilot burner shall be </w:t>
-      </w:r>
-      <w:r>
-        <w:rPr>
-          <w:rFonts w:ascii="Calibri" w:hAnsi="Calibri" w:cs="Calibri"/>
-        </w:rPr>
-        <w:t>SS – 304</w:t>
-      </w:r>
-      <w:r>
-        <w:rPr>
-          <w:rFonts w:ascii="Calibri" w:hAnsi="Calibri" w:cs="Calibri"/>
-        </w:rPr>
-        <w:t xml:space="preserve"> We have supplied the same tube and it’s working well as per the requirement</w:t>
-      </w:r>
-      <w:r>
-        <w:rPr>
-          <w:rFonts w:ascii="Calibri" w:hAnsi="Calibri" w:cs="Calibri"/>
-        </w:rPr>
-        <w:t>.</w:t>
-      </w:r>
-      <w:r>
-        <w:rPr>
-          <w:rFonts w:ascii="Calibri" w:hAnsi="Calibri" w:cs="Calibri"/>
-        </w:rPr>
-        <w:t xml:space="preserve"> </w:t>
-      </w:r>
-    </w:p>
-    <w:p>
-      <w:pPr>
-        <w:pStyle w:val="NoSpacing"/>
-        <w:numPr>
-          <w:ilvl w:val="0"/>
-          <w:numId w:val="4"/>
-        </w:numPr>
-        <w:rPr>
-          <w:rFonts w:ascii="Times New Roman" w:hAnsi="Times New Roman" w:cs="Times New Roman"/>
-          <w:sz w:val="24"/>
-          <w:szCs w:val="24"/>
-        </w:rPr>
-      </w:pPr>
-      <w:r>
-        <w:rPr>
-          <w:rFonts w:ascii="Calibri" w:hAnsi="Calibri" w:cs="Calibri"/>
-          <w:sz w:val="24"/>
-          <w:szCs w:val="24"/>
-        </w:rPr>
-        <w:t>Ball valve</w:t>
-      </w:r>
-    </w:p>
-    <w:p>
-      <w:pPr>
-        <w:pStyle w:val="NoSpacing"/>
-        <w:numPr>
-          <w:ilvl w:val="0"/>
-          <w:numId w:val="4"/>
-        </w:numPr>
-        <w:rPr>
-          <w:rFonts w:ascii="Times New Roman" w:hAnsi="Times New Roman" w:cs="Times New Roman"/>
-          <w:sz w:val="24"/>
-          <w:szCs w:val="24"/>
-        </w:rPr>
-      </w:pPr>
-      <w:r>
-        <w:rPr>
-          <w:rFonts w:ascii="Calibri" w:hAnsi="Calibri" w:cs="Calibri"/>
-          <w:sz w:val="24"/>
-          <w:szCs w:val="24"/>
-        </w:rPr>
-        <w:t>Pressure gauge with manual cock</w:t>
-      </w:r>
-    </w:p>
-    <w:p>
-      <w:pPr>
-        <w:pStyle w:val="NoSpacing"/>
-        <w:numPr>
-          <w:ilvl w:val="0"/>
-          <w:numId w:val="4"/>
-        </w:numPr>
-        <w:rPr>
-          <w:rFonts w:ascii="Times New Roman" w:hAnsi="Times New Roman" w:cs="Times New Roman"/>
-          <w:sz w:val="24"/>
-          <w:szCs w:val="24"/>
-        </w:rPr>
-      </w:pPr>
-      <w:r>
-        <w:rPr>
-          <w:rFonts w:ascii="Calibri" w:hAnsi="Calibri" w:cs="Calibri"/>
-          <w:sz w:val="24"/>
-          <w:szCs w:val="24"/>
-        </w:rPr>
-        <w:t>Pressure regulator</w:t>
-      </w:r>
-    </w:p>
-    <w:p>
-      <w:pPr>
-        <w:pStyle w:val="NoSpacing"/>
-        <w:numPr>
-          <w:ilvl w:val="0"/>
-          <w:numId w:val="4"/>
-        </w:numPr>
-        <w:rPr>
-          <w:rFonts w:ascii="Times New Roman" w:hAnsi="Times New Roman" w:cs="Times New Roman"/>
-          <w:sz w:val="24"/>
-          <w:szCs w:val="24"/>
-        </w:rPr>
-      </w:pPr>
-      <w:r>
-        <w:rPr>
-          <w:rFonts w:ascii="Calibri" w:hAnsi="Calibri" w:cs="Calibri"/>
-          <w:sz w:val="24"/>
-          <w:szCs w:val="24"/>
-        </w:rPr>
-        <w:t>Solenoid Valve</w:t>
-      </w:r>
-    </w:p>
-    <w:p>
-      <w:pPr>
-        <w:pStyle w:val="NoSpacing"/>
-        <w:numPr>
-          <w:ilvl w:val="0"/>
-          <w:numId w:val="4"/>
-        </w:numPr>
-        <w:rPr>
-          <w:rFonts w:ascii="Times New Roman" w:hAnsi="Times New Roman" w:cs="Times New Roman"/>
-          <w:sz w:val="24"/>
-          <w:szCs w:val="24"/>
-        </w:rPr>
-      </w:pPr>
-      <w:r>
-        <w:rPr>
-          <w:rFonts w:ascii="Calibri" w:hAnsi="Calibri" w:cs="Calibri"/>
-          <w:sz w:val="24"/>
-          <w:szCs w:val="24"/>
-        </w:rPr>
-        <w:t>Flexible Hoses</w:t>
-      </w:r>
-    </w:p>
-    <w:p>
-      <w:pPr>
-        <w:spacing w:before="180"/>
+        <w:spacing w:before="280" w:after="80"/>
         <w:jc w:val="both"/>
         <w:rPr>
           <w:b/>
@@ -3393,7 +3225,7 @@
     </w:p>
     <w:p>
       <w:pPr>
-        <w:spacing w:before="240"/>
+        <w:spacing w:before="280" w:after="80"/>
         <w:jc w:val="both"/>
         <w:rPr>
           <w:b/>
@@ -3532,61 +3364,7 @@
     </w:p>
     <w:p>
       <w:pPr>
-        <w:spacing w:before="180"/>
-        <w:rPr>
-          <w:b/>
-          <w:u w:val="single"/>
-        </w:rPr>
-      </w:pPr>
-    </w:p>
-    <w:p>
-      <w:pPr>
-        <w:spacing w:before="180"/>
-        <w:rPr>
-          <w:b/>
-          <w:u w:val="single"/>
-        </w:rPr>
-      </w:pPr>
-    </w:p>
-    <w:p>
-      <w:pPr>
-        <w:spacing w:before="180"/>
-        <w:rPr>
-          <w:b/>
-          <w:u w:val="single"/>
-        </w:rPr>
-      </w:pPr>
-    </w:p>
-    <w:p>
-      <w:pPr>
-        <w:spacing w:before="180"/>
-        <w:rPr>
-          <w:b/>
-          <w:u w:val="single"/>
-        </w:rPr>
-      </w:pPr>
-    </w:p>
-    <w:p>
-      <w:pPr>
-        <w:spacing w:before="180"/>
-        <w:rPr>
-          <w:b/>
-          <w:u w:val="single"/>
-        </w:rPr>
-      </w:pPr>
-    </w:p>
-    <w:p>
-      <w:pPr>
-        <w:spacing w:before="180"/>
-        <w:rPr>
-          <w:b/>
-          <w:u w:val="single"/>
-        </w:rPr>
-      </w:pPr>
-    </w:p>
-    <w:p>
-      <w:pPr>
-        <w:spacing w:before="180"/>
+        <w:spacing w:before="280" w:after="80"/>
         <w:rPr>
           <w:b/>
           <w:u w:val="single"/>
@@ -3970,25 +3748,7 @@
     </w:p>
     <w:p>
       <w:pPr>
-        <w:spacing w:before="240"/>
-        <w:jc w:val="both"/>
-        <w:rPr>
-          <w:b/>
-          <w:u w:val="single"/>
-        </w:rPr>
-      </w:pPr>
-    </w:p>
-    <w:p>
-      <w:pPr>
-        <w:jc w:val="both"/>
-        <w:rPr>
-          <w:b/>
-          <w:u w:val="single"/>
-        </w:rPr>
-      </w:pPr>
-    </w:p>
-    <w:p>
-      <w:pPr>
+        <w:spacing w:before="280" w:after="80"/>
         <w:jc w:val="both"/>
         <w:rPr>
           <w:b/>
@@ -4293,6 +4053,7 @@
     </w:p>
     <w:p>
       <w:pPr>
+        <w:spacing w:before="280" w:after="80"/>
         <w:rPr>
           <w:b/>
           <w:color w:val="000000"/>
@@ -4419,7 +4180,7 @@
     <w:p>
       <w:pPr>
         <w:widowControl w:val="0"/>
-        <w:spacing w:line="276" w:lineRule="auto"/>
+        <w:spacing w:line="276" w:lineRule="auto" w:before="280" w:after="80"/>
         <w:rPr>
           <w:b/>
           <w:iCs/>
@@ -4815,50 +4576,6 @@
         </w:tc>
       </w:tr>
     </w:tbl>
-    <w:p>
-      <w:pPr>
-        <w:rPr>
-          <w:b/>
-          <w:bCs/>
-          <w:color w:val="000000"/>
-          <w:u w:val="single"/>
-          <w:lang w:val="en-US" w:eastAsia="en-US" w:bidi="ar-SA"/>
-        </w:rPr>
-      </w:pPr>
-      <w:r>
-        <w:rPr>
-          <w:rFonts w:ascii="Calibri" w:hAnsi="Calibri" w:cs="Calibri"/>
-          <w:color w:val="000000"/>
-        </w:rPr>
-        <w:t xml:space="preserve"> </w:t>
-      </w:r>
-    </w:p>
-    <w:p>
-      <w:pPr>
-        <w:jc w:val="both"/>
-        <w:rPr>
-          <w:b/>
-          <w:bCs/>
-          <w:color w:val="000000"/>
-          <w:u w:val="single"/>
-          <w:lang w:val="en-US" w:eastAsia="en-US" w:bidi="ar-SA"/>
-        </w:rPr>
-      </w:pPr>
-      <w:r>
-        <w:rPr>
-          <w:rFonts w:ascii="Calibri" w:hAnsi="Calibri" w:cs="Calibri"/>
-          <w:color w:val="000000"/>
-        </w:rPr>
-        <w:t xml:space="preserve">   </w:t>
-      </w:r>
-    </w:p>
-    <w:p>
-      <w:pPr>
-        <w:rPr>
-          <w:lang w:val="en-US" w:eastAsia="en-US" w:bidi="ar-SA"/>
-        </w:rPr>
-      </w:pPr>
-    </w:p>
     <w:p>
       <w:pPr>
         <w:rPr>
@@ -9025,357 +8742,7 @@
     <w:p>
       <w:pPr>
         <w:pStyle w:val="NoSpacing"/>
-        <w:spacing w:before="180"/>
-        <w:rPr>
-          <w:rFonts w:ascii="Times New Roman" w:hAnsi="Times New Roman" w:cs="Times New Roman"/>
-          <w:b/>
-          <w:bCs/>
-          <w:sz w:val="24"/>
-          <w:szCs w:val="24"/>
-          <w:u w:val="single"/>
-        </w:rPr>
-      </w:pPr>
-    </w:p>
-    <w:p>
-      <w:pPr>
-        <w:pStyle w:val="NoSpacing"/>
-        <w:spacing w:before="180"/>
-        <w:rPr>
-          <w:rFonts w:ascii="Times New Roman" w:hAnsi="Times New Roman" w:cs="Times New Roman"/>
-          <w:b/>
-          <w:bCs/>
-          <w:sz w:val="24"/>
-          <w:szCs w:val="24"/>
-          <w:u w:val="single"/>
-        </w:rPr>
-      </w:pPr>
-    </w:p>
-    <w:p>
-      <w:pPr>
-        <w:pStyle w:val="NoSpacing"/>
-        <w:spacing w:before="180"/>
-        <w:rPr>
-          <w:rFonts w:ascii="Times New Roman" w:hAnsi="Times New Roman" w:cs="Times New Roman"/>
-          <w:b/>
-          <w:bCs/>
-          <w:sz w:val="24"/>
-          <w:szCs w:val="24"/>
-          <w:u w:val="single"/>
-        </w:rPr>
-      </w:pPr>
-    </w:p>
-    <w:p>
-      <w:pPr>
-        <w:pStyle w:val="NoSpacing"/>
-        <w:spacing w:before="180"/>
-        <w:rPr>
-          <w:rFonts w:ascii="Times New Roman" w:hAnsi="Times New Roman" w:cs="Times New Roman"/>
-          <w:b/>
-          <w:bCs/>
-          <w:sz w:val="24"/>
-          <w:szCs w:val="24"/>
-          <w:u w:val="single"/>
-        </w:rPr>
-      </w:pPr>
-    </w:p>
-    <w:p>
-      <w:pPr>
-        <w:pStyle w:val="NoSpacing"/>
-        <w:spacing w:before="180"/>
-        <w:rPr>
-          <w:rFonts w:ascii="Times New Roman" w:hAnsi="Times New Roman" w:cs="Times New Roman"/>
-          <w:b/>
-          <w:bCs/>
-          <w:sz w:val="24"/>
-          <w:szCs w:val="24"/>
-          <w:u w:val="single"/>
-        </w:rPr>
-      </w:pPr>
-    </w:p>
-    <w:p>
-      <w:pPr>
-        <w:pStyle w:val="NoSpacing"/>
-        <w:spacing w:before="180"/>
-        <w:rPr>
-          <w:rFonts w:ascii="Times New Roman" w:hAnsi="Times New Roman" w:cs="Times New Roman"/>
-          <w:b/>
-          <w:bCs/>
-          <w:sz w:val="24"/>
-          <w:szCs w:val="24"/>
-          <w:u w:val="single"/>
-        </w:rPr>
-      </w:pPr>
-    </w:p>
-    <w:p>
-      <w:pPr>
-        <w:pStyle w:val="NoSpacing"/>
-        <w:spacing w:before="180"/>
-        <w:rPr>
-          <w:rFonts w:ascii="Times New Roman" w:hAnsi="Times New Roman" w:cs="Times New Roman"/>
-          <w:b/>
-          <w:bCs/>
-          <w:sz w:val="24"/>
-          <w:szCs w:val="24"/>
-          <w:u w:val="single"/>
-        </w:rPr>
-      </w:pPr>
-    </w:p>
-    <w:p>
-      <w:pPr>
-        <w:pStyle w:val="NoSpacing"/>
-        <w:spacing w:before="180"/>
-        <w:rPr>
-          <w:rFonts w:ascii="Times New Roman" w:hAnsi="Times New Roman" w:cs="Times New Roman"/>
-          <w:b/>
-          <w:bCs/>
-          <w:sz w:val="24"/>
-          <w:szCs w:val="24"/>
-          <w:u w:val="single"/>
-        </w:rPr>
-      </w:pPr>
-    </w:p>
-    <w:p>
-      <w:pPr>
-        <w:pStyle w:val="NoSpacing"/>
-        <w:spacing w:before="180"/>
-        <w:rPr>
-          <w:rFonts w:ascii="Times New Roman" w:hAnsi="Times New Roman" w:cs="Times New Roman"/>
-          <w:b/>
-          <w:bCs/>
-          <w:sz w:val="24"/>
-          <w:szCs w:val="24"/>
-          <w:u w:val="single"/>
-        </w:rPr>
-      </w:pPr>
-    </w:p>
-    <w:p>
-      <w:pPr>
-        <w:pStyle w:val="NoSpacing"/>
-        <w:spacing w:before="180"/>
-        <w:rPr>
-          <w:rFonts w:ascii="Times New Roman" w:hAnsi="Times New Roman" w:cs="Times New Roman"/>
-          <w:b/>
-          <w:bCs/>
-          <w:sz w:val="24"/>
-          <w:szCs w:val="24"/>
-          <w:u w:val="single"/>
-        </w:rPr>
-      </w:pPr>
-    </w:p>
-    <w:p>
-      <w:pPr>
-        <w:pStyle w:val="NoSpacing"/>
-        <w:spacing w:before="180"/>
-        <w:rPr>
-          <w:rFonts w:ascii="Times New Roman" w:hAnsi="Times New Roman" w:cs="Times New Roman"/>
-          <w:b/>
-          <w:bCs/>
-          <w:sz w:val="24"/>
-          <w:szCs w:val="24"/>
-          <w:u w:val="single"/>
-        </w:rPr>
-      </w:pPr>
-    </w:p>
-    <w:p>
-      <w:pPr>
-        <w:pStyle w:val="NoSpacing"/>
-        <w:spacing w:before="180"/>
-        <w:rPr>
-          <w:rFonts w:ascii="Times New Roman" w:hAnsi="Times New Roman" w:cs="Times New Roman"/>
-          <w:b/>
-          <w:bCs/>
-          <w:sz w:val="24"/>
-          <w:szCs w:val="24"/>
-          <w:u w:val="single"/>
-        </w:rPr>
-      </w:pPr>
-    </w:p>
-    <w:p>
-      <w:pPr>
-        <w:pStyle w:val="NoSpacing"/>
-        <w:spacing w:before="180"/>
-        <w:rPr>
-          <w:rFonts w:ascii="Times New Roman" w:hAnsi="Times New Roman" w:cs="Times New Roman"/>
-          <w:b/>
-          <w:bCs/>
-          <w:sz w:val="24"/>
-          <w:szCs w:val="24"/>
-          <w:u w:val="single"/>
-        </w:rPr>
-      </w:pPr>
-    </w:p>
-    <w:p>
-      <w:pPr>
-        <w:pStyle w:val="NoSpacing"/>
-        <w:spacing w:before="180"/>
-        <w:rPr>
-          <w:rFonts w:ascii="Times New Roman" w:hAnsi="Times New Roman" w:cs="Times New Roman"/>
-          <w:b/>
-          <w:bCs/>
-          <w:sz w:val="24"/>
-          <w:szCs w:val="24"/>
-          <w:u w:val="single"/>
-        </w:rPr>
-      </w:pPr>
-    </w:p>
-    <w:p>
-      <w:pPr>
-        <w:pStyle w:val="NoSpacing"/>
-        <w:spacing w:before="180"/>
-        <w:rPr>
-          <w:rFonts w:ascii="Times New Roman" w:hAnsi="Times New Roman" w:cs="Times New Roman"/>
-          <w:b/>
-          <w:bCs/>
-          <w:sz w:val="24"/>
-          <w:szCs w:val="24"/>
-          <w:u w:val="single"/>
-        </w:rPr>
-      </w:pPr>
-    </w:p>
-    <w:p>
-      <w:pPr>
-        <w:pStyle w:val="NoSpacing"/>
-        <w:spacing w:before="180"/>
-        <w:rPr>
-          <w:rFonts w:ascii="Times New Roman" w:hAnsi="Times New Roman" w:cs="Times New Roman"/>
-          <w:b/>
-          <w:bCs/>
-          <w:sz w:val="24"/>
-          <w:szCs w:val="24"/>
-          <w:u w:val="single"/>
-        </w:rPr>
-      </w:pPr>
-    </w:p>
-    <w:p>
-      <w:pPr>
-        <w:pStyle w:val="NoSpacing"/>
-        <w:spacing w:before="180"/>
-        <w:rPr>
-          <w:rFonts w:ascii="Times New Roman" w:hAnsi="Times New Roman" w:cs="Times New Roman"/>
-          <w:b/>
-          <w:bCs/>
-          <w:sz w:val="24"/>
-          <w:szCs w:val="24"/>
-          <w:u w:val="single"/>
-        </w:rPr>
-      </w:pPr>
-    </w:p>
-    <w:p>
-      <w:pPr>
-        <w:pStyle w:val="NoSpacing"/>
-        <w:spacing w:before="180"/>
-        <w:rPr>
-          <w:rFonts w:ascii="Times New Roman" w:hAnsi="Times New Roman" w:cs="Times New Roman"/>
-          <w:b/>
-          <w:bCs/>
-          <w:sz w:val="24"/>
-          <w:szCs w:val="24"/>
-          <w:u w:val="single"/>
-        </w:rPr>
-      </w:pPr>
-    </w:p>
-    <w:p>
-      <w:pPr>
-        <w:pStyle w:val="NoSpacing"/>
-        <w:spacing w:before="180"/>
-        <w:rPr>
-          <w:rFonts w:ascii="Times New Roman" w:hAnsi="Times New Roman" w:cs="Times New Roman"/>
-          <w:b/>
-          <w:bCs/>
-          <w:sz w:val="24"/>
-          <w:szCs w:val="24"/>
-          <w:u w:val="single"/>
-        </w:rPr>
-      </w:pPr>
-    </w:p>
-    <w:p>
-      <w:pPr>
-        <w:pStyle w:val="NoSpacing"/>
-        <w:spacing w:before="180"/>
-        <w:rPr>
-          <w:rFonts w:ascii="Times New Roman" w:hAnsi="Times New Roman" w:cs="Times New Roman"/>
-          <w:b/>
-          <w:bCs/>
-          <w:sz w:val="24"/>
-          <w:szCs w:val="24"/>
-          <w:u w:val="single"/>
-        </w:rPr>
-      </w:pPr>
-    </w:p>
-    <w:p>
-      <w:pPr>
-        <w:pStyle w:val="NoSpacing"/>
-        <w:spacing w:before="180"/>
-        <w:rPr>
-          <w:rFonts w:ascii="Times New Roman" w:hAnsi="Times New Roman" w:cs="Times New Roman"/>
-          <w:b/>
-          <w:bCs/>
-          <w:sz w:val="24"/>
-          <w:szCs w:val="24"/>
-          <w:u w:val="single"/>
-        </w:rPr>
-      </w:pPr>
-    </w:p>
-    <w:p>
-      <w:pPr>
-        <w:pStyle w:val="NoSpacing"/>
-        <w:spacing w:before="180"/>
-        <w:rPr>
-          <w:rFonts w:ascii="Times New Roman" w:hAnsi="Times New Roman" w:cs="Times New Roman"/>
-          <w:b/>
-          <w:bCs/>
-          <w:sz w:val="24"/>
-          <w:szCs w:val="24"/>
-          <w:u w:val="single"/>
-        </w:rPr>
-      </w:pPr>
-    </w:p>
-    <w:p>
-      <w:pPr>
-        <w:pStyle w:val="NoSpacing"/>
-        <w:spacing w:before="180"/>
-        <w:rPr>
-          <w:rFonts w:ascii="Times New Roman" w:hAnsi="Times New Roman" w:cs="Times New Roman"/>
-          <w:b/>
-          <w:bCs/>
-          <w:sz w:val="24"/>
-          <w:szCs w:val="24"/>
-          <w:u w:val="single"/>
-        </w:rPr>
-      </w:pPr>
-    </w:p>
-    <w:p>
-      <w:pPr>
-        <w:pStyle w:val="NoSpacing"/>
-        <w:spacing w:before="180"/>
-        <w:rPr>
-          <w:rFonts w:ascii="Times New Roman" w:hAnsi="Times New Roman" w:cs="Times New Roman"/>
-          <w:b/>
-          <w:bCs/>
-          <w:sz w:val="24"/>
-          <w:szCs w:val="24"/>
-          <w:u w:val="single"/>
-        </w:rPr>
-      </w:pPr>
-    </w:p>
-    <w:p>
-      <w:pPr>
-        <w:pStyle w:val="NoSpacing"/>
-        <w:spacing w:before="180"/>
-        <w:rPr>
-          <w:rFonts w:ascii="Times New Roman" w:hAnsi="Times New Roman" w:cs="Times New Roman"/>
-          <w:b/>
-          <w:bCs/>
-          <w:sz w:val="24"/>
-          <w:szCs w:val="24"/>
-          <w:u w:val="single"/>
-        </w:rPr>
-      </w:pPr>
-    </w:p>
-    <w:p>
-      <w:pPr>
-        <w:pStyle w:val="NoSpacing"/>
-        <w:spacing w:before="180"/>
+        <w:spacing w:before="280" w:after="80"/>
         <w:rPr>
           <w:rFonts w:ascii="Times New Roman" w:hAnsi="Times New Roman" w:cs="Times New Roman"/>
           <w:b/>
@@ -9907,16 +9274,6 @@
         </w:rPr>
         <w:t>:</w:t>
       </w:r>
-    </w:p>
-    <w:p>
-      <w:pPr>
-        <w:pStyle w:val="NoSpacing"/>
-        <w:rPr>
-          <w:rFonts w:ascii="Times New Roman" w:hAnsi="Times New Roman" w:cs="Times New Roman"/>
-          <w:sz w:val="24"/>
-          <w:szCs w:val="24"/>
-        </w:rPr>
-      </w:pPr>
     </w:p>
     <w:tbl>
       <w:tblPr>
@@ -14682,9 +14039,9 @@
         </w:tc>
       </w:tr>
     </w:tbl>
-    <w:p/>
     <w:p>
       <w:pPr>
+        <w:spacing w:before="280" w:after="80"/>
         <w:jc w:val="center"/>
         <w:rPr>
           <w:b/>
@@ -14713,14 +14070,6 @@
         </w:rPr>
         <w:t>MAKE LIST</w:t>
       </w:r>
-    </w:p>
-    <w:p>
-      <w:pPr>
-        <w:jc w:val="center"/>
-        <w:rPr>
-          <w:u w:val="single"/>
-        </w:rPr>
-      </w:pPr>
     </w:p>
     <w:tbl>
       <w:tblPr>
@@ -17135,17 +16484,6 @@
           <w:lang w:val="en-US" w:eastAsia="en-US" w:bidi="ar-SA"/>
         </w:rPr>
       </w:pPr>
-    </w:p>
-    <w:p>
-      <w:pPr>
-        <w:rPr>
-          <w:rFonts w:eastAsiaTheme="minorHAnsi"/>
-          <w:b/>
-          <w:bCs/>
-          <w:spacing w:val="-3"/>
-          <w:lang w:val="en-US" w:eastAsia="en-US" w:bidi="ar-SA"/>
-        </w:rPr>
-      </w:pPr>
       <w:r>
         <w:rPr>
           <w:b/>
@@ -17158,6 +16496,7 @@
     <w:p>
       <w:pPr>
         <w:pStyle w:val="NoSpacing"/>
+        <w:spacing w:before="280" w:after="80"/>
         <w:jc w:val="center"/>
         <w:rPr>
           <w:rFonts w:ascii="Times New Roman" w:hAnsi="Times New Roman" w:cs="Times New Roman"/>
@@ -17209,7 +16548,7 @@
     <w:p>
       <w:pPr>
         <w:pStyle w:val="NoSpacing"/>
-        <w:spacing w:before="240"/>
+        <w:spacing w:before="280" w:after="80"/>
         <w:jc w:val="center"/>
         <w:rPr>
           <w:rFonts w:ascii="Times New Roman" w:hAnsi="Times New Roman" w:cs="Times New Roman"/>
@@ -17236,32 +16575,6 @@
           <w:lang w:val="en-GB"/>
         </w:rPr>
         <w:t>PRICE SCHEDULE</w:t>
-      </w:r>
-    </w:p>
-    <w:p>
-      <w:pPr>
-        <w:pStyle w:val="NoSpacing"/>
-        <w:rPr>
-          <w:rFonts w:ascii="Times New Roman" w:hAnsi="Times New Roman" w:cs="Times New Roman"/>
-          <w:b/>
-          <w:bCs/>
-          <w:color w:val="000000"/>
-          <w:sz w:val="24"/>
-          <w:szCs w:val="24"/>
-          <w:lang w:val="en-GB"/>
-        </w:rPr>
-      </w:pPr>
-      <w:r>
-        <w:rPr>
-          <w:rFonts w:ascii="Calibri" w:hAnsi="Calibri" w:cs="Calibri"/>
-          <w:b/>
-          <w:bCs/>
-          <w:color w:val="000000"/>
-          <w:sz w:val="24"/>
-          <w:szCs w:val="24"/>
-          <w:lang w:val="en-GB"/>
-        </w:rPr>
-        <w:t xml:space="preserve"> </w:t>
       </w:r>
     </w:p>
     <w:tbl>
@@ -17767,19 +17080,7 @@
     </w:p>
     <w:p>
       <w:pPr>
-        <w:pStyle w:val="NoSpacing"/>
-        <w:rPr>
-          <w:rFonts w:ascii="Times New Roman" w:hAnsi="Times New Roman" w:cs="Times New Roman"/>
-          <w:b/>
-          <w:color w:val="000000"/>
-          <w:sz w:val="24"/>
-          <w:szCs w:val="24"/>
-          <w:lang w:val="en-GB"/>
-        </w:rPr>
-      </w:pPr>
-    </w:p>
-    <w:p>
-      <w:pPr>
+        <w:spacing w:before="280" w:after="80"/>
         <w:rPr>
           <w:b/>
           <w:bCs/>
@@ -17900,382 +17201,7 @@
     <w:p>
       <w:pPr>
         <w:pStyle w:val="ListParagraph"/>
-        <w:spacing w:before="120"/>
-        <w:ind w:left="714"/>
-        <w:contextualSpacing w:val="0"/>
-        <w:jc w:val="center"/>
-        <w:rPr>
-          <w:b/>
-          <w:bCs/>
-          <w:spacing w:val="-1"/>
-          <w:u w:val="single"/>
-        </w:rPr>
-      </w:pPr>
-    </w:p>
-    <w:p>
-      <w:pPr>
-        <w:pStyle w:val="ListParagraph"/>
-        <w:spacing w:before="120"/>
-        <w:ind w:left="714"/>
-        <w:contextualSpacing w:val="0"/>
-        <w:jc w:val="center"/>
-        <w:rPr>
-          <w:b/>
-          <w:bCs/>
-          <w:spacing w:val="-1"/>
-          <w:u w:val="single"/>
-        </w:rPr>
-      </w:pPr>
-    </w:p>
-    <w:p>
-      <w:pPr>
-        <w:pStyle w:val="ListParagraph"/>
-        <w:spacing w:before="120"/>
-        <w:ind w:left="714"/>
-        <w:contextualSpacing w:val="0"/>
-        <w:jc w:val="center"/>
-        <w:rPr>
-          <w:b/>
-          <w:bCs/>
-          <w:spacing w:val="-1"/>
-          <w:u w:val="single"/>
-        </w:rPr>
-      </w:pPr>
-    </w:p>
-    <w:p>
-      <w:pPr>
-        <w:pStyle w:val="ListParagraph"/>
-        <w:spacing w:before="120"/>
-        <w:ind w:left="714"/>
-        <w:contextualSpacing w:val="0"/>
-        <w:jc w:val="center"/>
-        <w:rPr>
-          <w:b/>
-          <w:bCs/>
-          <w:spacing w:val="-1"/>
-          <w:u w:val="single"/>
-        </w:rPr>
-      </w:pPr>
-    </w:p>
-    <w:p>
-      <w:pPr>
-        <w:pStyle w:val="ListParagraph"/>
-        <w:spacing w:before="120"/>
-        <w:ind w:left="714"/>
-        <w:contextualSpacing w:val="0"/>
-        <w:jc w:val="center"/>
-        <w:rPr>
-          <w:b/>
-          <w:bCs/>
-          <w:spacing w:val="-1"/>
-          <w:u w:val="single"/>
-        </w:rPr>
-      </w:pPr>
-    </w:p>
-    <w:p>
-      <w:pPr>
-        <w:pStyle w:val="ListParagraph"/>
-        <w:spacing w:before="120"/>
-        <w:ind w:left="714"/>
-        <w:contextualSpacing w:val="0"/>
-        <w:jc w:val="center"/>
-        <w:rPr>
-          <w:b/>
-          <w:bCs/>
-          <w:spacing w:val="-1"/>
-          <w:u w:val="single"/>
-        </w:rPr>
-      </w:pPr>
-    </w:p>
-    <w:p>
-      <w:pPr>
-        <w:pStyle w:val="ListParagraph"/>
-        <w:spacing w:before="120"/>
-        <w:ind w:left="714"/>
-        <w:contextualSpacing w:val="0"/>
-        <w:jc w:val="center"/>
-        <w:rPr>
-          <w:b/>
-          <w:bCs/>
-          <w:spacing w:val="-1"/>
-          <w:u w:val="single"/>
-        </w:rPr>
-      </w:pPr>
-    </w:p>
-    <w:p>
-      <w:pPr>
-        <w:pStyle w:val="ListParagraph"/>
-        <w:spacing w:before="120"/>
-        <w:ind w:left="714"/>
-        <w:contextualSpacing w:val="0"/>
-        <w:jc w:val="center"/>
-        <w:rPr>
-          <w:b/>
-          <w:bCs/>
-          <w:spacing w:val="-1"/>
-          <w:u w:val="single"/>
-        </w:rPr>
-      </w:pPr>
-    </w:p>
-    <w:p>
-      <w:pPr>
-        <w:pStyle w:val="ListParagraph"/>
-        <w:spacing w:before="120"/>
-        <w:ind w:left="714"/>
-        <w:contextualSpacing w:val="0"/>
-        <w:jc w:val="center"/>
-        <w:rPr>
-          <w:b/>
-          <w:bCs/>
-          <w:spacing w:val="-1"/>
-          <w:u w:val="single"/>
-        </w:rPr>
-      </w:pPr>
-    </w:p>
-    <w:p>
-      <w:pPr>
-        <w:pStyle w:val="ListParagraph"/>
-        <w:spacing w:before="120"/>
-        <w:ind w:left="714"/>
-        <w:contextualSpacing w:val="0"/>
-        <w:jc w:val="center"/>
-        <w:rPr>
-          <w:b/>
-          <w:bCs/>
-          <w:spacing w:val="-1"/>
-          <w:u w:val="single"/>
-        </w:rPr>
-      </w:pPr>
-    </w:p>
-    <w:p>
-      <w:pPr>
-        <w:pStyle w:val="ListParagraph"/>
-        <w:spacing w:before="120"/>
-        <w:ind w:left="714"/>
-        <w:contextualSpacing w:val="0"/>
-        <w:jc w:val="center"/>
-        <w:rPr>
-          <w:b/>
-          <w:bCs/>
-          <w:spacing w:val="-1"/>
-          <w:u w:val="single"/>
-        </w:rPr>
-      </w:pPr>
-    </w:p>
-    <w:p>
-      <w:pPr>
-        <w:pStyle w:val="ListParagraph"/>
-        <w:spacing w:before="120"/>
-        <w:ind w:left="714"/>
-        <w:contextualSpacing w:val="0"/>
-        <w:jc w:val="center"/>
-        <w:rPr>
-          <w:b/>
-          <w:bCs/>
-          <w:spacing w:val="-1"/>
-          <w:u w:val="single"/>
-        </w:rPr>
-      </w:pPr>
-    </w:p>
-    <w:p>
-      <w:pPr>
-        <w:pStyle w:val="ListParagraph"/>
-        <w:spacing w:before="120"/>
-        <w:ind w:left="714"/>
-        <w:contextualSpacing w:val="0"/>
-        <w:jc w:val="center"/>
-        <w:rPr>
-          <w:b/>
-          <w:bCs/>
-          <w:spacing w:val="-1"/>
-          <w:u w:val="single"/>
-        </w:rPr>
-      </w:pPr>
-    </w:p>
-    <w:p>
-      <w:pPr>
-        <w:pStyle w:val="ListParagraph"/>
-        <w:spacing w:before="120"/>
-        <w:ind w:left="714"/>
-        <w:contextualSpacing w:val="0"/>
-        <w:jc w:val="center"/>
-        <w:rPr>
-          <w:b/>
-          <w:bCs/>
-          <w:spacing w:val="-1"/>
-          <w:u w:val="single"/>
-        </w:rPr>
-      </w:pPr>
-    </w:p>
-    <w:p>
-      <w:pPr>
-        <w:pStyle w:val="ListParagraph"/>
-        <w:spacing w:before="120"/>
-        <w:ind w:left="714"/>
-        <w:contextualSpacing w:val="0"/>
-        <w:jc w:val="center"/>
-        <w:rPr>
-          <w:b/>
-          <w:bCs/>
-          <w:spacing w:val="-1"/>
-          <w:u w:val="single"/>
-        </w:rPr>
-      </w:pPr>
-    </w:p>
-    <w:p>
-      <w:pPr>
-        <w:pStyle w:val="ListParagraph"/>
-        <w:spacing w:before="120"/>
-        <w:ind w:left="714"/>
-        <w:contextualSpacing w:val="0"/>
-        <w:jc w:val="center"/>
-        <w:rPr>
-          <w:b/>
-          <w:bCs/>
-          <w:spacing w:val="-1"/>
-          <w:u w:val="single"/>
-        </w:rPr>
-      </w:pPr>
-    </w:p>
-    <w:p>
-      <w:pPr>
-        <w:pStyle w:val="ListParagraph"/>
-        <w:spacing w:before="120"/>
-        <w:ind w:left="714"/>
-        <w:contextualSpacing w:val="0"/>
-        <w:jc w:val="center"/>
-        <w:rPr>
-          <w:b/>
-          <w:bCs/>
-          <w:spacing w:val="-1"/>
-          <w:u w:val="single"/>
-        </w:rPr>
-      </w:pPr>
-    </w:p>
-    <w:p>
-      <w:pPr>
-        <w:pStyle w:val="ListParagraph"/>
-        <w:spacing w:before="120"/>
-        <w:ind w:left="714"/>
-        <w:contextualSpacing w:val="0"/>
-        <w:jc w:val="center"/>
-        <w:rPr>
-          <w:b/>
-          <w:bCs/>
-          <w:spacing w:val="-1"/>
-          <w:u w:val="single"/>
-        </w:rPr>
-      </w:pPr>
-    </w:p>
-    <w:p>
-      <w:pPr>
-        <w:pStyle w:val="ListParagraph"/>
-        <w:spacing w:before="120"/>
-        <w:ind w:left="714"/>
-        <w:contextualSpacing w:val="0"/>
-        <w:jc w:val="center"/>
-        <w:rPr>
-          <w:b/>
-          <w:bCs/>
-          <w:spacing w:val="-1"/>
-          <w:u w:val="single"/>
-        </w:rPr>
-      </w:pPr>
-    </w:p>
-    <w:p>
-      <w:pPr>
-        <w:pStyle w:val="ListParagraph"/>
-        <w:spacing w:before="120"/>
-        <w:ind w:left="714"/>
-        <w:contextualSpacing w:val="0"/>
-        <w:jc w:val="center"/>
-        <w:rPr>
-          <w:b/>
-          <w:bCs/>
-          <w:spacing w:val="-1"/>
-          <w:u w:val="single"/>
-        </w:rPr>
-      </w:pPr>
-    </w:p>
-    <w:p>
-      <w:pPr>
-        <w:pStyle w:val="ListParagraph"/>
-        <w:spacing w:before="120"/>
-        <w:ind w:left="714"/>
-        <w:contextualSpacing w:val="0"/>
-        <w:jc w:val="center"/>
-        <w:rPr>
-          <w:b/>
-          <w:bCs/>
-          <w:spacing w:val="-1"/>
-          <w:u w:val="single"/>
-        </w:rPr>
-      </w:pPr>
-    </w:p>
-    <w:p>
-      <w:pPr>
-        <w:pStyle w:val="ListParagraph"/>
-        <w:spacing w:before="120"/>
-        <w:ind w:left="714"/>
-        <w:contextualSpacing w:val="0"/>
-        <w:jc w:val="center"/>
-        <w:rPr>
-          <w:b/>
-          <w:bCs/>
-          <w:spacing w:val="-1"/>
-          <w:u w:val="single"/>
-        </w:rPr>
-      </w:pPr>
-    </w:p>
-    <w:p>
-      <w:pPr>
-        <w:pStyle w:val="ListParagraph"/>
-        <w:spacing w:before="120"/>
-        <w:ind w:left="714"/>
-        <w:contextualSpacing w:val="0"/>
-        <w:jc w:val="center"/>
-        <w:rPr>
-          <w:b/>
-          <w:bCs/>
-          <w:spacing w:val="-1"/>
-          <w:u w:val="single"/>
-        </w:rPr>
-      </w:pPr>
-    </w:p>
-    <w:p>
-      <w:pPr>
-        <w:pStyle w:val="ListParagraph"/>
-        <w:spacing w:before="120"/>
-        <w:ind w:left="714"/>
-        <w:contextualSpacing w:val="0"/>
-        <w:jc w:val="center"/>
-        <w:rPr>
-          <w:b/>
-          <w:bCs/>
-          <w:spacing w:val="-1"/>
-          <w:u w:val="single"/>
-        </w:rPr>
-      </w:pPr>
-    </w:p>
-    <w:p>
-      <w:pPr>
-        <w:pStyle w:val="ListParagraph"/>
-        <w:spacing w:before="120"/>
-        <w:ind w:left="714"/>
-        <w:contextualSpacing w:val="0"/>
-        <w:jc w:val="center"/>
-        <w:rPr>
-          <w:b/>
-          <w:bCs/>
-          <w:spacing w:val="-1"/>
-          <w:u w:val="single"/>
-        </w:rPr>
-      </w:pPr>
-    </w:p>
-    <w:p>
-      <w:pPr>
-        <w:pStyle w:val="ListParagraph"/>
-        <w:spacing w:before="120"/>
+        <w:spacing w:before="280" w:after="80"/>
         <w:ind w:left="714"/>
         <w:contextualSpacing w:val="0"/>
         <w:jc w:val="center"/>
@@ -24573,26 +23499,6 @@
         <w:t>hichever is earlier.</w:t>
       </w:r>
     </w:p>
-    <w:p/>
-    <w:p/>
-    <w:p/>
-    <w:p/>
-    <w:p/>
-    <w:p/>
-    <w:p/>
-    <w:p/>
-    <w:p/>
-    <w:p/>
-    <w:p/>
-    <w:p/>
-    <w:p/>
-    <w:p/>
-    <w:p/>
-    <w:p/>
-    <w:p/>
-    <w:p/>
-    <w:p/>
-    <w:p/>
     <w:tbl>
       <w:tblPr>
         <w:tblW w:w="8713" w:type="dxa"/>
@@ -25982,9 +24888,6 @@
         </w:tc>
       </w:tr>
     </w:tbl>
-    <w:p/>
-    <w:p/>
-    <w:p/>
     <w:p>
       <w:pPr>
         <w:ind w:firstLine="360"/>
@@ -26131,26 +25034,6 @@
         <w:t>is will lead to quicker payback.</w:t>
       </w:r>
     </w:p>
-    <w:p>
-      <w:pPr>
-        <w:pStyle w:val="ListParagraph"/>
-      </w:pPr>
-    </w:p>
-    <w:p>
-      <w:bookmarkStart w:id="0" w:name="_GoBack"/>
-      <w:bookmarkEnd w:id="0"/>
-    </w:p>
-    <w:p/>
-    <w:p/>
-    <w:p/>
-    <w:p/>
-    <w:p/>
-    <w:p/>
-    <w:p/>
-    <w:p/>
-    <w:p/>
-    <w:p/>
-    <w:p/>
     <w:sectPr>
       <w:headerReference w:type="default" r:id="rId9"/>
       <w:footerReference w:type="default" r:id="rId10"/>

</xml_diff>

<commit_message>
style: regen price schedule + supervision like vertical
Replace the regen 3-col price table (S.No/Desc/Price) with the vertical 5-col
schedule (S.No · Item Description · Qty · Unit Price · Total Price + TOTAL row),
repointed to regen placeholders (price_line_desc / qty_words / price_inr). Swap
the bulleted supervision charges for the vertical supervision-charges table
(mech/PLC rates from the pricelist + note row). Price-in-words line retained.

Co-Authored-By: Claude Opus 4.8 (1M context) <noreply@anthropic.com>
</commit_message>
<xml_diff>
--- a/Regen_Offer_Template.docx
+++ b/Regen_Offer_Template.docx
@@ -16579,392 +16579,504 @@
     </w:p>
     <w:tbl>
       <w:tblPr>
-        <w:tblW w:w="9351" w:type="dxa"/>
-        <w:tblLook w:val="04A0" w:firstRow="1" w:lastRow="0" w:firstColumn="1" w:lastColumn="0" w:noHBand="0" w:noVBand="1"/>
+        <w:tblW w:type="dxa" w:w="9360"/>
+        <w:tblBorders>
+          <w:top w:val="single" w:color="auto" w:sz="4"/>
+          <w:left w:val="single" w:color="auto" w:sz="4"/>
+          <w:bottom w:val="single" w:color="auto" w:sz="4"/>
+          <w:right w:val="single" w:color="auto" w:sz="4"/>
+          <w:insideH w:val="single" w:color="auto" w:sz="4"/>
+          <w:insideV w:val="single" w:color="auto" w:sz="4"/>
+        </w:tblBorders>
       </w:tblPr>
       <w:tblGrid>
-        <w:gridCol w:w="846"/>
-        <w:gridCol w:w="6237"/>
-        <w:gridCol w:w="2268"/>
+        <w:gridCol w:w="780"/>
+        <w:gridCol w:w="4080"/>
+        <w:gridCol w:w="1100"/>
+        <w:gridCol w:w="1700"/>
+        <w:gridCol w:w="1700"/>
       </w:tblGrid>
       <w:tr>
         <w:trPr>
-          <w:trHeight w:val="454"/>
+          <w:tblHeader/>
         </w:trPr>
         <w:tc>
           <w:tcPr>
-            <w:tcW w:w="846" w:type="dxa"/>
+            <w:tcW w:type="dxa" w:w="780"/>
             <w:tcBorders>
-              <w:top w:val="single" w:sz="4" w:space="0" w:color="auto"/>
-              <w:left w:val="single" w:sz="4" w:space="0" w:color="auto"/>
-              <w:bottom w:val="single" w:sz="4" w:space="0" w:color="auto"/>
-              <w:right w:val="single" w:sz="4" w:space="0" w:color="auto"/>
+              <w:top w:val="single" w:color="BFBFBF" w:sz="4"/>
+              <w:left w:val="single" w:color="BFBFBF" w:sz="4"/>
+              <w:bottom w:val="single" w:color="BFBFBF" w:sz="4"/>
+              <w:right w:val="single" w:color="BFBFBF" w:sz="4"/>
             </w:tcBorders>
-            <w:shd w:val="clear" w:color="auto" w:fill="F1F5F9"/>
-            <w:noWrap/>
+            <w:shd w:fill="E87722" w:val="clear"/>
+            <w:tcMar>
+              <w:top w:type="dxa" w:w="100"/>
+              <w:left w:type="dxa" w:w="140"/>
+              <w:bottom w:type="dxa" w:w="100"/>
+              <w:right w:type="dxa" w:w="140"/>
+            </w:tcMar>
             <w:vAlign w:val="center"/>
-            <w:hideMark/>
           </w:tcPr>
           <w:p>
             <w:pPr>
-              <w:jc w:val="right"/>
-              <w:rPr>
+              <w:spacing w:after="40" w:before="40"/>
+              <w:jc w:val="center"/>
+            </w:pPr>
+            <w:r>
+              <w:rPr>
+                <w:rFonts w:ascii="Calibri" w:cs="Calibri" w:eastAsia="Calibri" w:hAnsi="Calibri"/>
                 <w:b/>
                 <w:bCs/>
-                <w:color w:val="000000"/>
-                <w:lang w:eastAsia="zh-CN" w:bidi="ar-SA"/>
-              </w:rPr>
-            </w:pPr>
-            <w:r>
-              <w:rPr>
-                <w:rFonts w:ascii="Calibri" w:hAnsi="Calibri" w:cs="Calibri"/>
-                <w:b/>
-                <w:bCs/>
-                <w:color w:val="000000"/>
-              </w:rPr>
-              <w:t xml:space="preserve">S. No. </w:t>
+                <w:color w:val="FFFFFF"/>
+                <w:sz w:val="22"/>
+                <w:szCs w:val="22"/>
+              </w:rPr>
+              <w:t xml:space="preserve">S. No.</w:t>
             </w:r>
           </w:p>
         </w:tc>
         <w:tc>
           <w:tcPr>
-            <w:tcW w:w="6237" w:type="dxa"/>
+            <w:tcW w:type="dxa" w:w="4080"/>
             <w:tcBorders>
-              <w:top w:val="single" w:sz="4" w:space="0" w:color="auto"/>
-              <w:left w:val="nil"/>
-              <w:bottom w:val="single" w:sz="4" w:space="0" w:color="auto"/>
-              <w:right w:val="single" w:sz="4" w:space="0" w:color="auto"/>
+              <w:top w:val="single" w:color="BFBFBF" w:sz="4"/>
+              <w:left w:val="single" w:color="BFBFBF" w:sz="4"/>
+              <w:bottom w:val="single" w:color="BFBFBF" w:sz="4"/>
+              <w:right w:val="single" w:color="BFBFBF" w:sz="4"/>
             </w:tcBorders>
-            <w:shd w:val="clear" w:color="auto" w:fill="F1F5F9"/>
-            <w:noWrap/>
+            <w:shd w:fill="E87722" w:val="clear"/>
+            <w:tcMar>
+              <w:top w:type="dxa" w:w="100"/>
+              <w:left w:type="dxa" w:w="140"/>
+              <w:bottom w:type="dxa" w:w="100"/>
+              <w:right w:type="dxa" w:w="140"/>
+            </w:tcMar>
             <w:vAlign w:val="center"/>
-            <w:hideMark/>
           </w:tcPr>
           <w:p>
             <w:pPr>
+              <w:spacing w:after="40" w:before="40"/>
               <w:jc w:val="center"/>
-              <w:rPr>
+            </w:pPr>
+            <w:r>
+              <w:rPr>
+                <w:rFonts w:ascii="Calibri" w:cs="Calibri" w:eastAsia="Calibri" w:hAnsi="Calibri"/>
                 <w:b/>
                 <w:bCs/>
-                <w:color w:val="000000"/>
-              </w:rPr>
-            </w:pPr>
-            <w:r>
-              <w:rPr>
-                <w:rFonts w:ascii="Calibri" w:hAnsi="Calibri" w:cs="Calibri"/>
-                <w:b/>
-                <w:bCs/>
-                <w:color w:val="000000"/>
-              </w:rPr>
-              <w:t>Description</w:t>
+                <w:color w:val="FFFFFF"/>
+                <w:sz w:val="22"/>
+                <w:szCs w:val="22"/>
+              </w:rPr>
+              <w:t xml:space="preserve">Item Description</w:t>
             </w:r>
           </w:p>
         </w:tc>
         <w:tc>
           <w:tcPr>
-            <w:tcW w:w="2268" w:type="dxa"/>
+            <w:tcW w:type="dxa" w:w="1100"/>
             <w:tcBorders>
-              <w:top w:val="single" w:sz="4" w:space="0" w:color="auto"/>
-              <w:left w:val="nil"/>
-              <w:bottom w:val="single" w:sz="4" w:space="0" w:color="auto"/>
-              <w:right w:val="single" w:sz="4" w:space="0" w:color="auto"/>
+              <w:top w:val="single" w:color="BFBFBF" w:sz="4"/>
+              <w:left w:val="single" w:color="BFBFBF" w:sz="4"/>
+              <w:bottom w:val="single" w:color="BFBFBF" w:sz="4"/>
+              <w:right w:val="single" w:color="BFBFBF" w:sz="4"/>
             </w:tcBorders>
-            <w:shd w:val="clear" w:color="auto" w:fill="F1F5F9"/>
-            <w:noWrap/>
+            <w:shd w:fill="E87722" w:val="clear"/>
+            <w:tcMar>
+              <w:top w:type="dxa" w:w="100"/>
+              <w:left w:type="dxa" w:w="140"/>
+              <w:bottom w:type="dxa" w:w="100"/>
+              <w:right w:type="dxa" w:w="140"/>
+            </w:tcMar>
             <w:vAlign w:val="center"/>
-            <w:hideMark/>
           </w:tcPr>
           <w:p>
             <w:pPr>
+              <w:spacing w:after="40" w:before="40"/>
               <w:jc w:val="center"/>
-              <w:rPr>
+            </w:pPr>
+            <w:r>
+              <w:rPr>
+                <w:rFonts w:ascii="Calibri" w:cs="Calibri" w:eastAsia="Calibri" w:hAnsi="Calibri"/>
                 <w:b/>
                 <w:bCs/>
-                <w:color w:val="000000"/>
-              </w:rPr>
+                <w:color w:val="FFFFFF"/>
+                <w:sz w:val="22"/>
+                <w:szCs w:val="22"/>
+              </w:rPr>
+              <w:t xml:space="preserve">Qty</w:t>
+            </w:r>
+          </w:p>
+        </w:tc>
+        <w:tc>
+          <w:tcPr>
+            <w:tcW w:type="dxa" w:w="1700"/>
+            <w:tcBorders>
+              <w:top w:val="single" w:color="BFBFBF" w:sz="4"/>
+              <w:left w:val="single" w:color="BFBFBF" w:sz="4"/>
+              <w:bottom w:val="single" w:color="BFBFBF" w:sz="4"/>
+              <w:right w:val="single" w:color="BFBFBF" w:sz="4"/>
+            </w:tcBorders>
+            <w:shd w:fill="E87722" w:val="clear"/>
+            <w:tcMar>
+              <w:top w:type="dxa" w:w="100"/>
+              <w:left w:type="dxa" w:w="140"/>
+              <w:bottom w:type="dxa" w:w="100"/>
+              <w:right w:type="dxa" w:w="140"/>
+            </w:tcMar>
+            <w:vAlign w:val="center"/>
+          </w:tcPr>
+          <w:p>
+            <w:pPr>
+              <w:spacing w:after="40" w:before="40"/>
+              <w:jc w:val="center"/>
             </w:pPr>
             <w:r>
               <w:rPr>
-                <w:rFonts w:ascii="Calibri" w:hAnsi="Calibri" w:cs="Calibri"/>
+                <w:rFonts w:ascii="Calibri" w:cs="Calibri" w:eastAsia="Calibri" w:hAnsi="Calibri"/>
                 <w:b/>
                 <w:bCs/>
-                <w:color w:val="000000"/>
-              </w:rPr>
-              <w:t>Price (INR)</w:t>
+                <w:color w:val="FFFFFF"/>
+                <w:sz w:val="22"/>
+                <w:szCs w:val="22"/>
+              </w:rPr>
+              <w:t xml:space="preserve">Unit Price (INR)</w:t>
+            </w:r>
+          </w:p>
+        </w:tc>
+        <w:tc>
+          <w:tcPr>
+            <w:tcW w:type="dxa" w:w="1700"/>
+            <w:tcBorders>
+              <w:top w:val="single" w:color="BFBFBF" w:sz="4"/>
+              <w:left w:val="single" w:color="BFBFBF" w:sz="4"/>
+              <w:bottom w:val="single" w:color="BFBFBF" w:sz="4"/>
+              <w:right w:val="single" w:color="BFBFBF" w:sz="4"/>
+            </w:tcBorders>
+            <w:shd w:fill="E87722" w:val="clear"/>
+            <w:tcMar>
+              <w:top w:type="dxa" w:w="100"/>
+              <w:left w:type="dxa" w:w="140"/>
+              <w:bottom w:type="dxa" w:w="100"/>
+              <w:right w:type="dxa" w:w="140"/>
+            </w:tcMar>
+            <w:vAlign w:val="center"/>
+          </w:tcPr>
+          <w:p>
+            <w:pPr>
+              <w:spacing w:after="40" w:before="40"/>
+              <w:jc w:val="center"/>
+            </w:pPr>
+            <w:r>
+              <w:rPr>
+                <w:rFonts w:ascii="Calibri" w:cs="Calibri" w:eastAsia="Calibri" w:hAnsi="Calibri"/>
+                <w:b/>
+                <w:bCs/>
+                <w:color w:val="FFFFFF"/>
+                <w:sz w:val="22"/>
+                <w:szCs w:val="22"/>
+              </w:rPr>
+              <w:t xml:space="preserve">Total Price (INR)</w:t>
             </w:r>
           </w:p>
         </w:tc>
       </w:tr>
       <w:tr>
-        <w:trPr>
-          <w:trHeight w:val="454"/>
-        </w:trPr>
         <w:tc>
           <w:tcPr>
-            <w:tcW w:w="846" w:type="dxa"/>
+            <w:tcW w:type="dxa" w:w="780"/>
             <w:tcBorders>
-              <w:top w:val="nil"/>
-              <w:left w:val="single" w:sz="4" w:space="0" w:color="auto"/>
-              <w:bottom w:val="single" w:sz="4" w:space="0" w:color="auto"/>
-              <w:right w:val="single" w:sz="4" w:space="0" w:color="auto"/>
+              <w:top w:val="single" w:color="BFBFBF" w:sz="4"/>
+              <w:left w:val="single" w:color="BFBFBF" w:sz="4"/>
+              <w:bottom w:val="single" w:color="BFBFBF" w:sz="4"/>
+              <w:right w:val="single" w:color="BFBFBF" w:sz="4"/>
             </w:tcBorders>
-            <w:shd w:val="clear" w:color="auto" w:fill="auto"/>
-            <w:noWrap/>
+            <w:tcMar>
+              <w:top w:type="dxa" w:w="100"/>
+              <w:left w:type="dxa" w:w="140"/>
+              <w:bottom w:type="dxa" w:w="100"/>
+              <w:right w:type="dxa" w:w="140"/>
+            </w:tcMar>
             <w:vAlign w:val="center"/>
-            <w:hideMark/>
           </w:tcPr>
           <w:p>
             <w:pPr>
+              <w:spacing w:after="40" w:before="40"/>
               <w:jc w:val="center"/>
-              <w:rPr>
-                <w:color w:val="000000"/>
-              </w:rPr>
             </w:pPr>
             <w:r>
               <w:rPr>
-                <w:rFonts w:ascii="Calibri" w:hAnsi="Calibri" w:cs="Calibri"/>
-                <w:color w:val="000000"/>
-              </w:rPr>
-              <w:t>1</w:t>
-            </w:r>
-            <w:r>
-              <w:rPr>
-                <w:rFonts w:ascii="Calibri" w:hAnsi="Calibri" w:cs="Calibri"/>
-                <w:color w:val="000000"/>
-              </w:rPr>
-              <w:t>.</w:t>
+                <w:rFonts w:ascii="Calibri" w:cs="Calibri" w:eastAsia="Calibri" w:hAnsi="Calibri"/>
+                <w:b/>
+                <w:bCs/>
+                <w:sz w:val="22"/>
+                <w:szCs w:val="22"/>
+              </w:rPr>
+              <w:t xml:space="preserve">1</w:t>
             </w:r>
           </w:p>
         </w:tc>
         <w:tc>
           <w:tcPr>
-            <w:tcW w:w="6237" w:type="dxa"/>
+            <w:tcW w:type="dxa" w:w="4080"/>
             <w:tcBorders>
-              <w:top w:val="nil"/>
-              <w:left w:val="nil"/>
-              <w:bottom w:val="single" w:sz="4" w:space="0" w:color="auto"/>
-              <w:right w:val="single" w:sz="4" w:space="0" w:color="auto"/>
+              <w:top w:val="single" w:color="BFBFBF" w:sz="4"/>
+              <w:left w:val="single" w:color="BFBFBF" w:sz="4"/>
+              <w:bottom w:val="single" w:color="BFBFBF" w:sz="4"/>
+              <w:right w:val="single" w:color="BFBFBF" w:sz="4"/>
             </w:tcBorders>
-            <w:shd w:val="clear" w:color="auto" w:fill="auto"/>
-            <w:noWrap/>
+            <w:tcMar>
+              <w:top w:type="dxa" w:w="100"/>
+              <w:left w:type="dxa" w:w="140"/>
+              <w:bottom w:type="dxa" w:w="100"/>
+              <w:right w:type="dxa" w:w="140"/>
+            </w:tcMar>
             <w:vAlign w:val="center"/>
-            <w:hideMark/>
           </w:tcPr>
           <w:p>
             <w:pPr>
-              <w:rPr>
-                <w:color w:val="000000"/>
-              </w:rPr>
+              <w:spacing w:after="40" w:before="40"/>
+              <w:jc w:val="left"/>
             </w:pPr>
             <w:r>
-              <w:rPr>
-                <w:rFonts w:ascii="Calibri" w:hAnsi="Calibri" w:cs="Calibri"/>
-                <w:color w:val="000000"/>
-              </w:rPr>
               <w:t>{{ price_line_desc }}</w:t>
-            </w:r>
-            <w:r>
-              <w:rPr>
-                <w:color w:val="000000"/>
-              </w:rPr>
             </w:r>
           </w:p>
         </w:tc>
         <w:tc>
           <w:tcPr>
-            <w:tcW w:w="2268" w:type="dxa"/>
+            <w:tcW w:type="dxa" w:w="1100"/>
             <w:tcBorders>
-              <w:top w:val="nil"/>
-              <w:left w:val="nil"/>
-              <w:bottom w:val="single" w:sz="4" w:space="0" w:color="auto"/>
-              <w:right w:val="single" w:sz="4" w:space="0" w:color="auto"/>
+              <w:top w:val="single" w:color="BFBFBF" w:sz="4"/>
+              <w:left w:val="single" w:color="BFBFBF" w:sz="4"/>
+              <w:bottom w:val="single" w:color="BFBFBF" w:sz="4"/>
+              <w:right w:val="single" w:color="BFBFBF" w:sz="4"/>
             </w:tcBorders>
-            <w:shd w:val="clear" w:color="auto" w:fill="auto"/>
-            <w:noWrap/>
+            <w:tcMar>
+              <w:top w:type="dxa" w:w="100"/>
+              <w:left w:type="dxa" w:w="140"/>
+              <w:bottom w:type="dxa" w:w="100"/>
+              <w:right w:type="dxa" w:w="140"/>
+            </w:tcMar>
             <w:vAlign w:val="center"/>
-            <w:hideMark/>
           </w:tcPr>
           <w:p>
             <w:pPr>
+              <w:spacing w:after="40" w:before="40"/>
+              <w:jc w:val="center"/>
+            </w:pPr>
+            <w:r>
+              <w:t>{{ qty_words }}</w:t>
+            </w:r>
+          </w:p>
+        </w:tc>
+        <w:tc>
+          <w:tcPr>
+            <w:tcW w:type="dxa" w:w="1700"/>
+            <w:tcBorders>
+              <w:top w:val="single" w:color="BFBFBF" w:sz="4"/>
+              <w:left w:val="single" w:color="BFBFBF" w:sz="4"/>
+              <w:bottom w:val="single" w:color="BFBFBF" w:sz="4"/>
+              <w:right w:val="single" w:color="BFBFBF" w:sz="4"/>
+            </w:tcBorders>
+            <w:tcMar>
+              <w:top w:type="dxa" w:w="100"/>
+              <w:left w:type="dxa" w:w="140"/>
+              <w:bottom w:type="dxa" w:w="100"/>
+              <w:right w:type="dxa" w:w="140"/>
+            </w:tcMar>
+            <w:vAlign w:val="center"/>
+          </w:tcPr>
+          <w:p>
+            <w:pPr>
+              <w:spacing w:after="40" w:before="40"/>
               <w:jc w:val="right"/>
-              <w:rPr>
-                <w:b/>
-                <w:bCs/>
-                <w:color w:val="000000"/>
-              </w:rPr>
             </w:pPr>
             <w:r>
-              <w:rPr>
-                <w:rFonts w:ascii="Calibri" w:hAnsi="Calibri" w:cs="Calibri"/>
-                <w:b/>
-                <w:bCs/>
-                <w:color w:val="000000"/>
-              </w:rPr>
-              <w:t xml:space="preserve">  </w:t>
-            </w:r>
-            <w:r>
-              <w:rPr>
-                <w:rFonts w:ascii="Calibri" w:hAnsi="Calibri" w:cs="Calibri"/>
-                <w:b/>
-                <w:bCs/>
-                <w:color w:val="000000"/>
-              </w:rPr>
               <w:t>{{ price_inr }}</w:t>
             </w:r>
-            <w:r>
-              <w:rPr>
-                <w:b/>
-                <w:bCs/>
-                <w:color w:val="000000"/>
-              </w:rPr>
-            </w:r>
-            <w:r>
-              <w:rPr>
-                <w:b/>
-                <w:bCs/>
-                <w:color w:val="000000"/>
-              </w:rPr>
-            </w:r>
-            <w:r>
-              <w:rPr>
-                <w:b/>
-                <w:bCs/>
-                <w:color w:val="000000"/>
-              </w:rPr>
-            </w:r>
-            <w:r>
-              <w:rPr>
-                <w:rFonts w:ascii="Calibri" w:hAnsi="Calibri" w:cs="Calibri"/>
-                <w:b/>
-                <w:bCs/>
-                <w:color w:val="000000"/>
-              </w:rPr>
-              <w:t xml:space="preserve"> </w:t>
+          </w:p>
+        </w:tc>
+        <w:tc>
+          <w:tcPr>
+            <w:tcW w:type="dxa" w:w="1700"/>
+            <w:tcBorders>
+              <w:top w:val="single" w:color="BFBFBF" w:sz="4"/>
+              <w:left w:val="single" w:color="BFBFBF" w:sz="4"/>
+              <w:bottom w:val="single" w:color="BFBFBF" w:sz="4"/>
+              <w:right w:val="single" w:color="BFBFBF" w:sz="4"/>
+            </w:tcBorders>
+            <w:tcMar>
+              <w:top w:type="dxa" w:w="100"/>
+              <w:left w:type="dxa" w:w="140"/>
+              <w:bottom w:type="dxa" w:w="100"/>
+              <w:right w:type="dxa" w:w="140"/>
+            </w:tcMar>
+            <w:vAlign w:val="center"/>
+          </w:tcPr>
+          <w:p>
+            <w:pPr>
+              <w:spacing w:after="40" w:before="40"/>
+              <w:jc w:val="right"/>
+            </w:pPr>
+            <w:r>
+              <w:t>{{ price_inr }}</w:t>
             </w:r>
           </w:p>
         </w:tc>
       </w:tr>
       <w:tr>
-        <w:trPr>
-          <w:trHeight w:val="454"/>
-        </w:trPr>
         <w:tc>
           <w:tcPr>
-            <w:tcW w:w="7083" w:type="dxa"/>
-            <w:gridSpan w:val="2"/>
+            <w:tcW w:type="dxa" w:w="780"/>
             <w:tcBorders>
-              <w:top w:val="single" w:sz="4" w:space="0" w:color="auto"/>
-              <w:left w:val="single" w:sz="4" w:space="0" w:color="auto"/>
-              <w:bottom w:val="single" w:sz="4" w:space="0" w:color="auto"/>
-              <w:right w:val="single" w:sz="4" w:space="0" w:color="000000"/>
+              <w:top w:val="single" w:color="BFBFBF" w:sz="4"/>
+              <w:left w:val="single" w:color="BFBFBF" w:sz="4"/>
+              <w:bottom w:val="single" w:color="BFBFBF" w:sz="4"/>
+              <w:right w:val="single" w:color="BFBFBF" w:sz="4"/>
             </w:tcBorders>
-            <w:shd w:val="clear" w:color="auto" w:fill="auto"/>
-            <w:noWrap/>
+            <w:tcMar>
+              <w:top w:type="dxa" w:w="100"/>
+              <w:left w:type="dxa" w:w="140"/>
+              <w:bottom w:type="dxa" w:w="100"/>
+              <w:right w:type="dxa" w:w="140"/>
+            </w:tcMar>
             <w:vAlign w:val="center"/>
-            <w:hideMark/>
           </w:tcPr>
           <w:p>
             <w:pPr>
-              <w:jc w:val="right"/>
-              <w:rPr>
-                <w:color w:val="000000"/>
-              </w:rPr>
+              <w:spacing w:after="40" w:before="40"/>
+              <w:jc w:val="center"/>
             </w:pPr>
             <w:r>
               <w:rPr>
-                <w:rFonts w:ascii="Calibri" w:hAnsi="Calibri" w:cs="Calibri"/>
-                <w:color w:val="000000"/>
-              </w:rPr>
-              <w:t>T</w:t>
-            </w:r>
-            <w:r>
-              <w:rPr>
-                <w:rFonts w:ascii="Calibri" w:hAnsi="Calibri" w:cs="Calibri"/>
-                <w:color w:val="000000"/>
-              </w:rPr>
-              <w:t>otal</w:t>
-            </w:r>
-            <w:r>
-              <w:rPr>
-                <w:rFonts w:ascii="Calibri" w:hAnsi="Calibri" w:cs="Calibri"/>
-                <w:color w:val="000000"/>
-              </w:rPr>
-              <w:t xml:space="preserve"> (</w:t>
-            </w:r>
-            <w:r>
-              <w:rPr>
-                <w:rFonts w:ascii="Calibri" w:hAnsi="Calibri" w:cs="Calibri"/>
+                <w:rFonts w:ascii="Calibri" w:cs="Calibri" w:eastAsia="Calibri" w:hAnsi="Calibri"/>
                 <w:b/>
                 <w:bCs/>
-                <w:color w:val="000000"/>
-              </w:rPr>
-              <w:t>Ex Works, Faridabad</w:t>
-            </w:r>
-            <w:r>
-              <w:rPr>
-                <w:rFonts w:ascii="Calibri" w:hAnsi="Calibri" w:cs="Calibri"/>
-                <w:color w:val="000000"/>
-              </w:rPr>
-              <w:t xml:space="preserve"> Price)</w:t>
-            </w:r>
-            <w:r>
-              <w:rPr>
-                <w:rFonts w:ascii="Calibri" w:hAnsi="Calibri" w:cs="Calibri"/>
-                <w:color w:val="000000"/>
-              </w:rPr>
-              <w:t xml:space="preserve"> </w:t>
+                <w:sz w:val="22"/>
+                <w:szCs w:val="22"/>
+              </w:rPr>
+              <w:t xml:space="preserve"/>
             </w:r>
           </w:p>
         </w:tc>
         <w:tc>
           <w:tcPr>
-            <w:tcW w:w="2268" w:type="dxa"/>
+            <w:tcW w:type="dxa" w:w="4080"/>
             <w:tcBorders>
-              <w:top w:val="nil"/>
-              <w:left w:val="nil"/>
-              <w:bottom w:val="single" w:sz="4" w:space="0" w:color="auto"/>
-              <w:right w:val="single" w:sz="4" w:space="0" w:color="auto"/>
+              <w:top w:val="single" w:color="BFBFBF" w:sz="4"/>
+              <w:left w:val="single" w:color="BFBFBF" w:sz="4"/>
+              <w:bottom w:val="single" w:color="BFBFBF" w:sz="4"/>
+              <w:right w:val="single" w:color="BFBFBF" w:sz="4"/>
             </w:tcBorders>
-            <w:shd w:val="clear" w:color="auto" w:fill="auto"/>
-            <w:noWrap/>
+            <w:tcMar>
+              <w:top w:type="dxa" w:w="100"/>
+              <w:left w:type="dxa" w:w="140"/>
+              <w:bottom w:type="dxa" w:w="100"/>
+              <w:right w:type="dxa" w:w="140"/>
+            </w:tcMar>
             <w:vAlign w:val="center"/>
-            <w:hideMark/>
           </w:tcPr>
           <w:p>
             <w:pPr>
+              <w:spacing w:after="40" w:before="40"/>
+              <w:jc w:val="left"/>
+            </w:pPr>
+            <w:r>
+              <w:rPr>
+                <w:b/>
+              </w:rPr>
+              <w:t xml:space="preserve">TOTAL</w:t>
+            </w:r>
+          </w:p>
+        </w:tc>
+        <w:tc>
+          <w:tcPr>
+            <w:tcW w:type="dxa" w:w="1100"/>
+            <w:tcBorders>
+              <w:top w:val="single" w:color="BFBFBF" w:sz="4"/>
+              <w:left w:val="single" w:color="BFBFBF" w:sz="4"/>
+              <w:bottom w:val="single" w:color="BFBFBF" w:sz="4"/>
+              <w:right w:val="single" w:color="BFBFBF" w:sz="4"/>
+            </w:tcBorders>
+            <w:tcMar>
+              <w:top w:type="dxa" w:w="100"/>
+              <w:left w:type="dxa" w:w="140"/>
+              <w:bottom w:type="dxa" w:w="100"/>
+              <w:right w:type="dxa" w:w="140"/>
+            </w:tcMar>
+            <w:vAlign w:val="center"/>
+          </w:tcPr>
+          <w:p>
+            <w:pPr>
+              <w:spacing w:after="40" w:before="40"/>
+              <w:jc w:val="center"/>
+            </w:pPr>
+            <w:r>
+              <w:rPr>
+                <w:b/>
+              </w:rPr>
+              <w:t xml:space="preserve"/>
+            </w:r>
+          </w:p>
+        </w:tc>
+        <w:tc>
+          <w:tcPr>
+            <w:tcW w:type="dxa" w:w="1700"/>
+            <w:tcBorders>
+              <w:top w:val="single" w:color="BFBFBF" w:sz="4"/>
+              <w:left w:val="single" w:color="BFBFBF" w:sz="4"/>
+              <w:bottom w:val="single" w:color="BFBFBF" w:sz="4"/>
+              <w:right w:val="single" w:color="BFBFBF" w:sz="4"/>
+            </w:tcBorders>
+            <w:tcMar>
+              <w:top w:type="dxa" w:w="100"/>
+              <w:left w:type="dxa" w:w="140"/>
+              <w:bottom w:type="dxa" w:w="100"/>
+              <w:right w:type="dxa" w:w="140"/>
+            </w:tcMar>
+            <w:vAlign w:val="center"/>
+          </w:tcPr>
+          <w:p>
+            <w:pPr>
+              <w:spacing w:after="40" w:before="40"/>
               <w:jc w:val="right"/>
+            </w:pPr>
+            <w:r>
               <w:rPr>
                 <w:b/>
-                <w:bCs/>
-                <w:color w:val="000000"/>
-              </w:rPr>
+              </w:rPr>
+              <w:t xml:space="preserve"/>
+            </w:r>
+          </w:p>
+        </w:tc>
+        <w:tc>
+          <w:tcPr>
+            <w:tcW w:type="dxa" w:w="1700"/>
+            <w:tcBorders>
+              <w:top w:val="single" w:color="BFBFBF" w:sz="4"/>
+              <w:left w:val="single" w:color="BFBFBF" w:sz="4"/>
+              <w:bottom w:val="single" w:color="BFBFBF" w:sz="4"/>
+              <w:right w:val="single" w:color="BFBFBF" w:sz="4"/>
+            </w:tcBorders>
+            <w:tcMar>
+              <w:top w:type="dxa" w:w="100"/>
+              <w:left w:type="dxa" w:w="140"/>
+              <w:bottom w:type="dxa" w:w="100"/>
+              <w:right w:type="dxa" w:w="140"/>
+            </w:tcMar>
+            <w:vAlign w:val="center"/>
+          </w:tcPr>
+          <w:p>
+            <w:pPr>
+              <w:spacing w:after="40" w:before="40"/>
+              <w:jc w:val="right"/>
             </w:pPr>
             <w:r>
               <w:rPr>
-                <w:rFonts w:ascii="Calibri" w:hAnsi="Calibri" w:cs="Calibri"/>
                 <w:b/>
-                <w:bCs/>
-                <w:color w:val="000000"/>
-              </w:rPr>
-              <w:t xml:space="preserve">  </w:t>
-            </w:r>
-            <w:r>
-              <w:rPr>
-                <w:rFonts w:ascii="Calibri" w:hAnsi="Calibri" w:cs="Calibri"/>
-                <w:b/>
-                <w:bCs/>
-                <w:color w:val="000000"/>
-              </w:rPr>
-              <w:t>{{ price_inr }}</w:t>
-            </w:r>
-            <w:r>
-              <w:rPr>
-                <w:rFonts w:ascii="Calibri" w:hAnsi="Calibri" w:cs="Calibri"/>
-                <w:b/>
-                <w:bCs/>
-                <w:color w:val="000000"/>
-              </w:rPr>
-              <w:t xml:space="preserve"> </w:t>
+              </w:rPr>
+              <w:t xml:space="preserve">{{ price_inr }}</w:t>
             </w:r>
           </w:p>
         </w:tc>
@@ -17101,103 +17213,83 @@
         <w:t>SUPERVISION CHARGES FOR ERECTION &amp; COMMISSIONING</w:t>
       </w:r>
     </w:p>
-    <w:p>
-      <w:pPr>
-        <w:pStyle w:val="ListParagraph"/>
-        <w:numPr>
-          <w:ilvl w:val="0"/>
-          <w:numId w:val="10"/>
-        </w:numPr>
-        <w:spacing w:before="120"/>
-        <w:jc w:val="both"/>
-      </w:pPr>
-      <w:r>
-        <w:rPr>
-          <w:rFonts w:ascii="Calibri" w:hAnsi="Calibri" w:cs="Calibri"/>
-        </w:rPr>
-        <w:t>Mechanical &amp; Instrumentation Supervisor: Rs.12,500/day/person, to &amp; fro fare from Faridabad to destination plus Boarding &amp;</w:t>
-      </w:r>
-      <w:r>
-        <w:rPr>
-          <w:rFonts w:ascii="Calibri" w:hAnsi="Calibri" w:cs="Calibri"/>
-        </w:rPr>
-        <w:t xml:space="preserve"> L</w:t>
-      </w:r>
-      <w:r>
-        <w:rPr>
-          <w:rFonts w:ascii="Calibri" w:hAnsi="Calibri" w:cs="Calibri"/>
-        </w:rPr>
-        <w:t>odging</w:t>
-      </w:r>
-      <w:r>
-        <w:rPr>
-          <w:rFonts w:ascii="Calibri" w:hAnsi="Calibri" w:cs="Calibri"/>
-        </w:rPr>
-        <w:t>.</w:t>
-      </w:r>
-    </w:p>
-    <w:p>
-      <w:pPr>
-        <w:pStyle w:val="ListParagraph"/>
-        <w:numPr>
-          <w:ilvl w:val="0"/>
-          <w:numId w:val="10"/>
-        </w:numPr>
-        <w:spacing w:before="120"/>
-        <w:ind w:left="714" w:hanging="357"/>
-        <w:contextualSpacing w:val="0"/>
-        <w:jc w:val="both"/>
-      </w:pPr>
-      <w:r>
-        <w:rPr>
-          <w:rFonts w:ascii="Calibri" w:hAnsi="Calibri" w:cs="Calibri"/>
-        </w:rPr>
-        <w:t>PLC Supervisor: Rs.15,500/day/person, to &amp; fro fare from Faridabad to destination</w:t>
-      </w:r>
-      <w:r>
-        <w:rPr>
-          <w:rFonts w:ascii="Calibri" w:hAnsi="Calibri" w:cs="Calibri"/>
-        </w:rPr>
-        <w:t xml:space="preserve"> (Air/Train 2</w:t>
-      </w:r>
-      <w:r>
-        <w:rPr>
-          <w:rFonts w:ascii="Calibri" w:hAnsi="Calibri" w:cs="Calibri"/>
-          <w:vertAlign w:val="superscript"/>
-        </w:rPr>
-        <w:t>nd</w:t>
-      </w:r>
-      <w:r>
-        <w:rPr>
-          <w:rFonts w:ascii="Calibri" w:hAnsi="Calibri" w:cs="Calibri"/>
-        </w:rPr>
-        <w:t xml:space="preserve"> AC)</w:t>
-      </w:r>
-      <w:r>
-        <w:rPr>
-          <w:rFonts w:ascii="Calibri" w:hAnsi="Calibri" w:cs="Calibri"/>
-        </w:rPr>
-        <w:t xml:space="preserve"> </w:t>
-      </w:r>
-      <w:r>
-        <w:rPr>
-          <w:rFonts w:ascii="Calibri" w:hAnsi="Calibri" w:cs="Calibri"/>
-        </w:rPr>
-        <w:t>plus Boarding &amp;</w:t>
-      </w:r>
-      <w:r>
-        <w:rPr>
-          <w:rFonts w:ascii="Calibri" w:hAnsi="Calibri" w:cs="Calibri"/>
-        </w:rPr>
-        <w:t xml:space="preserve"> </w:t>
-      </w:r>
-      <w:r>
-        <w:rPr>
-          <w:rFonts w:ascii="Calibri" w:hAnsi="Calibri" w:cs="Calibri"/>
-        </w:rPr>
-        <w:t>lodging.</w:t>
-      </w:r>
-    </w:p>
+    <w:tbl>
+      <w:tblPr>
+        <w:tblW w:type="dxa" w:w="9360"/>
+        <w:tblBorders>
+          <w:top w:val="single" w:sz="6" w:color="auto"/>
+          <w:left w:val="single" w:sz="6" w:color="auto"/>
+          <w:bottom w:val="single" w:sz="6" w:color="auto"/>
+          <w:right w:val="single" w:sz="6" w:color="auto"/>
+          <w:insideH w:val="single" w:sz="6" w:color="auto"/>
+          <w:insideV w:val="single" w:sz="6" w:color="auto"/>
+        </w:tblBorders>
+      </w:tblPr>
+      <w:tblGrid>
+        <w:gridCol w:w="6360"/>
+        <w:gridCol w:w="3000"/>
+      </w:tblGrid>
+      <w:tr>
+        <w:tc>
+          <w:tcPr>
+            <w:tcW w:type="dxa" w:w="6360"/>
+          </w:tcPr>
+          <w:p>
+            <w:r>
+              <w:t>Supervision Charges for Erection and Commissioning (Mechanical)</w:t>
+            </w:r>
+          </w:p>
+        </w:tc>
+        <w:tc>
+          <w:tcPr>
+            <w:tcW w:type="dxa" w:w="3000"/>
+          </w:tcPr>
+          <w:p>
+            <w:r>
+              <w:t xml:space="preserve">INR {{ supervision_mech }}</w:t>
+            </w:r>
+          </w:p>
+        </w:tc>
+      </w:tr>
+      <w:tr>
+        <w:tc>
+          <w:tcPr>
+            <w:tcW w:type="dxa" w:w="6360"/>
+          </w:tcPr>
+          <w:p>
+            <w:r>
+              <w:t>Supervision Charges for Erection and Commissioning (PLC and Instrumentation)</w:t>
+            </w:r>
+          </w:p>
+        </w:tc>
+        <w:tc>
+          <w:tcPr>
+            <w:tcW w:type="dxa" w:w="3000"/>
+          </w:tcPr>
+          <w:p>
+            <w:r>
+              <w:t xml:space="preserve">INR {{ supervision_plc }}</w:t>
+            </w:r>
+          </w:p>
+        </w:tc>
+      </w:tr>
+      <w:tr>
+        <w:tc>
+          <w:tcPr>
+            <w:tcW w:type="dxa" w:w="9360"/>
+            <w:gridSpan w:val="2"/>
+          </w:tcPr>
+          <w:p>
+            <w:r>
+              <w:rPr>
+                <w:i/>
+              </w:rPr>
+              <w:t>Note: To-and-fro fare from Delhi to site, plus boarding, lodging, local conveyance, and medical assistance if required.</w:t>
+            </w:r>
+          </w:p>
+        </w:tc>
+      </w:tr>
+    </w:tbl>
     <w:p>
       <w:pPr>
         <w:pStyle w:val="ListParagraph"/>

</xml_diff>

<commit_message>
fix: no header (logo/ref/rule) on first page of regen offer
Enable different-first-page header; first-page header is empty so the ENCON
logo + Ref line + orange rule now start from page 2, like the vertical offer.

Co-Authored-By: Claude Opus 4.8 (1M context) <noreply@anthropic.com>
</commit_message>
<xml_diff>
--- a/Regen_Offer_Template.docx
+++ b/Regen_Offer_Template.docx
@@ -25129,9 +25129,11 @@
     <w:sectPr>
       <w:headerReference w:type="default" r:id="rId9"/>
       <w:footerReference w:type="default" r:id="rId10"/>
+      <w:headerReference w:type="first" r:id="rId20"/>
       <w:pgSz w:w="11906" w:h="16838" w:orient="portrait"/>
       <w:pgMar w:top="1440" w:right="1083" w:bottom="1440" w:left="1083" w:header="708" w:footer="708" w:gutter="0"/>
       <w:pgNumType/>
+      <w:titlePg/>
       <w:docGrid w:linePitch="360"/>
     </w:sectPr>
   </w:body>
@@ -25619,6 +25621,12 @@
       <w:pStyle w:val="Header"/>
     </w:pPr>
   </w:p>
+</w:hdr>
+</file>
+
+<file path=word/header5.xml><?xml version="1.0" encoding="utf-8"?>
+<w:hdr xmlns:m="http://schemas.openxmlformats.org/officeDocument/2006/math" xmlns:mc="http://schemas.openxmlformats.org/markup-compatibility/2006" xmlns:mo="http://schemas.microsoft.com/office/mac/office/2008/main" xmlns:mv="urn:schemas-microsoft-com:mac:vml" xmlns:o="urn:schemas-microsoft-com:office:office" xmlns:r="http://schemas.openxmlformats.org/officeDocument/2006/relationships" xmlns:v="urn:schemas-microsoft-com:vml" xmlns:w10="urn:schemas-microsoft-com:office:word" xmlns:w14="http://schemas.microsoft.com/office/word/2010/wordml" xmlns:w="http://schemas.openxmlformats.org/wordprocessingml/2006/main" xmlns:wne="http://schemas.microsoft.com/office/word/2006/wordml" xmlns:wp14="http://schemas.microsoft.com/office/word/2010/wordprocessingDrawing" xmlns:wp="http://schemas.openxmlformats.org/drawingml/2006/wordprocessingDrawing" xmlns:wpc="http://schemas.microsoft.com/office/word/2010/wordprocessingCanvas" xmlns:wpg="http://schemas.microsoft.com/office/word/2010/wordprocessingGroup" xmlns:wpi="http://schemas.microsoft.com/office/word/2010/wordprocessingInk" xmlns:wps="http://schemas.microsoft.com/office/word/2010/wordprocessingShape" mc:Ignorable="w14 wp14">
+  <w:p/>
 </w:hdr>
 </file>
 

</xml_diff>

<commit_message>
style: regen offer — MAKE-LIST look for savings table, compact cover, trim intro
- Savings In NATURAL Gas table restyled like the vertical MAKE LIST (F1F5F9
  bold-centered header, thin black borders, clean white data rows).
- Cover letter line-spacing/spacing tightened + blank paras removed so it fits
  on one page.
- Dropped the 'We are proposing to give REGEN Burners in the furnace,' clause;
  line now opens 'REGEN is a range of Low NOx Regenerative burners...'.

Co-Authored-By: Claude Opus 4.8 (1M context) <noreply@anthropic.com>
</commit_message>
<xml_diff>
--- a/Regen_Offer_Template.docx
+++ b/Regen_Offer_Template.docx
@@ -4,53 +4,7 @@
   <w:body>
     <w:p>
       <w:pPr>
-        <w:spacing w:before="200" w:after="0"/>
-        <w:jc w:val="center"/>
-      </w:pPr>
-      <w:r>
-        <w:drawing>
-          <wp:inline distT="0" distB="0" distL="0" distR="0">
-            <wp:extent cx="3619500" cy="4680000"/>
-            <wp:effectExtent t="0" r="0" b="0" l="0"/>
-            <wp:docPr id="1" name="ENCON" descr="ENCON logo" title="ENCON"/>
-            <wp:cNvGraphicFramePr>
-              <a:graphicFrameLocks xmlns:a="http://schemas.openxmlformats.org/drawingml/2006/main" noChangeAspect="1"/>
-            </wp:cNvGraphicFramePr>
-            <a:graphic xmlns:a="http://schemas.openxmlformats.org/drawingml/2006/main">
-              <a:graphicData uri="http://schemas.openxmlformats.org/drawingml/2006/picture">
-                <pic:pic xmlns:pic="http://schemas.openxmlformats.org/drawingml/2006/picture">
-                  <pic:nvPicPr>
-                    <pic:cNvPr id="1" name="" descr=""/>
-                    <pic:cNvPicPr>
-                      <a:picLocks noChangeAspect="1" noChangeArrowheads="1"/>
-                    </pic:cNvPicPr>
-                  </pic:nvPicPr>
-                  <pic:blipFill>
-                    <a:blip r:embed="rId11" cstate="none"/>
-                    <a:srcRect/>
-                    <a:stretch>
-                      <a:fillRect/>
-                    </a:stretch>
-                  </pic:blipFill>
-                  <pic:spPr bwMode="auto">
-                    <a:xfrm>
-                      <a:off x="0" y="0"/>
-                      <a:ext cx="3619500" cy="4680000"/>
-                    </a:xfrm>
-                    <a:prstGeom prst="rect">
-                      <a:avLst/>
-                    </a:prstGeom>
-                  </pic:spPr>
-                </pic:pic>
-              </a:graphicData>
-            </a:graphic>
-          </wp:inline>
-        </w:drawing>
-      </w:r>
-    </w:p>
-    <w:p>
-      <w:pPr>
-        <w:spacing w:before="200" w:after="80"/>
+        <w:spacing w:before="120" w:after="40" w:line="240" w:lineRule="auto"/>
         <w:jc w:val="center"/>
       </w:pPr>
       <w:r>
@@ -68,7 +22,7 @@
     </w:p>
     <w:p>
       <w:pPr>
-        <w:spacing w:before="0" w:after="200"/>
+        <w:spacing w:before="0" w:after="40" w:line="240" w:lineRule="auto"/>
         <w:jc w:val="center"/>
       </w:pPr>
       <w:r>
@@ -360,7 +314,7 @@
     </w:tbl>
     <w:p>
       <w:pPr>
-        <w:spacing w:before="120" w:after="60"/>
+        <w:spacing w:before="0" w:after="40" w:line="240" w:lineRule="auto"/>
         <w:jc w:val="center"/>
       </w:pPr>
       <w:r>
@@ -377,7 +331,7 @@
     </w:p>
     <w:p>
       <w:pPr>
-        <w:spacing w:before="0" w:after="240"/>
+        <w:spacing w:before="0" w:after="40" w:line="240" w:lineRule="auto"/>
         <w:jc w:val="center"/>
       </w:pPr>
       <w:r>
@@ -394,7 +348,7 @@
     </w:p>
     <w:p>
       <w:pPr>
-        <w:spacing w:before="120" w:after="0"/>
+        <w:spacing w:before="0" w:after="40" w:line="240" w:lineRule="auto"/>
         <w:jc w:val="center"/>
       </w:pPr>
       <w:r>
@@ -409,7 +363,7 @@
     </w:p>
     <w:p>
       <w:pPr>
-        <w:spacing w:before="60" w:after="0"/>
+        <w:spacing w:before="0" w:after="40" w:line="240" w:lineRule="auto"/>
         <w:jc w:val="center"/>
       </w:pPr>
       <w:r>
@@ -424,7 +378,7 @@
     </w:p>
     <w:p>
       <w:pPr>
-        <w:spacing w:before="60" w:after="0"/>
+        <w:spacing w:before="0" w:after="40" w:line="240" w:lineRule="auto"/>
         <w:jc w:val="center"/>
       </w:pPr>
       <w:r>
@@ -443,7 +397,7 @@
         <w:pBdr>
           <w:bottom w:val="single" w:color="E87722" w:sz="12" w:space="4"/>
         </w:pBdr>
-        <w:spacing w:after="80" w:before="280"/>
+        <w:spacing w:after="40" w:before="120" w:line="240" w:lineRule="auto"/>
       </w:pPr>
       <w:r>
         <w:rPr>
@@ -459,7 +413,7 @@
     </w:p>
     <w:p>
       <w:pPr>
-        <w:spacing w:after="60" w:before="120" w:line="300"/>
+        <w:spacing w:after="40" w:before="0" w:line="240" w:lineRule="auto"/>
         <w:jc w:val="left"/>
       </w:pPr>
       <w:r>
@@ -471,7 +425,7 @@
     </w:p>
     <w:p>
       <w:pPr>
-        <w:spacing w:after="60" w:before="0"/>
+        <w:spacing w:after="40" w:before="0" w:line="240" w:lineRule="auto"/>
       </w:pPr>
       <w:r>
         <w:rPr>
@@ -487,7 +441,7 @@
     </w:p>
     <w:p>
       <w:pPr>
-        <w:spacing w:after="60" w:before="60" w:line="300"/>
+        <w:spacing w:after="40" w:before="0" w:line="240" w:lineRule="auto"/>
         <w:jc w:val="left"/>
       </w:pPr>
       <w:r>
@@ -500,7 +454,7 @@
     </w:p>
     <w:p>
       <w:pPr>
-        <w:spacing w:after="60" w:before="0" w:line="300"/>
+        <w:spacing w:after="40" w:before="0" w:line="240" w:lineRule="auto"/>
         <w:jc w:val="left"/>
       </w:pPr>
       <w:r>
@@ -512,7 +466,7 @@
     </w:p>
     <w:p>
       <w:pPr>
-        <w:spacing w:after="60" w:before="0" w:line="300"/>
+        <w:spacing w:after="40" w:before="0" w:line="240" w:lineRule="auto"/>
         <w:jc w:val="left"/>
       </w:pPr>
       <w:r>
@@ -524,7 +478,7 @@
     </w:p>
     <w:p>
       <w:pPr>
-        <w:spacing w:after="200" w:before="0" w:line="300"/>
+        <w:spacing w:after="40" w:before="0" w:line="240" w:lineRule="auto"/>
         <w:jc w:val="left"/>
       </w:pPr>
       <w:r>
@@ -541,6 +495,7 @@
         <w:tabs>
           <w:tab w:pos="4896" w:val="left"/>
         </w:tabs>
+        <w:spacing w:line="240" w:lineRule="auto" w:after="40" w:before="0"/>
       </w:pPr>
       <w:r>
         <w:rPr>
@@ -567,6 +522,7 @@
         <w:tabs>
           <w:tab w:pos="4896" w:val="left"/>
         </w:tabs>
+        <w:spacing w:line="240" w:lineRule="auto" w:after="40" w:before="0"/>
       </w:pPr>
       <w:r>
         <w:rPr>
@@ -590,7 +546,7 @@
     </w:p>
     <w:p>
       <w:pPr>
-        <w:spacing w:after="200" w:before="120"/>
+        <w:spacing w:after="40" w:before="0" w:line="240" w:lineRule="auto"/>
       </w:pPr>
       <w:r>
         <w:rPr>
@@ -615,7 +571,7 @@
     </w:p>
     <w:p>
       <w:pPr>
-        <w:spacing w:after="160" w:before="120" w:line="300"/>
+        <w:spacing w:after="40" w:before="0" w:line="240" w:lineRule="auto"/>
         <w:jc w:val="left"/>
       </w:pPr>
       <w:r>
@@ -627,7 +583,7 @@
     </w:p>
     <w:p>
       <w:pPr>
-        <w:spacing w:after="160" w:before="0" w:line="300"/>
+        <w:spacing w:after="40" w:before="0" w:line="240" w:lineRule="auto"/>
         <w:jc w:val="left"/>
       </w:pPr>
       <w:r>
@@ -653,7 +609,7 @@
     </w:p>
     <w:p>
       <w:pPr>
-        <w:spacing w:after="160" w:before="0" w:line="300"/>
+        <w:spacing w:after="40" w:before="0" w:line="240" w:lineRule="auto"/>
         <w:jc w:val="left"/>
       </w:pPr>
       <w:r>
@@ -665,7 +621,7 @@
     </w:p>
     <w:p>
       <w:pPr>
-        <w:spacing w:after="320" w:before="0" w:line="300"/>
+        <w:spacing w:after="40" w:before="0" w:line="240" w:lineRule="auto"/>
         <w:jc w:val="left"/>
       </w:pPr>
       <w:r>
@@ -677,7 +633,7 @@
     </w:p>
     <w:p>
       <w:pPr>
-        <w:spacing w:after="40" w:before="0" w:line="300"/>
+        <w:spacing w:after="40" w:before="0" w:line="240" w:lineRule="auto"/>
         <w:jc w:val="left"/>
       </w:pPr>
       <w:r>
@@ -689,7 +645,7 @@
     </w:p>
     <w:p>
       <w:pPr>
-        <w:spacing w:after="0" w:before="240"/>
+        <w:spacing w:after="40" w:before="0" w:line="240" w:lineRule="auto"/>
       </w:pPr>
       <w:r>
         <w:rPr>
@@ -705,7 +661,7 @@
     </w:p>
     <w:p>
       <w:pPr>
-        <w:spacing w:after="60" w:before="0" w:line="300"/>
+        <w:spacing w:after="40" w:before="0" w:line="240" w:lineRule="auto"/>
         <w:jc w:val="left"/>
       </w:pPr>
       <w:r>
@@ -717,6 +673,7 @@
     </w:p>
     <w:p>
       <w:pPr>
+        <w:spacing w:line="240" w:lineRule="auto" w:after="40" w:before="0"/>
         <w:jc w:val="left"/>
       </w:pPr>
       <w:r>
@@ -731,7 +688,7 @@
     </w:p>
     <w:p>
       <w:pPr>
-        <w:spacing w:after="0" w:before="0" w:line="300"/>
+        <w:spacing w:after="40" w:before="0" w:line="240" w:lineRule="auto"/>
         <w:jc w:val="left"/>
       </w:pPr>
       <w:r>
@@ -745,7 +702,7 @@
     </w:p>
     <w:p>
       <w:pPr>
-        <w:spacing w:after="320" w:before="0" w:line="300"/>
+        <w:spacing w:after="40" w:before="0" w:line="240" w:lineRule="auto"/>
         <w:jc w:val="left"/>
       </w:pPr>
       <w:r>
@@ -767,6 +724,7 @@
     </w:p>
     <w:p>
       <w:pPr>
+        <w:spacing w:line="240" w:lineRule="auto" w:after="40" w:before="0"/>
         <w:jc w:val="left"/>
       </w:pPr>
       <w:r>
@@ -789,6 +747,9 @@
       </w:r>
     </w:p>
     <w:p>
+      <w:pPr>
+        <w:spacing w:line="240" w:lineRule="auto" w:after="40" w:before="0"/>
+      </w:pPr>
       <w:r>
         <w:rPr>
           <w:rFonts w:ascii="Calibri" w:hAnsi="Calibri" w:cs="Calibri"/>
@@ -797,42 +758,6 @@
           <w:sz w:val="27"/>
         </w:rPr>
         <w:t>NATIONAL ENERGY EFFICIENCY INNOVATION AWARD</w:t>
-      </w:r>
-    </w:p>
-    <w:p>
-      <w:r>
-        <w:drawing>
-          <wp:inline xmlns:a="http://schemas.openxmlformats.org/drawingml/2006/main" xmlns:pic="http://schemas.openxmlformats.org/drawingml/2006/picture">
-            <wp:extent cx="1800000" cy="1166834"/>
-            <wp:docPr id="2" name="Picture 1002"/>
-            <wp:cNvGraphicFramePr>
-              <a:graphicFrameLocks noChangeAspect="1"/>
-            </wp:cNvGraphicFramePr>
-            <a:graphic>
-              <a:graphicData uri="http://schemas.openxmlformats.org/drawingml/2006/picture">
-                <pic:pic>
-                  <pic:nvPicPr>
-                    <pic:cNvPr id="2" name="cand3.jpg"/>
-                    <pic:cNvPicPr/>
-                  </pic:nvPicPr>
-                  <pic:blipFill>
-                    <a:blip r:embed="rId14"/>
-                    <a:stretch>
-                      <a:fillRect/>
-                    </a:stretch>
-                  </pic:blipFill>
-                  <pic:spPr>
-                    <a:xfrm>
-                      <a:off x="0" y="0"/>
-                      <a:ext cx="1800000" cy="1166834"/>
-                    </a:xfrm>
-                    <a:prstGeom prst="rect"/>
-                  </pic:spPr>
-                </pic:pic>
-              </a:graphicData>
-            </a:graphic>
-          </wp:inline>
-        </w:drawing>
       </w:r>
     </w:p>
     <w:p>
@@ -969,126 +894,62 @@
           <w:szCs w:val="24"/>
           <w:lang w:bidi="hi-IN"/>
         </w:rPr>
-        <w:drawing>
-          <wp:anchor distT="0" distB="0" distL="114300" distR="114300" simplePos="0" relativeHeight="251661312" behindDoc="1" locked="0" layoutInCell="1" allowOverlap="1" wp14:anchorId="34422ACD" wp14:editId="6CF81E9B">
-            <wp:simplePos x="0" y="0"/>
-            <wp:positionH relativeFrom="page">
-              <wp:posOffset>716280</wp:posOffset>
-            </wp:positionH>
-            <wp:positionV relativeFrom="paragraph">
-              <wp:posOffset>469265</wp:posOffset>
-            </wp:positionV>
-            <wp:extent cx="6507480" cy="4472940"/>
-            <wp:effectExtent l="0" t="0" r="7620" b="3810"/>
-            <wp:wrapTight wrapText="bothSides">
-              <wp:wrapPolygon edited="0">
-                <wp:start x="0" y="0"/>
-                <wp:lineTo x="0" y="21526"/>
-                <wp:lineTo x="21562" y="21526"/>
-                <wp:lineTo x="21562" y="0"/>
-                <wp:lineTo x="0" y="0"/>
-              </wp:wrapPolygon>
-            </wp:wrapTight>
-            <wp:docPr id="3" name="Picture 6" descr="A close up of a map&#10;&#10;Description automatically generated"/>
-            <wp:cNvGraphicFramePr>
-              <a:graphicFrameLocks xmlns:a="http://schemas.openxmlformats.org/drawingml/2006/main" noChangeAspect="1"/>
-            </wp:cNvGraphicFramePr>
-            <a:graphic xmlns:a="http://schemas.openxmlformats.org/drawingml/2006/main">
-              <a:graphicData uri="http://schemas.openxmlformats.org/drawingml/2006/picture">
-                <pic:pic xmlns:pic="http://schemas.openxmlformats.org/drawingml/2006/picture">
-                  <pic:nvPicPr>
-                    <pic:cNvPr id="3" name="Image 06-05-20 at 2.09 PM.jpg"/>
-                    <pic:cNvPicPr/>
-                  </pic:nvPicPr>
-                  <pic:blipFill>
-                    <a:blip r:embed="rId18"/>
-                    <a:stretch>
-                      <a:fillRect/>
-                    </a:stretch>
-                  </pic:blipFill>
-                  <pic:spPr>
-                    <a:xfrm>
-                      <a:off x="0" y="0"/>
-                      <a:ext cx="6507480" cy="4472940"/>
-                    </a:xfrm>
-                    <a:prstGeom prst="rect">
-                      <a:avLst/>
-                    </a:prstGeom>
-                  </pic:spPr>
-                </pic:pic>
-              </a:graphicData>
-            </a:graphic>
-            <wp14:sizeRelH relativeFrom="page">
-              <wp14:pctWidth>0</wp14:pctWidth>
-            </wp14:sizeRelH>
-            <wp14:sizeRelV relativeFrom="page">
-              <wp14:pctHeight>0</wp14:pctHeight>
-            </wp14:sizeRelV>
-          </wp:anchor>
-        </w:drawing>
-      </w:r>
-      <w:r>
-        <w:rPr>
-          <w:rFonts w:ascii="Calibri" w:hAnsi="Calibri" w:cs="Calibri"/>
-          <w:sz w:val="24"/>
-          <w:szCs w:val="24"/>
-        </w:rPr>
-        <w:t xml:space="preserve">We are proposing to give REGEN Burners in the </w:t>
-      </w:r>
-      <w:r>
-        <w:rPr>
-          <w:rFonts w:ascii="Calibri" w:hAnsi="Calibri" w:cs="Calibri"/>
-          <w:sz w:val="24"/>
-          <w:szCs w:val="24"/>
-        </w:rPr>
-        <w:t>furnace,</w:t>
-      </w:r>
-      <w:r>
-        <w:rPr>
-          <w:rFonts w:ascii="Calibri" w:hAnsi="Calibri" w:cs="Calibri"/>
-          <w:sz w:val="24"/>
-          <w:szCs w:val="24"/>
-        </w:rPr>
-        <w:t xml:space="preserve"> REGEN is a range </w:t>
-      </w:r>
-      <w:r>
-        <w:rPr>
-          <w:rFonts w:ascii="Calibri" w:hAnsi="Calibri" w:cs="Calibri"/>
-          <w:sz w:val="24"/>
-          <w:szCs w:val="24"/>
-        </w:rPr>
-        <w:t>of Low</w:t>
-      </w:r>
-      <w:r>
-        <w:rPr>
-          <w:rFonts w:ascii="Calibri" w:hAnsi="Calibri" w:cs="Calibri"/>
-          <w:sz w:val="24"/>
-          <w:szCs w:val="24"/>
-        </w:rPr>
-        <w:t xml:space="preserve"> NOx Regenerative burners developed by </w:t>
-      </w:r>
-      <w:r>
-        <w:rPr>
-          <w:rFonts w:ascii="Calibri" w:hAnsi="Calibri" w:cs="Calibri"/>
-          <w:sz w:val="24"/>
-          <w:szCs w:val="24"/>
-        </w:rPr>
-        <w:t>ENCON</w:t>
-      </w:r>
-      <w:r>
-        <w:rPr>
-          <w:rFonts w:ascii="Calibri" w:hAnsi="Calibri" w:cs="Calibri"/>
-          <w:sz w:val="24"/>
-          <w:szCs w:val="24"/>
-        </w:rPr>
-        <w:t>.</w:t>
+        <w:t xml:space="preserve">REGEN is a range of Low NOx Regenerative burners developed by ENCON.  </w:t>
+      </w:r>
+      <w:r>
+        <w:rPr>
+          <w:rFonts w:ascii="Calibri" w:hAnsi="Calibri" w:cs="Calibri"/>
+          <w:sz w:val="24"/>
+          <w:szCs w:val="24"/>
+        </w:rPr>
+      </w:r>
+      <w:r>
+        <w:rPr>
+          <w:rFonts w:ascii="Calibri" w:hAnsi="Calibri" w:cs="Calibri"/>
+          <w:sz w:val="24"/>
+          <w:szCs w:val="24"/>
+        </w:rPr>
+      </w:r>
+      <w:r>
+        <w:rPr>
+          <w:rFonts w:ascii="Calibri" w:hAnsi="Calibri" w:cs="Calibri"/>
+          <w:sz w:val="24"/>
+          <w:szCs w:val="24"/>
+        </w:rPr>
+      </w:r>
+      <w:r>
+        <w:rPr>
+          <w:rFonts w:ascii="Calibri" w:hAnsi="Calibri" w:cs="Calibri"/>
+          <w:sz w:val="24"/>
+          <w:szCs w:val="24"/>
+        </w:rPr>
+      </w:r>
+      <w:r>
+        <w:rPr>
+          <w:rFonts w:ascii="Calibri" w:hAnsi="Calibri" w:cs="Calibri"/>
+          <w:sz w:val="24"/>
+          <w:szCs w:val="24"/>
+        </w:rPr>
+      </w:r>
+      <w:r>
+        <w:rPr>
+          <w:rFonts w:ascii="Calibri" w:hAnsi="Calibri" w:cs="Calibri"/>
+          <w:sz w:val="24"/>
+          <w:szCs w:val="24"/>
+        </w:rPr>
+      </w:r>
+      <w:r>
+        <w:rPr>
+          <w:rFonts w:ascii="Calibri" w:hAnsi="Calibri" w:cs="Calibri"/>
+          <w:sz w:val="24"/>
+          <w:szCs w:val="24"/>
+        </w:rPr>
       </w:r>
       <w:r>
         <w:rPr>
           <w:rFonts w:ascii="Calibri" w:hAnsi="Calibri" w:cs="Calibri"/>
           <w:bCs/>
         </w:rPr>
-        <w:t xml:space="preserve">  </w:t>
       </w:r>
     </w:p>
     <w:p>
@@ -1364,6 +1225,14 @@
         <w:tblInd w:w="-5" w:type="dxa"/>
         <w:tblLayout w:type="fixed"/>
         <w:tblLook w:val="04A0" w:firstRow="1" w:lastRow="0" w:firstColumn="1" w:lastColumn="0" w:noHBand="0" w:noVBand="1"/>
+        <w:tblBorders>
+          <w:top w:val="single" w:sz="4" w:space="0" w:color="000000"/>
+          <w:left w:val="single" w:sz="4" w:space="0" w:color="000000"/>
+          <w:bottom w:val="single" w:sz="4" w:space="0" w:color="000000"/>
+          <w:right w:val="single" w:sz="4" w:space="0" w:color="000000"/>
+          <w:insideH w:val="single" w:sz="4" w:space="0" w:color="000000"/>
+          <w:insideV w:val="single" w:sz="4" w:space="0" w:color="000000"/>
+        </w:tblBorders>
       </w:tblPr>
       <w:tblGrid>
         <w:gridCol w:w="2127"/>
@@ -1379,18 +1248,19 @@
           <w:tcPr>
             <w:tcW w:w="9356" w:type="dxa"/>
             <w:gridSpan w:val="4"/>
-            <w:tcBorders>
-              <w:top w:val="single" w:sz="4" w:space="0" w:color="auto"/>
-              <w:left w:val="single" w:sz="4" w:space="0" w:color="auto"/>
-              <w:bottom w:val="single" w:sz="4" w:space="0" w:color="auto"/>
-              <w:right w:val="single" w:sz="4" w:space="0" w:color="auto"/>
-            </w:tcBorders>
-            <w:shd w:val="clear" w:color="auto" w:fill="F1F5F9"/>
             <w:vAlign w:val="center"/>
             <w:hideMark/>
+            <w:shd w:val="clear" w:color="auto" w:fill="F1F5F9"/>
+            <w:tcBorders>
+              <w:top w:val="single" w:sz="4" w:space="0" w:color="000000"/>
+              <w:left w:val="single" w:sz="4" w:space="0" w:color="000000"/>
+              <w:bottom w:val="single" w:sz="4" w:space="0" w:color="000000"/>
+              <w:right w:val="single" w:sz="4" w:space="0" w:color="000000"/>
+            </w:tcBorders>
           </w:tcPr>
           <w:p>
             <w:pPr>
+              <w:spacing w:before="40" w:after="40" w:line="240" w:lineRule="auto"/>
               <w:jc w:val="center"/>
               <w:rPr>
                 <w:color w:val="000000"/>
@@ -1400,7 +1270,8 @@
               <w:rPr>
                 <w:rFonts w:ascii="Calibri" w:hAnsi="Calibri" w:cs="Calibri"/>
                 <w:b/>
-                <w:color w:val="000000"/>
+                <w:color w:val="1F2937"/>
+                <w:sz w:val="30"/>
               </w:rPr>
               <w:t>Savings In NATURAL Gas</w:t>
             </w:r>
@@ -1414,18 +1285,19 @@
         <w:tc>
           <w:tcPr>
             <w:tcW w:w="2127" w:type="dxa"/>
-            <w:tcBorders>
-              <w:top w:val="nil"/>
-              <w:left w:val="single" w:sz="4" w:space="0" w:color="auto"/>
-              <w:bottom w:val="single" w:sz="4" w:space="0" w:color="auto"/>
-              <w:right w:val="single" w:sz="4" w:space="0" w:color="auto"/>
-            </w:tcBorders>
-            <w:shd w:val="clear" w:color="000000" w:fill="DBDBDB"/>
             <w:vAlign w:val="center"/>
             <w:hideMark/>
+            <w:shd w:val="clear" w:color="auto" w:fill="F1F5F9"/>
+            <w:tcBorders>
+              <w:top w:val="single" w:sz="4" w:space="0" w:color="000000"/>
+              <w:left w:val="single" w:sz="4" w:space="0" w:color="000000"/>
+              <w:bottom w:val="single" w:sz="4" w:space="0" w:color="000000"/>
+              <w:right w:val="single" w:sz="4" w:space="0" w:color="000000"/>
+            </w:tcBorders>
           </w:tcPr>
           <w:p>
             <w:pPr>
+              <w:spacing w:before="40" w:after="40" w:line="240" w:lineRule="auto"/>
               <w:jc w:val="center"/>
               <w:rPr>
                 <w:b/>
@@ -1438,7 +1310,8 @@
                 <w:rFonts w:ascii="Calibri" w:hAnsi="Calibri" w:cs="Calibri"/>
                 <w:b/>
                 <w:bCs/>
-                <w:color w:val="000000"/>
+                <w:color w:val="1F2937"/>
+                <w:sz w:val="25"/>
               </w:rPr>
               <w:t>Furnace Temp °C</w:t>
             </w:r>
@@ -1447,18 +1320,19 @@
         <w:tc>
           <w:tcPr>
             <w:tcW w:w="2835" w:type="dxa"/>
-            <w:tcBorders>
-              <w:top w:val="nil"/>
-              <w:left w:val="nil"/>
-              <w:bottom w:val="single" w:sz="4" w:space="0" w:color="auto"/>
-              <w:right w:val="single" w:sz="4" w:space="0" w:color="auto"/>
-            </w:tcBorders>
-            <w:shd w:val="clear" w:color="auto" w:fill="auto"/>
             <w:vAlign w:val="center"/>
             <w:hideMark/>
+            <w:shd w:val="clear" w:color="auto" w:fill="F1F5F9"/>
+            <w:tcBorders>
+              <w:top w:val="single" w:sz="4" w:space="0" w:color="000000"/>
+              <w:left w:val="single" w:sz="4" w:space="0" w:color="000000"/>
+              <w:bottom w:val="single" w:sz="4" w:space="0" w:color="000000"/>
+              <w:right w:val="single" w:sz="4" w:space="0" w:color="000000"/>
+            </w:tcBorders>
           </w:tcPr>
           <w:p>
             <w:pPr>
+              <w:spacing w:before="40" w:after="40" w:line="240" w:lineRule="auto"/>
               <w:jc w:val="center"/>
               <w:rPr>
                 <w:color w:val="000000"/>
@@ -1467,21 +1341,27 @@
             <w:r>
               <w:rPr>
                 <w:rFonts w:ascii="Calibri" w:hAnsi="Calibri" w:cs="Calibri"/>
-                <w:color w:val="000000"/>
+                <w:b/>
+                <w:color w:val="1F2937"/>
+                <w:sz w:val="25"/>
               </w:rPr>
               <w:t xml:space="preserve">Recuperator </w:t>
             </w:r>
             <w:r>
               <w:rPr>
                 <w:rFonts w:ascii="Calibri" w:hAnsi="Calibri" w:cs="Calibri"/>
-                <w:color w:val="000000"/>
+                <w:b/>
+                <w:color w:val="1F2937"/>
+                <w:sz w:val="25"/>
               </w:rPr>
               <w:t>v</w:t>
             </w:r>
             <w:r>
               <w:rPr>
                 <w:rFonts w:ascii="Calibri" w:hAnsi="Calibri" w:cs="Calibri"/>
-                <w:color w:val="000000"/>
+                <w:b/>
+                <w:color w:val="1F2937"/>
+                <w:sz w:val="25"/>
               </w:rPr>
               <w:t>s Cold Air</w:t>
             </w:r>
@@ -1490,18 +1370,19 @@
         <w:tc>
           <w:tcPr>
             <w:tcW w:w="2409" w:type="dxa"/>
-            <w:tcBorders>
-              <w:top w:val="nil"/>
-              <w:left w:val="nil"/>
-              <w:bottom w:val="single" w:sz="4" w:space="0" w:color="auto"/>
-              <w:right w:val="single" w:sz="4" w:space="0" w:color="auto"/>
-            </w:tcBorders>
-            <w:shd w:val="clear" w:color="auto" w:fill="auto"/>
             <w:vAlign w:val="center"/>
             <w:hideMark/>
+            <w:shd w:val="clear" w:color="auto" w:fill="F1F5F9"/>
+            <w:tcBorders>
+              <w:top w:val="single" w:sz="4" w:space="0" w:color="000000"/>
+              <w:left w:val="single" w:sz="4" w:space="0" w:color="000000"/>
+              <w:bottom w:val="single" w:sz="4" w:space="0" w:color="000000"/>
+              <w:right w:val="single" w:sz="4" w:space="0" w:color="000000"/>
+            </w:tcBorders>
           </w:tcPr>
           <w:p>
             <w:pPr>
+              <w:spacing w:before="40" w:after="40" w:line="240" w:lineRule="auto"/>
               <w:jc w:val="center"/>
               <w:rPr>
                 <w:color w:val="000000"/>
@@ -1510,21 +1391,27 @@
             <w:r>
               <w:rPr>
                 <w:rFonts w:ascii="Calibri" w:hAnsi="Calibri" w:cs="Calibri"/>
-                <w:color w:val="000000"/>
+                <w:b/>
+                <w:color w:val="1F2937"/>
+                <w:sz w:val="25"/>
               </w:rPr>
               <w:t xml:space="preserve">REGEN </w:t>
             </w:r>
             <w:r>
               <w:rPr>
                 <w:rFonts w:ascii="Calibri" w:hAnsi="Calibri" w:cs="Calibri"/>
-                <w:color w:val="000000"/>
+                <w:b/>
+                <w:color w:val="1F2937"/>
+                <w:sz w:val="25"/>
               </w:rPr>
               <w:t>v</w:t>
             </w:r>
             <w:r>
               <w:rPr>
                 <w:rFonts w:ascii="Calibri" w:hAnsi="Calibri" w:cs="Calibri"/>
-                <w:color w:val="000000"/>
+                <w:b/>
+                <w:color w:val="1F2937"/>
+                <w:sz w:val="25"/>
               </w:rPr>
               <w:t>s Cold Air</w:t>
             </w:r>
@@ -1533,18 +1420,19 @@
         <w:tc>
           <w:tcPr>
             <w:tcW w:w="1985" w:type="dxa"/>
-            <w:tcBorders>
-              <w:top w:val="nil"/>
-              <w:left w:val="nil"/>
-              <w:bottom w:val="single" w:sz="4" w:space="0" w:color="auto"/>
-              <w:right w:val="single" w:sz="4" w:space="0" w:color="auto"/>
-            </w:tcBorders>
-            <w:shd w:val="clear" w:color="auto" w:fill="auto"/>
             <w:vAlign w:val="center"/>
             <w:hideMark/>
+            <w:shd w:val="clear" w:color="auto" w:fill="F1F5F9"/>
+            <w:tcBorders>
+              <w:top w:val="single" w:sz="4" w:space="0" w:color="000000"/>
+              <w:left w:val="single" w:sz="4" w:space="0" w:color="000000"/>
+              <w:bottom w:val="single" w:sz="4" w:space="0" w:color="000000"/>
+              <w:right w:val="single" w:sz="4" w:space="0" w:color="000000"/>
+            </w:tcBorders>
           </w:tcPr>
           <w:p>
             <w:pPr>
+              <w:spacing w:before="40" w:after="40" w:line="240" w:lineRule="auto"/>
               <w:jc w:val="center"/>
               <w:rPr>
                 <w:color w:val="000000"/>
@@ -1553,21 +1441,27 @@
             <w:r>
               <w:rPr>
                 <w:rFonts w:ascii="Calibri" w:hAnsi="Calibri" w:cs="Calibri"/>
-                <w:color w:val="000000"/>
+                <w:b/>
+                <w:color w:val="1F2937"/>
+                <w:sz w:val="25"/>
               </w:rPr>
               <w:t xml:space="preserve">REGEN </w:t>
             </w:r>
             <w:r>
               <w:rPr>
                 <w:rFonts w:ascii="Calibri" w:hAnsi="Calibri" w:cs="Calibri"/>
-                <w:color w:val="000000"/>
+                <w:b/>
+                <w:color w:val="1F2937"/>
+                <w:sz w:val="25"/>
               </w:rPr>
               <w:t>v</w:t>
             </w:r>
             <w:r>
               <w:rPr>
                 <w:rFonts w:ascii="Calibri" w:hAnsi="Calibri" w:cs="Calibri"/>
-                <w:color w:val="000000"/>
+                <w:b/>
+                <w:color w:val="1F2937"/>
+                <w:sz w:val="25"/>
               </w:rPr>
               <w:t>s Recuperator</w:t>
             </w:r>
@@ -1581,18 +1475,19 @@
         <w:tc>
           <w:tcPr>
             <w:tcW w:w="2127" w:type="dxa"/>
-            <w:tcBorders>
-              <w:top w:val="nil"/>
-              <w:left w:val="single" w:sz="4" w:space="0" w:color="auto"/>
-              <w:bottom w:val="single" w:sz="4" w:space="0" w:color="auto"/>
-              <w:right w:val="single" w:sz="4" w:space="0" w:color="auto"/>
-            </w:tcBorders>
-            <w:shd w:val="clear" w:color="000000" w:fill="DBDBDB"/>
             <w:vAlign w:val="center"/>
             <w:hideMark/>
+            <w:shd w:val="clear" w:color="auto" w:fill="FFFFFF"/>
+            <w:tcBorders>
+              <w:top w:val="single" w:sz="4" w:space="0" w:color="000000"/>
+              <w:left w:val="single" w:sz="4" w:space="0" w:color="000000"/>
+              <w:bottom w:val="single" w:sz="4" w:space="0" w:color="000000"/>
+              <w:right w:val="single" w:sz="4" w:space="0" w:color="000000"/>
+            </w:tcBorders>
           </w:tcPr>
           <w:p>
             <w:pPr>
+              <w:spacing w:before="40" w:after="40" w:line="240" w:lineRule="auto"/>
               <w:jc w:val="center"/>
               <w:rPr>
                 <w:b/>
@@ -1605,7 +1500,8 @@
                 <w:rFonts w:ascii="Calibri" w:hAnsi="Calibri" w:cs="Calibri"/>
                 <w:b/>
                 <w:bCs/>
-                <w:color w:val="000000"/>
+                <w:color w:val="1F2937"/>
+                <w:sz w:val="24"/>
               </w:rPr>
               <w:t>1050</w:t>
             </w:r>
@@ -1614,18 +1510,19 @@
         <w:tc>
           <w:tcPr>
             <w:tcW w:w="2835" w:type="dxa"/>
-            <w:tcBorders>
-              <w:top w:val="nil"/>
-              <w:left w:val="nil"/>
-              <w:bottom w:val="single" w:sz="4" w:space="0" w:color="auto"/>
-              <w:right w:val="single" w:sz="4" w:space="0" w:color="auto"/>
-            </w:tcBorders>
-            <w:shd w:val="clear" w:color="auto" w:fill="auto"/>
             <w:vAlign w:val="center"/>
             <w:hideMark/>
+            <w:shd w:val="clear" w:color="auto" w:fill="FFFFFF"/>
+            <w:tcBorders>
+              <w:top w:val="single" w:sz="4" w:space="0" w:color="000000"/>
+              <w:left w:val="single" w:sz="4" w:space="0" w:color="000000"/>
+              <w:bottom w:val="single" w:sz="4" w:space="0" w:color="000000"/>
+              <w:right w:val="single" w:sz="4" w:space="0" w:color="000000"/>
+            </w:tcBorders>
           </w:tcPr>
           <w:p>
             <w:pPr>
+              <w:spacing w:before="40" w:after="40" w:line="240" w:lineRule="auto"/>
               <w:jc w:val="center"/>
               <w:rPr>
                 <w:color w:val="000000"/>
@@ -1634,7 +1531,9 @@
             <w:r>
               <w:rPr>
                 <w:rFonts w:ascii="Calibri" w:hAnsi="Calibri" w:cs="Calibri"/>
-                <w:color w:val="000000"/>
+                <w:b w:val="0"/>
+                <w:color w:val="1F2937"/>
+                <w:sz w:val="24"/>
               </w:rPr>
               <w:t>27.0%</w:t>
             </w:r>
@@ -1643,18 +1542,19 @@
         <w:tc>
           <w:tcPr>
             <w:tcW w:w="2409" w:type="dxa"/>
-            <w:tcBorders>
-              <w:top w:val="nil"/>
-              <w:left w:val="nil"/>
-              <w:bottom w:val="single" w:sz="4" w:space="0" w:color="auto"/>
-              <w:right w:val="single" w:sz="4" w:space="0" w:color="auto"/>
-            </w:tcBorders>
-            <w:shd w:val="clear" w:color="auto" w:fill="auto"/>
             <w:vAlign w:val="center"/>
             <w:hideMark/>
+            <w:shd w:val="clear" w:color="auto" w:fill="FFFFFF"/>
+            <w:tcBorders>
+              <w:top w:val="single" w:sz="4" w:space="0" w:color="000000"/>
+              <w:left w:val="single" w:sz="4" w:space="0" w:color="000000"/>
+              <w:bottom w:val="single" w:sz="4" w:space="0" w:color="000000"/>
+              <w:right w:val="single" w:sz="4" w:space="0" w:color="000000"/>
+            </w:tcBorders>
           </w:tcPr>
           <w:p>
             <w:pPr>
+              <w:spacing w:before="40" w:after="40" w:line="240" w:lineRule="auto"/>
               <w:jc w:val="center"/>
               <w:rPr>
                 <w:b/>
@@ -1665,9 +1565,10 @@
             <w:r>
               <w:rPr>
                 <w:rFonts w:ascii="Calibri" w:hAnsi="Calibri" w:cs="Calibri"/>
-                <w:b/>
+                <w:b w:val="0"/>
                 <w:bCs/>
-                <w:color w:val="000000"/>
+                <w:color w:val="1F2937"/>
+                <w:sz w:val="24"/>
               </w:rPr>
               <w:t>42.6%</w:t>
             </w:r>
@@ -1676,18 +1577,19 @@
         <w:tc>
           <w:tcPr>
             <w:tcW w:w="1985" w:type="dxa"/>
-            <w:tcBorders>
-              <w:top w:val="nil"/>
-              <w:left w:val="nil"/>
-              <w:bottom w:val="single" w:sz="4" w:space="0" w:color="auto"/>
-              <w:right w:val="single" w:sz="4" w:space="0" w:color="auto"/>
-            </w:tcBorders>
-            <w:shd w:val="clear" w:color="auto" w:fill="auto"/>
             <w:vAlign w:val="center"/>
             <w:hideMark/>
+            <w:shd w:val="clear" w:color="auto" w:fill="FFFFFF"/>
+            <w:tcBorders>
+              <w:top w:val="single" w:sz="4" w:space="0" w:color="000000"/>
+              <w:left w:val="single" w:sz="4" w:space="0" w:color="000000"/>
+              <w:bottom w:val="single" w:sz="4" w:space="0" w:color="000000"/>
+              <w:right w:val="single" w:sz="4" w:space="0" w:color="000000"/>
+            </w:tcBorders>
           </w:tcPr>
           <w:p>
             <w:pPr>
+              <w:spacing w:before="40" w:after="40" w:line="240" w:lineRule="auto"/>
               <w:jc w:val="center"/>
               <w:rPr>
                 <w:b/>
@@ -1698,9 +1600,10 @@
             <w:r>
               <w:rPr>
                 <w:rFonts w:ascii="Calibri" w:hAnsi="Calibri" w:cs="Calibri"/>
-                <w:b/>
+                <w:b w:val="0"/>
                 <w:bCs/>
-                <w:color w:val="000000"/>
+                <w:color w:val="1F2937"/>
+                <w:sz w:val="24"/>
               </w:rPr>
               <w:t>21.3%</w:t>
             </w:r>
@@ -1714,18 +1617,19 @@
         <w:tc>
           <w:tcPr>
             <w:tcW w:w="2127" w:type="dxa"/>
-            <w:tcBorders>
-              <w:top w:val="nil"/>
-              <w:left w:val="single" w:sz="4" w:space="0" w:color="auto"/>
-              <w:bottom w:val="single" w:sz="4" w:space="0" w:color="auto"/>
-              <w:right w:val="single" w:sz="4" w:space="0" w:color="auto"/>
-            </w:tcBorders>
-            <w:shd w:val="clear" w:color="000000" w:fill="DBDBDB"/>
             <w:vAlign w:val="center"/>
             <w:hideMark/>
+            <w:shd w:val="clear" w:color="auto" w:fill="FFFFFF"/>
+            <w:tcBorders>
+              <w:top w:val="single" w:sz="4" w:space="0" w:color="000000"/>
+              <w:left w:val="single" w:sz="4" w:space="0" w:color="000000"/>
+              <w:bottom w:val="single" w:sz="4" w:space="0" w:color="000000"/>
+              <w:right w:val="single" w:sz="4" w:space="0" w:color="000000"/>
+            </w:tcBorders>
           </w:tcPr>
           <w:p>
             <w:pPr>
+              <w:spacing w:before="40" w:after="40" w:line="240" w:lineRule="auto"/>
               <w:jc w:val="center"/>
               <w:rPr>
                 <w:b/>
@@ -1738,7 +1642,8 @@
                 <w:rFonts w:ascii="Calibri" w:hAnsi="Calibri" w:cs="Calibri"/>
                 <w:b/>
                 <w:bCs/>
-                <w:color w:val="000000"/>
+                <w:color w:val="1F2937"/>
+                <w:sz w:val="24"/>
               </w:rPr>
               <w:t>1100</w:t>
             </w:r>
@@ -1747,18 +1652,19 @@
         <w:tc>
           <w:tcPr>
             <w:tcW w:w="2835" w:type="dxa"/>
-            <w:tcBorders>
-              <w:top w:val="nil"/>
-              <w:left w:val="nil"/>
-              <w:bottom w:val="single" w:sz="4" w:space="0" w:color="auto"/>
-              <w:right w:val="single" w:sz="4" w:space="0" w:color="auto"/>
-            </w:tcBorders>
-            <w:shd w:val="clear" w:color="auto" w:fill="auto"/>
             <w:vAlign w:val="center"/>
             <w:hideMark/>
+            <w:shd w:val="clear" w:color="auto" w:fill="FFFFFF"/>
+            <w:tcBorders>
+              <w:top w:val="single" w:sz="4" w:space="0" w:color="000000"/>
+              <w:left w:val="single" w:sz="4" w:space="0" w:color="000000"/>
+              <w:bottom w:val="single" w:sz="4" w:space="0" w:color="000000"/>
+              <w:right w:val="single" w:sz="4" w:space="0" w:color="000000"/>
+            </w:tcBorders>
           </w:tcPr>
           <w:p>
             <w:pPr>
+              <w:spacing w:before="40" w:after="40" w:line="240" w:lineRule="auto"/>
               <w:jc w:val="center"/>
               <w:rPr>
                 <w:color w:val="000000"/>
@@ -1767,7 +1673,9 @@
             <w:r>
               <w:rPr>
                 <w:rFonts w:ascii="Calibri" w:hAnsi="Calibri" w:cs="Calibri"/>
-                <w:color w:val="000000"/>
+                <w:b w:val="0"/>
+                <w:color w:val="1F2937"/>
+                <w:sz w:val="24"/>
               </w:rPr>
               <w:t>27.9%</w:t>
             </w:r>
@@ -1776,18 +1684,19 @@
         <w:tc>
           <w:tcPr>
             <w:tcW w:w="2409" w:type="dxa"/>
-            <w:tcBorders>
-              <w:top w:val="nil"/>
-              <w:left w:val="nil"/>
-              <w:bottom w:val="single" w:sz="4" w:space="0" w:color="auto"/>
-              <w:right w:val="single" w:sz="4" w:space="0" w:color="auto"/>
-            </w:tcBorders>
-            <w:shd w:val="clear" w:color="auto" w:fill="auto"/>
             <w:vAlign w:val="center"/>
             <w:hideMark/>
+            <w:shd w:val="clear" w:color="auto" w:fill="FFFFFF"/>
+            <w:tcBorders>
+              <w:top w:val="single" w:sz="4" w:space="0" w:color="000000"/>
+              <w:left w:val="single" w:sz="4" w:space="0" w:color="000000"/>
+              <w:bottom w:val="single" w:sz="4" w:space="0" w:color="000000"/>
+              <w:right w:val="single" w:sz="4" w:space="0" w:color="000000"/>
+            </w:tcBorders>
           </w:tcPr>
           <w:p>
             <w:pPr>
+              <w:spacing w:before="40" w:after="40" w:line="240" w:lineRule="auto"/>
               <w:jc w:val="center"/>
               <w:rPr>
                 <w:b/>
@@ -1798,9 +1707,10 @@
             <w:r>
               <w:rPr>
                 <w:rFonts w:ascii="Calibri" w:hAnsi="Calibri" w:cs="Calibri"/>
-                <w:b/>
+                <w:b w:val="0"/>
                 <w:bCs/>
-                <w:color w:val="000000"/>
+                <w:color w:val="1F2937"/>
+                <w:sz w:val="24"/>
               </w:rPr>
               <w:t>43.7%</w:t>
             </w:r>
@@ -1809,18 +1719,19 @@
         <w:tc>
           <w:tcPr>
             <w:tcW w:w="1985" w:type="dxa"/>
-            <w:tcBorders>
-              <w:top w:val="nil"/>
-              <w:left w:val="nil"/>
-              <w:bottom w:val="single" w:sz="4" w:space="0" w:color="auto"/>
-              <w:right w:val="single" w:sz="4" w:space="0" w:color="auto"/>
-            </w:tcBorders>
-            <w:shd w:val="clear" w:color="auto" w:fill="auto"/>
             <w:vAlign w:val="center"/>
             <w:hideMark/>
+            <w:shd w:val="clear" w:color="auto" w:fill="FFFFFF"/>
+            <w:tcBorders>
+              <w:top w:val="single" w:sz="4" w:space="0" w:color="000000"/>
+              <w:left w:val="single" w:sz="4" w:space="0" w:color="000000"/>
+              <w:bottom w:val="single" w:sz="4" w:space="0" w:color="000000"/>
+              <w:right w:val="single" w:sz="4" w:space="0" w:color="000000"/>
+            </w:tcBorders>
           </w:tcPr>
           <w:p>
             <w:pPr>
+              <w:spacing w:before="40" w:after="40" w:line="240" w:lineRule="auto"/>
               <w:jc w:val="center"/>
               <w:rPr>
                 <w:b/>
@@ -1831,9 +1742,10 @@
             <w:r>
               <w:rPr>
                 <w:rFonts w:ascii="Calibri" w:hAnsi="Calibri" w:cs="Calibri"/>
-                <w:b/>
+                <w:b w:val="0"/>
                 <w:bCs/>
-                <w:color w:val="000000"/>
+                <w:color w:val="1F2937"/>
+                <w:sz w:val="24"/>
               </w:rPr>
               <w:t>21.9%</w:t>
             </w:r>
@@ -1847,18 +1759,19 @@
         <w:tc>
           <w:tcPr>
             <w:tcW w:w="2127" w:type="dxa"/>
-            <w:tcBorders>
-              <w:top w:val="nil"/>
-              <w:left w:val="single" w:sz="4" w:space="0" w:color="auto"/>
-              <w:bottom w:val="single" w:sz="4" w:space="0" w:color="auto"/>
-              <w:right w:val="single" w:sz="4" w:space="0" w:color="auto"/>
-            </w:tcBorders>
-            <w:shd w:val="clear" w:color="000000" w:fill="DBDBDB"/>
             <w:vAlign w:val="center"/>
             <w:hideMark/>
+            <w:shd w:val="clear" w:color="auto" w:fill="FFFFFF"/>
+            <w:tcBorders>
+              <w:top w:val="single" w:sz="4" w:space="0" w:color="000000"/>
+              <w:left w:val="single" w:sz="4" w:space="0" w:color="000000"/>
+              <w:bottom w:val="single" w:sz="4" w:space="0" w:color="000000"/>
+              <w:right w:val="single" w:sz="4" w:space="0" w:color="000000"/>
+            </w:tcBorders>
           </w:tcPr>
           <w:p>
             <w:pPr>
+              <w:spacing w:before="40" w:after="40" w:line="240" w:lineRule="auto"/>
               <w:jc w:val="center"/>
               <w:rPr>
                 <w:b/>
@@ -1871,7 +1784,8 @@
                 <w:rFonts w:ascii="Calibri" w:hAnsi="Calibri" w:cs="Calibri"/>
                 <w:b/>
                 <w:bCs/>
-                <w:color w:val="000000"/>
+                <w:color w:val="1F2937"/>
+                <w:sz w:val="24"/>
               </w:rPr>
               <w:t>1150</w:t>
             </w:r>
@@ -1880,18 +1794,19 @@
         <w:tc>
           <w:tcPr>
             <w:tcW w:w="2835" w:type="dxa"/>
-            <w:tcBorders>
-              <w:top w:val="nil"/>
-              <w:left w:val="nil"/>
-              <w:bottom w:val="single" w:sz="4" w:space="0" w:color="auto"/>
-              <w:right w:val="single" w:sz="4" w:space="0" w:color="auto"/>
-            </w:tcBorders>
-            <w:shd w:val="clear" w:color="auto" w:fill="auto"/>
             <w:vAlign w:val="center"/>
             <w:hideMark/>
+            <w:shd w:val="clear" w:color="auto" w:fill="FFFFFF"/>
+            <w:tcBorders>
+              <w:top w:val="single" w:sz="4" w:space="0" w:color="000000"/>
+              <w:left w:val="single" w:sz="4" w:space="0" w:color="000000"/>
+              <w:bottom w:val="single" w:sz="4" w:space="0" w:color="000000"/>
+              <w:right w:val="single" w:sz="4" w:space="0" w:color="000000"/>
+            </w:tcBorders>
           </w:tcPr>
           <w:p>
             <w:pPr>
+              <w:spacing w:before="40" w:after="40" w:line="240" w:lineRule="auto"/>
               <w:jc w:val="center"/>
               <w:rPr>
                 <w:color w:val="000000"/>
@@ -1900,7 +1815,9 @@
             <w:r>
               <w:rPr>
                 <w:rFonts w:ascii="Calibri" w:hAnsi="Calibri" w:cs="Calibri"/>
-                <w:color w:val="000000"/>
+                <w:b w:val="0"/>
+                <w:color w:val="1F2937"/>
+                <w:sz w:val="24"/>
               </w:rPr>
               <w:t>28.9%</w:t>
             </w:r>
@@ -1909,18 +1826,19 @@
         <w:tc>
           <w:tcPr>
             <w:tcW w:w="2409" w:type="dxa"/>
-            <w:tcBorders>
-              <w:top w:val="nil"/>
-              <w:left w:val="nil"/>
-              <w:bottom w:val="single" w:sz="4" w:space="0" w:color="auto"/>
-              <w:right w:val="single" w:sz="4" w:space="0" w:color="auto"/>
-            </w:tcBorders>
-            <w:shd w:val="clear" w:color="auto" w:fill="auto"/>
             <w:vAlign w:val="center"/>
             <w:hideMark/>
+            <w:shd w:val="clear" w:color="auto" w:fill="FFFFFF"/>
+            <w:tcBorders>
+              <w:top w:val="single" w:sz="4" w:space="0" w:color="000000"/>
+              <w:left w:val="single" w:sz="4" w:space="0" w:color="000000"/>
+              <w:bottom w:val="single" w:sz="4" w:space="0" w:color="000000"/>
+              <w:right w:val="single" w:sz="4" w:space="0" w:color="000000"/>
+            </w:tcBorders>
           </w:tcPr>
           <w:p>
             <w:pPr>
+              <w:spacing w:before="40" w:after="40" w:line="240" w:lineRule="auto"/>
               <w:jc w:val="center"/>
               <w:rPr>
                 <w:b/>
@@ -1931,9 +1849,10 @@
             <w:r>
               <w:rPr>
                 <w:rFonts w:ascii="Calibri" w:hAnsi="Calibri" w:cs="Calibri"/>
-                <w:b/>
+                <w:b w:val="0"/>
                 <w:bCs/>
-                <w:color w:val="000000"/>
+                <w:color w:val="1F2937"/>
+                <w:sz w:val="24"/>
               </w:rPr>
               <w:t>44.9%</w:t>
             </w:r>
@@ -1942,18 +1861,19 @@
         <w:tc>
           <w:tcPr>
             <w:tcW w:w="1985" w:type="dxa"/>
-            <w:tcBorders>
-              <w:top w:val="nil"/>
-              <w:left w:val="nil"/>
-              <w:bottom w:val="single" w:sz="4" w:space="0" w:color="auto"/>
-              <w:right w:val="single" w:sz="4" w:space="0" w:color="auto"/>
-            </w:tcBorders>
-            <w:shd w:val="clear" w:color="auto" w:fill="auto"/>
             <w:vAlign w:val="center"/>
             <w:hideMark/>
+            <w:shd w:val="clear" w:color="auto" w:fill="FFFFFF"/>
+            <w:tcBorders>
+              <w:top w:val="single" w:sz="4" w:space="0" w:color="000000"/>
+              <w:left w:val="single" w:sz="4" w:space="0" w:color="000000"/>
+              <w:bottom w:val="single" w:sz="4" w:space="0" w:color="000000"/>
+              <w:right w:val="single" w:sz="4" w:space="0" w:color="000000"/>
+            </w:tcBorders>
           </w:tcPr>
           <w:p>
             <w:pPr>
+              <w:spacing w:before="40" w:after="40" w:line="240" w:lineRule="auto"/>
               <w:jc w:val="center"/>
               <w:rPr>
                 <w:b/>
@@ -1964,9 +1884,10 @@
             <w:r>
               <w:rPr>
                 <w:rFonts w:ascii="Calibri" w:hAnsi="Calibri" w:cs="Calibri"/>
-                <w:b/>
+                <w:b w:val="0"/>
                 <w:bCs/>
-                <w:color w:val="000000"/>
+                <w:color w:val="1F2937"/>
+                <w:sz w:val="24"/>
               </w:rPr>
               <w:t>22.5%</w:t>
             </w:r>
@@ -1980,18 +1901,19 @@
         <w:tc>
           <w:tcPr>
             <w:tcW w:w="2127" w:type="dxa"/>
-            <w:tcBorders>
-              <w:top w:val="nil"/>
-              <w:left w:val="single" w:sz="4" w:space="0" w:color="auto"/>
-              <w:bottom w:val="single" w:sz="4" w:space="0" w:color="auto"/>
-              <w:right w:val="single" w:sz="4" w:space="0" w:color="auto"/>
-            </w:tcBorders>
-            <w:shd w:val="clear" w:color="000000" w:fill="DBDBDB"/>
             <w:vAlign w:val="center"/>
             <w:hideMark/>
+            <w:shd w:val="clear" w:color="auto" w:fill="FFFFFF"/>
+            <w:tcBorders>
+              <w:top w:val="single" w:sz="4" w:space="0" w:color="000000"/>
+              <w:left w:val="single" w:sz="4" w:space="0" w:color="000000"/>
+              <w:bottom w:val="single" w:sz="4" w:space="0" w:color="000000"/>
+              <w:right w:val="single" w:sz="4" w:space="0" w:color="000000"/>
+            </w:tcBorders>
           </w:tcPr>
           <w:p>
             <w:pPr>
+              <w:spacing w:before="40" w:after="40" w:line="240" w:lineRule="auto"/>
               <w:jc w:val="center"/>
               <w:rPr>
                 <w:b/>
@@ -2004,7 +1926,8 @@
                 <w:rFonts w:ascii="Calibri" w:hAnsi="Calibri" w:cs="Calibri"/>
                 <w:b/>
                 <w:bCs/>
-                <w:color w:val="000000"/>
+                <w:color w:val="1F2937"/>
+                <w:sz w:val="24"/>
               </w:rPr>
               <w:t>1200</w:t>
             </w:r>
@@ -2013,18 +1936,19 @@
         <w:tc>
           <w:tcPr>
             <w:tcW w:w="2835" w:type="dxa"/>
-            <w:tcBorders>
-              <w:top w:val="nil"/>
-              <w:left w:val="nil"/>
-              <w:bottom w:val="single" w:sz="4" w:space="0" w:color="auto"/>
-              <w:right w:val="single" w:sz="4" w:space="0" w:color="auto"/>
-            </w:tcBorders>
-            <w:shd w:val="clear" w:color="auto" w:fill="auto"/>
             <w:vAlign w:val="center"/>
             <w:hideMark/>
+            <w:shd w:val="clear" w:color="auto" w:fill="FFFFFF"/>
+            <w:tcBorders>
+              <w:top w:val="single" w:sz="4" w:space="0" w:color="000000"/>
+              <w:left w:val="single" w:sz="4" w:space="0" w:color="000000"/>
+              <w:bottom w:val="single" w:sz="4" w:space="0" w:color="000000"/>
+              <w:right w:val="single" w:sz="4" w:space="0" w:color="000000"/>
+            </w:tcBorders>
           </w:tcPr>
           <w:p>
             <w:pPr>
+              <w:spacing w:before="40" w:after="40" w:line="240" w:lineRule="auto"/>
               <w:jc w:val="center"/>
               <w:rPr>
                 <w:color w:val="000000"/>
@@ -2033,7 +1957,9 @@
             <w:r>
               <w:rPr>
                 <w:rFonts w:ascii="Calibri" w:hAnsi="Calibri" w:cs="Calibri"/>
-                <w:color w:val="000000"/>
+                <w:b w:val="0"/>
+                <w:color w:val="1F2937"/>
+                <w:sz w:val="24"/>
               </w:rPr>
               <w:t>30.0%</w:t>
             </w:r>
@@ -2042,18 +1968,19 @@
         <w:tc>
           <w:tcPr>
             <w:tcW w:w="2409" w:type="dxa"/>
-            <w:tcBorders>
-              <w:top w:val="nil"/>
-              <w:left w:val="nil"/>
-              <w:bottom w:val="single" w:sz="4" w:space="0" w:color="auto"/>
-              <w:right w:val="single" w:sz="4" w:space="0" w:color="auto"/>
-            </w:tcBorders>
-            <w:shd w:val="clear" w:color="auto" w:fill="auto"/>
             <w:vAlign w:val="center"/>
             <w:hideMark/>
+            <w:shd w:val="clear" w:color="auto" w:fill="FFFFFF"/>
+            <w:tcBorders>
+              <w:top w:val="single" w:sz="4" w:space="0" w:color="000000"/>
+              <w:left w:val="single" w:sz="4" w:space="0" w:color="000000"/>
+              <w:bottom w:val="single" w:sz="4" w:space="0" w:color="000000"/>
+              <w:right w:val="single" w:sz="4" w:space="0" w:color="000000"/>
+            </w:tcBorders>
           </w:tcPr>
           <w:p>
             <w:pPr>
+              <w:spacing w:before="40" w:after="40" w:line="240" w:lineRule="auto"/>
               <w:jc w:val="center"/>
               <w:rPr>
                 <w:b/>
@@ -2064,9 +1991,10 @@
             <w:r>
               <w:rPr>
                 <w:rFonts w:ascii="Calibri" w:hAnsi="Calibri" w:cs="Calibri"/>
-                <w:b/>
+                <w:b w:val="0"/>
                 <w:bCs/>
-                <w:color w:val="000000"/>
+                <w:color w:val="1F2937"/>
+                <w:sz w:val="24"/>
               </w:rPr>
               <w:t>46.2%</w:t>
             </w:r>
@@ -2075,18 +2003,19 @@
         <w:tc>
           <w:tcPr>
             <w:tcW w:w="1985" w:type="dxa"/>
-            <w:tcBorders>
-              <w:top w:val="nil"/>
-              <w:left w:val="nil"/>
-              <w:bottom w:val="single" w:sz="4" w:space="0" w:color="auto"/>
-              <w:right w:val="single" w:sz="4" w:space="0" w:color="auto"/>
-            </w:tcBorders>
-            <w:shd w:val="clear" w:color="auto" w:fill="auto"/>
             <w:vAlign w:val="center"/>
             <w:hideMark/>
+            <w:shd w:val="clear" w:color="auto" w:fill="FFFFFF"/>
+            <w:tcBorders>
+              <w:top w:val="single" w:sz="4" w:space="0" w:color="000000"/>
+              <w:left w:val="single" w:sz="4" w:space="0" w:color="000000"/>
+              <w:bottom w:val="single" w:sz="4" w:space="0" w:color="000000"/>
+              <w:right w:val="single" w:sz="4" w:space="0" w:color="000000"/>
+            </w:tcBorders>
           </w:tcPr>
           <w:p>
             <w:pPr>
+              <w:spacing w:before="40" w:after="40" w:line="240" w:lineRule="auto"/>
               <w:jc w:val="center"/>
               <w:rPr>
                 <w:b/>
@@ -2097,9 +2026,10 @@
             <w:r>
               <w:rPr>
                 <w:rFonts w:ascii="Calibri" w:hAnsi="Calibri" w:cs="Calibri"/>
-                <w:b/>
+                <w:b w:val="0"/>
                 <w:bCs/>
-                <w:color w:val="000000"/>
+                <w:color w:val="1F2937"/>
+                <w:sz w:val="24"/>
               </w:rPr>
               <w:t>23.1%</w:t>
             </w:r>

</xml_diff>

<commit_message>
fix: restore big cover logo on regen offer; gentler cover compaction
My earlier aggressive compaction had deleted the paragraph holding the big
ENCON cover graphic. Restored it; compaction now skips any image-bearing
paragraph and only lightly softens spacing (line-spacing 1.12, cap large
gaps). Header logo/ref/rule stay removed from page 1; savings table keeps the
MAKE-LIST look; intro clause stays trimmed.

Co-Authored-By: Claude Opus 4.8 (1M context) <noreply@anthropic.com>
</commit_message>
<xml_diff>
--- a/Regen_Offer_Template.docx
+++ b/Regen_Offer_Template.docx
@@ -4,7 +4,53 @@
   <w:body>
     <w:p>
       <w:pPr>
-        <w:spacing w:before="120" w:after="40" w:line="240" w:lineRule="auto"/>
+        <w:spacing w:before="200" w:after="0"/>
+        <w:jc w:val="center"/>
+      </w:pPr>
+      <w:r>
+        <w:drawing>
+          <wp:inline distT="0" distB="0" distL="0" distR="0">
+            <wp:extent cx="3619500" cy="4680000"/>
+            <wp:effectExtent t="0" r="0" b="0" l="0"/>
+            <wp:docPr id="1" name="ENCON" descr="ENCON logo" title="ENCON"/>
+            <wp:cNvGraphicFramePr>
+              <a:graphicFrameLocks xmlns:a="http://schemas.openxmlformats.org/drawingml/2006/main" noChangeAspect="1"/>
+            </wp:cNvGraphicFramePr>
+            <a:graphic xmlns:a="http://schemas.openxmlformats.org/drawingml/2006/main">
+              <a:graphicData uri="http://schemas.openxmlformats.org/drawingml/2006/picture">
+                <pic:pic xmlns:pic="http://schemas.openxmlformats.org/drawingml/2006/picture">
+                  <pic:nvPicPr>
+                    <pic:cNvPr id="1" name="" descr=""/>
+                    <pic:cNvPicPr>
+                      <a:picLocks noChangeAspect="1" noChangeArrowheads="1"/>
+                    </pic:cNvPicPr>
+                  </pic:nvPicPr>
+                  <pic:blipFill>
+                    <a:blip r:embed="rId11" cstate="none"/>
+                    <a:srcRect/>
+                    <a:stretch>
+                      <a:fillRect/>
+                    </a:stretch>
+                  </pic:blipFill>
+                  <pic:spPr bwMode="auto">
+                    <a:xfrm>
+                      <a:off x="0" y="0"/>
+                      <a:ext cx="3619500" cy="4680000"/>
+                    </a:xfrm>
+                    <a:prstGeom prst="rect">
+                      <a:avLst/>
+                    </a:prstGeom>
+                  </pic:spPr>
+                </pic:pic>
+              </a:graphicData>
+            </a:graphic>
+          </wp:inline>
+        </w:drawing>
+      </w:r>
+    </w:p>
+    <w:p>
+      <w:pPr>
+        <w:spacing w:before="200" w:after="80"/>
         <w:jc w:val="center"/>
       </w:pPr>
       <w:r>
@@ -22,7 +68,7 @@
     </w:p>
     <w:p>
       <w:pPr>
-        <w:spacing w:before="0" w:after="40" w:line="240" w:lineRule="auto"/>
+        <w:spacing w:before="0" w:after="200"/>
         <w:jc w:val="center"/>
       </w:pPr>
       <w:r>
@@ -314,7 +360,7 @@
     </w:tbl>
     <w:p>
       <w:pPr>
-        <w:spacing w:before="0" w:after="40" w:line="240" w:lineRule="auto"/>
+        <w:spacing w:before="120" w:after="60"/>
         <w:jc w:val="center"/>
       </w:pPr>
       <w:r>
@@ -331,7 +377,7 @@
     </w:p>
     <w:p>
       <w:pPr>
-        <w:spacing w:before="0" w:after="40" w:line="240" w:lineRule="auto"/>
+        <w:spacing w:before="0" w:after="240"/>
         <w:jc w:val="center"/>
       </w:pPr>
       <w:r>
@@ -348,7 +394,7 @@
     </w:p>
     <w:p>
       <w:pPr>
-        <w:spacing w:before="0" w:after="40" w:line="240" w:lineRule="auto"/>
+        <w:spacing w:before="120" w:after="0"/>
         <w:jc w:val="center"/>
       </w:pPr>
       <w:r>
@@ -363,7 +409,7 @@
     </w:p>
     <w:p>
       <w:pPr>
-        <w:spacing w:before="0" w:after="40" w:line="240" w:lineRule="auto"/>
+        <w:spacing w:before="60" w:after="0"/>
         <w:jc w:val="center"/>
       </w:pPr>
       <w:r>
@@ -378,7 +424,7 @@
     </w:p>
     <w:p>
       <w:pPr>
-        <w:spacing w:before="0" w:after="40" w:line="240" w:lineRule="auto"/>
+        <w:spacing w:before="60" w:after="0"/>
         <w:jc w:val="center"/>
       </w:pPr>
       <w:r>
@@ -397,7 +443,7 @@
         <w:pBdr>
           <w:bottom w:val="single" w:color="E87722" w:sz="12" w:space="4"/>
         </w:pBdr>
-        <w:spacing w:after="40" w:before="120" w:line="240" w:lineRule="auto"/>
+        <w:spacing w:after="80" w:before="200"/>
       </w:pPr>
       <w:r>
         <w:rPr>
@@ -413,7 +459,7 @@
     </w:p>
     <w:p>
       <w:pPr>
-        <w:spacing w:after="40" w:before="0" w:line="240" w:lineRule="auto"/>
+        <w:spacing w:after="60" w:before="120" w:line="269" w:lineRule="auto"/>
         <w:jc w:val="left"/>
       </w:pPr>
       <w:r>
@@ -425,7 +471,7 @@
     </w:p>
     <w:p>
       <w:pPr>
-        <w:spacing w:after="40" w:before="0" w:line="240" w:lineRule="auto"/>
+        <w:spacing w:after="60" w:before="0"/>
       </w:pPr>
       <w:r>
         <w:rPr>
@@ -441,7 +487,7 @@
     </w:p>
     <w:p>
       <w:pPr>
-        <w:spacing w:after="40" w:before="0" w:line="240" w:lineRule="auto"/>
+        <w:spacing w:after="60" w:before="60" w:line="269" w:lineRule="auto"/>
         <w:jc w:val="left"/>
       </w:pPr>
       <w:r>
@@ -454,7 +500,7 @@
     </w:p>
     <w:p>
       <w:pPr>
-        <w:spacing w:after="40" w:before="0" w:line="240" w:lineRule="auto"/>
+        <w:spacing w:after="60" w:before="0" w:line="269" w:lineRule="auto"/>
         <w:jc w:val="left"/>
       </w:pPr>
       <w:r>
@@ -466,7 +512,7 @@
     </w:p>
     <w:p>
       <w:pPr>
-        <w:spacing w:after="40" w:before="0" w:line="240" w:lineRule="auto"/>
+        <w:spacing w:after="60" w:before="0" w:line="269" w:lineRule="auto"/>
         <w:jc w:val="left"/>
       </w:pPr>
       <w:r>
@@ -478,7 +524,7 @@
     </w:p>
     <w:p>
       <w:pPr>
-        <w:spacing w:after="40" w:before="0" w:line="240" w:lineRule="auto"/>
+        <w:spacing w:after="200" w:before="0" w:line="269" w:lineRule="auto"/>
         <w:jc w:val="left"/>
       </w:pPr>
       <w:r>
@@ -495,7 +541,6 @@
         <w:tabs>
           <w:tab w:pos="4896" w:val="left"/>
         </w:tabs>
-        <w:spacing w:line="240" w:lineRule="auto" w:after="40" w:before="0"/>
       </w:pPr>
       <w:r>
         <w:rPr>
@@ -522,7 +567,6 @@
         <w:tabs>
           <w:tab w:pos="4896" w:val="left"/>
         </w:tabs>
-        <w:spacing w:line="240" w:lineRule="auto" w:after="40" w:before="0"/>
       </w:pPr>
       <w:r>
         <w:rPr>
@@ -546,7 +590,7 @@
     </w:p>
     <w:p>
       <w:pPr>
-        <w:spacing w:after="40" w:before="0" w:line="240" w:lineRule="auto"/>
+        <w:spacing w:after="200" w:before="120"/>
       </w:pPr>
       <w:r>
         <w:rPr>
@@ -571,7 +615,7 @@
     </w:p>
     <w:p>
       <w:pPr>
-        <w:spacing w:after="40" w:before="0" w:line="240" w:lineRule="auto"/>
+        <w:spacing w:after="160" w:before="120" w:line="269" w:lineRule="auto"/>
         <w:jc w:val="left"/>
       </w:pPr>
       <w:r>
@@ -583,7 +627,7 @@
     </w:p>
     <w:p>
       <w:pPr>
-        <w:spacing w:after="40" w:before="0" w:line="240" w:lineRule="auto"/>
+        <w:spacing w:after="160" w:before="0" w:line="269" w:lineRule="auto"/>
         <w:jc w:val="left"/>
       </w:pPr>
       <w:r>
@@ -609,7 +653,7 @@
     </w:p>
     <w:p>
       <w:pPr>
-        <w:spacing w:after="40" w:before="0" w:line="240" w:lineRule="auto"/>
+        <w:spacing w:after="160" w:before="0" w:line="269" w:lineRule="auto"/>
         <w:jc w:val="left"/>
       </w:pPr>
       <w:r>
@@ -621,7 +665,7 @@
     </w:p>
     <w:p>
       <w:pPr>
-        <w:spacing w:after="40" w:before="0" w:line="240" w:lineRule="auto"/>
+        <w:spacing w:after="200" w:before="0" w:line="269" w:lineRule="auto"/>
         <w:jc w:val="left"/>
       </w:pPr>
       <w:r>
@@ -633,7 +677,7 @@
     </w:p>
     <w:p>
       <w:pPr>
-        <w:spacing w:after="40" w:before="0" w:line="240" w:lineRule="auto"/>
+        <w:spacing w:after="40" w:before="0" w:line="269" w:lineRule="auto"/>
         <w:jc w:val="left"/>
       </w:pPr>
       <w:r>
@@ -645,7 +689,7 @@
     </w:p>
     <w:p>
       <w:pPr>
-        <w:spacing w:after="40" w:before="0" w:line="240" w:lineRule="auto"/>
+        <w:spacing w:after="0" w:before="240"/>
       </w:pPr>
       <w:r>
         <w:rPr>
@@ -661,7 +705,7 @@
     </w:p>
     <w:p>
       <w:pPr>
-        <w:spacing w:after="40" w:before="0" w:line="240" w:lineRule="auto"/>
+        <w:spacing w:after="60" w:before="0" w:line="269" w:lineRule="auto"/>
         <w:jc w:val="left"/>
       </w:pPr>
       <w:r>
@@ -673,7 +717,6 @@
     </w:p>
     <w:p>
       <w:pPr>
-        <w:spacing w:line="240" w:lineRule="auto" w:after="40" w:before="0"/>
         <w:jc w:val="left"/>
       </w:pPr>
       <w:r>
@@ -688,7 +731,7 @@
     </w:p>
     <w:p>
       <w:pPr>
-        <w:spacing w:after="40" w:before="0" w:line="240" w:lineRule="auto"/>
+        <w:spacing w:after="0" w:before="0" w:line="269" w:lineRule="auto"/>
         <w:jc w:val="left"/>
       </w:pPr>
       <w:r>
@@ -702,7 +745,7 @@
     </w:p>
     <w:p>
       <w:pPr>
-        <w:spacing w:after="40" w:before="0" w:line="240" w:lineRule="auto"/>
+        <w:spacing w:after="200" w:before="0" w:line="269" w:lineRule="auto"/>
         <w:jc w:val="left"/>
       </w:pPr>
       <w:r>
@@ -724,7 +767,6 @@
     </w:p>
     <w:p>
       <w:pPr>
-        <w:spacing w:line="240" w:lineRule="auto" w:after="40" w:before="0"/>
         <w:jc w:val="left"/>
       </w:pPr>
       <w:r>
@@ -747,9 +789,6 @@
       </w:r>
     </w:p>
     <w:p>
-      <w:pPr>
-        <w:spacing w:line="240" w:lineRule="auto" w:after="40" w:before="0"/>
-      </w:pPr>
       <w:r>
         <w:rPr>
           <w:rFonts w:ascii="Calibri" w:hAnsi="Calibri" w:cs="Calibri"/>
@@ -758,6 +797,42 @@
           <w:sz w:val="27"/>
         </w:rPr>
         <w:t>NATIONAL ENERGY EFFICIENCY INNOVATION AWARD</w:t>
+      </w:r>
+    </w:p>
+    <w:p>
+      <w:r>
+        <w:drawing>
+          <wp:inline xmlns:a="http://schemas.openxmlformats.org/drawingml/2006/main" xmlns:pic="http://schemas.openxmlformats.org/drawingml/2006/picture">
+            <wp:extent cx="1800000" cy="1166834"/>
+            <wp:docPr id="2" name="Picture 1002"/>
+            <wp:cNvGraphicFramePr>
+              <a:graphicFrameLocks noChangeAspect="1"/>
+            </wp:cNvGraphicFramePr>
+            <a:graphic>
+              <a:graphicData uri="http://schemas.openxmlformats.org/drawingml/2006/picture">
+                <pic:pic>
+                  <pic:nvPicPr>
+                    <pic:cNvPr id="2" name="cand3.jpg"/>
+                    <pic:cNvPicPr/>
+                  </pic:nvPicPr>
+                  <pic:blipFill>
+                    <a:blip r:embed="rId14"/>
+                    <a:stretch>
+                      <a:fillRect/>
+                    </a:stretch>
+                  </pic:blipFill>
+                  <pic:spPr>
+                    <a:xfrm>
+                      <a:off x="0" y="0"/>
+                      <a:ext cx="1800000" cy="1166834"/>
+                    </a:xfrm>
+                    <a:prstGeom prst="rect"/>
+                  </pic:spPr>
+                </pic:pic>
+              </a:graphicData>
+            </a:graphic>
+          </wp:inline>
+        </w:drawing>
       </w:r>
     </w:p>
     <w:p>

</xml_diff>

<commit_message>
style: tidy regen MAKE LIST table (vertical-center, single line spacing, snug rows)
Cells were top-aligned with an exact ~12pt line spacing and a forced 22.7pt
min row height, making rows loose and uneven. Now vertically centered, single
line spacing, auto row height, and consistent 3pt cell padding.

Co-Authored-By: Claude Opus 4.8 (1M context) <noreply@anthropic.com>
</commit_message>
<xml_diff>
--- a/Regen_Offer_Template.docx
+++ b/Regen_Offer_Template.docx
@@ -14089,8 +14089,10 @@
           <w:insideV w:val="single" w:sz="4" w:space="0" w:color="000000"/>
         </w:tblBorders>
         <w:tblCellMar>
-          <w:left w:w="0" w:type="dxa"/>
-          <w:right w:w="0" w:type="dxa"/>
+          <w:left w:w="108" w:type="dxa"/>
+          <w:right w:w="108" w:type="dxa"/>
+          <w:top w:w="60" w:type="dxa"/>
+          <w:bottom w:w="60" w:type="dxa"/>
         </w:tblCellMar>
         <w:tblLook w:val="01E0" w:firstRow="1" w:lastRow="1" w:firstColumn="1" w:lastColumn="1" w:noHBand="0" w:noVBand="0"/>
       </w:tblPr>
@@ -14100,7 +14102,6 @@
       </w:tblGrid>
       <w:tr>
         <w:trPr>
-          <w:trHeight w:val="454"/>
           <w:jc w:val="center"/>
         </w:trPr>
         <w:tc>
@@ -14119,7 +14120,7 @@
           <w:p>
             <w:pPr>
               <w:pStyle w:val="TableParagraph"/>
-              <w:spacing w:before="4" w:line="242" w:lineRule="exact"/>
+              <w:spacing w:before="60" w:line="240" w:lineRule="auto" w:after="60"/>
               <w:ind w:left="110"/>
               <w:jc w:val="center"/>
               <w:rPr>
@@ -14160,7 +14161,7 @@
           <w:p>
             <w:pPr>
               <w:pStyle w:val="TableParagraph"/>
-              <w:spacing w:before="4" w:line="242" w:lineRule="exact"/>
+              <w:spacing w:before="60" w:line="240" w:lineRule="auto" w:after="60"/>
               <w:ind w:left="110"/>
               <w:jc w:val="center"/>
               <w:rPr>
@@ -14188,7 +14189,6 @@
       </w:tr>
       <w:tr>
         <w:trPr>
-          <w:trHeight w:val="454"/>
           <w:jc w:val="center"/>
         </w:trPr>
         <w:tc>
@@ -14206,7 +14206,7 @@
           <w:p>
             <w:pPr>
               <w:pStyle w:val="TableParagraph"/>
-              <w:spacing w:before="3" w:line="242" w:lineRule="exact"/>
+              <w:spacing w:before="60" w:line="240" w:lineRule="auto" w:after="60"/>
               <w:ind w:left="110"/>
               <w:rPr>
                 <w:sz w:val="24"/>
@@ -14239,7 +14239,7 @@
           <w:p>
             <w:pPr>
               <w:pStyle w:val="TableParagraph"/>
-              <w:spacing w:before="3" w:line="242" w:lineRule="exact"/>
+              <w:spacing w:before="60" w:line="240" w:lineRule="auto" w:after="60"/>
               <w:ind w:left="110"/>
               <w:rPr>
                 <w:sz w:val="24"/>
@@ -14260,7 +14260,6 @@
       </w:tr>
       <w:tr>
         <w:trPr>
-          <w:trHeight w:val="454"/>
           <w:jc w:val="center"/>
         </w:trPr>
         <w:tc>
@@ -14278,7 +14277,7 @@
           <w:p>
             <w:pPr>
               <w:pStyle w:val="TableParagraph"/>
-              <w:spacing w:before="3" w:line="241" w:lineRule="exact"/>
+              <w:spacing w:before="60" w:line="240" w:lineRule="auto" w:after="60"/>
               <w:ind w:left="110"/>
               <w:rPr>
                 <w:sz w:val="24"/>
@@ -14311,7 +14310,7 @@
           <w:p>
             <w:pPr>
               <w:pStyle w:val="TableParagraph"/>
-              <w:spacing w:before="3" w:line="241" w:lineRule="exact"/>
+              <w:spacing w:before="60" w:line="240" w:lineRule="auto" w:after="60"/>
               <w:ind w:left="110"/>
               <w:rPr>
                 <w:sz w:val="24"/>
@@ -14332,7 +14331,6 @@
       </w:tr>
       <w:tr>
         <w:trPr>
-          <w:trHeight w:val="454"/>
           <w:jc w:val="center"/>
         </w:trPr>
         <w:tc>
@@ -14350,7 +14348,7 @@
           <w:p>
             <w:pPr>
               <w:pStyle w:val="TableParagraph"/>
-              <w:spacing w:before="2" w:line="242" w:lineRule="exact"/>
+              <w:spacing w:before="60" w:line="240" w:lineRule="auto" w:after="60"/>
               <w:ind w:left="110"/>
               <w:rPr>
                 <w:sz w:val="24"/>
@@ -14402,7 +14400,7 @@
           <w:p>
             <w:pPr>
               <w:pStyle w:val="TableParagraph"/>
-              <w:spacing w:before="2" w:line="242" w:lineRule="exact"/>
+              <w:spacing w:before="60" w:line="240" w:lineRule="auto" w:after="60"/>
               <w:ind w:left="110"/>
               <w:rPr>
                 <w:sz w:val="24"/>
@@ -14423,7 +14421,6 @@
       </w:tr>
       <w:tr>
         <w:trPr>
-          <w:trHeight w:val="454"/>
           <w:jc w:val="center"/>
         </w:trPr>
         <w:tc>
@@ -14441,7 +14438,7 @@
           <w:p>
             <w:pPr>
               <w:pStyle w:val="TableParagraph"/>
-              <w:spacing w:before="2" w:line="240" w:lineRule="exact"/>
+              <w:spacing w:before="60" w:line="240" w:lineRule="auto" w:after="60"/>
               <w:ind w:left="110"/>
               <w:rPr>
                 <w:sz w:val="24"/>
@@ -14493,7 +14490,7 @@
           <w:p>
             <w:pPr>
               <w:pStyle w:val="TableParagraph"/>
-              <w:spacing w:before="2" w:line="240" w:lineRule="exact"/>
+              <w:spacing w:before="60" w:line="240" w:lineRule="auto" w:after="60"/>
               <w:ind w:left="110"/>
               <w:rPr>
                 <w:sz w:val="24"/>
@@ -14515,7 +14512,6 @@
       </w:tr>
       <w:tr>
         <w:trPr>
-          <w:trHeight w:val="454"/>
           <w:jc w:val="center"/>
         </w:trPr>
         <w:tc>
@@ -14533,7 +14529,7 @@
           <w:p>
             <w:pPr>
               <w:pStyle w:val="TableParagraph"/>
-              <w:spacing w:before="4" w:line="242" w:lineRule="exact"/>
+              <w:spacing w:before="60" w:line="240" w:lineRule="auto" w:after="60"/>
               <w:ind w:left="110"/>
               <w:rPr>
                 <w:sz w:val="24"/>
@@ -14566,7 +14562,7 @@
           <w:p>
             <w:pPr>
               <w:pStyle w:val="TableParagraph"/>
-              <w:spacing w:before="4" w:line="242" w:lineRule="exact"/>
+              <w:spacing w:before="60" w:line="240" w:lineRule="auto" w:after="60"/>
               <w:ind w:left="110"/>
               <w:rPr>
                 <w:sz w:val="24"/>
@@ -14607,7 +14603,6 @@
       </w:tr>
       <w:tr>
         <w:trPr>
-          <w:trHeight w:val="454"/>
           <w:jc w:val="center"/>
         </w:trPr>
         <w:tc>
@@ -14625,7 +14620,7 @@
           <w:p>
             <w:pPr>
               <w:pStyle w:val="TableParagraph"/>
-              <w:spacing w:before="4" w:line="240" w:lineRule="exact"/>
+              <w:spacing w:before="60" w:line="240" w:lineRule="auto" w:after="60"/>
               <w:ind w:left="110"/>
               <w:rPr>
                 <w:sz w:val="24"/>
@@ -14677,7 +14672,7 @@
           <w:p>
             <w:pPr>
               <w:pStyle w:val="TableParagraph"/>
-              <w:spacing w:before="4" w:line="240" w:lineRule="exact"/>
+              <w:spacing w:before="60" w:line="240" w:lineRule="auto" w:after="60"/>
               <w:ind w:left="110"/>
               <w:rPr>
                 <w:sz w:val="24"/>
@@ -14698,7 +14693,6 @@
       </w:tr>
       <w:tr>
         <w:trPr>
-          <w:trHeight w:val="680"/>
           <w:jc w:val="center"/>
         </w:trPr>
         <w:tc>
@@ -14716,7 +14710,7 @@
           <w:p>
             <w:pPr>
               <w:pStyle w:val="TableParagraph"/>
-              <w:spacing w:before="2"/>
+              <w:spacing w:before="60" w:line="240" w:lineRule="auto" w:after="60"/>
               <w:ind w:left="110"/>
               <w:rPr>
                 <w:sz w:val="24"/>
@@ -14803,7 +14797,7 @@
           <w:p>
             <w:pPr>
               <w:pStyle w:val="TableParagraph"/>
-              <w:spacing w:before="8" w:line="240" w:lineRule="exact"/>
+              <w:spacing w:before="60" w:line="240" w:lineRule="auto" w:after="60"/>
               <w:ind w:left="110"/>
               <w:rPr>
                 <w:sz w:val="24"/>
@@ -14871,7 +14865,7 @@
           <w:p>
             <w:pPr>
               <w:pStyle w:val="TableParagraph"/>
-              <w:spacing w:before="2"/>
+              <w:spacing w:before="60" w:line="240" w:lineRule="auto" w:after="60"/>
               <w:ind w:left="110"/>
               <w:rPr>
                 <w:sz w:val="24"/>
@@ -14919,7 +14913,6 @@
       </w:tr>
       <w:tr>
         <w:trPr>
-          <w:trHeight w:val="454"/>
           <w:jc w:val="center"/>
         </w:trPr>
         <w:tc>
@@ -14937,7 +14930,7 @@
           <w:p>
             <w:pPr>
               <w:pStyle w:val="TableParagraph"/>
-              <w:spacing w:before="4" w:line="242" w:lineRule="exact"/>
+              <w:spacing w:before="60" w:line="240" w:lineRule="auto" w:after="60"/>
               <w:ind w:left="110"/>
               <w:rPr>
                 <w:sz w:val="24"/>
@@ -14989,7 +14982,7 @@
           <w:p>
             <w:pPr>
               <w:pStyle w:val="TableParagraph"/>
-              <w:spacing w:before="4" w:line="242" w:lineRule="exact"/>
+              <w:spacing w:before="60" w:line="240" w:lineRule="auto" w:after="60"/>
               <w:ind w:left="110"/>
               <w:rPr>
                 <w:sz w:val="24"/>
@@ -15010,7 +15003,6 @@
       </w:tr>
       <w:tr>
         <w:trPr>
-          <w:trHeight w:val="454"/>
           <w:jc w:val="center"/>
         </w:trPr>
         <w:tc>
@@ -15028,7 +15020,7 @@
           <w:p>
             <w:pPr>
               <w:pStyle w:val="TableParagraph"/>
-              <w:spacing w:before="3" w:line="241" w:lineRule="exact"/>
+              <w:spacing w:before="60" w:line="240" w:lineRule="auto" w:after="60"/>
               <w:ind w:left="110"/>
               <w:rPr>
                 <w:sz w:val="24"/>
@@ -15080,7 +15072,7 @@
           <w:p>
             <w:pPr>
               <w:pStyle w:val="TableParagraph"/>
-              <w:spacing w:before="3" w:line="241" w:lineRule="exact"/>
+              <w:spacing w:before="60" w:line="240" w:lineRule="auto" w:after="60"/>
               <w:ind w:left="110"/>
               <w:rPr>
                 <w:sz w:val="24"/>
@@ -15120,7 +15112,6 @@
       </w:tr>
       <w:tr>
         <w:trPr>
-          <w:trHeight w:val="454"/>
           <w:jc w:val="center"/>
         </w:trPr>
         <w:tc>
@@ -15138,7 +15129,7 @@
           <w:p>
             <w:pPr>
               <w:pStyle w:val="TableParagraph"/>
-              <w:spacing w:before="2" w:line="242" w:lineRule="exact"/>
+              <w:spacing w:before="60" w:line="240" w:lineRule="auto" w:after="60"/>
               <w:ind w:left="110"/>
               <w:rPr>
                 <w:sz w:val="24"/>
@@ -15171,7 +15162,7 @@
           <w:p>
             <w:pPr>
               <w:pStyle w:val="TableParagraph"/>
-              <w:spacing w:before="2" w:line="242" w:lineRule="exact"/>
+              <w:spacing w:before="60" w:line="240" w:lineRule="auto" w:after="60"/>
               <w:ind w:left="109"/>
               <w:rPr>
                 <w:sz w:val="24"/>
@@ -15191,7 +15182,6 @@
       </w:tr>
       <w:tr>
         <w:trPr>
-          <w:trHeight w:val="454"/>
           <w:jc w:val="center"/>
         </w:trPr>
         <w:tc>
@@ -15209,7 +15199,7 @@
           <w:p>
             <w:pPr>
               <w:pStyle w:val="TableParagraph"/>
-              <w:spacing w:before="2" w:line="242" w:lineRule="exact"/>
+              <w:spacing w:before="60" w:line="240" w:lineRule="auto" w:after="60"/>
               <w:ind w:left="110"/>
               <w:rPr>
                 <w:sz w:val="24"/>
@@ -15261,7 +15251,7 @@
           <w:p>
             <w:pPr>
               <w:pStyle w:val="TableParagraph"/>
-              <w:spacing w:before="2" w:line="242" w:lineRule="exact"/>
+              <w:spacing w:before="60" w:line="240" w:lineRule="auto" w:after="60"/>
               <w:ind w:left="110"/>
               <w:rPr>
                 <w:sz w:val="24"/>
@@ -15281,7 +15271,6 @@
       </w:tr>
       <w:tr>
         <w:trPr>
-          <w:trHeight w:val="454"/>
           <w:jc w:val="center"/>
         </w:trPr>
         <w:tc>
@@ -15299,7 +15288,7 @@
           <w:p>
             <w:pPr>
               <w:pStyle w:val="TableParagraph"/>
-              <w:spacing w:before="3" w:line="241" w:lineRule="exact"/>
+              <w:spacing w:before="60" w:line="240" w:lineRule="auto" w:after="60"/>
               <w:ind w:left="110"/>
               <w:rPr>
                 <w:sz w:val="24"/>
@@ -15332,7 +15321,7 @@
           <w:p>
             <w:pPr>
               <w:pStyle w:val="TableParagraph"/>
-              <w:spacing w:before="3" w:line="241" w:lineRule="exact"/>
+              <w:spacing w:before="60" w:line="240" w:lineRule="auto" w:after="60"/>
               <w:ind w:left="110"/>
               <w:rPr>
                 <w:sz w:val="24"/>
@@ -15362,7 +15351,6 @@
       </w:tr>
       <w:tr>
         <w:trPr>
-          <w:trHeight w:val="454"/>
           <w:jc w:val="center"/>
         </w:trPr>
         <w:tc>
@@ -15380,7 +15368,7 @@
           <w:p>
             <w:pPr>
               <w:pStyle w:val="TableParagraph"/>
-              <w:spacing w:before="3" w:line="242" w:lineRule="exact"/>
+              <w:spacing w:before="60" w:line="240" w:lineRule="auto" w:after="60"/>
               <w:ind w:left="110"/>
               <w:rPr>
                 <w:sz w:val="24"/>
@@ -15422,7 +15410,7 @@
           <w:p>
             <w:pPr>
               <w:pStyle w:val="TableParagraph"/>
-              <w:spacing w:before="3" w:line="242" w:lineRule="exact"/>
+              <w:spacing w:before="60" w:line="240" w:lineRule="auto" w:after="60"/>
               <w:ind w:left="110"/>
               <w:rPr>
                 <w:sz w:val="24"/>
@@ -15460,7 +15448,6 @@
       </w:tr>
       <w:tr>
         <w:trPr>
-          <w:trHeight w:val="454"/>
           <w:jc w:val="center"/>
         </w:trPr>
         <w:tc>
@@ -15478,7 +15465,7 @@
           <w:p>
             <w:pPr>
               <w:pStyle w:val="TableParagraph"/>
-              <w:spacing w:before="4" w:line="241" w:lineRule="exact"/>
+              <w:spacing w:before="60" w:line="240" w:lineRule="auto" w:after="60"/>
               <w:rPr>
                 <w:sz w:val="24"/>
                 <w:szCs w:val="24"/>
@@ -15548,7 +15535,7 @@
           <w:p>
             <w:pPr>
               <w:pStyle w:val="TableParagraph"/>
-              <w:spacing w:before="4" w:line="241" w:lineRule="exact"/>
+              <w:spacing w:before="60" w:line="240" w:lineRule="auto" w:after="60"/>
               <w:ind w:left="110"/>
               <w:rPr>
                 <w:sz w:val="24"/>
@@ -15569,7 +15556,6 @@
       </w:tr>
       <w:tr>
         <w:trPr>
-          <w:trHeight w:val="454"/>
           <w:jc w:val="center"/>
         </w:trPr>
         <w:tc>
@@ -15587,7 +15573,7 @@
           <w:p>
             <w:pPr>
               <w:pStyle w:val="TableParagraph"/>
-              <w:spacing w:before="4" w:line="242" w:lineRule="exact"/>
+              <w:spacing w:before="60" w:line="240" w:lineRule="auto" w:after="60"/>
               <w:ind w:left="110"/>
               <w:rPr>
                 <w:sz w:val="24"/>
@@ -15620,7 +15606,7 @@
           <w:p>
             <w:pPr>
               <w:pStyle w:val="TableParagraph"/>
-              <w:spacing w:before="4" w:line="242" w:lineRule="exact"/>
+              <w:spacing w:before="60" w:line="240" w:lineRule="auto" w:after="60"/>
               <w:ind w:left="110"/>
               <w:rPr>
                 <w:sz w:val="24"/>
@@ -15641,7 +15627,6 @@
       </w:tr>
       <w:tr>
         <w:trPr>
-          <w:trHeight w:val="454"/>
           <w:jc w:val="center"/>
         </w:trPr>
         <w:tc>
@@ -15659,7 +15644,7 @@
           <w:p>
             <w:pPr>
               <w:pStyle w:val="TableParagraph"/>
-              <w:spacing w:before="2" w:line="243" w:lineRule="exact"/>
+              <w:spacing w:before="60" w:line="240" w:lineRule="auto" w:after="60"/>
               <w:ind w:left="110"/>
               <w:rPr>
                 <w:sz w:val="24"/>
@@ -15749,7 +15734,7 @@
           <w:p>
             <w:pPr>
               <w:pStyle w:val="TableParagraph"/>
-              <w:spacing w:before="2" w:line="243" w:lineRule="exact"/>
+              <w:spacing w:before="60" w:line="240" w:lineRule="auto" w:after="60"/>
               <w:ind w:left="110"/>
               <w:rPr>
                 <w:sz w:val="24"/>
@@ -15772,7 +15757,6 @@
       </w:tr>
       <w:tr>
         <w:trPr>
-          <w:trHeight w:val="454"/>
           <w:jc w:val="center"/>
         </w:trPr>
         <w:tc>
@@ -15789,7 +15773,7 @@
           <w:p>
             <w:pPr>
               <w:pStyle w:val="TableParagraph"/>
-              <w:spacing w:before="2" w:line="243" w:lineRule="exact"/>
+              <w:spacing w:before="60" w:line="240" w:lineRule="auto" w:after="60"/>
               <w:ind w:left="110"/>
               <w:rPr>
                 <w:w w:val="105"/>
@@ -15822,7 +15806,7 @@
           <w:p>
             <w:pPr>
               <w:pStyle w:val="TableParagraph"/>
-              <w:spacing w:before="2" w:line="243" w:lineRule="exact"/>
+              <w:spacing w:before="60" w:line="240" w:lineRule="auto" w:after="60"/>
               <w:ind w:left="110"/>
               <w:rPr>
                 <w:w w:val="105"/>
@@ -15846,7 +15830,6 @@
       </w:tr>
       <w:tr>
         <w:trPr>
-          <w:trHeight w:val="454"/>
           <w:jc w:val="center"/>
         </w:trPr>
         <w:tc>
@@ -15863,7 +15846,7 @@
           <w:p>
             <w:pPr>
               <w:pStyle w:val="TableParagraph"/>
-              <w:spacing w:before="2" w:line="243" w:lineRule="exact"/>
+              <w:spacing w:before="60" w:line="240" w:lineRule="auto" w:after="60"/>
               <w:ind w:left="110"/>
               <w:rPr>
                 <w:w w:val="105"/>
@@ -15898,7 +15881,7 @@
           <w:p>
             <w:pPr>
               <w:pStyle w:val="TableParagraph"/>
-              <w:spacing w:before="2" w:line="243" w:lineRule="exact"/>
+              <w:spacing w:before="60" w:line="240" w:lineRule="auto" w:after="60"/>
               <w:ind w:left="110"/>
               <w:rPr>
                 <w:w w:val="105"/>
@@ -15929,7 +15912,6 @@
       </w:tr>
       <w:tr>
         <w:trPr>
-          <w:trHeight w:val="454"/>
           <w:jc w:val="center"/>
         </w:trPr>
         <w:tc>
@@ -15946,7 +15928,7 @@
           <w:p>
             <w:pPr>
               <w:pStyle w:val="TableParagraph"/>
-              <w:spacing w:before="2" w:line="243" w:lineRule="exact"/>
+              <w:spacing w:before="60" w:line="240" w:lineRule="auto" w:after="60"/>
               <w:ind w:left="110"/>
               <w:rPr>
                 <w:w w:val="105"/>
@@ -15979,7 +15961,7 @@
           <w:p>
             <w:pPr>
               <w:pStyle w:val="TableParagraph"/>
-              <w:spacing w:before="2" w:line="243" w:lineRule="exact"/>
+              <w:spacing w:before="60" w:line="240" w:lineRule="auto" w:after="60"/>
               <w:ind w:left="110"/>
               <w:rPr>
                 <w:w w:val="105"/>
@@ -16001,7 +15983,6 @@
       </w:tr>
       <w:tr>
         <w:trPr>
-          <w:trHeight w:val="454"/>
           <w:jc w:val="center"/>
         </w:trPr>
         <w:tc>
@@ -16018,7 +15999,7 @@
           <w:p>
             <w:pPr>
               <w:pStyle w:val="TableParagraph"/>
-              <w:spacing w:before="2" w:line="243" w:lineRule="exact"/>
+              <w:spacing w:before="60" w:line="240" w:lineRule="auto" w:after="60"/>
               <w:ind w:left="110"/>
               <w:rPr>
                 <w:w w:val="105"/>
@@ -16060,7 +16041,7 @@
           <w:p>
             <w:pPr>
               <w:pStyle w:val="TableParagraph"/>
-              <w:spacing w:before="2" w:line="243" w:lineRule="exact"/>
+              <w:spacing w:before="60" w:line="240" w:lineRule="auto" w:after="60"/>
               <w:ind w:left="110"/>
               <w:rPr>
                 <w:w w:val="105"/>
@@ -16082,7 +16063,6 @@
       </w:tr>
       <w:tr>
         <w:trPr>
-          <w:trHeight w:val="454"/>
           <w:jc w:val="center"/>
         </w:trPr>
         <w:tc>
@@ -16099,7 +16079,7 @@
           <w:p>
             <w:pPr>
               <w:pStyle w:val="TableParagraph"/>
-              <w:spacing w:before="2" w:line="243" w:lineRule="exact"/>
+              <w:spacing w:before="60" w:line="240" w:lineRule="auto" w:after="60"/>
               <w:ind w:left="110"/>
               <w:rPr>
                 <w:w w:val="105"/>
@@ -16132,7 +16112,7 @@
           <w:p>
             <w:pPr>
               <w:pStyle w:val="TableParagraph"/>
-              <w:spacing w:before="2" w:line="243" w:lineRule="exact"/>
+              <w:spacing w:before="60" w:line="240" w:lineRule="auto" w:after="60"/>
               <w:ind w:left="110"/>
               <w:rPr>
                 <w:w w:val="105"/>
@@ -16154,7 +16134,6 @@
       </w:tr>
       <w:tr>
         <w:trPr>
-          <w:trHeight w:val="454"/>
           <w:jc w:val="center"/>
         </w:trPr>
         <w:tc>
@@ -16171,7 +16150,7 @@
           <w:p>
             <w:pPr>
               <w:pStyle w:val="TableParagraph"/>
-              <w:spacing w:before="2" w:line="243" w:lineRule="exact"/>
+              <w:spacing w:before="60" w:line="240" w:lineRule="auto" w:after="60"/>
               <w:ind w:left="110"/>
               <w:rPr>
                 <w:w w:val="105"/>
@@ -16204,7 +16183,7 @@
           <w:p>
             <w:pPr>
               <w:pStyle w:val="TableParagraph"/>
-              <w:spacing w:before="2" w:line="243" w:lineRule="exact"/>
+              <w:spacing w:before="60" w:line="240" w:lineRule="auto" w:after="60"/>
               <w:ind w:left="110"/>
               <w:rPr>
                 <w:w w:val="105"/>
@@ -16235,7 +16214,6 @@
       </w:tr>
       <w:tr>
         <w:trPr>
-          <w:trHeight w:val="454"/>
           <w:jc w:val="center"/>
         </w:trPr>
         <w:tc>
@@ -16252,7 +16230,7 @@
           <w:p>
             <w:pPr>
               <w:pStyle w:val="TableParagraph"/>
-              <w:spacing w:before="2" w:line="243" w:lineRule="exact"/>
+              <w:spacing w:before="60" w:line="240" w:lineRule="auto" w:after="60"/>
               <w:ind w:left="110"/>
               <w:rPr>
                 <w:w w:val="105"/>
@@ -16285,7 +16263,7 @@
           <w:p>
             <w:pPr>
               <w:pStyle w:val="TableParagraph"/>
-              <w:spacing w:before="2" w:line="243" w:lineRule="exact"/>
+              <w:spacing w:before="60" w:line="240" w:lineRule="auto" w:after="60"/>
               <w:ind w:left="110"/>
               <w:rPr>
                 <w:w w:val="105"/>
@@ -16336,7 +16314,6 @@
       </w:tr>
       <w:tr>
         <w:trPr>
-          <w:trHeight w:val="454"/>
           <w:jc w:val="center"/>
         </w:trPr>
         <w:tc>
@@ -16353,7 +16330,7 @@
           <w:p>
             <w:pPr>
               <w:pStyle w:val="TableParagraph"/>
-              <w:spacing w:before="2" w:line="243" w:lineRule="exact"/>
+              <w:spacing w:before="60" w:line="240" w:lineRule="auto" w:after="60"/>
               <w:ind w:left="110"/>
               <w:rPr>
                 <w:w w:val="105"/>
@@ -16386,7 +16363,7 @@
           <w:p>
             <w:pPr>
               <w:pStyle w:val="TableParagraph"/>
-              <w:spacing w:before="2" w:line="243" w:lineRule="exact"/>
+              <w:spacing w:before="60" w:line="240" w:lineRule="auto" w:after="60"/>
               <w:ind w:left="110"/>
               <w:rPr>
                 <w:w w:val="105"/>
@@ -16408,7 +16385,6 @@
       </w:tr>
       <w:tr>
         <w:trPr>
-          <w:trHeight w:val="454"/>
           <w:jc w:val="center"/>
         </w:trPr>
         <w:tc>
@@ -16425,7 +16401,7 @@
           <w:p>
             <w:pPr>
               <w:pStyle w:val="TableParagraph"/>
-              <w:spacing w:before="2" w:line="243" w:lineRule="exact"/>
+              <w:spacing w:before="60" w:line="240" w:lineRule="auto" w:after="60"/>
               <w:ind w:left="110"/>
               <w:rPr>
                 <w:w w:val="105"/>
@@ -16458,7 +16434,7 @@
           <w:p>
             <w:pPr>
               <w:pStyle w:val="TableParagraph"/>
-              <w:spacing w:before="2" w:line="243" w:lineRule="exact"/>
+              <w:spacing w:before="60" w:line="240" w:lineRule="auto" w:after="60"/>
               <w:ind w:left="110"/>
               <w:rPr>
                 <w:w w:val="105"/>

</xml_diff>

<commit_message>
style: uniform regen table borders + drop orange underlines under ITEMS/MAKE
- Supervision table used sz6 borders vs sz4 elsewhere; standardized every
  bordered offer table to sz4 (auto) so gridlines are uniform.
- Removed the orange paragraph-bottom-border lines under the MAKE LIST 'ITEMS'
  and 'MAKE' header cells.

Co-Authored-By: Claude Opus 4.8 (1M context) <noreply@anthropic.com>
</commit_message>
<xml_diff>
--- a/Regen_Offer_Template.docx
+++ b/Regen_Offer_Template.docx
@@ -1301,12 +1301,12 @@
         <w:tblLayout w:type="fixed"/>
         <w:tblLook w:val="04A0" w:firstRow="1" w:lastRow="0" w:firstColumn="1" w:lastColumn="0" w:noHBand="0" w:noVBand="1"/>
         <w:tblBorders>
-          <w:top w:val="single" w:sz="4" w:space="0" w:color="000000"/>
-          <w:left w:val="single" w:sz="4" w:space="0" w:color="000000"/>
-          <w:bottom w:val="single" w:sz="4" w:space="0" w:color="000000"/>
-          <w:right w:val="single" w:sz="4" w:space="0" w:color="000000"/>
-          <w:insideH w:val="single" w:sz="4" w:space="0" w:color="000000"/>
-          <w:insideV w:val="single" w:sz="4" w:space="0" w:color="000000"/>
+          <w:top w:val="single" w:sz="4" w:space="0" w:color="auto"/>
+          <w:left w:val="single" w:sz="4" w:space="0" w:color="auto"/>
+          <w:bottom w:val="single" w:sz="4" w:space="0" w:color="auto"/>
+          <w:right w:val="single" w:sz="4" w:space="0" w:color="auto"/>
+          <w:insideH w:val="single" w:sz="4" w:space="0" w:color="auto"/>
+          <w:insideV w:val="single" w:sz="4" w:space="0" w:color="auto"/>
         </w:tblBorders>
       </w:tblPr>
       <w:tblGrid>
@@ -4620,12 +4620,12 @@
       <w:tblPr>
         <w:tblW w:w="5000" w:type="pct"/>
         <w:tblBorders>
-          <w:top w:val="single" w:sz="4" w:space="0" w:color="000000"/>
-          <w:left w:val="single" w:sz="4" w:space="0" w:color="000000"/>
-          <w:bottom w:val="single" w:sz="4" w:space="0" w:color="000000"/>
-          <w:right w:val="single" w:sz="4" w:space="0" w:color="000000"/>
-          <w:insideH w:val="single" w:sz="4" w:space="0" w:color="000000"/>
-          <w:insideV w:val="single" w:sz="4" w:space="0" w:color="000000"/>
+          <w:top w:val="single" w:sz="4" w:space="0" w:color="auto"/>
+          <w:left w:val="single" w:sz="4" w:space="0" w:color="auto"/>
+          <w:bottom w:val="single" w:sz="4" w:space="0" w:color="auto"/>
+          <w:right w:val="single" w:sz="4" w:space="0" w:color="auto"/>
+          <w:insideH w:val="single" w:sz="4" w:space="0" w:color="auto"/>
+          <w:insideV w:val="single" w:sz="4" w:space="0" w:color="auto"/>
         </w:tblBorders>
         <w:tblCellMar>
           <w:left w:w="0" w:type="dxa"/>
@@ -14081,12 +14081,12 @@
         <w:tblW w:w="5000" w:type="pct"/>
         <w:jc w:val="center"/>
         <w:tblBorders>
-          <w:top w:val="single" w:sz="4" w:space="0" w:color="000000"/>
-          <w:left w:val="single" w:sz="4" w:space="0" w:color="000000"/>
-          <w:bottom w:val="single" w:sz="4" w:space="0" w:color="000000"/>
-          <w:right w:val="single" w:sz="4" w:space="0" w:color="000000"/>
-          <w:insideH w:val="single" w:sz="4" w:space="0" w:color="000000"/>
-          <w:insideV w:val="single" w:sz="4" w:space="0" w:color="000000"/>
+          <w:top w:val="single" w:sz="4" w:space="0" w:color="auto"/>
+          <w:left w:val="single" w:sz="4" w:space="0" w:color="auto"/>
+          <w:bottom w:val="single" w:sz="4" w:space="0" w:color="auto"/>
+          <w:right w:val="single" w:sz="4" w:space="0" w:color="auto"/>
+          <w:insideH w:val="single" w:sz="4" w:space="0" w:color="auto"/>
+          <w:insideV w:val="single" w:sz="4" w:space="0" w:color="auto"/>
         </w:tblBorders>
         <w:tblCellMar>
           <w:left w:w="108" w:type="dxa"/>
@@ -14128,9 +14128,6 @@
                 <w:sz w:val="24"/>
                 <w:szCs w:val="24"/>
               </w:rPr>
-              <w:pBdr>
-                <w:bottom w:val="single" w:color="E87722" w:sz="12" w:space="4"/>
-              </w:pBdr>
             </w:pPr>
             <w:r>
               <w:rPr>
@@ -14169,9 +14166,6 @@
                 <w:sz w:val="24"/>
                 <w:szCs w:val="24"/>
               </w:rPr>
-              <w:pBdr>
-                <w:bottom w:val="single" w:color="E87722" w:sz="12" w:space="4"/>
-              </w:pBdr>
             </w:pPr>
             <w:r>
               <w:rPr>
@@ -17198,12 +17192,12 @@
       <w:tblPr>
         <w:tblW w:type="dxa" w:w="9360"/>
         <w:tblBorders>
-          <w:top w:val="single" w:sz="6" w:color="auto"/>
-          <w:left w:val="single" w:sz="6" w:color="auto"/>
-          <w:bottom w:val="single" w:sz="6" w:color="auto"/>
-          <w:right w:val="single" w:sz="6" w:color="auto"/>
-          <w:insideH w:val="single" w:sz="6" w:color="auto"/>
-          <w:insideV w:val="single" w:sz="6" w:color="auto"/>
+          <w:top w:val="single" w:sz="4" w:color="auto"/>
+          <w:left w:val="single" w:sz="4" w:color="auto"/>
+          <w:bottom w:val="single" w:sz="4" w:color="auto"/>
+          <w:right w:val="single" w:sz="4" w:color="auto"/>
+          <w:insideH w:val="single" w:sz="4" w:color="auto"/>
+          <w:insideV w:val="single" w:sz="4" w:color="auto"/>
         </w:tblBorders>
       </w:tblPr>
       <w:tblGrid>

</xml_diff>

<commit_message>
style: match T&C + ROI table widths, left-align ROI headings, separate tables
- Both Terms & Conditions and ROI tables set to the same 9740-twip width
  (fixed layout), so they line up.
- ROI section headings (ROI / Furnace Size / Retrofit Cost / Saving / Extra
  Costs) left-aligned instead of centered.
- Inserted a blank paragraph between the two previously-adjacent tables, which
  removes the phantom empty row Word rendered between them.

Co-Authored-By: Claude Opus 4.8 (1M context) <noreply@anthropic.com>
</commit_message>
<xml_diff>
--- a/Regen_Offer_Template.docx
+++ b/Regen_Offer_Template.docx
@@ -17290,11 +17290,8 @@
     </w:p>
     <w:tbl>
       <w:tblPr>
-        <w:tblW w:type="auto" w:w="0"/>
         <w:jc w:val="center"/>
-        <w:tblLayout w:type="fixed"/>
         <w:tblLook w:firstColumn="1" w:firstRow="1" w:lastColumn="0" w:lastRow="0" w:noHBand="0" w:noVBand="1" w:val="04A0"/>
-        <w:tblLayout w:type="fixed"/>
         <w:tblBorders>
           <w:top w:val="single" w:sz="4" w:space="0" w:color="auto"/>
           <w:left w:val="single" w:sz="4" w:space="0" w:color="auto"/>
@@ -17303,17 +17300,19 @@
           <w:insideH w:val="single" w:sz="4" w:space="0" w:color="auto"/>
           <w:insideV w:val="single" w:sz="4" w:space="0" w:color="auto"/>
         </w:tblBorders>
+        <w:tblW w:w="9740" w:type="dxa"/>
+        <w:tblLayout w:type="fixed"/>
       </w:tblPr>
       <w:tblGrid>
-        <w:gridCol w:w="4870"/>
-        <w:gridCol w:w="4870"/>
+        <w:gridCol w:w="2600"/>
+        <w:gridCol w:w="7140"/>
       </w:tblGrid>
       <w:tr>
         <w:tc>
           <w:tcPr>
-            <w:tcW w:type="dxa" w:w="2600"/>
             <w:vAlign w:val="top"/>
             <w:shd w:val="clear" w:color="auto" w:fill="F3F4F6"/>
+            <w:tcW w:w="2600" w:type="dxa"/>
           </w:tcPr>
           <w:p>
             <w:pPr>
@@ -17332,8 +17331,8 @@
         </w:tc>
         <w:tc>
           <w:tcPr>
-            <w:tcW w:type="dxa" w:w="6760"/>
             <w:vAlign w:val="top"/>
+            <w:tcW w:w="7140" w:type="dxa"/>
           </w:tcPr>
           <w:p>
             <w:pPr>
@@ -17353,9 +17352,9 @@
       <w:tr>
         <w:tc>
           <w:tcPr>
-            <w:tcW w:type="dxa" w:w="2600"/>
             <w:vAlign w:val="top"/>
             <w:shd w:val="clear" w:color="auto" w:fill="F3F4F6"/>
+            <w:tcW w:w="2600" w:type="dxa"/>
           </w:tcPr>
           <w:p>
             <w:pPr>
@@ -17374,8 +17373,8 @@
         </w:tc>
         <w:tc>
           <w:tcPr>
-            <w:tcW w:type="dxa" w:w="6760"/>
             <w:vAlign w:val="top"/>
+            <w:tcW w:w="7140" w:type="dxa"/>
           </w:tcPr>
           <w:p>
             <w:pPr>
@@ -17408,9 +17407,9 @@
       <w:tr>
         <w:tc>
           <w:tcPr>
-            <w:tcW w:type="dxa" w:w="2600"/>
             <w:vAlign w:val="top"/>
             <w:shd w:val="clear" w:color="auto" w:fill="F3F4F6"/>
+            <w:tcW w:w="2600" w:type="dxa"/>
           </w:tcPr>
           <w:p>
             <w:pPr>
@@ -17429,8 +17428,8 @@
         </w:tc>
         <w:tc>
           <w:tcPr>
-            <w:tcW w:type="dxa" w:w="6760"/>
             <w:vAlign w:val="top"/>
+            <w:tcW w:w="7140" w:type="dxa"/>
           </w:tcPr>
           <w:p>
             <w:pPr>
@@ -17489,9 +17488,9 @@
       <w:tr>
         <w:tc>
           <w:tcPr>
-            <w:tcW w:type="dxa" w:w="2600"/>
             <w:vAlign w:val="top"/>
             <w:shd w:val="clear" w:color="auto" w:fill="F3F4F6"/>
+            <w:tcW w:w="2600" w:type="dxa"/>
           </w:tcPr>
           <w:p>
             <w:pPr>
@@ -17510,8 +17509,8 @@
         </w:tc>
         <w:tc>
           <w:tcPr>
-            <w:tcW w:type="dxa" w:w="6760"/>
             <w:vAlign w:val="top"/>
+            <w:tcW w:w="7140" w:type="dxa"/>
           </w:tcPr>
           <w:p>
             <w:pPr>
@@ -17531,9 +17530,9 @@
       <w:tr>
         <w:tc>
           <w:tcPr>
-            <w:tcW w:type="dxa" w:w="2600"/>
             <w:vAlign w:val="top"/>
             <w:shd w:val="clear" w:color="auto" w:fill="F3F4F6"/>
+            <w:tcW w:w="2600" w:type="dxa"/>
           </w:tcPr>
           <w:p>
             <w:pPr>
@@ -17552,8 +17551,8 @@
         </w:tc>
         <w:tc>
           <w:tcPr>
-            <w:tcW w:type="dxa" w:w="6760"/>
             <w:vAlign w:val="top"/>
+            <w:tcW w:w="7140" w:type="dxa"/>
           </w:tcPr>
           <w:p>
             <w:pPr>
@@ -17573,9 +17572,9 @@
       <w:tr>
         <w:tc>
           <w:tcPr>
-            <w:tcW w:type="dxa" w:w="2600"/>
             <w:vAlign w:val="top"/>
             <w:shd w:val="clear" w:color="auto" w:fill="F3F4F6"/>
+            <w:tcW w:w="2600" w:type="dxa"/>
           </w:tcPr>
           <w:p>
             <w:pPr>
@@ -17594,8 +17593,8 @@
         </w:tc>
         <w:tc>
           <w:tcPr>
-            <w:tcW w:type="dxa" w:w="6760"/>
             <w:vAlign w:val="top"/>
+            <w:tcW w:w="7140" w:type="dxa"/>
           </w:tcPr>
           <w:p>
             <w:pPr>
@@ -17628,9 +17627,9 @@
       <w:tr>
         <w:tc>
           <w:tcPr>
-            <w:tcW w:type="dxa" w:w="2600"/>
             <w:vAlign w:val="top"/>
             <w:shd w:val="clear" w:color="auto" w:fill="F3F4F6"/>
+            <w:tcW w:w="2600" w:type="dxa"/>
           </w:tcPr>
           <w:p>
             <w:pPr>
@@ -17649,8 +17648,8 @@
         </w:tc>
         <w:tc>
           <w:tcPr>
-            <w:tcW w:type="dxa" w:w="6760"/>
             <w:vAlign w:val="top"/>
+            <w:tcW w:w="7140" w:type="dxa"/>
           </w:tcPr>
           <w:p>
             <w:pPr>
@@ -17670,9 +17669,9 @@
       <w:tr>
         <w:tc>
           <w:tcPr>
-            <w:tcW w:type="dxa" w:w="2600"/>
             <w:vAlign w:val="top"/>
             <w:shd w:val="clear" w:color="auto" w:fill="F3F4F6"/>
+            <w:tcW w:w="2600" w:type="dxa"/>
           </w:tcPr>
           <w:p>
             <w:pPr>
@@ -17691,8 +17690,8 @@
         </w:tc>
         <w:tc>
           <w:tcPr>
-            <w:tcW w:type="dxa" w:w="6760"/>
             <w:vAlign w:val="top"/>
+            <w:tcW w:w="7140" w:type="dxa"/>
           </w:tcPr>
           <w:p>
             <w:pPr>
@@ -17712,9 +17711,9 @@
       <w:tr>
         <w:tc>
           <w:tcPr>
-            <w:tcW w:type="dxa" w:w="2600"/>
             <w:vAlign w:val="top"/>
             <w:shd w:val="clear" w:color="auto" w:fill="F3F4F6"/>
+            <w:tcW w:w="2600" w:type="dxa"/>
           </w:tcPr>
           <w:p>
             <w:pPr>
@@ -17733,8 +17732,8 @@
         </w:tc>
         <w:tc>
           <w:tcPr>
-            <w:tcW w:type="dxa" w:w="6760"/>
             <w:vAlign w:val="top"/>
+            <w:tcW w:w="7140" w:type="dxa"/>
           </w:tcPr>
           <w:p>
             <w:pPr>
@@ -17778,18 +17777,20 @@
         </w:tc>
       </w:tr>
     </w:tbl>
+    <w:p/>
     <w:tbl>
       <w:tblPr>
-        <w:tblW w:w="8713" w:type="dxa"/>
         <w:jc w:val="center"/>
         <w:tblCellMar>
           <w:left w:w="0" w:type="dxa"/>
           <w:right w:w="0" w:type="dxa"/>
         </w:tblCellMar>
         <w:tblLook w:val="04A0" w:firstRow="1" w:lastRow="0" w:firstColumn="1" w:lastColumn="0" w:noHBand="0" w:noVBand="1"/>
+        <w:tblW w:w="9740" w:type="dxa"/>
+        <w:tblLayout w:type="fixed"/>
       </w:tblPr>
       <w:tblGrid>
-        <w:gridCol w:w="7363"/>
+        <w:gridCol w:w="8390"/>
         <w:gridCol w:w="1350"/>
       </w:tblGrid>
       <w:tr>
@@ -17799,7 +17800,6 @@
         </w:trPr>
         <w:tc>
           <w:tcPr>
-            <w:tcW w:w="0" w:type="auto"/>
             <w:gridSpan w:val="2"/>
             <w:tcBorders>
               <w:top w:val="single" w:sz="6" w:space="0" w:color="000000"/>
@@ -17816,10 +17816,11 @@
             <w:vAlign w:val="center"/>
             <w:hideMark/>
             <w:shd w:val="clear" w:fill="F1F5F9"/>
-          </w:tcPr>
-          <w:p>
-            <w:pPr>
-              <w:jc w:val="center"/>
+            <w:tcW w:w="9740" w:type="dxa"/>
+          </w:tcPr>
+          <w:p>
+            <w:pPr>
+              <w:jc w:val="left"/>
             </w:pPr>
             <w:r>
               <w:rPr>
@@ -17838,7 +17839,6 @@
         </w:trPr>
         <w:tc>
           <w:tcPr>
-            <w:tcW w:w="0" w:type="auto"/>
             <w:tcBorders>
               <w:top w:val="single" w:sz="6" w:space="0" w:color="CCCCCC"/>
               <w:left w:val="single" w:sz="6" w:space="0" w:color="000000"/>
@@ -17853,10 +17853,11 @@
             </w:tcMar>
             <w:vAlign w:val="center"/>
             <w:hideMark/>
-          </w:tcPr>
-          <w:p>
-            <w:pPr>
-              <w:jc w:val="center"/>
+            <w:tcW w:w="8390" w:type="dxa"/>
+          </w:tcPr>
+          <w:p>
+            <w:pPr>
+              <w:jc w:val="left"/>
             </w:pPr>
             <w:r>
               <w:rPr>
@@ -17882,7 +17883,6 @@
         </w:tc>
         <w:tc>
           <w:tcPr>
-            <w:tcW w:w="0" w:type="auto"/>
             <w:tcBorders>
               <w:top w:val="single" w:sz="6" w:space="0" w:color="CCCCCC"/>
               <w:left w:val="single" w:sz="6" w:space="0" w:color="CCCCCC"/>
@@ -17897,10 +17897,11 @@
             </w:tcMar>
             <w:vAlign w:val="center"/>
             <w:hideMark/>
-          </w:tcPr>
-          <w:p>
-            <w:pPr>
-              <w:jc w:val="right"/>
+            <w:tcW w:w="1350" w:type="dxa"/>
+          </w:tcPr>
+          <w:p>
+            <w:pPr>
+              <w:jc w:val="left"/>
               <w:rPr>
                 <w:rFonts w:ascii="Calibri" w:hAnsi="Calibri" w:cs="Calibri"/>
               </w:rPr>
@@ -17915,7 +17916,6 @@
         </w:trPr>
         <w:tc>
           <w:tcPr>
-            <w:tcW w:w="0" w:type="auto"/>
             <w:tcBorders>
               <w:top w:val="single" w:sz="6" w:space="0" w:color="CCCCCC"/>
               <w:left w:val="single" w:sz="6" w:space="0" w:color="000000"/>
@@ -17930,6 +17930,7 @@
             </w:tcMar>
             <w:vAlign w:val="center"/>
             <w:hideMark/>
+            <w:tcW w:w="8390" w:type="dxa"/>
           </w:tcPr>
           <w:p>
             <w:r>
@@ -17942,7 +17943,6 @@
         </w:tc>
         <w:tc>
           <w:tcPr>
-            <w:tcW w:w="0" w:type="auto"/>
             <w:tcBorders>
               <w:top w:val="single" w:sz="6" w:space="0" w:color="CCCCCC"/>
               <w:left w:val="single" w:sz="6" w:space="0" w:color="CCCCCC"/>
@@ -17957,6 +17957,7 @@
             </w:tcMar>
             <w:vAlign w:val="center"/>
             <w:hideMark/>
+            <w:tcW w:w="1350" w:type="dxa"/>
           </w:tcPr>
           <w:p>
             <w:pPr>
@@ -17978,7 +17979,6 @@
         </w:trPr>
         <w:tc>
           <w:tcPr>
-            <w:tcW w:w="0" w:type="auto"/>
             <w:tcBorders>
               <w:top w:val="single" w:sz="6" w:space="0" w:color="CCCCCC"/>
               <w:left w:val="single" w:sz="6" w:space="0" w:color="000000"/>
@@ -17993,6 +17993,7 @@
             </w:tcMar>
             <w:vAlign w:val="center"/>
             <w:hideMark/>
+            <w:tcW w:w="8390" w:type="dxa"/>
           </w:tcPr>
           <w:p>
             <w:r>
@@ -18005,7 +18006,6 @@
         </w:tc>
         <w:tc>
           <w:tcPr>
-            <w:tcW w:w="0" w:type="auto"/>
             <w:tcBorders>
               <w:top w:val="single" w:sz="6" w:space="0" w:color="CCCCCC"/>
               <w:left w:val="single" w:sz="6" w:space="0" w:color="CCCCCC"/>
@@ -18020,6 +18020,7 @@
             </w:tcMar>
             <w:vAlign w:val="center"/>
             <w:hideMark/>
+            <w:tcW w:w="1350" w:type="dxa"/>
           </w:tcPr>
           <w:p>
             <w:pPr>
@@ -18041,7 +18042,6 @@
         </w:trPr>
         <w:tc>
           <w:tcPr>
-            <w:tcW w:w="0" w:type="auto"/>
             <w:tcBorders>
               <w:top w:val="single" w:sz="6" w:space="0" w:color="CCCCCC"/>
               <w:left w:val="single" w:sz="6" w:space="0" w:color="000000"/>
@@ -18056,6 +18056,7 @@
             </w:tcMar>
             <w:vAlign w:val="center"/>
             <w:hideMark/>
+            <w:tcW w:w="8390" w:type="dxa"/>
           </w:tcPr>
           <w:p>
             <w:r>
@@ -18068,7 +18069,6 @@
         </w:tc>
         <w:tc>
           <w:tcPr>
-            <w:tcW w:w="0" w:type="auto"/>
             <w:tcBorders>
               <w:top w:val="single" w:sz="6" w:space="0" w:color="CCCCCC"/>
               <w:left w:val="single" w:sz="6" w:space="0" w:color="CCCCCC"/>
@@ -18083,6 +18083,7 @@
             </w:tcMar>
             <w:vAlign w:val="center"/>
             <w:hideMark/>
+            <w:tcW w:w="1350" w:type="dxa"/>
           </w:tcPr>
           <w:p>
             <w:pPr>
@@ -18104,7 +18105,6 @@
         </w:trPr>
         <w:tc>
           <w:tcPr>
-            <w:tcW w:w="0" w:type="auto"/>
             <w:tcBorders>
               <w:top w:val="single" w:sz="6" w:space="0" w:color="CCCCCC"/>
               <w:left w:val="single" w:sz="6" w:space="0" w:color="000000"/>
@@ -18119,6 +18119,7 @@
             </w:tcMar>
             <w:vAlign w:val="center"/>
             <w:hideMark/>
+            <w:tcW w:w="8390" w:type="dxa"/>
           </w:tcPr>
           <w:p>
             <w:r>
@@ -18131,7 +18132,6 @@
         </w:tc>
         <w:tc>
           <w:tcPr>
-            <w:tcW w:w="0" w:type="auto"/>
             <w:tcBorders>
               <w:top w:val="single" w:sz="6" w:space="0" w:color="CCCCCC"/>
               <w:left w:val="single" w:sz="6" w:space="0" w:color="CCCCCC"/>
@@ -18146,6 +18146,7 @@
             </w:tcMar>
             <w:vAlign w:val="center"/>
             <w:hideMark/>
+            <w:tcW w:w="1350" w:type="dxa"/>
           </w:tcPr>
           <w:p>
             <w:pPr>
@@ -18167,7 +18168,6 @@
         </w:trPr>
         <w:tc>
           <w:tcPr>
-            <w:tcW w:w="0" w:type="auto"/>
             <w:tcBorders>
               <w:top w:val="single" w:sz="6" w:space="0" w:color="CCCCCC"/>
               <w:left w:val="single" w:sz="6" w:space="0" w:color="000000"/>
@@ -18182,6 +18182,7 @@
             </w:tcMar>
             <w:vAlign w:val="center"/>
             <w:hideMark/>
+            <w:tcW w:w="8390" w:type="dxa"/>
           </w:tcPr>
           <w:p>
             <w:r>
@@ -18208,7 +18209,6 @@
         </w:tc>
         <w:tc>
           <w:tcPr>
-            <w:tcW w:w="0" w:type="auto"/>
             <w:tcBorders>
               <w:top w:val="single" w:sz="6" w:space="0" w:color="CCCCCC"/>
               <w:left w:val="single" w:sz="6" w:space="0" w:color="CCCCCC"/>
@@ -18223,6 +18223,7 @@
             </w:tcMar>
             <w:vAlign w:val="center"/>
             <w:hideMark/>
+            <w:tcW w:w="1350" w:type="dxa"/>
           </w:tcPr>
           <w:p>
             <w:pPr>
@@ -18244,7 +18245,6 @@
         </w:trPr>
         <w:tc>
           <w:tcPr>
-            <w:tcW w:w="0" w:type="auto"/>
             <w:tcBorders>
               <w:top w:val="single" w:sz="6" w:space="0" w:color="CCCCCC"/>
               <w:left w:val="single" w:sz="6" w:space="0" w:color="000000"/>
@@ -18259,6 +18259,7 @@
             </w:tcMar>
             <w:vAlign w:val="center"/>
             <w:hideMark/>
+            <w:tcW w:w="8390" w:type="dxa"/>
           </w:tcPr>
           <w:p>
             <w:r>
@@ -18271,7 +18272,6 @@
         </w:tc>
         <w:tc>
           <w:tcPr>
-            <w:tcW w:w="0" w:type="auto"/>
             <w:tcBorders>
               <w:top w:val="single" w:sz="6" w:space="0" w:color="CCCCCC"/>
               <w:left w:val="single" w:sz="6" w:space="0" w:color="CCCCCC"/>
@@ -18286,6 +18286,7 @@
             </w:tcMar>
             <w:vAlign w:val="center"/>
             <w:hideMark/>
+            <w:tcW w:w="1350" w:type="dxa"/>
           </w:tcPr>
           <w:p>
             <w:pPr>
@@ -18307,7 +18308,6 @@
         </w:trPr>
         <w:tc>
           <w:tcPr>
-            <w:tcW w:w="0" w:type="auto"/>
             <w:tcBorders>
               <w:top w:val="single" w:sz="6" w:space="0" w:color="CCCCCC"/>
               <w:left w:val="single" w:sz="6" w:space="0" w:color="000000"/>
@@ -18322,6 +18322,7 @@
             </w:tcMar>
             <w:vAlign w:val="center"/>
             <w:hideMark/>
+            <w:tcW w:w="8390" w:type="dxa"/>
           </w:tcPr>
           <w:p>
             <w:r>
@@ -18334,7 +18335,6 @@
         </w:tc>
         <w:tc>
           <w:tcPr>
-            <w:tcW w:w="0" w:type="auto"/>
             <w:tcBorders>
               <w:top w:val="single" w:sz="6" w:space="0" w:color="CCCCCC"/>
               <w:left w:val="single" w:sz="6" w:space="0" w:color="CCCCCC"/>
@@ -18349,6 +18349,7 @@
             </w:tcMar>
             <w:vAlign w:val="center"/>
             <w:hideMark/>
+            <w:tcW w:w="1350" w:type="dxa"/>
           </w:tcPr>
           <w:p>
             <w:pPr>
@@ -18370,7 +18371,6 @@
         </w:trPr>
         <w:tc>
           <w:tcPr>
-            <w:tcW w:w="0" w:type="auto"/>
             <w:gridSpan w:val="2"/>
             <w:tcBorders>
               <w:top w:val="single" w:sz="6" w:space="0" w:color="CCCCCC"/>
@@ -18386,10 +18386,11 @@
             </w:tcMar>
             <w:vAlign w:val="center"/>
             <w:hideMark/>
-          </w:tcPr>
-          <w:p>
-            <w:pPr>
-              <w:jc w:val="center"/>
+            <w:tcW w:w="9740" w:type="dxa"/>
+          </w:tcPr>
+          <w:p>
+            <w:pPr>
+              <w:jc w:val="left"/>
             </w:pPr>
             <w:r>
               <w:rPr>
@@ -18407,7 +18408,6 @@
         </w:trPr>
         <w:tc>
           <w:tcPr>
-            <w:tcW w:w="0" w:type="auto"/>
             <w:tcBorders>
               <w:top w:val="single" w:sz="6" w:space="0" w:color="CCCCCC"/>
               <w:left w:val="single" w:sz="6" w:space="0" w:color="000000"/>
@@ -18422,6 +18422,7 @@
             </w:tcMar>
             <w:vAlign w:val="center"/>
             <w:hideMark/>
+            <w:tcW w:w="8390" w:type="dxa"/>
           </w:tcPr>
           <w:p>
             <w:r>
@@ -18443,7 +18444,6 @@
         </w:tc>
         <w:tc>
           <w:tcPr>
-            <w:tcW w:w="0" w:type="auto"/>
             <w:tcBorders>
               <w:top w:val="single" w:sz="6" w:space="0" w:color="CCCCCC"/>
               <w:left w:val="single" w:sz="6" w:space="0" w:color="CCCCCC"/>
@@ -18458,6 +18458,7 @@
             </w:tcMar>
             <w:vAlign w:val="bottom"/>
             <w:hideMark/>
+            <w:tcW w:w="1350" w:type="dxa"/>
           </w:tcPr>
           <w:p>
             <w:pPr>
@@ -18479,7 +18480,6 @@
         </w:trPr>
         <w:tc>
           <w:tcPr>
-            <w:tcW w:w="0" w:type="auto"/>
             <w:gridSpan w:val="2"/>
             <w:tcBorders>
               <w:top w:val="single" w:sz="6" w:space="0" w:color="CCCCCC"/>
@@ -18495,10 +18495,11 @@
             </w:tcMar>
             <w:vAlign w:val="center"/>
             <w:hideMark/>
-          </w:tcPr>
-          <w:p>
-            <w:pPr>
-              <w:jc w:val="center"/>
+            <w:tcW w:w="9740" w:type="dxa"/>
+          </w:tcPr>
+          <w:p>
+            <w:pPr>
+              <w:jc w:val="left"/>
             </w:pPr>
             <w:r>
               <w:rPr>
@@ -18516,7 +18517,6 @@
         </w:trPr>
         <w:tc>
           <w:tcPr>
-            <w:tcW w:w="0" w:type="auto"/>
             <w:tcBorders>
               <w:top w:val="single" w:sz="6" w:space="0" w:color="CCCCCC"/>
               <w:left w:val="single" w:sz="6" w:space="0" w:color="000000"/>
@@ -18531,6 +18531,7 @@
             </w:tcMar>
             <w:vAlign w:val="center"/>
             <w:hideMark/>
+            <w:tcW w:w="8390" w:type="dxa"/>
           </w:tcPr>
           <w:p>
             <w:r>
@@ -18557,7 +18558,6 @@
         </w:tc>
         <w:tc>
           <w:tcPr>
-            <w:tcW w:w="0" w:type="auto"/>
             <w:tcBorders>
               <w:top w:val="single" w:sz="6" w:space="0" w:color="CCCCCC"/>
               <w:left w:val="single" w:sz="6" w:space="0" w:color="CCCCCC"/>
@@ -18572,6 +18572,7 @@
             </w:tcMar>
             <w:vAlign w:val="center"/>
             <w:hideMark/>
+            <w:tcW w:w="1350" w:type="dxa"/>
           </w:tcPr>
           <w:p>
             <w:pPr>
@@ -18593,7 +18594,6 @@
         </w:trPr>
         <w:tc>
           <w:tcPr>
-            <w:tcW w:w="0" w:type="auto"/>
             <w:tcBorders>
               <w:top w:val="single" w:sz="6" w:space="0" w:color="CCCCCC"/>
               <w:left w:val="single" w:sz="6" w:space="0" w:color="000000"/>
@@ -18608,6 +18608,7 @@
             </w:tcMar>
             <w:vAlign w:val="center"/>
             <w:hideMark/>
+            <w:tcW w:w="8390" w:type="dxa"/>
           </w:tcPr>
           <w:p>
             <w:r>
@@ -18620,7 +18621,6 @@
         </w:tc>
         <w:tc>
           <w:tcPr>
-            <w:tcW w:w="0" w:type="auto"/>
             <w:tcBorders>
               <w:top w:val="single" w:sz="6" w:space="0" w:color="CCCCCC"/>
               <w:left w:val="single" w:sz="6" w:space="0" w:color="CCCCCC"/>
@@ -18635,6 +18635,7 @@
             </w:tcMar>
             <w:vAlign w:val="center"/>
             <w:hideMark/>
+            <w:tcW w:w="1350" w:type="dxa"/>
           </w:tcPr>
           <w:p>
             <w:pPr>
@@ -18656,7 +18657,6 @@
         </w:trPr>
         <w:tc>
           <w:tcPr>
-            <w:tcW w:w="0" w:type="auto"/>
             <w:gridSpan w:val="2"/>
             <w:tcBorders>
               <w:top w:val="single" w:sz="6" w:space="0" w:color="CCCCCC"/>
@@ -18672,10 +18672,11 @@
             </w:tcMar>
             <w:vAlign w:val="center"/>
             <w:hideMark/>
-          </w:tcPr>
-          <w:p>
-            <w:pPr>
-              <w:jc w:val="center"/>
+            <w:tcW w:w="9740" w:type="dxa"/>
+          </w:tcPr>
+          <w:p>
+            <w:pPr>
+              <w:jc w:val="left"/>
             </w:pPr>
             <w:r>
               <w:rPr>
@@ -18693,7 +18694,6 @@
         </w:trPr>
         <w:tc>
           <w:tcPr>
-            <w:tcW w:w="0" w:type="auto"/>
             <w:tcBorders>
               <w:top w:val="single" w:sz="6" w:space="0" w:color="CCCCCC"/>
               <w:left w:val="single" w:sz="6" w:space="0" w:color="000000"/>
@@ -18708,6 +18708,7 @@
             </w:tcMar>
             <w:vAlign w:val="center"/>
             <w:hideMark/>
+            <w:tcW w:w="8390" w:type="dxa"/>
           </w:tcPr>
           <w:p>
             <w:r>
@@ -18720,7 +18721,6 @@
         </w:tc>
         <w:tc>
           <w:tcPr>
-            <w:tcW w:w="0" w:type="auto"/>
             <w:tcBorders>
               <w:top w:val="single" w:sz="6" w:space="0" w:color="CCCCCC"/>
               <w:left w:val="single" w:sz="6" w:space="0" w:color="CCCCCC"/>
@@ -18735,6 +18735,7 @@
             </w:tcMar>
             <w:vAlign w:val="center"/>
             <w:hideMark/>
+            <w:tcW w:w="1350" w:type="dxa"/>
           </w:tcPr>
           <w:p>
             <w:pPr>
@@ -18756,7 +18757,6 @@
         </w:trPr>
         <w:tc>
           <w:tcPr>
-            <w:tcW w:w="0" w:type="auto"/>
             <w:tcBorders>
               <w:top w:val="single" w:sz="6" w:space="0" w:color="CCCCCC"/>
               <w:left w:val="single" w:sz="6" w:space="0" w:color="000000"/>
@@ -18771,6 +18771,7 @@
             </w:tcMar>
             <w:vAlign w:val="center"/>
             <w:hideMark/>
+            <w:tcW w:w="8390" w:type="dxa"/>
           </w:tcPr>
           <w:p>
             <w:proofErr w:type="spellStart"/>
@@ -18786,7 +18787,6 @@
         </w:tc>
         <w:tc>
           <w:tcPr>
-            <w:tcW w:w="0" w:type="auto"/>
             <w:tcBorders>
               <w:top w:val="single" w:sz="6" w:space="0" w:color="CCCCCC"/>
               <w:left w:val="single" w:sz="6" w:space="0" w:color="CCCCCC"/>
@@ -18801,6 +18801,7 @@
             </w:tcMar>
             <w:vAlign w:val="center"/>
             <w:hideMark/>
+            <w:tcW w:w="1350" w:type="dxa"/>
           </w:tcPr>
           <w:p>
             <w:pPr>
@@ -18822,7 +18823,6 @@
         </w:trPr>
         <w:tc>
           <w:tcPr>
-            <w:tcW w:w="0" w:type="auto"/>
             <w:tcBorders>
               <w:top w:val="single" w:sz="6" w:space="0" w:color="CCCCCC"/>
               <w:left w:val="single" w:sz="6" w:space="0" w:color="000000"/>
@@ -18837,6 +18837,7 @@
             </w:tcMar>
             <w:vAlign w:val="center"/>
             <w:hideMark/>
+            <w:tcW w:w="8390" w:type="dxa"/>
           </w:tcPr>
           <w:p>
             <w:r>
@@ -18849,7 +18850,6 @@
         </w:tc>
         <w:tc>
           <w:tcPr>
-            <w:tcW w:w="0" w:type="auto"/>
             <w:tcBorders>
               <w:top w:val="single" w:sz="6" w:space="0" w:color="CCCCCC"/>
               <w:left w:val="single" w:sz="6" w:space="0" w:color="CCCCCC"/>
@@ -18864,6 +18864,7 @@
             </w:tcMar>
             <w:vAlign w:val="center"/>
             <w:hideMark/>
+            <w:tcW w:w="1350" w:type="dxa"/>
           </w:tcPr>
           <w:p>
             <w:pPr>
@@ -18885,7 +18886,6 @@
         </w:trPr>
         <w:tc>
           <w:tcPr>
-            <w:tcW w:w="0" w:type="auto"/>
             <w:tcBorders>
               <w:top w:val="single" w:sz="6" w:space="0" w:color="CCCCCC"/>
               <w:left w:val="single" w:sz="6" w:space="0" w:color="000000"/>
@@ -18900,6 +18900,7 @@
             </w:tcMar>
             <w:vAlign w:val="center"/>
             <w:hideMark/>
+            <w:tcW w:w="8390" w:type="dxa"/>
           </w:tcPr>
           <w:p>
             <w:proofErr w:type="spellStart"/>
@@ -18920,7 +18921,6 @@
         </w:tc>
         <w:tc>
           <w:tcPr>
-            <w:tcW w:w="0" w:type="auto"/>
             <w:tcBorders>
               <w:top w:val="single" w:sz="6" w:space="0" w:color="CCCCCC"/>
               <w:left w:val="single" w:sz="6" w:space="0" w:color="CCCCCC"/>
@@ -18935,6 +18935,7 @@
             </w:tcMar>
             <w:vAlign w:val="center"/>
             <w:hideMark/>
+            <w:tcW w:w="1350" w:type="dxa"/>
           </w:tcPr>
           <w:p>
             <w:pPr>
@@ -18956,7 +18957,6 @@
         </w:trPr>
         <w:tc>
           <w:tcPr>
-            <w:tcW w:w="0" w:type="auto"/>
             <w:tcBorders>
               <w:top w:val="single" w:sz="6" w:space="0" w:color="CCCCCC"/>
               <w:left w:val="single" w:sz="6" w:space="0" w:color="000000"/>
@@ -18971,6 +18971,7 @@
             </w:tcMar>
             <w:vAlign w:val="center"/>
             <w:hideMark/>
+            <w:tcW w:w="8390" w:type="dxa"/>
           </w:tcPr>
           <w:p>
             <w:r>
@@ -18997,7 +18998,6 @@
         </w:tc>
         <w:tc>
           <w:tcPr>
-            <w:tcW w:w="0" w:type="auto"/>
             <w:tcBorders>
               <w:top w:val="single" w:sz="6" w:space="0" w:color="CCCCCC"/>
               <w:left w:val="single" w:sz="6" w:space="0" w:color="CCCCCC"/>
@@ -19012,6 +19012,7 @@
             </w:tcMar>
             <w:vAlign w:val="center"/>
             <w:hideMark/>
+            <w:tcW w:w="1350" w:type="dxa"/>
           </w:tcPr>
           <w:p>
             <w:pPr>
@@ -19033,7 +19034,6 @@
         </w:trPr>
         <w:tc>
           <w:tcPr>
-            <w:tcW w:w="0" w:type="auto"/>
             <w:tcBorders>
               <w:top w:val="single" w:sz="6" w:space="0" w:color="CCCCCC"/>
               <w:left w:val="single" w:sz="6" w:space="0" w:color="000000"/>
@@ -19048,6 +19048,7 @@
             </w:tcMar>
             <w:vAlign w:val="center"/>
             <w:hideMark/>
+            <w:tcW w:w="8390" w:type="dxa"/>
           </w:tcPr>
           <w:p>
             <w:r>
@@ -19074,7 +19075,6 @@
         </w:tc>
         <w:tc>
           <w:tcPr>
-            <w:tcW w:w="0" w:type="auto"/>
             <w:tcBorders>
               <w:top w:val="single" w:sz="6" w:space="0" w:color="CCCCCC"/>
               <w:left w:val="single" w:sz="6" w:space="0" w:color="CCCCCC"/>
@@ -19089,6 +19089,7 @@
             </w:tcMar>
             <w:vAlign w:val="center"/>
             <w:hideMark/>
+            <w:tcW w:w="1350" w:type="dxa"/>
           </w:tcPr>
           <w:p>
             <w:pPr>
@@ -19110,7 +19111,6 @@
         </w:trPr>
         <w:tc>
           <w:tcPr>
-            <w:tcW w:w="0" w:type="auto"/>
             <w:tcBorders>
               <w:top w:val="single" w:sz="6" w:space="0" w:color="CCCCCC"/>
               <w:left w:val="single" w:sz="6" w:space="0" w:color="000000"/>
@@ -19125,6 +19125,7 @@
             </w:tcMar>
             <w:vAlign w:val="center"/>
             <w:hideMark/>
+            <w:tcW w:w="8390" w:type="dxa"/>
           </w:tcPr>
           <w:p>
             <w:r>
@@ -19137,7 +19138,6 @@
         </w:tc>
         <w:tc>
           <w:tcPr>
-            <w:tcW w:w="0" w:type="auto"/>
             <w:tcBorders>
               <w:top w:val="single" w:sz="6" w:space="0" w:color="CCCCCC"/>
               <w:left w:val="single" w:sz="6" w:space="0" w:color="CCCCCC"/>
@@ -19152,6 +19152,7 @@
             </w:tcMar>
             <w:vAlign w:val="center"/>
             <w:hideMark/>
+            <w:tcW w:w="1350" w:type="dxa"/>
           </w:tcPr>
           <w:p>
             <w:pPr>

</xml_diff>

<commit_message>
style: left-align section headings (T&C/BOM/MAKE LIST); space below page header
- TERMS AND CONDITIONS, BILL OF MATERIAL, MAKE LIST headings left-aligned and
  de-indented; the T&C orange rule now spans full width (its 0.5in indent was
  offsetting the underline).
- Raised top margin 1.0in -> 2.0in so body content clears the 1.38in running
  header logo (previously the table butted against / overlapped the header).

Co-Authored-By: Claude Opus 4.8 (1M context) <noreply@anthropic.com>
</commit_message>
<xml_diff>
--- a/Regen_Offer_Template.docx
+++ b/Regen_Offer_Template.docx
@@ -4602,8 +4602,8 @@
       <w:pPr>
         <w:pStyle w:val="Heading1"/>
         <w:spacing w:after="120"/>
-        <w:ind w:left="0" w:firstLine="0"/>
-        <w:jc w:val="center"/>
+        <w:ind w:firstLine="0"/>
+        <w:jc w:val="left"/>
         <w:rPr>
           <w:color w:val="000000"/>
         </w:rPr>
@@ -14047,7 +14047,7 @@
     <w:p>
       <w:pPr>
         <w:spacing w:before="280" w:after="80"/>
-        <w:jc w:val="center"/>
+        <w:jc w:val="left"/>
         <w:rPr>
           <w:b/>
           <w:bCs/>
@@ -17269,9 +17269,9 @@
       <w:pPr>
         <w:pStyle w:val="ListParagraph"/>
         <w:spacing w:before="280" w:after="80"/>
-        <w:ind w:left="714"/>
+        <w:ind/>
         <w:contextualSpacing w:val="0"/>
-        <w:jc w:val="center"/>
+        <w:jc w:val="left"/>
         <w:pBdr>
           <w:bottom w:val="single" w:color="E87722" w:sz="12" w:space="4"/>
         </w:pBdr>
@@ -19173,7 +19173,7 @@
       <w:footerReference w:type="default" r:id="rId10"/>
       <w:headerReference w:type="first" r:id="rId20"/>
       <w:pgSz w:w="11906" w:h="16838" w:orient="portrait"/>
-      <w:pgMar w:top="1440" w:right="1083" w:bottom="1440" w:left="1083" w:header="708" w:footer="708" w:gutter="0"/>
+      <w:pgMar w:top="2880" w:right="1083" w:bottom="1440" w:left="1083" w:header="708" w:footer="708" w:gutter="0"/>
       <w:pgNumType/>
       <w:titlePg/>
       <w:docGrid w:linePitch="360"/>

</xml_diff>

<commit_message>
style: left-align PART-A + TECHNICAL OFFER headings; full-width orange rules
TECHNICAL OFFER had L=20pt/R=10pt indents shrinking its orange rule; cleared
them and left-aligned both so their rules span full width like the others.

Co-Authored-By: Claude Opus 4.8 (1M context) <noreply@anthropic.com>
</commit_message>
<xml_diff>
--- a/Regen_Offer_Template.docx
+++ b/Regen_Offer_Template.docx
@@ -838,7 +838,7 @@
     <w:p>
       <w:pPr>
         <w:spacing w:before="280" w:after="80"/>
-        <w:jc w:val="center"/>
+        <w:jc w:val="left"/>
         <w:rPr>
           <w:b/>
           <w:bCs/>
@@ -889,8 +889,8 @@
       <w:pPr>
         <w:pStyle w:val="Heading2"/>
         <w:spacing w:before="280" w:after="80"/>
-        <w:ind w:left="402" w:right="193"/>
-        <w:jc w:val="center"/>
+        <w:ind/>
+        <w:jc w:val="left"/>
         <w:rPr>
           <w:rFonts w:ascii="Times New Roman" w:hAnsi="Times New Roman" w:cs="Times New Roman"/>
         </w:rPr>

</xml_diff>

<commit_message>
feat: drop BILL OF MATERIAL from regen offer; MAKE LIST now dynamic from BOM
- Removed the BILL OF MATERIAL heading + table entirely.
- MAKE LIST is now built from the real build_regen_df output: only item
  categories actually present appear, each with the make(s) used (deduped,
  BOM order). engine/regen_bom_table.py fill_make_list() + _makelist_category().
- main.py regen branch now calls fill_make_list instead of fill_bom_table.
- Removed the furnace-pressure OPERATIONAL SEQUENCE section (kept the
  temperature-control one).

Co-Authored-By: Claude Opus 4.8 (1M context) <noreply@anthropic.com>
</commit_message>
<xml_diff>
--- a/Regen_Offer_Template.docx
+++ b/Regen_Offer_Template.docx
@@ -4184,138 +4184,6 @@
     </w:p>
     <w:p>
       <w:pPr>
-        <w:widowControl w:val="0"/>
-        <w:spacing w:line="276" w:lineRule="auto" w:before="280" w:after="80"/>
-        <w:rPr>
-          <w:b/>
-          <w:iCs/>
-          <w:color w:val="000000"/>
-          <w:u w:val="single"/>
-        </w:rPr>
-        <w:pBdr>
-          <w:bottom w:val="single" w:color="E87722" w:sz="12" w:space="4"/>
-        </w:pBdr>
-      </w:pPr>
-      <w:r>
-        <w:rPr>
-          <w:rFonts w:ascii="Calibri" w:hAnsi="Calibri" w:cs="Calibri"/>
-          <w:b/>
-          <w:iCs/>
-          <w:color w:val="1F2937"/>
-          <w:sz w:val="30"/>
-        </w:rPr>
-        <w:t>OPERATIONAL SEQUENCE</w:t>
-      </w:r>
-    </w:p>
-    <w:p>
-      <w:pPr>
-        <w:jc w:val="both"/>
-      </w:pPr>
-      <w:r>
-        <w:rPr>
-          <w:rFonts w:ascii="Calibri" w:hAnsi="Calibri" w:cs="Calibri"/>
-        </w:rPr>
-        <w:t>The Sequence of Pressure control in the furnace will be as following:</w:t>
-      </w:r>
-    </w:p>
-    <w:p>
-      <w:pPr>
-        <w:pStyle w:val="ListParagraph"/>
-        <w:widowControl w:val="0"/>
-        <w:numPr>
-          <w:ilvl w:val="0"/>
-          <w:numId w:val="8"/>
-        </w:numPr>
-        <w:spacing w:after="200" w:line="276" w:lineRule="auto"/>
-        <w:jc w:val="both"/>
-      </w:pPr>
-      <w:r>
-        <w:rPr>
-          <w:rFonts w:ascii="Calibri" w:hAnsi="Calibri" w:cs="Calibri"/>
-        </w:rPr>
-        <w:t>The sensing tube fitted in the furnace, will give the Pressure differential and that will be sensed by the Pressure Transmitter</w:t>
-      </w:r>
-    </w:p>
-    <w:p>
-      <w:pPr>
-        <w:pStyle w:val="ListParagraph"/>
-        <w:widowControl w:val="0"/>
-        <w:numPr>
-          <w:ilvl w:val="0"/>
-          <w:numId w:val="8"/>
-        </w:numPr>
-        <w:spacing w:after="200" w:line="276" w:lineRule="auto"/>
-        <w:jc w:val="both"/>
-      </w:pPr>
-      <w:r>
-        <w:rPr>
-          <w:rFonts w:ascii="Calibri" w:hAnsi="Calibri" w:cs="Calibri"/>
-        </w:rPr>
-        <w:t xml:space="preserve">The pressure transmitter will give </w:t>
-      </w:r>
-      <w:r>
-        <w:rPr>
-          <w:rFonts w:ascii="Calibri" w:hAnsi="Calibri" w:cs="Calibri"/>
-        </w:rPr>
-        <w:t>a signal</w:t>
-      </w:r>
-      <w:r>
-        <w:rPr>
-          <w:rFonts w:ascii="Calibri" w:hAnsi="Calibri" w:cs="Calibri"/>
-        </w:rPr>
-        <w:t xml:space="preserve"> to the P.L.C indicating the furnace </w:t>
-      </w:r>
-      <w:r>
-        <w:rPr>
-          <w:rFonts w:ascii="Calibri" w:hAnsi="Calibri" w:cs="Calibri"/>
-        </w:rPr>
-        <w:t>pressure.</w:t>
-      </w:r>
-    </w:p>
-    <w:p>
-      <w:pPr>
-        <w:pStyle w:val="ListParagraph"/>
-        <w:widowControl w:val="0"/>
-        <w:numPr>
-          <w:ilvl w:val="0"/>
-          <w:numId w:val="8"/>
-        </w:numPr>
-        <w:spacing w:after="200" w:line="276" w:lineRule="auto"/>
-        <w:jc w:val="both"/>
-      </w:pPr>
-      <w:r>
-        <w:rPr>
-          <w:rFonts w:ascii="Calibri" w:hAnsi="Calibri" w:cs="Calibri"/>
-        </w:rPr>
-        <w:t xml:space="preserve">P.L.C will send a signal to the </w:t>
-      </w:r>
-      <w:r>
-        <w:rPr>
-          <w:rFonts w:ascii="Calibri" w:hAnsi="Calibri" w:cs="Calibri"/>
-        </w:rPr>
-        <w:t>flue control valve</w:t>
-      </w:r>
-      <w:r>
-        <w:rPr>
-          <w:rFonts w:ascii="Calibri" w:hAnsi="Calibri" w:cs="Calibri"/>
-        </w:rPr>
-        <w:t xml:space="preserve"> fitted on the flue line to modulate</w:t>
-      </w:r>
-      <w:r>
-        <w:rPr>
-          <w:rFonts w:ascii="Calibri" w:hAnsi="Calibri" w:cs="Calibri"/>
-        </w:rPr>
-        <w:t xml:space="preserve"> </w:t>
-      </w:r>
-      <w:r>
-        <w:rPr>
-          <w:rFonts w:ascii="Calibri" w:hAnsi="Calibri" w:cs="Calibri"/>
-        </w:rPr>
-        <w:t xml:space="preserve">according to the set pressure. </w:t>
-      </w:r>
-    </w:p>
-    <w:p>
-      <w:pPr>
         <w:pStyle w:val="Heading1"/>
         <w:spacing w:before="240"/>
         <w:ind w:left="0" w:firstLine="0"/>
@@ -4598,4152 +4466,6 @@
         <w:br w:type="page"/>
       </w:r>
     </w:p>
-    <w:p>
-      <w:pPr>
-        <w:pStyle w:val="Heading1"/>
-        <w:spacing w:after="120"/>
-        <w:ind w:firstLine="0"/>
-        <w:jc w:val="left"/>
-        <w:rPr>
-          <w:color w:val="000000"/>
-        </w:rPr>
-      </w:pPr>
-      <w:r>
-        <w:rPr>
-          <w:rFonts w:ascii="Calibri" w:hAnsi="Calibri" w:cs="Calibri"/>
-          <w:color w:val="000000"/>
-        </w:rPr>
-        <w:t>BILL OF MATERIAL</w:t>
-      </w:r>
-    </w:p>
-    <w:tbl>
-      <w:tblPr>
-        <w:tblW w:w="5000" w:type="pct"/>
-        <w:tblBorders>
-          <w:top w:val="single" w:sz="4" w:space="0" w:color="auto"/>
-          <w:left w:val="single" w:sz="4" w:space="0" w:color="auto"/>
-          <w:bottom w:val="single" w:sz="4" w:space="0" w:color="auto"/>
-          <w:right w:val="single" w:sz="4" w:space="0" w:color="auto"/>
-          <w:insideH w:val="single" w:sz="4" w:space="0" w:color="auto"/>
-          <w:insideV w:val="single" w:sz="4" w:space="0" w:color="auto"/>
-        </w:tblBorders>
-        <w:tblCellMar>
-          <w:left w:w="0" w:type="dxa"/>
-          <w:right w:w="0" w:type="dxa"/>
-        </w:tblCellMar>
-        <w:tblLook w:val="01E0" w:firstRow="1" w:lastRow="1" w:firstColumn="1" w:lastColumn="1" w:noHBand="0" w:noVBand="0"/>
-      </w:tblPr>
-      <w:tblGrid>
-        <w:gridCol w:w="7625"/>
-        <w:gridCol w:w="1399"/>
-      </w:tblGrid>
-      <w:tr>
-        <w:trPr>
-          <w:trHeight w:val="340"/>
-        </w:trPr>
-        <w:tc>
-          <w:tcPr>
-            <w:tcW w:w="4225" w:type="pct"/>
-            <w:vAlign w:val="center"/>
-            <w:shd w:val="clear" w:fill="F1F5F9"/>
-          </w:tcPr>
-          <w:p>
-            <w:pPr>
-              <w:pStyle w:val="TableParagraph"/>
-              <w:spacing w:before="27"/>
-              <w:rPr>
-                <w:b/>
-                <w:sz w:val="24"/>
-              </w:rPr>
-            </w:pPr>
-            <w:r>
-              <w:rPr>
-                <w:rFonts w:ascii="Calibri" w:hAnsi="Calibri" w:cs="Calibri"/>
-                <w:b/>
-                <w:sz w:val="24"/>
-              </w:rPr>
-              <w:t>Description</w:t>
-            </w:r>
-          </w:p>
-        </w:tc>
-        <w:tc>
-          <w:tcPr>
-            <w:tcW w:w="775" w:type="pct"/>
-            <w:shd w:val="clear" w:fill="F1F5F9"/>
-          </w:tcPr>
-          <w:p>
-            <w:pPr>
-              <w:pStyle w:val="TableParagraph"/>
-              <w:spacing w:before="27"/>
-              <w:ind w:left="132"/>
-              <w:rPr>
-                <w:b/>
-                <w:sz w:val="24"/>
-              </w:rPr>
-            </w:pPr>
-            <w:r>
-              <w:rPr>
-                <w:rFonts w:ascii="Calibri" w:hAnsi="Calibri" w:cs="Calibri"/>
-                <w:b/>
-                <w:sz w:val="24"/>
-              </w:rPr>
-              <w:t>Qty.</w:t>
-            </w:r>
-          </w:p>
-        </w:tc>
-      </w:tr>
-      <w:tr>
-        <w:trPr>
-          <w:trHeight w:val="369"/>
-        </w:trPr>
-        <w:tc>
-          <w:tcPr>
-            <w:tcW w:w="5000" w:type="pct"/>
-            <w:gridSpan w:val="2"/>
-            <w:vAlign w:val="center"/>
-          </w:tcPr>
-          <w:p>
-            <w:pPr>
-              <w:pStyle w:val="TableParagraph"/>
-              <w:spacing w:before="20"/>
-              <w:rPr>
-                <w:b/>
-                <w:sz w:val="24"/>
-              </w:rPr>
-            </w:pPr>
-            <w:r>
-              <w:rPr>
-                <w:rFonts w:ascii="Calibri" w:hAnsi="Calibri" w:cs="Calibri"/>
-                <w:b/>
-                <w:sz w:val="24"/>
-              </w:rPr>
-              <w:t>BURNER</w:t>
-            </w:r>
-            <w:r>
-              <w:rPr>
-                <w:rFonts w:ascii="Calibri" w:hAnsi="Calibri" w:cs="Calibri"/>
-                <w:b/>
-                <w:spacing w:val="-2"/>
-                <w:sz w:val="24"/>
-              </w:rPr>
-              <w:t xml:space="preserve"> </w:t>
-            </w:r>
-            <w:r>
-              <w:rPr>
-                <w:rFonts w:ascii="Calibri" w:hAnsi="Calibri" w:cs="Calibri"/>
-                <w:b/>
-                <w:sz w:val="24"/>
-              </w:rPr>
-              <w:t>(complete</w:t>
-            </w:r>
-            <w:r>
-              <w:rPr>
-                <w:rFonts w:ascii="Calibri" w:hAnsi="Calibri" w:cs="Calibri"/>
-                <w:b/>
-                <w:spacing w:val="-2"/>
-                <w:sz w:val="24"/>
-              </w:rPr>
-              <w:t xml:space="preserve"> </w:t>
-            </w:r>
-            <w:r>
-              <w:rPr>
-                <w:rFonts w:ascii="Calibri" w:hAnsi="Calibri" w:cs="Calibri"/>
-                <w:b/>
-                <w:sz w:val="24"/>
-              </w:rPr>
-              <w:t>set)</w:t>
-            </w:r>
-            <w:r>
-              <w:rPr>
-                <w:rFonts w:ascii="Calibri" w:hAnsi="Calibri" w:cs="Calibri"/>
-                <w:b/>
-                <w:spacing w:val="-1"/>
-                <w:sz w:val="24"/>
-              </w:rPr>
-              <w:t xml:space="preserve"> </w:t>
-            </w:r>
-            <w:r>
-              <w:rPr>
-                <w:rFonts w:ascii="Calibri" w:hAnsi="Calibri" w:cs="Calibri"/>
-                <w:b/>
-                <w:sz w:val="24"/>
-              </w:rPr>
-              <w:t>Consist</w:t>
-            </w:r>
-            <w:r>
-              <w:rPr>
-                <w:rFonts w:ascii="Calibri" w:hAnsi="Calibri" w:cs="Calibri"/>
-                <w:b/>
-                <w:spacing w:val="-1"/>
-                <w:sz w:val="24"/>
-              </w:rPr>
-              <w:t xml:space="preserve"> </w:t>
-            </w:r>
-            <w:r>
-              <w:rPr>
-                <w:rFonts w:ascii="Calibri" w:hAnsi="Calibri" w:cs="Calibri"/>
-                <w:b/>
-                <w:sz w:val="24"/>
-              </w:rPr>
-              <w:t>of:</w:t>
-            </w:r>
-          </w:p>
-        </w:tc>
-      </w:tr>
-      <w:tr>
-        <w:trPr>
-          <w:trHeight w:val="369"/>
-        </w:trPr>
-        <w:tc>
-          <w:tcPr>
-            <w:tcW w:w="4225" w:type="pct"/>
-            <w:vAlign w:val="center"/>
-          </w:tcPr>
-          <w:p>
-            <w:pPr>
-              <w:pStyle w:val="TableParagraph"/>
-              <w:spacing w:line="256" w:lineRule="exact"/>
-              <w:rPr>
-                <w:sz w:val="24"/>
-              </w:rPr>
-            </w:pPr>
-            <w:r>
-              <w:rPr>
-                <w:rFonts w:ascii="Calibri" w:hAnsi="Calibri" w:cs="Calibri"/>
-                <w:sz w:val="24"/>
-              </w:rPr>
-              <w:t>Burner</w:t>
-            </w:r>
-            <w:r>
-              <w:rPr>
-                <w:rFonts w:ascii="Calibri" w:hAnsi="Calibri" w:cs="Calibri"/>
-                <w:spacing w:val="-3"/>
-                <w:sz w:val="24"/>
-              </w:rPr>
-              <w:t xml:space="preserve"> </w:t>
-            </w:r>
-            <w:r>
-              <w:rPr>
-                <w:rFonts w:ascii="Calibri" w:hAnsi="Calibri" w:cs="Calibri"/>
-                <w:sz w:val="24"/>
-              </w:rPr>
-              <w:t>with</w:t>
-            </w:r>
-            <w:r>
-              <w:rPr>
-                <w:rFonts w:ascii="Calibri" w:hAnsi="Calibri" w:cs="Calibri"/>
-                <w:spacing w:val="-2"/>
-                <w:sz w:val="24"/>
-              </w:rPr>
-              <w:t xml:space="preserve"> </w:t>
-            </w:r>
-            <w:r>
-              <w:rPr>
-                <w:rFonts w:ascii="Calibri" w:hAnsi="Calibri" w:cs="Calibri"/>
-                <w:sz w:val="24"/>
-              </w:rPr>
-              <w:t>Accessories</w:t>
-            </w:r>
-          </w:p>
-        </w:tc>
-        <w:tc>
-          <w:tcPr>
-            <w:tcW w:w="775" w:type="pct"/>
-          </w:tcPr>
-          <w:p>
-            <w:pPr>
-              <w:pStyle w:val="TableParagraph"/>
-              <w:spacing w:line="256" w:lineRule="exact"/>
-              <w:ind w:left="93"/>
-              <w:rPr>
-                <w:sz w:val="24"/>
-              </w:rPr>
-            </w:pPr>
-            <w:r>
-              <w:rPr>
-                <w:rFonts w:ascii="Calibri" w:hAnsi="Calibri" w:cs="Calibri"/>
-                <w:sz w:val="24"/>
-              </w:rPr>
-              <w:t>2</w:t>
-            </w:r>
-            <w:r>
-              <w:rPr>
-                <w:rFonts w:ascii="Calibri" w:hAnsi="Calibri" w:cs="Calibri"/>
-                <w:spacing w:val="-1"/>
-                <w:sz w:val="24"/>
-              </w:rPr>
-              <w:t xml:space="preserve"> </w:t>
-            </w:r>
-            <w:r>
-              <w:rPr>
-                <w:rFonts w:ascii="Calibri" w:hAnsi="Calibri" w:cs="Calibri"/>
-                <w:sz w:val="24"/>
-              </w:rPr>
-              <w:t>Nos.</w:t>
-            </w:r>
-          </w:p>
-        </w:tc>
-      </w:tr>
-      <w:tr>
-        <w:trPr>
-          <w:trHeight w:val="369"/>
-        </w:trPr>
-        <w:tc>
-          <w:tcPr>
-            <w:tcW w:w="4225" w:type="pct"/>
-            <w:vAlign w:val="center"/>
-          </w:tcPr>
-          <w:p>
-            <w:pPr>
-              <w:pStyle w:val="TableParagraph"/>
-              <w:spacing w:before="25"/>
-              <w:rPr>
-                <w:sz w:val="24"/>
-              </w:rPr>
-            </w:pPr>
-            <w:r>
-              <w:rPr>
-                <w:rFonts w:ascii="Calibri" w:hAnsi="Calibri" w:cs="Calibri"/>
-                <w:sz w:val="24"/>
-              </w:rPr>
-              <w:t>Burner</w:t>
-            </w:r>
-            <w:r>
-              <w:rPr>
-                <w:rFonts w:ascii="Calibri" w:hAnsi="Calibri" w:cs="Calibri"/>
-                <w:spacing w:val="-3"/>
-                <w:sz w:val="24"/>
-              </w:rPr>
-              <w:t xml:space="preserve"> </w:t>
-            </w:r>
-            <w:r>
-              <w:rPr>
-                <w:rFonts w:ascii="Calibri" w:hAnsi="Calibri" w:cs="Calibri"/>
-                <w:sz w:val="24"/>
-              </w:rPr>
-              <w:t>with</w:t>
-            </w:r>
-            <w:r>
-              <w:rPr>
-                <w:rFonts w:ascii="Calibri" w:hAnsi="Calibri" w:cs="Calibri"/>
-                <w:spacing w:val="-2"/>
-                <w:sz w:val="24"/>
-              </w:rPr>
-              <w:t xml:space="preserve"> </w:t>
-            </w:r>
-            <w:r>
-              <w:rPr>
-                <w:rFonts w:ascii="Calibri" w:hAnsi="Calibri" w:cs="Calibri"/>
-                <w:sz w:val="24"/>
-              </w:rPr>
-              <w:t>Regenerator</w:t>
-            </w:r>
-          </w:p>
-        </w:tc>
-        <w:tc>
-          <w:tcPr>
-            <w:tcW w:w="775" w:type="pct"/>
-          </w:tcPr>
-          <w:p>
-            <w:pPr>
-              <w:pStyle w:val="TableParagraph"/>
-              <w:spacing w:before="25"/>
-              <w:ind w:left="93"/>
-              <w:rPr>
-                <w:sz w:val="24"/>
-              </w:rPr>
-            </w:pPr>
-            <w:r>
-              <w:rPr>
-                <w:rFonts w:ascii="Calibri" w:hAnsi="Calibri" w:cs="Calibri"/>
-                <w:sz w:val="24"/>
-              </w:rPr>
-              <w:t>2</w:t>
-            </w:r>
-            <w:r>
-              <w:rPr>
-                <w:rFonts w:ascii="Calibri" w:hAnsi="Calibri" w:cs="Calibri"/>
-                <w:spacing w:val="-1"/>
-                <w:sz w:val="24"/>
-              </w:rPr>
-              <w:t xml:space="preserve"> </w:t>
-            </w:r>
-            <w:r>
-              <w:rPr>
-                <w:rFonts w:ascii="Calibri" w:hAnsi="Calibri" w:cs="Calibri"/>
-                <w:sz w:val="24"/>
-              </w:rPr>
-              <w:t>Nos.</w:t>
-            </w:r>
-          </w:p>
-        </w:tc>
-      </w:tr>
-      <w:tr>
-        <w:trPr>
-          <w:trHeight w:val="369"/>
-        </w:trPr>
-        <w:tc>
-          <w:tcPr>
-            <w:tcW w:w="4225" w:type="pct"/>
-            <w:vAlign w:val="center"/>
-          </w:tcPr>
-          <w:p>
-            <w:pPr>
-              <w:pStyle w:val="TableParagraph"/>
-              <w:spacing w:before="23"/>
-              <w:rPr>
-                <w:sz w:val="24"/>
-              </w:rPr>
-            </w:pPr>
-            <w:r>
-              <w:rPr>
-                <w:rFonts w:ascii="Calibri" w:hAnsi="Calibri" w:cs="Calibri"/>
-                <w:sz w:val="24"/>
-              </w:rPr>
-              <w:t>Pilot</w:t>
-            </w:r>
-            <w:r>
-              <w:rPr>
-                <w:rFonts w:ascii="Calibri" w:hAnsi="Calibri" w:cs="Calibri"/>
-                <w:spacing w:val="-2"/>
-                <w:sz w:val="24"/>
-              </w:rPr>
-              <w:t xml:space="preserve"> </w:t>
-            </w:r>
-            <w:r>
-              <w:rPr>
-                <w:rFonts w:ascii="Calibri" w:hAnsi="Calibri" w:cs="Calibri"/>
-                <w:sz w:val="24"/>
-              </w:rPr>
-              <w:t>Burners</w:t>
-            </w:r>
-          </w:p>
-        </w:tc>
-        <w:tc>
-          <w:tcPr>
-            <w:tcW w:w="775" w:type="pct"/>
-          </w:tcPr>
-          <w:p>
-            <w:pPr>
-              <w:pStyle w:val="TableParagraph"/>
-              <w:spacing w:before="23"/>
-              <w:ind w:left="93"/>
-              <w:rPr>
-                <w:sz w:val="24"/>
-              </w:rPr>
-            </w:pPr>
-            <w:r>
-              <w:rPr>
-                <w:rFonts w:ascii="Calibri" w:hAnsi="Calibri" w:cs="Calibri"/>
-                <w:sz w:val="24"/>
-              </w:rPr>
-              <w:t>2</w:t>
-            </w:r>
-            <w:r>
-              <w:rPr>
-                <w:rFonts w:ascii="Calibri" w:hAnsi="Calibri" w:cs="Calibri"/>
-                <w:spacing w:val="-1"/>
-                <w:sz w:val="24"/>
-              </w:rPr>
-              <w:t xml:space="preserve"> </w:t>
-            </w:r>
-            <w:r>
-              <w:rPr>
-                <w:rFonts w:ascii="Calibri" w:hAnsi="Calibri" w:cs="Calibri"/>
-                <w:sz w:val="24"/>
-              </w:rPr>
-              <w:t>Nos.</w:t>
-            </w:r>
-          </w:p>
-        </w:tc>
-      </w:tr>
-      <w:tr>
-        <w:trPr>
-          <w:trHeight w:val="369"/>
-        </w:trPr>
-        <w:tc>
-          <w:tcPr>
-            <w:tcW w:w="4225" w:type="pct"/>
-            <w:vAlign w:val="center"/>
-          </w:tcPr>
-          <w:p>
-            <w:pPr>
-              <w:pStyle w:val="TableParagraph"/>
-              <w:spacing w:before="23"/>
-              <w:rPr>
-                <w:sz w:val="24"/>
-              </w:rPr>
-            </w:pPr>
-            <w:r>
-              <w:rPr>
-                <w:rFonts w:ascii="Calibri" w:hAnsi="Calibri" w:cs="Calibri"/>
-                <w:sz w:val="24"/>
-              </w:rPr>
-              <w:t>NG</w:t>
-            </w:r>
-            <w:r>
-              <w:rPr>
-                <w:rFonts w:ascii="Calibri" w:hAnsi="Calibri" w:cs="Calibri"/>
-                <w:spacing w:val="-2"/>
-                <w:sz w:val="24"/>
-              </w:rPr>
-              <w:t xml:space="preserve"> </w:t>
-            </w:r>
-            <w:r>
-              <w:rPr>
-                <w:rFonts w:ascii="Calibri" w:hAnsi="Calibri" w:cs="Calibri"/>
-                <w:sz w:val="24"/>
-              </w:rPr>
-              <w:t>Burners</w:t>
-            </w:r>
-          </w:p>
-        </w:tc>
-        <w:tc>
-          <w:tcPr>
-            <w:tcW w:w="775" w:type="pct"/>
-          </w:tcPr>
-          <w:p>
-            <w:pPr>
-              <w:pStyle w:val="TableParagraph"/>
-              <w:spacing w:before="23"/>
-              <w:rPr>
-                <w:sz w:val="24"/>
-              </w:rPr>
-            </w:pPr>
-            <w:r>
-              <w:rPr>
-                <w:rFonts w:ascii="Calibri" w:hAnsi="Calibri" w:cs="Calibri"/>
-                <w:sz w:val="24"/>
-              </w:rPr>
-              <w:t>2</w:t>
-            </w:r>
-            <w:r>
-              <w:rPr>
-                <w:rFonts w:ascii="Calibri" w:hAnsi="Calibri" w:cs="Calibri"/>
-                <w:spacing w:val="-1"/>
-                <w:sz w:val="24"/>
-              </w:rPr>
-              <w:t xml:space="preserve"> </w:t>
-            </w:r>
-            <w:r>
-              <w:rPr>
-                <w:rFonts w:ascii="Calibri" w:hAnsi="Calibri" w:cs="Calibri"/>
-                <w:sz w:val="24"/>
-              </w:rPr>
-              <w:t>Nos.</w:t>
-            </w:r>
-          </w:p>
-        </w:tc>
-      </w:tr>
-      <w:tr>
-        <w:trPr>
-          <w:trHeight w:val="369"/>
-        </w:trPr>
-        <w:tc>
-          <w:tcPr>
-            <w:tcW w:w="4225" w:type="pct"/>
-            <w:vAlign w:val="center"/>
-          </w:tcPr>
-          <w:p>
-            <w:pPr>
-              <w:pStyle w:val="TableParagraph"/>
-              <w:spacing w:before="23"/>
-              <w:rPr>
-                <w:sz w:val="24"/>
-              </w:rPr>
-            </w:pPr>
-            <w:r>
-              <w:rPr>
-                <w:rFonts w:ascii="Calibri" w:hAnsi="Calibri" w:cs="Calibri"/>
-                <w:sz w:val="24"/>
-              </w:rPr>
-              <w:t>Burner</w:t>
-            </w:r>
-            <w:r>
-              <w:rPr>
-                <w:rFonts w:ascii="Calibri" w:hAnsi="Calibri" w:cs="Calibri"/>
-                <w:spacing w:val="-2"/>
-                <w:sz w:val="24"/>
-              </w:rPr>
-              <w:t xml:space="preserve"> </w:t>
-            </w:r>
-            <w:r>
-              <w:rPr>
-                <w:rFonts w:ascii="Calibri" w:hAnsi="Calibri" w:cs="Calibri"/>
-                <w:sz w:val="24"/>
-              </w:rPr>
-              <w:t>Controller</w:t>
-            </w:r>
-          </w:p>
-        </w:tc>
-        <w:tc>
-          <w:tcPr>
-            <w:tcW w:w="775" w:type="pct"/>
-          </w:tcPr>
-          <w:p>
-            <w:pPr>
-              <w:pStyle w:val="TableParagraph"/>
-              <w:spacing w:before="23"/>
-              <w:ind w:left="93"/>
-              <w:rPr>
-                <w:sz w:val="24"/>
-              </w:rPr>
-            </w:pPr>
-            <w:r>
-              <w:rPr>
-                <w:rFonts w:ascii="Calibri" w:hAnsi="Calibri" w:cs="Calibri"/>
-                <w:sz w:val="24"/>
-              </w:rPr>
-              <w:t>2</w:t>
-            </w:r>
-            <w:r>
-              <w:rPr>
-                <w:rFonts w:ascii="Calibri" w:hAnsi="Calibri" w:cs="Calibri"/>
-                <w:spacing w:val="-1"/>
-                <w:sz w:val="24"/>
-              </w:rPr>
-              <w:t xml:space="preserve"> </w:t>
-            </w:r>
-            <w:r>
-              <w:rPr>
-                <w:rFonts w:ascii="Calibri" w:hAnsi="Calibri" w:cs="Calibri"/>
-                <w:sz w:val="24"/>
-              </w:rPr>
-              <w:t>Nos.</w:t>
-            </w:r>
-          </w:p>
-        </w:tc>
-      </w:tr>
-      <w:tr>
-        <w:trPr>
-          <w:trHeight w:val="369"/>
-        </w:trPr>
-        <w:tc>
-          <w:tcPr>
-            <w:tcW w:w="4225" w:type="pct"/>
-            <w:vAlign w:val="center"/>
-          </w:tcPr>
-          <w:p>
-            <w:pPr>
-              <w:pStyle w:val="TableParagraph"/>
-              <w:spacing w:before="26"/>
-              <w:rPr>
-                <w:sz w:val="24"/>
-              </w:rPr>
-            </w:pPr>
-            <w:r>
-              <w:rPr>
-                <w:rFonts w:ascii="Calibri" w:hAnsi="Calibri" w:cs="Calibri"/>
-                <w:sz w:val="24"/>
-              </w:rPr>
-              <w:t>Ignition</w:t>
-            </w:r>
-            <w:r>
-              <w:rPr>
-                <w:rFonts w:ascii="Calibri" w:hAnsi="Calibri" w:cs="Calibri"/>
-                <w:spacing w:val="-3"/>
-                <w:sz w:val="24"/>
-              </w:rPr>
-              <w:t xml:space="preserve"> </w:t>
-            </w:r>
-            <w:r>
-              <w:rPr>
-                <w:rFonts w:ascii="Calibri" w:hAnsi="Calibri" w:cs="Calibri"/>
-                <w:sz w:val="24"/>
-              </w:rPr>
-              <w:t>Transformer</w:t>
-            </w:r>
-          </w:p>
-        </w:tc>
-        <w:tc>
-          <w:tcPr>
-            <w:tcW w:w="775" w:type="pct"/>
-          </w:tcPr>
-          <w:p>
-            <w:pPr>
-              <w:pStyle w:val="TableParagraph"/>
-              <w:spacing w:before="26"/>
-              <w:ind w:left="93"/>
-              <w:rPr>
-                <w:sz w:val="24"/>
-              </w:rPr>
-            </w:pPr>
-            <w:r>
-              <w:rPr>
-                <w:rFonts w:ascii="Calibri" w:hAnsi="Calibri" w:cs="Calibri"/>
-                <w:sz w:val="24"/>
-              </w:rPr>
-              <w:t>2</w:t>
-            </w:r>
-            <w:r>
-              <w:rPr>
-                <w:rFonts w:ascii="Calibri" w:hAnsi="Calibri" w:cs="Calibri"/>
-                <w:spacing w:val="-1"/>
-                <w:sz w:val="24"/>
-              </w:rPr>
-              <w:t xml:space="preserve"> </w:t>
-            </w:r>
-            <w:r>
-              <w:rPr>
-                <w:rFonts w:ascii="Calibri" w:hAnsi="Calibri" w:cs="Calibri"/>
-                <w:sz w:val="24"/>
-              </w:rPr>
-              <w:t>Nos.</w:t>
-            </w:r>
-          </w:p>
-        </w:tc>
-      </w:tr>
-      <w:tr>
-        <w:trPr>
-          <w:trHeight w:val="369"/>
-        </w:trPr>
-        <w:tc>
-          <w:tcPr>
-            <w:tcW w:w="4225" w:type="pct"/>
-            <w:vAlign w:val="center"/>
-          </w:tcPr>
-          <w:p>
-            <w:pPr>
-              <w:pStyle w:val="TableParagraph"/>
-              <w:spacing w:before="25"/>
-              <w:rPr>
-                <w:sz w:val="24"/>
-              </w:rPr>
-            </w:pPr>
-            <w:r>
-              <w:rPr>
-                <w:rFonts w:ascii="Calibri" w:hAnsi="Calibri" w:cs="Calibri"/>
-                <w:sz w:val="24"/>
-              </w:rPr>
-              <w:t>UV</w:t>
-            </w:r>
-            <w:r>
-              <w:rPr>
-                <w:rFonts w:ascii="Calibri" w:hAnsi="Calibri" w:cs="Calibri"/>
-                <w:spacing w:val="-2"/>
-                <w:sz w:val="24"/>
-              </w:rPr>
-              <w:t xml:space="preserve"> </w:t>
-            </w:r>
-            <w:r>
-              <w:rPr>
-                <w:rFonts w:ascii="Calibri" w:hAnsi="Calibri" w:cs="Calibri"/>
-                <w:sz w:val="24"/>
-              </w:rPr>
-              <w:t>Sensor</w:t>
-            </w:r>
-          </w:p>
-        </w:tc>
-        <w:tc>
-          <w:tcPr>
-            <w:tcW w:w="775" w:type="pct"/>
-          </w:tcPr>
-          <w:p>
-            <w:pPr>
-              <w:pStyle w:val="TableParagraph"/>
-              <w:spacing w:before="25"/>
-              <w:ind w:left="93"/>
-              <w:rPr>
-                <w:sz w:val="24"/>
-              </w:rPr>
-            </w:pPr>
-            <w:r>
-              <w:rPr>
-                <w:rFonts w:ascii="Calibri" w:hAnsi="Calibri" w:cs="Calibri"/>
-                <w:sz w:val="24"/>
-              </w:rPr>
-              <w:t>2</w:t>
-            </w:r>
-            <w:r>
-              <w:rPr>
-                <w:rFonts w:ascii="Calibri" w:hAnsi="Calibri" w:cs="Calibri"/>
-                <w:spacing w:val="-1"/>
-                <w:sz w:val="24"/>
-              </w:rPr>
-              <w:t xml:space="preserve"> </w:t>
-            </w:r>
-            <w:r>
-              <w:rPr>
-                <w:rFonts w:ascii="Calibri" w:hAnsi="Calibri" w:cs="Calibri"/>
-                <w:sz w:val="24"/>
-              </w:rPr>
-              <w:t>Nos.</w:t>
-            </w:r>
-          </w:p>
-        </w:tc>
-      </w:tr>
-      <w:tr>
-        <w:trPr>
-          <w:trHeight w:val="369"/>
-        </w:trPr>
-        <w:tc>
-          <w:tcPr>
-            <w:tcW w:w="5000" w:type="pct"/>
-            <w:gridSpan w:val="2"/>
-            <w:vAlign w:val="center"/>
-          </w:tcPr>
-          <w:p>
-            <w:pPr>
-              <w:pStyle w:val="TableParagraph"/>
-              <w:spacing w:before="23"/>
-              <w:rPr>
-                <w:sz w:val="24"/>
-              </w:rPr>
-            </w:pPr>
-            <w:r>
-              <w:rPr>
-                <w:rFonts w:ascii="Calibri" w:hAnsi="Calibri" w:cs="Calibri"/>
-                <w:sz w:val="24"/>
-              </w:rPr>
-              <w:t>For</w:t>
-            </w:r>
-            <w:r>
-              <w:rPr>
-                <w:rFonts w:ascii="Calibri" w:hAnsi="Calibri" w:cs="Calibri"/>
-                <w:spacing w:val="-3"/>
-                <w:sz w:val="24"/>
-              </w:rPr>
-              <w:t xml:space="preserve"> </w:t>
-            </w:r>
-            <w:r>
-              <w:rPr>
-                <w:rFonts w:ascii="Calibri" w:hAnsi="Calibri" w:cs="Calibri"/>
-                <w:sz w:val="24"/>
-              </w:rPr>
-              <w:t>Pilot</w:t>
-            </w:r>
-            <w:r>
-              <w:rPr>
-                <w:rFonts w:ascii="Calibri" w:hAnsi="Calibri" w:cs="Calibri"/>
-                <w:spacing w:val="-1"/>
-                <w:sz w:val="24"/>
-              </w:rPr>
-              <w:t xml:space="preserve"> </w:t>
-            </w:r>
-            <w:r>
-              <w:rPr>
-                <w:rFonts w:ascii="Calibri" w:hAnsi="Calibri" w:cs="Calibri"/>
-                <w:sz w:val="24"/>
-              </w:rPr>
-              <w:t>Burner</w:t>
-            </w:r>
-          </w:p>
-        </w:tc>
-      </w:tr>
-      <w:tr>
-        <w:trPr>
-          <w:trHeight w:val="369"/>
-        </w:trPr>
-        <w:tc>
-          <w:tcPr>
-            <w:tcW w:w="4225" w:type="pct"/>
-            <w:vAlign w:val="center"/>
-          </w:tcPr>
-          <w:p>
-            <w:pPr>
-              <w:pStyle w:val="TableParagraph"/>
-              <w:spacing w:before="25"/>
-              <w:rPr>
-                <w:sz w:val="24"/>
-              </w:rPr>
-            </w:pPr>
-            <w:r>
-              <w:rPr>
-                <w:rFonts w:ascii="Calibri" w:hAnsi="Calibri" w:cs="Calibri"/>
-                <w:sz w:val="24"/>
-              </w:rPr>
-              <w:t>Pilot</w:t>
-            </w:r>
-            <w:r>
-              <w:rPr>
-                <w:rFonts w:ascii="Calibri" w:hAnsi="Calibri" w:cs="Calibri"/>
-                <w:spacing w:val="-3"/>
-                <w:sz w:val="24"/>
-              </w:rPr>
-              <w:t xml:space="preserve"> </w:t>
-            </w:r>
-            <w:r>
-              <w:rPr>
-                <w:rFonts w:ascii="Calibri" w:hAnsi="Calibri" w:cs="Calibri"/>
-                <w:sz w:val="24"/>
-              </w:rPr>
-              <w:t>regulator</w:t>
-            </w:r>
-          </w:p>
-        </w:tc>
-        <w:tc>
-          <w:tcPr>
-            <w:tcW w:w="775" w:type="pct"/>
-          </w:tcPr>
-          <w:p>
-            <w:pPr>
-              <w:pStyle w:val="TableParagraph"/>
-              <w:spacing w:before="25"/>
-              <w:ind w:left="93"/>
-              <w:rPr>
-                <w:sz w:val="24"/>
-              </w:rPr>
-            </w:pPr>
-            <w:r>
-              <w:rPr>
-                <w:rFonts w:ascii="Calibri" w:hAnsi="Calibri" w:cs="Calibri"/>
-                <w:sz w:val="24"/>
-              </w:rPr>
-              <w:t>2</w:t>
-            </w:r>
-            <w:r>
-              <w:rPr>
-                <w:rFonts w:ascii="Calibri" w:hAnsi="Calibri" w:cs="Calibri"/>
-                <w:spacing w:val="-1"/>
-                <w:sz w:val="24"/>
-              </w:rPr>
-              <w:t xml:space="preserve"> </w:t>
-            </w:r>
-            <w:r>
-              <w:rPr>
-                <w:rFonts w:ascii="Calibri" w:hAnsi="Calibri" w:cs="Calibri"/>
-                <w:sz w:val="24"/>
-              </w:rPr>
-              <w:t>Nos.</w:t>
-            </w:r>
-          </w:p>
-        </w:tc>
-      </w:tr>
-      <w:tr>
-        <w:trPr>
-          <w:trHeight w:val="369"/>
-        </w:trPr>
-        <w:tc>
-          <w:tcPr>
-            <w:tcW w:w="4225" w:type="pct"/>
-            <w:vAlign w:val="center"/>
-          </w:tcPr>
-          <w:p>
-            <w:pPr>
-              <w:pStyle w:val="TableParagraph"/>
-              <w:spacing w:before="25"/>
-              <w:rPr>
-                <w:sz w:val="24"/>
-              </w:rPr>
-            </w:pPr>
-            <w:r>
-              <w:rPr>
-                <w:rFonts w:ascii="Calibri" w:hAnsi="Calibri" w:cs="Calibri"/>
-                <w:sz w:val="24"/>
-              </w:rPr>
-              <w:t>Pilot Solenoid</w:t>
-            </w:r>
-            <w:r>
-              <w:rPr>
-                <w:rFonts w:ascii="Calibri" w:hAnsi="Calibri" w:cs="Calibri"/>
-                <w:spacing w:val="-2"/>
-                <w:sz w:val="24"/>
-              </w:rPr>
-              <w:t xml:space="preserve"> </w:t>
-            </w:r>
-            <w:r>
-              <w:rPr>
-                <w:rFonts w:ascii="Calibri" w:hAnsi="Calibri" w:cs="Calibri"/>
-                <w:sz w:val="24"/>
-              </w:rPr>
-              <w:t>Valve</w:t>
-            </w:r>
-          </w:p>
-        </w:tc>
-        <w:tc>
-          <w:tcPr>
-            <w:tcW w:w="775" w:type="pct"/>
-          </w:tcPr>
-          <w:p>
-            <w:pPr>
-              <w:pStyle w:val="TableParagraph"/>
-              <w:spacing w:before="25"/>
-              <w:ind w:left="93"/>
-              <w:rPr>
-                <w:sz w:val="24"/>
-              </w:rPr>
-            </w:pPr>
-            <w:r>
-              <w:rPr>
-                <w:rFonts w:ascii="Calibri" w:hAnsi="Calibri" w:cs="Calibri"/>
-                <w:sz w:val="24"/>
-              </w:rPr>
-              <w:t>2</w:t>
-            </w:r>
-            <w:r>
-              <w:rPr>
-                <w:rFonts w:ascii="Calibri" w:hAnsi="Calibri" w:cs="Calibri"/>
-                <w:spacing w:val="-1"/>
-                <w:sz w:val="24"/>
-              </w:rPr>
-              <w:t xml:space="preserve"> </w:t>
-            </w:r>
-            <w:r>
-              <w:rPr>
-                <w:rFonts w:ascii="Calibri" w:hAnsi="Calibri" w:cs="Calibri"/>
-                <w:sz w:val="24"/>
-              </w:rPr>
-              <w:t>Nos.</w:t>
-            </w:r>
-          </w:p>
-        </w:tc>
-      </w:tr>
-      <w:tr>
-        <w:trPr>
-          <w:trHeight w:val="369"/>
-        </w:trPr>
-        <w:tc>
-          <w:tcPr>
-            <w:tcW w:w="4225" w:type="pct"/>
-            <w:vAlign w:val="center"/>
-          </w:tcPr>
-          <w:p>
-            <w:pPr>
-              <w:pStyle w:val="TableParagraph"/>
-              <w:spacing w:before="23"/>
-              <w:rPr>
-                <w:sz w:val="24"/>
-              </w:rPr>
-            </w:pPr>
-            <w:r>
-              <w:rPr>
-                <w:rFonts w:ascii="Calibri" w:hAnsi="Calibri" w:cs="Calibri"/>
-                <w:sz w:val="24"/>
-              </w:rPr>
-              <w:t>Ball</w:t>
-            </w:r>
-            <w:r>
-              <w:rPr>
-                <w:rFonts w:ascii="Calibri" w:hAnsi="Calibri" w:cs="Calibri"/>
-                <w:spacing w:val="-3"/>
-                <w:sz w:val="24"/>
-              </w:rPr>
-              <w:t xml:space="preserve"> </w:t>
-            </w:r>
-            <w:r>
-              <w:rPr>
-                <w:rFonts w:ascii="Calibri" w:hAnsi="Calibri" w:cs="Calibri"/>
-                <w:sz w:val="24"/>
-              </w:rPr>
-              <w:t>Valve</w:t>
-            </w:r>
-          </w:p>
-        </w:tc>
-        <w:tc>
-          <w:tcPr>
-            <w:tcW w:w="775" w:type="pct"/>
-          </w:tcPr>
-          <w:p>
-            <w:pPr>
-              <w:pStyle w:val="TableParagraph"/>
-              <w:spacing w:before="23"/>
-              <w:ind w:left="93"/>
-              <w:rPr>
-                <w:sz w:val="24"/>
-              </w:rPr>
-            </w:pPr>
-            <w:r>
-              <w:rPr>
-                <w:rFonts w:ascii="Calibri" w:hAnsi="Calibri" w:cs="Calibri"/>
-                <w:sz w:val="24"/>
-              </w:rPr>
-              <w:t>2</w:t>
-            </w:r>
-            <w:r>
-              <w:rPr>
-                <w:rFonts w:ascii="Calibri" w:hAnsi="Calibri" w:cs="Calibri"/>
-                <w:spacing w:val="-1"/>
-                <w:sz w:val="24"/>
-              </w:rPr>
-              <w:t xml:space="preserve"> </w:t>
-            </w:r>
-            <w:r>
-              <w:rPr>
-                <w:rFonts w:ascii="Calibri" w:hAnsi="Calibri" w:cs="Calibri"/>
-                <w:sz w:val="24"/>
-              </w:rPr>
-              <w:t>Nos.</w:t>
-            </w:r>
-          </w:p>
-        </w:tc>
-      </w:tr>
-      <w:tr>
-        <w:trPr>
-          <w:trHeight w:val="369"/>
-        </w:trPr>
-        <w:tc>
-          <w:tcPr>
-            <w:tcW w:w="4225" w:type="pct"/>
-            <w:vAlign w:val="center"/>
-          </w:tcPr>
-          <w:p>
-            <w:pPr>
-              <w:pStyle w:val="TableParagraph"/>
-              <w:spacing w:before="23"/>
-              <w:rPr>
-                <w:sz w:val="24"/>
-              </w:rPr>
-            </w:pPr>
-            <w:r>
-              <w:rPr>
-                <w:rFonts w:ascii="Calibri" w:hAnsi="Calibri" w:cs="Calibri"/>
-                <w:sz w:val="24"/>
-              </w:rPr>
-              <w:t>Pressure</w:t>
-            </w:r>
-            <w:r>
-              <w:rPr>
-                <w:rFonts w:ascii="Calibri" w:hAnsi="Calibri" w:cs="Calibri"/>
-                <w:spacing w:val="-3"/>
-                <w:sz w:val="24"/>
-              </w:rPr>
-              <w:t xml:space="preserve"> </w:t>
-            </w:r>
-            <w:r>
-              <w:rPr>
-                <w:rFonts w:ascii="Calibri" w:hAnsi="Calibri" w:cs="Calibri"/>
-                <w:sz w:val="24"/>
-              </w:rPr>
-              <w:t>Gauge</w:t>
-            </w:r>
-            <w:r>
-              <w:rPr>
-                <w:rFonts w:ascii="Calibri" w:hAnsi="Calibri" w:cs="Calibri"/>
-                <w:spacing w:val="-1"/>
-                <w:sz w:val="24"/>
-              </w:rPr>
-              <w:t xml:space="preserve"> </w:t>
-            </w:r>
-          </w:p>
-        </w:tc>
-        <w:tc>
-          <w:tcPr>
-            <w:tcW w:w="775" w:type="pct"/>
-          </w:tcPr>
-          <w:p>
-            <w:pPr>
-              <w:pStyle w:val="TableParagraph"/>
-              <w:spacing w:before="23"/>
-              <w:ind w:left="93"/>
-              <w:rPr>
-                <w:sz w:val="24"/>
-              </w:rPr>
-            </w:pPr>
-            <w:r>
-              <w:rPr>
-                <w:rFonts w:ascii="Calibri" w:hAnsi="Calibri" w:cs="Calibri"/>
-                <w:sz w:val="24"/>
-              </w:rPr>
-              <w:t>2</w:t>
-            </w:r>
-            <w:r>
-              <w:rPr>
-                <w:rFonts w:ascii="Calibri" w:hAnsi="Calibri" w:cs="Calibri"/>
-                <w:spacing w:val="-1"/>
-                <w:sz w:val="24"/>
-              </w:rPr>
-              <w:t xml:space="preserve"> </w:t>
-            </w:r>
-            <w:r>
-              <w:rPr>
-                <w:rFonts w:ascii="Calibri" w:hAnsi="Calibri" w:cs="Calibri"/>
-                <w:sz w:val="24"/>
-              </w:rPr>
-              <w:t>Nos.</w:t>
-            </w:r>
-          </w:p>
-        </w:tc>
-      </w:tr>
-      <w:tr>
-        <w:trPr>
-          <w:trHeight w:val="369"/>
-        </w:trPr>
-        <w:tc>
-          <w:tcPr>
-            <w:tcW w:w="4225" w:type="pct"/>
-            <w:vAlign w:val="center"/>
-          </w:tcPr>
-          <w:p>
-            <w:pPr>
-              <w:pStyle w:val="TableParagraph"/>
-              <w:spacing w:before="23"/>
-              <w:rPr>
-                <w:sz w:val="24"/>
-              </w:rPr>
-            </w:pPr>
-            <w:r>
-              <w:rPr>
-                <w:rFonts w:ascii="Calibri" w:hAnsi="Calibri" w:cs="Calibri"/>
-                <w:sz w:val="24"/>
-              </w:rPr>
-              <w:t>Flexible</w:t>
-            </w:r>
-            <w:r>
-              <w:rPr>
-                <w:rFonts w:ascii="Calibri" w:hAnsi="Calibri" w:cs="Calibri"/>
-                <w:spacing w:val="-2"/>
-                <w:sz w:val="24"/>
-              </w:rPr>
-              <w:t xml:space="preserve"> </w:t>
-            </w:r>
-            <w:r>
-              <w:rPr>
-                <w:rFonts w:ascii="Calibri" w:hAnsi="Calibri" w:cs="Calibri"/>
-                <w:sz w:val="24"/>
-              </w:rPr>
-              <w:t>Ho</w:t>
-            </w:r>
-            <w:r>
-              <w:rPr>
-                <w:rFonts w:ascii="Calibri" w:hAnsi="Calibri" w:cs="Calibri"/>
-                <w:sz w:val="24"/>
-              </w:rPr>
-              <w:t>se</w:t>
-            </w:r>
-            <w:r>
-              <w:rPr>
-                <w:rFonts w:ascii="Calibri" w:hAnsi="Calibri" w:cs="Calibri"/>
-                <w:spacing w:val="-3"/>
-                <w:sz w:val="24"/>
-              </w:rPr>
-              <w:t xml:space="preserve"> </w:t>
-            </w:r>
-          </w:p>
-        </w:tc>
-        <w:tc>
-          <w:tcPr>
-            <w:tcW w:w="775" w:type="pct"/>
-          </w:tcPr>
-          <w:p>
-            <w:pPr>
-              <w:pStyle w:val="TableParagraph"/>
-              <w:spacing w:before="23"/>
-              <w:ind w:left="93"/>
-              <w:rPr>
-                <w:sz w:val="24"/>
-              </w:rPr>
-            </w:pPr>
-            <w:r>
-              <w:rPr>
-                <w:rFonts w:ascii="Calibri" w:hAnsi="Calibri" w:cs="Calibri"/>
-                <w:sz w:val="24"/>
-              </w:rPr>
-              <w:t>1</w:t>
-            </w:r>
-            <w:r>
-              <w:rPr>
-                <w:rFonts w:ascii="Calibri" w:hAnsi="Calibri" w:cs="Calibri"/>
-                <w:spacing w:val="-1"/>
-                <w:sz w:val="24"/>
-              </w:rPr>
-              <w:t xml:space="preserve"> </w:t>
-            </w:r>
-            <w:r>
-              <w:rPr>
-                <w:rFonts w:ascii="Calibri" w:hAnsi="Calibri" w:cs="Calibri"/>
-                <w:sz w:val="24"/>
-              </w:rPr>
-              <w:t>set</w:t>
-            </w:r>
-          </w:p>
-        </w:tc>
-      </w:tr>
-      <w:tr>
-        <w:trPr>
-          <w:trHeight w:val="369"/>
-        </w:trPr>
-        <w:tc>
-          <w:tcPr>
-            <w:tcW w:w="4225" w:type="pct"/>
-            <w:vAlign w:val="center"/>
-          </w:tcPr>
-          <w:p>
-            <w:pPr>
-              <w:pStyle w:val="TableParagraph"/>
-              <w:spacing w:before="19"/>
-              <w:rPr>
-                <w:sz w:val="24"/>
-              </w:rPr>
-            </w:pPr>
-            <w:r>
-              <w:rPr>
-                <w:rFonts w:ascii="Calibri" w:hAnsi="Calibri" w:cs="Calibri"/>
-                <w:sz w:val="24"/>
-              </w:rPr>
-              <w:t>Pneumatic</w:t>
-            </w:r>
-            <w:r>
-              <w:rPr>
-                <w:rFonts w:ascii="Calibri" w:hAnsi="Calibri" w:cs="Calibri"/>
-                <w:sz w:val="24"/>
-              </w:rPr>
-              <w:t xml:space="preserve"> </w:t>
-            </w:r>
-            <w:r>
-              <w:rPr>
-                <w:rFonts w:ascii="Calibri" w:hAnsi="Calibri" w:cs="Calibri"/>
-                <w:sz w:val="24"/>
-              </w:rPr>
-              <w:t>Shut</w:t>
-            </w:r>
-            <w:r>
-              <w:rPr>
-                <w:rFonts w:ascii="Calibri" w:hAnsi="Calibri" w:cs="Calibri"/>
-                <w:spacing w:val="-1"/>
-                <w:sz w:val="24"/>
-              </w:rPr>
-              <w:t xml:space="preserve"> </w:t>
-            </w:r>
-            <w:r>
-              <w:rPr>
-                <w:rFonts w:ascii="Calibri" w:hAnsi="Calibri" w:cs="Calibri"/>
-                <w:sz w:val="24"/>
-              </w:rPr>
-              <w:t>O</w:t>
-            </w:r>
-            <w:r>
-              <w:rPr>
-                <w:rFonts w:ascii="Calibri" w:hAnsi="Calibri" w:cs="Calibri"/>
-                <w:sz w:val="24"/>
-              </w:rPr>
-              <w:t>f</w:t>
-            </w:r>
-            <w:r>
-              <w:rPr>
-                <w:rFonts w:ascii="Calibri" w:hAnsi="Calibri" w:cs="Calibri"/>
-                <w:sz w:val="24"/>
-              </w:rPr>
-              <w:t>f</w:t>
-            </w:r>
-            <w:r>
-              <w:rPr>
-                <w:rFonts w:ascii="Calibri" w:hAnsi="Calibri" w:cs="Calibri"/>
-                <w:spacing w:val="-2"/>
-                <w:sz w:val="24"/>
-              </w:rPr>
-              <w:t xml:space="preserve"> </w:t>
-            </w:r>
-            <w:r>
-              <w:rPr>
-                <w:rFonts w:ascii="Calibri" w:hAnsi="Calibri" w:cs="Calibri"/>
-                <w:sz w:val="24"/>
-              </w:rPr>
-              <w:t>Valve</w:t>
-            </w:r>
-            <w:r>
-              <w:rPr>
-                <w:rFonts w:ascii="Calibri" w:hAnsi="Calibri" w:cs="Calibri"/>
-                <w:spacing w:val="-1"/>
-                <w:sz w:val="24"/>
-              </w:rPr>
-              <w:t xml:space="preserve"> </w:t>
-            </w:r>
-            <w:r>
-              <w:rPr>
-                <w:rFonts w:ascii="Calibri" w:hAnsi="Calibri" w:cs="Calibri"/>
-                <w:sz w:val="24"/>
-              </w:rPr>
-              <w:t>Air</w:t>
-            </w:r>
-          </w:p>
-        </w:tc>
-        <w:tc>
-          <w:tcPr>
-            <w:tcW w:w="775" w:type="pct"/>
-          </w:tcPr>
-          <w:p>
-            <w:pPr>
-              <w:pStyle w:val="TableParagraph"/>
-              <w:spacing w:before="19"/>
-              <w:rPr>
-                <w:sz w:val="24"/>
-              </w:rPr>
-            </w:pPr>
-            <w:r>
-              <w:rPr>
-                <w:rFonts w:ascii="Calibri" w:hAnsi="Calibri" w:cs="Calibri"/>
-                <w:sz w:val="24"/>
-              </w:rPr>
-              <w:t>2</w:t>
-            </w:r>
-            <w:r>
-              <w:rPr>
-                <w:rFonts w:ascii="Calibri" w:hAnsi="Calibri" w:cs="Calibri"/>
-                <w:spacing w:val="-1"/>
-                <w:sz w:val="24"/>
-              </w:rPr>
-              <w:t xml:space="preserve"> </w:t>
-            </w:r>
-            <w:r>
-              <w:rPr>
-                <w:rFonts w:ascii="Calibri" w:hAnsi="Calibri" w:cs="Calibri"/>
-                <w:sz w:val="24"/>
-              </w:rPr>
-              <w:t>Nos.</w:t>
-            </w:r>
-          </w:p>
-        </w:tc>
-      </w:tr>
-      <w:tr>
-        <w:trPr>
-          <w:trHeight w:val="369"/>
-        </w:trPr>
-        <w:tc>
-          <w:tcPr>
-            <w:tcW w:w="4225" w:type="pct"/>
-            <w:vAlign w:val="center"/>
-          </w:tcPr>
-          <w:p>
-            <w:pPr>
-              <w:pStyle w:val="TableParagraph"/>
-              <w:spacing w:before="22"/>
-              <w:rPr>
-                <w:sz w:val="24"/>
-              </w:rPr>
-            </w:pPr>
-            <w:r>
-              <w:rPr>
-                <w:rFonts w:ascii="Calibri" w:hAnsi="Calibri" w:cs="Calibri"/>
-                <w:sz w:val="24"/>
-              </w:rPr>
-              <w:t xml:space="preserve">Pneumatic </w:t>
-            </w:r>
-            <w:r>
-              <w:rPr>
-                <w:rFonts w:ascii="Calibri" w:hAnsi="Calibri" w:cs="Calibri"/>
-                <w:sz w:val="24"/>
-              </w:rPr>
-              <w:t>Flow</w:t>
-            </w:r>
-            <w:r>
-              <w:rPr>
-                <w:rFonts w:ascii="Calibri" w:hAnsi="Calibri" w:cs="Calibri"/>
-                <w:spacing w:val="-1"/>
-                <w:sz w:val="24"/>
-              </w:rPr>
-              <w:t xml:space="preserve"> </w:t>
-            </w:r>
-            <w:r>
-              <w:rPr>
-                <w:rFonts w:ascii="Calibri" w:hAnsi="Calibri" w:cs="Calibri"/>
-                <w:sz w:val="24"/>
-              </w:rPr>
-              <w:t>Control Valve</w:t>
-            </w:r>
-            <w:r>
-              <w:rPr>
-                <w:rFonts w:ascii="Calibri" w:hAnsi="Calibri" w:cs="Calibri"/>
-                <w:spacing w:val="-1"/>
-                <w:sz w:val="24"/>
-              </w:rPr>
-              <w:t xml:space="preserve"> </w:t>
-            </w:r>
-            <w:r>
-              <w:rPr>
-                <w:rFonts w:ascii="Calibri" w:hAnsi="Calibri" w:cs="Calibri"/>
-                <w:sz w:val="24"/>
-              </w:rPr>
-              <w:t xml:space="preserve">– </w:t>
-            </w:r>
-            <w:r>
-              <w:rPr>
-                <w:rFonts w:ascii="Calibri" w:hAnsi="Calibri" w:cs="Calibri"/>
-                <w:sz w:val="24"/>
-              </w:rPr>
-              <w:t>AIR</w:t>
-            </w:r>
-          </w:p>
-        </w:tc>
-        <w:tc>
-          <w:tcPr>
-            <w:tcW w:w="775" w:type="pct"/>
-          </w:tcPr>
-          <w:p>
-            <w:pPr>
-              <w:pStyle w:val="TableParagraph"/>
-              <w:spacing w:before="22"/>
-              <w:rPr>
-                <w:sz w:val="24"/>
-              </w:rPr>
-            </w:pPr>
-            <w:r>
-              <w:rPr>
-                <w:rFonts w:ascii="Calibri" w:hAnsi="Calibri" w:cs="Calibri"/>
-                <w:sz w:val="24"/>
-              </w:rPr>
-              <w:t>1</w:t>
-            </w:r>
-            <w:r>
-              <w:rPr>
-                <w:rFonts w:ascii="Calibri" w:hAnsi="Calibri" w:cs="Calibri"/>
-                <w:spacing w:val="-1"/>
-                <w:sz w:val="24"/>
-              </w:rPr>
-              <w:t xml:space="preserve"> </w:t>
-            </w:r>
-            <w:r>
-              <w:rPr>
-                <w:rFonts w:ascii="Calibri" w:hAnsi="Calibri" w:cs="Calibri"/>
-                <w:sz w:val="24"/>
-              </w:rPr>
-              <w:t>Nos.</w:t>
-            </w:r>
-          </w:p>
-        </w:tc>
-      </w:tr>
-      <w:tr>
-        <w:trPr>
-          <w:trHeight w:val="369"/>
-        </w:trPr>
-        <w:tc>
-          <w:tcPr>
-            <w:tcW w:w="4225" w:type="pct"/>
-            <w:vAlign w:val="center"/>
-          </w:tcPr>
-          <w:p>
-            <w:pPr>
-              <w:pStyle w:val="TableParagraph"/>
-              <w:spacing w:before="22"/>
-              <w:rPr>
-                <w:sz w:val="24"/>
-              </w:rPr>
-            </w:pPr>
-            <w:r>
-              <w:rPr>
-                <w:rFonts w:ascii="Calibri" w:hAnsi="Calibri" w:cs="Calibri"/>
-                <w:sz w:val="24"/>
-              </w:rPr>
-              <w:t>DPT</w:t>
-            </w:r>
-            <w:r>
-              <w:rPr>
-                <w:rFonts w:ascii="Calibri" w:hAnsi="Calibri" w:cs="Calibri"/>
-                <w:spacing w:val="-1"/>
-                <w:sz w:val="24"/>
-              </w:rPr>
-              <w:t xml:space="preserve"> </w:t>
-            </w:r>
-            <w:r>
-              <w:rPr>
-                <w:rFonts w:ascii="Calibri" w:hAnsi="Calibri" w:cs="Calibri"/>
-                <w:sz w:val="24"/>
-              </w:rPr>
-              <w:t xml:space="preserve">With </w:t>
-            </w:r>
-            <w:r>
-              <w:rPr>
-                <w:rFonts w:ascii="Calibri" w:hAnsi="Calibri" w:cs="Calibri"/>
-                <w:sz w:val="24"/>
-              </w:rPr>
-              <w:t>Orifice</w:t>
-            </w:r>
-            <w:r>
-              <w:rPr>
-                <w:rFonts w:ascii="Calibri" w:hAnsi="Calibri" w:cs="Calibri"/>
-                <w:spacing w:val="-3"/>
-                <w:sz w:val="24"/>
-              </w:rPr>
-              <w:t xml:space="preserve"> </w:t>
-            </w:r>
-            <w:r>
-              <w:rPr>
-                <w:rFonts w:ascii="Calibri" w:hAnsi="Calibri" w:cs="Calibri"/>
-                <w:sz w:val="24"/>
-              </w:rPr>
-              <w:t>Plate</w:t>
-            </w:r>
-            <w:r>
-              <w:rPr>
-                <w:rFonts w:ascii="Calibri" w:hAnsi="Calibri" w:cs="Calibri"/>
-                <w:sz w:val="24"/>
-              </w:rPr>
-              <w:t xml:space="preserve"> - Air</w:t>
-            </w:r>
-          </w:p>
-        </w:tc>
-        <w:tc>
-          <w:tcPr>
-            <w:tcW w:w="775" w:type="pct"/>
-          </w:tcPr>
-          <w:p>
-            <w:pPr>
-              <w:pStyle w:val="TableParagraph"/>
-              <w:spacing w:before="22"/>
-              <w:rPr>
-                <w:sz w:val="24"/>
-              </w:rPr>
-            </w:pPr>
-            <w:r>
-              <w:rPr>
-                <w:rFonts w:ascii="Calibri" w:hAnsi="Calibri" w:cs="Calibri"/>
-                <w:sz w:val="24"/>
-              </w:rPr>
-              <w:t>1</w:t>
-            </w:r>
-            <w:r>
-              <w:rPr>
-                <w:rFonts w:ascii="Calibri" w:hAnsi="Calibri" w:cs="Calibri"/>
-                <w:spacing w:val="-1"/>
-                <w:sz w:val="24"/>
-              </w:rPr>
-              <w:t xml:space="preserve"> </w:t>
-            </w:r>
-            <w:r>
-              <w:rPr>
-                <w:rFonts w:ascii="Calibri" w:hAnsi="Calibri" w:cs="Calibri"/>
-                <w:sz w:val="24"/>
-              </w:rPr>
-              <w:t>Nos.</w:t>
-            </w:r>
-          </w:p>
-        </w:tc>
-      </w:tr>
-      <w:tr>
-        <w:trPr>
-          <w:trHeight w:val="369"/>
-        </w:trPr>
-        <w:tc>
-          <w:tcPr>
-            <w:tcW w:w="4225" w:type="pct"/>
-            <w:vAlign w:val="center"/>
-          </w:tcPr>
-          <w:p>
-            <w:pPr>
-              <w:pStyle w:val="TableParagraph"/>
-              <w:spacing w:before="22"/>
-              <w:rPr>
-                <w:sz w:val="24"/>
-              </w:rPr>
-            </w:pPr>
-            <w:r>
-              <w:rPr>
-                <w:rFonts w:ascii="Calibri" w:hAnsi="Calibri" w:cs="Calibri"/>
-                <w:sz w:val="24"/>
-              </w:rPr>
-              <w:t>Pressure</w:t>
-            </w:r>
-            <w:r>
-              <w:rPr>
-                <w:rFonts w:ascii="Calibri" w:hAnsi="Calibri" w:cs="Calibri"/>
-                <w:spacing w:val="-3"/>
-                <w:sz w:val="24"/>
-              </w:rPr>
-              <w:t xml:space="preserve"> </w:t>
-            </w:r>
-            <w:r>
-              <w:rPr>
-                <w:rFonts w:ascii="Calibri" w:hAnsi="Calibri" w:cs="Calibri"/>
-                <w:sz w:val="24"/>
-              </w:rPr>
-              <w:t>Gauge</w:t>
-            </w:r>
-            <w:r>
-              <w:rPr>
-                <w:rFonts w:ascii="Calibri" w:hAnsi="Calibri" w:cs="Calibri"/>
-                <w:spacing w:val="-1"/>
-                <w:sz w:val="24"/>
-              </w:rPr>
-              <w:t xml:space="preserve"> </w:t>
-            </w:r>
-          </w:p>
-        </w:tc>
-        <w:tc>
-          <w:tcPr>
-            <w:tcW w:w="775" w:type="pct"/>
-          </w:tcPr>
-          <w:p>
-            <w:pPr>
-              <w:pStyle w:val="TableParagraph"/>
-              <w:spacing w:before="22"/>
-              <w:rPr>
-                <w:sz w:val="24"/>
-              </w:rPr>
-            </w:pPr>
-            <w:r>
-              <w:rPr>
-                <w:rFonts w:ascii="Calibri" w:hAnsi="Calibri" w:cs="Calibri"/>
-                <w:sz w:val="24"/>
-              </w:rPr>
-              <w:t>2</w:t>
-            </w:r>
-            <w:r>
-              <w:rPr>
-                <w:rFonts w:ascii="Calibri" w:hAnsi="Calibri" w:cs="Calibri"/>
-                <w:spacing w:val="-1"/>
-                <w:sz w:val="24"/>
-              </w:rPr>
-              <w:t xml:space="preserve"> </w:t>
-            </w:r>
-            <w:r>
-              <w:rPr>
-                <w:rFonts w:ascii="Calibri" w:hAnsi="Calibri" w:cs="Calibri"/>
-                <w:sz w:val="24"/>
-              </w:rPr>
-              <w:t>Nos.</w:t>
-            </w:r>
-          </w:p>
-        </w:tc>
-      </w:tr>
-      <w:tr>
-        <w:trPr>
-          <w:trHeight w:val="369"/>
-        </w:trPr>
-        <w:tc>
-          <w:tcPr>
-            <w:tcW w:w="4225" w:type="pct"/>
-            <w:vAlign w:val="center"/>
-          </w:tcPr>
-          <w:p>
-            <w:pPr>
-              <w:pStyle w:val="TableParagraph"/>
-              <w:spacing w:before="19"/>
-              <w:rPr>
-                <w:sz w:val="24"/>
-              </w:rPr>
-            </w:pPr>
-            <w:r>
-              <w:rPr>
-                <w:rFonts w:ascii="Calibri" w:hAnsi="Calibri" w:cs="Calibri"/>
-                <w:sz w:val="24"/>
-              </w:rPr>
-              <w:t xml:space="preserve">Pneumatic </w:t>
-            </w:r>
-            <w:r>
-              <w:rPr>
-                <w:rFonts w:ascii="Calibri" w:hAnsi="Calibri" w:cs="Calibri"/>
-                <w:sz w:val="24"/>
-              </w:rPr>
-              <w:t>Shut</w:t>
-            </w:r>
-            <w:r>
-              <w:rPr>
-                <w:rFonts w:ascii="Calibri" w:hAnsi="Calibri" w:cs="Calibri"/>
-                <w:spacing w:val="-1"/>
-                <w:sz w:val="24"/>
-              </w:rPr>
-              <w:t xml:space="preserve"> </w:t>
-            </w:r>
-            <w:r>
-              <w:rPr>
-                <w:rFonts w:ascii="Calibri" w:hAnsi="Calibri" w:cs="Calibri"/>
-                <w:sz w:val="24"/>
-              </w:rPr>
-              <w:t>Of</w:t>
-            </w:r>
-            <w:r>
-              <w:rPr>
-                <w:rFonts w:ascii="Calibri" w:hAnsi="Calibri" w:cs="Calibri"/>
-                <w:sz w:val="24"/>
-              </w:rPr>
-              <w:t>f</w:t>
-            </w:r>
-            <w:r>
-              <w:rPr>
-                <w:rFonts w:ascii="Calibri" w:hAnsi="Calibri" w:cs="Calibri"/>
-                <w:spacing w:val="-1"/>
-                <w:sz w:val="24"/>
-              </w:rPr>
-              <w:t xml:space="preserve"> </w:t>
-            </w:r>
-            <w:r>
-              <w:rPr>
-                <w:rFonts w:ascii="Calibri" w:hAnsi="Calibri" w:cs="Calibri"/>
-                <w:sz w:val="24"/>
-              </w:rPr>
-              <w:t>Valve</w:t>
-            </w:r>
-            <w:r>
-              <w:rPr>
-                <w:rFonts w:ascii="Calibri" w:hAnsi="Calibri" w:cs="Calibri"/>
-                <w:spacing w:val="-1"/>
-                <w:sz w:val="24"/>
-              </w:rPr>
-              <w:t xml:space="preserve"> </w:t>
-            </w:r>
-            <w:r>
-              <w:rPr>
-                <w:rFonts w:ascii="Calibri" w:hAnsi="Calibri" w:cs="Calibri"/>
-                <w:sz w:val="24"/>
-              </w:rPr>
-              <w:t>Flue</w:t>
-            </w:r>
-            <w:r>
-              <w:rPr>
-                <w:rFonts w:ascii="Calibri" w:hAnsi="Calibri" w:cs="Calibri"/>
-                <w:spacing w:val="-1"/>
-                <w:sz w:val="24"/>
-              </w:rPr>
-              <w:t xml:space="preserve"> </w:t>
-            </w:r>
-            <w:r>
-              <w:rPr>
-                <w:rFonts w:ascii="Calibri" w:hAnsi="Calibri" w:cs="Calibri"/>
-                <w:sz w:val="24"/>
-              </w:rPr>
-              <w:t>Gas</w:t>
-            </w:r>
-            <w:r>
-              <w:rPr>
-                <w:rFonts w:ascii="Calibri" w:hAnsi="Calibri" w:cs="Calibri"/>
-                <w:spacing w:val="1"/>
-                <w:sz w:val="24"/>
-              </w:rPr>
-              <w:t xml:space="preserve"> </w:t>
-            </w:r>
-          </w:p>
-        </w:tc>
-        <w:tc>
-          <w:tcPr>
-            <w:tcW w:w="775" w:type="pct"/>
-          </w:tcPr>
-          <w:p>
-            <w:pPr>
-              <w:pStyle w:val="TableParagraph"/>
-              <w:spacing w:before="19"/>
-              <w:rPr>
-                <w:sz w:val="24"/>
-              </w:rPr>
-            </w:pPr>
-            <w:r>
-              <w:rPr>
-                <w:rFonts w:ascii="Calibri" w:hAnsi="Calibri" w:cs="Calibri"/>
-                <w:sz w:val="24"/>
-              </w:rPr>
-              <w:t>2</w:t>
-            </w:r>
-            <w:r>
-              <w:rPr>
-                <w:rFonts w:ascii="Calibri" w:hAnsi="Calibri" w:cs="Calibri"/>
-                <w:spacing w:val="-1"/>
-                <w:sz w:val="24"/>
-              </w:rPr>
-              <w:t xml:space="preserve"> </w:t>
-            </w:r>
-            <w:r>
-              <w:rPr>
-                <w:rFonts w:ascii="Calibri" w:hAnsi="Calibri" w:cs="Calibri"/>
-                <w:sz w:val="24"/>
-              </w:rPr>
-              <w:t>Nos.</w:t>
-            </w:r>
-          </w:p>
-        </w:tc>
-      </w:tr>
-      <w:tr>
-        <w:trPr>
-          <w:trHeight w:val="369"/>
-        </w:trPr>
-        <w:tc>
-          <w:tcPr>
-            <w:tcW w:w="4225" w:type="pct"/>
-            <w:vAlign w:val="center"/>
-          </w:tcPr>
-          <w:p>
-            <w:pPr>
-              <w:pStyle w:val="TableParagraph"/>
-              <w:spacing w:before="19"/>
-              <w:rPr>
-                <w:sz w:val="24"/>
-              </w:rPr>
-            </w:pPr>
-            <w:r>
-              <w:rPr>
-                <w:rFonts w:ascii="Calibri" w:hAnsi="Calibri" w:cs="Calibri"/>
-                <w:sz w:val="24"/>
-              </w:rPr>
-              <w:t xml:space="preserve">Pneumatic </w:t>
-            </w:r>
-            <w:r>
-              <w:rPr>
-                <w:rFonts w:ascii="Calibri" w:hAnsi="Calibri" w:cs="Calibri"/>
-                <w:sz w:val="24"/>
-              </w:rPr>
-              <w:t>Control</w:t>
-            </w:r>
-            <w:r>
-              <w:rPr>
-                <w:rFonts w:ascii="Calibri" w:hAnsi="Calibri" w:cs="Calibri"/>
-                <w:spacing w:val="59"/>
-                <w:sz w:val="24"/>
-              </w:rPr>
-              <w:t xml:space="preserve"> </w:t>
-            </w:r>
-            <w:r>
-              <w:rPr>
-                <w:rFonts w:ascii="Calibri" w:hAnsi="Calibri" w:cs="Calibri"/>
-                <w:sz w:val="24"/>
-              </w:rPr>
-              <w:t>Valve</w:t>
-            </w:r>
-            <w:r>
-              <w:rPr>
-                <w:rFonts w:ascii="Calibri" w:hAnsi="Calibri" w:cs="Calibri"/>
-                <w:spacing w:val="-1"/>
-                <w:sz w:val="24"/>
-              </w:rPr>
-              <w:t xml:space="preserve"> </w:t>
-            </w:r>
-            <w:r>
-              <w:rPr>
-                <w:rFonts w:ascii="Calibri" w:hAnsi="Calibri" w:cs="Calibri"/>
-                <w:sz w:val="24"/>
-              </w:rPr>
-              <w:t>Flue Gas</w:t>
-            </w:r>
-            <w:r>
-              <w:rPr>
-                <w:rFonts w:ascii="Calibri" w:hAnsi="Calibri" w:cs="Calibri"/>
-                <w:spacing w:val="1"/>
-                <w:sz w:val="24"/>
-              </w:rPr>
-              <w:t xml:space="preserve"> </w:t>
-            </w:r>
-          </w:p>
-        </w:tc>
-        <w:tc>
-          <w:tcPr>
-            <w:tcW w:w="775" w:type="pct"/>
-          </w:tcPr>
-          <w:p>
-            <w:pPr>
-              <w:pStyle w:val="TableParagraph"/>
-              <w:spacing w:before="19"/>
-              <w:rPr>
-                <w:sz w:val="24"/>
-              </w:rPr>
-            </w:pPr>
-            <w:r>
-              <w:rPr>
-                <w:rFonts w:ascii="Calibri" w:hAnsi="Calibri" w:cs="Calibri"/>
-                <w:sz w:val="24"/>
-              </w:rPr>
-              <w:t>1</w:t>
-            </w:r>
-            <w:r>
-              <w:rPr>
-                <w:rFonts w:ascii="Calibri" w:hAnsi="Calibri" w:cs="Calibri"/>
-                <w:spacing w:val="-1"/>
-                <w:sz w:val="24"/>
-              </w:rPr>
-              <w:t xml:space="preserve"> </w:t>
-            </w:r>
-            <w:r>
-              <w:rPr>
-                <w:rFonts w:ascii="Calibri" w:hAnsi="Calibri" w:cs="Calibri"/>
-                <w:sz w:val="24"/>
-              </w:rPr>
-              <w:t>Nos.</w:t>
-            </w:r>
-          </w:p>
-        </w:tc>
-      </w:tr>
-      <w:tr>
-        <w:trPr>
-          <w:trHeight w:val="369"/>
-        </w:trPr>
-        <w:tc>
-          <w:tcPr>
-            <w:tcW w:w="4225" w:type="pct"/>
-            <w:vAlign w:val="center"/>
-          </w:tcPr>
-          <w:p>
-            <w:pPr>
-              <w:pStyle w:val="TableParagraph"/>
-              <w:spacing w:before="19"/>
-              <w:rPr>
-                <w:sz w:val="24"/>
-              </w:rPr>
-            </w:pPr>
-            <w:r>
-              <w:rPr>
-                <w:rFonts w:ascii="Calibri" w:hAnsi="Calibri" w:cs="Calibri"/>
-                <w:sz w:val="24"/>
-              </w:rPr>
-              <w:t xml:space="preserve">Pneumatic </w:t>
-            </w:r>
-            <w:r>
-              <w:rPr>
-                <w:rFonts w:ascii="Calibri" w:hAnsi="Calibri" w:cs="Calibri"/>
-                <w:sz w:val="24"/>
-              </w:rPr>
-              <w:t>Flow</w:t>
-            </w:r>
-            <w:r>
-              <w:rPr>
-                <w:rFonts w:ascii="Calibri" w:hAnsi="Calibri" w:cs="Calibri"/>
-                <w:spacing w:val="-2"/>
-                <w:sz w:val="24"/>
-              </w:rPr>
-              <w:t xml:space="preserve"> </w:t>
-            </w:r>
-            <w:r>
-              <w:rPr>
-                <w:rFonts w:ascii="Calibri" w:hAnsi="Calibri" w:cs="Calibri"/>
-                <w:sz w:val="24"/>
-              </w:rPr>
-              <w:t>Control</w:t>
-            </w:r>
-            <w:r>
-              <w:rPr>
-                <w:rFonts w:ascii="Calibri" w:hAnsi="Calibri" w:cs="Calibri"/>
-                <w:spacing w:val="-1"/>
-                <w:sz w:val="24"/>
-              </w:rPr>
-              <w:t xml:space="preserve"> </w:t>
-            </w:r>
-            <w:r>
-              <w:rPr>
-                <w:rFonts w:ascii="Calibri" w:hAnsi="Calibri" w:cs="Calibri"/>
-                <w:sz w:val="24"/>
-              </w:rPr>
-              <w:t>Valve</w:t>
-            </w:r>
-            <w:r>
-              <w:rPr>
-                <w:rFonts w:ascii="Calibri" w:hAnsi="Calibri" w:cs="Calibri"/>
-                <w:spacing w:val="-1"/>
-                <w:sz w:val="24"/>
-              </w:rPr>
-              <w:t xml:space="preserve"> </w:t>
-            </w:r>
-            <w:r>
-              <w:rPr>
-                <w:rFonts w:ascii="Calibri" w:hAnsi="Calibri" w:cs="Calibri"/>
-                <w:sz w:val="24"/>
-              </w:rPr>
-              <w:t>-Gas</w:t>
-            </w:r>
-          </w:p>
-        </w:tc>
-        <w:tc>
-          <w:tcPr>
-            <w:tcW w:w="775" w:type="pct"/>
-          </w:tcPr>
-          <w:p>
-            <w:pPr>
-              <w:pStyle w:val="TableParagraph"/>
-              <w:spacing w:before="19"/>
-              <w:rPr>
-                <w:sz w:val="24"/>
-              </w:rPr>
-            </w:pPr>
-            <w:r>
-              <w:rPr>
-                <w:rFonts w:ascii="Calibri" w:hAnsi="Calibri" w:cs="Calibri"/>
-                <w:sz w:val="24"/>
-              </w:rPr>
-              <w:t>1</w:t>
-            </w:r>
-            <w:r>
-              <w:rPr>
-                <w:rFonts w:ascii="Calibri" w:hAnsi="Calibri" w:cs="Calibri"/>
-                <w:spacing w:val="-1"/>
-                <w:sz w:val="24"/>
-              </w:rPr>
-              <w:t xml:space="preserve"> </w:t>
-            </w:r>
-            <w:r>
-              <w:rPr>
-                <w:rFonts w:ascii="Calibri" w:hAnsi="Calibri" w:cs="Calibri"/>
-                <w:sz w:val="24"/>
-              </w:rPr>
-              <w:t>Nos.</w:t>
-            </w:r>
-          </w:p>
-        </w:tc>
-      </w:tr>
-      <w:tr>
-        <w:trPr>
-          <w:trHeight w:val="369"/>
-        </w:trPr>
-        <w:tc>
-          <w:tcPr>
-            <w:tcW w:w="4225" w:type="pct"/>
-            <w:vAlign w:val="center"/>
-          </w:tcPr>
-          <w:p>
-            <w:pPr>
-              <w:pStyle w:val="TableParagraph"/>
-              <w:spacing w:before="22"/>
-              <w:rPr>
-                <w:sz w:val="24"/>
-              </w:rPr>
-            </w:pPr>
-            <w:r>
-              <w:rPr>
-                <w:rFonts w:ascii="Calibri" w:hAnsi="Calibri" w:cs="Calibri"/>
-                <w:sz w:val="24"/>
-              </w:rPr>
-              <w:t>DPT</w:t>
-            </w:r>
-            <w:r>
-              <w:rPr>
-                <w:rFonts w:ascii="Calibri" w:hAnsi="Calibri" w:cs="Calibri"/>
-                <w:spacing w:val="-1"/>
-                <w:sz w:val="24"/>
-              </w:rPr>
-              <w:t xml:space="preserve"> </w:t>
-            </w:r>
-            <w:r>
-              <w:rPr>
-                <w:rFonts w:ascii="Calibri" w:hAnsi="Calibri" w:cs="Calibri"/>
-                <w:sz w:val="24"/>
-              </w:rPr>
-              <w:t>With</w:t>
-            </w:r>
-            <w:r>
-              <w:rPr>
-                <w:rFonts w:ascii="Calibri" w:hAnsi="Calibri" w:cs="Calibri"/>
-                <w:spacing w:val="-1"/>
-                <w:sz w:val="24"/>
-              </w:rPr>
-              <w:t xml:space="preserve"> </w:t>
-            </w:r>
-            <w:r>
-              <w:rPr>
-                <w:rFonts w:ascii="Calibri" w:hAnsi="Calibri" w:cs="Calibri"/>
-                <w:sz w:val="24"/>
-              </w:rPr>
-              <w:t>Orifice</w:t>
-            </w:r>
-            <w:r>
-              <w:rPr>
-                <w:rFonts w:ascii="Calibri" w:hAnsi="Calibri" w:cs="Calibri"/>
-                <w:spacing w:val="-3"/>
-                <w:sz w:val="24"/>
-              </w:rPr>
-              <w:t xml:space="preserve"> </w:t>
-            </w:r>
-            <w:r>
-              <w:rPr>
-                <w:rFonts w:ascii="Calibri" w:hAnsi="Calibri" w:cs="Calibri"/>
-                <w:sz w:val="24"/>
-              </w:rPr>
-              <w:t>Plate- Gas</w:t>
-            </w:r>
-          </w:p>
-        </w:tc>
-        <w:tc>
-          <w:tcPr>
-            <w:tcW w:w="775" w:type="pct"/>
-          </w:tcPr>
-          <w:p>
-            <w:pPr>
-              <w:pStyle w:val="TableParagraph"/>
-              <w:spacing w:before="22"/>
-              <w:rPr>
-                <w:sz w:val="24"/>
-              </w:rPr>
-            </w:pPr>
-            <w:r>
-              <w:rPr>
-                <w:rFonts w:ascii="Calibri" w:hAnsi="Calibri" w:cs="Calibri"/>
-                <w:sz w:val="24"/>
-              </w:rPr>
-              <w:t>1</w:t>
-            </w:r>
-            <w:r>
-              <w:rPr>
-                <w:rFonts w:ascii="Calibri" w:hAnsi="Calibri" w:cs="Calibri"/>
-                <w:spacing w:val="-1"/>
-                <w:sz w:val="24"/>
-              </w:rPr>
-              <w:t xml:space="preserve"> </w:t>
-            </w:r>
-            <w:r>
-              <w:rPr>
-                <w:rFonts w:ascii="Calibri" w:hAnsi="Calibri" w:cs="Calibri"/>
-                <w:sz w:val="24"/>
-              </w:rPr>
-              <w:t>Nos.</w:t>
-            </w:r>
-          </w:p>
-        </w:tc>
-      </w:tr>
-      <w:tr>
-        <w:trPr>
-          <w:trHeight w:val="369"/>
-        </w:trPr>
-        <w:tc>
-          <w:tcPr>
-            <w:tcW w:w="4225" w:type="pct"/>
-            <w:vAlign w:val="center"/>
-          </w:tcPr>
-          <w:p>
-            <w:pPr>
-              <w:pStyle w:val="TableParagraph"/>
-              <w:spacing w:before="22"/>
-              <w:rPr>
-                <w:sz w:val="24"/>
-              </w:rPr>
-            </w:pPr>
-            <w:r>
-              <w:rPr>
-                <w:rFonts w:ascii="Calibri" w:hAnsi="Calibri" w:cs="Calibri"/>
-                <w:sz w:val="24"/>
-              </w:rPr>
-              <w:t>Thermocouple</w:t>
-            </w:r>
-            <w:r>
-              <w:rPr>
-                <w:rFonts w:ascii="Calibri" w:hAnsi="Calibri" w:cs="Calibri"/>
-                <w:spacing w:val="-1"/>
-                <w:sz w:val="24"/>
-              </w:rPr>
-              <w:t xml:space="preserve"> </w:t>
-            </w:r>
-            <w:r>
-              <w:rPr>
-                <w:rFonts w:ascii="Calibri" w:hAnsi="Calibri" w:cs="Calibri"/>
-                <w:sz w:val="24"/>
-              </w:rPr>
-              <w:t>with</w:t>
-            </w:r>
-            <w:r>
-              <w:rPr>
-                <w:rFonts w:ascii="Calibri" w:hAnsi="Calibri" w:cs="Calibri"/>
-                <w:spacing w:val="-1"/>
-                <w:sz w:val="24"/>
-              </w:rPr>
-              <w:t xml:space="preserve"> </w:t>
-            </w:r>
-            <w:r>
-              <w:rPr>
-                <w:rFonts w:ascii="Calibri" w:hAnsi="Calibri" w:cs="Calibri"/>
-                <w:sz w:val="24"/>
-              </w:rPr>
-              <w:t>TT</w:t>
-            </w:r>
-            <w:r>
-              <w:rPr>
-                <w:rFonts w:ascii="Calibri" w:hAnsi="Calibri" w:cs="Calibri"/>
-                <w:spacing w:val="-1"/>
-                <w:sz w:val="24"/>
-              </w:rPr>
-              <w:t xml:space="preserve"> </w:t>
-            </w:r>
-            <w:r>
-              <w:rPr>
-                <w:rFonts w:ascii="Calibri" w:hAnsi="Calibri" w:cs="Calibri"/>
-                <w:sz w:val="24"/>
-              </w:rPr>
-              <w:t>(for</w:t>
-            </w:r>
-            <w:r>
-              <w:rPr>
-                <w:rFonts w:ascii="Calibri" w:hAnsi="Calibri" w:cs="Calibri"/>
-                <w:spacing w:val="-2"/>
-                <w:sz w:val="24"/>
-              </w:rPr>
-              <w:t xml:space="preserve"> </w:t>
-            </w:r>
-            <w:r>
-              <w:rPr>
-                <w:rFonts w:ascii="Calibri" w:hAnsi="Calibri" w:cs="Calibri"/>
-                <w:sz w:val="24"/>
-              </w:rPr>
-              <w:t>burner)</w:t>
-            </w:r>
-          </w:p>
-        </w:tc>
-        <w:tc>
-          <w:tcPr>
-            <w:tcW w:w="775" w:type="pct"/>
-          </w:tcPr>
-          <w:p>
-            <w:pPr>
-              <w:pStyle w:val="TableParagraph"/>
-              <w:spacing w:before="22"/>
-              <w:rPr>
-                <w:sz w:val="24"/>
-              </w:rPr>
-            </w:pPr>
-            <w:r>
-              <w:rPr>
-                <w:rFonts w:ascii="Calibri" w:hAnsi="Calibri" w:cs="Calibri"/>
-                <w:sz w:val="24"/>
-              </w:rPr>
-              <w:t>4</w:t>
-            </w:r>
-            <w:r>
-              <w:rPr>
-                <w:rFonts w:ascii="Calibri" w:hAnsi="Calibri" w:cs="Calibri"/>
-                <w:spacing w:val="-1"/>
-                <w:sz w:val="24"/>
-              </w:rPr>
-              <w:t xml:space="preserve"> </w:t>
-            </w:r>
-            <w:r>
-              <w:rPr>
-                <w:rFonts w:ascii="Calibri" w:hAnsi="Calibri" w:cs="Calibri"/>
-                <w:sz w:val="24"/>
-              </w:rPr>
-              <w:t>Nos.</w:t>
-            </w:r>
-          </w:p>
-        </w:tc>
-      </w:tr>
-      <w:tr>
-        <w:trPr>
-          <w:trHeight w:val="369"/>
-        </w:trPr>
-        <w:tc>
-          <w:tcPr>
-            <w:tcW w:w="4225" w:type="pct"/>
-            <w:vAlign w:val="center"/>
-          </w:tcPr>
-          <w:p>
-            <w:pPr>
-              <w:pStyle w:val="TableParagraph"/>
-              <w:spacing w:before="22"/>
-              <w:rPr>
-                <w:sz w:val="24"/>
-              </w:rPr>
-            </w:pPr>
-            <w:r>
-              <w:rPr>
-                <w:rFonts w:ascii="Calibri" w:hAnsi="Calibri" w:cs="Calibri"/>
-                <w:sz w:val="24"/>
-              </w:rPr>
-              <w:t xml:space="preserve">Air, Fuel &amp; Flue Gas </w:t>
-            </w:r>
-            <w:r>
-              <w:rPr>
-                <w:rFonts w:ascii="Calibri" w:hAnsi="Calibri" w:cs="Calibri"/>
-                <w:sz w:val="24"/>
-              </w:rPr>
-              <w:t>Pipelines</w:t>
-            </w:r>
-          </w:p>
-        </w:tc>
-        <w:tc>
-          <w:tcPr>
-            <w:tcW w:w="775" w:type="pct"/>
-          </w:tcPr>
-          <w:p>
-            <w:pPr>
-              <w:pStyle w:val="TableParagraph"/>
-              <w:spacing w:before="22"/>
-              <w:rPr>
-                <w:sz w:val="24"/>
-              </w:rPr>
-            </w:pPr>
-            <w:r>
-              <w:rPr>
-                <w:rFonts w:ascii="Calibri" w:hAnsi="Calibri" w:cs="Calibri"/>
-                <w:sz w:val="24"/>
-              </w:rPr>
-              <w:t>1 Lot</w:t>
-            </w:r>
-          </w:p>
-        </w:tc>
-      </w:tr>
-      <w:tr>
-        <w:trPr>
-          <w:trHeight w:val="624"/>
-        </w:trPr>
-        <w:tc>
-          <w:tcPr>
-            <w:tcW w:w="5000" w:type="pct"/>
-            <w:gridSpan w:val="2"/>
-            <w:vAlign w:val="center"/>
-          </w:tcPr>
-          <w:p>
-            <w:pPr>
-              <w:pStyle w:val="TableParagraph"/>
-              <w:spacing w:before="22"/>
-              <w:rPr>
-                <w:b/>
-                <w:bCs/>
-                <w:sz w:val="24"/>
-              </w:rPr>
-            </w:pPr>
-            <w:r>
-              <w:rPr>
-                <w:rFonts w:ascii="Calibri" w:hAnsi="Calibri" w:cs="Calibri"/>
-                <w:b/>
-                <w:bCs/>
-                <w:sz w:val="24"/>
-              </w:rPr>
-              <w:t xml:space="preserve">NATURAL </w:t>
-            </w:r>
-            <w:r>
-              <w:rPr>
-                <w:rFonts w:ascii="Calibri" w:hAnsi="Calibri" w:cs="Calibri"/>
-                <w:b/>
-                <w:bCs/>
-                <w:sz w:val="24"/>
-              </w:rPr>
-              <w:t>GAS</w:t>
-            </w:r>
-            <w:r>
-              <w:rPr>
-                <w:rFonts w:ascii="Calibri" w:hAnsi="Calibri" w:cs="Calibri"/>
-                <w:b/>
-                <w:bCs/>
-                <w:spacing w:val="-1"/>
-                <w:sz w:val="24"/>
-              </w:rPr>
-              <w:t xml:space="preserve"> </w:t>
-            </w:r>
-            <w:r>
-              <w:rPr>
-                <w:rFonts w:ascii="Calibri" w:hAnsi="Calibri" w:cs="Calibri"/>
-                <w:b/>
-                <w:bCs/>
-                <w:sz w:val="24"/>
-              </w:rPr>
-              <w:t>TRAIN</w:t>
-            </w:r>
-            <w:r>
-              <w:rPr>
-                <w:rFonts w:ascii="Calibri" w:hAnsi="Calibri" w:cs="Calibri"/>
-                <w:b/>
-                <w:bCs/>
-                <w:spacing w:val="-1"/>
-                <w:sz w:val="24"/>
-              </w:rPr>
-              <w:t xml:space="preserve"> – </w:t>
-            </w:r>
-            <w:r>
-              <w:rPr>
-                <w:rFonts w:ascii="Calibri" w:hAnsi="Calibri" w:cs="Calibri"/>
-                <w:spacing w:val="-1"/>
-                <w:sz w:val="24"/>
-              </w:rPr>
-              <w:t>gas flow</w:t>
-            </w:r>
-            <w:r>
-              <w:rPr>
-                <w:rFonts w:ascii="Calibri" w:hAnsi="Calibri" w:cs="Calibri"/>
-                <w:spacing w:val="-1"/>
-                <w:sz w:val="24"/>
-              </w:rPr>
-              <w:t xml:space="preserve"> &amp; consumption shall be</w:t>
-            </w:r>
-            <w:r>
-              <w:rPr>
-                <w:rFonts w:ascii="Calibri" w:hAnsi="Calibri" w:cs="Calibri"/>
-                <w:spacing w:val="-1"/>
-                <w:sz w:val="24"/>
-              </w:rPr>
-              <w:t xml:space="preserve"> shown in PLC</w:t>
-            </w:r>
-            <w:r>
-              <w:rPr>
-                <w:rFonts w:ascii="Calibri" w:hAnsi="Calibri" w:cs="Calibri"/>
-                <w:spacing w:val="-1"/>
-                <w:sz w:val="24"/>
-              </w:rPr>
-              <w:t xml:space="preserve"> directly.</w:t>
-            </w:r>
-            <w:r>
-              <w:rPr>
-                <w:rFonts w:ascii="Calibri" w:hAnsi="Calibri" w:cs="Calibri"/>
-                <w:spacing w:val="-1"/>
-                <w:sz w:val="24"/>
-              </w:rPr>
-              <w:t xml:space="preserve"> </w:t>
-            </w:r>
-          </w:p>
-        </w:tc>
-      </w:tr>
-      <w:tr>
-        <w:trPr>
-          <w:trHeight w:val="340"/>
-        </w:trPr>
-        <w:tc>
-          <w:tcPr>
-            <w:tcW w:w="4225" w:type="pct"/>
-            <w:vAlign w:val="center"/>
-          </w:tcPr>
-          <w:p>
-            <w:pPr>
-              <w:pStyle w:val="TableParagraph"/>
-              <w:spacing w:before="22"/>
-              <w:rPr>
-                <w:sz w:val="24"/>
-              </w:rPr>
-            </w:pPr>
-            <w:r>
-              <w:rPr>
-                <w:rFonts w:ascii="Calibri" w:hAnsi="Calibri" w:cs="Calibri"/>
-                <w:sz w:val="24"/>
-              </w:rPr>
-              <w:t>Ball</w:t>
-            </w:r>
-            <w:r>
-              <w:rPr>
-                <w:rFonts w:ascii="Calibri" w:hAnsi="Calibri" w:cs="Calibri"/>
-                <w:spacing w:val="-3"/>
-                <w:sz w:val="24"/>
-              </w:rPr>
-              <w:t xml:space="preserve"> </w:t>
-            </w:r>
-            <w:r>
-              <w:rPr>
-                <w:rFonts w:ascii="Calibri" w:hAnsi="Calibri" w:cs="Calibri"/>
-                <w:sz w:val="24"/>
-              </w:rPr>
-              <w:t>Valve</w:t>
-            </w:r>
-          </w:p>
-        </w:tc>
-        <w:tc>
-          <w:tcPr>
-            <w:tcW w:w="775" w:type="pct"/>
-          </w:tcPr>
-          <w:p>
-            <w:pPr>
-              <w:pStyle w:val="TableParagraph"/>
-              <w:spacing w:before="22"/>
-              <w:rPr>
-                <w:sz w:val="24"/>
-              </w:rPr>
-            </w:pPr>
-            <w:r>
-              <w:rPr>
-                <w:rFonts w:ascii="Calibri" w:hAnsi="Calibri" w:cs="Calibri"/>
-                <w:sz w:val="24"/>
-              </w:rPr>
-              <w:t>01</w:t>
-            </w:r>
-            <w:r>
-              <w:rPr>
-                <w:rFonts w:ascii="Calibri" w:hAnsi="Calibri" w:cs="Calibri"/>
-                <w:spacing w:val="-1"/>
-                <w:sz w:val="24"/>
-              </w:rPr>
-              <w:t xml:space="preserve"> </w:t>
-            </w:r>
-            <w:r>
-              <w:rPr>
-                <w:rFonts w:ascii="Calibri" w:hAnsi="Calibri" w:cs="Calibri"/>
-                <w:sz w:val="24"/>
-              </w:rPr>
-              <w:t>No.</w:t>
-            </w:r>
-          </w:p>
-        </w:tc>
-      </w:tr>
-      <w:tr>
-        <w:trPr>
-          <w:trHeight w:val="340"/>
-        </w:trPr>
-        <w:tc>
-          <w:tcPr>
-            <w:tcW w:w="4225" w:type="pct"/>
-            <w:vAlign w:val="center"/>
-          </w:tcPr>
-          <w:p>
-            <w:pPr>
-              <w:pStyle w:val="TableParagraph"/>
-              <w:spacing w:before="22"/>
-              <w:rPr>
-                <w:sz w:val="24"/>
-              </w:rPr>
-            </w:pPr>
-            <w:r>
-              <w:rPr>
-                <w:rFonts w:ascii="Calibri" w:hAnsi="Calibri" w:cs="Calibri"/>
-                <w:sz w:val="24"/>
-              </w:rPr>
-              <w:t>Pressure</w:t>
-            </w:r>
-            <w:r>
-              <w:rPr>
-                <w:rFonts w:ascii="Calibri" w:hAnsi="Calibri" w:cs="Calibri"/>
-                <w:spacing w:val="-2"/>
-                <w:sz w:val="24"/>
-              </w:rPr>
-              <w:t xml:space="preserve"> </w:t>
-            </w:r>
-            <w:r>
-              <w:rPr>
-                <w:rFonts w:ascii="Calibri" w:hAnsi="Calibri" w:cs="Calibri"/>
-                <w:sz w:val="24"/>
-              </w:rPr>
-              <w:t>gauge</w:t>
-            </w:r>
-            <w:r>
-              <w:rPr>
-                <w:rFonts w:ascii="Calibri" w:hAnsi="Calibri" w:cs="Calibri"/>
-                <w:spacing w:val="-3"/>
-                <w:sz w:val="24"/>
-              </w:rPr>
-              <w:t xml:space="preserve"> </w:t>
-            </w:r>
-            <w:r>
-              <w:rPr>
-                <w:rFonts w:ascii="Calibri" w:hAnsi="Calibri" w:cs="Calibri"/>
-                <w:sz w:val="24"/>
-              </w:rPr>
-              <w:t>with Isolation</w:t>
-            </w:r>
-            <w:r>
-              <w:rPr>
-                <w:rFonts w:ascii="Calibri" w:hAnsi="Calibri" w:cs="Calibri"/>
-                <w:spacing w:val="-2"/>
-                <w:sz w:val="24"/>
-              </w:rPr>
-              <w:t xml:space="preserve"> </w:t>
-            </w:r>
-            <w:r>
-              <w:rPr>
-                <w:rFonts w:ascii="Calibri" w:hAnsi="Calibri" w:cs="Calibri"/>
-                <w:sz w:val="24"/>
-              </w:rPr>
-              <w:t>Valve</w:t>
-            </w:r>
-          </w:p>
-        </w:tc>
-        <w:tc>
-          <w:tcPr>
-            <w:tcW w:w="775" w:type="pct"/>
-          </w:tcPr>
-          <w:p>
-            <w:pPr>
-              <w:pStyle w:val="TableParagraph"/>
-              <w:spacing w:before="22"/>
-              <w:rPr>
-                <w:sz w:val="24"/>
-              </w:rPr>
-            </w:pPr>
-            <w:r>
-              <w:rPr>
-                <w:rFonts w:ascii="Calibri" w:hAnsi="Calibri" w:cs="Calibri"/>
-                <w:sz w:val="24"/>
-              </w:rPr>
-              <w:t>01</w:t>
-            </w:r>
-            <w:r>
-              <w:rPr>
-                <w:rFonts w:ascii="Calibri" w:hAnsi="Calibri" w:cs="Calibri"/>
-                <w:spacing w:val="-1"/>
-                <w:sz w:val="24"/>
-              </w:rPr>
-              <w:t xml:space="preserve"> </w:t>
-            </w:r>
-            <w:r>
-              <w:rPr>
-                <w:rFonts w:ascii="Calibri" w:hAnsi="Calibri" w:cs="Calibri"/>
-                <w:sz w:val="24"/>
-              </w:rPr>
-              <w:t>No.</w:t>
-            </w:r>
-          </w:p>
-        </w:tc>
-      </w:tr>
-      <w:tr>
-        <w:trPr>
-          <w:trHeight w:val="340"/>
-        </w:trPr>
-        <w:tc>
-          <w:tcPr>
-            <w:tcW w:w="4225" w:type="pct"/>
-            <w:vAlign w:val="center"/>
-          </w:tcPr>
-          <w:p>
-            <w:pPr>
-              <w:pStyle w:val="TableParagraph"/>
-              <w:spacing w:before="19"/>
-              <w:rPr>
-                <w:sz w:val="24"/>
-              </w:rPr>
-            </w:pPr>
-            <w:r>
-              <w:rPr>
-                <w:rFonts w:ascii="Calibri" w:hAnsi="Calibri" w:cs="Calibri"/>
-                <w:sz w:val="24"/>
-              </w:rPr>
-              <w:t>Gas</w:t>
-            </w:r>
-            <w:r>
-              <w:rPr>
-                <w:rFonts w:ascii="Calibri" w:hAnsi="Calibri" w:cs="Calibri"/>
-                <w:spacing w:val="-2"/>
-                <w:sz w:val="24"/>
-              </w:rPr>
-              <w:t xml:space="preserve"> </w:t>
-            </w:r>
-            <w:r>
-              <w:rPr>
-                <w:rFonts w:ascii="Calibri" w:hAnsi="Calibri" w:cs="Calibri"/>
-                <w:sz w:val="24"/>
-              </w:rPr>
-              <w:t>Filter</w:t>
-            </w:r>
-          </w:p>
-        </w:tc>
-        <w:tc>
-          <w:tcPr>
-            <w:tcW w:w="775" w:type="pct"/>
-          </w:tcPr>
-          <w:p>
-            <w:pPr>
-              <w:pStyle w:val="TableParagraph"/>
-              <w:spacing w:before="19"/>
-              <w:rPr>
-                <w:sz w:val="24"/>
-              </w:rPr>
-            </w:pPr>
-            <w:r>
-              <w:rPr>
-                <w:rFonts w:ascii="Calibri" w:hAnsi="Calibri" w:cs="Calibri"/>
-                <w:sz w:val="24"/>
-              </w:rPr>
-              <w:t>01</w:t>
-            </w:r>
-            <w:r>
-              <w:rPr>
-                <w:rFonts w:ascii="Calibri" w:hAnsi="Calibri" w:cs="Calibri"/>
-                <w:spacing w:val="-1"/>
-                <w:sz w:val="24"/>
-              </w:rPr>
-              <w:t xml:space="preserve"> </w:t>
-            </w:r>
-            <w:r>
-              <w:rPr>
-                <w:rFonts w:ascii="Calibri" w:hAnsi="Calibri" w:cs="Calibri"/>
-                <w:sz w:val="24"/>
-              </w:rPr>
-              <w:t>No.</w:t>
-            </w:r>
-          </w:p>
-        </w:tc>
-      </w:tr>
-      <w:tr>
-        <w:trPr>
-          <w:trHeight w:val="340"/>
-        </w:trPr>
-        <w:tc>
-          <w:tcPr>
-            <w:tcW w:w="4225" w:type="pct"/>
-            <w:vAlign w:val="center"/>
-          </w:tcPr>
-          <w:p>
-            <w:pPr>
-              <w:pStyle w:val="TableParagraph"/>
-              <w:spacing w:before="19"/>
-              <w:rPr>
-                <w:sz w:val="24"/>
-              </w:rPr>
-            </w:pPr>
-            <w:r>
-              <w:rPr>
-                <w:rFonts w:ascii="Calibri" w:hAnsi="Calibri" w:cs="Calibri"/>
-                <w:sz w:val="24"/>
-              </w:rPr>
-              <w:t>Slam</w:t>
-            </w:r>
-            <w:r>
-              <w:rPr>
-                <w:rFonts w:ascii="Calibri" w:hAnsi="Calibri" w:cs="Calibri"/>
-                <w:spacing w:val="-1"/>
-                <w:sz w:val="24"/>
-              </w:rPr>
-              <w:t xml:space="preserve"> </w:t>
-            </w:r>
-            <w:r>
-              <w:rPr>
-                <w:rFonts w:ascii="Calibri" w:hAnsi="Calibri" w:cs="Calibri"/>
-                <w:sz w:val="24"/>
-              </w:rPr>
-              <w:t>Shut of</w:t>
-            </w:r>
-            <w:r>
-              <w:rPr>
-                <w:rFonts w:ascii="Calibri" w:hAnsi="Calibri" w:cs="Calibri"/>
-                <w:sz w:val="24"/>
-              </w:rPr>
-              <w:t>f</w:t>
-            </w:r>
-            <w:r>
-              <w:rPr>
-                <w:rFonts w:ascii="Calibri" w:hAnsi="Calibri" w:cs="Calibri"/>
-                <w:spacing w:val="-1"/>
-                <w:sz w:val="24"/>
-              </w:rPr>
-              <w:t xml:space="preserve"> </w:t>
-            </w:r>
-            <w:r>
-              <w:rPr>
-                <w:rFonts w:ascii="Calibri" w:hAnsi="Calibri" w:cs="Calibri"/>
-                <w:sz w:val="24"/>
-              </w:rPr>
-              <w:t>Valve</w:t>
-            </w:r>
-          </w:p>
-        </w:tc>
-        <w:tc>
-          <w:tcPr>
-            <w:tcW w:w="775" w:type="pct"/>
-          </w:tcPr>
-          <w:p>
-            <w:pPr>
-              <w:pStyle w:val="TableParagraph"/>
-              <w:spacing w:before="19"/>
-              <w:rPr>
-                <w:sz w:val="24"/>
-              </w:rPr>
-            </w:pPr>
-            <w:r>
-              <w:rPr>
-                <w:rFonts w:ascii="Calibri" w:hAnsi="Calibri" w:cs="Calibri"/>
-                <w:sz w:val="24"/>
-              </w:rPr>
-              <w:t>01</w:t>
-            </w:r>
-            <w:r>
-              <w:rPr>
-                <w:rFonts w:ascii="Calibri" w:hAnsi="Calibri" w:cs="Calibri"/>
-                <w:spacing w:val="-1"/>
-                <w:sz w:val="24"/>
-              </w:rPr>
-              <w:t xml:space="preserve"> </w:t>
-            </w:r>
-            <w:r>
-              <w:rPr>
-                <w:rFonts w:ascii="Calibri" w:hAnsi="Calibri" w:cs="Calibri"/>
-                <w:sz w:val="24"/>
-              </w:rPr>
-              <w:t>No.</w:t>
-            </w:r>
-          </w:p>
-        </w:tc>
-      </w:tr>
-      <w:tr>
-        <w:trPr>
-          <w:trHeight w:val="340"/>
-        </w:trPr>
-        <w:tc>
-          <w:tcPr>
-            <w:tcW w:w="4225" w:type="pct"/>
-            <w:vAlign w:val="center"/>
-          </w:tcPr>
-          <w:p>
-            <w:pPr>
-              <w:pStyle w:val="TableParagraph"/>
-              <w:spacing w:before="19"/>
-              <w:rPr>
-                <w:sz w:val="24"/>
-              </w:rPr>
-            </w:pPr>
-            <w:r>
-              <w:rPr>
-                <w:rFonts w:ascii="Calibri" w:hAnsi="Calibri" w:cs="Calibri"/>
-                <w:sz w:val="24"/>
-              </w:rPr>
-              <w:t>Pressure</w:t>
-            </w:r>
-            <w:r>
-              <w:rPr>
-                <w:rFonts w:ascii="Calibri" w:hAnsi="Calibri" w:cs="Calibri"/>
-                <w:spacing w:val="-4"/>
-                <w:sz w:val="24"/>
-              </w:rPr>
-              <w:t xml:space="preserve"> </w:t>
-            </w:r>
-            <w:r>
-              <w:rPr>
-                <w:rFonts w:ascii="Calibri" w:hAnsi="Calibri" w:cs="Calibri"/>
-                <w:sz w:val="24"/>
-              </w:rPr>
-              <w:t>Regulator</w:t>
-            </w:r>
-          </w:p>
-        </w:tc>
-        <w:tc>
-          <w:tcPr>
-            <w:tcW w:w="775" w:type="pct"/>
-          </w:tcPr>
-          <w:p>
-            <w:pPr>
-              <w:pStyle w:val="TableParagraph"/>
-              <w:spacing w:before="19"/>
-              <w:rPr>
-                <w:sz w:val="24"/>
-              </w:rPr>
-            </w:pPr>
-            <w:r>
-              <w:rPr>
-                <w:rFonts w:ascii="Calibri" w:hAnsi="Calibri" w:cs="Calibri"/>
-                <w:sz w:val="24"/>
-              </w:rPr>
-              <w:t>01</w:t>
-            </w:r>
-            <w:r>
-              <w:rPr>
-                <w:rFonts w:ascii="Calibri" w:hAnsi="Calibri" w:cs="Calibri"/>
-                <w:spacing w:val="-1"/>
-                <w:sz w:val="24"/>
-              </w:rPr>
-              <w:t xml:space="preserve"> </w:t>
-            </w:r>
-            <w:r>
-              <w:rPr>
-                <w:rFonts w:ascii="Calibri" w:hAnsi="Calibri" w:cs="Calibri"/>
-                <w:sz w:val="24"/>
-              </w:rPr>
-              <w:t>No.</w:t>
-            </w:r>
-          </w:p>
-        </w:tc>
-      </w:tr>
-      <w:tr>
-        <w:trPr>
-          <w:trHeight w:val="340"/>
-        </w:trPr>
-        <w:tc>
-          <w:tcPr>
-            <w:tcW w:w="4225" w:type="pct"/>
-            <w:vAlign w:val="center"/>
-          </w:tcPr>
-          <w:p>
-            <w:pPr>
-              <w:pStyle w:val="TableParagraph"/>
-              <w:spacing w:before="22"/>
-              <w:rPr>
-                <w:sz w:val="24"/>
-              </w:rPr>
-            </w:pPr>
-            <w:r>
-              <w:rPr>
-                <w:rFonts w:ascii="Calibri" w:hAnsi="Calibri" w:cs="Calibri"/>
-                <w:sz w:val="24"/>
-              </w:rPr>
-              <w:t>Pressure</w:t>
-            </w:r>
-            <w:r>
-              <w:rPr>
-                <w:rFonts w:ascii="Calibri" w:hAnsi="Calibri" w:cs="Calibri"/>
-                <w:spacing w:val="-3"/>
-                <w:sz w:val="24"/>
-              </w:rPr>
-              <w:t xml:space="preserve"> </w:t>
-            </w:r>
-            <w:r>
-              <w:rPr>
-                <w:rFonts w:ascii="Calibri" w:hAnsi="Calibri" w:cs="Calibri"/>
-                <w:sz w:val="24"/>
-              </w:rPr>
-              <w:t>Relief</w:t>
-            </w:r>
-            <w:r>
-              <w:rPr>
-                <w:rFonts w:ascii="Calibri" w:hAnsi="Calibri" w:cs="Calibri"/>
-                <w:spacing w:val="-1"/>
-                <w:sz w:val="24"/>
-              </w:rPr>
-              <w:t xml:space="preserve"> </w:t>
-            </w:r>
-            <w:r>
-              <w:rPr>
-                <w:rFonts w:ascii="Calibri" w:hAnsi="Calibri" w:cs="Calibri"/>
-                <w:sz w:val="24"/>
-              </w:rPr>
-              <w:t>Valve</w:t>
-            </w:r>
-            <w:r>
-              <w:rPr>
-                <w:rFonts w:ascii="Calibri" w:hAnsi="Calibri" w:cs="Calibri"/>
-                <w:spacing w:val="-1"/>
-                <w:sz w:val="24"/>
-              </w:rPr>
-              <w:t xml:space="preserve"> </w:t>
-            </w:r>
-            <w:r>
-              <w:rPr>
-                <w:rFonts w:ascii="Calibri" w:hAnsi="Calibri" w:cs="Calibri"/>
-                <w:sz w:val="24"/>
-              </w:rPr>
-              <w:t>with</w:t>
-            </w:r>
-            <w:r>
-              <w:rPr>
-                <w:rFonts w:ascii="Calibri" w:hAnsi="Calibri" w:cs="Calibri"/>
-                <w:spacing w:val="-1"/>
-                <w:sz w:val="24"/>
-              </w:rPr>
-              <w:t xml:space="preserve"> </w:t>
-            </w:r>
-            <w:r>
-              <w:rPr>
-                <w:rFonts w:ascii="Calibri" w:hAnsi="Calibri" w:cs="Calibri"/>
-                <w:sz w:val="24"/>
-              </w:rPr>
-              <w:t>isolation</w:t>
-            </w:r>
-            <w:r>
-              <w:rPr>
-                <w:rFonts w:ascii="Calibri" w:hAnsi="Calibri" w:cs="Calibri"/>
-                <w:spacing w:val="-1"/>
-                <w:sz w:val="24"/>
-              </w:rPr>
-              <w:t xml:space="preserve"> </w:t>
-            </w:r>
-            <w:r>
-              <w:rPr>
-                <w:rFonts w:ascii="Calibri" w:hAnsi="Calibri" w:cs="Calibri"/>
-                <w:sz w:val="24"/>
-              </w:rPr>
-              <w:t>valve</w:t>
-            </w:r>
-          </w:p>
-        </w:tc>
-        <w:tc>
-          <w:tcPr>
-            <w:tcW w:w="775" w:type="pct"/>
-          </w:tcPr>
-          <w:p>
-            <w:pPr>
-              <w:pStyle w:val="TableParagraph"/>
-              <w:spacing w:before="22"/>
-              <w:rPr>
-                <w:sz w:val="24"/>
-              </w:rPr>
-            </w:pPr>
-            <w:r>
-              <w:rPr>
-                <w:rFonts w:ascii="Calibri" w:hAnsi="Calibri" w:cs="Calibri"/>
-                <w:sz w:val="24"/>
-              </w:rPr>
-              <w:t>01</w:t>
-            </w:r>
-            <w:r>
-              <w:rPr>
-                <w:rFonts w:ascii="Calibri" w:hAnsi="Calibri" w:cs="Calibri"/>
-                <w:spacing w:val="-1"/>
-                <w:sz w:val="24"/>
-              </w:rPr>
-              <w:t xml:space="preserve"> </w:t>
-            </w:r>
-            <w:r>
-              <w:rPr>
-                <w:rFonts w:ascii="Calibri" w:hAnsi="Calibri" w:cs="Calibri"/>
-                <w:sz w:val="24"/>
-              </w:rPr>
-              <w:t>No.</w:t>
-            </w:r>
-          </w:p>
-        </w:tc>
-      </w:tr>
-      <w:tr>
-        <w:trPr>
-          <w:trHeight w:val="340"/>
-        </w:trPr>
-        <w:tc>
-          <w:tcPr>
-            <w:tcW w:w="4225" w:type="pct"/>
-            <w:vAlign w:val="center"/>
-          </w:tcPr>
-          <w:p>
-            <w:pPr>
-              <w:pStyle w:val="TableParagraph"/>
-              <w:spacing w:before="22"/>
-              <w:rPr>
-                <w:sz w:val="24"/>
-              </w:rPr>
-            </w:pPr>
-            <w:r>
-              <w:rPr>
-                <w:rFonts w:ascii="Calibri" w:hAnsi="Calibri" w:cs="Calibri"/>
-                <w:sz w:val="24"/>
-              </w:rPr>
-              <w:t>Safety</w:t>
-            </w:r>
-            <w:r>
-              <w:rPr>
-                <w:rFonts w:ascii="Calibri" w:hAnsi="Calibri" w:cs="Calibri"/>
-                <w:spacing w:val="-4"/>
-                <w:sz w:val="24"/>
-              </w:rPr>
-              <w:t xml:space="preserve"> </w:t>
-            </w:r>
-            <w:r>
-              <w:rPr>
-                <w:rFonts w:ascii="Calibri" w:hAnsi="Calibri" w:cs="Calibri"/>
-                <w:sz w:val="24"/>
-              </w:rPr>
-              <w:t>Auto</w:t>
-            </w:r>
-            <w:r>
-              <w:rPr>
-                <w:rFonts w:ascii="Calibri" w:hAnsi="Calibri" w:cs="Calibri"/>
-                <w:spacing w:val="-1"/>
-                <w:sz w:val="24"/>
-              </w:rPr>
-              <w:t xml:space="preserve"> </w:t>
-            </w:r>
-            <w:r>
-              <w:rPr>
-                <w:rFonts w:ascii="Calibri" w:hAnsi="Calibri" w:cs="Calibri"/>
-                <w:sz w:val="24"/>
-              </w:rPr>
-              <w:t>reset Solenoid</w:t>
-            </w:r>
-            <w:r>
-              <w:rPr>
-                <w:rFonts w:ascii="Calibri" w:hAnsi="Calibri" w:cs="Calibri"/>
-                <w:spacing w:val="-1"/>
-                <w:sz w:val="24"/>
-              </w:rPr>
-              <w:t xml:space="preserve"> </w:t>
-            </w:r>
-            <w:r>
-              <w:rPr>
-                <w:rFonts w:ascii="Calibri" w:hAnsi="Calibri" w:cs="Calibri"/>
-                <w:sz w:val="24"/>
-              </w:rPr>
-              <w:t>Valve</w:t>
-            </w:r>
-          </w:p>
-        </w:tc>
-        <w:tc>
-          <w:tcPr>
-            <w:tcW w:w="775" w:type="pct"/>
-          </w:tcPr>
-          <w:p>
-            <w:pPr>
-              <w:pStyle w:val="TableParagraph"/>
-              <w:spacing w:before="22"/>
-              <w:rPr>
-                <w:sz w:val="24"/>
-              </w:rPr>
-            </w:pPr>
-            <w:r>
-              <w:rPr>
-                <w:rFonts w:ascii="Calibri" w:hAnsi="Calibri" w:cs="Calibri"/>
-                <w:sz w:val="24"/>
-              </w:rPr>
-              <w:t>01</w:t>
-            </w:r>
-            <w:r>
-              <w:rPr>
-                <w:rFonts w:ascii="Calibri" w:hAnsi="Calibri" w:cs="Calibri"/>
-                <w:spacing w:val="-1"/>
-                <w:sz w:val="24"/>
-              </w:rPr>
-              <w:t xml:space="preserve"> </w:t>
-            </w:r>
-            <w:r>
-              <w:rPr>
-                <w:rFonts w:ascii="Calibri" w:hAnsi="Calibri" w:cs="Calibri"/>
-                <w:sz w:val="24"/>
-              </w:rPr>
-              <w:t>No.</w:t>
-            </w:r>
-          </w:p>
-        </w:tc>
-      </w:tr>
-      <w:tr>
-        <w:trPr>
-          <w:trHeight w:val="340"/>
-        </w:trPr>
-        <w:tc>
-          <w:tcPr>
-            <w:tcW w:w="4225" w:type="pct"/>
-            <w:vAlign w:val="center"/>
-          </w:tcPr>
-          <w:p>
-            <w:pPr>
-              <w:pStyle w:val="TableParagraph"/>
-              <w:spacing w:before="22"/>
-              <w:rPr>
-                <w:sz w:val="24"/>
-              </w:rPr>
-            </w:pPr>
-            <w:r>
-              <w:rPr>
-                <w:rFonts w:ascii="Calibri" w:hAnsi="Calibri" w:cs="Calibri"/>
-                <w:sz w:val="24"/>
-              </w:rPr>
-              <w:t>Low</w:t>
-            </w:r>
-            <w:r>
-              <w:rPr>
-                <w:rFonts w:ascii="Calibri" w:hAnsi="Calibri" w:cs="Calibri"/>
-                <w:spacing w:val="-1"/>
-                <w:sz w:val="24"/>
-              </w:rPr>
-              <w:t xml:space="preserve"> </w:t>
-            </w:r>
-            <w:r>
-              <w:rPr>
-                <w:rFonts w:ascii="Calibri" w:hAnsi="Calibri" w:cs="Calibri"/>
-                <w:sz w:val="24"/>
-              </w:rPr>
-              <w:t>Gas</w:t>
-            </w:r>
-            <w:r>
-              <w:rPr>
-                <w:rFonts w:ascii="Calibri" w:hAnsi="Calibri" w:cs="Calibri"/>
-                <w:spacing w:val="-1"/>
-                <w:sz w:val="24"/>
-              </w:rPr>
-              <w:t xml:space="preserve"> </w:t>
-            </w:r>
-            <w:r>
-              <w:rPr>
-                <w:rFonts w:ascii="Calibri" w:hAnsi="Calibri" w:cs="Calibri"/>
-                <w:sz w:val="24"/>
-              </w:rPr>
-              <w:t>Pressure</w:t>
-            </w:r>
-            <w:r>
-              <w:rPr>
-                <w:rFonts w:ascii="Calibri" w:hAnsi="Calibri" w:cs="Calibri"/>
-                <w:spacing w:val="-2"/>
-                <w:sz w:val="24"/>
-              </w:rPr>
-              <w:t xml:space="preserve"> </w:t>
-            </w:r>
-            <w:r>
-              <w:rPr>
-                <w:rFonts w:ascii="Calibri" w:hAnsi="Calibri" w:cs="Calibri"/>
-                <w:sz w:val="24"/>
-              </w:rPr>
-              <w:t>Switch</w:t>
-            </w:r>
-            <w:r>
-              <w:rPr>
-                <w:rFonts w:ascii="Calibri" w:hAnsi="Calibri" w:cs="Calibri"/>
-                <w:spacing w:val="-2"/>
-                <w:sz w:val="24"/>
-              </w:rPr>
-              <w:t xml:space="preserve"> </w:t>
-            </w:r>
-            <w:r>
-              <w:rPr>
-                <w:rFonts w:ascii="Calibri" w:hAnsi="Calibri" w:cs="Calibri"/>
-                <w:sz w:val="24"/>
-              </w:rPr>
-              <w:t>with</w:t>
-            </w:r>
-            <w:r>
-              <w:rPr>
-                <w:rFonts w:ascii="Calibri" w:hAnsi="Calibri" w:cs="Calibri"/>
-                <w:spacing w:val="-1"/>
-                <w:sz w:val="24"/>
-              </w:rPr>
-              <w:t xml:space="preserve"> </w:t>
-            </w:r>
-            <w:r>
-              <w:rPr>
-                <w:rFonts w:ascii="Calibri" w:hAnsi="Calibri" w:cs="Calibri"/>
-                <w:sz w:val="24"/>
-              </w:rPr>
-              <w:t>manual</w:t>
-            </w:r>
-            <w:r>
-              <w:rPr>
-                <w:rFonts w:ascii="Calibri" w:hAnsi="Calibri" w:cs="Calibri"/>
-                <w:spacing w:val="-1"/>
-                <w:sz w:val="24"/>
-              </w:rPr>
-              <w:t xml:space="preserve"> </w:t>
-            </w:r>
-            <w:r>
-              <w:rPr>
-                <w:rFonts w:ascii="Calibri" w:hAnsi="Calibri" w:cs="Calibri"/>
-                <w:sz w:val="24"/>
-              </w:rPr>
-              <w:t>valve</w:t>
-            </w:r>
-          </w:p>
-        </w:tc>
-        <w:tc>
-          <w:tcPr>
-            <w:tcW w:w="775" w:type="pct"/>
-          </w:tcPr>
-          <w:p>
-            <w:pPr>
-              <w:pStyle w:val="TableParagraph"/>
-              <w:spacing w:before="22"/>
-              <w:rPr>
-                <w:sz w:val="24"/>
-              </w:rPr>
-            </w:pPr>
-            <w:r>
-              <w:rPr>
-                <w:rFonts w:ascii="Calibri" w:hAnsi="Calibri" w:cs="Calibri"/>
-                <w:sz w:val="24"/>
-              </w:rPr>
-              <w:t>01</w:t>
-            </w:r>
-            <w:r>
-              <w:rPr>
-                <w:rFonts w:ascii="Calibri" w:hAnsi="Calibri" w:cs="Calibri"/>
-                <w:spacing w:val="-1"/>
-                <w:sz w:val="24"/>
-              </w:rPr>
-              <w:t xml:space="preserve"> </w:t>
-            </w:r>
-            <w:r>
-              <w:rPr>
-                <w:rFonts w:ascii="Calibri" w:hAnsi="Calibri" w:cs="Calibri"/>
-                <w:sz w:val="24"/>
-              </w:rPr>
-              <w:t>No.</w:t>
-            </w:r>
-          </w:p>
-        </w:tc>
-      </w:tr>
-      <w:tr>
-        <w:trPr>
-          <w:trHeight w:val="340"/>
-        </w:trPr>
-        <w:tc>
-          <w:tcPr>
-            <w:tcW w:w="4225" w:type="pct"/>
-            <w:vAlign w:val="center"/>
-          </w:tcPr>
-          <w:p>
-            <w:pPr>
-              <w:pStyle w:val="TableParagraph"/>
-              <w:spacing w:before="19"/>
-              <w:rPr>
-                <w:sz w:val="24"/>
-              </w:rPr>
-            </w:pPr>
-            <w:r>
-              <w:rPr>
-                <w:rFonts w:ascii="Calibri" w:hAnsi="Calibri" w:cs="Calibri"/>
-                <w:sz w:val="24"/>
-              </w:rPr>
-              <w:t>High</w:t>
-            </w:r>
-            <w:r>
-              <w:rPr>
-                <w:rFonts w:ascii="Calibri" w:hAnsi="Calibri" w:cs="Calibri"/>
-                <w:spacing w:val="-1"/>
-                <w:sz w:val="24"/>
-              </w:rPr>
-              <w:t xml:space="preserve"> </w:t>
-            </w:r>
-            <w:r>
-              <w:rPr>
-                <w:rFonts w:ascii="Calibri" w:hAnsi="Calibri" w:cs="Calibri"/>
-                <w:sz w:val="24"/>
-              </w:rPr>
-              <w:t>Gas</w:t>
-            </w:r>
-            <w:r>
-              <w:rPr>
-                <w:rFonts w:ascii="Calibri" w:hAnsi="Calibri" w:cs="Calibri"/>
-                <w:spacing w:val="-1"/>
-                <w:sz w:val="24"/>
-              </w:rPr>
-              <w:t xml:space="preserve"> </w:t>
-            </w:r>
-            <w:r>
-              <w:rPr>
-                <w:rFonts w:ascii="Calibri" w:hAnsi="Calibri" w:cs="Calibri"/>
-                <w:sz w:val="24"/>
-              </w:rPr>
-              <w:t>Pressure</w:t>
-            </w:r>
-            <w:r>
-              <w:rPr>
-                <w:rFonts w:ascii="Calibri" w:hAnsi="Calibri" w:cs="Calibri"/>
-                <w:spacing w:val="-3"/>
-                <w:sz w:val="24"/>
-              </w:rPr>
-              <w:t xml:space="preserve"> </w:t>
-            </w:r>
-            <w:r>
-              <w:rPr>
-                <w:rFonts w:ascii="Calibri" w:hAnsi="Calibri" w:cs="Calibri"/>
-                <w:sz w:val="24"/>
-              </w:rPr>
-              <w:t>Switch</w:t>
-            </w:r>
-            <w:r>
-              <w:rPr>
-                <w:rFonts w:ascii="Calibri" w:hAnsi="Calibri" w:cs="Calibri"/>
-                <w:spacing w:val="-1"/>
-                <w:sz w:val="24"/>
-              </w:rPr>
-              <w:t xml:space="preserve"> </w:t>
-            </w:r>
-            <w:r>
-              <w:rPr>
-                <w:rFonts w:ascii="Calibri" w:hAnsi="Calibri" w:cs="Calibri"/>
-                <w:sz w:val="24"/>
-              </w:rPr>
-              <w:t>with</w:t>
-            </w:r>
-            <w:r>
-              <w:rPr>
-                <w:rFonts w:ascii="Calibri" w:hAnsi="Calibri" w:cs="Calibri"/>
-                <w:spacing w:val="-1"/>
-                <w:sz w:val="24"/>
-              </w:rPr>
-              <w:t xml:space="preserve"> </w:t>
-            </w:r>
-            <w:r>
-              <w:rPr>
-                <w:rFonts w:ascii="Calibri" w:hAnsi="Calibri" w:cs="Calibri"/>
-                <w:sz w:val="24"/>
-              </w:rPr>
-              <w:t>manual</w:t>
-            </w:r>
-            <w:r>
-              <w:rPr>
-                <w:rFonts w:ascii="Calibri" w:hAnsi="Calibri" w:cs="Calibri"/>
-                <w:spacing w:val="-1"/>
-                <w:sz w:val="24"/>
-              </w:rPr>
-              <w:t xml:space="preserve"> </w:t>
-            </w:r>
-            <w:r>
-              <w:rPr>
-                <w:rFonts w:ascii="Calibri" w:hAnsi="Calibri" w:cs="Calibri"/>
-                <w:sz w:val="24"/>
-              </w:rPr>
-              <w:t>valve</w:t>
-            </w:r>
-          </w:p>
-        </w:tc>
-        <w:tc>
-          <w:tcPr>
-            <w:tcW w:w="775" w:type="pct"/>
-          </w:tcPr>
-          <w:p>
-            <w:pPr>
-              <w:pStyle w:val="TableParagraph"/>
-              <w:spacing w:before="19"/>
-              <w:rPr>
-                <w:sz w:val="24"/>
-              </w:rPr>
-            </w:pPr>
-            <w:r>
-              <w:rPr>
-                <w:rFonts w:ascii="Calibri" w:hAnsi="Calibri" w:cs="Calibri"/>
-                <w:sz w:val="24"/>
-              </w:rPr>
-              <w:t>01</w:t>
-            </w:r>
-            <w:r>
-              <w:rPr>
-                <w:rFonts w:ascii="Calibri" w:hAnsi="Calibri" w:cs="Calibri"/>
-                <w:spacing w:val="-1"/>
-                <w:sz w:val="24"/>
-              </w:rPr>
-              <w:t xml:space="preserve"> </w:t>
-            </w:r>
-            <w:r>
-              <w:rPr>
-                <w:rFonts w:ascii="Calibri" w:hAnsi="Calibri" w:cs="Calibri"/>
-                <w:sz w:val="24"/>
-              </w:rPr>
-              <w:t>No.</w:t>
-            </w:r>
-          </w:p>
-        </w:tc>
-      </w:tr>
-      <w:tr>
-        <w:trPr>
-          <w:trHeight w:val="340"/>
-        </w:trPr>
-        <w:tc>
-          <w:tcPr>
-            <w:tcW w:w="4225" w:type="pct"/>
-            <w:vAlign w:val="center"/>
-          </w:tcPr>
-          <w:p>
-            <w:pPr>
-              <w:pStyle w:val="TableParagraph"/>
-              <w:spacing w:before="19"/>
-              <w:rPr>
-                <w:sz w:val="24"/>
-              </w:rPr>
-            </w:pPr>
-            <w:r>
-              <w:rPr>
-                <w:rFonts w:ascii="Calibri" w:hAnsi="Calibri" w:cs="Calibri"/>
-                <w:sz w:val="24"/>
-              </w:rPr>
-              <w:t>Solenoid</w:t>
-            </w:r>
-            <w:r>
-              <w:rPr>
-                <w:rFonts w:ascii="Calibri" w:hAnsi="Calibri" w:cs="Calibri"/>
-                <w:spacing w:val="-1"/>
-                <w:sz w:val="24"/>
-              </w:rPr>
-              <w:t xml:space="preserve"> </w:t>
-            </w:r>
-            <w:r>
-              <w:rPr>
-                <w:rFonts w:ascii="Calibri" w:hAnsi="Calibri" w:cs="Calibri"/>
-                <w:sz w:val="24"/>
-              </w:rPr>
-              <w:t>Valve</w:t>
-            </w:r>
-          </w:p>
-        </w:tc>
-        <w:tc>
-          <w:tcPr>
-            <w:tcW w:w="775" w:type="pct"/>
-          </w:tcPr>
-          <w:p>
-            <w:pPr>
-              <w:pStyle w:val="TableParagraph"/>
-              <w:spacing w:before="19"/>
-              <w:rPr>
-                <w:sz w:val="24"/>
-              </w:rPr>
-            </w:pPr>
-            <w:r>
-              <w:rPr>
-                <w:rFonts w:ascii="Calibri" w:hAnsi="Calibri" w:cs="Calibri"/>
-                <w:sz w:val="24"/>
-              </w:rPr>
-              <w:t>01</w:t>
-            </w:r>
-            <w:r>
-              <w:rPr>
-                <w:rFonts w:ascii="Calibri" w:hAnsi="Calibri" w:cs="Calibri"/>
-                <w:spacing w:val="-1"/>
-                <w:sz w:val="24"/>
-              </w:rPr>
-              <w:t xml:space="preserve"> </w:t>
-            </w:r>
-            <w:r>
-              <w:rPr>
-                <w:rFonts w:ascii="Calibri" w:hAnsi="Calibri" w:cs="Calibri"/>
-                <w:sz w:val="24"/>
-              </w:rPr>
-              <w:t>No.</w:t>
-            </w:r>
-          </w:p>
-        </w:tc>
-      </w:tr>
-      <w:tr>
-        <w:trPr>
-          <w:trHeight w:val="340"/>
-        </w:trPr>
-        <w:tc>
-          <w:tcPr>
-            <w:tcW w:w="4225" w:type="pct"/>
-            <w:vAlign w:val="center"/>
-          </w:tcPr>
-          <w:p>
-            <w:pPr>
-              <w:pStyle w:val="TableParagraph"/>
-              <w:spacing w:before="19"/>
-              <w:rPr>
-                <w:sz w:val="24"/>
-              </w:rPr>
-            </w:pPr>
-            <w:r>
-              <w:rPr>
-                <w:rFonts w:ascii="Calibri" w:hAnsi="Calibri" w:cs="Calibri"/>
-                <w:sz w:val="24"/>
-              </w:rPr>
-              <w:t>Fitting</w:t>
-            </w:r>
-            <w:r>
-              <w:rPr>
-                <w:rFonts w:ascii="Calibri" w:hAnsi="Calibri" w:cs="Calibri"/>
-                <w:spacing w:val="-4"/>
-                <w:sz w:val="24"/>
-              </w:rPr>
-              <w:t xml:space="preserve"> </w:t>
-            </w:r>
-            <w:r>
-              <w:rPr>
-                <w:rFonts w:ascii="Calibri" w:hAnsi="Calibri" w:cs="Calibri"/>
-                <w:sz w:val="24"/>
-              </w:rPr>
-              <w:t>for</w:t>
-            </w:r>
-            <w:r>
-              <w:rPr>
-                <w:rFonts w:ascii="Calibri" w:hAnsi="Calibri" w:cs="Calibri"/>
-                <w:spacing w:val="-1"/>
-                <w:sz w:val="24"/>
-              </w:rPr>
-              <w:t xml:space="preserve"> </w:t>
-            </w:r>
-            <w:r>
-              <w:rPr>
-                <w:rFonts w:ascii="Calibri" w:hAnsi="Calibri" w:cs="Calibri"/>
-                <w:sz w:val="24"/>
-              </w:rPr>
-              <w:t>valves for</w:t>
-            </w:r>
-            <w:r>
-              <w:rPr>
-                <w:rFonts w:ascii="Calibri" w:hAnsi="Calibri" w:cs="Calibri"/>
-                <w:spacing w:val="-1"/>
-                <w:sz w:val="24"/>
-              </w:rPr>
-              <w:t xml:space="preserve"> </w:t>
-            </w:r>
-            <w:r>
-              <w:rPr>
-                <w:rFonts w:ascii="Calibri" w:hAnsi="Calibri" w:cs="Calibri"/>
-                <w:sz w:val="24"/>
-              </w:rPr>
-              <w:t>pilot line</w:t>
-            </w:r>
-          </w:p>
-        </w:tc>
-        <w:tc>
-          <w:tcPr>
-            <w:tcW w:w="775" w:type="pct"/>
-          </w:tcPr>
-          <w:p>
-            <w:pPr>
-              <w:pStyle w:val="TableParagraph"/>
-              <w:spacing w:before="19"/>
-              <w:rPr>
-                <w:sz w:val="24"/>
-              </w:rPr>
-            </w:pPr>
-            <w:r>
-              <w:rPr>
-                <w:rFonts w:ascii="Calibri" w:hAnsi="Calibri" w:cs="Calibri"/>
-                <w:sz w:val="24"/>
-              </w:rPr>
-              <w:t>01</w:t>
-            </w:r>
-            <w:r>
-              <w:rPr>
-                <w:rFonts w:ascii="Calibri" w:hAnsi="Calibri" w:cs="Calibri"/>
-                <w:spacing w:val="-1"/>
-                <w:sz w:val="24"/>
-              </w:rPr>
-              <w:t xml:space="preserve"> </w:t>
-            </w:r>
-            <w:r>
-              <w:rPr>
-                <w:rFonts w:ascii="Calibri" w:hAnsi="Calibri" w:cs="Calibri"/>
-                <w:sz w:val="24"/>
-              </w:rPr>
-              <w:t>No.</w:t>
-            </w:r>
-          </w:p>
-        </w:tc>
-      </w:tr>
-      <w:tr>
-        <w:trPr>
-          <w:trHeight w:val="340"/>
-        </w:trPr>
-        <w:tc>
-          <w:tcPr>
-            <w:tcW w:w="4225" w:type="pct"/>
-            <w:vAlign w:val="center"/>
-          </w:tcPr>
-          <w:p>
-            <w:pPr>
-              <w:pStyle w:val="TableParagraph"/>
-              <w:spacing w:before="19"/>
-              <w:rPr>
-                <w:sz w:val="24"/>
-              </w:rPr>
-            </w:pPr>
-            <w:r>
-              <w:rPr>
-                <w:rFonts w:ascii="Calibri" w:hAnsi="Calibri" w:cs="Calibri"/>
-                <w:sz w:val="24"/>
-              </w:rPr>
-              <w:t>Solenoid Valve for Main Burner</w:t>
-            </w:r>
-            <w:r>
-              <w:rPr>
-                <w:rFonts w:ascii="Calibri" w:hAnsi="Calibri" w:cs="Calibri"/>
-                <w:sz w:val="24"/>
-              </w:rPr>
-              <w:t>s</w:t>
-            </w:r>
-          </w:p>
-        </w:tc>
-        <w:tc>
-          <w:tcPr>
-            <w:tcW w:w="775" w:type="pct"/>
-          </w:tcPr>
-          <w:p>
-            <w:pPr>
-              <w:pStyle w:val="TableParagraph"/>
-              <w:spacing w:before="19"/>
-              <w:rPr>
-                <w:sz w:val="24"/>
-              </w:rPr>
-            </w:pPr>
-            <w:r>
-              <w:rPr>
-                <w:rFonts w:ascii="Calibri" w:hAnsi="Calibri" w:cs="Calibri"/>
-                <w:sz w:val="24"/>
-              </w:rPr>
-              <w:t>0</w:t>
-            </w:r>
-            <w:r>
-              <w:rPr>
-                <w:rFonts w:ascii="Calibri" w:hAnsi="Calibri" w:cs="Calibri"/>
-                <w:sz w:val="24"/>
-              </w:rPr>
-              <w:t>2 Nos.</w:t>
-            </w:r>
-          </w:p>
-        </w:tc>
-      </w:tr>
-      <w:tr>
-        <w:trPr>
-          <w:trHeight w:val="340"/>
-        </w:trPr>
-        <w:tc>
-          <w:tcPr>
-            <w:tcW w:w="4225" w:type="pct"/>
-            <w:vAlign w:val="center"/>
-          </w:tcPr>
-          <w:p>
-            <w:pPr>
-              <w:pStyle w:val="TableParagraph"/>
-              <w:spacing w:before="19"/>
-              <w:rPr>
-                <w:b/>
-                <w:bCs/>
-                <w:sz w:val="24"/>
-              </w:rPr>
-            </w:pPr>
-            <w:r>
-              <w:rPr>
-                <w:rFonts w:ascii="Calibri" w:hAnsi="Calibri" w:cs="Calibri"/>
-                <w:b/>
-                <w:bCs/>
-                <w:sz w:val="24"/>
-              </w:rPr>
-              <w:t>Miscellaneous</w:t>
-            </w:r>
-          </w:p>
-        </w:tc>
-        <w:tc>
-          <w:tcPr>
-            <w:tcW w:w="775" w:type="pct"/>
-          </w:tcPr>
-          <w:p>
-            <w:pPr>
-              <w:pStyle w:val="TableParagraph"/>
-              <w:spacing w:before="19"/>
-              <w:rPr>
-                <w:sz w:val="24"/>
-              </w:rPr>
-            </w:pPr>
-          </w:p>
-        </w:tc>
-      </w:tr>
-      <w:tr>
-        <w:trPr>
-          <w:trHeight w:val="455"/>
-        </w:trPr>
-        <w:tc>
-          <w:tcPr>
-            <w:tcW w:w="4225" w:type="pct"/>
-            <w:vAlign w:val="center"/>
-          </w:tcPr>
-          <w:p>
-            <w:pPr>
-              <w:pStyle w:val="TableParagraph"/>
-              <w:spacing w:before="19"/>
-              <w:rPr>
-                <w:sz w:val="24"/>
-              </w:rPr>
-            </w:pPr>
-            <w:r>
-              <w:rPr>
-                <w:rFonts w:ascii="Calibri" w:hAnsi="Calibri" w:cs="Calibri"/>
-                <w:sz w:val="24"/>
-              </w:rPr>
-              <w:t>PLC S7 – 1</w:t>
-            </w:r>
-            <w:r>
-              <w:rPr>
-                <w:rFonts w:ascii="Calibri" w:hAnsi="Calibri" w:cs="Calibri"/>
-                <w:sz w:val="24"/>
-              </w:rPr>
-              <w:t>2</w:t>
-            </w:r>
-            <w:r>
-              <w:rPr>
-                <w:rFonts w:ascii="Calibri" w:hAnsi="Calibri" w:cs="Calibri"/>
-                <w:sz w:val="24"/>
-              </w:rPr>
-              <w:t>00 with HMI</w:t>
-            </w:r>
-            <w:r>
-              <w:rPr>
-                <w:rFonts w:ascii="Calibri" w:hAnsi="Calibri" w:cs="Calibri"/>
-                <w:sz w:val="24"/>
-              </w:rPr>
-              <w:t xml:space="preserve"> Siemens </w:t>
-            </w:r>
-          </w:p>
-        </w:tc>
-        <w:tc>
-          <w:tcPr>
-            <w:tcW w:w="775" w:type="pct"/>
-          </w:tcPr>
-          <w:p>
-            <w:pPr>
-              <w:pStyle w:val="TableParagraph"/>
-              <w:spacing w:before="19"/>
-              <w:rPr>
-                <w:sz w:val="24"/>
-              </w:rPr>
-            </w:pPr>
-            <w:r>
-              <w:rPr>
-                <w:rFonts w:ascii="Calibri" w:hAnsi="Calibri" w:cs="Calibri"/>
-                <w:sz w:val="24"/>
-              </w:rPr>
-              <w:t>1 No.</w:t>
-            </w:r>
-          </w:p>
-        </w:tc>
-      </w:tr>
-      <w:tr>
-        <w:trPr>
-          <w:trHeight w:val="340"/>
-        </w:trPr>
-        <w:tc>
-          <w:tcPr>
-            <w:tcW w:w="4225" w:type="pct"/>
-            <w:vAlign w:val="center"/>
-          </w:tcPr>
-          <w:p>
-            <w:pPr>
-              <w:pStyle w:val="TableParagraph"/>
-              <w:spacing w:before="19"/>
-              <w:rPr>
-                <w:sz w:val="24"/>
-              </w:rPr>
-            </w:pPr>
-            <w:r>
-              <w:rPr>
-                <w:rFonts w:ascii="Calibri" w:hAnsi="Calibri" w:cs="Calibri"/>
-                <w:sz w:val="24"/>
-              </w:rPr>
-              <w:t>Combustion Air Blower</w:t>
-            </w:r>
-            <w:r>
-              <w:rPr>
-                <w:rFonts w:ascii="Calibri" w:hAnsi="Calibri" w:cs="Calibri"/>
-                <w:sz w:val="24"/>
-              </w:rPr>
-              <w:t xml:space="preserve"> with Motor</w:t>
-            </w:r>
-            <w:r>
-              <w:rPr>
-                <w:rFonts w:ascii="Calibri" w:hAnsi="Calibri" w:cs="Calibri"/>
-                <w:sz w:val="24"/>
-              </w:rPr>
-              <w:t xml:space="preserve"> (IE3)  </w:t>
-            </w:r>
-          </w:p>
-        </w:tc>
-        <w:tc>
-          <w:tcPr>
-            <w:tcW w:w="775" w:type="pct"/>
-          </w:tcPr>
-          <w:p>
-            <w:pPr>
-              <w:pStyle w:val="TableParagraph"/>
-              <w:spacing w:before="19"/>
-              <w:rPr>
-                <w:sz w:val="24"/>
-              </w:rPr>
-            </w:pPr>
-            <w:r>
-              <w:rPr>
-                <w:rFonts w:ascii="Calibri" w:hAnsi="Calibri" w:cs="Calibri"/>
-                <w:sz w:val="24"/>
-              </w:rPr>
-              <w:t>1 No.</w:t>
-            </w:r>
-          </w:p>
-        </w:tc>
-      </w:tr>
-      <w:tr>
-        <w:trPr>
-          <w:trHeight w:val="437"/>
-        </w:trPr>
-        <w:tc>
-          <w:tcPr>
-            <w:tcW w:w="4225" w:type="pct"/>
-            <w:vAlign w:val="center"/>
-          </w:tcPr>
-          <w:p>
-            <w:pPr>
-              <w:autoSpaceDE w:val="0"/>
-              <w:autoSpaceDN w:val="0"/>
-              <w:adjustRightInd w:val="0"/>
-              <w:ind w:left="113" w:right="113"/>
-              <w:rPr>
-                <w:color w:val="2C2C2C"/>
-                <w:lang w:eastAsia="en-US" w:bidi="ar-SA"/>
-              </w:rPr>
-            </w:pPr>
-            <w:r>
-              <w:rPr>
-                <w:rFonts w:ascii="Calibri" w:hAnsi="Calibri" w:cs="Calibri"/>
-                <w:szCs w:val="22"/>
-                <w:lang w:val="en-US" w:eastAsia="en-US" w:bidi="ar-SA"/>
-              </w:rPr>
-              <w:t>Flu</w:t>
-            </w:r>
-            <w:r>
-              <w:rPr>
-                <w:rFonts w:ascii="Calibri" w:hAnsi="Calibri" w:cs="Calibri"/>
-                <w:szCs w:val="22"/>
-                <w:lang w:val="en-US" w:eastAsia="en-US" w:bidi="ar-SA"/>
-              </w:rPr>
-              <w:t>e</w:t>
-            </w:r>
-            <w:r>
-              <w:rPr>
-                <w:rFonts w:ascii="Calibri" w:hAnsi="Calibri" w:cs="Calibri"/>
-                <w:szCs w:val="22"/>
-                <w:lang w:val="en-US" w:eastAsia="en-US" w:bidi="ar-SA"/>
-              </w:rPr>
-              <w:t xml:space="preserve"> gas Suction Blower</w:t>
-            </w:r>
-            <w:r>
-              <w:rPr>
-                <w:rFonts w:ascii="Calibri" w:hAnsi="Calibri" w:cs="Calibri"/>
-                <w:szCs w:val="22"/>
-                <w:lang w:val="en-US" w:eastAsia="en-US" w:bidi="ar-SA"/>
-              </w:rPr>
-              <w:t xml:space="preserve"> with Motor.</w:t>
-            </w:r>
-            <w:r>
-              <w:rPr>
-                <w:rFonts w:ascii="Calibri" w:hAnsi="Calibri" w:cs="Calibri"/>
-                <w:szCs w:val="22"/>
-                <w:lang w:val="en-US" w:eastAsia="en-US" w:bidi="ar-SA"/>
-              </w:rPr>
-              <w:t xml:space="preserve"> </w:t>
-            </w:r>
-          </w:p>
-        </w:tc>
-        <w:tc>
-          <w:tcPr>
-            <w:tcW w:w="775" w:type="pct"/>
-            <w:vAlign w:val="center"/>
-          </w:tcPr>
-          <w:p>
-            <w:pPr>
-              <w:pStyle w:val="TableParagraph"/>
-              <w:spacing w:before="19"/>
-              <w:rPr>
-                <w:sz w:val="24"/>
-              </w:rPr>
-            </w:pPr>
-            <w:r>
-              <w:rPr>
-                <w:rFonts w:ascii="Calibri" w:hAnsi="Calibri" w:cs="Calibri"/>
-                <w:sz w:val="24"/>
-              </w:rPr>
-              <w:t>1 No.</w:t>
-            </w:r>
-          </w:p>
-        </w:tc>
-      </w:tr>
-      <w:tr>
-        <w:trPr>
-          <w:trHeight w:val="340"/>
-        </w:trPr>
-        <w:tc>
-          <w:tcPr>
-            <w:tcW w:w="4225" w:type="pct"/>
-            <w:vAlign w:val="center"/>
-          </w:tcPr>
-          <w:p>
-            <w:pPr>
-              <w:pStyle w:val="TableParagraph"/>
-              <w:spacing w:before="19"/>
-              <w:rPr>
-                <w:sz w:val="24"/>
-              </w:rPr>
-            </w:pPr>
-            <w:r>
-              <w:rPr>
-                <w:rFonts w:ascii="Calibri" w:hAnsi="Calibri" w:cs="Calibri"/>
-                <w:sz w:val="24"/>
-              </w:rPr>
-              <w:t>Thermocouple with TT for Furnace</w:t>
-            </w:r>
-          </w:p>
-        </w:tc>
-        <w:tc>
-          <w:tcPr>
-            <w:tcW w:w="775" w:type="pct"/>
-          </w:tcPr>
-          <w:p>
-            <w:pPr>
-              <w:pStyle w:val="TableParagraph"/>
-              <w:spacing w:before="19"/>
-              <w:rPr>
-                <w:sz w:val="24"/>
-              </w:rPr>
-            </w:pPr>
-            <w:r>
-              <w:rPr>
-                <w:rFonts w:ascii="Calibri" w:hAnsi="Calibri" w:cs="Calibri"/>
-                <w:sz w:val="24"/>
-              </w:rPr>
-              <w:t>1 No.</w:t>
-            </w:r>
-          </w:p>
-        </w:tc>
-      </w:tr>
-      <w:tr>
-        <w:trPr>
-          <w:trHeight w:val="340"/>
-        </w:trPr>
-        <w:tc>
-          <w:tcPr>
-            <w:tcW w:w="4225" w:type="pct"/>
-            <w:vAlign w:val="center"/>
-          </w:tcPr>
-          <w:p>
-            <w:pPr>
-              <w:pStyle w:val="TableParagraph"/>
-              <w:spacing w:before="19"/>
-              <w:rPr>
-                <w:sz w:val="24"/>
-              </w:rPr>
-            </w:pPr>
-            <w:r>
-              <w:rPr>
-                <w:rFonts w:ascii="Calibri" w:hAnsi="Calibri" w:cs="Calibri"/>
-                <w:sz w:val="24"/>
-              </w:rPr>
-              <w:t>Pressure Sensing Tube</w:t>
-            </w:r>
-          </w:p>
-        </w:tc>
-        <w:tc>
-          <w:tcPr>
-            <w:tcW w:w="775" w:type="pct"/>
-          </w:tcPr>
-          <w:p>
-            <w:pPr>
-              <w:pStyle w:val="TableParagraph"/>
-              <w:spacing w:before="19"/>
-              <w:rPr>
-                <w:sz w:val="24"/>
-              </w:rPr>
-            </w:pPr>
-            <w:r>
-              <w:rPr>
-                <w:rFonts w:ascii="Calibri" w:hAnsi="Calibri" w:cs="Calibri"/>
-                <w:sz w:val="24"/>
-              </w:rPr>
-              <w:t>1 No.</w:t>
-            </w:r>
-          </w:p>
-        </w:tc>
-      </w:tr>
-      <w:tr>
-        <w:trPr>
-          <w:trHeight w:val="340"/>
-        </w:trPr>
-        <w:tc>
-          <w:tcPr>
-            <w:tcW w:w="4225" w:type="pct"/>
-            <w:vAlign w:val="center"/>
-          </w:tcPr>
-          <w:p>
-            <w:pPr>
-              <w:pStyle w:val="TableParagraph"/>
-              <w:spacing w:before="19"/>
-              <w:rPr>
-                <w:sz w:val="24"/>
-              </w:rPr>
-            </w:pPr>
-            <w:r>
-              <w:rPr>
-                <w:rFonts w:ascii="Calibri" w:hAnsi="Calibri" w:cs="Calibri"/>
-                <w:sz w:val="24"/>
-              </w:rPr>
-              <w:t>DPT for Pressure</w:t>
-            </w:r>
-          </w:p>
-        </w:tc>
-        <w:tc>
-          <w:tcPr>
-            <w:tcW w:w="775" w:type="pct"/>
-          </w:tcPr>
-          <w:p>
-            <w:pPr>
-              <w:pStyle w:val="TableParagraph"/>
-              <w:spacing w:before="19"/>
-              <w:rPr>
-                <w:sz w:val="24"/>
-              </w:rPr>
-            </w:pPr>
-            <w:r>
-              <w:rPr>
-                <w:rFonts w:ascii="Calibri" w:hAnsi="Calibri" w:cs="Calibri"/>
-                <w:sz w:val="24"/>
-              </w:rPr>
-              <w:t>1 No.</w:t>
-            </w:r>
-          </w:p>
-        </w:tc>
-      </w:tr>
-      <w:tr>
-        <w:trPr>
-          <w:trHeight w:val="340"/>
-        </w:trPr>
-        <w:tc>
-          <w:tcPr>
-            <w:tcW w:w="4225" w:type="pct"/>
-            <w:vAlign w:val="center"/>
-          </w:tcPr>
-          <w:p>
-            <w:pPr>
-              <w:pStyle w:val="TableParagraph"/>
-              <w:spacing w:before="19"/>
-              <w:rPr>
-                <w:sz w:val="24"/>
-              </w:rPr>
-            </w:pPr>
-            <w:r>
-              <w:rPr>
-                <w:rFonts w:ascii="Calibri" w:hAnsi="Calibri" w:cs="Calibri"/>
-                <w:sz w:val="24"/>
-              </w:rPr>
-              <w:t>Control Panel</w:t>
-            </w:r>
-          </w:p>
-        </w:tc>
-        <w:tc>
-          <w:tcPr>
-            <w:tcW w:w="775" w:type="pct"/>
-          </w:tcPr>
-          <w:p>
-            <w:pPr>
-              <w:pStyle w:val="TableParagraph"/>
-              <w:spacing w:before="19"/>
-              <w:rPr>
-                <w:sz w:val="24"/>
-              </w:rPr>
-            </w:pPr>
-            <w:r>
-              <w:rPr>
-                <w:rFonts w:ascii="Calibri" w:hAnsi="Calibri" w:cs="Calibri"/>
-                <w:sz w:val="24"/>
-              </w:rPr>
-              <w:t>1 No.</w:t>
-            </w:r>
-          </w:p>
-        </w:tc>
-      </w:tr>
-    </w:tbl>
     <w:p>
       <w:pPr>
         <w:pStyle w:val="NoSpacing"/>

</xml_diff>

<commit_message>
fix: restore furnace-pressure OPERATIONAL SEQUENCE in regen offer
Reinstated the OPERATIONAL SEQUENCE block (intro + 3 bullets) under FURNACE
PRESSURE CONTROL SYSTEM that the previous commit removed. The FURNACE PRESSURE
CONTROL SYSTEM section itself was never removed.

Co-Authored-By: Claude Opus 4.8 (1M context) <noreply@anthropic.com>
</commit_message>
<xml_diff>
--- a/Regen_Offer_Template.docx
+++ b/Regen_Offer_Template.docx
@@ -4180,6 +4180,138 @@
           <w:rFonts w:ascii="Calibri" w:hAnsi="Calibri" w:cs="Calibri"/>
         </w:rPr>
         <w:t xml:space="preserve">lue control Valves </w:t>
+      </w:r>
+    </w:p>
+    <w:p>
+      <w:pPr>
+        <w:widowControl w:val="0"/>
+        <w:spacing w:line="276" w:lineRule="auto" w:before="280" w:after="80"/>
+        <w:rPr>
+          <w:b/>
+          <w:iCs/>
+          <w:color w:val="000000"/>
+          <w:u w:val="single"/>
+        </w:rPr>
+        <w:pBdr>
+          <w:bottom w:val="single" w:color="E87722" w:sz="12" w:space="4"/>
+        </w:pBdr>
+      </w:pPr>
+      <w:r>
+        <w:rPr>
+          <w:rFonts w:ascii="Calibri" w:hAnsi="Calibri" w:cs="Calibri"/>
+          <w:b/>
+          <w:iCs/>
+          <w:color w:val="1F2937"/>
+          <w:sz w:val="30"/>
+        </w:rPr>
+        <w:t>OPERATIONAL SEQUENCE</w:t>
+      </w:r>
+    </w:p>
+    <w:p>
+      <w:pPr>
+        <w:jc w:val="both"/>
+      </w:pPr>
+      <w:r>
+        <w:rPr>
+          <w:rFonts w:ascii="Calibri" w:hAnsi="Calibri" w:cs="Calibri"/>
+        </w:rPr>
+        <w:t>The Sequence of Pressure control in the furnace will be as following:</w:t>
+      </w:r>
+    </w:p>
+    <w:p>
+      <w:pPr>
+        <w:pStyle w:val="ListParagraph"/>
+        <w:widowControl w:val="0"/>
+        <w:numPr>
+          <w:ilvl w:val="0"/>
+          <w:numId w:val="8"/>
+        </w:numPr>
+        <w:spacing w:after="200" w:line="276" w:lineRule="auto"/>
+        <w:jc w:val="both"/>
+      </w:pPr>
+      <w:r>
+        <w:rPr>
+          <w:rFonts w:ascii="Calibri" w:hAnsi="Calibri" w:cs="Calibri"/>
+        </w:rPr>
+        <w:t>The sensing tube fitted in the furnace, will give the Pressure differential and that will be sensed by the Pressure Transmitter</w:t>
+      </w:r>
+    </w:p>
+    <w:p>
+      <w:pPr>
+        <w:pStyle w:val="ListParagraph"/>
+        <w:widowControl w:val="0"/>
+        <w:numPr>
+          <w:ilvl w:val="0"/>
+          <w:numId w:val="8"/>
+        </w:numPr>
+        <w:spacing w:after="200" w:line="276" w:lineRule="auto"/>
+        <w:jc w:val="both"/>
+      </w:pPr>
+      <w:r>
+        <w:rPr>
+          <w:rFonts w:ascii="Calibri" w:hAnsi="Calibri" w:cs="Calibri"/>
+        </w:rPr>
+        <w:t xml:space="preserve">The pressure transmitter will give </w:t>
+      </w:r>
+      <w:r>
+        <w:rPr>
+          <w:rFonts w:ascii="Calibri" w:hAnsi="Calibri" w:cs="Calibri"/>
+        </w:rPr>
+        <w:t>a signal</w:t>
+      </w:r>
+      <w:r>
+        <w:rPr>
+          <w:rFonts w:ascii="Calibri" w:hAnsi="Calibri" w:cs="Calibri"/>
+        </w:rPr>
+        <w:t xml:space="preserve"> to the P.L.C indicating the furnace </w:t>
+      </w:r>
+      <w:r>
+        <w:rPr>
+          <w:rFonts w:ascii="Calibri" w:hAnsi="Calibri" w:cs="Calibri"/>
+        </w:rPr>
+        <w:t>pressure.</w:t>
+      </w:r>
+    </w:p>
+    <w:p>
+      <w:pPr>
+        <w:pStyle w:val="ListParagraph"/>
+        <w:widowControl w:val="0"/>
+        <w:numPr>
+          <w:ilvl w:val="0"/>
+          <w:numId w:val="8"/>
+        </w:numPr>
+        <w:spacing w:after="200" w:line="276" w:lineRule="auto"/>
+        <w:jc w:val="both"/>
+      </w:pPr>
+      <w:r>
+        <w:rPr>
+          <w:rFonts w:ascii="Calibri" w:hAnsi="Calibri" w:cs="Calibri"/>
+        </w:rPr>
+        <w:t xml:space="preserve">P.L.C will send a signal to the </w:t>
+      </w:r>
+      <w:r>
+        <w:rPr>
+          <w:rFonts w:ascii="Calibri" w:hAnsi="Calibri" w:cs="Calibri"/>
+        </w:rPr>
+        <w:t>flue control valve</w:t>
+      </w:r>
+      <w:r>
+        <w:rPr>
+          <w:rFonts w:ascii="Calibri" w:hAnsi="Calibri" w:cs="Calibri"/>
+        </w:rPr>
+        <w:t xml:space="preserve"> fitted on the flue line to modulate</w:t>
+      </w:r>
+      <w:r>
+        <w:rPr>
+          <w:rFonts w:ascii="Calibri" w:hAnsi="Calibri" w:cs="Calibri"/>
+        </w:rPr>
+        <w:t xml:space="preserve"> </w:t>
+      </w:r>
+      <w:r>
+        <w:rPr>
+          <w:rFonts w:ascii="Calibri" w:hAnsi="Calibri" w:cs="Calibri"/>
+        </w:rPr>
+        <w:t xml:space="preserve">according to the set pressure. </w:t>
       </w:r>
     </w:p>
     <w:p>

</xml_diff>

<commit_message>
style: remove COVER LETTER heading from regen offer
Co-Authored-By: Claude Opus 4.8 (1M context) <noreply@anthropic.com>
</commit_message>
<xml_diff>
--- a/Regen_Offer_Template.docx
+++ b/Regen_Offer_Template.docx
@@ -435,26 +435,6 @@
           <w:szCs w:val="20"/>
         </w:rPr>
         <w:t xml:space="preserve">sales@encon.co.in   •   www.encon.co.in</w:t>
-      </w:r>
-    </w:p>
-    <w:p>
-      <w:pPr>
-        <w:pStyle w:val="Heading1"/>
-        <w:pBdr>
-          <w:bottom w:val="single" w:color="E87722" w:sz="12" w:space="4"/>
-        </w:pBdr>
-        <w:spacing w:after="80" w:before="200"/>
-      </w:pPr>
-      <w:r>
-        <w:rPr>
-          <w:rFonts w:ascii="Calibri" w:cs="Calibri" w:eastAsia="Calibri" w:hAnsi="Calibri"/>
-          <w:b/>
-          <w:bCs/>
-          <w:color w:val="1F2937"/>
-          <w:sz w:val="32"/>
-          <w:szCs w:val="32"/>
-        </w:rPr>
-        <w:t>COVER LETTER</w:t>
       </w:r>
     </w:p>
     <w:p>

</xml_diff>

<commit_message>
style: line spacing 1.0 on all regen offer bullets (was 1.15)
Co-Authored-By: Claude Opus 4.8 (1M context) <noreply@anthropic.com>
</commit_message>
<xml_diff>
--- a/Regen_Offer_Template.docx
+++ b/Regen_Offer_Template.docx
@@ -2538,7 +2538,7 @@
           <w:ilvl w:val="0"/>
           <w:numId w:val="4"/>
         </w:numPr>
-        <w:spacing w:line="276" w:lineRule="auto"/>
+        <w:spacing w:line="240" w:lineRule="auto"/>
         <w:rPr>
           <w:rFonts w:ascii="Times New Roman" w:hAnsi="Times New Roman" w:cs="Times New Roman"/>
           <w:sz w:val="24"/>
@@ -2561,7 +2561,7 @@
           <w:ilvl w:val="0"/>
           <w:numId w:val="4"/>
         </w:numPr>
-        <w:spacing w:line="276" w:lineRule="auto"/>
+        <w:spacing w:line="240" w:lineRule="auto"/>
         <w:rPr>
           <w:rFonts w:ascii="Times New Roman" w:hAnsi="Times New Roman" w:cs="Times New Roman"/>
           <w:sz w:val="24"/>
@@ -2592,7 +2592,7 @@
           <w:ilvl w:val="0"/>
           <w:numId w:val="4"/>
         </w:numPr>
-        <w:spacing w:line="276" w:lineRule="auto"/>
+        <w:spacing w:line="240" w:lineRule="auto"/>
         <w:rPr>
           <w:rFonts w:ascii="Times New Roman" w:hAnsi="Times New Roman" w:cs="Times New Roman"/>
           <w:sz w:val="24"/>
@@ -2615,7 +2615,7 @@
           <w:ilvl w:val="0"/>
           <w:numId w:val="4"/>
         </w:numPr>
-        <w:spacing w:line="276" w:lineRule="auto"/>
+        <w:spacing w:line="240" w:lineRule="auto"/>
         <w:rPr>
           <w:rFonts w:ascii="Times New Roman" w:hAnsi="Times New Roman" w:cs="Times New Roman"/>
           <w:sz w:val="24"/>
@@ -2654,7 +2654,7 @@
           <w:ilvl w:val="0"/>
           <w:numId w:val="4"/>
         </w:numPr>
-        <w:spacing w:line="276" w:lineRule="auto"/>
+        <w:spacing w:line="240" w:lineRule="auto"/>
         <w:rPr>
           <w:rFonts w:ascii="Times New Roman" w:hAnsi="Times New Roman" w:cs="Times New Roman"/>
           <w:sz w:val="24"/>
@@ -2685,7 +2685,7 @@
           <w:ilvl w:val="0"/>
           <w:numId w:val="4"/>
         </w:numPr>
-        <w:spacing w:line="276" w:lineRule="auto"/>
+        <w:spacing w:line="240" w:lineRule="auto"/>
         <w:rPr>
           <w:rFonts w:ascii="Times New Roman" w:hAnsi="Times New Roman" w:cs="Times New Roman"/>
           <w:sz w:val="24"/>
@@ -2708,7 +2708,7 @@
           <w:ilvl w:val="0"/>
           <w:numId w:val="4"/>
         </w:numPr>
-        <w:spacing w:line="276" w:lineRule="auto"/>
+        <w:spacing w:line="240" w:lineRule="auto"/>
         <w:rPr>
           <w:rFonts w:ascii="Times New Roman" w:hAnsi="Times New Roman" w:cs="Times New Roman"/>
           <w:sz w:val="24"/>
@@ -2739,7 +2739,7 @@
           <w:ilvl w:val="0"/>
           <w:numId w:val="4"/>
         </w:numPr>
-        <w:spacing w:line="276" w:lineRule="auto"/>
+        <w:spacing w:line="240" w:lineRule="auto"/>
         <w:rPr>
           <w:rFonts w:ascii="Times New Roman" w:hAnsi="Times New Roman" w:cs="Times New Roman"/>
           <w:sz w:val="24"/>
@@ -2770,7 +2770,7 @@
           <w:ilvl w:val="0"/>
           <w:numId w:val="4"/>
         </w:numPr>
-        <w:spacing w:line="276" w:lineRule="auto"/>
+        <w:spacing w:line="240" w:lineRule="auto"/>
         <w:rPr>
           <w:rFonts w:ascii="Times New Roman" w:hAnsi="Times New Roman" w:cs="Times New Roman"/>
           <w:sz w:val="24"/>
@@ -2793,7 +2793,7 @@
           <w:ilvl w:val="0"/>
           <w:numId w:val="4"/>
         </w:numPr>
-        <w:spacing w:line="276" w:lineRule="auto"/>
+        <w:spacing w:line="240" w:lineRule="auto"/>
         <w:rPr>
           <w:rFonts w:ascii="Times New Roman" w:hAnsi="Times New Roman" w:cs="Times New Roman"/>
           <w:sz w:val="24"/>
@@ -2816,7 +2816,7 @@
           <w:ilvl w:val="0"/>
           <w:numId w:val="4"/>
         </w:numPr>
-        <w:spacing w:line="276" w:lineRule="auto"/>
+        <w:spacing w:line="240" w:lineRule="auto"/>
         <w:rPr>
           <w:rFonts w:ascii="Times New Roman" w:hAnsi="Times New Roman" w:cs="Times New Roman"/>
           <w:sz w:val="24"/>
@@ -2847,7 +2847,7 @@
           <w:ilvl w:val="0"/>
           <w:numId w:val="4"/>
         </w:numPr>
-        <w:spacing w:line="276" w:lineRule="auto"/>
+        <w:spacing w:line="240" w:lineRule="auto"/>
         <w:rPr>
           <w:rFonts w:ascii="Times New Roman" w:hAnsi="Times New Roman" w:cs="Times New Roman"/>
           <w:sz w:val="24"/>
@@ -2966,6 +2966,7 @@
           <w:ilvl w:val="0"/>
           <w:numId w:val="4"/>
         </w:numPr>
+        <w:spacing w:line="240" w:lineRule="auto"/>
         <w:rPr>
           <w:rFonts w:ascii="Times New Roman" w:hAnsi="Times New Roman" w:cs="Times New Roman"/>
           <w:sz w:val="24"/>
@@ -2988,6 +2989,7 @@
           <w:ilvl w:val="0"/>
           <w:numId w:val="4"/>
         </w:numPr>
+        <w:spacing w:line="240" w:lineRule="auto"/>
         <w:rPr>
           <w:rFonts w:ascii="Times New Roman" w:hAnsi="Times New Roman" w:cs="Times New Roman"/>
           <w:sz w:val="24"/>
@@ -3010,6 +3012,7 @@
           <w:ilvl w:val="0"/>
           <w:numId w:val="4"/>
         </w:numPr>
+        <w:spacing w:line="240" w:lineRule="auto"/>
         <w:rPr>
           <w:rFonts w:ascii="Times New Roman" w:hAnsi="Times New Roman" w:cs="Times New Roman"/>
           <w:sz w:val="24"/>
@@ -3032,6 +3035,7 @@
           <w:ilvl w:val="0"/>
           <w:numId w:val="4"/>
         </w:numPr>
+        <w:spacing w:line="240" w:lineRule="auto"/>
         <w:rPr>
           <w:rFonts w:ascii="Times New Roman" w:hAnsi="Times New Roman" w:cs="Times New Roman"/>
           <w:sz w:val="24"/>
@@ -3054,6 +3058,7 @@
           <w:ilvl w:val="0"/>
           <w:numId w:val="4"/>
         </w:numPr>
+        <w:spacing w:line="240" w:lineRule="auto"/>
         <w:rPr>
           <w:rFonts w:ascii="Times New Roman" w:hAnsi="Times New Roman" w:cs="Times New Roman"/>
           <w:sz w:val="24"/>
@@ -3477,7 +3482,7 @@
           <w:ilvl w:val="0"/>
           <w:numId w:val="5"/>
         </w:numPr>
-        <w:spacing w:after="200" w:line="276" w:lineRule="auto"/>
+        <w:spacing w:after="200" w:line="240" w:lineRule="auto"/>
         <w:jc w:val="both"/>
       </w:pPr>
       <w:r>
@@ -3507,7 +3512,7 @@
           <w:ilvl w:val="0"/>
           <w:numId w:val="5"/>
         </w:numPr>
-        <w:spacing w:after="200" w:line="276" w:lineRule="auto"/>
+        <w:spacing w:after="200" w:line="240" w:lineRule="auto"/>
         <w:jc w:val="both"/>
       </w:pPr>
       <w:r>
@@ -3531,7 +3536,7 @@
           <w:ilvl w:val="0"/>
           <w:numId w:val="5"/>
         </w:numPr>
-        <w:spacing w:after="200" w:line="276" w:lineRule="auto"/>
+        <w:spacing w:after="200" w:line="240" w:lineRule="auto"/>
         <w:jc w:val="both"/>
       </w:pPr>
       <w:r>
@@ -3567,7 +3572,7 @@
           <w:ilvl w:val="0"/>
           <w:numId w:val="5"/>
         </w:numPr>
-        <w:spacing w:after="200" w:line="276" w:lineRule="auto"/>
+        <w:spacing w:after="200" w:line="240" w:lineRule="auto"/>
         <w:jc w:val="both"/>
       </w:pPr>
       <w:r>
@@ -3603,7 +3608,7 @@
           <w:ilvl w:val="0"/>
           <w:numId w:val="5"/>
         </w:numPr>
-        <w:spacing w:after="200" w:line="276" w:lineRule="auto"/>
+        <w:spacing w:after="200" w:line="240" w:lineRule="auto"/>
         <w:jc w:val="both"/>
         <w:rPr>
           <w:lang w:val="en-IN"/>
@@ -3639,7 +3644,7 @@
           <w:ilvl w:val="0"/>
           <w:numId w:val="5"/>
         </w:numPr>
-        <w:spacing w:after="200" w:line="276" w:lineRule="auto"/>
+        <w:spacing w:after="200" w:line="240" w:lineRule="auto"/>
         <w:jc w:val="both"/>
         <w:rPr>
           <w:lang w:val="en-IN"/>
@@ -3689,7 +3694,7 @@
           <w:ilvl w:val="0"/>
           <w:numId w:val="5"/>
         </w:numPr>
-        <w:spacing w:after="200" w:line="276" w:lineRule="auto"/>
+        <w:spacing w:after="200" w:line="240" w:lineRule="auto"/>
         <w:jc w:val="both"/>
         <w:rPr>
           <w:lang w:val="en-IN"/>
@@ -3834,7 +3839,7 @@
           <w:ilvl w:val="0"/>
           <w:numId w:val="6"/>
         </w:numPr>
-        <w:spacing w:after="200" w:line="276" w:lineRule="auto"/>
+        <w:spacing w:after="200" w:line="240" w:lineRule="auto"/>
         <w:jc w:val="both"/>
       </w:pPr>
       <w:r>
@@ -3858,7 +3863,7 @@
           <w:ilvl w:val="0"/>
           <w:numId w:val="6"/>
         </w:numPr>
-        <w:spacing w:after="200" w:line="276" w:lineRule="auto"/>
+        <w:spacing w:after="200" w:line="240" w:lineRule="auto"/>
         <w:jc w:val="both"/>
       </w:pPr>
       <w:r>
@@ -3900,7 +3905,7 @@
           <w:ilvl w:val="0"/>
           <w:numId w:val="6"/>
         </w:numPr>
-        <w:spacing w:after="200" w:line="276" w:lineRule="auto"/>
+        <w:spacing w:after="200" w:line="240" w:lineRule="auto"/>
         <w:jc w:val="both"/>
       </w:pPr>
       <w:r>
@@ -4077,7 +4082,7 @@
           <w:ilvl w:val="0"/>
           <w:numId w:val="7"/>
         </w:numPr>
-        <w:spacing w:after="200" w:line="276" w:lineRule="auto"/>
+        <w:spacing w:after="200" w:line="240" w:lineRule="auto"/>
       </w:pPr>
       <w:r>
         <w:rPr>
@@ -4112,7 +4117,7 @@
           <w:ilvl w:val="0"/>
           <w:numId w:val="7"/>
         </w:numPr>
-        <w:spacing w:after="200" w:line="276" w:lineRule="auto"/>
+        <w:spacing w:after="200" w:line="240" w:lineRule="auto"/>
       </w:pPr>
       <w:r>
         <w:rPr>
@@ -4147,7 +4152,7 @@
           <w:ilvl w:val="0"/>
           <w:numId w:val="7"/>
         </w:numPr>
-        <w:spacing w:after="200" w:line="276" w:lineRule="auto"/>
+        <w:spacing w:after="200" w:line="240" w:lineRule="auto"/>
       </w:pPr>
       <w:r>
         <w:rPr>
@@ -4206,7 +4211,7 @@
           <w:ilvl w:val="0"/>
           <w:numId w:val="8"/>
         </w:numPr>
-        <w:spacing w:after="200" w:line="276" w:lineRule="auto"/>
+        <w:spacing w:after="200" w:line="240" w:lineRule="auto"/>
         <w:jc w:val="both"/>
       </w:pPr>
       <w:r>
@@ -4224,7 +4229,7 @@
           <w:ilvl w:val="0"/>
           <w:numId w:val="8"/>
         </w:numPr>
-        <w:spacing w:after="200" w:line="276" w:lineRule="auto"/>
+        <w:spacing w:after="200" w:line="240" w:lineRule="auto"/>
         <w:jc w:val="both"/>
       </w:pPr>
       <w:r>
@@ -4260,7 +4265,7 @@
           <w:ilvl w:val="0"/>
           <w:numId w:val="8"/>
         </w:numPr>
-        <w:spacing w:after="200" w:line="276" w:lineRule="auto"/>
+        <w:spacing w:after="200" w:line="240" w:lineRule="auto"/>
         <w:jc w:val="both"/>
       </w:pPr>
       <w:r>

</xml_diff>

<commit_message>
style: shrink cover logo to fit page 1; tighten all bullets; 'kW capacity' lowercase
- Cover logo 5.12in -> 4.0in tall (kept aspect) + trimmed two cover gaps so the
  cover block fits on page 1.
- All bullets: single line spacing + 2pt after (were 10pt) for a tight list.
- 'kW Capacity' -> 'kW capacity'.

Co-Authored-By: Claude Opus 4.8 (1M context) <noreply@anthropic.com>
</commit_message>
<xml_diff>
--- a/Regen_Offer_Template.docx
+++ b/Regen_Offer_Template.docx
@@ -10,7 +10,7 @@
       <w:r>
         <w:drawing>
           <wp:inline distT="0" distB="0" distL="0" distR="0">
-            <wp:extent cx="3619500" cy="4680000"/>
+            <wp:extent cx="2828778" cy="3657600"/>
             <wp:effectExtent t="0" r="0" b="0" l="0"/>
             <wp:docPr id="1" name="ENCON" descr="ENCON logo" title="ENCON"/>
             <wp:cNvGraphicFramePr>
@@ -35,7 +35,7 @@
                   <pic:spPr bwMode="auto">
                     <a:xfrm>
                       <a:off x="0" y="0"/>
-                      <a:ext cx="3619500" cy="4680000"/>
+                      <a:ext cx="2828778" cy="3657600"/>
                     </a:xfrm>
                     <a:prstGeom prst="rect">
                       <a:avLst/>
@@ -68,7 +68,7 @@
     </w:p>
     <w:p>
       <w:pPr>
-        <w:spacing w:before="0" w:after="200"/>
+        <w:spacing w:before="0" w:after="120"/>
         <w:jc w:val="center"/>
       </w:pPr>
       <w:r>
@@ -377,7 +377,7 @@
     </w:p>
     <w:p>
       <w:pPr>
-        <w:spacing w:before="0" w:after="240"/>
+        <w:spacing w:before="0" w:after="80"/>
         <w:jc w:val="center"/>
       </w:pPr>
       <w:r>
@@ -2256,7 +2256,7 @@
           <w:sz w:val="24"/>
           <w:szCs w:val="24"/>
         </w:rPr>
-        <w:t>We shall supply {{ qty_words }} of ENCON Regen Burners of {{ kw }} kW Capacity, the fuel used in these burners will be {{ fuel_name }}.</w:t>
+        <w:t>We shall supply {{ qty_words }} of ENCON Regen Burners of {{ kw }} kW capacity, the fuel used in these burners will be {{ fuel_name }}.</w:t>
       </w:r>
       <w:r>
         <w:rPr>
@@ -2538,7 +2538,7 @@
           <w:ilvl w:val="0"/>
           <w:numId w:val="4"/>
         </w:numPr>
-        <w:spacing w:line="240" w:lineRule="auto"/>
+        <w:spacing w:line="240" w:lineRule="auto" w:before="0" w:after="40"/>
         <w:rPr>
           <w:rFonts w:ascii="Times New Roman" w:hAnsi="Times New Roman" w:cs="Times New Roman"/>
           <w:sz w:val="24"/>
@@ -2561,7 +2561,7 @@
           <w:ilvl w:val="0"/>
           <w:numId w:val="4"/>
         </w:numPr>
-        <w:spacing w:line="240" w:lineRule="auto"/>
+        <w:spacing w:line="240" w:lineRule="auto" w:before="0" w:after="40"/>
         <w:rPr>
           <w:rFonts w:ascii="Times New Roman" w:hAnsi="Times New Roman" w:cs="Times New Roman"/>
           <w:sz w:val="24"/>
@@ -2592,7 +2592,7 @@
           <w:ilvl w:val="0"/>
           <w:numId w:val="4"/>
         </w:numPr>
-        <w:spacing w:line="240" w:lineRule="auto"/>
+        <w:spacing w:line="240" w:lineRule="auto" w:before="0" w:after="40"/>
         <w:rPr>
           <w:rFonts w:ascii="Times New Roman" w:hAnsi="Times New Roman" w:cs="Times New Roman"/>
           <w:sz w:val="24"/>
@@ -2615,7 +2615,7 @@
           <w:ilvl w:val="0"/>
           <w:numId w:val="4"/>
         </w:numPr>
-        <w:spacing w:line="240" w:lineRule="auto"/>
+        <w:spacing w:line="240" w:lineRule="auto" w:before="0" w:after="40"/>
         <w:rPr>
           <w:rFonts w:ascii="Times New Roman" w:hAnsi="Times New Roman" w:cs="Times New Roman"/>
           <w:sz w:val="24"/>
@@ -2654,7 +2654,7 @@
           <w:ilvl w:val="0"/>
           <w:numId w:val="4"/>
         </w:numPr>
-        <w:spacing w:line="240" w:lineRule="auto"/>
+        <w:spacing w:line="240" w:lineRule="auto" w:before="0" w:after="40"/>
         <w:rPr>
           <w:rFonts w:ascii="Times New Roman" w:hAnsi="Times New Roman" w:cs="Times New Roman"/>
           <w:sz w:val="24"/>
@@ -2685,7 +2685,7 @@
           <w:ilvl w:val="0"/>
           <w:numId w:val="4"/>
         </w:numPr>
-        <w:spacing w:line="240" w:lineRule="auto"/>
+        <w:spacing w:line="240" w:lineRule="auto" w:before="0" w:after="40"/>
         <w:rPr>
           <w:rFonts w:ascii="Times New Roman" w:hAnsi="Times New Roman" w:cs="Times New Roman"/>
           <w:sz w:val="24"/>
@@ -2708,7 +2708,7 @@
           <w:ilvl w:val="0"/>
           <w:numId w:val="4"/>
         </w:numPr>
-        <w:spacing w:line="240" w:lineRule="auto"/>
+        <w:spacing w:line="240" w:lineRule="auto" w:before="0" w:after="40"/>
         <w:rPr>
           <w:rFonts w:ascii="Times New Roman" w:hAnsi="Times New Roman" w:cs="Times New Roman"/>
           <w:sz w:val="24"/>
@@ -2739,7 +2739,7 @@
           <w:ilvl w:val="0"/>
           <w:numId w:val="4"/>
         </w:numPr>
-        <w:spacing w:line="240" w:lineRule="auto"/>
+        <w:spacing w:line="240" w:lineRule="auto" w:before="0" w:after="40"/>
         <w:rPr>
           <w:rFonts w:ascii="Times New Roman" w:hAnsi="Times New Roman" w:cs="Times New Roman"/>
           <w:sz w:val="24"/>
@@ -2770,7 +2770,7 @@
           <w:ilvl w:val="0"/>
           <w:numId w:val="4"/>
         </w:numPr>
-        <w:spacing w:line="240" w:lineRule="auto"/>
+        <w:spacing w:line="240" w:lineRule="auto" w:before="0" w:after="40"/>
         <w:rPr>
           <w:rFonts w:ascii="Times New Roman" w:hAnsi="Times New Roman" w:cs="Times New Roman"/>
           <w:sz w:val="24"/>
@@ -2793,7 +2793,7 @@
           <w:ilvl w:val="0"/>
           <w:numId w:val="4"/>
         </w:numPr>
-        <w:spacing w:line="240" w:lineRule="auto"/>
+        <w:spacing w:line="240" w:lineRule="auto" w:before="0" w:after="40"/>
         <w:rPr>
           <w:rFonts w:ascii="Times New Roman" w:hAnsi="Times New Roman" w:cs="Times New Roman"/>
           <w:sz w:val="24"/>
@@ -2816,7 +2816,7 @@
           <w:ilvl w:val="0"/>
           <w:numId w:val="4"/>
         </w:numPr>
-        <w:spacing w:line="240" w:lineRule="auto"/>
+        <w:spacing w:line="240" w:lineRule="auto" w:before="0" w:after="40"/>
         <w:rPr>
           <w:rFonts w:ascii="Times New Roman" w:hAnsi="Times New Roman" w:cs="Times New Roman"/>
           <w:sz w:val="24"/>
@@ -2847,7 +2847,7 @@
           <w:ilvl w:val="0"/>
           <w:numId w:val="4"/>
         </w:numPr>
-        <w:spacing w:line="240" w:lineRule="auto"/>
+        <w:spacing w:line="240" w:lineRule="auto" w:before="0" w:after="40"/>
         <w:rPr>
           <w:rFonts w:ascii="Times New Roman" w:hAnsi="Times New Roman" w:cs="Times New Roman"/>
           <w:sz w:val="24"/>
@@ -2966,7 +2966,7 @@
           <w:ilvl w:val="0"/>
           <w:numId w:val="4"/>
         </w:numPr>
-        <w:spacing w:line="240" w:lineRule="auto"/>
+        <w:spacing w:line="240" w:lineRule="auto" w:before="0" w:after="40"/>
         <w:rPr>
           <w:rFonts w:ascii="Times New Roman" w:hAnsi="Times New Roman" w:cs="Times New Roman"/>
           <w:sz w:val="24"/>
@@ -2989,7 +2989,7 @@
           <w:ilvl w:val="0"/>
           <w:numId w:val="4"/>
         </w:numPr>
-        <w:spacing w:line="240" w:lineRule="auto"/>
+        <w:spacing w:line="240" w:lineRule="auto" w:before="0" w:after="40"/>
         <w:rPr>
           <w:rFonts w:ascii="Times New Roman" w:hAnsi="Times New Roman" w:cs="Times New Roman"/>
           <w:sz w:val="24"/>
@@ -3012,7 +3012,7 @@
           <w:ilvl w:val="0"/>
           <w:numId w:val="4"/>
         </w:numPr>
-        <w:spacing w:line="240" w:lineRule="auto"/>
+        <w:spacing w:line="240" w:lineRule="auto" w:before="0" w:after="40"/>
         <w:rPr>
           <w:rFonts w:ascii="Times New Roman" w:hAnsi="Times New Roman" w:cs="Times New Roman"/>
           <w:sz w:val="24"/>
@@ -3035,7 +3035,7 @@
           <w:ilvl w:val="0"/>
           <w:numId w:val="4"/>
         </w:numPr>
-        <w:spacing w:line="240" w:lineRule="auto"/>
+        <w:spacing w:line="240" w:lineRule="auto" w:before="0" w:after="40"/>
         <w:rPr>
           <w:rFonts w:ascii="Times New Roman" w:hAnsi="Times New Roman" w:cs="Times New Roman"/>
           <w:sz w:val="24"/>
@@ -3058,7 +3058,7 @@
           <w:ilvl w:val="0"/>
           <w:numId w:val="4"/>
         </w:numPr>
-        <w:spacing w:line="240" w:lineRule="auto"/>
+        <w:spacing w:line="240" w:lineRule="auto" w:before="0" w:after="40"/>
         <w:rPr>
           <w:rFonts w:ascii="Times New Roman" w:hAnsi="Times New Roman" w:cs="Times New Roman"/>
           <w:sz w:val="24"/>
@@ -3482,7 +3482,7 @@
           <w:ilvl w:val="0"/>
           <w:numId w:val="5"/>
         </w:numPr>
-        <w:spacing w:after="200" w:line="240" w:lineRule="auto"/>
+        <w:spacing w:after="40" w:line="240" w:lineRule="auto" w:before="0"/>
         <w:jc w:val="both"/>
       </w:pPr>
       <w:r>
@@ -3512,7 +3512,7 @@
           <w:ilvl w:val="0"/>
           <w:numId w:val="5"/>
         </w:numPr>
-        <w:spacing w:after="200" w:line="240" w:lineRule="auto"/>
+        <w:spacing w:after="40" w:line="240" w:lineRule="auto" w:before="0"/>
         <w:jc w:val="both"/>
       </w:pPr>
       <w:r>
@@ -3536,7 +3536,7 @@
           <w:ilvl w:val="0"/>
           <w:numId w:val="5"/>
         </w:numPr>
-        <w:spacing w:after="200" w:line="240" w:lineRule="auto"/>
+        <w:spacing w:after="40" w:line="240" w:lineRule="auto" w:before="0"/>
         <w:jc w:val="both"/>
       </w:pPr>
       <w:r>
@@ -3572,7 +3572,7 @@
           <w:ilvl w:val="0"/>
           <w:numId w:val="5"/>
         </w:numPr>
-        <w:spacing w:after="200" w:line="240" w:lineRule="auto"/>
+        <w:spacing w:after="40" w:line="240" w:lineRule="auto" w:before="0"/>
         <w:jc w:val="both"/>
       </w:pPr>
       <w:r>
@@ -3608,7 +3608,7 @@
           <w:ilvl w:val="0"/>
           <w:numId w:val="5"/>
         </w:numPr>
-        <w:spacing w:after="200" w:line="240" w:lineRule="auto"/>
+        <w:spacing w:after="40" w:line="240" w:lineRule="auto" w:before="0"/>
         <w:jc w:val="both"/>
         <w:rPr>
           <w:lang w:val="en-IN"/>
@@ -3644,7 +3644,7 @@
           <w:ilvl w:val="0"/>
           <w:numId w:val="5"/>
         </w:numPr>
-        <w:spacing w:after="200" w:line="240" w:lineRule="auto"/>
+        <w:spacing w:after="40" w:line="240" w:lineRule="auto" w:before="0"/>
         <w:jc w:val="both"/>
         <w:rPr>
           <w:lang w:val="en-IN"/>
@@ -3694,7 +3694,7 @@
           <w:ilvl w:val="0"/>
           <w:numId w:val="5"/>
         </w:numPr>
-        <w:spacing w:after="200" w:line="240" w:lineRule="auto"/>
+        <w:spacing w:after="40" w:line="240" w:lineRule="auto" w:before="0"/>
         <w:jc w:val="both"/>
         <w:rPr>
           <w:lang w:val="en-IN"/>
@@ -3839,7 +3839,7 @@
           <w:ilvl w:val="0"/>
           <w:numId w:val="6"/>
         </w:numPr>
-        <w:spacing w:after="200" w:line="240" w:lineRule="auto"/>
+        <w:spacing w:after="40" w:line="240" w:lineRule="auto" w:before="0"/>
         <w:jc w:val="both"/>
       </w:pPr>
       <w:r>
@@ -3863,7 +3863,7 @@
           <w:ilvl w:val="0"/>
           <w:numId w:val="6"/>
         </w:numPr>
-        <w:spacing w:after="200" w:line="240" w:lineRule="auto"/>
+        <w:spacing w:after="40" w:line="240" w:lineRule="auto" w:before="0"/>
         <w:jc w:val="both"/>
       </w:pPr>
       <w:r>
@@ -3905,7 +3905,7 @@
           <w:ilvl w:val="0"/>
           <w:numId w:val="6"/>
         </w:numPr>
-        <w:spacing w:after="200" w:line="240" w:lineRule="auto"/>
+        <w:spacing w:after="40" w:line="240" w:lineRule="auto" w:before="0"/>
         <w:jc w:val="both"/>
       </w:pPr>
       <w:r>
@@ -4082,7 +4082,7 @@
           <w:ilvl w:val="0"/>
           <w:numId w:val="7"/>
         </w:numPr>
-        <w:spacing w:after="200" w:line="240" w:lineRule="auto"/>
+        <w:spacing w:after="40" w:line="240" w:lineRule="auto" w:before="0"/>
       </w:pPr>
       <w:r>
         <w:rPr>
@@ -4117,7 +4117,7 @@
           <w:ilvl w:val="0"/>
           <w:numId w:val="7"/>
         </w:numPr>
-        <w:spacing w:after="200" w:line="240" w:lineRule="auto"/>
+        <w:spacing w:after="40" w:line="240" w:lineRule="auto" w:before="0"/>
       </w:pPr>
       <w:r>
         <w:rPr>
@@ -4152,7 +4152,7 @@
           <w:ilvl w:val="0"/>
           <w:numId w:val="7"/>
         </w:numPr>
-        <w:spacing w:after="200" w:line="240" w:lineRule="auto"/>
+        <w:spacing w:after="40" w:line="240" w:lineRule="auto" w:before="0"/>
       </w:pPr>
       <w:r>
         <w:rPr>
@@ -4211,7 +4211,7 @@
           <w:ilvl w:val="0"/>
           <w:numId w:val="8"/>
         </w:numPr>
-        <w:spacing w:after="200" w:line="240" w:lineRule="auto"/>
+        <w:spacing w:after="40" w:line="240" w:lineRule="auto" w:before="0"/>
         <w:jc w:val="both"/>
       </w:pPr>
       <w:r>
@@ -4229,7 +4229,7 @@
           <w:ilvl w:val="0"/>
           <w:numId w:val="8"/>
         </w:numPr>
-        <w:spacing w:after="200" w:line="240" w:lineRule="auto"/>
+        <w:spacing w:after="40" w:line="240" w:lineRule="auto" w:before="0"/>
         <w:jc w:val="both"/>
       </w:pPr>
       <w:r>
@@ -4265,7 +4265,7 @@
           <w:ilvl w:val="0"/>
           <w:numId w:val="8"/>
         </w:numPr>
-        <w:spacing w:after="200" w:line="240" w:lineRule="auto"/>
+        <w:spacing w:after="40" w:line="240" w:lineRule="auto" w:before="0"/>
         <w:jc w:val="both"/>
       </w:pPr>
       <w:r>

</xml_diff>

<commit_message>
feat: remove ROI table from regen offer; make Flexible Hose 'Bengal Industries'
- Removed the ROI table (+ its separator) from the offer per request.
- _regen_make: Flexible Hose make BENGAL -> Bengal Industries (shows in the
  dynamic MAKE LIST).

Co-Authored-By: Claude Opus 4.8 (1M context) <noreply@anthropic.com>
</commit_message>
<xml_diff>
--- a/Regen_Offer_Template.docx
+++ b/Regen_Offer_Template.docx
@@ -13611,1397 +13611,6 @@
                 <w:sz w:val="22"/>
               </w:rPr>
               <w:t>This will lead to a quicker payback.</w:t>
-            </w:r>
-          </w:p>
-        </w:tc>
-      </w:tr>
-    </w:tbl>
-    <w:p/>
-    <w:tbl>
-      <w:tblPr>
-        <w:jc w:val="center"/>
-        <w:tblCellMar>
-          <w:left w:w="0" w:type="dxa"/>
-          <w:right w:w="0" w:type="dxa"/>
-        </w:tblCellMar>
-        <w:tblLook w:val="04A0" w:firstRow="1" w:lastRow="0" w:firstColumn="1" w:lastColumn="0" w:noHBand="0" w:noVBand="1"/>
-        <w:tblW w:w="9740" w:type="dxa"/>
-        <w:tblLayout w:type="fixed"/>
-      </w:tblPr>
-      <w:tblGrid>
-        <w:gridCol w:w="8390"/>
-        <w:gridCol w:w="1350"/>
-      </w:tblGrid>
-      <w:tr>
-        <w:trPr>
-          <w:trHeight w:val="300"/>
-          <w:jc w:val="center"/>
-        </w:trPr>
-        <w:tc>
-          <w:tcPr>
-            <w:gridSpan w:val="2"/>
-            <w:tcBorders>
-              <w:top w:val="single" w:sz="6" w:space="0" w:color="000000"/>
-              <w:left w:val="single" w:sz="6" w:space="0" w:color="000000"/>
-              <w:bottom w:val="single" w:sz="6" w:space="0" w:color="000000"/>
-              <w:right w:val="single" w:sz="6" w:space="0" w:color="000000"/>
-            </w:tcBorders>
-            <w:tcMar>
-              <w:top w:w="0" w:type="dxa"/>
-              <w:left w:w="45" w:type="dxa"/>
-              <w:bottom w:w="0" w:type="dxa"/>
-              <w:right w:w="45" w:type="dxa"/>
-            </w:tcMar>
-            <w:vAlign w:val="center"/>
-            <w:hideMark/>
-            <w:shd w:val="clear" w:fill="F1F5F9"/>
-            <w:tcW w:w="9740" w:type="dxa"/>
-          </w:tcPr>
-          <w:p>
-            <w:pPr>
-              <w:jc w:val="left"/>
-            </w:pPr>
-            <w:r>
-              <w:rPr>
-                <w:rFonts w:ascii="Calibri" w:hAnsi="Calibri" w:cs="Calibri"/>
-                <w:b/>
-              </w:rPr>
-              <w:t>ROI</w:t>
-            </w:r>
-          </w:p>
-        </w:tc>
-      </w:tr>
-      <w:tr>
-        <w:trPr>
-          <w:trHeight w:val="300"/>
-          <w:jc w:val="center"/>
-        </w:trPr>
-        <w:tc>
-          <w:tcPr>
-            <w:tcBorders>
-              <w:top w:val="single" w:sz="6" w:space="0" w:color="CCCCCC"/>
-              <w:left w:val="single" w:sz="6" w:space="0" w:color="000000"/>
-              <w:bottom w:val="single" w:sz="6" w:space="0" w:color="000000"/>
-              <w:right w:val="single" w:sz="6" w:space="0" w:color="000000"/>
-            </w:tcBorders>
-            <w:tcMar>
-              <w:top w:w="0" w:type="dxa"/>
-              <w:left w:w="45" w:type="dxa"/>
-              <w:bottom w:w="0" w:type="dxa"/>
-              <w:right w:w="45" w:type="dxa"/>
-            </w:tcMar>
-            <w:vAlign w:val="center"/>
-            <w:hideMark/>
-            <w:tcW w:w="8390" w:type="dxa"/>
-          </w:tcPr>
-          <w:p>
-            <w:pPr>
-              <w:jc w:val="left"/>
-            </w:pPr>
-            <w:r>
-              <w:rPr>
-                <w:rFonts w:ascii="Calibri" w:hAnsi="Calibri" w:cs="Calibri"/>
-              </w:rPr>
-              <w:t>Furnace Size (Ton/</w:t>
-            </w:r>
-            <w:proofErr w:type="spellStart"/>
-            <w:r>
-              <w:rPr>
-                <w:rFonts w:ascii="Calibri" w:hAnsi="Calibri" w:cs="Calibri"/>
-              </w:rPr>
-              <w:t>Hr</w:t>
-            </w:r>
-            <w:proofErr w:type="spellEnd"/>
-            <w:r>
-              <w:rPr>
-                <w:rFonts w:ascii="Calibri" w:hAnsi="Calibri" w:cs="Calibri"/>
-              </w:rPr>
-              <w:t>)</w:t>
-            </w:r>
-          </w:p>
-        </w:tc>
-        <w:tc>
-          <w:tcPr>
-            <w:tcBorders>
-              <w:top w:val="single" w:sz="6" w:space="0" w:color="CCCCCC"/>
-              <w:left w:val="single" w:sz="6" w:space="0" w:color="CCCCCC"/>
-              <w:bottom w:val="single" w:sz="6" w:space="0" w:color="000000"/>
-              <w:right w:val="single" w:sz="6" w:space="0" w:color="000000"/>
-            </w:tcBorders>
-            <w:tcMar>
-              <w:top w:w="0" w:type="dxa"/>
-              <w:left w:w="45" w:type="dxa"/>
-              <w:bottom w:w="0" w:type="dxa"/>
-              <w:right w:w="45" w:type="dxa"/>
-            </w:tcMar>
-            <w:vAlign w:val="center"/>
-            <w:hideMark/>
-            <w:tcW w:w="1350" w:type="dxa"/>
-          </w:tcPr>
-          <w:p>
-            <w:pPr>
-              <w:jc w:val="left"/>
-              <w:rPr>
-                <w:rFonts w:ascii="Calibri" w:hAnsi="Calibri" w:cs="Calibri"/>
-              </w:rPr>
-            </w:pPr>
-          </w:p>
-        </w:tc>
-      </w:tr>
-      <w:tr>
-        <w:trPr>
-          <w:trHeight w:val="300"/>
-          <w:jc w:val="center"/>
-        </w:trPr>
-        <w:tc>
-          <w:tcPr>
-            <w:tcBorders>
-              <w:top w:val="single" w:sz="6" w:space="0" w:color="CCCCCC"/>
-              <w:left w:val="single" w:sz="6" w:space="0" w:color="000000"/>
-              <w:bottom w:val="single" w:sz="6" w:space="0" w:color="000000"/>
-              <w:right w:val="single" w:sz="6" w:space="0" w:color="000000"/>
-            </w:tcBorders>
-            <w:tcMar>
-              <w:top w:w="0" w:type="dxa"/>
-              <w:left w:w="45" w:type="dxa"/>
-              <w:bottom w:w="0" w:type="dxa"/>
-              <w:right w:w="45" w:type="dxa"/>
-            </w:tcMar>
-            <w:vAlign w:val="center"/>
-            <w:hideMark/>
-            <w:tcW w:w="8390" w:type="dxa"/>
-          </w:tcPr>
-          <w:p>
-            <w:r>
-              <w:rPr>
-                <w:rFonts w:ascii="Calibri" w:hAnsi="Calibri" w:cs="Calibri"/>
-              </w:rPr>
-              <w:t xml:space="preserve">Present Fuel Consumption (Nm3/ton ) </w:t>
-            </w:r>
-          </w:p>
-        </w:tc>
-        <w:tc>
-          <w:tcPr>
-            <w:tcBorders>
-              <w:top w:val="single" w:sz="6" w:space="0" w:color="CCCCCC"/>
-              <w:left w:val="single" w:sz="6" w:space="0" w:color="CCCCCC"/>
-              <w:bottom w:val="single" w:sz="6" w:space="0" w:color="000000"/>
-              <w:right w:val="single" w:sz="6" w:space="0" w:color="000000"/>
-            </w:tcBorders>
-            <w:tcMar>
-              <w:top w:w="0" w:type="dxa"/>
-              <w:left w:w="45" w:type="dxa"/>
-              <w:bottom w:w="0" w:type="dxa"/>
-              <w:right w:w="45" w:type="dxa"/>
-            </w:tcMar>
-            <w:vAlign w:val="center"/>
-            <w:hideMark/>
-            <w:tcW w:w="1350" w:type="dxa"/>
-          </w:tcPr>
-          <w:p>
-            <w:pPr>
-              <w:jc w:val="right"/>
-            </w:pPr>
-            <w:r>
-              <w:rPr>
-                <w:rFonts w:ascii="Calibri" w:hAnsi="Calibri" w:cs="Calibri"/>
-              </w:rPr>
-              <w:t xml:space="preserve">90.00 </w:t>
-            </w:r>
-          </w:p>
-        </w:tc>
-      </w:tr>
-      <w:tr>
-        <w:trPr>
-          <w:trHeight w:val="300"/>
-          <w:jc w:val="center"/>
-        </w:trPr>
-        <w:tc>
-          <w:tcPr>
-            <w:tcBorders>
-              <w:top w:val="single" w:sz="6" w:space="0" w:color="CCCCCC"/>
-              <w:left w:val="single" w:sz="6" w:space="0" w:color="000000"/>
-              <w:bottom w:val="single" w:sz="6" w:space="0" w:color="000000"/>
-              <w:right w:val="single" w:sz="6" w:space="0" w:color="000000"/>
-            </w:tcBorders>
-            <w:tcMar>
-              <w:top w:w="0" w:type="dxa"/>
-              <w:left w:w="45" w:type="dxa"/>
-              <w:bottom w:w="0" w:type="dxa"/>
-              <w:right w:w="45" w:type="dxa"/>
-            </w:tcMar>
-            <w:vAlign w:val="center"/>
-            <w:hideMark/>
-            <w:tcW w:w="8390" w:type="dxa"/>
-          </w:tcPr>
-          <w:p>
-            <w:r>
-              <w:rPr>
-                <w:rFonts w:ascii="Calibri" w:hAnsi="Calibri" w:cs="Calibri"/>
-              </w:rPr>
-              <w:t xml:space="preserve">Fuel Consumption with regenerative burner (Nm3/ton ) </w:t>
-            </w:r>
-          </w:p>
-        </w:tc>
-        <w:tc>
-          <w:tcPr>
-            <w:tcBorders>
-              <w:top w:val="single" w:sz="6" w:space="0" w:color="CCCCCC"/>
-              <w:left w:val="single" w:sz="6" w:space="0" w:color="CCCCCC"/>
-              <w:bottom w:val="single" w:sz="6" w:space="0" w:color="000000"/>
-              <w:right w:val="single" w:sz="6" w:space="0" w:color="000000"/>
-            </w:tcBorders>
-            <w:tcMar>
-              <w:top w:w="0" w:type="dxa"/>
-              <w:left w:w="45" w:type="dxa"/>
-              <w:bottom w:w="0" w:type="dxa"/>
-              <w:right w:w="45" w:type="dxa"/>
-            </w:tcMar>
-            <w:vAlign w:val="center"/>
-            <w:hideMark/>
-            <w:tcW w:w="1350" w:type="dxa"/>
-          </w:tcPr>
-          <w:p>
-            <w:pPr>
-              <w:jc w:val="right"/>
-            </w:pPr>
-            <w:r>
-              <w:rPr>
-                <w:rFonts w:ascii="Calibri" w:hAnsi="Calibri" w:cs="Calibri"/>
-              </w:rPr>
-              <w:t xml:space="preserve">63.00 </w:t>
-            </w:r>
-          </w:p>
-        </w:tc>
-      </w:tr>
-      <w:tr>
-        <w:trPr>
-          <w:trHeight w:val="300"/>
-          <w:jc w:val="center"/>
-        </w:trPr>
-        <w:tc>
-          <w:tcPr>
-            <w:tcBorders>
-              <w:top w:val="single" w:sz="6" w:space="0" w:color="CCCCCC"/>
-              <w:left w:val="single" w:sz="6" w:space="0" w:color="000000"/>
-              <w:bottom w:val="single" w:sz="6" w:space="0" w:color="000000"/>
-              <w:right w:val="single" w:sz="6" w:space="0" w:color="000000"/>
-            </w:tcBorders>
-            <w:tcMar>
-              <w:top w:w="0" w:type="dxa"/>
-              <w:left w:w="45" w:type="dxa"/>
-              <w:bottom w:w="0" w:type="dxa"/>
-              <w:right w:w="45" w:type="dxa"/>
-            </w:tcMar>
-            <w:vAlign w:val="center"/>
-            <w:hideMark/>
-            <w:tcW w:w="8390" w:type="dxa"/>
-          </w:tcPr>
-          <w:p>
-            <w:r>
-              <w:rPr>
-                <w:rFonts w:ascii="Calibri" w:hAnsi="Calibri" w:cs="Calibri"/>
-              </w:rPr>
-              <w:t xml:space="preserve">Fuel Saving (Nm3/Ton ) </w:t>
-            </w:r>
-          </w:p>
-        </w:tc>
-        <w:tc>
-          <w:tcPr>
-            <w:tcBorders>
-              <w:top w:val="single" w:sz="6" w:space="0" w:color="CCCCCC"/>
-              <w:left w:val="single" w:sz="6" w:space="0" w:color="CCCCCC"/>
-              <w:bottom w:val="single" w:sz="6" w:space="0" w:color="000000"/>
-              <w:right w:val="single" w:sz="6" w:space="0" w:color="000000"/>
-            </w:tcBorders>
-            <w:tcMar>
-              <w:top w:w="0" w:type="dxa"/>
-              <w:left w:w="45" w:type="dxa"/>
-              <w:bottom w:w="0" w:type="dxa"/>
-              <w:right w:w="45" w:type="dxa"/>
-            </w:tcMar>
-            <w:vAlign w:val="center"/>
-            <w:hideMark/>
-            <w:tcW w:w="1350" w:type="dxa"/>
-          </w:tcPr>
-          <w:p>
-            <w:pPr>
-              <w:jc w:val="right"/>
-            </w:pPr>
-            <w:r>
-              <w:rPr>
-                <w:rFonts w:ascii="Calibri" w:hAnsi="Calibri" w:cs="Calibri"/>
-              </w:rPr>
-              <w:t xml:space="preserve">27.00 </w:t>
-            </w:r>
-          </w:p>
-        </w:tc>
-      </w:tr>
-      <w:tr>
-        <w:trPr>
-          <w:trHeight w:val="300"/>
-          <w:jc w:val="center"/>
-        </w:trPr>
-        <w:tc>
-          <w:tcPr>
-            <w:tcBorders>
-              <w:top w:val="single" w:sz="6" w:space="0" w:color="CCCCCC"/>
-              <w:left w:val="single" w:sz="6" w:space="0" w:color="000000"/>
-              <w:bottom w:val="single" w:sz="6" w:space="0" w:color="000000"/>
-              <w:right w:val="single" w:sz="6" w:space="0" w:color="000000"/>
-            </w:tcBorders>
-            <w:tcMar>
-              <w:top w:w="0" w:type="dxa"/>
-              <w:left w:w="45" w:type="dxa"/>
-              <w:bottom w:w="0" w:type="dxa"/>
-              <w:right w:w="45" w:type="dxa"/>
-            </w:tcMar>
-            <w:vAlign w:val="center"/>
-            <w:hideMark/>
-            <w:tcW w:w="8390" w:type="dxa"/>
-          </w:tcPr>
-          <w:p>
-            <w:r>
-              <w:rPr>
-                <w:rFonts w:ascii="Calibri" w:hAnsi="Calibri" w:cs="Calibri"/>
-              </w:rPr>
-              <w:t xml:space="preserve">Average Cost of Natural Gas (INR/Nm3) </w:t>
-            </w:r>
-          </w:p>
-        </w:tc>
-        <w:tc>
-          <w:tcPr>
-            <w:tcBorders>
-              <w:top w:val="single" w:sz="6" w:space="0" w:color="CCCCCC"/>
-              <w:left w:val="single" w:sz="6" w:space="0" w:color="CCCCCC"/>
-              <w:bottom w:val="single" w:sz="6" w:space="0" w:color="000000"/>
-              <w:right w:val="single" w:sz="6" w:space="0" w:color="000000"/>
-            </w:tcBorders>
-            <w:tcMar>
-              <w:top w:w="0" w:type="dxa"/>
-              <w:left w:w="45" w:type="dxa"/>
-              <w:bottom w:w="0" w:type="dxa"/>
-              <w:right w:w="45" w:type="dxa"/>
-            </w:tcMar>
-            <w:vAlign w:val="center"/>
-            <w:hideMark/>
-            <w:tcW w:w="1350" w:type="dxa"/>
-          </w:tcPr>
-          <w:p>
-            <w:pPr>
-              <w:jc w:val="right"/>
-            </w:pPr>
-            <w:r>
-              <w:rPr>
-                <w:rFonts w:ascii="Calibri" w:hAnsi="Calibri" w:cs="Calibri"/>
-              </w:rPr>
-              <w:t xml:space="preserve">50.00 </w:t>
-            </w:r>
-          </w:p>
-        </w:tc>
-      </w:tr>
-      <w:tr>
-        <w:trPr>
-          <w:trHeight w:val="300"/>
-          <w:jc w:val="center"/>
-        </w:trPr>
-        <w:tc>
-          <w:tcPr>
-            <w:tcBorders>
-              <w:top w:val="single" w:sz="6" w:space="0" w:color="CCCCCC"/>
-              <w:left w:val="single" w:sz="6" w:space="0" w:color="000000"/>
-              <w:bottom w:val="single" w:sz="6" w:space="0" w:color="000000"/>
-              <w:right w:val="single" w:sz="6" w:space="0" w:color="000000"/>
-            </w:tcBorders>
-            <w:tcMar>
-              <w:top w:w="0" w:type="dxa"/>
-              <w:left w:w="45" w:type="dxa"/>
-              <w:bottom w:w="0" w:type="dxa"/>
-              <w:right w:w="45" w:type="dxa"/>
-            </w:tcMar>
-            <w:vAlign w:val="center"/>
-            <w:hideMark/>
-            <w:tcW w:w="8390" w:type="dxa"/>
-          </w:tcPr>
-          <w:p>
-            <w:r>
-              <w:rPr>
-                <w:rFonts w:ascii="Calibri" w:hAnsi="Calibri" w:cs="Calibri"/>
-              </w:rPr>
-              <w:t>Cost of Electricity (</w:t>
-            </w:r>
-            <w:proofErr w:type="spellStart"/>
-            <w:r>
-              <w:rPr>
-                <w:rFonts w:ascii="Calibri" w:hAnsi="Calibri" w:cs="Calibri"/>
-              </w:rPr>
-              <w:t>Rs</w:t>
-            </w:r>
-            <w:proofErr w:type="spellEnd"/>
-            <w:r>
-              <w:rPr>
-                <w:rFonts w:ascii="Calibri" w:hAnsi="Calibri" w:cs="Calibri"/>
-              </w:rPr>
-              <w:t xml:space="preserve">/Kw) </w:t>
-            </w:r>
-          </w:p>
-        </w:tc>
-        <w:tc>
-          <w:tcPr>
-            <w:tcBorders>
-              <w:top w:val="single" w:sz="6" w:space="0" w:color="CCCCCC"/>
-              <w:left w:val="single" w:sz="6" w:space="0" w:color="CCCCCC"/>
-              <w:bottom w:val="single" w:sz="6" w:space="0" w:color="000000"/>
-              <w:right w:val="single" w:sz="6" w:space="0" w:color="000000"/>
-            </w:tcBorders>
-            <w:tcMar>
-              <w:top w:w="0" w:type="dxa"/>
-              <w:left w:w="45" w:type="dxa"/>
-              <w:bottom w:w="0" w:type="dxa"/>
-              <w:right w:w="45" w:type="dxa"/>
-            </w:tcMar>
-            <w:vAlign w:val="center"/>
-            <w:hideMark/>
-            <w:tcW w:w="1350" w:type="dxa"/>
-          </w:tcPr>
-          <w:p>
-            <w:pPr>
-              <w:jc w:val="right"/>
-            </w:pPr>
-            <w:r>
-              <w:rPr>
-                <w:rFonts w:ascii="Calibri" w:hAnsi="Calibri" w:cs="Calibri"/>
-              </w:rPr>
-              <w:t xml:space="preserve">8.00 </w:t>
-            </w:r>
-          </w:p>
-        </w:tc>
-      </w:tr>
-      <w:tr>
-        <w:trPr>
-          <w:trHeight w:val="300"/>
-          <w:jc w:val="center"/>
-        </w:trPr>
-        <w:tc>
-          <w:tcPr>
-            <w:tcBorders>
-              <w:top w:val="single" w:sz="6" w:space="0" w:color="CCCCCC"/>
-              <w:left w:val="single" w:sz="6" w:space="0" w:color="000000"/>
-              <w:bottom w:val="single" w:sz="6" w:space="0" w:color="000000"/>
-              <w:right w:val="single" w:sz="6" w:space="0" w:color="000000"/>
-            </w:tcBorders>
-            <w:tcMar>
-              <w:top w:w="0" w:type="dxa"/>
-              <w:left w:w="45" w:type="dxa"/>
-              <w:bottom w:w="0" w:type="dxa"/>
-              <w:right w:w="45" w:type="dxa"/>
-            </w:tcMar>
-            <w:vAlign w:val="center"/>
-            <w:hideMark/>
-            <w:tcW w:w="8390" w:type="dxa"/>
-          </w:tcPr>
-          <w:p>
-            <w:r>
-              <w:rPr>
-                <w:rFonts w:ascii="Calibri" w:hAnsi="Calibri" w:cs="Calibri"/>
-              </w:rPr>
-              <w:t xml:space="preserve">Working Days </w:t>
-            </w:r>
-          </w:p>
-        </w:tc>
-        <w:tc>
-          <w:tcPr>
-            <w:tcBorders>
-              <w:top w:val="single" w:sz="6" w:space="0" w:color="CCCCCC"/>
-              <w:left w:val="single" w:sz="6" w:space="0" w:color="CCCCCC"/>
-              <w:bottom w:val="single" w:sz="6" w:space="0" w:color="000000"/>
-              <w:right w:val="single" w:sz="6" w:space="0" w:color="000000"/>
-            </w:tcBorders>
-            <w:tcMar>
-              <w:top w:w="0" w:type="dxa"/>
-              <w:left w:w="45" w:type="dxa"/>
-              <w:bottom w:w="0" w:type="dxa"/>
-              <w:right w:w="45" w:type="dxa"/>
-            </w:tcMar>
-            <w:vAlign w:val="center"/>
-            <w:hideMark/>
-            <w:tcW w:w="1350" w:type="dxa"/>
-          </w:tcPr>
-          <w:p>
-            <w:pPr>
-              <w:jc w:val="right"/>
-            </w:pPr>
-            <w:r>
-              <w:rPr>
-                <w:rFonts w:ascii="Calibri" w:hAnsi="Calibri" w:cs="Calibri"/>
-              </w:rPr>
-              <w:t xml:space="preserve">330.00 </w:t>
-            </w:r>
-          </w:p>
-        </w:tc>
-      </w:tr>
-      <w:tr>
-        <w:trPr>
-          <w:trHeight w:val="300"/>
-          <w:jc w:val="center"/>
-        </w:trPr>
-        <w:tc>
-          <w:tcPr>
-            <w:tcBorders>
-              <w:top w:val="single" w:sz="6" w:space="0" w:color="CCCCCC"/>
-              <w:left w:val="single" w:sz="6" w:space="0" w:color="000000"/>
-              <w:bottom w:val="single" w:sz="6" w:space="0" w:color="000000"/>
-              <w:right w:val="single" w:sz="6" w:space="0" w:color="000000"/>
-            </w:tcBorders>
-            <w:tcMar>
-              <w:top w:w="0" w:type="dxa"/>
-              <w:left w:w="45" w:type="dxa"/>
-              <w:bottom w:w="0" w:type="dxa"/>
-              <w:right w:w="45" w:type="dxa"/>
-            </w:tcMar>
-            <w:vAlign w:val="center"/>
-            <w:hideMark/>
-            <w:tcW w:w="8390" w:type="dxa"/>
-          </w:tcPr>
-          <w:p>
-            <w:r>
-              <w:rPr>
-                <w:rFonts w:ascii="Calibri" w:hAnsi="Calibri" w:cs="Calibri"/>
-              </w:rPr>
-              <w:t xml:space="preserve">Working Hours </w:t>
-            </w:r>
-          </w:p>
-        </w:tc>
-        <w:tc>
-          <w:tcPr>
-            <w:tcBorders>
-              <w:top w:val="single" w:sz="6" w:space="0" w:color="CCCCCC"/>
-              <w:left w:val="single" w:sz="6" w:space="0" w:color="CCCCCC"/>
-              <w:bottom w:val="single" w:sz="6" w:space="0" w:color="000000"/>
-              <w:right w:val="single" w:sz="6" w:space="0" w:color="000000"/>
-            </w:tcBorders>
-            <w:tcMar>
-              <w:top w:w="0" w:type="dxa"/>
-              <w:left w:w="45" w:type="dxa"/>
-              <w:bottom w:w="0" w:type="dxa"/>
-              <w:right w:w="45" w:type="dxa"/>
-            </w:tcMar>
-            <w:vAlign w:val="center"/>
-            <w:hideMark/>
-            <w:tcW w:w="1350" w:type="dxa"/>
-          </w:tcPr>
-          <w:p>
-            <w:pPr>
-              <w:jc w:val="right"/>
-            </w:pPr>
-            <w:r>
-              <w:rPr>
-                <w:rFonts w:ascii="Calibri" w:hAnsi="Calibri" w:cs="Calibri"/>
-              </w:rPr>
-              <w:t xml:space="preserve">16.00 </w:t>
-            </w:r>
-          </w:p>
-        </w:tc>
-      </w:tr>
-      <w:tr>
-        <w:trPr>
-          <w:trHeight w:val="300"/>
-          <w:jc w:val="center"/>
-        </w:trPr>
-        <w:tc>
-          <w:tcPr>
-            <w:gridSpan w:val="2"/>
-            <w:tcBorders>
-              <w:top w:val="single" w:sz="6" w:space="0" w:color="CCCCCC"/>
-              <w:left w:val="single" w:sz="6" w:space="0" w:color="000000"/>
-              <w:bottom w:val="single" w:sz="6" w:space="0" w:color="000000"/>
-              <w:right w:val="single" w:sz="6" w:space="0" w:color="000000"/>
-            </w:tcBorders>
-            <w:tcMar>
-              <w:top w:w="0" w:type="dxa"/>
-              <w:left w:w="45" w:type="dxa"/>
-              <w:bottom w:w="0" w:type="dxa"/>
-              <w:right w:w="45" w:type="dxa"/>
-            </w:tcMar>
-            <w:vAlign w:val="center"/>
-            <w:hideMark/>
-            <w:tcW w:w="9740" w:type="dxa"/>
-          </w:tcPr>
-          <w:p>
-            <w:pPr>
-              <w:jc w:val="left"/>
-            </w:pPr>
-            <w:r>
-              <w:rPr>
-                <w:rFonts w:ascii="Calibri" w:hAnsi="Calibri" w:cs="Calibri"/>
-              </w:rPr>
-              <w:t>Retrofit Cost</w:t>
-            </w:r>
-          </w:p>
-        </w:tc>
-      </w:tr>
-      <w:tr>
-        <w:trPr>
-          <w:trHeight w:val="300"/>
-          <w:jc w:val="center"/>
-        </w:trPr>
-        <w:tc>
-          <w:tcPr>
-            <w:tcBorders>
-              <w:top w:val="single" w:sz="6" w:space="0" w:color="CCCCCC"/>
-              <w:left w:val="single" w:sz="6" w:space="0" w:color="000000"/>
-              <w:bottom w:val="single" w:sz="6" w:space="0" w:color="000000"/>
-              <w:right w:val="single" w:sz="6" w:space="0" w:color="000000"/>
-            </w:tcBorders>
-            <w:tcMar>
-              <w:top w:w="0" w:type="dxa"/>
-              <w:left w:w="45" w:type="dxa"/>
-              <w:bottom w:w="0" w:type="dxa"/>
-              <w:right w:w="45" w:type="dxa"/>
-            </w:tcMar>
-            <w:vAlign w:val="center"/>
-            <w:hideMark/>
-            <w:tcW w:w="8390" w:type="dxa"/>
-          </w:tcPr>
-          <w:p>
-            <w:r>
-              <w:rPr>
-                <w:rFonts w:ascii="Calibri" w:hAnsi="Calibri" w:cs="Calibri"/>
-              </w:rPr>
-              <w:t>Cost of Regenerative Burner System</w:t>
-            </w:r>
-            <w:proofErr w:type="spellStart"/>
-            <w:r/>
-            <w:proofErr w:type="spellEnd"/>
-            <w:r>
-              <w:rPr>
-                <w:rFonts w:ascii="Calibri" w:hAnsi="Calibri" w:cs="Calibri"/>
-              </w:rPr>
-              <w:t xml:space="preserve"> </w:t>
-            </w:r>
-          </w:p>
-        </w:tc>
-        <w:tc>
-          <w:tcPr>
-            <w:tcBorders>
-              <w:top w:val="single" w:sz="6" w:space="0" w:color="CCCCCC"/>
-              <w:left w:val="single" w:sz="6" w:space="0" w:color="CCCCCC"/>
-              <w:bottom w:val="single" w:sz="6" w:space="0" w:color="000000"/>
-              <w:right w:val="single" w:sz="6" w:space="0" w:color="000000"/>
-            </w:tcBorders>
-            <w:tcMar>
-              <w:top w:w="0" w:type="dxa"/>
-              <w:left w:w="45" w:type="dxa"/>
-              <w:bottom w:w="0" w:type="dxa"/>
-              <w:right w:w="45" w:type="dxa"/>
-            </w:tcMar>
-            <w:vAlign w:val="bottom"/>
-            <w:hideMark/>
-            <w:tcW w:w="1350" w:type="dxa"/>
-          </w:tcPr>
-          <w:p>
-            <w:pPr>
-              <w:jc w:val="center"/>
-            </w:pPr>
-            <w:r>
-              <w:rPr>
-                <w:rFonts w:ascii="Calibri" w:hAnsi="Calibri" w:cs="Calibri"/>
-              </w:rPr>
-              <w:t xml:space="preserve">5,100,000.00 </w:t>
-            </w:r>
-          </w:p>
-        </w:tc>
-      </w:tr>
-      <w:tr>
-        <w:trPr>
-          <w:trHeight w:val="300"/>
-          <w:jc w:val="center"/>
-        </w:trPr>
-        <w:tc>
-          <w:tcPr>
-            <w:gridSpan w:val="2"/>
-            <w:tcBorders>
-              <w:top w:val="single" w:sz="6" w:space="0" w:color="CCCCCC"/>
-              <w:left w:val="single" w:sz="6" w:space="0" w:color="000000"/>
-              <w:bottom w:val="single" w:sz="6" w:space="0" w:color="000000"/>
-              <w:right w:val="single" w:sz="6" w:space="0" w:color="000000"/>
-            </w:tcBorders>
-            <w:tcMar>
-              <w:top w:w="0" w:type="dxa"/>
-              <w:left w:w="45" w:type="dxa"/>
-              <w:bottom w:w="0" w:type="dxa"/>
-              <w:right w:w="45" w:type="dxa"/>
-            </w:tcMar>
-            <w:vAlign w:val="center"/>
-            <w:hideMark/>
-            <w:tcW w:w="9740" w:type="dxa"/>
-          </w:tcPr>
-          <w:p>
-            <w:pPr>
-              <w:jc w:val="left"/>
-            </w:pPr>
-            <w:r>
-              <w:rPr>
-                <w:rFonts w:ascii="Calibri" w:hAnsi="Calibri" w:cs="Calibri"/>
-              </w:rPr>
-              <w:t>Saving</w:t>
-            </w:r>
-          </w:p>
-        </w:tc>
-      </w:tr>
-      <w:tr>
-        <w:trPr>
-          <w:trHeight w:val="300"/>
-          <w:jc w:val="center"/>
-        </w:trPr>
-        <w:tc>
-          <w:tcPr>
-            <w:tcBorders>
-              <w:top w:val="single" w:sz="6" w:space="0" w:color="CCCCCC"/>
-              <w:left w:val="single" w:sz="6" w:space="0" w:color="000000"/>
-              <w:bottom w:val="single" w:sz="6" w:space="0" w:color="000000"/>
-              <w:right w:val="single" w:sz="6" w:space="0" w:color="000000"/>
-            </w:tcBorders>
-            <w:tcMar>
-              <w:top w:w="0" w:type="dxa"/>
-              <w:left w:w="45" w:type="dxa"/>
-              <w:bottom w:w="0" w:type="dxa"/>
-              <w:right w:w="45" w:type="dxa"/>
-            </w:tcMar>
-            <w:vAlign w:val="center"/>
-            <w:hideMark/>
-            <w:tcW w:w="8390" w:type="dxa"/>
-          </w:tcPr>
-          <w:p>
-            <w:r>
-              <w:rPr>
-                <w:rFonts w:ascii="Calibri" w:hAnsi="Calibri" w:cs="Calibri"/>
-              </w:rPr>
-              <w:t xml:space="preserve">Savings in Fuel Cost per year (considering 330 days and 16 </w:t>
-            </w:r>
-            <w:proofErr w:type="spellStart"/>
-            <w:r>
-              <w:rPr>
-                <w:rFonts w:ascii="Calibri" w:hAnsi="Calibri" w:cs="Calibri"/>
-              </w:rPr>
-              <w:t>hrs</w:t>
-            </w:r>
-            <w:proofErr w:type="spellEnd"/>
-            <w:r>
-              <w:rPr>
-                <w:rFonts w:ascii="Calibri" w:hAnsi="Calibri" w:cs="Calibri"/>
-              </w:rPr>
-              <w:t xml:space="preserve"> of working) </w:t>
-            </w:r>
-          </w:p>
-        </w:tc>
-        <w:tc>
-          <w:tcPr>
-            <w:tcBorders>
-              <w:top w:val="single" w:sz="6" w:space="0" w:color="CCCCCC"/>
-              <w:left w:val="single" w:sz="6" w:space="0" w:color="CCCCCC"/>
-              <w:bottom w:val="single" w:sz="6" w:space="0" w:color="000000"/>
-              <w:right w:val="single" w:sz="6" w:space="0" w:color="000000"/>
-            </w:tcBorders>
-            <w:tcMar>
-              <w:top w:w="0" w:type="dxa"/>
-              <w:left w:w="45" w:type="dxa"/>
-              <w:bottom w:w="0" w:type="dxa"/>
-              <w:right w:w="45" w:type="dxa"/>
-            </w:tcMar>
-            <w:vAlign w:val="center"/>
-            <w:hideMark/>
-            <w:tcW w:w="1350" w:type="dxa"/>
-          </w:tcPr>
-          <w:p>
-            <w:pPr>
-              <w:jc w:val="right"/>
-            </w:pPr>
-            <w:r>
-              <w:rPr>
-                <w:rFonts w:ascii="Calibri" w:hAnsi="Calibri" w:cs="Calibri"/>
-              </w:rPr>
-              <w:t xml:space="preserve">7,128,000.00 </w:t>
-            </w:r>
-          </w:p>
-        </w:tc>
-      </w:tr>
-      <w:tr>
-        <w:trPr>
-          <w:trHeight w:val="300"/>
-          <w:jc w:val="center"/>
-        </w:trPr>
-        <w:tc>
-          <w:tcPr>
-            <w:tcBorders>
-              <w:top w:val="single" w:sz="6" w:space="0" w:color="CCCCCC"/>
-              <w:left w:val="single" w:sz="6" w:space="0" w:color="000000"/>
-              <w:bottom w:val="single" w:sz="6" w:space="0" w:color="000000"/>
-              <w:right w:val="single" w:sz="6" w:space="0" w:color="000000"/>
-            </w:tcBorders>
-            <w:tcMar>
-              <w:top w:w="0" w:type="dxa"/>
-              <w:left w:w="45" w:type="dxa"/>
-              <w:bottom w:w="0" w:type="dxa"/>
-              <w:right w:w="45" w:type="dxa"/>
-            </w:tcMar>
-            <w:vAlign w:val="center"/>
-            <w:hideMark/>
-            <w:tcW w:w="8390" w:type="dxa"/>
-          </w:tcPr>
-          <w:p>
-            <w:r>
-              <w:rPr>
-                <w:rFonts w:ascii="Calibri" w:hAnsi="Calibri" w:cs="Calibri"/>
-              </w:rPr>
-              <w:t xml:space="preserve">Total Saving </w:t>
-            </w:r>
-          </w:p>
-        </w:tc>
-        <w:tc>
-          <w:tcPr>
-            <w:tcBorders>
-              <w:top w:val="single" w:sz="6" w:space="0" w:color="CCCCCC"/>
-              <w:left w:val="single" w:sz="6" w:space="0" w:color="CCCCCC"/>
-              <w:bottom w:val="single" w:sz="6" w:space="0" w:color="000000"/>
-              <w:right w:val="single" w:sz="6" w:space="0" w:color="000000"/>
-            </w:tcBorders>
-            <w:tcMar>
-              <w:top w:w="0" w:type="dxa"/>
-              <w:left w:w="45" w:type="dxa"/>
-              <w:bottom w:w="0" w:type="dxa"/>
-              <w:right w:w="45" w:type="dxa"/>
-            </w:tcMar>
-            <w:vAlign w:val="center"/>
-            <w:hideMark/>
-            <w:tcW w:w="1350" w:type="dxa"/>
-          </w:tcPr>
-          <w:p>
-            <w:pPr>
-              <w:jc w:val="right"/>
-            </w:pPr>
-            <w:r>
-              <w:rPr>
-                <w:rFonts w:ascii="Calibri" w:hAnsi="Calibri" w:cs="Calibri"/>
-              </w:rPr>
-              <w:t xml:space="preserve">7,128,000.00 </w:t>
-            </w:r>
-          </w:p>
-        </w:tc>
-      </w:tr>
-      <w:tr>
-        <w:trPr>
-          <w:trHeight w:val="300"/>
-          <w:jc w:val="center"/>
-        </w:trPr>
-        <w:tc>
-          <w:tcPr>
-            <w:gridSpan w:val="2"/>
-            <w:tcBorders>
-              <w:top w:val="single" w:sz="6" w:space="0" w:color="CCCCCC"/>
-              <w:left w:val="single" w:sz="6" w:space="0" w:color="000000"/>
-              <w:bottom w:val="single" w:sz="6" w:space="0" w:color="000000"/>
-              <w:right w:val="single" w:sz="6" w:space="0" w:color="000000"/>
-            </w:tcBorders>
-            <w:tcMar>
-              <w:top w:w="0" w:type="dxa"/>
-              <w:left w:w="45" w:type="dxa"/>
-              <w:bottom w:w="0" w:type="dxa"/>
-              <w:right w:w="45" w:type="dxa"/>
-            </w:tcMar>
-            <w:vAlign w:val="center"/>
-            <w:hideMark/>
-            <w:tcW w:w="9740" w:type="dxa"/>
-          </w:tcPr>
-          <w:p>
-            <w:pPr>
-              <w:jc w:val="left"/>
-            </w:pPr>
-            <w:r>
-              <w:rPr>
-                <w:rFonts w:ascii="Calibri" w:hAnsi="Calibri" w:cs="Calibri"/>
-              </w:rPr>
-              <w:t>Extra Costs</w:t>
-            </w:r>
-          </w:p>
-        </w:tc>
-      </w:tr>
-      <w:tr>
-        <w:trPr>
-          <w:trHeight w:val="300"/>
-          <w:jc w:val="center"/>
-        </w:trPr>
-        <w:tc>
-          <w:tcPr>
-            <w:tcBorders>
-              <w:top w:val="single" w:sz="6" w:space="0" w:color="CCCCCC"/>
-              <w:left w:val="single" w:sz="6" w:space="0" w:color="000000"/>
-              <w:bottom w:val="single" w:sz="6" w:space="0" w:color="000000"/>
-              <w:right w:val="single" w:sz="6" w:space="0" w:color="000000"/>
-            </w:tcBorders>
-            <w:tcMar>
-              <w:top w:w="0" w:type="dxa"/>
-              <w:left w:w="45" w:type="dxa"/>
-              <w:bottom w:w="0" w:type="dxa"/>
-              <w:right w:w="45" w:type="dxa"/>
-            </w:tcMar>
-            <w:vAlign w:val="center"/>
-            <w:hideMark/>
-            <w:tcW w:w="8390" w:type="dxa"/>
-          </w:tcPr>
-          <w:p>
-            <w:r>
-              <w:rPr>
-                <w:rFonts w:ascii="Calibri" w:hAnsi="Calibri" w:cs="Calibri"/>
-              </w:rPr>
-              <w:t>Electricity - Blower</w:t>
-            </w:r>
-          </w:p>
-        </w:tc>
-        <w:tc>
-          <w:tcPr>
-            <w:tcBorders>
-              <w:top w:val="single" w:sz="6" w:space="0" w:color="CCCCCC"/>
-              <w:left w:val="single" w:sz="6" w:space="0" w:color="CCCCCC"/>
-              <w:bottom w:val="single" w:sz="6" w:space="0" w:color="000000"/>
-              <w:right w:val="single" w:sz="6" w:space="0" w:color="000000"/>
-            </w:tcBorders>
-            <w:tcMar>
-              <w:top w:w="0" w:type="dxa"/>
-              <w:left w:w="45" w:type="dxa"/>
-              <w:bottom w:w="0" w:type="dxa"/>
-              <w:right w:w="45" w:type="dxa"/>
-            </w:tcMar>
-            <w:vAlign w:val="center"/>
-            <w:hideMark/>
-            <w:tcW w:w="1350" w:type="dxa"/>
-          </w:tcPr>
-          <w:p>
-            <w:pPr>
-              <w:jc w:val="right"/>
-            </w:pPr>
-            <w:r>
-              <w:rPr>
-                <w:rFonts w:ascii="Calibri" w:hAnsi="Calibri" w:cs="Calibri"/>
-              </w:rPr>
-              <w:t xml:space="preserve">236,016.00 </w:t>
-            </w:r>
-          </w:p>
-        </w:tc>
-      </w:tr>
-      <w:tr>
-        <w:trPr>
-          <w:trHeight w:val="300"/>
-          <w:jc w:val="center"/>
-        </w:trPr>
-        <w:tc>
-          <w:tcPr>
-            <w:tcBorders>
-              <w:top w:val="single" w:sz="6" w:space="0" w:color="CCCCCC"/>
-              <w:left w:val="single" w:sz="6" w:space="0" w:color="000000"/>
-              <w:bottom w:val="single" w:sz="6" w:space="0" w:color="000000"/>
-              <w:right w:val="single" w:sz="6" w:space="0" w:color="000000"/>
-            </w:tcBorders>
-            <w:tcMar>
-              <w:top w:w="0" w:type="dxa"/>
-              <w:left w:w="45" w:type="dxa"/>
-              <w:bottom w:w="0" w:type="dxa"/>
-              <w:right w:w="45" w:type="dxa"/>
-            </w:tcMar>
-            <w:vAlign w:val="center"/>
-            <w:hideMark/>
-            <w:tcW w:w="8390" w:type="dxa"/>
-          </w:tcPr>
-          <w:p>
-            <w:proofErr w:type="spellStart"/>
-            <w:r>
-              <w:rPr>
-                <w:rFonts w:ascii="Calibri" w:hAnsi="Calibri" w:cs="Calibri"/>
-              </w:rPr>
-              <w:t>Maintenance Cost</w:t>
-            </w:r>
-            <w:proofErr w:type="spellEnd"/>
-            <w:r/>
-          </w:p>
-        </w:tc>
-        <w:tc>
-          <w:tcPr>
-            <w:tcBorders>
-              <w:top w:val="single" w:sz="6" w:space="0" w:color="CCCCCC"/>
-              <w:left w:val="single" w:sz="6" w:space="0" w:color="CCCCCC"/>
-              <w:bottom w:val="single" w:sz="6" w:space="0" w:color="000000"/>
-              <w:right w:val="single" w:sz="6" w:space="0" w:color="000000"/>
-            </w:tcBorders>
-            <w:tcMar>
-              <w:top w:w="0" w:type="dxa"/>
-              <w:left w:w="45" w:type="dxa"/>
-              <w:bottom w:w="0" w:type="dxa"/>
-              <w:right w:w="45" w:type="dxa"/>
-            </w:tcMar>
-            <w:vAlign w:val="center"/>
-            <w:hideMark/>
-            <w:tcW w:w="1350" w:type="dxa"/>
-          </w:tcPr>
-          <w:p>
-            <w:pPr>
-              <w:jc w:val="right"/>
-            </w:pPr>
-            <w:r>
-              <w:rPr>
-                <w:rFonts w:ascii="Calibri" w:hAnsi="Calibri" w:cs="Calibri"/>
-              </w:rPr>
-              <w:t xml:space="preserve">51,000.00 </w:t>
-            </w:r>
-          </w:p>
-        </w:tc>
-      </w:tr>
-      <w:tr>
-        <w:trPr>
-          <w:trHeight w:val="300"/>
-          <w:jc w:val="center"/>
-        </w:trPr>
-        <w:tc>
-          <w:tcPr>
-            <w:tcBorders>
-              <w:top w:val="single" w:sz="6" w:space="0" w:color="CCCCCC"/>
-              <w:left w:val="single" w:sz="6" w:space="0" w:color="000000"/>
-              <w:bottom w:val="single" w:sz="6" w:space="0" w:color="000000"/>
-              <w:right w:val="single" w:sz="6" w:space="0" w:color="000000"/>
-            </w:tcBorders>
-            <w:tcMar>
-              <w:top w:w="0" w:type="dxa"/>
-              <w:left w:w="45" w:type="dxa"/>
-              <w:bottom w:w="0" w:type="dxa"/>
-              <w:right w:w="45" w:type="dxa"/>
-            </w:tcMar>
-            <w:vAlign w:val="center"/>
-            <w:hideMark/>
-            <w:tcW w:w="8390" w:type="dxa"/>
-          </w:tcPr>
-          <w:p>
-            <w:r>
-              <w:rPr>
-                <w:rFonts w:ascii="Calibri" w:hAnsi="Calibri" w:cs="Calibri"/>
-              </w:rPr>
-              <w:t>Spare Cost</w:t>
-            </w:r>
-          </w:p>
-        </w:tc>
-        <w:tc>
-          <w:tcPr>
-            <w:tcBorders>
-              <w:top w:val="single" w:sz="6" w:space="0" w:color="CCCCCC"/>
-              <w:left w:val="single" w:sz="6" w:space="0" w:color="CCCCCC"/>
-              <w:bottom w:val="single" w:sz="6" w:space="0" w:color="000000"/>
-              <w:right w:val="single" w:sz="6" w:space="0" w:color="000000"/>
-            </w:tcBorders>
-            <w:tcMar>
-              <w:top w:w="0" w:type="dxa"/>
-              <w:left w:w="45" w:type="dxa"/>
-              <w:bottom w:w="0" w:type="dxa"/>
-              <w:right w:w="45" w:type="dxa"/>
-            </w:tcMar>
-            <w:vAlign w:val="center"/>
-            <w:hideMark/>
-            <w:tcW w:w="1350" w:type="dxa"/>
-          </w:tcPr>
-          <w:p>
-            <w:pPr>
-              <w:jc w:val="right"/>
-            </w:pPr>
-            <w:r>
-              <w:rPr>
-                <w:rFonts w:ascii="Calibri" w:hAnsi="Calibri" w:cs="Calibri"/>
-              </w:rPr>
-              <w:t xml:space="preserve">102,000.00 </w:t>
-            </w:r>
-          </w:p>
-        </w:tc>
-      </w:tr>
-      <w:tr>
-        <w:trPr>
-          <w:trHeight w:val="300"/>
-          <w:jc w:val="center"/>
-        </w:trPr>
-        <w:tc>
-          <w:tcPr>
-            <w:tcBorders>
-              <w:top w:val="single" w:sz="6" w:space="0" w:color="CCCCCC"/>
-              <w:left w:val="single" w:sz="6" w:space="0" w:color="000000"/>
-              <w:bottom w:val="single" w:sz="6" w:space="0" w:color="000000"/>
-              <w:right w:val="single" w:sz="6" w:space="0" w:color="000000"/>
-            </w:tcBorders>
-            <w:tcMar>
-              <w:top w:w="0" w:type="dxa"/>
-              <w:left w:w="45" w:type="dxa"/>
-              <w:bottom w:w="0" w:type="dxa"/>
-              <w:right w:w="45" w:type="dxa"/>
-            </w:tcMar>
-            <w:vAlign w:val="center"/>
-            <w:hideMark/>
-            <w:tcW w:w="8390" w:type="dxa"/>
-          </w:tcPr>
-          <w:p>
-            <w:proofErr w:type="spellStart"/>
-            <w:r>
-              <w:rPr>
-                <w:rFonts w:ascii="Calibri" w:hAnsi="Calibri" w:cs="Calibri"/>
-              </w:rPr>
-              <w:t>Additional Costs</w:t>
-            </w:r>
-            <w:proofErr w:type="spellEnd"/>
-            <w:r>
-              <w:rPr>
-                <w:rFonts w:ascii="Calibri" w:hAnsi="Calibri" w:cs="Calibri"/>
-              </w:rPr>
-              <w:t xml:space="preserve"> </w:t>
-            </w:r>
-          </w:p>
-        </w:tc>
-        <w:tc>
-          <w:tcPr>
-            <w:tcBorders>
-              <w:top w:val="single" w:sz="6" w:space="0" w:color="CCCCCC"/>
-              <w:left w:val="single" w:sz="6" w:space="0" w:color="CCCCCC"/>
-              <w:bottom w:val="single" w:sz="6" w:space="0" w:color="000000"/>
-              <w:right w:val="single" w:sz="6" w:space="0" w:color="000000"/>
-            </w:tcBorders>
-            <w:tcMar>
-              <w:top w:w="0" w:type="dxa"/>
-              <w:left w:w="45" w:type="dxa"/>
-              <w:bottom w:w="0" w:type="dxa"/>
-              <w:right w:w="45" w:type="dxa"/>
-            </w:tcMar>
-            <w:vAlign w:val="center"/>
-            <w:hideMark/>
-            <w:tcW w:w="1350" w:type="dxa"/>
-          </w:tcPr>
-          <w:p>
-            <w:pPr>
-              <w:jc w:val="right"/>
-            </w:pPr>
-            <w:r>
-              <w:rPr>
-                <w:rFonts w:ascii="Calibri" w:hAnsi="Calibri" w:cs="Calibri"/>
-              </w:rPr>
-              <w:t xml:space="preserve">389,016.00 </w:t>
-            </w:r>
-          </w:p>
-        </w:tc>
-      </w:tr>
-      <w:tr>
-        <w:trPr>
-          <w:trHeight w:val="300"/>
-          <w:jc w:val="center"/>
-        </w:trPr>
-        <w:tc>
-          <w:tcPr>
-            <w:tcBorders>
-              <w:top w:val="single" w:sz="6" w:space="0" w:color="CCCCCC"/>
-              <w:left w:val="single" w:sz="6" w:space="0" w:color="000000"/>
-              <w:bottom w:val="single" w:sz="6" w:space="0" w:color="000000"/>
-              <w:right w:val="single" w:sz="6" w:space="0" w:color="000000"/>
-            </w:tcBorders>
-            <w:tcMar>
-              <w:top w:w="0" w:type="dxa"/>
-              <w:left w:w="45" w:type="dxa"/>
-              <w:bottom w:w="0" w:type="dxa"/>
-              <w:right w:w="45" w:type="dxa"/>
-            </w:tcMar>
-            <w:vAlign w:val="center"/>
-            <w:hideMark/>
-            <w:tcW w:w="8390" w:type="dxa"/>
-          </w:tcPr>
-          <w:p>
-            <w:r>
-              <w:rPr>
-                <w:rFonts w:ascii="Calibri" w:hAnsi="Calibri" w:cs="Calibri"/>
-              </w:rPr>
-              <w:t>NET SAVINGS PER ANNUM (</w:t>
-            </w:r>
-            <w:proofErr w:type="spellStart"/>
-            <w:r>
-              <w:rPr>
-                <w:rFonts w:ascii="Calibri" w:hAnsi="Calibri" w:cs="Calibri"/>
-              </w:rPr>
-              <w:t>Rs</w:t>
-            </w:r>
-            <w:proofErr w:type="spellEnd"/>
-            <w:r>
-              <w:rPr>
-                <w:rFonts w:ascii="Calibri" w:hAnsi="Calibri" w:cs="Calibri"/>
-              </w:rPr>
-              <w:t xml:space="preserve">.) </w:t>
-            </w:r>
-          </w:p>
-        </w:tc>
-        <w:tc>
-          <w:tcPr>
-            <w:tcBorders>
-              <w:top w:val="single" w:sz="6" w:space="0" w:color="CCCCCC"/>
-              <w:left w:val="single" w:sz="6" w:space="0" w:color="CCCCCC"/>
-              <w:bottom w:val="single" w:sz="6" w:space="0" w:color="000000"/>
-              <w:right w:val="single" w:sz="6" w:space="0" w:color="000000"/>
-            </w:tcBorders>
-            <w:tcMar>
-              <w:top w:w="0" w:type="dxa"/>
-              <w:left w:w="45" w:type="dxa"/>
-              <w:bottom w:w="0" w:type="dxa"/>
-              <w:right w:w="45" w:type="dxa"/>
-            </w:tcMar>
-            <w:vAlign w:val="center"/>
-            <w:hideMark/>
-            <w:tcW w:w="1350" w:type="dxa"/>
-          </w:tcPr>
-          <w:p>
-            <w:pPr>
-              <w:jc w:val="right"/>
-            </w:pPr>
-            <w:r>
-              <w:rPr>
-                <w:rFonts w:ascii="Calibri" w:hAnsi="Calibri" w:cs="Calibri"/>
-              </w:rPr>
-              <w:t xml:space="preserve">6,738,984.00 </w:t>
-            </w:r>
-          </w:p>
-        </w:tc>
-      </w:tr>
-      <w:tr>
-        <w:trPr>
-          <w:trHeight w:val="300"/>
-          <w:jc w:val="center"/>
-        </w:trPr>
-        <w:tc>
-          <w:tcPr>
-            <w:tcBorders>
-              <w:top w:val="single" w:sz="6" w:space="0" w:color="CCCCCC"/>
-              <w:left w:val="single" w:sz="6" w:space="0" w:color="000000"/>
-              <w:bottom w:val="single" w:sz="6" w:space="0" w:color="000000"/>
-              <w:right w:val="single" w:sz="6" w:space="0" w:color="000000"/>
-            </w:tcBorders>
-            <w:tcMar>
-              <w:top w:w="0" w:type="dxa"/>
-              <w:left w:w="45" w:type="dxa"/>
-              <w:bottom w:w="0" w:type="dxa"/>
-              <w:right w:w="45" w:type="dxa"/>
-            </w:tcMar>
-            <w:vAlign w:val="center"/>
-            <w:hideMark/>
-            <w:tcW w:w="8390" w:type="dxa"/>
-          </w:tcPr>
-          <w:p>
-            <w:r>
-              <w:rPr>
-                <w:rFonts w:ascii="Calibri" w:hAnsi="Calibri" w:cs="Calibri"/>
-              </w:rPr>
-              <w:t>NET SAVINGS PER DAY (</w:t>
-            </w:r>
-            <w:proofErr w:type="spellStart"/>
-            <w:r>
-              <w:rPr>
-                <w:rFonts w:ascii="Calibri" w:hAnsi="Calibri" w:cs="Calibri"/>
-              </w:rPr>
-              <w:t>Rs</w:t>
-            </w:r>
-            <w:proofErr w:type="spellEnd"/>
-            <w:r>
-              <w:rPr>
-                <w:rFonts w:ascii="Calibri" w:hAnsi="Calibri" w:cs="Calibri"/>
-              </w:rPr>
-              <w:t xml:space="preserve">.) </w:t>
-            </w:r>
-          </w:p>
-        </w:tc>
-        <w:tc>
-          <w:tcPr>
-            <w:tcBorders>
-              <w:top w:val="single" w:sz="6" w:space="0" w:color="CCCCCC"/>
-              <w:left w:val="single" w:sz="6" w:space="0" w:color="CCCCCC"/>
-              <w:bottom w:val="single" w:sz="6" w:space="0" w:color="000000"/>
-              <w:right w:val="single" w:sz="6" w:space="0" w:color="000000"/>
-            </w:tcBorders>
-            <w:tcMar>
-              <w:top w:w="0" w:type="dxa"/>
-              <w:left w:w="45" w:type="dxa"/>
-              <w:bottom w:w="0" w:type="dxa"/>
-              <w:right w:w="45" w:type="dxa"/>
-            </w:tcMar>
-            <w:vAlign w:val="center"/>
-            <w:hideMark/>
-            <w:tcW w:w="1350" w:type="dxa"/>
-          </w:tcPr>
-          <w:p>
-            <w:pPr>
-              <w:jc w:val="right"/>
-            </w:pPr>
-            <w:r>
-              <w:rPr>
-                <w:rFonts w:ascii="Calibri" w:hAnsi="Calibri" w:cs="Calibri"/>
-              </w:rPr>
-              <w:t xml:space="preserve">20,421.16 </w:t>
-            </w:r>
-          </w:p>
-        </w:tc>
-      </w:tr>
-      <w:tr>
-        <w:trPr>
-          <w:trHeight w:val="300"/>
-          <w:jc w:val="center"/>
-        </w:trPr>
-        <w:tc>
-          <w:tcPr>
-            <w:tcBorders>
-              <w:top w:val="single" w:sz="6" w:space="0" w:color="CCCCCC"/>
-              <w:left w:val="single" w:sz="6" w:space="0" w:color="000000"/>
-              <w:bottom w:val="single" w:sz="6" w:space="0" w:color="000000"/>
-              <w:right w:val="single" w:sz="6" w:space="0" w:color="000000"/>
-            </w:tcBorders>
-            <w:tcMar>
-              <w:top w:w="0" w:type="dxa"/>
-              <w:left w:w="45" w:type="dxa"/>
-              <w:bottom w:w="0" w:type="dxa"/>
-              <w:right w:w="45" w:type="dxa"/>
-            </w:tcMar>
-            <w:vAlign w:val="center"/>
-            <w:hideMark/>
-            <w:tcW w:w="8390" w:type="dxa"/>
-          </w:tcPr>
-          <w:p>
-            <w:r>
-              <w:rPr>
-                <w:rFonts w:ascii="Calibri" w:hAnsi="Calibri" w:cs="Calibri"/>
-              </w:rPr>
-              <w:t>Approx. Pay Back Of Regenerative Burner (DAYS)</w:t>
-            </w:r>
-          </w:p>
-        </w:tc>
-        <w:tc>
-          <w:tcPr>
-            <w:tcBorders>
-              <w:top w:val="single" w:sz="6" w:space="0" w:color="CCCCCC"/>
-              <w:left w:val="single" w:sz="6" w:space="0" w:color="CCCCCC"/>
-              <w:bottom w:val="single" w:sz="6" w:space="0" w:color="000000"/>
-              <w:right w:val="single" w:sz="6" w:space="0" w:color="000000"/>
-            </w:tcBorders>
-            <w:tcMar>
-              <w:top w:w="0" w:type="dxa"/>
-              <w:left w:w="45" w:type="dxa"/>
-              <w:bottom w:w="0" w:type="dxa"/>
-              <w:right w:w="45" w:type="dxa"/>
-            </w:tcMar>
-            <w:vAlign w:val="center"/>
-            <w:hideMark/>
-            <w:tcW w:w="1350" w:type="dxa"/>
-          </w:tcPr>
-          <w:p>
-            <w:pPr>
-              <w:jc w:val="right"/>
-            </w:pPr>
-            <w:r>
-              <w:rPr>
-                <w:rFonts w:ascii="Calibri" w:hAnsi="Calibri" w:cs="Calibri"/>
-              </w:rPr>
-              <w:t xml:space="preserve">250.00 </w:t>
             </w:r>
           </w:p>
         </w:tc>

</xml_diff>

<commit_message>
feat: re-add BILL OF MATERIAL table to offer, showing every BOM item + qty
Added a BILL OF MATERIAL heading + Description|Qty table before EXCLUSIONS,
populated dynamically from build_regen_df via fill_bom_table (called alongside
fill_make_list). Every item shows its exact quantity (now matching the
reference costing sheet).

Co-Authored-By: Claude Opus 4.8 (1M context) <noreply@anthropic.com>
</commit_message>
<xml_diff>
--- a/Regen_Offer_Template.docx
+++ b/Regen_Offer_Template.docx
@@ -4583,6 +4583,93 @@
         <w:br w:type="page"/>
       </w:r>
     </w:p>
+    <w:p>
+      <w:pPr>
+        <w:spacing w:before="280" w:after="80"/>
+        <w:jc w:val="left"/>
+        <w:rPr>
+          <w:b/>
+          <w:bCs/>
+          <w:u w:val="single"/>
+        </w:rPr>
+        <w:pBdr>
+          <w:bottom w:val="single" w:color="E87722" w:sz="12" w:space="4"/>
+        </w:pBdr>
+      </w:pPr>
+      <w:r>
+        <w:rPr>
+          <w:b/>
+          <w:bCs/>
+          <w:spacing w:val="-3"/>
+        </w:rPr>
+        <w:br w:type="page"/>
+      </w:r>
+    </w:p>
+    <w:tbl>
+      <w:tblPr>
+        <w:tblW w:type="auto" w:w="0"/>
+        <w:jc w:val="center"/>
+        <w:tblLook w:firstColumn="1" w:firstRow="1" w:lastColumn="0" w:lastRow="0" w:noHBand="0" w:noVBand="1" w:val="04A0"/>
+        <w:tblW w:w="5000" w:type="pct"/>
+        <w:tblLayout w:type="fixed"/>
+        <w:tblBorders>
+          <w:top w:val="single" w:sz="4" w:space="0" w:color="000000"/>
+          <w:left w:val="single" w:sz="4" w:space="0" w:color="000000"/>
+          <w:bottom w:val="single" w:sz="4" w:space="0" w:color="000000"/>
+          <w:right w:val="single" w:sz="4" w:space="0" w:color="000000"/>
+          <w:insideH w:val="single" w:sz="4" w:space="0" w:color="000000"/>
+          <w:insideV w:val="single" w:sz="4" w:space="0" w:color="000000"/>
+        </w:tblBorders>
+      </w:tblPr>
+      <w:tblGrid>
+        <w:gridCol w:w="7625"/>
+        <w:gridCol w:w="1399"/>
+      </w:tblGrid>
+      <w:tr>
+        <w:tc>
+          <w:tcPr>
+            <w:tcW w:type="dxa" w:w="7625"/>
+            <w:shd w:val="clear" w:color="auto" w:fill="F1F5F9"/>
+            <w:vAlign w:val="center"/>
+          </w:tcPr>
+          <w:p>
+            <w:pPr>
+              <w:spacing w:before="40" w:after="40" w:line="240" w:lineRule="auto"/>
+              <w:jc w:val="left"/>
+            </w:pPr>
+            <w:r>
+              <w:rPr>
+                <w:b/>
+                <w:color w:val="1F2937"/>
+                <w:sz w:val="25"/>
+              </w:rPr>
+              <w:t>Description</w:t>
+            </w:r>
+          </w:p>
+        </w:tc>
+        <w:tc>
+          <w:tcPr>
+            <w:tcW w:type="dxa" w:w="1399"/>
+            <w:shd w:val="clear" w:color="auto" w:fill="F1F5F9"/>
+            <w:vAlign w:val="center"/>
+          </w:tcPr>
+          <w:p>
+            <w:pPr>
+              <w:spacing w:before="40" w:after="40" w:line="240" w:lineRule="auto"/>
+              <w:jc w:val="center"/>
+            </w:pPr>
+            <w:r>
+              <w:rPr>
+                <w:b/>
+                <w:color w:val="1F2937"/>
+                <w:sz w:val="25"/>
+              </w:rPr>
+              <w:t>Qty.</w:t>
+            </w:r>
+          </w:p>
+        </w:tc>
+      </w:tr>
+    </w:tbl>
     <w:p>
       <w:pPr>
         <w:pStyle w:val="NoSpacing"/>

</xml_diff>

<commit_message>
style: fix bullet-point consistency + grammar in regen offer
- Title-case component names (Ball Valve, Gas Filter, Gas Governor, Pressure
  Gauge with Manual Cock, Pressure Regulator).
- Standardize P.L.C -> PLC.
- Grammar: 'entering the burner', 'Transmitter is installed', '1 Damper-type
  Flue Control Valve', removed stray comma in the pressure-sensing sentence.

Co-Authored-By: Claude Opus 4.8 (1M context) <noreply@anthropic.com>
</commit_message>
<xml_diff>
--- a/Regen_Offer_Template.docx
+++ b/Regen_Offer_Template.docx
@@ -2551,7 +2551,7 @@
           <w:sz w:val="24"/>
           <w:szCs w:val="24"/>
         </w:rPr>
-        <w:t>Ball valve</w:t>
+        <w:t>Ball Valve</w:t>
       </w:r>
     </w:p>
     <w:p>
@@ -2605,7 +2605,7 @@
           <w:sz w:val="24"/>
           <w:szCs w:val="24"/>
         </w:rPr>
-        <w:t>Gas filter</w:t>
+        <w:t>Gas Filter</w:t>
       </w:r>
     </w:p>
     <w:p>
@@ -2698,7 +2698,7 @@
           <w:sz w:val="24"/>
           <w:szCs w:val="24"/>
         </w:rPr>
-        <w:t>Pressure Regulator/ Gas governor</w:t>
+        <w:t>Pressure Regulator/ Gas Governor</w:t>
       </w:r>
     </w:p>
     <w:p>
@@ -2979,7 +2979,7 @@
           <w:sz w:val="24"/>
           <w:szCs w:val="24"/>
         </w:rPr>
-        <w:t>Ball valve</w:t>
+        <w:t>Ball Valve</w:t>
       </w:r>
     </w:p>
     <w:p>
@@ -3002,7 +3002,7 @@
           <w:sz w:val="24"/>
           <w:szCs w:val="24"/>
         </w:rPr>
-        <w:t>Pressure gauge with manual cock</w:t>
+        <w:t>Pressure Gauge with Manual Cock</w:t>
       </w:r>
     </w:p>
     <w:p>
@@ -3025,7 +3025,7 @@
           <w:sz w:val="24"/>
           <w:szCs w:val="24"/>
         </w:rPr>
-        <w:t>Pressure regulator</w:t>
+        <w:t>Pressure Regulator</w:t>
       </w:r>
     </w:p>
     <w:p>
@@ -3870,31 +3870,27 @@
         <w:rPr>
           <w:rFonts w:ascii="Calibri" w:hAnsi="Calibri" w:cs="Calibri"/>
         </w:rPr>
-        <w:t xml:space="preserve">The Flow of Air &amp; Gas </w:t>
-      </w:r>
-      <w:r>
-        <w:rPr>
-          <w:rFonts w:ascii="Calibri" w:hAnsi="Calibri" w:cs="Calibri"/>
-        </w:rPr>
-        <w:t xml:space="preserve">entering </w:t>
-      </w:r>
-      <w:r>
-        <w:rPr>
-          <w:rFonts w:ascii="Calibri" w:hAnsi="Calibri" w:cs="Calibri"/>
-        </w:rPr>
-        <w:t xml:space="preserve">to burner </w:t>
-      </w:r>
-      <w:r>
-        <w:rPr>
-          <w:rFonts w:ascii="Calibri" w:hAnsi="Calibri" w:cs="Calibri"/>
-        </w:rPr>
-        <w:t>will</w:t>
-      </w:r>
-      <w:r>
-        <w:rPr>
-          <w:rFonts w:ascii="Calibri" w:hAnsi="Calibri" w:cs="Calibri"/>
-        </w:rPr>
-        <w:t xml:space="preserve"> be governed by the ratio set in the PLC.</w:t>
+        <w:t>The Flow of Air &amp; Gas entering the burner will be governed by the ratio set in the PLC.</w:t>
+      </w:r>
+      <w:r>
+        <w:rPr>
+          <w:rFonts w:ascii="Calibri" w:hAnsi="Calibri" w:cs="Calibri"/>
+        </w:rPr>
+      </w:r>
+      <w:r>
+        <w:rPr>
+          <w:rFonts w:ascii="Calibri" w:hAnsi="Calibri" w:cs="Calibri"/>
+        </w:rPr>
+      </w:r>
+      <w:r>
+        <w:rPr>
+          <w:rFonts w:ascii="Calibri" w:hAnsi="Calibri" w:cs="Calibri"/>
+        </w:rPr>
+      </w:r>
+      <w:r>
+        <w:rPr>
+          <w:rFonts w:ascii="Calibri" w:hAnsi="Calibri" w:cs="Calibri"/>
+        </w:rPr>
       </w:r>
     </w:p>
     <w:p>
@@ -4088,25 +4084,22 @@
         <w:rPr>
           <w:rFonts w:ascii="Calibri" w:hAnsi="Calibri" w:cs="Calibri"/>
         </w:rPr>
-        <w:t>P.L.C</w:t>
-      </w:r>
-      <w:r>
-        <w:rPr>
-          <w:rFonts w:ascii="Calibri" w:hAnsi="Calibri" w:cs="Calibri"/>
-        </w:rPr>
-        <w:t xml:space="preserve"> S7</w:t>
-      </w:r>
-      <w:r>
-        <w:rPr>
-          <w:rFonts w:ascii="Calibri" w:hAnsi="Calibri" w:cs="Calibri"/>
-        </w:rPr>
-        <w:t xml:space="preserve"> – </w:t>
-      </w:r>
-      <w:r>
-        <w:rPr>
-          <w:rFonts w:ascii="Calibri" w:hAnsi="Calibri" w:cs="Calibri"/>
-        </w:rPr>
-        <w:t>1200</w:t>
+        <w:t>PLC S7 – 1200</w:t>
+      </w:r>
+      <w:r>
+        <w:rPr>
+          <w:rFonts w:ascii="Calibri" w:hAnsi="Calibri" w:cs="Calibri"/>
+        </w:rPr>
+      </w:r>
+      <w:r>
+        <w:rPr>
+          <w:rFonts w:ascii="Calibri" w:hAnsi="Calibri" w:cs="Calibri"/>
+        </w:rPr>
+      </w:r>
+      <w:r>
+        <w:rPr>
+          <w:rFonts w:ascii="Calibri" w:hAnsi="Calibri" w:cs="Calibri"/>
+        </w:rPr>
       </w:r>
     </w:p>
     <w:p>
@@ -4123,25 +4116,22 @@
         <w:rPr>
           <w:rFonts w:ascii="Calibri" w:hAnsi="Calibri" w:cs="Calibri"/>
         </w:rPr>
-        <w:t>1</w:t>
-      </w:r>
-      <w:r>
-        <w:rPr>
-          <w:rFonts w:ascii="Calibri" w:hAnsi="Calibri" w:cs="Calibri"/>
-        </w:rPr>
-        <w:t xml:space="preserve"> </w:t>
-      </w:r>
-      <w:r>
-        <w:rPr>
-          <w:rFonts w:ascii="Calibri" w:hAnsi="Calibri" w:cs="Calibri"/>
-        </w:rPr>
-        <w:t xml:space="preserve">Pressure Sensing Tube with Pressure Transmitter be installed in the </w:t>
-      </w:r>
-      <w:r>
-        <w:rPr>
-          <w:rFonts w:ascii="Calibri" w:hAnsi="Calibri" w:cs="Calibri"/>
-        </w:rPr>
-        <w:t>furnace.</w:t>
+        <w:t>1 Pressure Sensing Tube with Pressure Transmitter is installed in the furnace.</w:t>
+      </w:r>
+      <w:r>
+        <w:rPr>
+          <w:rFonts w:ascii="Calibri" w:hAnsi="Calibri" w:cs="Calibri"/>
+        </w:rPr>
+      </w:r>
+      <w:r>
+        <w:rPr>
+          <w:rFonts w:ascii="Calibri" w:hAnsi="Calibri" w:cs="Calibri"/>
+        </w:rPr>
+      </w:r>
+      <w:r>
+        <w:rPr>
+          <w:rFonts w:ascii="Calibri" w:hAnsi="Calibri" w:cs="Calibri"/>
+        </w:rPr>
       </w:r>
     </w:p>
     <w:p>
@@ -4158,13 +4148,12 @@
         <w:rPr>
           <w:rFonts w:ascii="Calibri" w:hAnsi="Calibri" w:cs="Calibri"/>
         </w:rPr>
-        <w:t>1 Damper type F</w:t>
-      </w:r>
-      <w:r>
-        <w:rPr>
-          <w:rFonts w:ascii="Calibri" w:hAnsi="Calibri" w:cs="Calibri"/>
-        </w:rPr>
-        <w:t xml:space="preserve">lue control Valves </w:t>
+        <w:t xml:space="preserve">1 Damper-type Flue Control Valve </w:t>
+      </w:r>
+      <w:r>
+        <w:rPr>
+          <w:rFonts w:ascii="Calibri" w:hAnsi="Calibri" w:cs="Calibri"/>
+        </w:rPr>
       </w:r>
     </w:p>
     <w:p>
@@ -4218,7 +4207,7 @@
         <w:rPr>
           <w:rFonts w:ascii="Calibri" w:hAnsi="Calibri" w:cs="Calibri"/>
         </w:rPr>
-        <w:t>The sensing tube fitted in the furnace, will give the Pressure differential and that will be sensed by the Pressure Transmitter</w:t>
+        <w:t>The sensing tube fitted in the furnace will give the pressure differential and that will be sensed by the Pressure Transmitter</w:t>
       </w:r>
     </w:p>
     <w:p>
@@ -4236,25 +4225,22 @@
         <w:rPr>
           <w:rFonts w:ascii="Calibri" w:hAnsi="Calibri" w:cs="Calibri"/>
         </w:rPr>
-        <w:t xml:space="preserve">The pressure transmitter will give </w:t>
-      </w:r>
-      <w:r>
-        <w:rPr>
-          <w:rFonts w:ascii="Calibri" w:hAnsi="Calibri" w:cs="Calibri"/>
-        </w:rPr>
-        <w:t>a signal</w:t>
-      </w:r>
-      <w:r>
-        <w:rPr>
-          <w:rFonts w:ascii="Calibri" w:hAnsi="Calibri" w:cs="Calibri"/>
-        </w:rPr>
-        <w:t xml:space="preserve"> to the P.L.C indicating the furnace </w:t>
-      </w:r>
-      <w:r>
-        <w:rPr>
-          <w:rFonts w:ascii="Calibri" w:hAnsi="Calibri" w:cs="Calibri"/>
-        </w:rPr>
-        <w:t>pressure.</w:t>
+        <w:t>The pressure transmitter will give a signal to the PLC indicating the furnace pressure.</w:t>
+      </w:r>
+      <w:r>
+        <w:rPr>
+          <w:rFonts w:ascii="Calibri" w:hAnsi="Calibri" w:cs="Calibri"/>
+        </w:rPr>
+      </w:r>
+      <w:r>
+        <w:rPr>
+          <w:rFonts w:ascii="Calibri" w:hAnsi="Calibri" w:cs="Calibri"/>
+        </w:rPr>
+      </w:r>
+      <w:r>
+        <w:rPr>
+          <w:rFonts w:ascii="Calibri" w:hAnsi="Calibri" w:cs="Calibri"/>
+        </w:rPr>
       </w:r>
     </w:p>
     <w:p>
@@ -4272,31 +4258,27 @@
         <w:rPr>
           <w:rFonts w:ascii="Calibri" w:hAnsi="Calibri" w:cs="Calibri"/>
         </w:rPr>
-        <w:t xml:space="preserve">P.L.C will send a signal to the </w:t>
-      </w:r>
-      <w:r>
-        <w:rPr>
-          <w:rFonts w:ascii="Calibri" w:hAnsi="Calibri" w:cs="Calibri"/>
-        </w:rPr>
-        <w:t>flue control valve</w:t>
-      </w:r>
-      <w:r>
-        <w:rPr>
-          <w:rFonts w:ascii="Calibri" w:hAnsi="Calibri" w:cs="Calibri"/>
-        </w:rPr>
-        <w:t xml:space="preserve"> fitted on the flue line to modulate</w:t>
-      </w:r>
-      <w:r>
-        <w:rPr>
-          <w:rFonts w:ascii="Calibri" w:hAnsi="Calibri" w:cs="Calibri"/>
-        </w:rPr>
-        <w:t xml:space="preserve"> </w:t>
-      </w:r>
-      <w:r>
-        <w:rPr>
-          <w:rFonts w:ascii="Calibri" w:hAnsi="Calibri" w:cs="Calibri"/>
-        </w:rPr>
-        <w:t xml:space="preserve">according to the set pressure. </w:t>
+        <w:t xml:space="preserve">PLC will send a signal to the flue control valve fitted on the flue line to modulate according to the set pressure. </w:t>
+      </w:r>
+      <w:r>
+        <w:rPr>
+          <w:rFonts w:ascii="Calibri" w:hAnsi="Calibri" w:cs="Calibri"/>
+        </w:rPr>
+      </w:r>
+      <w:r>
+        <w:rPr>
+          <w:rFonts w:ascii="Calibri" w:hAnsi="Calibri" w:cs="Calibri"/>
+        </w:rPr>
+      </w:r>
+      <w:r>
+        <w:rPr>
+          <w:rFonts w:ascii="Calibri" w:hAnsi="Calibri" w:cs="Calibri"/>
+        </w:rPr>
+      </w:r>
+      <w:r>
+        <w:rPr>
+          <w:rFonts w:ascii="Calibri" w:hAnsi="Calibri" w:cs="Calibri"/>
+        </w:rPr>
       </w:r>
     </w:p>
     <w:p>

</xml_diff>

<commit_message>
revert: remove BILL OF MATERIAL table from regen offer
Removed the Description|Qty table + heading and unwired fill_bom_table. The
builder quantity fixes (matching the reference costing) stay in place.

Co-Authored-By: Claude Opus 4.8 (1M context) <noreply@anthropic.com>
</commit_message>
<xml_diff>
--- a/Regen_Offer_Template.docx
+++ b/Regen_Offer_Template.docx
@@ -4587,71 +4587,6 @@
         <w:br w:type="page"/>
       </w:r>
     </w:p>
-    <w:tbl>
-      <w:tblPr>
-        <w:tblW w:type="auto" w:w="0"/>
-        <w:jc w:val="center"/>
-        <w:tblLook w:firstColumn="1" w:firstRow="1" w:lastColumn="0" w:lastRow="0" w:noHBand="0" w:noVBand="1" w:val="04A0"/>
-        <w:tblW w:w="5000" w:type="pct"/>
-        <w:tblLayout w:type="fixed"/>
-        <w:tblBorders>
-          <w:top w:val="single" w:sz="4" w:space="0" w:color="000000"/>
-          <w:left w:val="single" w:sz="4" w:space="0" w:color="000000"/>
-          <w:bottom w:val="single" w:sz="4" w:space="0" w:color="000000"/>
-          <w:right w:val="single" w:sz="4" w:space="0" w:color="000000"/>
-          <w:insideH w:val="single" w:sz="4" w:space="0" w:color="000000"/>
-          <w:insideV w:val="single" w:sz="4" w:space="0" w:color="000000"/>
-        </w:tblBorders>
-      </w:tblPr>
-      <w:tblGrid>
-        <w:gridCol w:w="7625"/>
-        <w:gridCol w:w="1399"/>
-      </w:tblGrid>
-      <w:tr>
-        <w:tc>
-          <w:tcPr>
-            <w:tcW w:type="dxa" w:w="7625"/>
-            <w:shd w:val="clear" w:color="auto" w:fill="F1F5F9"/>
-            <w:vAlign w:val="center"/>
-          </w:tcPr>
-          <w:p>
-            <w:pPr>
-              <w:spacing w:before="40" w:after="40" w:line="240" w:lineRule="auto"/>
-              <w:jc w:val="left"/>
-            </w:pPr>
-            <w:r>
-              <w:rPr>
-                <w:b/>
-                <w:color w:val="1F2937"/>
-                <w:sz w:val="25"/>
-              </w:rPr>
-              <w:t>Description</w:t>
-            </w:r>
-          </w:p>
-        </w:tc>
-        <w:tc>
-          <w:tcPr>
-            <w:tcW w:type="dxa" w:w="1399"/>
-            <w:shd w:val="clear" w:color="auto" w:fill="F1F5F9"/>
-            <w:vAlign w:val="center"/>
-          </w:tcPr>
-          <w:p>
-            <w:pPr>
-              <w:spacing w:before="40" w:after="40" w:line="240" w:lineRule="auto"/>
-              <w:jc w:val="center"/>
-            </w:pPr>
-            <w:r>
-              <w:rPr>
-                <w:b/>
-                <w:color w:val="1F2937"/>
-                <w:sz w:val="25"/>
-              </w:rPr>
-              <w:t>Qty.</w:t>
-            </w:r>
-          </w:p>
-        </w:tc>
-      </w:tr>
-    </w:tbl>
     <w:p>
       <w:pPr>
         <w:pStyle w:val="NoSpacing"/>

</xml_diff>

<commit_message>
fix: gas train section is fuel-specific (was hardcoded PNG), matches header
'PNG GAS TRAIN FOR MAIN BURNERS' + body now use {{ fuel_word }}, the same var
as the burner header (para 39). NG offer -> 'NG GAS TRAIN FOR MAIN BURNERS'.

Co-Authored-By: Claude Opus 4.8 (1M context) <noreply@anthropic.com>
</commit_message>
<xml_diff>
--- a/Regen_Offer_Template.docx
+++ b/Regen_Offer_Template.docx
@@ -2407,7 +2407,7 @@
           <w:color w:val="1F2937"/>
           <w:sz w:val="30"/>
         </w:rPr>
-        <w:t>PNG</w:t>
+        <w:t>{{ fuel_word }}</w:t>
       </w:r>
       <w:r>
         <w:rPr>
@@ -2468,7 +2468,7 @@
         <w:rPr>
           <w:rFonts w:ascii="Calibri" w:hAnsi="Calibri" w:cs="Calibri"/>
         </w:rPr>
-        <w:t xml:space="preserve">PNG which supply the fuel to burners at desired flow and pressure. </w:t>
+        <w:t xml:space="preserve">{{ fuel_word }} which supply the fuel to burners at desired flow and pressure. </w:t>
       </w:r>
       <w:r>
         <w:rPr>

</xml_diff>

<commit_message>
style: box the burner intro (heading + paragraph) in a light-blue panel
Wrapped 'ENCON REGENERATIVE {fuel} BURNERS' + its intro sentence in a single-
cell table with a light-blue fill (DDEBF7) and a soft blue box border. Jinja
tags render intact inside the cell.

Co-Authored-By: Claude Opus 4.8 (1M context) <noreply@anthropic.com>
</commit_message>
<xml_diff>
--- a/Regen_Offer_Template.docx
+++ b/Regen_Offer_Template.docx
@@ -2198,194 +2198,225 @@
         <w:t>lameless nozzle is not included)</w:t>
       </w:r>
     </w:p>
-    <w:p>
-      <w:pPr>
-        <w:rPr>
-          <w:b/>
-          <w:u w:val="single"/>
-        </w:rPr>
-      </w:pPr>
-      <w:r>
-        <w:rPr>
-          <w:rFonts w:ascii="Calibri" w:hAnsi="Calibri" w:cs="Calibri"/>
-          <w:b/>
-        </w:rPr>
-        <w:t>ENCON REGENERATIVE {{ fuel_word }} BURNERS – {{ burner_count }}</w:t>
-      </w:r>
-      <w:r>
-        <w:rPr>
-          <w:b/>
-        </w:rPr>
-      </w:r>
-      <w:r>
-        <w:rPr>
-          <w:b/>
-        </w:rPr>
-      </w:r>
-      <w:r>
-        <w:rPr>
-          <w:b/>
-        </w:rPr>
-      </w:r>
-      <w:r>
-        <w:rPr>
-          <w:b/>
-        </w:rPr>
-      </w:r>
-      <w:r>
-        <w:rPr>
-          <w:b/>
-        </w:rPr>
-      </w:r>
-    </w:p>
-    <w:p>
-      <w:pPr>
-        <w:pStyle w:val="NoSpacing"/>
-        <w:widowControl w:val="0"/>
-        <w:spacing w:after="120" w:line="276" w:lineRule="auto"/>
-        <w:jc w:val="both"/>
-        <w:rPr>
-          <w:rFonts w:ascii="Times New Roman" w:hAnsi="Times New Roman" w:cs="Times New Roman"/>
-          <w:sz w:val="24"/>
-          <w:szCs w:val="24"/>
-        </w:rPr>
-      </w:pPr>
-      <w:r>
-        <w:rPr>
-          <w:rFonts w:ascii="Calibri" w:hAnsi="Calibri" w:cs="Calibri"/>
-          <w:sz w:val="24"/>
-          <w:szCs w:val="24"/>
-        </w:rPr>
-        <w:t>We shall supply {{ qty_words }} of ENCON Regen Burners of {{ kw }} kW capacity; the fuel used in these burners will be {{ fuel_name }}.</w:t>
-      </w:r>
-      <w:r>
-        <w:rPr>
-          <w:rFonts w:ascii="Times New Roman" w:hAnsi="Times New Roman" w:cs="Times New Roman"/>
-          <w:sz w:val="24"/>
-          <w:szCs w:val="24"/>
-        </w:rPr>
-      </w:r>
-      <w:r>
-        <w:rPr>
-          <w:rFonts w:ascii="Times New Roman" w:hAnsi="Times New Roman" w:cs="Times New Roman"/>
-          <w:sz w:val="24"/>
-          <w:szCs w:val="24"/>
-        </w:rPr>
-      </w:r>
-      <w:r>
-        <w:rPr>
-          <w:rFonts w:ascii="Times New Roman" w:hAnsi="Times New Roman" w:cs="Times New Roman"/>
-          <w:sz w:val="24"/>
-          <w:szCs w:val="24"/>
-        </w:rPr>
-      </w:r>
-      <w:r>
-        <w:rPr>
-          <w:rFonts w:ascii="Times New Roman" w:hAnsi="Times New Roman" w:cs="Times New Roman"/>
-          <w:sz w:val="24"/>
-          <w:szCs w:val="24"/>
-        </w:rPr>
-      </w:r>
-      <w:r>
-        <w:rPr>
-          <w:rFonts w:ascii="Times New Roman" w:hAnsi="Times New Roman" w:cs="Times New Roman"/>
-          <w:sz w:val="24"/>
-          <w:szCs w:val="24"/>
-        </w:rPr>
-      </w:r>
-      <w:r>
-        <w:rPr>
-          <w:rFonts w:ascii="Times New Roman" w:hAnsi="Times New Roman" w:cs="Times New Roman"/>
-          <w:sz w:val="24"/>
-          <w:szCs w:val="24"/>
-        </w:rPr>
-      </w:r>
-      <w:r>
-        <w:rPr>
-          <w:rFonts w:ascii="Times New Roman" w:hAnsi="Times New Roman" w:cs="Times New Roman"/>
-          <w:sz w:val="24"/>
-          <w:szCs w:val="24"/>
-        </w:rPr>
-      </w:r>
-      <w:r>
-        <w:rPr>
-          <w:rFonts w:ascii="Times New Roman" w:hAnsi="Times New Roman" w:cs="Times New Roman"/>
-          <w:sz w:val="24"/>
-          <w:szCs w:val="24"/>
-        </w:rPr>
-      </w:r>
-      <w:r>
-        <w:rPr>
-          <w:rFonts w:ascii="Times New Roman" w:hAnsi="Times New Roman" w:cs="Times New Roman"/>
-          <w:sz w:val="24"/>
-          <w:szCs w:val="24"/>
-        </w:rPr>
-      </w:r>
-      <w:r>
-        <w:rPr>
-          <w:rFonts w:ascii="Calibri" w:hAnsi="Calibri" w:cs="Calibri"/>
-          <w:sz w:val="24"/>
-          <w:szCs w:val="24"/>
-        </w:rPr>
-        <w:t xml:space="preserve"> Each </w:t>
-      </w:r>
-      <w:r>
-        <w:rPr>
-          <w:rFonts w:ascii="Calibri" w:hAnsi="Calibri" w:cs="Calibri"/>
-          <w:sz w:val="24"/>
-          <w:szCs w:val="24"/>
-        </w:rPr>
-        <w:t xml:space="preserve">regen </w:t>
-      </w:r>
-      <w:r>
-        <w:rPr>
-          <w:rFonts w:ascii="Calibri" w:hAnsi="Calibri" w:cs="Calibri"/>
-          <w:sz w:val="24"/>
-          <w:szCs w:val="24"/>
-        </w:rPr>
-        <w:t xml:space="preserve">burner is accompanied </w:t>
-      </w:r>
-      <w:r>
-        <w:rPr>
-          <w:rFonts w:ascii="Calibri" w:hAnsi="Calibri" w:cs="Calibri"/>
-          <w:sz w:val="24"/>
-          <w:szCs w:val="24"/>
-        </w:rPr>
-        <w:t>by</w:t>
-      </w:r>
-      <w:r>
-        <w:rPr>
-          <w:rFonts w:ascii="Calibri" w:hAnsi="Calibri" w:cs="Calibri"/>
-          <w:sz w:val="24"/>
-          <w:szCs w:val="24"/>
-        </w:rPr>
-        <w:t xml:space="preserve"> a</w:t>
-      </w:r>
-      <w:r>
-        <w:rPr>
-          <w:rFonts w:ascii="Calibri" w:hAnsi="Calibri" w:cs="Calibri"/>
-          <w:sz w:val="24"/>
-          <w:szCs w:val="24"/>
-        </w:rPr>
-        <w:t xml:space="preserve">n </w:t>
-      </w:r>
-      <w:r>
-        <w:rPr>
-          <w:rFonts w:ascii="Calibri" w:hAnsi="Calibri" w:cs="Calibri"/>
-          <w:sz w:val="24"/>
-          <w:szCs w:val="24"/>
-        </w:rPr>
-        <w:t>air-cooled</w:t>
-      </w:r>
-      <w:r>
-        <w:rPr>
-          <w:rFonts w:ascii="Calibri" w:hAnsi="Calibri" w:cs="Calibri"/>
-          <w:sz w:val="24"/>
-          <w:szCs w:val="24"/>
-        </w:rPr>
-        <w:t xml:space="preserve"> pilot burner and UV Sensor. </w:t>
-      </w:r>
-    </w:p>
+    <w:tbl>
+      <w:tblPr>
+        <w:tblW w:type="auto" w:w="0"/>
+        <w:jc w:val="center"/>
+        <w:tblLook w:firstColumn="1" w:firstRow="1" w:lastColumn="0" w:lastRow="0" w:noHBand="0" w:noVBand="1" w:val="04A0"/>
+        <w:tblW w:w="5000" w:type="pct"/>
+        <w:tblBorders>
+          <w:top w:val="single" w:sz="8" w:space="0" w:color="9DC3E6"/>
+          <w:left w:val="single" w:sz="8" w:space="0" w:color="9DC3E6"/>
+          <w:bottom w:val="single" w:sz="8" w:space="0" w:color="9DC3E6"/>
+          <w:right w:val="single" w:sz="8" w:space="0" w:color="9DC3E6"/>
+        </w:tblBorders>
+        <w:tblCellMar>
+          <w:top w:w="100" w:type="dxa"/>
+          <w:bottom w:w="100" w:type="dxa"/>
+          <w:left w:w="140" w:type="dxa"/>
+          <w:right w:w="140" w:type="dxa"/>
+        </w:tblCellMar>
+      </w:tblPr>
+      <w:tblGrid>
+        <w:gridCol w:w="9740"/>
+      </w:tblGrid>
+      <w:tr>
+        <w:tc>
+          <w:tcPr>
+            <w:tcW w:type="dxa" w:w="9740"/>
+            <w:shd w:val="clear" w:color="auto" w:fill="DDEBF7"/>
+          </w:tcPr>
+          <w:p>
+            <w:pPr>
+              <w:rPr>
+                <w:b/>
+                <w:u w:val="single"/>
+              </w:rPr>
+            </w:pPr>
+            <w:r>
+              <w:rPr>
+                <w:rFonts w:ascii="Calibri" w:hAnsi="Calibri" w:cs="Calibri"/>
+                <w:b/>
+              </w:rPr>
+              <w:t>ENCON REGENERATIVE {{ fuel_word }} BURNERS – {{ burner_count }}</w:t>
+            </w:r>
+            <w:r>
+              <w:rPr>
+                <w:b/>
+              </w:rPr>
+            </w:r>
+            <w:r>
+              <w:rPr>
+                <w:b/>
+              </w:rPr>
+            </w:r>
+            <w:r>
+              <w:rPr>
+                <w:b/>
+              </w:rPr>
+            </w:r>
+            <w:r>
+              <w:rPr>
+                <w:b/>
+              </w:rPr>
+            </w:r>
+            <w:r>
+              <w:rPr>
+                <w:b/>
+              </w:rPr>
+            </w:r>
+          </w:p>
+          <w:p>
+            <w:pPr>
+              <w:pStyle w:val="NoSpacing"/>
+              <w:widowControl w:val="0"/>
+              <w:spacing w:after="120" w:line="276" w:lineRule="auto"/>
+              <w:jc w:val="both"/>
+              <w:rPr>
+                <w:rFonts w:ascii="Times New Roman" w:hAnsi="Times New Roman" w:cs="Times New Roman"/>
+                <w:sz w:val="24"/>
+                <w:szCs w:val="24"/>
+              </w:rPr>
+            </w:pPr>
+            <w:r>
+              <w:rPr>
+                <w:rFonts w:ascii="Calibri" w:hAnsi="Calibri" w:cs="Calibri"/>
+                <w:sz w:val="24"/>
+                <w:szCs w:val="24"/>
+              </w:rPr>
+              <w:t>We shall supply {{ qty_words }} of ENCON Regen Burners of {{ kw }} kW capacity; the fuel used in these burners will be {{ fuel_name }}.</w:t>
+            </w:r>
+            <w:r>
+              <w:rPr>
+                <w:rFonts w:ascii="Times New Roman" w:hAnsi="Times New Roman" w:cs="Times New Roman"/>
+                <w:sz w:val="24"/>
+                <w:szCs w:val="24"/>
+              </w:rPr>
+            </w:r>
+            <w:r>
+              <w:rPr>
+                <w:rFonts w:ascii="Times New Roman" w:hAnsi="Times New Roman" w:cs="Times New Roman"/>
+                <w:sz w:val="24"/>
+                <w:szCs w:val="24"/>
+              </w:rPr>
+            </w:r>
+            <w:r>
+              <w:rPr>
+                <w:rFonts w:ascii="Times New Roman" w:hAnsi="Times New Roman" w:cs="Times New Roman"/>
+                <w:sz w:val="24"/>
+                <w:szCs w:val="24"/>
+              </w:rPr>
+            </w:r>
+            <w:r>
+              <w:rPr>
+                <w:rFonts w:ascii="Times New Roman" w:hAnsi="Times New Roman" w:cs="Times New Roman"/>
+                <w:sz w:val="24"/>
+                <w:szCs w:val="24"/>
+              </w:rPr>
+            </w:r>
+            <w:r>
+              <w:rPr>
+                <w:rFonts w:ascii="Times New Roman" w:hAnsi="Times New Roman" w:cs="Times New Roman"/>
+                <w:sz w:val="24"/>
+                <w:szCs w:val="24"/>
+              </w:rPr>
+            </w:r>
+            <w:r>
+              <w:rPr>
+                <w:rFonts w:ascii="Times New Roman" w:hAnsi="Times New Roman" w:cs="Times New Roman"/>
+                <w:sz w:val="24"/>
+                <w:szCs w:val="24"/>
+              </w:rPr>
+            </w:r>
+            <w:r>
+              <w:rPr>
+                <w:rFonts w:ascii="Times New Roman" w:hAnsi="Times New Roman" w:cs="Times New Roman"/>
+                <w:sz w:val="24"/>
+                <w:szCs w:val="24"/>
+              </w:rPr>
+            </w:r>
+            <w:r>
+              <w:rPr>
+                <w:rFonts w:ascii="Times New Roman" w:hAnsi="Times New Roman" w:cs="Times New Roman"/>
+                <w:sz w:val="24"/>
+                <w:szCs w:val="24"/>
+              </w:rPr>
+            </w:r>
+            <w:r>
+              <w:rPr>
+                <w:rFonts w:ascii="Times New Roman" w:hAnsi="Times New Roman" w:cs="Times New Roman"/>
+                <w:sz w:val="24"/>
+                <w:szCs w:val="24"/>
+              </w:rPr>
+            </w:r>
+            <w:r>
+              <w:rPr>
+                <w:rFonts w:ascii="Calibri" w:hAnsi="Calibri" w:cs="Calibri"/>
+                <w:sz w:val="24"/>
+                <w:szCs w:val="24"/>
+              </w:rPr>
+              <w:t xml:space="preserve"> Each </w:t>
+            </w:r>
+            <w:r>
+              <w:rPr>
+                <w:rFonts w:ascii="Calibri" w:hAnsi="Calibri" w:cs="Calibri"/>
+                <w:sz w:val="24"/>
+                <w:szCs w:val="24"/>
+              </w:rPr>
+              <w:t xml:space="preserve">regen </w:t>
+            </w:r>
+            <w:r>
+              <w:rPr>
+                <w:rFonts w:ascii="Calibri" w:hAnsi="Calibri" w:cs="Calibri"/>
+                <w:sz w:val="24"/>
+                <w:szCs w:val="24"/>
+              </w:rPr>
+              <w:t xml:space="preserve">burner is accompanied </w:t>
+            </w:r>
+            <w:r>
+              <w:rPr>
+                <w:rFonts w:ascii="Calibri" w:hAnsi="Calibri" w:cs="Calibri"/>
+                <w:sz w:val="24"/>
+                <w:szCs w:val="24"/>
+              </w:rPr>
+              <w:t>by</w:t>
+            </w:r>
+            <w:r>
+              <w:rPr>
+                <w:rFonts w:ascii="Calibri" w:hAnsi="Calibri" w:cs="Calibri"/>
+                <w:sz w:val="24"/>
+                <w:szCs w:val="24"/>
+              </w:rPr>
+              <w:t xml:space="preserve"> a</w:t>
+            </w:r>
+            <w:r>
+              <w:rPr>
+                <w:rFonts w:ascii="Calibri" w:hAnsi="Calibri" w:cs="Calibri"/>
+                <w:sz w:val="24"/>
+                <w:szCs w:val="24"/>
+              </w:rPr>
+              <w:t xml:space="preserve">n </w:t>
+            </w:r>
+            <w:r>
+              <w:rPr>
+                <w:rFonts w:ascii="Calibri" w:hAnsi="Calibri" w:cs="Calibri"/>
+                <w:sz w:val="24"/>
+                <w:szCs w:val="24"/>
+              </w:rPr>
+              <w:t>air-cooled</w:t>
+            </w:r>
+            <w:r>
+              <w:rPr>
+                <w:rFonts w:ascii="Calibri" w:hAnsi="Calibri" w:cs="Calibri"/>
+                <w:sz w:val="24"/>
+                <w:szCs w:val="24"/>
+              </w:rPr>
+              <w:t xml:space="preserve"> pilot burner and UV Sensor. </w:t>
+            </w:r>
+          </w:p>
+        </w:tc>
+      </w:tr>
+    </w:tbl>
     <w:p>
       <w:pPr>
         <w:spacing w:before="280" w:after="80"/>

</xml_diff>

<commit_message>
feat: add 'consisting of' scope list to regen cover letter (gas + oil)
Cover letter now lists what the system comprises after the enclose line:
1. Regenerative Burners  2. Temperature Control  3. Blower for Combustion Air
4. ID Fan for Suction of Flue Gas  5. Panel with PLC & HMI. Applied to both the
gas and oil regen templates.

Co-Authored-By: Claude Opus 4.8 (1M context) <noreply@anthropic.com>
</commit_message>
<xml_diff>
--- a/Regen_Offer_Template.docx
+++ b/Regen_Offer_Template.docx
@@ -641,6 +641,65 @@
           <w:rFonts w:ascii="Calibri" w:cs="Calibri" w:eastAsia="Calibri" w:hAnsi="Calibri"/>
         </w:rPr>
         <w:t>We are pleased to enclose herewith our most competitive and comprehensive offer for the same for your kind perusal.</w:t>
+      </w:r>
+    </w:p>
+    <w:p>
+      <w:pPr>
+        <w:spacing w:after="60" w:before="0" w:line="240" w:lineRule="auto"/>
+        <w:jc w:val="left"/>
+      </w:pPr>
+      <w:r>
+        <w:t>The offer broadly comprises the following:</w:t>
+      </w:r>
+    </w:p>
+    <w:p>
+      <w:pPr>
+        <w:spacing w:after="20" w:before="0" w:line="240" w:lineRule="auto"/>
+        <w:ind w:left="504"/>
+        <w:jc w:val="left"/>
+      </w:pPr>
+      <w:r>
+        <w:t>1. Regenerative Burners</w:t>
+      </w:r>
+    </w:p>
+    <w:p>
+      <w:pPr>
+        <w:spacing w:after="20" w:before="0" w:line="240" w:lineRule="auto"/>
+        <w:ind w:left="504"/>
+        <w:jc w:val="left"/>
+      </w:pPr>
+      <w:r>
+        <w:t>2. Temperature Control</w:t>
+      </w:r>
+    </w:p>
+    <w:p>
+      <w:pPr>
+        <w:spacing w:after="20" w:before="0" w:line="240" w:lineRule="auto"/>
+        <w:ind w:left="504"/>
+        <w:jc w:val="left"/>
+      </w:pPr>
+      <w:r>
+        <w:t>3. Blower for Combustion Air</w:t>
+      </w:r>
+    </w:p>
+    <w:p>
+      <w:pPr>
+        <w:spacing w:after="20" w:before="0" w:line="240" w:lineRule="auto"/>
+        <w:ind w:left="504"/>
+        <w:jc w:val="left"/>
+      </w:pPr>
+      <w:r>
+        <w:t>4. ID Fan for Suction of Flue Gas</w:t>
+      </w:r>
+    </w:p>
+    <w:p>
+      <w:pPr>
+        <w:spacing w:after="20" w:before="0" w:line="240" w:lineRule="auto"/>
+        <w:ind w:left="504"/>
+        <w:jc w:val="left"/>
+      </w:pPr>
+      <w:r>
+        <w:t>5. Panel with PLC &amp; HMI</w:t>
       </w:r>
     </w:p>
     <w:p>

</xml_diff>

<commit_message>
fix: oil MAKE LIST says 'Regen Oil Burner'; PLC model S7-1200/1500 consistent
- MAKE LIST burner category is fuel-aware: 'Regen Oil Burner' on oil offers,
  'Regen Gas Burner' on gas.
- Static FURNACE PRESSURE CONTROL PLC heading updated 'S7 - 1200' -> 'S7-1200/
  1500' in both templates to match the dynamic TEMP CONTROL line.

Co-Authored-By: Claude Opus 4.8 (1M context) <noreply@anthropic.com>
</commit_message>
<xml_diff>
--- a/Regen_Offer_Template.docx
+++ b/Regen_Offer_Template.docx
@@ -3579,19 +3579,17 @@
         <w:rPr>
           <w:rFonts w:ascii="Calibri" w:hAnsi="Calibri" w:cs="Calibri"/>
         </w:rPr>
-        <w:t>PLC</w:t>
-      </w:r>
-      <w:r>
-        <w:rPr>
-          <w:rFonts w:ascii="Calibri" w:hAnsi="Calibri" w:cs="Calibri"/>
-        </w:rPr>
-        <w:t xml:space="preserve"> S</w:t>
-      </w:r>
-      <w:r>
-        <w:rPr>
-          <w:rFonts w:ascii="Calibri" w:hAnsi="Calibri" w:cs="Calibri"/>
-        </w:rPr>
-        <w:t xml:space="preserve">7 – 1200 </w:t>
+        <w:t xml:space="preserve">PLC S7-1200/1500 </w:t>
+      </w:r>
+      <w:r>
+        <w:rPr>
+          <w:rFonts w:ascii="Calibri" w:hAnsi="Calibri" w:cs="Calibri"/>
+        </w:rPr>
+      </w:r>
+      <w:r>
+        <w:rPr>
+          <w:rFonts w:ascii="Calibri" w:hAnsi="Calibri" w:cs="Calibri"/>
+        </w:rPr>
       </w:r>
     </w:p>
     <w:p>
@@ -4174,7 +4172,7 @@
         <w:rPr>
           <w:rFonts w:ascii="Calibri" w:hAnsi="Calibri" w:cs="Calibri"/>
         </w:rPr>
-        <w:t>PLC S7 – 1200</w:t>
+        <w:t>PLC S7-1200/1500</w:t>
       </w:r>
       <w:r>
         <w:rPr>

</xml_diff>

<commit_message>
feat: dynamic cover-letter scope list - Furnace Pressure Control (all), Gas Train (gas only)
fill_consist_list() rebuilds the 'consisting of' list per fuel: all offers get
Furnace Pressure Control; gas fuels also get '{fuel} Gas Train' (oil fuels
don't). Now runs on both gas + oil offers (was gas-only static). Removed the
old static 5-item list from the gas template.

Co-Authored-By: Claude Opus 4.8 (1M context) <noreply@anthropic.com>
</commit_message>
<xml_diff>
--- a/Regen_Offer_Template.docx
+++ b/Regen_Offer_Template.docx
@@ -641,65 +641,6 @@
           <w:rFonts w:ascii="Calibri" w:cs="Calibri" w:eastAsia="Calibri" w:hAnsi="Calibri"/>
         </w:rPr>
         <w:t>We are pleased to enclose herewith our most competitive and comprehensive offer for the same for your kind perusal.</w:t>
-      </w:r>
-    </w:p>
-    <w:p>
-      <w:pPr>
-        <w:spacing w:after="60" w:before="0" w:line="240" w:lineRule="auto"/>
-        <w:jc w:val="left"/>
-      </w:pPr>
-      <w:r>
-        <w:t>The offer broadly comprises the following:</w:t>
-      </w:r>
-    </w:p>
-    <w:p>
-      <w:pPr>
-        <w:spacing w:after="20" w:before="0" w:line="240" w:lineRule="auto"/>
-        <w:ind w:left="504"/>
-        <w:jc w:val="left"/>
-      </w:pPr>
-      <w:r>
-        <w:t>1. Regenerative Burners</w:t>
-      </w:r>
-    </w:p>
-    <w:p>
-      <w:pPr>
-        <w:spacing w:after="20" w:before="0" w:line="240" w:lineRule="auto"/>
-        <w:ind w:left="504"/>
-        <w:jc w:val="left"/>
-      </w:pPr>
-      <w:r>
-        <w:t>2. Temperature Control</w:t>
-      </w:r>
-    </w:p>
-    <w:p>
-      <w:pPr>
-        <w:spacing w:after="20" w:before="0" w:line="240" w:lineRule="auto"/>
-        <w:ind w:left="504"/>
-        <w:jc w:val="left"/>
-      </w:pPr>
-      <w:r>
-        <w:t>3. Blower for Combustion Air</w:t>
-      </w:r>
-    </w:p>
-    <w:p>
-      <w:pPr>
-        <w:spacing w:after="20" w:before="0" w:line="240" w:lineRule="auto"/>
-        <w:ind w:left="504"/>
-        <w:jc w:val="left"/>
-      </w:pPr>
-      <w:r>
-        <w:t>4. ID Fan for Suction of Flue Gas</w:t>
-      </w:r>
-    </w:p>
-    <w:p>
-      <w:pPr>
-        <w:spacing w:after="20" w:before="0" w:line="240" w:lineRule="auto"/>
-        <w:ind w:left="504"/>
-        <w:jc w:val="left"/>
-      </w:pPr>
-      <w:r>
-        <w:t>5. Panel with PLC &amp; HMI</w:t>
       </w:r>
     </w:p>
     <w:p>

</xml_diff>

<commit_message>
style: remove all orange underlines/rules from regen offers (gas + oil)
Stripped the orange (E87722) paragraph bottom-borders under every heading and
the header rule, in both templates. Orange text (cover title) and orange table-
header fills are left as-is (not underlines).

Co-Authored-By: Claude Opus 4.8 (1M context) <noreply@anthropic.com>
</commit_message>
<xml_diff>
--- a/Regen_Offer_Template.docx
+++ b/Regen_Offer_Template.docx
@@ -824,9 +824,6 @@
           <w:bCs/>
           <w:spacing w:val="-2"/>
         </w:rPr>
-        <w:pBdr>
-          <w:bottom w:val="single" w:color="E87722" w:sz="12" w:space="4"/>
-        </w:pBdr>
       </w:pPr>
       <w:r>
         <w:rPr>
@@ -874,9 +871,6 @@
         <w:rPr>
           <w:rFonts w:ascii="Times New Roman" w:hAnsi="Times New Roman" w:cs="Times New Roman"/>
         </w:rPr>
-        <w:pBdr>
-          <w:bottom w:val="single" w:color="E87722" w:sz="12" w:space="4"/>
-        </w:pBdr>
       </w:pPr>
       <w:r>
         <w:rPr>
@@ -916,9 +910,6 @@
           <w:b/>
           <w:u w:val="single"/>
         </w:rPr>
-        <w:pBdr>
-          <w:bottom w:val="single" w:color="E87722" w:sz="12" w:space="4"/>
-        </w:pBdr>
       </w:pPr>
       <w:r>
         <w:rPr>
@@ -1193,9 +1184,6 @@
           <w:b/>
           <w:u w:val="single"/>
         </w:rPr>
-        <w:pBdr>
-          <w:bottom w:val="single" w:color="E87722" w:sz="12" w:space="4"/>
-        </w:pBdr>
       </w:pPr>
       <w:r>
         <w:rPr>
@@ -2426,9 +2414,6 @@
           <w:bCs/>
           <w:u w:val="single"/>
         </w:rPr>
-        <w:pBdr>
-          <w:bottom w:val="single" w:color="E87722" w:sz="12" w:space="4"/>
-        </w:pBdr>
       </w:pPr>
       <w:r>
         <w:rPr>
@@ -2901,9 +2886,6 @@
           <w:b/>
           <w:u w:val="single"/>
         </w:rPr>
-        <w:pBdr>
-          <w:bottom w:val="single" w:color="E87722" w:sz="12" w:space="4"/>
-        </w:pBdr>
       </w:pPr>
       <w:r>
         <w:rPr>
@@ -3113,9 +3095,6 @@
           <w:b/>
           <w:u w:val="single"/>
         </w:rPr>
-        <w:pBdr>
-          <w:bottom w:val="single" w:color="E87722" w:sz="12" w:space="4"/>
-        </w:pBdr>
       </w:pPr>
       <w:r>
         <w:rPr>
@@ -3252,9 +3231,6 @@
           <w:b/>
           <w:u w:val="single"/>
         </w:rPr>
-        <w:pBdr>
-          <w:bottom w:val="single" w:color="E87722" w:sz="12" w:space="4"/>
-        </w:pBdr>
       </w:pPr>
       <w:r>
         <w:rPr>
@@ -3390,9 +3366,6 @@
           <w:b/>
           <w:u w:val="single"/>
         </w:rPr>
-        <w:pBdr>
-          <w:bottom w:val="single" w:color="E87722" w:sz="12" w:space="4"/>
-        </w:pBdr>
       </w:pPr>
       <w:r>
         <w:rPr>
@@ -3773,9 +3746,6 @@
           <w:b/>
           <w:u w:val="single"/>
         </w:rPr>
-        <w:pBdr>
-          <w:bottom w:val="single" w:color="E87722" w:sz="12" w:space="4"/>
-        </w:pBdr>
       </w:pPr>
       <w:r>
         <w:rPr>
@@ -4074,9 +4044,6 @@
           <w:color w:val="000000"/>
           <w:u w:val="single"/>
         </w:rPr>
-        <w:pBdr>
-          <w:bottom w:val="single" w:color="E87722" w:sz="12" w:space="4"/>
-        </w:pBdr>
       </w:pPr>
       <w:r>
         <w:rPr>
@@ -4195,9 +4162,6 @@
           <w:color w:val="000000"/>
           <w:u w:val="single"/>
         </w:rPr>
-        <w:pBdr>
-          <w:bottom w:val="single" w:color="E87722" w:sz="12" w:space="4"/>
-        </w:pBdr>
       </w:pPr>
       <w:r>
         <w:rPr>
@@ -4603,9 +4567,6 @@
           <w:bCs/>
           <w:u w:val="single"/>
         </w:rPr>
-        <w:pBdr>
-          <w:bottom w:val="single" w:color="E87722" w:sz="12" w:space="4"/>
-        </w:pBdr>
       </w:pPr>
       <w:r>
         <w:rPr>
@@ -4628,9 +4589,6 @@
           <w:szCs w:val="24"/>
           <w:u w:val="single"/>
         </w:rPr>
-        <w:pBdr>
-          <w:bottom w:val="single" w:color="E87722" w:sz="12" w:space="4"/>
-        </w:pBdr>
       </w:pPr>
       <w:r>
         <w:rPr>
@@ -9925,9 +9883,6 @@
           <w:bCs/>
           <w:u w:val="single"/>
         </w:rPr>
-        <w:pBdr>
-          <w:bottom w:val="single" w:color="E87722" w:sz="12" w:space="4"/>
-        </w:pBdr>
       </w:pPr>
       <w:r>
         <w:rPr>
@@ -12352,9 +12307,6 @@
           <w:sz w:val="24"/>
           <w:szCs w:val="24"/>
         </w:rPr>
-        <w:pBdr>
-          <w:bottom w:val="single" w:color="E87722" w:sz="12" w:space="4"/>
-        </w:pBdr>
       </w:pPr>
       <w:r>
         <w:rPr>
@@ -12407,9 +12359,6 @@
           <w:u w:val="single"/>
           <w:lang w:val="en-GB"/>
         </w:rPr>
-        <w:pBdr>
-          <w:bottom w:val="single" w:color="E87722" w:sz="12" w:space="4"/>
-        </w:pBdr>
       </w:pPr>
       <w:r>
         <w:rPr>
@@ -13045,9 +12994,6 @@
           <w:bCs/>
           <w:u w:val="single"/>
         </w:rPr>
-        <w:pBdr>
-          <w:bottom w:val="single" w:color="E87722" w:sz="12" w:space="4"/>
-        </w:pBdr>
       </w:pPr>
       <w:r>
         <w:rPr>
@@ -13144,9 +13090,6 @@
         <w:ind/>
         <w:contextualSpacing w:val="0"/>
         <w:jc w:val="left"/>
-        <w:pBdr>
-          <w:bottom w:val="single" w:color="E87722" w:sz="12" w:space="4"/>
-        </w:pBdr>
       </w:pPr>
       <w:r>
         <w:rPr>
@@ -14026,7 +13969,7 @@
       <w:tblBorders>
         <w:top w:val="none" w:color="FFFFFF" w:sz="0"/>
         <w:left w:val="none" w:color="FFFFFF" w:sz="0"/>
-        <w:bottom w:val="single" w:color="E87722" w:sz="12"/>
+        <w:bottom w:val="single" w:color="auto" w:sz="12"/>
         <w:right w:val="none" w:color="FFFFFF" w:sz="0"/>
         <w:insideH w:val="none" w:color="FFFFFF" w:sz="0"/>
         <w:insideV w:val="none" w:color="FFFFFF" w:sz="0"/>

</xml_diff>

<commit_message>
style: double the inner margins on the burner-intro box (gas + oil)
Doubled the single-cell box's cell margins (top/bottom 100->200, left/right
140->280 twips) so the heading + paragraph sit further from the box border.

Co-Authored-By: Claude Opus 4.8 (1M context) <noreply@anthropic.com>
</commit_message>
<xml_diff>
--- a/Regen_Offer_Template.docx
+++ b/Regen_Offer_Template.docx
@@ -2199,10 +2199,10 @@
           <w:right w:val="single" w:sz="8" w:space="0" w:color="9DC3E6"/>
         </w:tblBorders>
         <w:tblCellMar>
-          <w:top w:w="100" w:type="dxa"/>
-          <w:bottom w:w="100" w:type="dxa"/>
-          <w:left w:w="140" w:type="dxa"/>
-          <w:right w:w="140" w:type="dxa"/>
+          <w:top w:w="200" w:type="dxa"/>
+          <w:bottom w:w="200" w:type="dxa"/>
+          <w:left w:w="280" w:type="dxa"/>
+          <w:right w:w="280" w:type="dxa"/>
         </w:tblCellMar>
       </w:tblPr>
       <w:tblGrid>

</xml_diff>

<commit_message>
revert: un-box burner intro (plain section like HPU); drop quantities from scope lists
- Removed the light-blue box around the burner intro; it's now a plain heading
  + paragraph matching the HPU section (both templates).
- HEATING & PUMPING UNIT, TEMPERATURE CONTROL, and itemized gas-train scope
  bullets no longer show quantities (item names only).

Co-Authored-By: Claude Opus 4.8 (1M context) <noreply@anthropic.com>
</commit_message>
<xml_diff>
--- a/Regen_Offer_Template.docx
+++ b/Regen_Offer_Template.docx
@@ -2186,225 +2186,194 @@
         <w:t>lameless nozzle is not included)</w:t>
       </w:r>
     </w:p>
-    <w:tbl>
-      <w:tblPr>
-        <w:tblW w:type="auto" w:w="0"/>
-        <w:jc w:val="center"/>
-        <w:tblLook w:firstColumn="1" w:firstRow="1" w:lastColumn="0" w:lastRow="0" w:noHBand="0" w:noVBand="1" w:val="04A0"/>
-        <w:tblW w:w="5000" w:type="pct"/>
-        <w:tblBorders>
-          <w:top w:val="single" w:sz="8" w:space="0" w:color="9DC3E6"/>
-          <w:left w:val="single" w:sz="8" w:space="0" w:color="9DC3E6"/>
-          <w:bottom w:val="single" w:sz="8" w:space="0" w:color="9DC3E6"/>
-          <w:right w:val="single" w:sz="8" w:space="0" w:color="9DC3E6"/>
-        </w:tblBorders>
-        <w:tblCellMar>
-          <w:top w:w="200" w:type="dxa"/>
-          <w:bottom w:w="200" w:type="dxa"/>
-          <w:left w:w="280" w:type="dxa"/>
-          <w:right w:w="280" w:type="dxa"/>
-        </w:tblCellMar>
-      </w:tblPr>
-      <w:tblGrid>
-        <w:gridCol w:w="9740"/>
-      </w:tblGrid>
-      <w:tr>
-        <w:tc>
-          <w:tcPr>
-            <w:tcW w:type="dxa" w:w="9740"/>
-            <w:shd w:val="clear" w:color="auto" w:fill="DDEBF7"/>
-          </w:tcPr>
-          <w:p>
-            <w:pPr>
-              <w:rPr>
-                <w:b/>
-                <w:u w:val="single"/>
-              </w:rPr>
-            </w:pPr>
-            <w:r>
-              <w:rPr>
-                <w:rFonts w:ascii="Calibri" w:hAnsi="Calibri" w:cs="Calibri"/>
-                <w:b/>
-              </w:rPr>
-              <w:t>ENCON REGENERATIVE {{ fuel_word }} BURNERS – {{ burner_count }}</w:t>
-            </w:r>
-            <w:r>
-              <w:rPr>
-                <w:b/>
-              </w:rPr>
-            </w:r>
-            <w:r>
-              <w:rPr>
-                <w:b/>
-              </w:rPr>
-            </w:r>
-            <w:r>
-              <w:rPr>
-                <w:b/>
-              </w:rPr>
-            </w:r>
-            <w:r>
-              <w:rPr>
-                <w:b/>
-              </w:rPr>
-            </w:r>
-            <w:r>
-              <w:rPr>
-                <w:b/>
-              </w:rPr>
-            </w:r>
-          </w:p>
-          <w:p>
-            <w:pPr>
-              <w:pStyle w:val="NoSpacing"/>
-              <w:widowControl w:val="0"/>
-              <w:spacing w:after="120" w:line="276" w:lineRule="auto"/>
-              <w:jc w:val="both"/>
-              <w:rPr>
-                <w:rFonts w:ascii="Times New Roman" w:hAnsi="Times New Roman" w:cs="Times New Roman"/>
-                <w:sz w:val="24"/>
-                <w:szCs w:val="24"/>
-              </w:rPr>
-            </w:pPr>
-            <w:r>
-              <w:rPr>
-                <w:rFonts w:ascii="Calibri" w:hAnsi="Calibri" w:cs="Calibri"/>
-                <w:sz w:val="24"/>
-                <w:szCs w:val="24"/>
-              </w:rPr>
-              <w:t>We shall supply {{ qty_words }} of ENCON Regen Burners of {{ kw }} kW capacity; the fuel used in these burners will be {{ fuel_name }}.</w:t>
-            </w:r>
-            <w:r>
-              <w:rPr>
-                <w:rFonts w:ascii="Times New Roman" w:hAnsi="Times New Roman" w:cs="Times New Roman"/>
-                <w:sz w:val="24"/>
-                <w:szCs w:val="24"/>
-              </w:rPr>
-            </w:r>
-            <w:r>
-              <w:rPr>
-                <w:rFonts w:ascii="Times New Roman" w:hAnsi="Times New Roman" w:cs="Times New Roman"/>
-                <w:sz w:val="24"/>
-                <w:szCs w:val="24"/>
-              </w:rPr>
-            </w:r>
-            <w:r>
-              <w:rPr>
-                <w:rFonts w:ascii="Times New Roman" w:hAnsi="Times New Roman" w:cs="Times New Roman"/>
-                <w:sz w:val="24"/>
-                <w:szCs w:val="24"/>
-              </w:rPr>
-            </w:r>
-            <w:r>
-              <w:rPr>
-                <w:rFonts w:ascii="Times New Roman" w:hAnsi="Times New Roman" w:cs="Times New Roman"/>
-                <w:sz w:val="24"/>
-                <w:szCs w:val="24"/>
-              </w:rPr>
-            </w:r>
-            <w:r>
-              <w:rPr>
-                <w:rFonts w:ascii="Times New Roman" w:hAnsi="Times New Roman" w:cs="Times New Roman"/>
-                <w:sz w:val="24"/>
-                <w:szCs w:val="24"/>
-              </w:rPr>
-            </w:r>
-            <w:r>
-              <w:rPr>
-                <w:rFonts w:ascii="Times New Roman" w:hAnsi="Times New Roman" w:cs="Times New Roman"/>
-                <w:sz w:val="24"/>
-                <w:szCs w:val="24"/>
-              </w:rPr>
-            </w:r>
-            <w:r>
-              <w:rPr>
-                <w:rFonts w:ascii="Times New Roman" w:hAnsi="Times New Roman" w:cs="Times New Roman"/>
-                <w:sz w:val="24"/>
-                <w:szCs w:val="24"/>
-              </w:rPr>
-            </w:r>
-            <w:r>
-              <w:rPr>
-                <w:rFonts w:ascii="Times New Roman" w:hAnsi="Times New Roman" w:cs="Times New Roman"/>
-                <w:sz w:val="24"/>
-                <w:szCs w:val="24"/>
-              </w:rPr>
-            </w:r>
-            <w:r>
-              <w:rPr>
-                <w:rFonts w:ascii="Times New Roman" w:hAnsi="Times New Roman" w:cs="Times New Roman"/>
-                <w:sz w:val="24"/>
-                <w:szCs w:val="24"/>
-              </w:rPr>
-            </w:r>
-            <w:r>
-              <w:rPr>
-                <w:rFonts w:ascii="Calibri" w:hAnsi="Calibri" w:cs="Calibri"/>
-                <w:sz w:val="24"/>
-                <w:szCs w:val="24"/>
-              </w:rPr>
-              <w:t xml:space="preserve"> Each </w:t>
-            </w:r>
-            <w:r>
-              <w:rPr>
-                <w:rFonts w:ascii="Calibri" w:hAnsi="Calibri" w:cs="Calibri"/>
-                <w:sz w:val="24"/>
-                <w:szCs w:val="24"/>
-              </w:rPr>
-              <w:t xml:space="preserve">regen </w:t>
-            </w:r>
-            <w:r>
-              <w:rPr>
-                <w:rFonts w:ascii="Calibri" w:hAnsi="Calibri" w:cs="Calibri"/>
-                <w:sz w:val="24"/>
-                <w:szCs w:val="24"/>
-              </w:rPr>
-              <w:t xml:space="preserve">burner is accompanied </w:t>
-            </w:r>
-            <w:r>
-              <w:rPr>
-                <w:rFonts w:ascii="Calibri" w:hAnsi="Calibri" w:cs="Calibri"/>
-                <w:sz w:val="24"/>
-                <w:szCs w:val="24"/>
-              </w:rPr>
-              <w:t>by</w:t>
-            </w:r>
-            <w:r>
-              <w:rPr>
-                <w:rFonts w:ascii="Calibri" w:hAnsi="Calibri" w:cs="Calibri"/>
-                <w:sz w:val="24"/>
-                <w:szCs w:val="24"/>
-              </w:rPr>
-              <w:t xml:space="preserve"> a</w:t>
-            </w:r>
-            <w:r>
-              <w:rPr>
-                <w:rFonts w:ascii="Calibri" w:hAnsi="Calibri" w:cs="Calibri"/>
-                <w:sz w:val="24"/>
-                <w:szCs w:val="24"/>
-              </w:rPr>
-              <w:t xml:space="preserve">n </w:t>
-            </w:r>
-            <w:r>
-              <w:rPr>
-                <w:rFonts w:ascii="Calibri" w:hAnsi="Calibri" w:cs="Calibri"/>
-                <w:sz w:val="24"/>
-                <w:szCs w:val="24"/>
-              </w:rPr>
-              <w:t>air-cooled</w:t>
-            </w:r>
-            <w:r>
-              <w:rPr>
-                <w:rFonts w:ascii="Calibri" w:hAnsi="Calibri" w:cs="Calibri"/>
-                <w:sz w:val="24"/>
-                <w:szCs w:val="24"/>
-              </w:rPr>
-              <w:t xml:space="preserve"> pilot burner and UV Sensor. </w:t>
-            </w:r>
-          </w:p>
-        </w:tc>
-      </w:tr>
-    </w:tbl>
+    <w:p>
+      <w:pPr>
+        <w:rPr>
+          <w:b/>
+          <w:u w:val="single"/>
+        </w:rPr>
+      </w:pPr>
+      <w:r>
+        <w:rPr>
+          <w:rFonts w:ascii="Calibri" w:hAnsi="Calibri" w:cs="Calibri"/>
+          <w:b/>
+        </w:rPr>
+        <w:t>ENCON REGENERATIVE {{ fuel_word }} BURNERS – {{ burner_count }}</w:t>
+      </w:r>
+      <w:r>
+        <w:rPr>
+          <w:b/>
+        </w:rPr>
+      </w:r>
+      <w:r>
+        <w:rPr>
+          <w:b/>
+        </w:rPr>
+      </w:r>
+      <w:r>
+        <w:rPr>
+          <w:b/>
+        </w:rPr>
+      </w:r>
+      <w:r>
+        <w:rPr>
+          <w:b/>
+        </w:rPr>
+      </w:r>
+      <w:r>
+        <w:rPr>
+          <w:b/>
+        </w:rPr>
+      </w:r>
+    </w:p>
+    <w:p>
+      <w:pPr>
+        <w:pStyle w:val="NoSpacing"/>
+        <w:widowControl w:val="0"/>
+        <w:spacing w:after="120" w:line="276" w:lineRule="auto"/>
+        <w:jc w:val="both"/>
+        <w:rPr>
+          <w:rFonts w:ascii="Times New Roman" w:hAnsi="Times New Roman" w:cs="Times New Roman"/>
+          <w:sz w:val="24"/>
+          <w:szCs w:val="24"/>
+        </w:rPr>
+      </w:pPr>
+      <w:r>
+        <w:rPr>
+          <w:rFonts w:ascii="Calibri" w:hAnsi="Calibri" w:cs="Calibri"/>
+          <w:sz w:val="24"/>
+          <w:szCs w:val="24"/>
+        </w:rPr>
+        <w:t>We shall supply {{ qty_words }} of ENCON Regen Burners of {{ kw }} kW capacity; the fuel used in these burners will be {{ fuel_name }}.</w:t>
+      </w:r>
+      <w:r>
+        <w:rPr>
+          <w:rFonts w:ascii="Times New Roman" w:hAnsi="Times New Roman" w:cs="Times New Roman"/>
+          <w:sz w:val="24"/>
+          <w:szCs w:val="24"/>
+        </w:rPr>
+      </w:r>
+      <w:r>
+        <w:rPr>
+          <w:rFonts w:ascii="Times New Roman" w:hAnsi="Times New Roman" w:cs="Times New Roman"/>
+          <w:sz w:val="24"/>
+          <w:szCs w:val="24"/>
+        </w:rPr>
+      </w:r>
+      <w:r>
+        <w:rPr>
+          <w:rFonts w:ascii="Times New Roman" w:hAnsi="Times New Roman" w:cs="Times New Roman"/>
+          <w:sz w:val="24"/>
+          <w:szCs w:val="24"/>
+        </w:rPr>
+      </w:r>
+      <w:r>
+        <w:rPr>
+          <w:rFonts w:ascii="Times New Roman" w:hAnsi="Times New Roman" w:cs="Times New Roman"/>
+          <w:sz w:val="24"/>
+          <w:szCs w:val="24"/>
+        </w:rPr>
+      </w:r>
+      <w:r>
+        <w:rPr>
+          <w:rFonts w:ascii="Times New Roman" w:hAnsi="Times New Roman" w:cs="Times New Roman"/>
+          <w:sz w:val="24"/>
+          <w:szCs w:val="24"/>
+        </w:rPr>
+      </w:r>
+      <w:r>
+        <w:rPr>
+          <w:rFonts w:ascii="Times New Roman" w:hAnsi="Times New Roman" w:cs="Times New Roman"/>
+          <w:sz w:val="24"/>
+          <w:szCs w:val="24"/>
+        </w:rPr>
+      </w:r>
+      <w:r>
+        <w:rPr>
+          <w:rFonts w:ascii="Times New Roman" w:hAnsi="Times New Roman" w:cs="Times New Roman"/>
+          <w:sz w:val="24"/>
+          <w:szCs w:val="24"/>
+        </w:rPr>
+      </w:r>
+      <w:r>
+        <w:rPr>
+          <w:rFonts w:ascii="Times New Roman" w:hAnsi="Times New Roman" w:cs="Times New Roman"/>
+          <w:sz w:val="24"/>
+          <w:szCs w:val="24"/>
+        </w:rPr>
+      </w:r>
+      <w:r>
+        <w:rPr>
+          <w:rFonts w:ascii="Times New Roman" w:hAnsi="Times New Roman" w:cs="Times New Roman"/>
+          <w:sz w:val="24"/>
+          <w:szCs w:val="24"/>
+        </w:rPr>
+      </w:r>
+      <w:r>
+        <w:rPr>
+          <w:rFonts w:ascii="Calibri" w:hAnsi="Calibri" w:cs="Calibri"/>
+          <w:sz w:val="24"/>
+          <w:szCs w:val="24"/>
+        </w:rPr>
+        <w:t xml:space="preserve"> Each </w:t>
+      </w:r>
+      <w:r>
+        <w:rPr>
+          <w:rFonts w:ascii="Calibri" w:hAnsi="Calibri" w:cs="Calibri"/>
+          <w:sz w:val="24"/>
+          <w:szCs w:val="24"/>
+        </w:rPr>
+        <w:t xml:space="preserve">regen </w:t>
+      </w:r>
+      <w:r>
+        <w:rPr>
+          <w:rFonts w:ascii="Calibri" w:hAnsi="Calibri" w:cs="Calibri"/>
+          <w:sz w:val="24"/>
+          <w:szCs w:val="24"/>
+        </w:rPr>
+        <w:t xml:space="preserve">burner is accompanied </w:t>
+      </w:r>
+      <w:r>
+        <w:rPr>
+          <w:rFonts w:ascii="Calibri" w:hAnsi="Calibri" w:cs="Calibri"/>
+          <w:sz w:val="24"/>
+          <w:szCs w:val="24"/>
+        </w:rPr>
+        <w:t>by</w:t>
+      </w:r>
+      <w:r>
+        <w:rPr>
+          <w:rFonts w:ascii="Calibri" w:hAnsi="Calibri" w:cs="Calibri"/>
+          <w:sz w:val="24"/>
+          <w:szCs w:val="24"/>
+        </w:rPr>
+        <w:t xml:space="preserve"> a</w:t>
+      </w:r>
+      <w:r>
+        <w:rPr>
+          <w:rFonts w:ascii="Calibri" w:hAnsi="Calibri" w:cs="Calibri"/>
+          <w:sz w:val="24"/>
+          <w:szCs w:val="24"/>
+        </w:rPr>
+        <w:t xml:space="preserve">n </w:t>
+      </w:r>
+      <w:r>
+        <w:rPr>
+          <w:rFonts w:ascii="Calibri" w:hAnsi="Calibri" w:cs="Calibri"/>
+          <w:sz w:val="24"/>
+          <w:szCs w:val="24"/>
+        </w:rPr>
+        <w:t>air-cooled</w:t>
+      </w:r>
+      <w:r>
+        <w:rPr>
+          <w:rFonts w:ascii="Calibri" w:hAnsi="Calibri" w:cs="Calibri"/>
+          <w:sz w:val="24"/>
+          <w:szCs w:val="24"/>
+        </w:rPr>
+        <w:t xml:space="preserve"> pilot burner and UV Sensor. </w:t>
+      </w:r>
+    </w:p>
     <w:p>
       <w:pPr>
         <w:spacing w:before="280" w:after="80"/>

</xml_diff>

<commit_message>
feat: gas-train supply pressure is fuel-specific - NG 2.1 bar, others 1000 mm
Templatized the pressure clause ({{ pressure_clause }}); NG keeps 'Pressure at
TOP 2.1 bar and minimum pressure as 1 bar is considered.', all other gas fuels
get 'Pressure at 1000 mm is considered.'

Co-Authored-By: Claude Opus 4.8 (1M context) <noreply@anthropic.com>
</commit_message>
<xml_diff>
--- a/Regen_Offer_Template.docx
+++ b/Regen_Offer_Template.docx
@@ -2473,7 +2473,7 @@
           <w:b/>
           <w:bCs/>
         </w:rPr>
-        <w:t>Pressure</w:t>
+        <w:t>{{ pressure_clause }}</w:t>
       </w:r>
       <w:r>
         <w:rPr>
@@ -2481,7 +2481,6 @@
           <w:b/>
           <w:bCs/>
         </w:rPr>
-        <w:t xml:space="preserve"> at TOP</w:t>
       </w:r>
       <w:r>
         <w:rPr>
@@ -2489,7 +2488,6 @@
           <w:b/>
           <w:bCs/>
         </w:rPr>
-        <w:t xml:space="preserve"> </w:t>
       </w:r>
       <w:r>
         <w:rPr>
@@ -2497,7 +2495,6 @@
           <w:b/>
           <w:bCs/>
         </w:rPr>
-        <w:t xml:space="preserve">2.1 bar and </w:t>
       </w:r>
       <w:r>
         <w:rPr>
@@ -2505,7 +2502,6 @@
           <w:b/>
           <w:bCs/>
         </w:rPr>
-        <w:t>m</w:t>
       </w:r>
       <w:r>
         <w:rPr>
@@ -2513,7 +2509,6 @@
           <w:b/>
           <w:bCs/>
         </w:rPr>
-        <w:t>inimum pressure as 1 bar is considered.</w:t>
       </w:r>
     </w:p>
     <w:p>

</xml_diff>

<commit_message>
style: uniform section headings (Calibri 15pt bold 1F2937) matching NG GAS TRAIN
Normalized the off headings — burner intro (ENCON REGENERATIVE ... BURNERS),
PART-A/B, MAKE LIST, ELECTRICAL CONTROL PANEL — to the same size/color/font as
the gas-train heading. Both templates. Diagram caption 'PART OF REGENERATIVE
BURNER' left as-is.

Co-Authored-By: Claude Opus 4.8 (1M context) <noreply@anthropic.com>
</commit_message>
<xml_diff>
--- a/Regen_Offer_Template.docx
+++ b/Regen_Offer_Template.docx
@@ -827,27 +827,32 @@
       </w:pPr>
       <w:r>
         <w:rPr>
-          <w:b/>
-          <w:bCs/>
-        </w:rPr>
-        <w:br w:type="page"/>
-      </w:r>
-      <w:r>
-        <w:rPr>
-          <w:rFonts w:ascii="Calibri" w:hAnsi="Calibri" w:cs="Calibri"/>
+          <w:rFonts w:ascii="Calibri" w:hAnsi="Calibri"/>
           <w:b/>
           <w:bCs/>
           <w:color w:val="1F2937"/>
           <w:sz w:val="30"/>
         </w:rPr>
-        <w:t>PART</w:t>
+        <w:br w:type="page"/>
       </w:r>
       <w:r>
         <w:rPr>
           <w:rFonts w:ascii="Calibri" w:hAnsi="Calibri" w:cs="Calibri"/>
           <w:b/>
           <w:bCs/>
+          <w:color w:val="1F2937"/>
+          <w:sz w:val="30"/>
+        </w:rPr>
+        <w:t>PART</w:t>
+      </w:r>
+      <w:r>
+        <w:rPr>
+          <w:rFonts w:ascii="Calibri" w:hAnsi="Calibri" w:cs="Calibri"/>
+          <w:b/>
+          <w:bCs/>
+          <w:color w:val="1F2937"/>
           <w:spacing w:val="-2"/>
+          <w:sz w:val="30"/>
         </w:rPr>
         <w:t xml:space="preserve"> </w:t>
       </w:r>
@@ -2197,32 +2202,49 @@
         <w:rPr>
           <w:rFonts w:ascii="Calibri" w:hAnsi="Calibri" w:cs="Calibri"/>
           <w:b/>
+          <w:color w:val="1F2937"/>
+          <w:sz w:val="30"/>
         </w:rPr>
         <w:t>ENCON REGENERATIVE {{ fuel_word }} BURNERS – {{ burner_count }}</w:t>
       </w:r>
       <w:r>
         <w:rPr>
+          <w:rFonts w:ascii="Calibri" w:hAnsi="Calibri"/>
           <w:b/>
-        </w:rPr>
-      </w:r>
-      <w:r>
-        <w:rPr>
+          <w:color w:val="1F2937"/>
+          <w:sz w:val="30"/>
+        </w:rPr>
+      </w:r>
+      <w:r>
+        <w:rPr>
+          <w:rFonts w:ascii="Calibri" w:hAnsi="Calibri"/>
           <w:b/>
-        </w:rPr>
-      </w:r>
-      <w:r>
-        <w:rPr>
+          <w:color w:val="1F2937"/>
+          <w:sz w:val="30"/>
+        </w:rPr>
+      </w:r>
+      <w:r>
+        <w:rPr>
+          <w:rFonts w:ascii="Calibri" w:hAnsi="Calibri"/>
           <w:b/>
-        </w:rPr>
-      </w:r>
-      <w:r>
-        <w:rPr>
+          <w:color w:val="1F2937"/>
+          <w:sz w:val="30"/>
+        </w:rPr>
+      </w:r>
+      <w:r>
+        <w:rPr>
+          <w:rFonts w:ascii="Calibri" w:hAnsi="Calibri"/>
           <w:b/>
-        </w:rPr>
-      </w:r>
-      <w:r>
-        <w:rPr>
+          <w:color w:val="1F2937"/>
+          <w:sz w:val="30"/>
+        </w:rPr>
+      </w:r>
+      <w:r>
+        <w:rPr>
+          <w:rFonts w:ascii="Calibri" w:hAnsi="Calibri"/>
           <w:b/>
+          <w:color w:val="1F2937"/>
+          <w:sz w:val="30"/>
         </w:rPr>
       </w:r>
     </w:p>
@@ -4250,7 +4272,9 @@
       <w:r>
         <w:rPr>
           <w:rFonts w:ascii="Calibri" w:hAnsi="Calibri" w:cs="Calibri"/>
-          <w:color w:val="000000"/>
+          <w:b/>
+          <w:color w:val="1F2937"/>
+          <w:sz w:val="30"/>
         </w:rPr>
         <w:t>ELECTRICAL CONTROL PANEL</w:t>
       </w:r>
@@ -9850,9 +9874,12 @@
       </w:pPr>
       <w:r>
         <w:rPr>
+          <w:rFonts w:ascii="Calibri" w:hAnsi="Calibri"/>
           <w:b/>
           <w:bCs/>
+          <w:color w:val="1F2937"/>
           <w:spacing w:val="-3"/>
+          <w:sz w:val="30"/>
         </w:rPr>
         <w:br w:type="page"/>
       </w:r>

</xml_diff>

<commit_message>
fix: remove empty pages + PART-B; left-align PRICE SCHEDULE; tighten cover letter
- Removed empty paragraphs that carried stray page breaks (they produced blank
  header-only pages); PART-A's page break kept.
- Removed the PART - B heading from all regen offers.
- Left-aligned the PRICE SCHEDULE heading.
- Zeroed all cover-letter paragraph spacing (single line spacing, no gaps).
Both gas + oil templates.

Co-Authored-By: Claude Opus 4.8 (1M context) <noreply@anthropic.com>
</commit_message>
<xml_diff>
--- a/Regen_Offer_Template.docx
+++ b/Regen_Offer_Template.docx
@@ -439,7 +439,7 @@
     </w:p>
     <w:p>
       <w:pPr>
-        <w:spacing w:after="60" w:before="120" w:line="269" w:lineRule="auto"/>
+        <w:spacing w:after="0" w:before="0" w:line="240" w:lineRule="auto"/>
         <w:jc w:val="left"/>
       </w:pPr>
       <w:r>
@@ -451,7 +451,7 @@
     </w:p>
     <w:p>
       <w:pPr>
-        <w:spacing w:after="60" w:before="0"/>
+        <w:spacing w:after="0" w:before="0" w:line="240" w:lineRule="auto"/>
       </w:pPr>
       <w:r>
         <w:rPr>
@@ -467,7 +467,7 @@
     </w:p>
     <w:p>
       <w:pPr>
-        <w:spacing w:after="60" w:before="60" w:line="269" w:lineRule="auto"/>
+        <w:spacing w:after="0" w:before="0" w:line="240" w:lineRule="auto"/>
         <w:jc w:val="left"/>
       </w:pPr>
       <w:r>
@@ -480,7 +480,7 @@
     </w:p>
     <w:p>
       <w:pPr>
-        <w:spacing w:after="60" w:before="0" w:line="269" w:lineRule="auto"/>
+        <w:spacing w:after="0" w:before="0" w:line="240" w:lineRule="auto"/>
         <w:jc w:val="left"/>
       </w:pPr>
       <w:r>
@@ -492,7 +492,7 @@
     </w:p>
     <w:p>
       <w:pPr>
-        <w:spacing w:after="60" w:before="0" w:line="269" w:lineRule="auto"/>
+        <w:spacing w:after="0" w:before="0" w:line="240" w:lineRule="auto"/>
         <w:jc w:val="left"/>
       </w:pPr>
       <w:r>
@@ -504,7 +504,7 @@
     </w:p>
     <w:p>
       <w:pPr>
-        <w:spacing w:after="200" w:before="0" w:line="269" w:lineRule="auto"/>
+        <w:spacing w:after="0" w:before="0" w:line="240" w:lineRule="auto"/>
         <w:jc w:val="left"/>
       </w:pPr>
       <w:r>
@@ -521,6 +521,7 @@
         <w:tabs>
           <w:tab w:pos="4896" w:val="left"/>
         </w:tabs>
+        <w:spacing w:before="0" w:after="0" w:line="240" w:lineRule="auto"/>
       </w:pPr>
       <w:r>
         <w:rPr>
@@ -547,6 +548,7 @@
         <w:tabs>
           <w:tab w:pos="4896" w:val="left"/>
         </w:tabs>
+        <w:spacing w:before="0" w:after="0" w:line="240" w:lineRule="auto"/>
       </w:pPr>
       <w:r>
         <w:rPr>
@@ -570,7 +572,7 @@
     </w:p>
     <w:p>
       <w:pPr>
-        <w:spacing w:after="200" w:before="120"/>
+        <w:spacing w:after="0" w:before="0" w:line="240" w:lineRule="auto"/>
       </w:pPr>
       <w:r>
         <w:rPr>
@@ -595,7 +597,7 @@
     </w:p>
     <w:p>
       <w:pPr>
-        <w:spacing w:after="160" w:before="120" w:line="269" w:lineRule="auto"/>
+        <w:spacing w:after="0" w:before="0" w:line="240" w:lineRule="auto"/>
         <w:jc w:val="left"/>
       </w:pPr>
       <w:r>
@@ -607,7 +609,7 @@
     </w:p>
     <w:p>
       <w:pPr>
-        <w:spacing w:after="160" w:before="0" w:line="269" w:lineRule="auto"/>
+        <w:spacing w:after="0" w:before="0" w:line="240" w:lineRule="auto"/>
         <w:jc w:val="left"/>
       </w:pPr>
       <w:r>
@@ -633,7 +635,7 @@
     </w:p>
     <w:p>
       <w:pPr>
-        <w:spacing w:after="160" w:before="0" w:line="269" w:lineRule="auto"/>
+        <w:spacing w:after="0" w:before="0" w:line="240" w:lineRule="auto"/>
         <w:jc w:val="left"/>
       </w:pPr>
       <w:r>
@@ -645,7 +647,7 @@
     </w:p>
     <w:p>
       <w:pPr>
-        <w:spacing w:after="200" w:before="0" w:line="269" w:lineRule="auto"/>
+        <w:spacing w:after="0" w:before="0" w:line="240" w:lineRule="auto"/>
         <w:jc w:val="left"/>
       </w:pPr>
       <w:r>
@@ -657,7 +659,7 @@
     </w:p>
     <w:p>
       <w:pPr>
-        <w:spacing w:after="40" w:before="0" w:line="269" w:lineRule="auto"/>
+        <w:spacing w:after="0" w:before="0" w:line="240" w:lineRule="auto"/>
         <w:jc w:val="left"/>
       </w:pPr>
       <w:r>
@@ -669,7 +671,7 @@
     </w:p>
     <w:p>
       <w:pPr>
-        <w:spacing w:after="0" w:before="240"/>
+        <w:spacing w:after="0" w:before="0" w:line="240" w:lineRule="auto"/>
       </w:pPr>
       <w:r>
         <w:rPr>
@@ -685,7 +687,7 @@
     </w:p>
     <w:p>
       <w:pPr>
-        <w:spacing w:after="60" w:before="0" w:line="269" w:lineRule="auto"/>
+        <w:spacing w:after="0" w:before="0" w:line="240" w:lineRule="auto"/>
         <w:jc w:val="left"/>
       </w:pPr>
       <w:r>
@@ -697,6 +699,7 @@
     </w:p>
     <w:p>
       <w:pPr>
+        <w:spacing w:before="0" w:after="0" w:line="240" w:lineRule="auto"/>
         <w:jc w:val="left"/>
       </w:pPr>
       <w:r>
@@ -711,7 +714,7 @@
     </w:p>
     <w:p>
       <w:pPr>
-        <w:spacing w:after="0" w:before="0" w:line="269" w:lineRule="auto"/>
+        <w:spacing w:after="0" w:before="0" w:line="240" w:lineRule="auto"/>
         <w:jc w:val="left"/>
       </w:pPr>
       <w:r>
@@ -725,7 +728,7 @@
     </w:p>
     <w:p>
       <w:pPr>
-        <w:spacing w:after="200" w:before="0" w:line="269" w:lineRule="auto"/>
+        <w:spacing w:after="0" w:before="0" w:line="240" w:lineRule="auto"/>
         <w:jc w:val="left"/>
       </w:pPr>
       <w:r>
@@ -747,6 +750,7 @@
     </w:p>
     <w:p>
       <w:pPr>
+        <w:spacing w:before="0" w:after="0" w:line="240" w:lineRule="auto"/>
         <w:jc w:val="left"/>
       </w:pPr>
       <w:r>
@@ -4531,42 +4535,6 @@
     </w:tbl>
     <w:p>
       <w:pPr>
-        <w:rPr>
-          <w:b/>
-          <w:bCs/>
-          <w:color w:val="000000"/>
-          <w:u w:val="single"/>
-          <w:lang w:val="en-US" w:eastAsia="en-US" w:bidi="ar-SA"/>
-        </w:rPr>
-      </w:pPr>
-      <w:r>
-        <w:rPr>
-          <w:color w:val="000000"/>
-        </w:rPr>
-        <w:br w:type="page"/>
-      </w:r>
-    </w:p>
-    <w:p>
-      <w:pPr>
-        <w:spacing w:before="280" w:after="80"/>
-        <w:jc w:val="left"/>
-        <w:rPr>
-          <w:b/>
-          <w:bCs/>
-          <w:u w:val="single"/>
-        </w:rPr>
-      </w:pPr>
-      <w:r>
-        <w:rPr>
-          <w:b/>
-          <w:bCs/>
-          <w:spacing w:val="-3"/>
-        </w:rPr>
-        <w:br w:type="page"/>
-      </w:r>
-    </w:p>
-    <w:p>
-      <w:pPr>
         <w:pStyle w:val="NoSpacing"/>
         <w:spacing w:before="280" w:after="80"/>
         <w:rPr>
@@ -12269,77 +12237,9 @@
     </w:tbl>
     <w:p>
       <w:pPr>
-        <w:rPr>
-          <w:rFonts w:eastAsiaTheme="minorHAnsi"/>
-          <w:b/>
-          <w:bCs/>
-          <w:spacing w:val="-3"/>
-          <w:lang w:val="en-US" w:eastAsia="en-US" w:bidi="ar-SA"/>
-        </w:rPr>
-      </w:pPr>
-      <w:r>
-        <w:rPr>
-          <w:b/>
-          <w:bCs/>
-          <w:spacing w:val="-3"/>
-        </w:rPr>
-        <w:br w:type="page"/>
-      </w:r>
-    </w:p>
-    <w:p>
-      <w:pPr>
         <w:pStyle w:val="NoSpacing"/>
         <w:spacing w:before="280" w:after="80"/>
-        <w:jc w:val="center"/>
-        <w:rPr>
-          <w:rFonts w:ascii="Times New Roman" w:hAnsi="Times New Roman" w:cs="Times New Roman"/>
-          <w:b/>
-          <w:bCs/>
-          <w:sz w:val="24"/>
-          <w:szCs w:val="24"/>
-        </w:rPr>
-      </w:pPr>
-      <w:r>
-        <w:rPr>
-          <w:rFonts w:ascii="Calibri" w:hAnsi="Calibri" w:cs="Calibri"/>
-          <w:b/>
-          <w:bCs/>
-          <w:color w:val="1F2937"/>
-          <w:spacing w:val="-3"/>
-          <w:sz w:val="30"/>
-          <w:szCs w:val="24"/>
-        </w:rPr>
-        <w:t>P</w:t>
-      </w:r>
-      <w:r>
-        <w:rPr>
-          <w:rFonts w:ascii="Calibri" w:hAnsi="Calibri" w:cs="Calibri"/>
-          <w:b/>
-          <w:bCs/>
-          <w:color w:val="1F2937"/>
-          <w:spacing w:val="2"/>
-          <w:sz w:val="30"/>
-          <w:szCs w:val="24"/>
-        </w:rPr>
-        <w:t>A</w:t>
-      </w:r>
-      <w:r>
-        <w:rPr>
-          <w:rFonts w:ascii="Calibri" w:hAnsi="Calibri" w:cs="Calibri"/>
-          <w:b/>
-          <w:bCs/>
-          <w:color w:val="1F2937"/>
-          <w:sz w:val="30"/>
-          <w:szCs w:val="24"/>
-        </w:rPr>
-        <w:t xml:space="preserve">RT – B </w:t>
-      </w:r>
-    </w:p>
-    <w:p>
-      <w:pPr>
-        <w:pStyle w:val="NoSpacing"/>
-        <w:spacing w:before="280" w:after="80"/>
-        <w:jc w:val="center"/>
+        <w:jc w:val="left"/>
         <w:rPr>
           <w:rFonts w:ascii="Times New Roman" w:hAnsi="Times New Roman" w:cs="Times New Roman"/>
           <w:b/>

</xml_diff>

<commit_message>
style: drop '(Flameless nozzle is not included)' from burner diagram caption
Caption now reads 'PART OF REGENERATIVE BURNER' in both templates.

Co-Authored-By: Claude Opus 4.8 (1M context) <noreply@anthropic.com>
</commit_message>
<xml_diff>
--- a/Regen_Offer_Template.docx
+++ b/Regen_Offer_Template.docx
@@ -2102,97 +2102,31 @@
           <w:noProof/>
           <w:lang w:val="en-US" w:eastAsia="en-US"/>
         </w:rPr>
-        <w:drawing>
-          <wp:anchor distT="0" distB="0" distL="114300" distR="114300" simplePos="0" relativeHeight="251659264" behindDoc="1" locked="0" layoutInCell="1" allowOverlap="1" wp14:anchorId="20706207" wp14:editId="41F53874">
-            <wp:simplePos x="0" y="0"/>
-            <wp:positionH relativeFrom="page">
-              <wp:align>center</wp:align>
-            </wp:positionH>
-            <wp:positionV relativeFrom="paragraph">
-              <wp:posOffset>274955</wp:posOffset>
-            </wp:positionV>
-            <wp:extent cx="7032625" cy="3810000"/>
-            <wp:effectExtent l="0" t="0" r="0" b="0"/>
-            <wp:wrapTight wrapText="bothSides">
-              <wp:wrapPolygon edited="0">
-                <wp:start x="0" y="0"/>
-                <wp:lineTo x="0" y="21492"/>
-                <wp:lineTo x="21532" y="21492"/>
-                <wp:lineTo x="21532" y="0"/>
-                <wp:lineTo x="0" y="0"/>
-              </wp:wrapPolygon>
-            </wp:wrapTight>
-            <wp:docPr id="4" name="Picture 5" descr="A close up of a device&#10;&#10;Description automatically generated"/>
-            <wp:cNvGraphicFramePr>
-              <a:graphicFrameLocks xmlns:a="http://schemas.openxmlformats.org/drawingml/2006/main" noChangeAspect="1"/>
-            </wp:cNvGraphicFramePr>
-            <a:graphic xmlns:a="http://schemas.openxmlformats.org/drawingml/2006/main">
-              <a:graphicData uri="http://schemas.openxmlformats.org/drawingml/2006/picture">
-                <pic:pic xmlns:pic="http://schemas.openxmlformats.org/drawingml/2006/picture">
-                  <pic:nvPicPr>
-                    <pic:cNvPr id="4" name="Image 07-03-20 at 3.28 PM.jpg"/>
-                    <pic:cNvPicPr/>
-                  </pic:nvPicPr>
-                  <pic:blipFill>
-                    <a:blip r:embed="rId19">
-                      <a:extLst>
-                        <a:ext uri="{28A0092B-C50C-407E-A947-70E740481C1C}">
-                          <a14:useLocalDpi xmlns:a14="http://schemas.microsoft.com/office/drawing/2010/main" val="0"/>
-                        </a:ext>
-                      </a:extLst>
-                    </a:blip>
-                    <a:stretch>
-                      <a:fillRect/>
-                    </a:stretch>
-                  </pic:blipFill>
-                  <pic:spPr>
-                    <a:xfrm>
-                      <a:off x="0" y="0"/>
-                      <a:ext cx="7032625" cy="3810000"/>
-                    </a:xfrm>
-                    <a:prstGeom prst="rect">
-                      <a:avLst/>
-                    </a:prstGeom>
-                  </pic:spPr>
-                </pic:pic>
-              </a:graphicData>
-            </a:graphic>
-            <wp14:sizeRelH relativeFrom="page">
-              <wp14:pctWidth>0</wp14:pctWidth>
-            </wp14:sizeRelH>
-            <wp14:sizeRelV relativeFrom="page">
-              <wp14:pctHeight>0</wp14:pctHeight>
-            </wp14:sizeRelV>
-          </wp:anchor>
-        </w:drawing>
+        <w:t>PART OF REGENERATIVE BURNER</w:t>
       </w:r>
       <w:r>
         <w:rPr>
           <w:rFonts w:ascii="Calibri" w:hAnsi="Calibri" w:cs="Calibri"/>
           <w:b/>
         </w:rPr>
-        <w:t>PART OF REGENERATIVE BURNER</w:t>
       </w:r>
       <w:r>
         <w:rPr>
           <w:rFonts w:ascii="Calibri" w:hAnsi="Calibri" w:cs="Calibri"/>
           <w:bCs/>
         </w:rPr>
-        <w:t xml:space="preserve"> (</w:t>
       </w:r>
       <w:r>
         <w:rPr>
           <w:rFonts w:ascii="Calibri" w:hAnsi="Calibri" w:cs="Calibri"/>
           <w:bCs/>
         </w:rPr>
-        <w:t>F</w:t>
       </w:r>
       <w:r>
         <w:rPr>
           <w:rFonts w:ascii="Calibri" w:hAnsi="Calibri" w:cs="Calibri"/>
           <w:bCs/>
         </w:rPr>
-        <w:t>lameless nozzle is not included)</w:t>
       </w:r>
     </w:p>
     <w:p>

</xml_diff>

<commit_message>
feat(regen offer): add Client Details + Marketing Person tables after Energy Saving
Cloned the vertical offer's two tables (CLIENT DETAILS: Company/Contact Person/
Designation/Contact No./Email; MARKETING PERSON DETAILS: Name/Email/Contact No.)
into both regen templates (gas + oil), inserted right after the Energy Saving
savings table (before 'PART OF REGENERATIVE BURNER'). Placeholders fill from the
shared writer's customer context. Verified end-to-end.

Co-Authored-By: Claude Opus 4.8 (1M context) <noreply@anthropic.com>
</commit_message>
<xml_diff>
--- a/Regen_Offer_Template.docx
+++ b/Regen_Offer_Template.docx
@@ -2084,6 +2084,586 @@
                 <w:sz w:val="24"/>
               </w:rPr>
               <w:t>23.1%</w:t>
+            </w:r>
+          </w:p>
+        </w:tc>
+      </w:tr>
+    </w:tbl>
+    <w:p>
+      <w:pPr>
+        <w:pStyle w:val="Heading3"/>
+        <w:spacing w:after="80" w:before="200"/>
+      </w:pPr>
+      <w:r>
+        <w:rPr>
+          <w:rFonts w:ascii="Calibri" w:cs="Calibri" w:eastAsia="Calibri" w:hAnsi="Calibri"/>
+          <w:b/>
+          <w:bCs/>
+          <w:color w:val="1F2937"/>
+          <w:sz w:val="22"/>
+          <w:szCs w:val="22"/>
+        </w:rPr>
+        <w:t>CLIENT DETAILS</w:t>
+      </w:r>
+    </w:p>
+    <w:tbl>
+      <w:tblPr>
+        <w:tblW w:type="dxa" w:w="9360"/>
+        <w:tblBorders>
+          <w:top w:val="single" w:color="auto" w:sz="4"/>
+          <w:left w:val="single" w:color="auto" w:sz="4"/>
+          <w:bottom w:val="single" w:color="auto" w:sz="4"/>
+          <w:right w:val="single" w:color="auto" w:sz="4"/>
+          <w:insideH w:val="single" w:color="auto" w:sz="4"/>
+          <w:insideV w:val="single" w:color="auto" w:sz="4"/>
+        </w:tblBorders>
+      </w:tblPr>
+      <w:tblGrid>
+        <w:gridCol w:w="3120"/>
+        <w:gridCol w:w="6240"/>
+      </w:tblGrid>
+      <w:tr>
+        <w:tc>
+          <w:tcPr>
+            <w:tcW w:type="dxa" w:w="3120"/>
+            <w:tcBorders>
+              <w:top w:val="single" w:color="BFBFBF" w:sz="4"/>
+              <w:left w:val="single" w:color="BFBFBF" w:sz="4"/>
+              <w:bottom w:val="single" w:color="BFBFBF" w:sz="4"/>
+              <w:right w:val="single" w:color="BFBFBF" w:sz="4"/>
+            </w:tcBorders>
+            <w:shd w:fill="F3F4F6" w:val="clear"/>
+            <w:tcMar>
+              <w:top w:type="dxa" w:w="100"/>
+              <w:left w:type="dxa" w:w="140"/>
+              <w:bottom w:type="dxa" w:w="100"/>
+              <w:right w:type="dxa" w:w="140"/>
+            </w:tcMar>
+            <w:vAlign w:val="center"/>
+          </w:tcPr>
+          <w:p>
+            <w:pPr>
+              <w:spacing w:after="40" w:before="40"/>
+              <w:jc w:val="left"/>
+            </w:pPr>
+            <w:r>
+              <w:rPr>
+                <w:rFonts w:ascii="Calibri" w:cs="Calibri" w:eastAsia="Calibri" w:hAnsi="Calibri"/>
+                <w:b/>
+                <w:bCs/>
+                <w:sz w:val="22"/>
+                <w:szCs w:val="22"/>
+              </w:rPr>
+              <w:t xml:space="preserve">Company</w:t>
+            </w:r>
+          </w:p>
+        </w:tc>
+        <w:tc>
+          <w:tcPr>
+            <w:tcW w:type="dxa" w:w="6240"/>
+            <w:tcBorders>
+              <w:top w:val="single" w:color="BFBFBF" w:sz="4"/>
+              <w:left w:val="single" w:color="BFBFBF" w:sz="4"/>
+              <w:bottom w:val="single" w:color="BFBFBF" w:sz="4"/>
+              <w:right w:val="single" w:color="BFBFBF" w:sz="4"/>
+            </w:tcBorders>
+            <w:tcMar>
+              <w:top w:type="dxa" w:w="100"/>
+              <w:left w:type="dxa" w:w="140"/>
+              <w:bottom w:type="dxa" w:w="100"/>
+              <w:right w:type="dxa" w:w="140"/>
+            </w:tcMar>
+            <w:vAlign w:val="center"/>
+          </w:tcPr>
+          <w:p>
+            <w:pPr>
+              <w:spacing w:after="40" w:before="40"/>
+              <w:jc w:val="left"/>
+            </w:pPr>
+            <w:r>
+              <w:t>{{company_name}}</w:t>
+            </w:r>
+          </w:p>
+        </w:tc>
+      </w:tr>
+      <w:tr>
+        <w:tc>
+          <w:tcPr>
+            <w:tcW w:type="dxa" w:w="3120"/>
+            <w:tcBorders>
+              <w:top w:val="single" w:color="BFBFBF" w:sz="4"/>
+              <w:left w:val="single" w:color="BFBFBF" w:sz="4"/>
+              <w:bottom w:val="single" w:color="BFBFBF" w:sz="4"/>
+              <w:right w:val="single" w:color="BFBFBF" w:sz="4"/>
+            </w:tcBorders>
+            <w:shd w:fill="F3F4F6" w:val="clear"/>
+            <w:tcMar>
+              <w:top w:type="dxa" w:w="100"/>
+              <w:left w:type="dxa" w:w="140"/>
+              <w:bottom w:type="dxa" w:w="100"/>
+              <w:right w:type="dxa" w:w="140"/>
+            </w:tcMar>
+            <w:vAlign w:val="center"/>
+          </w:tcPr>
+          <w:p>
+            <w:pPr>
+              <w:spacing w:after="40" w:before="40"/>
+              <w:jc w:val="left"/>
+            </w:pPr>
+            <w:r>
+              <w:rPr>
+                <w:rFonts w:ascii="Calibri" w:cs="Calibri" w:eastAsia="Calibri" w:hAnsi="Calibri"/>
+                <w:b/>
+                <w:bCs/>
+                <w:sz w:val="22"/>
+                <w:szCs w:val="22"/>
+              </w:rPr>
+              <w:t xml:space="preserve">Contact Person</w:t>
+            </w:r>
+          </w:p>
+        </w:tc>
+        <w:tc>
+          <w:tcPr>
+            <w:tcW w:type="dxa" w:w="6240"/>
+            <w:tcBorders>
+              <w:top w:val="single" w:color="BFBFBF" w:sz="4"/>
+              <w:left w:val="single" w:color="BFBFBF" w:sz="4"/>
+              <w:bottom w:val="single" w:color="BFBFBF" w:sz="4"/>
+              <w:right w:val="single" w:color="BFBFBF" w:sz="4"/>
+            </w:tcBorders>
+            <w:tcMar>
+              <w:top w:type="dxa" w:w="100"/>
+              <w:left w:type="dxa" w:w="140"/>
+              <w:bottom w:type="dxa" w:w="100"/>
+              <w:right w:type="dxa" w:w="140"/>
+            </w:tcMar>
+            <w:vAlign w:val="center"/>
+          </w:tcPr>
+          <w:p>
+            <w:pPr>
+              <w:spacing w:after="40" w:before="40"/>
+              <w:jc w:val="left"/>
+            </w:pPr>
+            <w:r>
+              <w:t>{{poc_name}}</w:t>
+            </w:r>
+          </w:p>
+        </w:tc>
+      </w:tr>
+      <w:tr>
+        <w:tc>
+          <w:tcPr>
+            <w:tcW w:type="dxa" w:w="3120"/>
+            <w:tcBorders>
+              <w:top w:val="single" w:color="BFBFBF" w:sz="4"/>
+              <w:left w:val="single" w:color="BFBFBF" w:sz="4"/>
+              <w:bottom w:val="single" w:color="BFBFBF" w:sz="4"/>
+              <w:right w:val="single" w:color="BFBFBF" w:sz="4"/>
+            </w:tcBorders>
+            <w:shd w:fill="F3F4F6" w:val="clear"/>
+            <w:tcMar>
+              <w:top w:type="dxa" w:w="100"/>
+              <w:left w:type="dxa" w:w="140"/>
+              <w:bottom w:type="dxa" w:w="100"/>
+              <w:right w:type="dxa" w:w="140"/>
+            </w:tcMar>
+            <w:vAlign w:val="center"/>
+          </w:tcPr>
+          <w:p>
+            <w:pPr>
+              <w:spacing w:after="40" w:before="40"/>
+              <w:jc w:val="left"/>
+            </w:pPr>
+            <w:r>
+              <w:rPr>
+                <w:rFonts w:ascii="Calibri" w:cs="Calibri" w:eastAsia="Calibri" w:hAnsi="Calibri"/>
+                <w:b/>
+                <w:bCs/>
+                <w:sz w:val="22"/>
+                <w:szCs w:val="22"/>
+              </w:rPr>
+              <w:t xml:space="preserve">Designation</w:t>
+            </w:r>
+          </w:p>
+        </w:tc>
+        <w:tc>
+          <w:tcPr>
+            <w:tcW w:type="dxa" w:w="6240"/>
+            <w:tcBorders>
+              <w:top w:val="single" w:color="BFBFBF" w:sz="4"/>
+              <w:left w:val="single" w:color="BFBFBF" w:sz="4"/>
+              <w:bottom w:val="single" w:color="BFBFBF" w:sz="4"/>
+              <w:right w:val="single" w:color="BFBFBF" w:sz="4"/>
+            </w:tcBorders>
+            <w:tcMar>
+              <w:top w:type="dxa" w:w="100"/>
+              <w:left w:type="dxa" w:w="140"/>
+              <w:bottom w:type="dxa" w:w="100"/>
+              <w:right w:type="dxa" w:w="140"/>
+            </w:tcMar>
+            <w:vAlign w:val="center"/>
+          </w:tcPr>
+          <w:p>
+            <w:pPr>
+              <w:spacing w:after="40" w:before="40"/>
+              <w:jc w:val="left"/>
+            </w:pPr>
+            <w:r>
+              <w:t>{{poc_designation}}</w:t>
+            </w:r>
+          </w:p>
+        </w:tc>
+      </w:tr>
+      <w:tr>
+        <w:tc>
+          <w:tcPr>
+            <w:tcW w:type="dxa" w:w="3120"/>
+            <w:tcBorders>
+              <w:top w:val="single" w:color="BFBFBF" w:sz="4"/>
+              <w:left w:val="single" w:color="BFBFBF" w:sz="4"/>
+              <w:bottom w:val="single" w:color="BFBFBF" w:sz="4"/>
+              <w:right w:val="single" w:color="BFBFBF" w:sz="4"/>
+            </w:tcBorders>
+            <w:shd w:fill="F3F4F6" w:val="clear"/>
+            <w:tcMar>
+              <w:top w:type="dxa" w:w="100"/>
+              <w:left w:type="dxa" w:w="140"/>
+              <w:bottom w:type="dxa" w:w="100"/>
+              <w:right w:type="dxa" w:w="140"/>
+            </w:tcMar>
+            <w:vAlign w:val="center"/>
+          </w:tcPr>
+          <w:p>
+            <w:pPr>
+              <w:spacing w:after="40" w:before="40"/>
+              <w:jc w:val="left"/>
+            </w:pPr>
+            <w:r>
+              <w:rPr>
+                <w:rFonts w:ascii="Calibri" w:cs="Calibri" w:eastAsia="Calibri" w:hAnsi="Calibri"/>
+                <w:b/>
+                <w:bCs/>
+                <w:sz w:val="22"/>
+                <w:szCs w:val="22"/>
+              </w:rPr>
+              <w:t xml:space="preserve">Contact No.</w:t>
+            </w:r>
+          </w:p>
+        </w:tc>
+        <w:tc>
+          <w:tcPr>
+            <w:tcW w:type="dxa" w:w="6240"/>
+            <w:tcBorders>
+              <w:top w:val="single" w:color="BFBFBF" w:sz="4"/>
+              <w:left w:val="single" w:color="BFBFBF" w:sz="4"/>
+              <w:bottom w:val="single" w:color="BFBFBF" w:sz="4"/>
+              <w:right w:val="single" w:color="BFBFBF" w:sz="4"/>
+            </w:tcBorders>
+            <w:tcMar>
+              <w:top w:type="dxa" w:w="100"/>
+              <w:left w:type="dxa" w:w="140"/>
+              <w:bottom w:type="dxa" w:w="100"/>
+              <w:right w:type="dxa" w:w="140"/>
+            </w:tcMar>
+            <w:vAlign w:val="center"/>
+          </w:tcPr>
+          <w:p>
+            <w:pPr>
+              <w:spacing w:after="40" w:before="40"/>
+              <w:jc w:val="left"/>
+            </w:pPr>
+            <w:r>
+              <w:t>{{mobile_no}}</w:t>
+            </w:r>
+          </w:p>
+        </w:tc>
+      </w:tr>
+      <w:tr>
+        <w:tc>
+          <w:tcPr>
+            <w:tcW w:type="dxa" w:w="3120"/>
+            <w:tcBorders>
+              <w:top w:val="single" w:color="BFBFBF" w:sz="4"/>
+              <w:left w:val="single" w:color="BFBFBF" w:sz="4"/>
+              <w:bottom w:val="single" w:color="BFBFBF" w:sz="4"/>
+              <w:right w:val="single" w:color="BFBFBF" w:sz="4"/>
+            </w:tcBorders>
+            <w:shd w:fill="F3F4F6" w:val="clear"/>
+            <w:tcMar>
+              <w:top w:type="dxa" w:w="100"/>
+              <w:left w:type="dxa" w:w="140"/>
+              <w:bottom w:type="dxa" w:w="100"/>
+              <w:right w:type="dxa" w:w="140"/>
+            </w:tcMar>
+            <w:vAlign w:val="center"/>
+          </w:tcPr>
+          <w:p>
+            <w:pPr>
+              <w:spacing w:after="40" w:before="40"/>
+              <w:jc w:val="left"/>
+            </w:pPr>
+            <w:r>
+              <w:rPr>
+                <w:rFonts w:ascii="Calibri" w:cs="Calibri" w:eastAsia="Calibri" w:hAnsi="Calibri"/>
+                <w:b/>
+                <w:bCs/>
+                <w:sz w:val="22"/>
+                <w:szCs w:val="22"/>
+              </w:rPr>
+              <w:t xml:space="preserve">Email</w:t>
+            </w:r>
+          </w:p>
+        </w:tc>
+        <w:tc>
+          <w:tcPr>
+            <w:tcW w:type="dxa" w:w="6240"/>
+            <w:tcBorders>
+              <w:top w:val="single" w:color="BFBFBF" w:sz="4"/>
+              <w:left w:val="single" w:color="BFBFBF" w:sz="4"/>
+              <w:bottom w:val="single" w:color="BFBFBF" w:sz="4"/>
+              <w:right w:val="single" w:color="BFBFBF" w:sz="4"/>
+            </w:tcBorders>
+            <w:tcMar>
+              <w:top w:type="dxa" w:w="100"/>
+              <w:left w:type="dxa" w:w="140"/>
+              <w:bottom w:type="dxa" w:w="100"/>
+              <w:right w:type="dxa" w:w="140"/>
+            </w:tcMar>
+            <w:vAlign w:val="center"/>
+          </w:tcPr>
+          <w:p>
+            <w:pPr>
+              <w:spacing w:after="40" w:before="40"/>
+              <w:jc w:val="left"/>
+            </w:pPr>
+            <w:r>
+              <w:t>{{email}}</w:t>
+            </w:r>
+          </w:p>
+        </w:tc>
+      </w:tr>
+    </w:tbl>
+    <w:p>
+      <w:pPr>
+        <w:pStyle w:val="Heading3"/>
+        <w:spacing w:after="80" w:before="200"/>
+      </w:pPr>
+      <w:r>
+        <w:rPr>
+          <w:rFonts w:ascii="Calibri" w:cs="Calibri" w:eastAsia="Calibri" w:hAnsi="Calibri"/>
+          <w:b/>
+          <w:bCs/>
+          <w:color w:val="1F2937"/>
+          <w:sz w:val="22"/>
+          <w:szCs w:val="22"/>
+        </w:rPr>
+        <w:t>MARKETING PERSON DETAILS</w:t>
+      </w:r>
+    </w:p>
+    <w:tbl>
+      <w:tblPr>
+        <w:tblW w:type="dxa" w:w="9360"/>
+        <w:tblBorders>
+          <w:top w:val="single" w:color="auto" w:sz="4"/>
+          <w:left w:val="single" w:color="auto" w:sz="4"/>
+          <w:bottom w:val="single" w:color="auto" w:sz="4"/>
+          <w:right w:val="single" w:color="auto" w:sz="4"/>
+          <w:insideH w:val="single" w:color="auto" w:sz="4"/>
+          <w:insideV w:val="single" w:color="auto" w:sz="4"/>
+        </w:tblBorders>
+      </w:tblPr>
+      <w:tblGrid>
+        <w:gridCol w:w="3120"/>
+        <w:gridCol w:w="6240"/>
+      </w:tblGrid>
+      <w:tr>
+        <w:tc>
+          <w:tcPr>
+            <w:tcW w:type="dxa" w:w="3120"/>
+            <w:tcBorders>
+              <w:top w:val="single" w:color="BFBFBF" w:sz="4"/>
+              <w:left w:val="single" w:color="BFBFBF" w:sz="4"/>
+              <w:bottom w:val="single" w:color="BFBFBF" w:sz="4"/>
+              <w:right w:val="single" w:color="BFBFBF" w:sz="4"/>
+            </w:tcBorders>
+            <w:shd w:fill="F3F4F6" w:val="clear"/>
+            <w:tcMar>
+              <w:top w:type="dxa" w:w="100"/>
+              <w:left w:type="dxa" w:w="140"/>
+              <w:bottom w:type="dxa" w:w="100"/>
+              <w:right w:type="dxa" w:w="140"/>
+            </w:tcMar>
+            <w:vAlign w:val="center"/>
+          </w:tcPr>
+          <w:p>
+            <w:pPr>
+              <w:spacing w:after="40" w:before="40"/>
+              <w:jc w:val="left"/>
+            </w:pPr>
+            <w:r>
+              <w:rPr>
+                <w:rFonts w:ascii="Calibri" w:cs="Calibri" w:eastAsia="Calibri" w:hAnsi="Calibri"/>
+                <w:b/>
+                <w:bCs/>
+                <w:sz w:val="22"/>
+                <w:szCs w:val="22"/>
+              </w:rPr>
+              <w:t xml:space="preserve">Name</w:t>
+            </w:r>
+          </w:p>
+        </w:tc>
+        <w:tc>
+          <w:tcPr>
+            <w:tcW w:type="dxa" w:w="6240"/>
+            <w:tcBorders>
+              <w:top w:val="single" w:color="BFBFBF" w:sz="4"/>
+              <w:left w:val="single" w:color="BFBFBF" w:sz="4"/>
+              <w:bottom w:val="single" w:color="BFBFBF" w:sz="4"/>
+              <w:right w:val="single" w:color="BFBFBF" w:sz="4"/>
+            </w:tcBorders>
+            <w:tcMar>
+              <w:top w:type="dxa" w:w="100"/>
+              <w:left w:type="dxa" w:w="140"/>
+              <w:bottom w:type="dxa" w:w="100"/>
+              <w:right w:type="dxa" w:w="140"/>
+            </w:tcMar>
+            <w:vAlign w:val="center"/>
+          </w:tcPr>
+          <w:p>
+            <w:pPr>
+              <w:spacing w:after="40" w:before="40"/>
+              <w:jc w:val="left"/>
+            </w:pPr>
+            <w:r>
+              <w:t>{{marketing_person}}</w:t>
+            </w:r>
+          </w:p>
+        </w:tc>
+      </w:tr>
+      <w:tr>
+        <w:tc>
+          <w:tcPr>
+            <w:tcW w:type="dxa" w:w="3120"/>
+            <w:tcBorders>
+              <w:top w:val="single" w:color="BFBFBF" w:sz="4"/>
+              <w:left w:val="single" w:color="BFBFBF" w:sz="4"/>
+              <w:bottom w:val="single" w:color="BFBFBF" w:sz="4"/>
+              <w:right w:val="single" w:color="BFBFBF" w:sz="4"/>
+            </w:tcBorders>
+            <w:shd w:fill="F3F4F6" w:val="clear"/>
+            <w:tcMar>
+              <w:top w:type="dxa" w:w="100"/>
+              <w:left w:type="dxa" w:w="140"/>
+              <w:bottom w:type="dxa" w:w="100"/>
+              <w:right w:type="dxa" w:w="140"/>
+            </w:tcMar>
+            <w:vAlign w:val="center"/>
+          </w:tcPr>
+          <w:p>
+            <w:pPr>
+              <w:spacing w:after="40" w:before="40"/>
+              <w:jc w:val="left"/>
+            </w:pPr>
+            <w:r>
+              <w:rPr>
+                <w:rFonts w:ascii="Calibri" w:cs="Calibri" w:eastAsia="Calibri" w:hAnsi="Calibri"/>
+                <w:b/>
+                <w:bCs/>
+                <w:sz w:val="22"/>
+                <w:szCs w:val="22"/>
+              </w:rPr>
+              <w:t xml:space="preserve">Email</w:t>
+            </w:r>
+          </w:p>
+        </w:tc>
+        <w:tc>
+          <w:tcPr>
+            <w:tcW w:type="dxa" w:w="6240"/>
+            <w:tcBorders>
+              <w:top w:val="single" w:color="BFBFBF" w:sz="4"/>
+              <w:left w:val="single" w:color="BFBFBF" w:sz="4"/>
+              <w:bottom w:val="single" w:color="BFBFBF" w:sz="4"/>
+              <w:right w:val="single" w:color="BFBFBF" w:sz="4"/>
+            </w:tcBorders>
+            <w:tcMar>
+              <w:top w:type="dxa" w:w="100"/>
+              <w:left w:type="dxa" w:w="140"/>
+              <w:bottom w:type="dxa" w:w="100"/>
+              <w:right w:type="dxa" w:w="140"/>
+            </w:tcMar>
+            <w:vAlign w:val="center"/>
+          </w:tcPr>
+          <w:p>
+            <w:pPr>
+              <w:spacing w:after="40" w:before="40"/>
+              <w:jc w:val="left"/>
+            </w:pPr>
+            <w:r>
+              <w:t>{{marketing_email}}</w:t>
+            </w:r>
+          </w:p>
+        </w:tc>
+      </w:tr>
+      <w:tr>
+        <w:tc>
+          <w:tcPr>
+            <w:tcW w:type="dxa" w:w="3120"/>
+            <w:tcBorders>
+              <w:top w:val="single" w:color="BFBFBF" w:sz="4"/>
+              <w:left w:val="single" w:color="BFBFBF" w:sz="4"/>
+              <w:bottom w:val="single" w:color="BFBFBF" w:sz="4"/>
+              <w:right w:val="single" w:color="BFBFBF" w:sz="4"/>
+            </w:tcBorders>
+            <w:shd w:fill="F3F4F6" w:val="clear"/>
+            <w:tcMar>
+              <w:top w:type="dxa" w:w="100"/>
+              <w:left w:type="dxa" w:w="140"/>
+              <w:bottom w:type="dxa" w:w="100"/>
+              <w:right w:type="dxa" w:w="140"/>
+            </w:tcMar>
+            <w:vAlign w:val="center"/>
+          </w:tcPr>
+          <w:p>
+            <w:pPr>
+              <w:spacing w:after="40" w:before="40"/>
+              <w:jc w:val="left"/>
+            </w:pPr>
+            <w:r>
+              <w:rPr>
+                <w:rFonts w:ascii="Calibri" w:cs="Calibri" w:eastAsia="Calibri" w:hAnsi="Calibri"/>
+                <w:b/>
+                <w:bCs/>
+                <w:sz w:val="22"/>
+                <w:szCs w:val="22"/>
+              </w:rPr>
+              <w:t xml:space="preserve">Contact No.</w:t>
+            </w:r>
+          </w:p>
+        </w:tc>
+        <w:tc>
+          <w:tcPr>
+            <w:tcW w:type="dxa" w:w="6240"/>
+            <w:tcBorders>
+              <w:top w:val="single" w:color="BFBFBF" w:sz="4"/>
+              <w:left w:val="single" w:color="BFBFBF" w:sz="4"/>
+              <w:bottom w:val="single" w:color="BFBFBF" w:sz="4"/>
+              <w:right w:val="single" w:color="BFBFBF" w:sz="4"/>
+            </w:tcBorders>
+            <w:tcMar>
+              <w:top w:type="dxa" w:w="100"/>
+              <w:left w:type="dxa" w:w="140"/>
+              <w:bottom w:type="dxa" w:w="100"/>
+              <w:right w:type="dxa" w:w="140"/>
+            </w:tcMar>
+            <w:vAlign w:val="center"/>
+          </w:tcPr>
+          <w:p>
+            <w:pPr>
+              <w:spacing w:after="40" w:before="40"/>
+              <w:jc w:val="left"/>
+            </w:pPr>
+            <w:r>
+              <w:t>{{marketing_phone}}</w:t>
             </w:r>
           </w:p>
         </w:tc>

</xml_diff>

<commit_message>
fix(regen): restore burner diagrams in offer
The two core technical figures had become orphaned in the templates
(files present in media but not placed in the document body, dropped
during an earlier PART-B/empty-page cleanup). Re-insert both under
PART OF REGENERATIVE BURNER with captions:
  Fig 1: Parts of Regenerative Burner (assembly 3D + section view)
  Fig 2: Operation of Regenerative Burner (Mode A/B cycle)
Applied to both gas and oil regen templates.

Co-Authored-By: Claude Opus 4.8 <noreply@anthropic.com>
</commit_message>
<xml_diff>
--- a/Regen_Offer_Template.docx
+++ b/Regen_Offer_Template.docx
@@ -2707,6 +2707,108 @@
           <w:rFonts w:ascii="Calibri" w:hAnsi="Calibri" w:cs="Calibri"/>
           <w:bCs/>
         </w:rPr>
+      </w:r>
+    </w:p>
+    <w:p>
+      <w:pPr>
+        <w:jc w:val="center"/>
+      </w:pPr>
+      <w:r>
+        <w:rPr>
+          <w:b/>
+          <w:sz w:val="20"/>
+        </w:rPr>
+        <w:t>Fig 1: Parts of Regenerative Burner</w:t>
+      </w:r>
+    </w:p>
+    <w:p>
+      <w:pPr>
+        <w:jc w:val="center"/>
+      </w:pPr>
+      <w:r>
+        <w:drawing>
+          <wp:inline xmlns:a="http://schemas.openxmlformats.org/drawingml/2006/main" xmlns:pic="http://schemas.openxmlformats.org/drawingml/2006/picture">
+            <wp:extent cx="5669280" cy="3047855"/>
+            <wp:docPr id="3" name="Picture 3"/>
+            <wp:cNvGraphicFramePr>
+              <a:graphicFrameLocks noChangeAspect="1"/>
+            </wp:cNvGraphicFramePr>
+            <a:graphic>
+              <a:graphicData uri="http://schemas.openxmlformats.org/drawingml/2006/picture">
+                <pic:pic>
+                  <pic:nvPicPr>
+                    <pic:cNvPr id="0" name="image.jpg"/>
+                    <pic:cNvPicPr/>
+                  </pic:nvPicPr>
+                  <pic:blipFill>
+                    <a:blip r:embed="rId19"/>
+                    <a:stretch>
+                      <a:fillRect/>
+                    </a:stretch>
+                  </pic:blipFill>
+                  <pic:spPr>
+                    <a:xfrm>
+                      <a:off x="0" y="0"/>
+                      <a:ext cx="5669280" cy="3047855"/>
+                    </a:xfrm>
+                    <a:prstGeom prst="rect"/>
+                  </pic:spPr>
+                </pic:pic>
+              </a:graphicData>
+            </a:graphic>
+          </wp:inline>
+        </w:drawing>
+      </w:r>
+    </w:p>
+    <w:p>
+      <w:pPr>
+        <w:jc w:val="center"/>
+      </w:pPr>
+      <w:r>
+        <w:rPr>
+          <w:b/>
+          <w:sz w:val="20"/>
+        </w:rPr>
+        <w:t>Fig 2: Operation of Regenerative Burner</w:t>
+      </w:r>
+    </w:p>
+    <w:p>
+      <w:pPr>
+        <w:jc w:val="center"/>
+      </w:pPr>
+      <w:r>
+        <w:drawing>
+          <wp:inline xmlns:a="http://schemas.openxmlformats.org/drawingml/2006/main" xmlns:pic="http://schemas.openxmlformats.org/drawingml/2006/picture">
+            <wp:extent cx="5669280" cy="3931760"/>
+            <wp:docPr id="4" name="Picture 4"/>
+            <wp:cNvGraphicFramePr>
+              <a:graphicFrameLocks noChangeAspect="1"/>
+            </wp:cNvGraphicFramePr>
+            <a:graphic>
+              <a:graphicData uri="http://schemas.openxmlformats.org/drawingml/2006/picture">
+                <pic:pic>
+                  <pic:nvPicPr>
+                    <pic:cNvPr id="0" name="image.jpg"/>
+                    <pic:cNvPicPr/>
+                  </pic:nvPicPr>
+                  <pic:blipFill>
+                    <a:blip r:embed="rId18"/>
+                    <a:stretch>
+                      <a:fillRect/>
+                    </a:stretch>
+                  </pic:blipFill>
+                  <pic:spPr>
+                    <a:xfrm>
+                      <a:off x="0" y="0"/>
+                      <a:ext cx="5669280" cy="3931760"/>
+                    </a:xfrm>
+                    <a:prstGeom prst="rect"/>
+                  </pic:spPr>
+                </pic:pic>
+              </a:graphicData>
+            </a:graphic>
+          </wp:inline>
+        </w:drawing>
       </w:r>
     </w:p>
     <w:p>

</xml_diff>

<commit_message>
feat(regen): make Terms & Conditions form-editable + drop stale heading
Regen offer T&C were hardcoded in the template (9-row site/erection table),
while the form collected the unrelated 12-field equipment T&C set that the
template never used — so edits never reached the offer.

- Convert both regen templates' T&C value cells to {{ tnc_regen_* }} placeholders.
- REGEN_STANDARD_TNC defaults (matching the original wording) in
  equipment_advantages.py; backend fills blanks, form values override.
- Replace the regen form's T&C editor with the 9 actual rows (Material
  Custody, Site Facilities, Delivery & Erection, Transportation, Taxes,
  Payment, Packing, Warranty, Note); ride along in extra_context.
- Remove the now-redundant 'PART OF REGENERATIVE BURNER' heading line.

Co-Authored-By: Claude Opus 4.8 <noreply@anthropic.com>
</commit_message>
<xml_diff>
--- a/Regen_Offer_Template.docx
+++ b/Regen_Offer_Template.docx
@@ -2671,46 +2671,6 @@
     </w:tbl>
     <w:p>
       <w:pPr>
-        <w:rPr>
-          <w:b/>
-          <w:u w:val="single"/>
-        </w:rPr>
-      </w:pPr>
-      <w:r>
-        <w:rPr>
-          <w:bCs/>
-          <w:noProof/>
-          <w:lang w:val="en-US" w:eastAsia="en-US"/>
-        </w:rPr>
-        <w:t>PART OF REGENERATIVE BURNER</w:t>
-      </w:r>
-      <w:r>
-        <w:rPr>
-          <w:rFonts w:ascii="Calibri" w:hAnsi="Calibri" w:cs="Calibri"/>
-          <w:b/>
-        </w:rPr>
-      </w:r>
-      <w:r>
-        <w:rPr>
-          <w:rFonts w:ascii="Calibri" w:hAnsi="Calibri" w:cs="Calibri"/>
-          <w:bCs/>
-        </w:rPr>
-      </w:r>
-      <w:r>
-        <w:rPr>
-          <w:rFonts w:ascii="Calibri" w:hAnsi="Calibri" w:cs="Calibri"/>
-          <w:bCs/>
-        </w:rPr>
-      </w:r>
-      <w:r>
-        <w:rPr>
-          <w:rFonts w:ascii="Calibri" w:hAnsi="Calibri" w:cs="Calibri"/>
-          <w:bCs/>
-        </w:rPr>
-      </w:r>
-    </w:p>
-    <w:p>
-      <w:pPr>
         <w:jc w:val="center"/>
       </w:pPr>
       <w:r>
@@ -13663,10 +13623,9 @@
             </w:pPr>
             <w:r>
               <w:rPr>
-                <w:color w:val="1F2937"/>
                 <w:sz w:val="22"/>
               </w:rPr>
-              <w:t>All material supplied by us will be received by your store for safe custody and storage. The material will be issued to us as and when required for installation.</w:t>
+              <w:t>{{ tnc_regen_material_custody }}</w:t>
             </w:r>
           </w:p>
         </w:tc>
@@ -13705,23 +13664,9 @@
             </w:pPr>
             <w:r>
               <w:rPr>
-                <w:color w:val="1F2937"/>
                 <w:sz w:val="22"/>
               </w:rPr>
-              <w:t>Electricity and water to be provided free of charge for the erection work.</w:t>
-            </w:r>
-          </w:p>
-          <w:p>
-            <w:pPr>
-              <w:spacing w:before="20" w:after="20" w:line="252" w:lineRule="auto"/>
-              <w:jc w:val="left"/>
-            </w:pPr>
-            <w:r>
-              <w:rPr>
-                <w:color w:val="1F2937"/>
-                <w:sz w:val="22"/>
-              </w:rPr>
-              <w:t>Crane facilities available in your works to be provided free of charge.</w:t>
+              <w:t>{{ tnc_regen_site_facilities }}</w:t>
             </w:r>
           </w:p>
         </w:tc>
@@ -13760,49 +13705,9 @@
             </w:pPr>
             <w:r>
               <w:rPr>
-                <w:color w:val="1F2937"/>
                 <w:sz w:val="22"/>
               </w:rPr>
-              <w:t>Drawings for the furnace will be prepared and submitted within 5 weeks from the date of your confirmed order for the design work.</w:t>
-            </w:r>
-          </w:p>
-          <w:p>
-            <w:pPr>
-              <w:spacing w:before="20" w:after="20" w:line="252" w:lineRule="auto"/>
-              <w:jc w:val="left"/>
-            </w:pPr>
-            <w:r>
-              <w:rPr>
-                <w:color w:val="1F2937"/>
-                <w:sz w:val="22"/>
-              </w:rPr>
-              <w:t>After approval of the drawings, items in our scope of supply will be delivered within 15 weeks from the date of drawing approval.</w:t>
-            </w:r>
-          </w:p>
-          <w:p>
-            <w:pPr>
-              <w:spacing w:before="20" w:after="20" w:line="252" w:lineRule="auto"/>
-              <w:jc w:val="left"/>
-            </w:pPr>
-            <w:r>
-              <w:rPr>
-                <w:color w:val="1F2937"/>
-                <w:sz w:val="22"/>
-              </w:rPr>
-              <w:t>The erection schedule will be mutually worked out based on your scope of erection work.</w:t>
-            </w:r>
-          </w:p>
-          <w:p>
-            <w:pPr>
-              <w:spacing w:before="20" w:after="20" w:line="252" w:lineRule="auto"/>
-              <w:jc w:val="left"/>
-            </w:pPr>
-            <w:r>
-              <w:rPr>
-                <w:color w:val="1F2937"/>
-                <w:sz w:val="22"/>
-              </w:rPr>
-              <w:t>We shall not be responsible for any delay due to non-availability of fronts, delay in issue of work permits, safety clearances and other clearances that fall in your purview.</w:t>
+              <w:t>{{ tnc_regen_delivery }}</w:t>
             </w:r>
           </w:p>
         </w:tc>
@@ -13841,10 +13746,9 @@
             </w:pPr>
             <w:r>
               <w:rPr>
-                <w:color w:val="1F2937"/>
                 <w:sz w:val="22"/>
               </w:rPr>
-              <w:t>From our factory to your work site — extra at actuals and chargeable to you.</w:t>
+              <w:t>{{ tnc_regen_transportation }}</w:t>
             </w:r>
           </w:p>
         </w:tc>
@@ -13883,10 +13787,9 @@
             </w:pPr>
             <w:r>
               <w:rPr>
-                <w:color w:val="1F2937"/>
                 <w:sz w:val="22"/>
               </w:rPr>
-              <w:t>Extra at actuals.</w:t>
+              <w:t>{{ tnc_regen_taxes }}</w:t>
             </w:r>
           </w:p>
         </w:tc>
@@ -13925,23 +13828,9 @@
             </w:pPr>
             <w:r>
               <w:rPr>
-                <w:color w:val="1F2937"/>
                 <w:sz w:val="22"/>
               </w:rPr>
-              <w:t>30% along with the purchase order.</w:t>
-            </w:r>
-          </w:p>
-          <w:p>
-            <w:pPr>
-              <w:spacing w:before="20" w:after="20" w:line="252" w:lineRule="auto"/>
-              <w:jc w:val="left"/>
-            </w:pPr>
-            <w:r>
-              <w:rPr>
-                <w:color w:val="1F2937"/>
-                <w:sz w:val="22"/>
-              </w:rPr>
-              <w:t>70% against inspection of material at our works.</w:t>
+              <w:t>{{ tnc_regen_payment }}</w:t>
             </w:r>
           </w:p>
         </w:tc>
@@ -13980,10 +13869,9 @@
             </w:pPr>
             <w:r>
               <w:rPr>
-                <w:color w:val="1F2937"/>
                 <w:sz w:val="22"/>
               </w:rPr>
-              <w:t>4% of the order value, charged extra.</w:t>
+              <w:t>{{ tnc_regen_packing }}</w:t>
             </w:r>
           </w:p>
         </w:tc>
@@ -14022,10 +13910,9 @@
             </w:pPr>
             <w:r>
               <w:rPr>
-                <w:color w:val="1F2937"/>
                 <w:sz w:val="22"/>
               </w:rPr>
-              <w:t>18 months from the date of material supplied (any manufacturing defect) or 12 months from date of commissioning, whichever is earlier.</w:t>
+              <w:t>{{ tnc_regen_warranty }}</w:t>
             </w:r>
           </w:p>
         </w:tc>
@@ -14064,36 +13951,9 @@
             </w:pPr>
             <w:r>
               <w:rPr>
-                <w:color w:val="1F2937"/>
                 <w:sz w:val="22"/>
               </w:rPr>
-              <w:t>There will be a reduction in dross formation.</w:t>
-            </w:r>
-          </w:p>
-          <w:p>
-            <w:pPr>
-              <w:spacing w:before="20" w:after="20" w:line="252" w:lineRule="auto"/>
-              <w:jc w:val="left"/>
-            </w:pPr>
-            <w:r>
-              <w:rPr>
-                <w:color w:val="1F2937"/>
-                <w:sz w:val="22"/>
-              </w:rPr>
-              <w:t>Savings are calculated assuming a recuperator preheating combustion air to 350 °C.</w:t>
-            </w:r>
-          </w:p>
-          <w:p>
-            <w:pPr>
-              <w:spacing w:before="20" w:after="20" w:line="252" w:lineRule="auto"/>
-              <w:jc w:val="left"/>
-            </w:pPr>
-            <w:r>
-              <w:rPr>
-                <w:color w:val="1F2937"/>
-                <w:sz w:val="22"/>
-              </w:rPr>
-              <w:t>This will lead to a quicker payback.</w:t>
+              <w:t>{{ tnc_regen_note }}</w:t>
             </w:r>
           </w:p>
         </w:tc>

</xml_diff>

<commit_message>
feat: PLC S7-1500 only (drop 1200); regen blower standby/VFD line
- PLC references now read Siemens S7-1500 across the board (was
  S7-1200 / S7-1200/1500): btf_builder, regen_builder BOM spec,
  Offer_Template + both regen templates (body + control tables).
- Regen offer combustion-blower paragraph now adds a sentence when
  Standby Blower and/or VFD is selected on the form (both -> combined
  sentence); flags forwarded via extra_context.

Co-Authored-By: Claude Opus 4.8 <noreply@anthropic.com>
</commit_message>
<xml_diff>
--- a/Regen_Offer_Template.docx
+++ b/Regen_Offer_Template.docx
@@ -1981,7 +1981,7 @@
                 <w:color w:val="1F2937"/>
                 <w:sz w:val="24"/>
               </w:rPr>
-              <w:t>1200</w:t>
+              <w:t>1500</w:t>
             </w:r>
           </w:p>
         </w:tc>
@@ -3788,6 +3788,14 @@
         </w:rPr>
         <w:t xml:space="preserve">. </w:t>
       </w:r>
+      <w:r>
+        <w:rPr>
+          <w:rFonts w:ascii="Calibri" w:hAnsi="Calibri" w:cs="Calibri"/>
+          <w:sz w:val="24"/>
+          <w:szCs w:val="24"/>
+        </w:rPr>
+        <w:t xml:space="preserve"> {% if standby_blower and vfd %}A standby blower and a Variable Frequency Drive (VFD) shall also be provided.{% elif standby_blower %}A standby blower shall also be provided.{% elif vfd %}A Variable Frequency Drive (VFD) shall also be provided.{% endif %}</w:t>
+      </w:r>
     </w:p>
     <w:p>
       <w:pPr>
@@ -4059,7 +4067,7 @@
         <w:rPr>
           <w:rFonts w:ascii="Calibri" w:hAnsi="Calibri" w:cs="Calibri"/>
         </w:rPr>
-        <w:t xml:space="preserve">PLC S7-1200/1500 </w:t>
+        <w:t xml:space="preserve">PLC S7-1500 </w:t>
       </w:r>
       <w:r>
         <w:rPr>
@@ -4646,7 +4654,7 @@
         <w:rPr>
           <w:rFonts w:ascii="Calibri" w:hAnsi="Calibri" w:cs="Calibri"/>
         </w:rPr>
-        <w:t>PLC S7-1200/1500</w:t>
+        <w:t>PLC S7-1500</w:t>
       </w:r>
       <w:r>
         <w:rPr>
@@ -4937,25 +4945,22 @@
               <w:rPr>
                 <w:rFonts w:ascii="Calibri" w:hAnsi="Calibri" w:cs="Calibri"/>
               </w:rPr>
-              <w:t>S7 1</w:t>
-            </w:r>
-            <w:r>
-              <w:rPr>
-                <w:rFonts w:ascii="Calibri" w:hAnsi="Calibri" w:cs="Calibri"/>
-              </w:rPr>
-              <w:t>2</w:t>
-            </w:r>
-            <w:r>
-              <w:rPr>
-                <w:rFonts w:ascii="Calibri" w:hAnsi="Calibri" w:cs="Calibri"/>
-              </w:rPr>
-              <w:t>00 P.L.C with HMI</w:t>
-            </w:r>
-            <w:r>
-              <w:rPr>
-                <w:rFonts w:ascii="Calibri" w:hAnsi="Calibri" w:cs="Calibri"/>
-              </w:rPr>
-              <w:t xml:space="preserve"> </w:t>
+              <w:t xml:space="preserve">S7 1500 P.L.C with HMI </w:t>
+            </w:r>
+            <w:r>
+              <w:rPr>
+                <w:rFonts w:ascii="Calibri" w:hAnsi="Calibri" w:cs="Calibri"/>
+              </w:rPr>
+            </w:r>
+            <w:r>
+              <w:rPr>
+                <w:rFonts w:ascii="Calibri" w:hAnsi="Calibri" w:cs="Calibri"/>
+              </w:rPr>
+            </w:r>
+            <w:r>
+              <w:rPr>
+                <w:rFonts w:ascii="Calibri" w:hAnsi="Calibri" w:cs="Calibri"/>
+              </w:rPr>
             </w:r>
           </w:p>
         </w:tc>

</xml_diff>

<commit_message>
feat(regen): move burner figures below the REGENERATIVE BURNERS text
Relocate both technical figures from after the Client/Marketing tables to
directly after the REGENERATIVE BURNERS description (before ENERGY SAVING),
and reorder to drawings-first: Fig 1 = Operation schematic, Fig 2 = Parts
(3D assembly/section). Applied to gas and oil templates.

Co-Authored-By: Claude Opus 4.8 <noreply@anthropic.com>
</commit_message>
<xml_diff>
--- a/Regen_Offer_Template.docx
+++ b/Regen_Offer_Template.docx
@@ -1187,1488 +1187,55 @@
     </w:p>
     <w:p>
       <w:pPr>
-        <w:spacing w:before="280" w:after="80"/>
-        <w:jc w:val="both"/>
+        <w:jc w:val="center"/>
+      </w:pPr>
+      <w:r>
         <w:rPr>
           <w:b/>
-          <w:u w:val="single"/>
-        </w:rPr>
-      </w:pPr>
-      <w:r>
-        <w:rPr>
-          <w:rFonts w:ascii="Calibri" w:hAnsi="Calibri" w:cs="Calibri"/>
-          <w:b/>
-          <w:color w:val="1F2937"/>
-          <w:sz w:val="30"/>
-        </w:rPr>
-        <w:t>ENERGY SAVING</w:t>
+          <w:sz w:val="20"/>
+        </w:rPr>
+        <w:t>Fig 1: Operation of Regenerative Burner</w:t>
       </w:r>
     </w:p>
     <w:p>
       <w:pPr>
-        <w:pStyle w:val="NoSpacing"/>
-        <w:widowControl w:val="0"/>
-        <w:spacing w:after="120" w:line="276" w:lineRule="auto"/>
-        <w:jc w:val="both"/>
-        <w:rPr>
-          <w:rFonts w:ascii="Times New Roman" w:hAnsi="Times New Roman" w:cs="Times New Roman"/>
-          <w:sz w:val="24"/>
-          <w:szCs w:val="24"/>
-        </w:rPr>
-      </w:pPr>
-      <w:r>
-        <w:rPr>
-          <w:rFonts w:ascii="Calibri" w:hAnsi="Calibri" w:cs="Calibri"/>
-          <w:sz w:val="24"/>
-          <w:szCs w:val="24"/>
-        </w:rPr>
-        <w:t>The chart shows the Saving in natural gas in a furnace compared to a system with no recuperator, a system with a recuperator giving a preheat temperature of 400 °C</w:t>
-      </w:r>
-      <w:r>
-        <w:rPr>
-          <w:rFonts w:ascii="Times New Roman" w:hAnsi="Times New Roman" w:cs="Times New Roman"/>
-          <w:sz w:val="24"/>
-          <w:szCs w:val="24"/>
-          <w:vertAlign w:val="superscript"/>
-        </w:rPr>
-      </w:r>
-      <w:r>
-        <w:rPr>
-          <w:rFonts w:ascii="Calibri" w:hAnsi="Calibri" w:cs="Calibri"/>
-          <w:sz w:val="24"/>
-          <w:szCs w:val="24"/>
-        </w:rPr>
-        <w:t xml:space="preserve"> and with Regenerative burners operating with a preheat temperature of 1000 °C</w:t>
-      </w:r>
-      <w:r>
-        <w:rPr>
-          <w:rFonts w:ascii="Times New Roman" w:hAnsi="Times New Roman" w:cs="Times New Roman"/>
-          <w:sz w:val="24"/>
-          <w:szCs w:val="24"/>
-        </w:rPr>
-      </w:r>
-      <w:r>
-        <w:rPr>
-          <w:rFonts w:ascii="Times New Roman" w:hAnsi="Times New Roman" w:cs="Times New Roman"/>
-          <w:sz w:val="24"/>
-          <w:szCs w:val="24"/>
-        </w:rPr>
-      </w:r>
-      <w:r>
-        <w:rPr>
-          <w:rFonts w:ascii="Times New Roman" w:hAnsi="Times New Roman" w:cs="Times New Roman"/>
-          <w:sz w:val="24"/>
-          <w:szCs w:val="24"/>
-          <w:vertAlign w:val="superscript"/>
-        </w:rPr>
-      </w:r>
-      <w:r>
-        <w:rPr>
-          <w:rFonts w:ascii="Calibri" w:hAnsi="Calibri" w:cs="Calibri"/>
-          <w:sz w:val="24"/>
-          <w:szCs w:val="24"/>
-        </w:rPr>
-        <w:t xml:space="preserve">.  </w:t>
+        <w:jc w:val="center"/>
+      </w:pPr>
+      <w:r>
+        <w:drawing>
+          <wp:inline xmlns:a="http://schemas.openxmlformats.org/drawingml/2006/main" xmlns:pic="http://schemas.openxmlformats.org/drawingml/2006/picture">
+            <wp:extent cx="5669280" cy="3931760"/>
+            <wp:docPr id="4" name="Picture 4"/>
+            <wp:cNvGraphicFramePr>
+              <a:graphicFrameLocks noChangeAspect="1"/>
+            </wp:cNvGraphicFramePr>
+            <a:graphic>
+              <a:graphicData uri="http://schemas.openxmlformats.org/drawingml/2006/picture">
+                <pic:pic>
+                  <pic:nvPicPr>
+                    <pic:cNvPr id="0" name="image.jpg"/>
+                    <pic:cNvPicPr/>
+                  </pic:nvPicPr>
+                  <pic:blipFill>
+                    <a:blip r:embed="rId18"/>
+                    <a:stretch>
+                      <a:fillRect/>
+                    </a:stretch>
+                  </pic:blipFill>
+                  <pic:spPr>
+                    <a:xfrm>
+                      <a:off x="0" y="0"/>
+                      <a:ext cx="5669280" cy="3931760"/>
+                    </a:xfrm>
+                    <a:prstGeom prst="rect"/>
+                  </pic:spPr>
+                </pic:pic>
+              </a:graphicData>
+            </a:graphic>
+          </wp:inline>
+        </w:drawing>
       </w:r>
     </w:p>
-    <w:tbl>
-      <w:tblPr>
-        <w:tblW w:w="9356" w:type="dxa"/>
-        <w:tblInd w:w="-5" w:type="dxa"/>
-        <w:tblLayout w:type="fixed"/>
-        <w:tblLook w:val="04A0" w:firstRow="1" w:lastRow="0" w:firstColumn="1" w:lastColumn="0" w:noHBand="0" w:noVBand="1"/>
-        <w:tblBorders>
-          <w:top w:val="single" w:sz="4" w:space="0" w:color="auto"/>
-          <w:left w:val="single" w:sz="4" w:space="0" w:color="auto"/>
-          <w:bottom w:val="single" w:sz="4" w:space="0" w:color="auto"/>
-          <w:right w:val="single" w:sz="4" w:space="0" w:color="auto"/>
-          <w:insideH w:val="single" w:sz="4" w:space="0" w:color="auto"/>
-          <w:insideV w:val="single" w:sz="4" w:space="0" w:color="auto"/>
-        </w:tblBorders>
-      </w:tblPr>
-      <w:tblGrid>
-        <w:gridCol w:w="2127"/>
-        <w:gridCol w:w="2835"/>
-        <w:gridCol w:w="2409"/>
-        <w:gridCol w:w="1985"/>
-      </w:tblGrid>
-      <w:tr>
-        <w:trPr>
-          <w:trHeight w:val="397"/>
-        </w:trPr>
-        <w:tc>
-          <w:tcPr>
-            <w:tcW w:w="9356" w:type="dxa"/>
-            <w:gridSpan w:val="4"/>
-            <w:vAlign w:val="center"/>
-            <w:hideMark/>
-            <w:shd w:val="clear" w:color="auto" w:fill="F1F5F9"/>
-            <w:tcBorders>
-              <w:top w:val="single" w:sz="4" w:space="0" w:color="000000"/>
-              <w:left w:val="single" w:sz="4" w:space="0" w:color="000000"/>
-              <w:bottom w:val="single" w:sz="4" w:space="0" w:color="000000"/>
-              <w:right w:val="single" w:sz="4" w:space="0" w:color="000000"/>
-            </w:tcBorders>
-          </w:tcPr>
-          <w:p>
-            <w:pPr>
-              <w:spacing w:before="40" w:after="40" w:line="240" w:lineRule="auto"/>
-              <w:jc w:val="center"/>
-              <w:rPr>
-                <w:color w:val="000000"/>
-              </w:rPr>
-            </w:pPr>
-            <w:r>
-              <w:rPr>
-                <w:rFonts w:ascii="Calibri" w:hAnsi="Calibri" w:cs="Calibri"/>
-                <w:b/>
-                <w:color w:val="1F2937"/>
-                <w:sz w:val="30"/>
-              </w:rPr>
-              <w:t>Savings In {{ savings_fuel }}</w:t>
-            </w:r>
-          </w:p>
-        </w:tc>
-      </w:tr>
-      <w:tr>
-        <w:trPr>
-          <w:trHeight w:val="680"/>
-        </w:trPr>
-        <w:tc>
-          <w:tcPr>
-            <w:tcW w:w="2127" w:type="dxa"/>
-            <w:vAlign w:val="center"/>
-            <w:hideMark/>
-            <w:shd w:val="clear" w:color="auto" w:fill="F1F5F9"/>
-            <w:tcBorders>
-              <w:top w:val="single" w:sz="4" w:space="0" w:color="000000"/>
-              <w:left w:val="single" w:sz="4" w:space="0" w:color="000000"/>
-              <w:bottom w:val="single" w:sz="4" w:space="0" w:color="000000"/>
-              <w:right w:val="single" w:sz="4" w:space="0" w:color="000000"/>
-            </w:tcBorders>
-          </w:tcPr>
-          <w:p>
-            <w:pPr>
-              <w:spacing w:before="40" w:after="40" w:line="240" w:lineRule="auto"/>
-              <w:jc w:val="center"/>
-              <w:rPr>
-                <w:b/>
-                <w:bCs/>
-                <w:color w:val="000000"/>
-              </w:rPr>
-            </w:pPr>
-            <w:r>
-              <w:rPr>
-                <w:rFonts w:ascii="Calibri" w:hAnsi="Calibri" w:cs="Calibri"/>
-                <w:b/>
-                <w:bCs/>
-                <w:color w:val="1F2937"/>
-                <w:sz w:val="25"/>
-              </w:rPr>
-              <w:t>Furnace Temp °C</w:t>
-            </w:r>
-          </w:p>
-        </w:tc>
-        <w:tc>
-          <w:tcPr>
-            <w:tcW w:w="2835" w:type="dxa"/>
-            <w:vAlign w:val="center"/>
-            <w:hideMark/>
-            <w:shd w:val="clear" w:color="auto" w:fill="F1F5F9"/>
-            <w:tcBorders>
-              <w:top w:val="single" w:sz="4" w:space="0" w:color="000000"/>
-              <w:left w:val="single" w:sz="4" w:space="0" w:color="000000"/>
-              <w:bottom w:val="single" w:sz="4" w:space="0" w:color="000000"/>
-              <w:right w:val="single" w:sz="4" w:space="0" w:color="000000"/>
-            </w:tcBorders>
-          </w:tcPr>
-          <w:p>
-            <w:pPr>
-              <w:spacing w:before="40" w:after="40" w:line="240" w:lineRule="auto"/>
-              <w:jc w:val="center"/>
-              <w:rPr>
-                <w:color w:val="000000"/>
-              </w:rPr>
-            </w:pPr>
-            <w:r>
-              <w:rPr>
-                <w:rFonts w:ascii="Calibri" w:hAnsi="Calibri" w:cs="Calibri"/>
-                <w:b/>
-                <w:color w:val="1F2937"/>
-                <w:sz w:val="25"/>
-              </w:rPr>
-              <w:t xml:space="preserve">Recuperator </w:t>
-            </w:r>
-            <w:r>
-              <w:rPr>
-                <w:rFonts w:ascii="Calibri" w:hAnsi="Calibri" w:cs="Calibri"/>
-                <w:b/>
-                <w:color w:val="1F2937"/>
-                <w:sz w:val="25"/>
-              </w:rPr>
-              <w:t>v</w:t>
-            </w:r>
-            <w:r>
-              <w:rPr>
-                <w:rFonts w:ascii="Calibri" w:hAnsi="Calibri" w:cs="Calibri"/>
-                <w:b/>
-                <w:color w:val="1F2937"/>
-                <w:sz w:val="25"/>
-              </w:rPr>
-              <w:t>s Cold Air</w:t>
-            </w:r>
-          </w:p>
-        </w:tc>
-        <w:tc>
-          <w:tcPr>
-            <w:tcW w:w="2409" w:type="dxa"/>
-            <w:vAlign w:val="center"/>
-            <w:hideMark/>
-            <w:shd w:val="clear" w:color="auto" w:fill="F1F5F9"/>
-            <w:tcBorders>
-              <w:top w:val="single" w:sz="4" w:space="0" w:color="000000"/>
-              <w:left w:val="single" w:sz="4" w:space="0" w:color="000000"/>
-              <w:bottom w:val="single" w:sz="4" w:space="0" w:color="000000"/>
-              <w:right w:val="single" w:sz="4" w:space="0" w:color="000000"/>
-            </w:tcBorders>
-          </w:tcPr>
-          <w:p>
-            <w:pPr>
-              <w:spacing w:before="40" w:after="40" w:line="240" w:lineRule="auto"/>
-              <w:jc w:val="center"/>
-              <w:rPr>
-                <w:color w:val="000000"/>
-              </w:rPr>
-            </w:pPr>
-            <w:r>
-              <w:rPr>
-                <w:rFonts w:ascii="Calibri" w:hAnsi="Calibri" w:cs="Calibri"/>
-                <w:b/>
-                <w:color w:val="1F2937"/>
-                <w:sz w:val="25"/>
-              </w:rPr>
-              <w:t xml:space="preserve">REGEN </w:t>
-            </w:r>
-            <w:r>
-              <w:rPr>
-                <w:rFonts w:ascii="Calibri" w:hAnsi="Calibri" w:cs="Calibri"/>
-                <w:b/>
-                <w:color w:val="1F2937"/>
-                <w:sz w:val="25"/>
-              </w:rPr>
-              <w:t>v</w:t>
-            </w:r>
-            <w:r>
-              <w:rPr>
-                <w:rFonts w:ascii="Calibri" w:hAnsi="Calibri" w:cs="Calibri"/>
-                <w:b/>
-                <w:color w:val="1F2937"/>
-                <w:sz w:val="25"/>
-              </w:rPr>
-              <w:t>s Cold Air</w:t>
-            </w:r>
-          </w:p>
-        </w:tc>
-        <w:tc>
-          <w:tcPr>
-            <w:tcW w:w="1985" w:type="dxa"/>
-            <w:vAlign w:val="center"/>
-            <w:hideMark/>
-            <w:shd w:val="clear" w:color="auto" w:fill="F1F5F9"/>
-            <w:tcBorders>
-              <w:top w:val="single" w:sz="4" w:space="0" w:color="000000"/>
-              <w:left w:val="single" w:sz="4" w:space="0" w:color="000000"/>
-              <w:bottom w:val="single" w:sz="4" w:space="0" w:color="000000"/>
-              <w:right w:val="single" w:sz="4" w:space="0" w:color="000000"/>
-            </w:tcBorders>
-          </w:tcPr>
-          <w:p>
-            <w:pPr>
-              <w:spacing w:before="40" w:after="40" w:line="240" w:lineRule="auto"/>
-              <w:jc w:val="center"/>
-              <w:rPr>
-                <w:color w:val="000000"/>
-              </w:rPr>
-            </w:pPr>
-            <w:r>
-              <w:rPr>
-                <w:rFonts w:ascii="Calibri" w:hAnsi="Calibri" w:cs="Calibri"/>
-                <w:b/>
-                <w:color w:val="1F2937"/>
-                <w:sz w:val="25"/>
-              </w:rPr>
-              <w:t xml:space="preserve">REGEN </w:t>
-            </w:r>
-            <w:r>
-              <w:rPr>
-                <w:rFonts w:ascii="Calibri" w:hAnsi="Calibri" w:cs="Calibri"/>
-                <w:b/>
-                <w:color w:val="1F2937"/>
-                <w:sz w:val="25"/>
-              </w:rPr>
-              <w:t>v</w:t>
-            </w:r>
-            <w:r>
-              <w:rPr>
-                <w:rFonts w:ascii="Calibri" w:hAnsi="Calibri" w:cs="Calibri"/>
-                <w:b/>
-                <w:color w:val="1F2937"/>
-                <w:sz w:val="25"/>
-              </w:rPr>
-              <w:t>s Recuperator</w:t>
-            </w:r>
-          </w:p>
-        </w:tc>
-      </w:tr>
-      <w:tr>
-        <w:trPr>
-          <w:trHeight w:val="454"/>
-        </w:trPr>
-        <w:tc>
-          <w:tcPr>
-            <w:tcW w:w="2127" w:type="dxa"/>
-            <w:vAlign w:val="center"/>
-            <w:hideMark/>
-            <w:shd w:val="clear" w:color="auto" w:fill="FFFFFF"/>
-            <w:tcBorders>
-              <w:top w:val="single" w:sz="4" w:space="0" w:color="000000"/>
-              <w:left w:val="single" w:sz="4" w:space="0" w:color="000000"/>
-              <w:bottom w:val="single" w:sz="4" w:space="0" w:color="000000"/>
-              <w:right w:val="single" w:sz="4" w:space="0" w:color="000000"/>
-            </w:tcBorders>
-          </w:tcPr>
-          <w:p>
-            <w:pPr>
-              <w:spacing w:before="40" w:after="40" w:line="240" w:lineRule="auto"/>
-              <w:jc w:val="center"/>
-              <w:rPr>
-                <w:b/>
-                <w:bCs/>
-                <w:color w:val="000000"/>
-              </w:rPr>
-            </w:pPr>
-            <w:r>
-              <w:rPr>
-                <w:rFonts w:ascii="Calibri" w:hAnsi="Calibri" w:cs="Calibri"/>
-                <w:b/>
-                <w:bCs/>
-                <w:color w:val="1F2937"/>
-                <w:sz w:val="24"/>
-              </w:rPr>
-              <w:t>1050</w:t>
-            </w:r>
-          </w:p>
-        </w:tc>
-        <w:tc>
-          <w:tcPr>
-            <w:tcW w:w="2835" w:type="dxa"/>
-            <w:vAlign w:val="center"/>
-            <w:hideMark/>
-            <w:shd w:val="clear" w:color="auto" w:fill="FFFFFF"/>
-            <w:tcBorders>
-              <w:top w:val="single" w:sz="4" w:space="0" w:color="000000"/>
-              <w:left w:val="single" w:sz="4" w:space="0" w:color="000000"/>
-              <w:bottom w:val="single" w:sz="4" w:space="0" w:color="000000"/>
-              <w:right w:val="single" w:sz="4" w:space="0" w:color="000000"/>
-            </w:tcBorders>
-          </w:tcPr>
-          <w:p>
-            <w:pPr>
-              <w:spacing w:before="40" w:after="40" w:line="240" w:lineRule="auto"/>
-              <w:jc w:val="center"/>
-              <w:rPr>
-                <w:color w:val="000000"/>
-              </w:rPr>
-            </w:pPr>
-            <w:r>
-              <w:rPr>
-                <w:rFonts w:ascii="Calibri" w:hAnsi="Calibri" w:cs="Calibri"/>
-                <w:b w:val="0"/>
-                <w:color w:val="1F2937"/>
-                <w:sz w:val="24"/>
-              </w:rPr>
-              <w:t>27.0%</w:t>
-            </w:r>
-          </w:p>
-        </w:tc>
-        <w:tc>
-          <w:tcPr>
-            <w:tcW w:w="2409" w:type="dxa"/>
-            <w:vAlign w:val="center"/>
-            <w:hideMark/>
-            <w:shd w:val="clear" w:color="auto" w:fill="FFFFFF"/>
-            <w:tcBorders>
-              <w:top w:val="single" w:sz="4" w:space="0" w:color="000000"/>
-              <w:left w:val="single" w:sz="4" w:space="0" w:color="000000"/>
-              <w:bottom w:val="single" w:sz="4" w:space="0" w:color="000000"/>
-              <w:right w:val="single" w:sz="4" w:space="0" w:color="000000"/>
-            </w:tcBorders>
-          </w:tcPr>
-          <w:p>
-            <w:pPr>
-              <w:spacing w:before="40" w:after="40" w:line="240" w:lineRule="auto"/>
-              <w:jc w:val="center"/>
-              <w:rPr>
-                <w:b/>
-                <w:bCs/>
-                <w:color w:val="000000"/>
-              </w:rPr>
-            </w:pPr>
-            <w:r>
-              <w:rPr>
-                <w:rFonts w:ascii="Calibri" w:hAnsi="Calibri" w:cs="Calibri"/>
-                <w:b w:val="0"/>
-                <w:bCs/>
-                <w:color w:val="1F2937"/>
-                <w:sz w:val="24"/>
-              </w:rPr>
-              <w:t>42.6%</w:t>
-            </w:r>
-          </w:p>
-        </w:tc>
-        <w:tc>
-          <w:tcPr>
-            <w:tcW w:w="1985" w:type="dxa"/>
-            <w:vAlign w:val="center"/>
-            <w:hideMark/>
-            <w:shd w:val="clear" w:color="auto" w:fill="FFFFFF"/>
-            <w:tcBorders>
-              <w:top w:val="single" w:sz="4" w:space="0" w:color="000000"/>
-              <w:left w:val="single" w:sz="4" w:space="0" w:color="000000"/>
-              <w:bottom w:val="single" w:sz="4" w:space="0" w:color="000000"/>
-              <w:right w:val="single" w:sz="4" w:space="0" w:color="000000"/>
-            </w:tcBorders>
-          </w:tcPr>
-          <w:p>
-            <w:pPr>
-              <w:spacing w:before="40" w:after="40" w:line="240" w:lineRule="auto"/>
-              <w:jc w:val="center"/>
-              <w:rPr>
-                <w:b/>
-                <w:bCs/>
-                <w:color w:val="000000"/>
-              </w:rPr>
-            </w:pPr>
-            <w:r>
-              <w:rPr>
-                <w:rFonts w:ascii="Calibri" w:hAnsi="Calibri" w:cs="Calibri"/>
-                <w:b w:val="0"/>
-                <w:bCs/>
-                <w:color w:val="1F2937"/>
-                <w:sz w:val="24"/>
-              </w:rPr>
-              <w:t>21.3%</w:t>
-            </w:r>
-          </w:p>
-        </w:tc>
-      </w:tr>
-      <w:tr>
-        <w:trPr>
-          <w:trHeight w:val="454"/>
-        </w:trPr>
-        <w:tc>
-          <w:tcPr>
-            <w:tcW w:w="2127" w:type="dxa"/>
-            <w:vAlign w:val="center"/>
-            <w:hideMark/>
-            <w:shd w:val="clear" w:color="auto" w:fill="FFFFFF"/>
-            <w:tcBorders>
-              <w:top w:val="single" w:sz="4" w:space="0" w:color="000000"/>
-              <w:left w:val="single" w:sz="4" w:space="0" w:color="000000"/>
-              <w:bottom w:val="single" w:sz="4" w:space="0" w:color="000000"/>
-              <w:right w:val="single" w:sz="4" w:space="0" w:color="000000"/>
-            </w:tcBorders>
-          </w:tcPr>
-          <w:p>
-            <w:pPr>
-              <w:spacing w:before="40" w:after="40" w:line="240" w:lineRule="auto"/>
-              <w:jc w:val="center"/>
-              <w:rPr>
-                <w:b/>
-                <w:bCs/>
-                <w:color w:val="000000"/>
-              </w:rPr>
-            </w:pPr>
-            <w:r>
-              <w:rPr>
-                <w:rFonts w:ascii="Calibri" w:hAnsi="Calibri" w:cs="Calibri"/>
-                <w:b/>
-                <w:bCs/>
-                <w:color w:val="1F2937"/>
-                <w:sz w:val="24"/>
-              </w:rPr>
-              <w:t>1100</w:t>
-            </w:r>
-          </w:p>
-        </w:tc>
-        <w:tc>
-          <w:tcPr>
-            <w:tcW w:w="2835" w:type="dxa"/>
-            <w:vAlign w:val="center"/>
-            <w:hideMark/>
-            <w:shd w:val="clear" w:color="auto" w:fill="FFFFFF"/>
-            <w:tcBorders>
-              <w:top w:val="single" w:sz="4" w:space="0" w:color="000000"/>
-              <w:left w:val="single" w:sz="4" w:space="0" w:color="000000"/>
-              <w:bottom w:val="single" w:sz="4" w:space="0" w:color="000000"/>
-              <w:right w:val="single" w:sz="4" w:space="0" w:color="000000"/>
-            </w:tcBorders>
-          </w:tcPr>
-          <w:p>
-            <w:pPr>
-              <w:spacing w:before="40" w:after="40" w:line="240" w:lineRule="auto"/>
-              <w:jc w:val="center"/>
-              <w:rPr>
-                <w:color w:val="000000"/>
-              </w:rPr>
-            </w:pPr>
-            <w:r>
-              <w:rPr>
-                <w:rFonts w:ascii="Calibri" w:hAnsi="Calibri" w:cs="Calibri"/>
-                <w:b w:val="0"/>
-                <w:color w:val="1F2937"/>
-                <w:sz w:val="24"/>
-              </w:rPr>
-              <w:t>27.9%</w:t>
-            </w:r>
-          </w:p>
-        </w:tc>
-        <w:tc>
-          <w:tcPr>
-            <w:tcW w:w="2409" w:type="dxa"/>
-            <w:vAlign w:val="center"/>
-            <w:hideMark/>
-            <w:shd w:val="clear" w:color="auto" w:fill="FFFFFF"/>
-            <w:tcBorders>
-              <w:top w:val="single" w:sz="4" w:space="0" w:color="000000"/>
-              <w:left w:val="single" w:sz="4" w:space="0" w:color="000000"/>
-              <w:bottom w:val="single" w:sz="4" w:space="0" w:color="000000"/>
-              <w:right w:val="single" w:sz="4" w:space="0" w:color="000000"/>
-            </w:tcBorders>
-          </w:tcPr>
-          <w:p>
-            <w:pPr>
-              <w:spacing w:before="40" w:after="40" w:line="240" w:lineRule="auto"/>
-              <w:jc w:val="center"/>
-              <w:rPr>
-                <w:b/>
-                <w:bCs/>
-                <w:color w:val="000000"/>
-              </w:rPr>
-            </w:pPr>
-            <w:r>
-              <w:rPr>
-                <w:rFonts w:ascii="Calibri" w:hAnsi="Calibri" w:cs="Calibri"/>
-                <w:b w:val="0"/>
-                <w:bCs/>
-                <w:color w:val="1F2937"/>
-                <w:sz w:val="24"/>
-              </w:rPr>
-              <w:t>43.7%</w:t>
-            </w:r>
-          </w:p>
-        </w:tc>
-        <w:tc>
-          <w:tcPr>
-            <w:tcW w:w="1985" w:type="dxa"/>
-            <w:vAlign w:val="center"/>
-            <w:hideMark/>
-            <w:shd w:val="clear" w:color="auto" w:fill="FFFFFF"/>
-            <w:tcBorders>
-              <w:top w:val="single" w:sz="4" w:space="0" w:color="000000"/>
-              <w:left w:val="single" w:sz="4" w:space="0" w:color="000000"/>
-              <w:bottom w:val="single" w:sz="4" w:space="0" w:color="000000"/>
-              <w:right w:val="single" w:sz="4" w:space="0" w:color="000000"/>
-            </w:tcBorders>
-          </w:tcPr>
-          <w:p>
-            <w:pPr>
-              <w:spacing w:before="40" w:after="40" w:line="240" w:lineRule="auto"/>
-              <w:jc w:val="center"/>
-              <w:rPr>
-                <w:b/>
-                <w:bCs/>
-                <w:color w:val="000000"/>
-              </w:rPr>
-            </w:pPr>
-            <w:r>
-              <w:rPr>
-                <w:rFonts w:ascii="Calibri" w:hAnsi="Calibri" w:cs="Calibri"/>
-                <w:b w:val="0"/>
-                <w:bCs/>
-                <w:color w:val="1F2937"/>
-                <w:sz w:val="24"/>
-              </w:rPr>
-              <w:t>21.9%</w:t>
-            </w:r>
-          </w:p>
-        </w:tc>
-      </w:tr>
-      <w:tr>
-        <w:trPr>
-          <w:trHeight w:val="454"/>
-        </w:trPr>
-        <w:tc>
-          <w:tcPr>
-            <w:tcW w:w="2127" w:type="dxa"/>
-            <w:vAlign w:val="center"/>
-            <w:hideMark/>
-            <w:shd w:val="clear" w:color="auto" w:fill="FFFFFF"/>
-            <w:tcBorders>
-              <w:top w:val="single" w:sz="4" w:space="0" w:color="000000"/>
-              <w:left w:val="single" w:sz="4" w:space="0" w:color="000000"/>
-              <w:bottom w:val="single" w:sz="4" w:space="0" w:color="000000"/>
-              <w:right w:val="single" w:sz="4" w:space="0" w:color="000000"/>
-            </w:tcBorders>
-          </w:tcPr>
-          <w:p>
-            <w:pPr>
-              <w:spacing w:before="40" w:after="40" w:line="240" w:lineRule="auto"/>
-              <w:jc w:val="center"/>
-              <w:rPr>
-                <w:b/>
-                <w:bCs/>
-                <w:color w:val="000000"/>
-              </w:rPr>
-            </w:pPr>
-            <w:r>
-              <w:rPr>
-                <w:rFonts w:ascii="Calibri" w:hAnsi="Calibri" w:cs="Calibri"/>
-                <w:b/>
-                <w:bCs/>
-                <w:color w:val="1F2937"/>
-                <w:sz w:val="24"/>
-              </w:rPr>
-              <w:t>1150</w:t>
-            </w:r>
-          </w:p>
-        </w:tc>
-        <w:tc>
-          <w:tcPr>
-            <w:tcW w:w="2835" w:type="dxa"/>
-            <w:vAlign w:val="center"/>
-            <w:hideMark/>
-            <w:shd w:val="clear" w:color="auto" w:fill="FFFFFF"/>
-            <w:tcBorders>
-              <w:top w:val="single" w:sz="4" w:space="0" w:color="000000"/>
-              <w:left w:val="single" w:sz="4" w:space="0" w:color="000000"/>
-              <w:bottom w:val="single" w:sz="4" w:space="0" w:color="000000"/>
-              <w:right w:val="single" w:sz="4" w:space="0" w:color="000000"/>
-            </w:tcBorders>
-          </w:tcPr>
-          <w:p>
-            <w:pPr>
-              <w:spacing w:before="40" w:after="40" w:line="240" w:lineRule="auto"/>
-              <w:jc w:val="center"/>
-              <w:rPr>
-                <w:color w:val="000000"/>
-              </w:rPr>
-            </w:pPr>
-            <w:r>
-              <w:rPr>
-                <w:rFonts w:ascii="Calibri" w:hAnsi="Calibri" w:cs="Calibri"/>
-                <w:b w:val="0"/>
-                <w:color w:val="1F2937"/>
-                <w:sz w:val="24"/>
-              </w:rPr>
-              <w:t>28.9%</w:t>
-            </w:r>
-          </w:p>
-        </w:tc>
-        <w:tc>
-          <w:tcPr>
-            <w:tcW w:w="2409" w:type="dxa"/>
-            <w:vAlign w:val="center"/>
-            <w:hideMark/>
-            <w:shd w:val="clear" w:color="auto" w:fill="FFFFFF"/>
-            <w:tcBorders>
-              <w:top w:val="single" w:sz="4" w:space="0" w:color="000000"/>
-              <w:left w:val="single" w:sz="4" w:space="0" w:color="000000"/>
-              <w:bottom w:val="single" w:sz="4" w:space="0" w:color="000000"/>
-              <w:right w:val="single" w:sz="4" w:space="0" w:color="000000"/>
-            </w:tcBorders>
-          </w:tcPr>
-          <w:p>
-            <w:pPr>
-              <w:spacing w:before="40" w:after="40" w:line="240" w:lineRule="auto"/>
-              <w:jc w:val="center"/>
-              <w:rPr>
-                <w:b/>
-                <w:bCs/>
-                <w:color w:val="000000"/>
-              </w:rPr>
-            </w:pPr>
-            <w:r>
-              <w:rPr>
-                <w:rFonts w:ascii="Calibri" w:hAnsi="Calibri" w:cs="Calibri"/>
-                <w:b w:val="0"/>
-                <w:bCs/>
-                <w:color w:val="1F2937"/>
-                <w:sz w:val="24"/>
-              </w:rPr>
-              <w:t>44.9%</w:t>
-            </w:r>
-          </w:p>
-        </w:tc>
-        <w:tc>
-          <w:tcPr>
-            <w:tcW w:w="1985" w:type="dxa"/>
-            <w:vAlign w:val="center"/>
-            <w:hideMark/>
-            <w:shd w:val="clear" w:color="auto" w:fill="FFFFFF"/>
-            <w:tcBorders>
-              <w:top w:val="single" w:sz="4" w:space="0" w:color="000000"/>
-              <w:left w:val="single" w:sz="4" w:space="0" w:color="000000"/>
-              <w:bottom w:val="single" w:sz="4" w:space="0" w:color="000000"/>
-              <w:right w:val="single" w:sz="4" w:space="0" w:color="000000"/>
-            </w:tcBorders>
-          </w:tcPr>
-          <w:p>
-            <w:pPr>
-              <w:spacing w:before="40" w:after="40" w:line="240" w:lineRule="auto"/>
-              <w:jc w:val="center"/>
-              <w:rPr>
-                <w:b/>
-                <w:bCs/>
-                <w:color w:val="000000"/>
-              </w:rPr>
-            </w:pPr>
-            <w:r>
-              <w:rPr>
-                <w:rFonts w:ascii="Calibri" w:hAnsi="Calibri" w:cs="Calibri"/>
-                <w:b w:val="0"/>
-                <w:bCs/>
-                <w:color w:val="1F2937"/>
-                <w:sz w:val="24"/>
-              </w:rPr>
-              <w:t>22.5%</w:t>
-            </w:r>
-          </w:p>
-        </w:tc>
-      </w:tr>
-      <w:tr>
-        <w:trPr>
-          <w:trHeight w:val="454"/>
-        </w:trPr>
-        <w:tc>
-          <w:tcPr>
-            <w:tcW w:w="2127" w:type="dxa"/>
-            <w:vAlign w:val="center"/>
-            <w:hideMark/>
-            <w:shd w:val="clear" w:color="auto" w:fill="FFFFFF"/>
-            <w:tcBorders>
-              <w:top w:val="single" w:sz="4" w:space="0" w:color="000000"/>
-              <w:left w:val="single" w:sz="4" w:space="0" w:color="000000"/>
-              <w:bottom w:val="single" w:sz="4" w:space="0" w:color="000000"/>
-              <w:right w:val="single" w:sz="4" w:space="0" w:color="000000"/>
-            </w:tcBorders>
-          </w:tcPr>
-          <w:p>
-            <w:pPr>
-              <w:spacing w:before="40" w:after="40" w:line="240" w:lineRule="auto"/>
-              <w:jc w:val="center"/>
-              <w:rPr>
-                <w:b/>
-                <w:bCs/>
-                <w:color w:val="000000"/>
-              </w:rPr>
-            </w:pPr>
-            <w:r>
-              <w:rPr>
-                <w:rFonts w:ascii="Calibri" w:hAnsi="Calibri" w:cs="Calibri"/>
-                <w:b/>
-                <w:bCs/>
-                <w:color w:val="1F2937"/>
-                <w:sz w:val="24"/>
-              </w:rPr>
-              <w:t>1500</w:t>
-            </w:r>
-          </w:p>
-        </w:tc>
-        <w:tc>
-          <w:tcPr>
-            <w:tcW w:w="2835" w:type="dxa"/>
-            <w:vAlign w:val="center"/>
-            <w:hideMark/>
-            <w:shd w:val="clear" w:color="auto" w:fill="FFFFFF"/>
-            <w:tcBorders>
-              <w:top w:val="single" w:sz="4" w:space="0" w:color="000000"/>
-              <w:left w:val="single" w:sz="4" w:space="0" w:color="000000"/>
-              <w:bottom w:val="single" w:sz="4" w:space="0" w:color="000000"/>
-              <w:right w:val="single" w:sz="4" w:space="0" w:color="000000"/>
-            </w:tcBorders>
-          </w:tcPr>
-          <w:p>
-            <w:pPr>
-              <w:spacing w:before="40" w:after="40" w:line="240" w:lineRule="auto"/>
-              <w:jc w:val="center"/>
-              <w:rPr>
-                <w:color w:val="000000"/>
-              </w:rPr>
-            </w:pPr>
-            <w:r>
-              <w:rPr>
-                <w:rFonts w:ascii="Calibri" w:hAnsi="Calibri" w:cs="Calibri"/>
-                <w:b w:val="0"/>
-                <w:color w:val="1F2937"/>
-                <w:sz w:val="24"/>
-              </w:rPr>
-              <w:t>30.0%</w:t>
-            </w:r>
-          </w:p>
-        </w:tc>
-        <w:tc>
-          <w:tcPr>
-            <w:tcW w:w="2409" w:type="dxa"/>
-            <w:vAlign w:val="center"/>
-            <w:hideMark/>
-            <w:shd w:val="clear" w:color="auto" w:fill="FFFFFF"/>
-            <w:tcBorders>
-              <w:top w:val="single" w:sz="4" w:space="0" w:color="000000"/>
-              <w:left w:val="single" w:sz="4" w:space="0" w:color="000000"/>
-              <w:bottom w:val="single" w:sz="4" w:space="0" w:color="000000"/>
-              <w:right w:val="single" w:sz="4" w:space="0" w:color="000000"/>
-            </w:tcBorders>
-          </w:tcPr>
-          <w:p>
-            <w:pPr>
-              <w:spacing w:before="40" w:after="40" w:line="240" w:lineRule="auto"/>
-              <w:jc w:val="center"/>
-              <w:rPr>
-                <w:b/>
-                <w:bCs/>
-                <w:color w:val="000000"/>
-              </w:rPr>
-            </w:pPr>
-            <w:r>
-              <w:rPr>
-                <w:rFonts w:ascii="Calibri" w:hAnsi="Calibri" w:cs="Calibri"/>
-                <w:b w:val="0"/>
-                <w:bCs/>
-                <w:color w:val="1F2937"/>
-                <w:sz w:val="24"/>
-              </w:rPr>
-              <w:t>46.2%</w:t>
-            </w:r>
-          </w:p>
-        </w:tc>
-        <w:tc>
-          <w:tcPr>
-            <w:tcW w:w="1985" w:type="dxa"/>
-            <w:vAlign w:val="center"/>
-            <w:hideMark/>
-            <w:shd w:val="clear" w:color="auto" w:fill="FFFFFF"/>
-            <w:tcBorders>
-              <w:top w:val="single" w:sz="4" w:space="0" w:color="000000"/>
-              <w:left w:val="single" w:sz="4" w:space="0" w:color="000000"/>
-              <w:bottom w:val="single" w:sz="4" w:space="0" w:color="000000"/>
-              <w:right w:val="single" w:sz="4" w:space="0" w:color="000000"/>
-            </w:tcBorders>
-          </w:tcPr>
-          <w:p>
-            <w:pPr>
-              <w:spacing w:before="40" w:after="40" w:line="240" w:lineRule="auto"/>
-              <w:jc w:val="center"/>
-              <w:rPr>
-                <w:b/>
-                <w:bCs/>
-                <w:color w:val="000000"/>
-              </w:rPr>
-            </w:pPr>
-            <w:r>
-              <w:rPr>
-                <w:rFonts w:ascii="Calibri" w:hAnsi="Calibri" w:cs="Calibri"/>
-                <w:b w:val="0"/>
-                <w:bCs/>
-                <w:color w:val="1F2937"/>
-                <w:sz w:val="24"/>
-              </w:rPr>
-              <w:t>23.1%</w:t>
-            </w:r>
-          </w:p>
-        </w:tc>
-      </w:tr>
-    </w:tbl>
-    <w:p>
-      <w:pPr>
-        <w:pStyle w:val="Heading3"/>
-        <w:spacing w:after="80" w:before="200"/>
-      </w:pPr>
-      <w:r>
-        <w:rPr>
-          <w:rFonts w:ascii="Calibri" w:cs="Calibri" w:eastAsia="Calibri" w:hAnsi="Calibri"/>
-          <w:b/>
-          <w:bCs/>
-          <w:color w:val="1F2937"/>
-          <w:sz w:val="22"/>
-          <w:szCs w:val="22"/>
-        </w:rPr>
-        <w:t>CLIENT DETAILS</w:t>
-      </w:r>
-    </w:p>
-    <w:tbl>
-      <w:tblPr>
-        <w:tblW w:type="dxa" w:w="9360"/>
-        <w:tblBorders>
-          <w:top w:val="single" w:color="auto" w:sz="4"/>
-          <w:left w:val="single" w:color="auto" w:sz="4"/>
-          <w:bottom w:val="single" w:color="auto" w:sz="4"/>
-          <w:right w:val="single" w:color="auto" w:sz="4"/>
-          <w:insideH w:val="single" w:color="auto" w:sz="4"/>
-          <w:insideV w:val="single" w:color="auto" w:sz="4"/>
-        </w:tblBorders>
-      </w:tblPr>
-      <w:tblGrid>
-        <w:gridCol w:w="3120"/>
-        <w:gridCol w:w="6240"/>
-      </w:tblGrid>
-      <w:tr>
-        <w:tc>
-          <w:tcPr>
-            <w:tcW w:type="dxa" w:w="3120"/>
-            <w:tcBorders>
-              <w:top w:val="single" w:color="BFBFBF" w:sz="4"/>
-              <w:left w:val="single" w:color="BFBFBF" w:sz="4"/>
-              <w:bottom w:val="single" w:color="BFBFBF" w:sz="4"/>
-              <w:right w:val="single" w:color="BFBFBF" w:sz="4"/>
-            </w:tcBorders>
-            <w:shd w:fill="F3F4F6" w:val="clear"/>
-            <w:tcMar>
-              <w:top w:type="dxa" w:w="100"/>
-              <w:left w:type="dxa" w:w="140"/>
-              <w:bottom w:type="dxa" w:w="100"/>
-              <w:right w:type="dxa" w:w="140"/>
-            </w:tcMar>
-            <w:vAlign w:val="center"/>
-          </w:tcPr>
-          <w:p>
-            <w:pPr>
-              <w:spacing w:after="40" w:before="40"/>
-              <w:jc w:val="left"/>
-            </w:pPr>
-            <w:r>
-              <w:rPr>
-                <w:rFonts w:ascii="Calibri" w:cs="Calibri" w:eastAsia="Calibri" w:hAnsi="Calibri"/>
-                <w:b/>
-                <w:bCs/>
-                <w:sz w:val="22"/>
-                <w:szCs w:val="22"/>
-              </w:rPr>
-              <w:t xml:space="preserve">Company</w:t>
-            </w:r>
-          </w:p>
-        </w:tc>
-        <w:tc>
-          <w:tcPr>
-            <w:tcW w:type="dxa" w:w="6240"/>
-            <w:tcBorders>
-              <w:top w:val="single" w:color="BFBFBF" w:sz="4"/>
-              <w:left w:val="single" w:color="BFBFBF" w:sz="4"/>
-              <w:bottom w:val="single" w:color="BFBFBF" w:sz="4"/>
-              <w:right w:val="single" w:color="BFBFBF" w:sz="4"/>
-            </w:tcBorders>
-            <w:tcMar>
-              <w:top w:type="dxa" w:w="100"/>
-              <w:left w:type="dxa" w:w="140"/>
-              <w:bottom w:type="dxa" w:w="100"/>
-              <w:right w:type="dxa" w:w="140"/>
-            </w:tcMar>
-            <w:vAlign w:val="center"/>
-          </w:tcPr>
-          <w:p>
-            <w:pPr>
-              <w:spacing w:after="40" w:before="40"/>
-              <w:jc w:val="left"/>
-            </w:pPr>
-            <w:r>
-              <w:t>{{company_name}}</w:t>
-            </w:r>
-          </w:p>
-        </w:tc>
-      </w:tr>
-      <w:tr>
-        <w:tc>
-          <w:tcPr>
-            <w:tcW w:type="dxa" w:w="3120"/>
-            <w:tcBorders>
-              <w:top w:val="single" w:color="BFBFBF" w:sz="4"/>
-              <w:left w:val="single" w:color="BFBFBF" w:sz="4"/>
-              <w:bottom w:val="single" w:color="BFBFBF" w:sz="4"/>
-              <w:right w:val="single" w:color="BFBFBF" w:sz="4"/>
-            </w:tcBorders>
-            <w:shd w:fill="F3F4F6" w:val="clear"/>
-            <w:tcMar>
-              <w:top w:type="dxa" w:w="100"/>
-              <w:left w:type="dxa" w:w="140"/>
-              <w:bottom w:type="dxa" w:w="100"/>
-              <w:right w:type="dxa" w:w="140"/>
-            </w:tcMar>
-            <w:vAlign w:val="center"/>
-          </w:tcPr>
-          <w:p>
-            <w:pPr>
-              <w:spacing w:after="40" w:before="40"/>
-              <w:jc w:val="left"/>
-            </w:pPr>
-            <w:r>
-              <w:rPr>
-                <w:rFonts w:ascii="Calibri" w:cs="Calibri" w:eastAsia="Calibri" w:hAnsi="Calibri"/>
-                <w:b/>
-                <w:bCs/>
-                <w:sz w:val="22"/>
-                <w:szCs w:val="22"/>
-              </w:rPr>
-              <w:t xml:space="preserve">Contact Person</w:t>
-            </w:r>
-          </w:p>
-        </w:tc>
-        <w:tc>
-          <w:tcPr>
-            <w:tcW w:type="dxa" w:w="6240"/>
-            <w:tcBorders>
-              <w:top w:val="single" w:color="BFBFBF" w:sz="4"/>
-              <w:left w:val="single" w:color="BFBFBF" w:sz="4"/>
-              <w:bottom w:val="single" w:color="BFBFBF" w:sz="4"/>
-              <w:right w:val="single" w:color="BFBFBF" w:sz="4"/>
-            </w:tcBorders>
-            <w:tcMar>
-              <w:top w:type="dxa" w:w="100"/>
-              <w:left w:type="dxa" w:w="140"/>
-              <w:bottom w:type="dxa" w:w="100"/>
-              <w:right w:type="dxa" w:w="140"/>
-            </w:tcMar>
-            <w:vAlign w:val="center"/>
-          </w:tcPr>
-          <w:p>
-            <w:pPr>
-              <w:spacing w:after="40" w:before="40"/>
-              <w:jc w:val="left"/>
-            </w:pPr>
-            <w:r>
-              <w:t>{{poc_name}}</w:t>
-            </w:r>
-          </w:p>
-        </w:tc>
-      </w:tr>
-      <w:tr>
-        <w:tc>
-          <w:tcPr>
-            <w:tcW w:type="dxa" w:w="3120"/>
-            <w:tcBorders>
-              <w:top w:val="single" w:color="BFBFBF" w:sz="4"/>
-              <w:left w:val="single" w:color="BFBFBF" w:sz="4"/>
-              <w:bottom w:val="single" w:color="BFBFBF" w:sz="4"/>
-              <w:right w:val="single" w:color="BFBFBF" w:sz="4"/>
-            </w:tcBorders>
-            <w:shd w:fill="F3F4F6" w:val="clear"/>
-            <w:tcMar>
-              <w:top w:type="dxa" w:w="100"/>
-              <w:left w:type="dxa" w:w="140"/>
-              <w:bottom w:type="dxa" w:w="100"/>
-              <w:right w:type="dxa" w:w="140"/>
-            </w:tcMar>
-            <w:vAlign w:val="center"/>
-          </w:tcPr>
-          <w:p>
-            <w:pPr>
-              <w:spacing w:after="40" w:before="40"/>
-              <w:jc w:val="left"/>
-            </w:pPr>
-            <w:r>
-              <w:rPr>
-                <w:rFonts w:ascii="Calibri" w:cs="Calibri" w:eastAsia="Calibri" w:hAnsi="Calibri"/>
-                <w:b/>
-                <w:bCs/>
-                <w:sz w:val="22"/>
-                <w:szCs w:val="22"/>
-              </w:rPr>
-              <w:t xml:space="preserve">Designation</w:t>
-            </w:r>
-          </w:p>
-        </w:tc>
-        <w:tc>
-          <w:tcPr>
-            <w:tcW w:type="dxa" w:w="6240"/>
-            <w:tcBorders>
-              <w:top w:val="single" w:color="BFBFBF" w:sz="4"/>
-              <w:left w:val="single" w:color="BFBFBF" w:sz="4"/>
-              <w:bottom w:val="single" w:color="BFBFBF" w:sz="4"/>
-              <w:right w:val="single" w:color="BFBFBF" w:sz="4"/>
-            </w:tcBorders>
-            <w:tcMar>
-              <w:top w:type="dxa" w:w="100"/>
-              <w:left w:type="dxa" w:w="140"/>
-              <w:bottom w:type="dxa" w:w="100"/>
-              <w:right w:type="dxa" w:w="140"/>
-            </w:tcMar>
-            <w:vAlign w:val="center"/>
-          </w:tcPr>
-          <w:p>
-            <w:pPr>
-              <w:spacing w:after="40" w:before="40"/>
-              <w:jc w:val="left"/>
-            </w:pPr>
-            <w:r>
-              <w:t>{{poc_designation}}</w:t>
-            </w:r>
-          </w:p>
-        </w:tc>
-      </w:tr>
-      <w:tr>
-        <w:tc>
-          <w:tcPr>
-            <w:tcW w:type="dxa" w:w="3120"/>
-            <w:tcBorders>
-              <w:top w:val="single" w:color="BFBFBF" w:sz="4"/>
-              <w:left w:val="single" w:color="BFBFBF" w:sz="4"/>
-              <w:bottom w:val="single" w:color="BFBFBF" w:sz="4"/>
-              <w:right w:val="single" w:color="BFBFBF" w:sz="4"/>
-            </w:tcBorders>
-            <w:shd w:fill="F3F4F6" w:val="clear"/>
-            <w:tcMar>
-              <w:top w:type="dxa" w:w="100"/>
-              <w:left w:type="dxa" w:w="140"/>
-              <w:bottom w:type="dxa" w:w="100"/>
-              <w:right w:type="dxa" w:w="140"/>
-            </w:tcMar>
-            <w:vAlign w:val="center"/>
-          </w:tcPr>
-          <w:p>
-            <w:pPr>
-              <w:spacing w:after="40" w:before="40"/>
-              <w:jc w:val="left"/>
-            </w:pPr>
-            <w:r>
-              <w:rPr>
-                <w:rFonts w:ascii="Calibri" w:cs="Calibri" w:eastAsia="Calibri" w:hAnsi="Calibri"/>
-                <w:b/>
-                <w:bCs/>
-                <w:sz w:val="22"/>
-                <w:szCs w:val="22"/>
-              </w:rPr>
-              <w:t xml:space="preserve">Contact No.</w:t>
-            </w:r>
-          </w:p>
-        </w:tc>
-        <w:tc>
-          <w:tcPr>
-            <w:tcW w:type="dxa" w:w="6240"/>
-            <w:tcBorders>
-              <w:top w:val="single" w:color="BFBFBF" w:sz="4"/>
-              <w:left w:val="single" w:color="BFBFBF" w:sz="4"/>
-              <w:bottom w:val="single" w:color="BFBFBF" w:sz="4"/>
-              <w:right w:val="single" w:color="BFBFBF" w:sz="4"/>
-            </w:tcBorders>
-            <w:tcMar>
-              <w:top w:type="dxa" w:w="100"/>
-              <w:left w:type="dxa" w:w="140"/>
-              <w:bottom w:type="dxa" w:w="100"/>
-              <w:right w:type="dxa" w:w="140"/>
-            </w:tcMar>
-            <w:vAlign w:val="center"/>
-          </w:tcPr>
-          <w:p>
-            <w:pPr>
-              <w:spacing w:after="40" w:before="40"/>
-              <w:jc w:val="left"/>
-            </w:pPr>
-            <w:r>
-              <w:t>{{mobile_no}}</w:t>
-            </w:r>
-          </w:p>
-        </w:tc>
-      </w:tr>
-      <w:tr>
-        <w:tc>
-          <w:tcPr>
-            <w:tcW w:type="dxa" w:w="3120"/>
-            <w:tcBorders>
-              <w:top w:val="single" w:color="BFBFBF" w:sz="4"/>
-              <w:left w:val="single" w:color="BFBFBF" w:sz="4"/>
-              <w:bottom w:val="single" w:color="BFBFBF" w:sz="4"/>
-              <w:right w:val="single" w:color="BFBFBF" w:sz="4"/>
-            </w:tcBorders>
-            <w:shd w:fill="F3F4F6" w:val="clear"/>
-            <w:tcMar>
-              <w:top w:type="dxa" w:w="100"/>
-              <w:left w:type="dxa" w:w="140"/>
-              <w:bottom w:type="dxa" w:w="100"/>
-              <w:right w:type="dxa" w:w="140"/>
-            </w:tcMar>
-            <w:vAlign w:val="center"/>
-          </w:tcPr>
-          <w:p>
-            <w:pPr>
-              <w:spacing w:after="40" w:before="40"/>
-              <w:jc w:val="left"/>
-            </w:pPr>
-            <w:r>
-              <w:rPr>
-                <w:rFonts w:ascii="Calibri" w:cs="Calibri" w:eastAsia="Calibri" w:hAnsi="Calibri"/>
-                <w:b/>
-                <w:bCs/>
-                <w:sz w:val="22"/>
-                <w:szCs w:val="22"/>
-              </w:rPr>
-              <w:t xml:space="preserve">Email</w:t>
-            </w:r>
-          </w:p>
-        </w:tc>
-        <w:tc>
-          <w:tcPr>
-            <w:tcW w:type="dxa" w:w="6240"/>
-            <w:tcBorders>
-              <w:top w:val="single" w:color="BFBFBF" w:sz="4"/>
-              <w:left w:val="single" w:color="BFBFBF" w:sz="4"/>
-              <w:bottom w:val="single" w:color="BFBFBF" w:sz="4"/>
-              <w:right w:val="single" w:color="BFBFBF" w:sz="4"/>
-            </w:tcBorders>
-            <w:tcMar>
-              <w:top w:type="dxa" w:w="100"/>
-              <w:left w:type="dxa" w:w="140"/>
-              <w:bottom w:type="dxa" w:w="100"/>
-              <w:right w:type="dxa" w:w="140"/>
-            </w:tcMar>
-            <w:vAlign w:val="center"/>
-          </w:tcPr>
-          <w:p>
-            <w:pPr>
-              <w:spacing w:after="40" w:before="40"/>
-              <w:jc w:val="left"/>
-            </w:pPr>
-            <w:r>
-              <w:t>{{email}}</w:t>
-            </w:r>
-          </w:p>
-        </w:tc>
-      </w:tr>
-    </w:tbl>
-    <w:p>
-      <w:pPr>
-        <w:pStyle w:val="Heading3"/>
-        <w:spacing w:after="80" w:before="200"/>
-      </w:pPr>
-      <w:r>
-        <w:rPr>
-          <w:rFonts w:ascii="Calibri" w:cs="Calibri" w:eastAsia="Calibri" w:hAnsi="Calibri"/>
-          <w:b/>
-          <w:bCs/>
-          <w:color w:val="1F2937"/>
-          <w:sz w:val="22"/>
-          <w:szCs w:val="22"/>
-        </w:rPr>
-        <w:t>MARKETING PERSON DETAILS</w:t>
-      </w:r>
-    </w:p>
-    <w:tbl>
-      <w:tblPr>
-        <w:tblW w:type="dxa" w:w="9360"/>
-        <w:tblBorders>
-          <w:top w:val="single" w:color="auto" w:sz="4"/>
-          <w:left w:val="single" w:color="auto" w:sz="4"/>
-          <w:bottom w:val="single" w:color="auto" w:sz="4"/>
-          <w:right w:val="single" w:color="auto" w:sz="4"/>
-          <w:insideH w:val="single" w:color="auto" w:sz="4"/>
-          <w:insideV w:val="single" w:color="auto" w:sz="4"/>
-        </w:tblBorders>
-      </w:tblPr>
-      <w:tblGrid>
-        <w:gridCol w:w="3120"/>
-        <w:gridCol w:w="6240"/>
-      </w:tblGrid>
-      <w:tr>
-        <w:tc>
-          <w:tcPr>
-            <w:tcW w:type="dxa" w:w="3120"/>
-            <w:tcBorders>
-              <w:top w:val="single" w:color="BFBFBF" w:sz="4"/>
-              <w:left w:val="single" w:color="BFBFBF" w:sz="4"/>
-              <w:bottom w:val="single" w:color="BFBFBF" w:sz="4"/>
-              <w:right w:val="single" w:color="BFBFBF" w:sz="4"/>
-            </w:tcBorders>
-            <w:shd w:fill="F3F4F6" w:val="clear"/>
-            <w:tcMar>
-              <w:top w:type="dxa" w:w="100"/>
-              <w:left w:type="dxa" w:w="140"/>
-              <w:bottom w:type="dxa" w:w="100"/>
-              <w:right w:type="dxa" w:w="140"/>
-            </w:tcMar>
-            <w:vAlign w:val="center"/>
-          </w:tcPr>
-          <w:p>
-            <w:pPr>
-              <w:spacing w:after="40" w:before="40"/>
-              <w:jc w:val="left"/>
-            </w:pPr>
-            <w:r>
-              <w:rPr>
-                <w:rFonts w:ascii="Calibri" w:cs="Calibri" w:eastAsia="Calibri" w:hAnsi="Calibri"/>
-                <w:b/>
-                <w:bCs/>
-                <w:sz w:val="22"/>
-                <w:szCs w:val="22"/>
-              </w:rPr>
-              <w:t xml:space="preserve">Name</w:t>
-            </w:r>
-          </w:p>
-        </w:tc>
-        <w:tc>
-          <w:tcPr>
-            <w:tcW w:type="dxa" w:w="6240"/>
-            <w:tcBorders>
-              <w:top w:val="single" w:color="BFBFBF" w:sz="4"/>
-              <w:left w:val="single" w:color="BFBFBF" w:sz="4"/>
-              <w:bottom w:val="single" w:color="BFBFBF" w:sz="4"/>
-              <w:right w:val="single" w:color="BFBFBF" w:sz="4"/>
-            </w:tcBorders>
-            <w:tcMar>
-              <w:top w:type="dxa" w:w="100"/>
-              <w:left w:type="dxa" w:w="140"/>
-              <w:bottom w:type="dxa" w:w="100"/>
-              <w:right w:type="dxa" w:w="140"/>
-            </w:tcMar>
-            <w:vAlign w:val="center"/>
-          </w:tcPr>
-          <w:p>
-            <w:pPr>
-              <w:spacing w:after="40" w:before="40"/>
-              <w:jc w:val="left"/>
-            </w:pPr>
-            <w:r>
-              <w:t>{{marketing_person}}</w:t>
-            </w:r>
-          </w:p>
-        </w:tc>
-      </w:tr>
-      <w:tr>
-        <w:tc>
-          <w:tcPr>
-            <w:tcW w:type="dxa" w:w="3120"/>
-            <w:tcBorders>
-              <w:top w:val="single" w:color="BFBFBF" w:sz="4"/>
-              <w:left w:val="single" w:color="BFBFBF" w:sz="4"/>
-              <w:bottom w:val="single" w:color="BFBFBF" w:sz="4"/>
-              <w:right w:val="single" w:color="BFBFBF" w:sz="4"/>
-            </w:tcBorders>
-            <w:shd w:fill="F3F4F6" w:val="clear"/>
-            <w:tcMar>
-              <w:top w:type="dxa" w:w="100"/>
-              <w:left w:type="dxa" w:w="140"/>
-              <w:bottom w:type="dxa" w:w="100"/>
-              <w:right w:type="dxa" w:w="140"/>
-            </w:tcMar>
-            <w:vAlign w:val="center"/>
-          </w:tcPr>
-          <w:p>
-            <w:pPr>
-              <w:spacing w:after="40" w:before="40"/>
-              <w:jc w:val="left"/>
-            </w:pPr>
-            <w:r>
-              <w:rPr>
-                <w:rFonts w:ascii="Calibri" w:cs="Calibri" w:eastAsia="Calibri" w:hAnsi="Calibri"/>
-                <w:b/>
-                <w:bCs/>
-                <w:sz w:val="22"/>
-                <w:szCs w:val="22"/>
-              </w:rPr>
-              <w:t xml:space="preserve">Email</w:t>
-            </w:r>
-          </w:p>
-        </w:tc>
-        <w:tc>
-          <w:tcPr>
-            <w:tcW w:type="dxa" w:w="6240"/>
-            <w:tcBorders>
-              <w:top w:val="single" w:color="BFBFBF" w:sz="4"/>
-              <w:left w:val="single" w:color="BFBFBF" w:sz="4"/>
-              <w:bottom w:val="single" w:color="BFBFBF" w:sz="4"/>
-              <w:right w:val="single" w:color="BFBFBF" w:sz="4"/>
-            </w:tcBorders>
-            <w:tcMar>
-              <w:top w:type="dxa" w:w="100"/>
-              <w:left w:type="dxa" w:w="140"/>
-              <w:bottom w:type="dxa" w:w="100"/>
-              <w:right w:type="dxa" w:w="140"/>
-            </w:tcMar>
-            <w:vAlign w:val="center"/>
-          </w:tcPr>
-          <w:p>
-            <w:pPr>
-              <w:spacing w:after="40" w:before="40"/>
-              <w:jc w:val="left"/>
-            </w:pPr>
-            <w:r>
-              <w:t>{{marketing_email}}</w:t>
-            </w:r>
-          </w:p>
-        </w:tc>
-      </w:tr>
-      <w:tr>
-        <w:tc>
-          <w:tcPr>
-            <w:tcW w:type="dxa" w:w="3120"/>
-            <w:tcBorders>
-              <w:top w:val="single" w:color="BFBFBF" w:sz="4"/>
-              <w:left w:val="single" w:color="BFBFBF" w:sz="4"/>
-              <w:bottom w:val="single" w:color="BFBFBF" w:sz="4"/>
-              <w:right w:val="single" w:color="BFBFBF" w:sz="4"/>
-            </w:tcBorders>
-            <w:shd w:fill="F3F4F6" w:val="clear"/>
-            <w:tcMar>
-              <w:top w:type="dxa" w:w="100"/>
-              <w:left w:type="dxa" w:w="140"/>
-              <w:bottom w:type="dxa" w:w="100"/>
-              <w:right w:type="dxa" w:w="140"/>
-            </w:tcMar>
-            <w:vAlign w:val="center"/>
-          </w:tcPr>
-          <w:p>
-            <w:pPr>
-              <w:spacing w:after="40" w:before="40"/>
-              <w:jc w:val="left"/>
-            </w:pPr>
-            <w:r>
-              <w:rPr>
-                <w:rFonts w:ascii="Calibri" w:cs="Calibri" w:eastAsia="Calibri" w:hAnsi="Calibri"/>
-                <w:b/>
-                <w:bCs/>
-                <w:sz w:val="22"/>
-                <w:szCs w:val="22"/>
-              </w:rPr>
-              <w:t xml:space="preserve">Contact No.</w:t>
-            </w:r>
-          </w:p>
-        </w:tc>
-        <w:tc>
-          <w:tcPr>
-            <w:tcW w:type="dxa" w:w="6240"/>
-            <w:tcBorders>
-              <w:top w:val="single" w:color="BFBFBF" w:sz="4"/>
-              <w:left w:val="single" w:color="BFBFBF" w:sz="4"/>
-              <w:bottom w:val="single" w:color="BFBFBF" w:sz="4"/>
-              <w:right w:val="single" w:color="BFBFBF" w:sz="4"/>
-            </w:tcBorders>
-            <w:tcMar>
-              <w:top w:type="dxa" w:w="100"/>
-              <w:left w:type="dxa" w:w="140"/>
-              <w:bottom w:type="dxa" w:w="100"/>
-              <w:right w:type="dxa" w:w="140"/>
-            </w:tcMar>
-            <w:vAlign w:val="center"/>
-          </w:tcPr>
-          <w:p>
-            <w:pPr>
-              <w:spacing w:after="40" w:before="40"/>
-              <w:jc w:val="left"/>
-            </w:pPr>
-            <w:r>
-              <w:t>{{marketing_phone}}</w:t>
-            </w:r>
-          </w:p>
-        </w:tc>
-      </w:tr>
-    </w:tbl>
     <w:p>
       <w:pPr>
         <w:jc w:val="center"/>
@@ -2678,7 +1245,7 @@
           <w:b/>
           <w:sz w:val="20"/>
         </w:rPr>
-        <w:t>Fig 1: Parts of Regenerative Burner</w:t>
+        <w:t>Fig 2: Parts of Regenerative Burner</w:t>
       </w:r>
     </w:p>
     <w:p>
@@ -2722,55 +1289,1488 @@
     </w:p>
     <w:p>
       <w:pPr>
-        <w:jc w:val="center"/>
-      </w:pPr>
-      <w:r>
+        <w:spacing w:before="280" w:after="80"/>
+        <w:jc w:val="both"/>
         <w:rPr>
           <w:b/>
-          <w:sz w:val="20"/>
-        </w:rPr>
-        <w:t>Fig 2: Operation of Regenerative Burner</w:t>
+          <w:u w:val="single"/>
+        </w:rPr>
+      </w:pPr>
+      <w:r>
+        <w:rPr>
+          <w:rFonts w:ascii="Calibri" w:hAnsi="Calibri" w:cs="Calibri"/>
+          <w:b/>
+          <w:color w:val="1F2937"/>
+          <w:sz w:val="30"/>
+        </w:rPr>
+        <w:t>ENERGY SAVING</w:t>
       </w:r>
     </w:p>
     <w:p>
       <w:pPr>
-        <w:jc w:val="center"/>
-      </w:pPr>
-      <w:r>
-        <w:drawing>
-          <wp:inline xmlns:a="http://schemas.openxmlformats.org/drawingml/2006/main" xmlns:pic="http://schemas.openxmlformats.org/drawingml/2006/picture">
-            <wp:extent cx="5669280" cy="3931760"/>
-            <wp:docPr id="4" name="Picture 4"/>
-            <wp:cNvGraphicFramePr>
-              <a:graphicFrameLocks noChangeAspect="1"/>
-            </wp:cNvGraphicFramePr>
-            <a:graphic>
-              <a:graphicData uri="http://schemas.openxmlformats.org/drawingml/2006/picture">
-                <pic:pic>
-                  <pic:nvPicPr>
-                    <pic:cNvPr id="0" name="image.jpg"/>
-                    <pic:cNvPicPr/>
-                  </pic:nvPicPr>
-                  <pic:blipFill>
-                    <a:blip r:embed="rId18"/>
-                    <a:stretch>
-                      <a:fillRect/>
-                    </a:stretch>
-                  </pic:blipFill>
-                  <pic:spPr>
-                    <a:xfrm>
-                      <a:off x="0" y="0"/>
-                      <a:ext cx="5669280" cy="3931760"/>
-                    </a:xfrm>
-                    <a:prstGeom prst="rect"/>
-                  </pic:spPr>
-                </pic:pic>
-              </a:graphicData>
-            </a:graphic>
-          </wp:inline>
-        </w:drawing>
+        <w:pStyle w:val="NoSpacing"/>
+        <w:widowControl w:val="0"/>
+        <w:spacing w:after="120" w:line="276" w:lineRule="auto"/>
+        <w:jc w:val="both"/>
+        <w:rPr>
+          <w:rFonts w:ascii="Times New Roman" w:hAnsi="Times New Roman" w:cs="Times New Roman"/>
+          <w:sz w:val="24"/>
+          <w:szCs w:val="24"/>
+        </w:rPr>
+      </w:pPr>
+      <w:r>
+        <w:rPr>
+          <w:rFonts w:ascii="Calibri" w:hAnsi="Calibri" w:cs="Calibri"/>
+          <w:sz w:val="24"/>
+          <w:szCs w:val="24"/>
+        </w:rPr>
+        <w:t>The chart shows the Saving in natural gas in a furnace compared to a system with no recuperator, a system with a recuperator giving a preheat temperature of 400 °C</w:t>
+      </w:r>
+      <w:r>
+        <w:rPr>
+          <w:rFonts w:ascii="Times New Roman" w:hAnsi="Times New Roman" w:cs="Times New Roman"/>
+          <w:sz w:val="24"/>
+          <w:szCs w:val="24"/>
+          <w:vertAlign w:val="superscript"/>
+        </w:rPr>
+      </w:r>
+      <w:r>
+        <w:rPr>
+          <w:rFonts w:ascii="Calibri" w:hAnsi="Calibri" w:cs="Calibri"/>
+          <w:sz w:val="24"/>
+          <w:szCs w:val="24"/>
+        </w:rPr>
+        <w:t xml:space="preserve"> and with Regenerative burners operating with a preheat temperature of 1000 °C</w:t>
+      </w:r>
+      <w:r>
+        <w:rPr>
+          <w:rFonts w:ascii="Times New Roman" w:hAnsi="Times New Roman" w:cs="Times New Roman"/>
+          <w:sz w:val="24"/>
+          <w:szCs w:val="24"/>
+        </w:rPr>
+      </w:r>
+      <w:r>
+        <w:rPr>
+          <w:rFonts w:ascii="Times New Roman" w:hAnsi="Times New Roman" w:cs="Times New Roman"/>
+          <w:sz w:val="24"/>
+          <w:szCs w:val="24"/>
+        </w:rPr>
+      </w:r>
+      <w:r>
+        <w:rPr>
+          <w:rFonts w:ascii="Times New Roman" w:hAnsi="Times New Roman" w:cs="Times New Roman"/>
+          <w:sz w:val="24"/>
+          <w:szCs w:val="24"/>
+          <w:vertAlign w:val="superscript"/>
+        </w:rPr>
+      </w:r>
+      <w:r>
+        <w:rPr>
+          <w:rFonts w:ascii="Calibri" w:hAnsi="Calibri" w:cs="Calibri"/>
+          <w:sz w:val="24"/>
+          <w:szCs w:val="24"/>
+        </w:rPr>
+        <w:t xml:space="preserve">.  </w:t>
       </w:r>
     </w:p>
+    <w:tbl>
+      <w:tblPr>
+        <w:tblW w:w="9356" w:type="dxa"/>
+        <w:tblInd w:w="-5" w:type="dxa"/>
+        <w:tblLayout w:type="fixed"/>
+        <w:tblLook w:val="04A0" w:firstRow="1" w:lastRow="0" w:firstColumn="1" w:lastColumn="0" w:noHBand="0" w:noVBand="1"/>
+        <w:tblBorders>
+          <w:top w:val="single" w:sz="4" w:space="0" w:color="auto"/>
+          <w:left w:val="single" w:sz="4" w:space="0" w:color="auto"/>
+          <w:bottom w:val="single" w:sz="4" w:space="0" w:color="auto"/>
+          <w:right w:val="single" w:sz="4" w:space="0" w:color="auto"/>
+          <w:insideH w:val="single" w:sz="4" w:space="0" w:color="auto"/>
+          <w:insideV w:val="single" w:sz="4" w:space="0" w:color="auto"/>
+        </w:tblBorders>
+      </w:tblPr>
+      <w:tblGrid>
+        <w:gridCol w:w="2127"/>
+        <w:gridCol w:w="2835"/>
+        <w:gridCol w:w="2409"/>
+        <w:gridCol w:w="1985"/>
+      </w:tblGrid>
+      <w:tr>
+        <w:trPr>
+          <w:trHeight w:val="397"/>
+        </w:trPr>
+        <w:tc>
+          <w:tcPr>
+            <w:tcW w:w="9356" w:type="dxa"/>
+            <w:gridSpan w:val="4"/>
+            <w:vAlign w:val="center"/>
+            <w:hideMark/>
+            <w:shd w:val="clear" w:color="auto" w:fill="F1F5F9"/>
+            <w:tcBorders>
+              <w:top w:val="single" w:sz="4" w:space="0" w:color="000000"/>
+              <w:left w:val="single" w:sz="4" w:space="0" w:color="000000"/>
+              <w:bottom w:val="single" w:sz="4" w:space="0" w:color="000000"/>
+              <w:right w:val="single" w:sz="4" w:space="0" w:color="000000"/>
+            </w:tcBorders>
+          </w:tcPr>
+          <w:p>
+            <w:pPr>
+              <w:spacing w:before="40" w:after="40" w:line="240" w:lineRule="auto"/>
+              <w:jc w:val="center"/>
+              <w:rPr>
+                <w:color w:val="000000"/>
+              </w:rPr>
+            </w:pPr>
+            <w:r>
+              <w:rPr>
+                <w:rFonts w:ascii="Calibri" w:hAnsi="Calibri" w:cs="Calibri"/>
+                <w:b/>
+                <w:color w:val="1F2937"/>
+                <w:sz w:val="30"/>
+              </w:rPr>
+              <w:t>Savings In {{ savings_fuel }}</w:t>
+            </w:r>
+          </w:p>
+        </w:tc>
+      </w:tr>
+      <w:tr>
+        <w:trPr>
+          <w:trHeight w:val="680"/>
+        </w:trPr>
+        <w:tc>
+          <w:tcPr>
+            <w:tcW w:w="2127" w:type="dxa"/>
+            <w:vAlign w:val="center"/>
+            <w:hideMark/>
+            <w:shd w:val="clear" w:color="auto" w:fill="F1F5F9"/>
+            <w:tcBorders>
+              <w:top w:val="single" w:sz="4" w:space="0" w:color="000000"/>
+              <w:left w:val="single" w:sz="4" w:space="0" w:color="000000"/>
+              <w:bottom w:val="single" w:sz="4" w:space="0" w:color="000000"/>
+              <w:right w:val="single" w:sz="4" w:space="0" w:color="000000"/>
+            </w:tcBorders>
+          </w:tcPr>
+          <w:p>
+            <w:pPr>
+              <w:spacing w:before="40" w:after="40" w:line="240" w:lineRule="auto"/>
+              <w:jc w:val="center"/>
+              <w:rPr>
+                <w:b/>
+                <w:bCs/>
+                <w:color w:val="000000"/>
+              </w:rPr>
+            </w:pPr>
+            <w:r>
+              <w:rPr>
+                <w:rFonts w:ascii="Calibri" w:hAnsi="Calibri" w:cs="Calibri"/>
+                <w:b/>
+                <w:bCs/>
+                <w:color w:val="1F2937"/>
+                <w:sz w:val="25"/>
+              </w:rPr>
+              <w:t>Furnace Temp °C</w:t>
+            </w:r>
+          </w:p>
+        </w:tc>
+        <w:tc>
+          <w:tcPr>
+            <w:tcW w:w="2835" w:type="dxa"/>
+            <w:vAlign w:val="center"/>
+            <w:hideMark/>
+            <w:shd w:val="clear" w:color="auto" w:fill="F1F5F9"/>
+            <w:tcBorders>
+              <w:top w:val="single" w:sz="4" w:space="0" w:color="000000"/>
+              <w:left w:val="single" w:sz="4" w:space="0" w:color="000000"/>
+              <w:bottom w:val="single" w:sz="4" w:space="0" w:color="000000"/>
+              <w:right w:val="single" w:sz="4" w:space="0" w:color="000000"/>
+            </w:tcBorders>
+          </w:tcPr>
+          <w:p>
+            <w:pPr>
+              <w:spacing w:before="40" w:after="40" w:line="240" w:lineRule="auto"/>
+              <w:jc w:val="center"/>
+              <w:rPr>
+                <w:color w:val="000000"/>
+              </w:rPr>
+            </w:pPr>
+            <w:r>
+              <w:rPr>
+                <w:rFonts w:ascii="Calibri" w:hAnsi="Calibri" w:cs="Calibri"/>
+                <w:b/>
+                <w:color w:val="1F2937"/>
+                <w:sz w:val="25"/>
+              </w:rPr>
+              <w:t xml:space="preserve">Recuperator </w:t>
+            </w:r>
+            <w:r>
+              <w:rPr>
+                <w:rFonts w:ascii="Calibri" w:hAnsi="Calibri" w:cs="Calibri"/>
+                <w:b/>
+                <w:color w:val="1F2937"/>
+                <w:sz w:val="25"/>
+              </w:rPr>
+              <w:t>v</w:t>
+            </w:r>
+            <w:r>
+              <w:rPr>
+                <w:rFonts w:ascii="Calibri" w:hAnsi="Calibri" w:cs="Calibri"/>
+                <w:b/>
+                <w:color w:val="1F2937"/>
+                <w:sz w:val="25"/>
+              </w:rPr>
+              <w:t>s Cold Air</w:t>
+            </w:r>
+          </w:p>
+        </w:tc>
+        <w:tc>
+          <w:tcPr>
+            <w:tcW w:w="2409" w:type="dxa"/>
+            <w:vAlign w:val="center"/>
+            <w:hideMark/>
+            <w:shd w:val="clear" w:color="auto" w:fill="F1F5F9"/>
+            <w:tcBorders>
+              <w:top w:val="single" w:sz="4" w:space="0" w:color="000000"/>
+              <w:left w:val="single" w:sz="4" w:space="0" w:color="000000"/>
+              <w:bottom w:val="single" w:sz="4" w:space="0" w:color="000000"/>
+              <w:right w:val="single" w:sz="4" w:space="0" w:color="000000"/>
+            </w:tcBorders>
+          </w:tcPr>
+          <w:p>
+            <w:pPr>
+              <w:spacing w:before="40" w:after="40" w:line="240" w:lineRule="auto"/>
+              <w:jc w:val="center"/>
+              <w:rPr>
+                <w:color w:val="000000"/>
+              </w:rPr>
+            </w:pPr>
+            <w:r>
+              <w:rPr>
+                <w:rFonts w:ascii="Calibri" w:hAnsi="Calibri" w:cs="Calibri"/>
+                <w:b/>
+                <w:color w:val="1F2937"/>
+                <w:sz w:val="25"/>
+              </w:rPr>
+              <w:t xml:space="preserve">REGEN </w:t>
+            </w:r>
+            <w:r>
+              <w:rPr>
+                <w:rFonts w:ascii="Calibri" w:hAnsi="Calibri" w:cs="Calibri"/>
+                <w:b/>
+                <w:color w:val="1F2937"/>
+                <w:sz w:val="25"/>
+              </w:rPr>
+              <w:t>v</w:t>
+            </w:r>
+            <w:r>
+              <w:rPr>
+                <w:rFonts w:ascii="Calibri" w:hAnsi="Calibri" w:cs="Calibri"/>
+                <w:b/>
+                <w:color w:val="1F2937"/>
+                <w:sz w:val="25"/>
+              </w:rPr>
+              <w:t>s Cold Air</w:t>
+            </w:r>
+          </w:p>
+        </w:tc>
+        <w:tc>
+          <w:tcPr>
+            <w:tcW w:w="1985" w:type="dxa"/>
+            <w:vAlign w:val="center"/>
+            <w:hideMark/>
+            <w:shd w:val="clear" w:color="auto" w:fill="F1F5F9"/>
+            <w:tcBorders>
+              <w:top w:val="single" w:sz="4" w:space="0" w:color="000000"/>
+              <w:left w:val="single" w:sz="4" w:space="0" w:color="000000"/>
+              <w:bottom w:val="single" w:sz="4" w:space="0" w:color="000000"/>
+              <w:right w:val="single" w:sz="4" w:space="0" w:color="000000"/>
+            </w:tcBorders>
+          </w:tcPr>
+          <w:p>
+            <w:pPr>
+              <w:spacing w:before="40" w:after="40" w:line="240" w:lineRule="auto"/>
+              <w:jc w:val="center"/>
+              <w:rPr>
+                <w:color w:val="000000"/>
+              </w:rPr>
+            </w:pPr>
+            <w:r>
+              <w:rPr>
+                <w:rFonts w:ascii="Calibri" w:hAnsi="Calibri" w:cs="Calibri"/>
+                <w:b/>
+                <w:color w:val="1F2937"/>
+                <w:sz w:val="25"/>
+              </w:rPr>
+              <w:t xml:space="preserve">REGEN </w:t>
+            </w:r>
+            <w:r>
+              <w:rPr>
+                <w:rFonts w:ascii="Calibri" w:hAnsi="Calibri" w:cs="Calibri"/>
+                <w:b/>
+                <w:color w:val="1F2937"/>
+                <w:sz w:val="25"/>
+              </w:rPr>
+              <w:t>v</w:t>
+            </w:r>
+            <w:r>
+              <w:rPr>
+                <w:rFonts w:ascii="Calibri" w:hAnsi="Calibri" w:cs="Calibri"/>
+                <w:b/>
+                <w:color w:val="1F2937"/>
+                <w:sz w:val="25"/>
+              </w:rPr>
+              <w:t>s Recuperator</w:t>
+            </w:r>
+          </w:p>
+        </w:tc>
+      </w:tr>
+      <w:tr>
+        <w:trPr>
+          <w:trHeight w:val="454"/>
+        </w:trPr>
+        <w:tc>
+          <w:tcPr>
+            <w:tcW w:w="2127" w:type="dxa"/>
+            <w:vAlign w:val="center"/>
+            <w:hideMark/>
+            <w:shd w:val="clear" w:color="auto" w:fill="FFFFFF"/>
+            <w:tcBorders>
+              <w:top w:val="single" w:sz="4" w:space="0" w:color="000000"/>
+              <w:left w:val="single" w:sz="4" w:space="0" w:color="000000"/>
+              <w:bottom w:val="single" w:sz="4" w:space="0" w:color="000000"/>
+              <w:right w:val="single" w:sz="4" w:space="0" w:color="000000"/>
+            </w:tcBorders>
+          </w:tcPr>
+          <w:p>
+            <w:pPr>
+              <w:spacing w:before="40" w:after="40" w:line="240" w:lineRule="auto"/>
+              <w:jc w:val="center"/>
+              <w:rPr>
+                <w:b/>
+                <w:bCs/>
+                <w:color w:val="000000"/>
+              </w:rPr>
+            </w:pPr>
+            <w:r>
+              <w:rPr>
+                <w:rFonts w:ascii="Calibri" w:hAnsi="Calibri" w:cs="Calibri"/>
+                <w:b/>
+                <w:bCs/>
+                <w:color w:val="1F2937"/>
+                <w:sz w:val="24"/>
+              </w:rPr>
+              <w:t>1050</w:t>
+            </w:r>
+          </w:p>
+        </w:tc>
+        <w:tc>
+          <w:tcPr>
+            <w:tcW w:w="2835" w:type="dxa"/>
+            <w:vAlign w:val="center"/>
+            <w:hideMark/>
+            <w:shd w:val="clear" w:color="auto" w:fill="FFFFFF"/>
+            <w:tcBorders>
+              <w:top w:val="single" w:sz="4" w:space="0" w:color="000000"/>
+              <w:left w:val="single" w:sz="4" w:space="0" w:color="000000"/>
+              <w:bottom w:val="single" w:sz="4" w:space="0" w:color="000000"/>
+              <w:right w:val="single" w:sz="4" w:space="0" w:color="000000"/>
+            </w:tcBorders>
+          </w:tcPr>
+          <w:p>
+            <w:pPr>
+              <w:spacing w:before="40" w:after="40" w:line="240" w:lineRule="auto"/>
+              <w:jc w:val="center"/>
+              <w:rPr>
+                <w:color w:val="000000"/>
+              </w:rPr>
+            </w:pPr>
+            <w:r>
+              <w:rPr>
+                <w:rFonts w:ascii="Calibri" w:hAnsi="Calibri" w:cs="Calibri"/>
+                <w:b w:val="0"/>
+                <w:color w:val="1F2937"/>
+                <w:sz w:val="24"/>
+              </w:rPr>
+              <w:t>27.0%</w:t>
+            </w:r>
+          </w:p>
+        </w:tc>
+        <w:tc>
+          <w:tcPr>
+            <w:tcW w:w="2409" w:type="dxa"/>
+            <w:vAlign w:val="center"/>
+            <w:hideMark/>
+            <w:shd w:val="clear" w:color="auto" w:fill="FFFFFF"/>
+            <w:tcBorders>
+              <w:top w:val="single" w:sz="4" w:space="0" w:color="000000"/>
+              <w:left w:val="single" w:sz="4" w:space="0" w:color="000000"/>
+              <w:bottom w:val="single" w:sz="4" w:space="0" w:color="000000"/>
+              <w:right w:val="single" w:sz="4" w:space="0" w:color="000000"/>
+            </w:tcBorders>
+          </w:tcPr>
+          <w:p>
+            <w:pPr>
+              <w:spacing w:before="40" w:after="40" w:line="240" w:lineRule="auto"/>
+              <w:jc w:val="center"/>
+              <w:rPr>
+                <w:b/>
+                <w:bCs/>
+                <w:color w:val="000000"/>
+              </w:rPr>
+            </w:pPr>
+            <w:r>
+              <w:rPr>
+                <w:rFonts w:ascii="Calibri" w:hAnsi="Calibri" w:cs="Calibri"/>
+                <w:b w:val="0"/>
+                <w:bCs/>
+                <w:color w:val="1F2937"/>
+                <w:sz w:val="24"/>
+              </w:rPr>
+              <w:t>42.6%</w:t>
+            </w:r>
+          </w:p>
+        </w:tc>
+        <w:tc>
+          <w:tcPr>
+            <w:tcW w:w="1985" w:type="dxa"/>
+            <w:vAlign w:val="center"/>
+            <w:hideMark/>
+            <w:shd w:val="clear" w:color="auto" w:fill="FFFFFF"/>
+            <w:tcBorders>
+              <w:top w:val="single" w:sz="4" w:space="0" w:color="000000"/>
+              <w:left w:val="single" w:sz="4" w:space="0" w:color="000000"/>
+              <w:bottom w:val="single" w:sz="4" w:space="0" w:color="000000"/>
+              <w:right w:val="single" w:sz="4" w:space="0" w:color="000000"/>
+            </w:tcBorders>
+          </w:tcPr>
+          <w:p>
+            <w:pPr>
+              <w:spacing w:before="40" w:after="40" w:line="240" w:lineRule="auto"/>
+              <w:jc w:val="center"/>
+              <w:rPr>
+                <w:b/>
+                <w:bCs/>
+                <w:color w:val="000000"/>
+              </w:rPr>
+            </w:pPr>
+            <w:r>
+              <w:rPr>
+                <w:rFonts w:ascii="Calibri" w:hAnsi="Calibri" w:cs="Calibri"/>
+                <w:b w:val="0"/>
+                <w:bCs/>
+                <w:color w:val="1F2937"/>
+                <w:sz w:val="24"/>
+              </w:rPr>
+              <w:t>21.3%</w:t>
+            </w:r>
+          </w:p>
+        </w:tc>
+      </w:tr>
+      <w:tr>
+        <w:trPr>
+          <w:trHeight w:val="454"/>
+        </w:trPr>
+        <w:tc>
+          <w:tcPr>
+            <w:tcW w:w="2127" w:type="dxa"/>
+            <w:vAlign w:val="center"/>
+            <w:hideMark/>
+            <w:shd w:val="clear" w:color="auto" w:fill="FFFFFF"/>
+            <w:tcBorders>
+              <w:top w:val="single" w:sz="4" w:space="0" w:color="000000"/>
+              <w:left w:val="single" w:sz="4" w:space="0" w:color="000000"/>
+              <w:bottom w:val="single" w:sz="4" w:space="0" w:color="000000"/>
+              <w:right w:val="single" w:sz="4" w:space="0" w:color="000000"/>
+            </w:tcBorders>
+          </w:tcPr>
+          <w:p>
+            <w:pPr>
+              <w:spacing w:before="40" w:after="40" w:line="240" w:lineRule="auto"/>
+              <w:jc w:val="center"/>
+              <w:rPr>
+                <w:b/>
+                <w:bCs/>
+                <w:color w:val="000000"/>
+              </w:rPr>
+            </w:pPr>
+            <w:r>
+              <w:rPr>
+                <w:rFonts w:ascii="Calibri" w:hAnsi="Calibri" w:cs="Calibri"/>
+                <w:b/>
+                <w:bCs/>
+                <w:color w:val="1F2937"/>
+                <w:sz w:val="24"/>
+              </w:rPr>
+              <w:t>1100</w:t>
+            </w:r>
+          </w:p>
+        </w:tc>
+        <w:tc>
+          <w:tcPr>
+            <w:tcW w:w="2835" w:type="dxa"/>
+            <w:vAlign w:val="center"/>
+            <w:hideMark/>
+            <w:shd w:val="clear" w:color="auto" w:fill="FFFFFF"/>
+            <w:tcBorders>
+              <w:top w:val="single" w:sz="4" w:space="0" w:color="000000"/>
+              <w:left w:val="single" w:sz="4" w:space="0" w:color="000000"/>
+              <w:bottom w:val="single" w:sz="4" w:space="0" w:color="000000"/>
+              <w:right w:val="single" w:sz="4" w:space="0" w:color="000000"/>
+            </w:tcBorders>
+          </w:tcPr>
+          <w:p>
+            <w:pPr>
+              <w:spacing w:before="40" w:after="40" w:line="240" w:lineRule="auto"/>
+              <w:jc w:val="center"/>
+              <w:rPr>
+                <w:color w:val="000000"/>
+              </w:rPr>
+            </w:pPr>
+            <w:r>
+              <w:rPr>
+                <w:rFonts w:ascii="Calibri" w:hAnsi="Calibri" w:cs="Calibri"/>
+                <w:b w:val="0"/>
+                <w:color w:val="1F2937"/>
+                <w:sz w:val="24"/>
+              </w:rPr>
+              <w:t>27.9%</w:t>
+            </w:r>
+          </w:p>
+        </w:tc>
+        <w:tc>
+          <w:tcPr>
+            <w:tcW w:w="2409" w:type="dxa"/>
+            <w:vAlign w:val="center"/>
+            <w:hideMark/>
+            <w:shd w:val="clear" w:color="auto" w:fill="FFFFFF"/>
+            <w:tcBorders>
+              <w:top w:val="single" w:sz="4" w:space="0" w:color="000000"/>
+              <w:left w:val="single" w:sz="4" w:space="0" w:color="000000"/>
+              <w:bottom w:val="single" w:sz="4" w:space="0" w:color="000000"/>
+              <w:right w:val="single" w:sz="4" w:space="0" w:color="000000"/>
+            </w:tcBorders>
+          </w:tcPr>
+          <w:p>
+            <w:pPr>
+              <w:spacing w:before="40" w:after="40" w:line="240" w:lineRule="auto"/>
+              <w:jc w:val="center"/>
+              <w:rPr>
+                <w:b/>
+                <w:bCs/>
+                <w:color w:val="000000"/>
+              </w:rPr>
+            </w:pPr>
+            <w:r>
+              <w:rPr>
+                <w:rFonts w:ascii="Calibri" w:hAnsi="Calibri" w:cs="Calibri"/>
+                <w:b w:val="0"/>
+                <w:bCs/>
+                <w:color w:val="1F2937"/>
+                <w:sz w:val="24"/>
+              </w:rPr>
+              <w:t>43.7%</w:t>
+            </w:r>
+          </w:p>
+        </w:tc>
+        <w:tc>
+          <w:tcPr>
+            <w:tcW w:w="1985" w:type="dxa"/>
+            <w:vAlign w:val="center"/>
+            <w:hideMark/>
+            <w:shd w:val="clear" w:color="auto" w:fill="FFFFFF"/>
+            <w:tcBorders>
+              <w:top w:val="single" w:sz="4" w:space="0" w:color="000000"/>
+              <w:left w:val="single" w:sz="4" w:space="0" w:color="000000"/>
+              <w:bottom w:val="single" w:sz="4" w:space="0" w:color="000000"/>
+              <w:right w:val="single" w:sz="4" w:space="0" w:color="000000"/>
+            </w:tcBorders>
+          </w:tcPr>
+          <w:p>
+            <w:pPr>
+              <w:spacing w:before="40" w:after="40" w:line="240" w:lineRule="auto"/>
+              <w:jc w:val="center"/>
+              <w:rPr>
+                <w:b/>
+                <w:bCs/>
+                <w:color w:val="000000"/>
+              </w:rPr>
+            </w:pPr>
+            <w:r>
+              <w:rPr>
+                <w:rFonts w:ascii="Calibri" w:hAnsi="Calibri" w:cs="Calibri"/>
+                <w:b w:val="0"/>
+                <w:bCs/>
+                <w:color w:val="1F2937"/>
+                <w:sz w:val="24"/>
+              </w:rPr>
+              <w:t>21.9%</w:t>
+            </w:r>
+          </w:p>
+        </w:tc>
+      </w:tr>
+      <w:tr>
+        <w:trPr>
+          <w:trHeight w:val="454"/>
+        </w:trPr>
+        <w:tc>
+          <w:tcPr>
+            <w:tcW w:w="2127" w:type="dxa"/>
+            <w:vAlign w:val="center"/>
+            <w:hideMark/>
+            <w:shd w:val="clear" w:color="auto" w:fill="FFFFFF"/>
+            <w:tcBorders>
+              <w:top w:val="single" w:sz="4" w:space="0" w:color="000000"/>
+              <w:left w:val="single" w:sz="4" w:space="0" w:color="000000"/>
+              <w:bottom w:val="single" w:sz="4" w:space="0" w:color="000000"/>
+              <w:right w:val="single" w:sz="4" w:space="0" w:color="000000"/>
+            </w:tcBorders>
+          </w:tcPr>
+          <w:p>
+            <w:pPr>
+              <w:spacing w:before="40" w:after="40" w:line="240" w:lineRule="auto"/>
+              <w:jc w:val="center"/>
+              <w:rPr>
+                <w:b/>
+                <w:bCs/>
+                <w:color w:val="000000"/>
+              </w:rPr>
+            </w:pPr>
+            <w:r>
+              <w:rPr>
+                <w:rFonts w:ascii="Calibri" w:hAnsi="Calibri" w:cs="Calibri"/>
+                <w:b/>
+                <w:bCs/>
+                <w:color w:val="1F2937"/>
+                <w:sz w:val="24"/>
+              </w:rPr>
+              <w:t>1150</w:t>
+            </w:r>
+          </w:p>
+        </w:tc>
+        <w:tc>
+          <w:tcPr>
+            <w:tcW w:w="2835" w:type="dxa"/>
+            <w:vAlign w:val="center"/>
+            <w:hideMark/>
+            <w:shd w:val="clear" w:color="auto" w:fill="FFFFFF"/>
+            <w:tcBorders>
+              <w:top w:val="single" w:sz="4" w:space="0" w:color="000000"/>
+              <w:left w:val="single" w:sz="4" w:space="0" w:color="000000"/>
+              <w:bottom w:val="single" w:sz="4" w:space="0" w:color="000000"/>
+              <w:right w:val="single" w:sz="4" w:space="0" w:color="000000"/>
+            </w:tcBorders>
+          </w:tcPr>
+          <w:p>
+            <w:pPr>
+              <w:spacing w:before="40" w:after="40" w:line="240" w:lineRule="auto"/>
+              <w:jc w:val="center"/>
+              <w:rPr>
+                <w:color w:val="000000"/>
+              </w:rPr>
+            </w:pPr>
+            <w:r>
+              <w:rPr>
+                <w:rFonts w:ascii="Calibri" w:hAnsi="Calibri" w:cs="Calibri"/>
+                <w:b w:val="0"/>
+                <w:color w:val="1F2937"/>
+                <w:sz w:val="24"/>
+              </w:rPr>
+              <w:t>28.9%</w:t>
+            </w:r>
+          </w:p>
+        </w:tc>
+        <w:tc>
+          <w:tcPr>
+            <w:tcW w:w="2409" w:type="dxa"/>
+            <w:vAlign w:val="center"/>
+            <w:hideMark/>
+            <w:shd w:val="clear" w:color="auto" w:fill="FFFFFF"/>
+            <w:tcBorders>
+              <w:top w:val="single" w:sz="4" w:space="0" w:color="000000"/>
+              <w:left w:val="single" w:sz="4" w:space="0" w:color="000000"/>
+              <w:bottom w:val="single" w:sz="4" w:space="0" w:color="000000"/>
+              <w:right w:val="single" w:sz="4" w:space="0" w:color="000000"/>
+            </w:tcBorders>
+          </w:tcPr>
+          <w:p>
+            <w:pPr>
+              <w:spacing w:before="40" w:after="40" w:line="240" w:lineRule="auto"/>
+              <w:jc w:val="center"/>
+              <w:rPr>
+                <w:b/>
+                <w:bCs/>
+                <w:color w:val="000000"/>
+              </w:rPr>
+            </w:pPr>
+            <w:r>
+              <w:rPr>
+                <w:rFonts w:ascii="Calibri" w:hAnsi="Calibri" w:cs="Calibri"/>
+                <w:b w:val="0"/>
+                <w:bCs/>
+                <w:color w:val="1F2937"/>
+                <w:sz w:val="24"/>
+              </w:rPr>
+              <w:t>44.9%</w:t>
+            </w:r>
+          </w:p>
+        </w:tc>
+        <w:tc>
+          <w:tcPr>
+            <w:tcW w:w="1985" w:type="dxa"/>
+            <w:vAlign w:val="center"/>
+            <w:hideMark/>
+            <w:shd w:val="clear" w:color="auto" w:fill="FFFFFF"/>
+            <w:tcBorders>
+              <w:top w:val="single" w:sz="4" w:space="0" w:color="000000"/>
+              <w:left w:val="single" w:sz="4" w:space="0" w:color="000000"/>
+              <w:bottom w:val="single" w:sz="4" w:space="0" w:color="000000"/>
+              <w:right w:val="single" w:sz="4" w:space="0" w:color="000000"/>
+            </w:tcBorders>
+          </w:tcPr>
+          <w:p>
+            <w:pPr>
+              <w:spacing w:before="40" w:after="40" w:line="240" w:lineRule="auto"/>
+              <w:jc w:val="center"/>
+              <w:rPr>
+                <w:b/>
+                <w:bCs/>
+                <w:color w:val="000000"/>
+              </w:rPr>
+            </w:pPr>
+            <w:r>
+              <w:rPr>
+                <w:rFonts w:ascii="Calibri" w:hAnsi="Calibri" w:cs="Calibri"/>
+                <w:b w:val="0"/>
+                <w:bCs/>
+                <w:color w:val="1F2937"/>
+                <w:sz w:val="24"/>
+              </w:rPr>
+              <w:t>22.5%</w:t>
+            </w:r>
+          </w:p>
+        </w:tc>
+      </w:tr>
+      <w:tr>
+        <w:trPr>
+          <w:trHeight w:val="454"/>
+        </w:trPr>
+        <w:tc>
+          <w:tcPr>
+            <w:tcW w:w="2127" w:type="dxa"/>
+            <w:vAlign w:val="center"/>
+            <w:hideMark/>
+            <w:shd w:val="clear" w:color="auto" w:fill="FFFFFF"/>
+            <w:tcBorders>
+              <w:top w:val="single" w:sz="4" w:space="0" w:color="000000"/>
+              <w:left w:val="single" w:sz="4" w:space="0" w:color="000000"/>
+              <w:bottom w:val="single" w:sz="4" w:space="0" w:color="000000"/>
+              <w:right w:val="single" w:sz="4" w:space="0" w:color="000000"/>
+            </w:tcBorders>
+          </w:tcPr>
+          <w:p>
+            <w:pPr>
+              <w:spacing w:before="40" w:after="40" w:line="240" w:lineRule="auto"/>
+              <w:jc w:val="center"/>
+              <w:rPr>
+                <w:b/>
+                <w:bCs/>
+                <w:color w:val="000000"/>
+              </w:rPr>
+            </w:pPr>
+            <w:r>
+              <w:rPr>
+                <w:rFonts w:ascii="Calibri" w:hAnsi="Calibri" w:cs="Calibri"/>
+                <w:b/>
+                <w:bCs/>
+                <w:color w:val="1F2937"/>
+                <w:sz w:val="24"/>
+              </w:rPr>
+              <w:t>1500</w:t>
+            </w:r>
+          </w:p>
+        </w:tc>
+        <w:tc>
+          <w:tcPr>
+            <w:tcW w:w="2835" w:type="dxa"/>
+            <w:vAlign w:val="center"/>
+            <w:hideMark/>
+            <w:shd w:val="clear" w:color="auto" w:fill="FFFFFF"/>
+            <w:tcBorders>
+              <w:top w:val="single" w:sz="4" w:space="0" w:color="000000"/>
+              <w:left w:val="single" w:sz="4" w:space="0" w:color="000000"/>
+              <w:bottom w:val="single" w:sz="4" w:space="0" w:color="000000"/>
+              <w:right w:val="single" w:sz="4" w:space="0" w:color="000000"/>
+            </w:tcBorders>
+          </w:tcPr>
+          <w:p>
+            <w:pPr>
+              <w:spacing w:before="40" w:after="40" w:line="240" w:lineRule="auto"/>
+              <w:jc w:val="center"/>
+              <w:rPr>
+                <w:color w:val="000000"/>
+              </w:rPr>
+            </w:pPr>
+            <w:r>
+              <w:rPr>
+                <w:rFonts w:ascii="Calibri" w:hAnsi="Calibri" w:cs="Calibri"/>
+                <w:b w:val="0"/>
+                <w:color w:val="1F2937"/>
+                <w:sz w:val="24"/>
+              </w:rPr>
+              <w:t>30.0%</w:t>
+            </w:r>
+          </w:p>
+        </w:tc>
+        <w:tc>
+          <w:tcPr>
+            <w:tcW w:w="2409" w:type="dxa"/>
+            <w:vAlign w:val="center"/>
+            <w:hideMark/>
+            <w:shd w:val="clear" w:color="auto" w:fill="FFFFFF"/>
+            <w:tcBorders>
+              <w:top w:val="single" w:sz="4" w:space="0" w:color="000000"/>
+              <w:left w:val="single" w:sz="4" w:space="0" w:color="000000"/>
+              <w:bottom w:val="single" w:sz="4" w:space="0" w:color="000000"/>
+              <w:right w:val="single" w:sz="4" w:space="0" w:color="000000"/>
+            </w:tcBorders>
+          </w:tcPr>
+          <w:p>
+            <w:pPr>
+              <w:spacing w:before="40" w:after="40" w:line="240" w:lineRule="auto"/>
+              <w:jc w:val="center"/>
+              <w:rPr>
+                <w:b/>
+                <w:bCs/>
+                <w:color w:val="000000"/>
+              </w:rPr>
+            </w:pPr>
+            <w:r>
+              <w:rPr>
+                <w:rFonts w:ascii="Calibri" w:hAnsi="Calibri" w:cs="Calibri"/>
+                <w:b w:val="0"/>
+                <w:bCs/>
+                <w:color w:val="1F2937"/>
+                <w:sz w:val="24"/>
+              </w:rPr>
+              <w:t>46.2%</w:t>
+            </w:r>
+          </w:p>
+        </w:tc>
+        <w:tc>
+          <w:tcPr>
+            <w:tcW w:w="1985" w:type="dxa"/>
+            <w:vAlign w:val="center"/>
+            <w:hideMark/>
+            <w:shd w:val="clear" w:color="auto" w:fill="FFFFFF"/>
+            <w:tcBorders>
+              <w:top w:val="single" w:sz="4" w:space="0" w:color="000000"/>
+              <w:left w:val="single" w:sz="4" w:space="0" w:color="000000"/>
+              <w:bottom w:val="single" w:sz="4" w:space="0" w:color="000000"/>
+              <w:right w:val="single" w:sz="4" w:space="0" w:color="000000"/>
+            </w:tcBorders>
+          </w:tcPr>
+          <w:p>
+            <w:pPr>
+              <w:spacing w:before="40" w:after="40" w:line="240" w:lineRule="auto"/>
+              <w:jc w:val="center"/>
+              <w:rPr>
+                <w:b/>
+                <w:bCs/>
+                <w:color w:val="000000"/>
+              </w:rPr>
+            </w:pPr>
+            <w:r>
+              <w:rPr>
+                <w:rFonts w:ascii="Calibri" w:hAnsi="Calibri" w:cs="Calibri"/>
+                <w:b w:val="0"/>
+                <w:bCs/>
+                <w:color w:val="1F2937"/>
+                <w:sz w:val="24"/>
+              </w:rPr>
+              <w:t>23.1%</w:t>
+            </w:r>
+          </w:p>
+        </w:tc>
+      </w:tr>
+    </w:tbl>
+    <w:p>
+      <w:pPr>
+        <w:pStyle w:val="Heading3"/>
+        <w:spacing w:after="80" w:before="200"/>
+      </w:pPr>
+      <w:r>
+        <w:rPr>
+          <w:rFonts w:ascii="Calibri" w:cs="Calibri" w:eastAsia="Calibri" w:hAnsi="Calibri"/>
+          <w:b/>
+          <w:bCs/>
+          <w:color w:val="1F2937"/>
+          <w:sz w:val="22"/>
+          <w:szCs w:val="22"/>
+        </w:rPr>
+        <w:t>CLIENT DETAILS</w:t>
+      </w:r>
+    </w:p>
+    <w:tbl>
+      <w:tblPr>
+        <w:tblW w:type="dxa" w:w="9360"/>
+        <w:tblBorders>
+          <w:top w:val="single" w:color="auto" w:sz="4"/>
+          <w:left w:val="single" w:color="auto" w:sz="4"/>
+          <w:bottom w:val="single" w:color="auto" w:sz="4"/>
+          <w:right w:val="single" w:color="auto" w:sz="4"/>
+          <w:insideH w:val="single" w:color="auto" w:sz="4"/>
+          <w:insideV w:val="single" w:color="auto" w:sz="4"/>
+        </w:tblBorders>
+      </w:tblPr>
+      <w:tblGrid>
+        <w:gridCol w:w="3120"/>
+        <w:gridCol w:w="6240"/>
+      </w:tblGrid>
+      <w:tr>
+        <w:tc>
+          <w:tcPr>
+            <w:tcW w:type="dxa" w:w="3120"/>
+            <w:tcBorders>
+              <w:top w:val="single" w:color="BFBFBF" w:sz="4"/>
+              <w:left w:val="single" w:color="BFBFBF" w:sz="4"/>
+              <w:bottom w:val="single" w:color="BFBFBF" w:sz="4"/>
+              <w:right w:val="single" w:color="BFBFBF" w:sz="4"/>
+            </w:tcBorders>
+            <w:shd w:fill="F3F4F6" w:val="clear"/>
+            <w:tcMar>
+              <w:top w:type="dxa" w:w="100"/>
+              <w:left w:type="dxa" w:w="140"/>
+              <w:bottom w:type="dxa" w:w="100"/>
+              <w:right w:type="dxa" w:w="140"/>
+            </w:tcMar>
+            <w:vAlign w:val="center"/>
+          </w:tcPr>
+          <w:p>
+            <w:pPr>
+              <w:spacing w:after="40" w:before="40"/>
+              <w:jc w:val="left"/>
+            </w:pPr>
+            <w:r>
+              <w:rPr>
+                <w:rFonts w:ascii="Calibri" w:cs="Calibri" w:eastAsia="Calibri" w:hAnsi="Calibri"/>
+                <w:b/>
+                <w:bCs/>
+                <w:sz w:val="22"/>
+                <w:szCs w:val="22"/>
+              </w:rPr>
+              <w:t xml:space="preserve">Company</w:t>
+            </w:r>
+          </w:p>
+        </w:tc>
+        <w:tc>
+          <w:tcPr>
+            <w:tcW w:type="dxa" w:w="6240"/>
+            <w:tcBorders>
+              <w:top w:val="single" w:color="BFBFBF" w:sz="4"/>
+              <w:left w:val="single" w:color="BFBFBF" w:sz="4"/>
+              <w:bottom w:val="single" w:color="BFBFBF" w:sz="4"/>
+              <w:right w:val="single" w:color="BFBFBF" w:sz="4"/>
+            </w:tcBorders>
+            <w:tcMar>
+              <w:top w:type="dxa" w:w="100"/>
+              <w:left w:type="dxa" w:w="140"/>
+              <w:bottom w:type="dxa" w:w="100"/>
+              <w:right w:type="dxa" w:w="140"/>
+            </w:tcMar>
+            <w:vAlign w:val="center"/>
+          </w:tcPr>
+          <w:p>
+            <w:pPr>
+              <w:spacing w:after="40" w:before="40"/>
+              <w:jc w:val="left"/>
+            </w:pPr>
+            <w:r>
+              <w:t>{{company_name}}</w:t>
+            </w:r>
+          </w:p>
+        </w:tc>
+      </w:tr>
+      <w:tr>
+        <w:tc>
+          <w:tcPr>
+            <w:tcW w:type="dxa" w:w="3120"/>
+            <w:tcBorders>
+              <w:top w:val="single" w:color="BFBFBF" w:sz="4"/>
+              <w:left w:val="single" w:color="BFBFBF" w:sz="4"/>
+              <w:bottom w:val="single" w:color="BFBFBF" w:sz="4"/>
+              <w:right w:val="single" w:color="BFBFBF" w:sz="4"/>
+            </w:tcBorders>
+            <w:shd w:fill="F3F4F6" w:val="clear"/>
+            <w:tcMar>
+              <w:top w:type="dxa" w:w="100"/>
+              <w:left w:type="dxa" w:w="140"/>
+              <w:bottom w:type="dxa" w:w="100"/>
+              <w:right w:type="dxa" w:w="140"/>
+            </w:tcMar>
+            <w:vAlign w:val="center"/>
+          </w:tcPr>
+          <w:p>
+            <w:pPr>
+              <w:spacing w:after="40" w:before="40"/>
+              <w:jc w:val="left"/>
+            </w:pPr>
+            <w:r>
+              <w:rPr>
+                <w:rFonts w:ascii="Calibri" w:cs="Calibri" w:eastAsia="Calibri" w:hAnsi="Calibri"/>
+                <w:b/>
+                <w:bCs/>
+                <w:sz w:val="22"/>
+                <w:szCs w:val="22"/>
+              </w:rPr>
+              <w:t xml:space="preserve">Contact Person</w:t>
+            </w:r>
+          </w:p>
+        </w:tc>
+        <w:tc>
+          <w:tcPr>
+            <w:tcW w:type="dxa" w:w="6240"/>
+            <w:tcBorders>
+              <w:top w:val="single" w:color="BFBFBF" w:sz="4"/>
+              <w:left w:val="single" w:color="BFBFBF" w:sz="4"/>
+              <w:bottom w:val="single" w:color="BFBFBF" w:sz="4"/>
+              <w:right w:val="single" w:color="BFBFBF" w:sz="4"/>
+            </w:tcBorders>
+            <w:tcMar>
+              <w:top w:type="dxa" w:w="100"/>
+              <w:left w:type="dxa" w:w="140"/>
+              <w:bottom w:type="dxa" w:w="100"/>
+              <w:right w:type="dxa" w:w="140"/>
+            </w:tcMar>
+            <w:vAlign w:val="center"/>
+          </w:tcPr>
+          <w:p>
+            <w:pPr>
+              <w:spacing w:after="40" w:before="40"/>
+              <w:jc w:val="left"/>
+            </w:pPr>
+            <w:r>
+              <w:t>{{poc_name}}</w:t>
+            </w:r>
+          </w:p>
+        </w:tc>
+      </w:tr>
+      <w:tr>
+        <w:tc>
+          <w:tcPr>
+            <w:tcW w:type="dxa" w:w="3120"/>
+            <w:tcBorders>
+              <w:top w:val="single" w:color="BFBFBF" w:sz="4"/>
+              <w:left w:val="single" w:color="BFBFBF" w:sz="4"/>
+              <w:bottom w:val="single" w:color="BFBFBF" w:sz="4"/>
+              <w:right w:val="single" w:color="BFBFBF" w:sz="4"/>
+            </w:tcBorders>
+            <w:shd w:fill="F3F4F6" w:val="clear"/>
+            <w:tcMar>
+              <w:top w:type="dxa" w:w="100"/>
+              <w:left w:type="dxa" w:w="140"/>
+              <w:bottom w:type="dxa" w:w="100"/>
+              <w:right w:type="dxa" w:w="140"/>
+            </w:tcMar>
+            <w:vAlign w:val="center"/>
+          </w:tcPr>
+          <w:p>
+            <w:pPr>
+              <w:spacing w:after="40" w:before="40"/>
+              <w:jc w:val="left"/>
+            </w:pPr>
+            <w:r>
+              <w:rPr>
+                <w:rFonts w:ascii="Calibri" w:cs="Calibri" w:eastAsia="Calibri" w:hAnsi="Calibri"/>
+                <w:b/>
+                <w:bCs/>
+                <w:sz w:val="22"/>
+                <w:szCs w:val="22"/>
+              </w:rPr>
+              <w:t xml:space="preserve">Designation</w:t>
+            </w:r>
+          </w:p>
+        </w:tc>
+        <w:tc>
+          <w:tcPr>
+            <w:tcW w:type="dxa" w:w="6240"/>
+            <w:tcBorders>
+              <w:top w:val="single" w:color="BFBFBF" w:sz="4"/>
+              <w:left w:val="single" w:color="BFBFBF" w:sz="4"/>
+              <w:bottom w:val="single" w:color="BFBFBF" w:sz="4"/>
+              <w:right w:val="single" w:color="BFBFBF" w:sz="4"/>
+            </w:tcBorders>
+            <w:tcMar>
+              <w:top w:type="dxa" w:w="100"/>
+              <w:left w:type="dxa" w:w="140"/>
+              <w:bottom w:type="dxa" w:w="100"/>
+              <w:right w:type="dxa" w:w="140"/>
+            </w:tcMar>
+            <w:vAlign w:val="center"/>
+          </w:tcPr>
+          <w:p>
+            <w:pPr>
+              <w:spacing w:after="40" w:before="40"/>
+              <w:jc w:val="left"/>
+            </w:pPr>
+            <w:r>
+              <w:t>{{poc_designation}}</w:t>
+            </w:r>
+          </w:p>
+        </w:tc>
+      </w:tr>
+      <w:tr>
+        <w:tc>
+          <w:tcPr>
+            <w:tcW w:type="dxa" w:w="3120"/>
+            <w:tcBorders>
+              <w:top w:val="single" w:color="BFBFBF" w:sz="4"/>
+              <w:left w:val="single" w:color="BFBFBF" w:sz="4"/>
+              <w:bottom w:val="single" w:color="BFBFBF" w:sz="4"/>
+              <w:right w:val="single" w:color="BFBFBF" w:sz="4"/>
+            </w:tcBorders>
+            <w:shd w:fill="F3F4F6" w:val="clear"/>
+            <w:tcMar>
+              <w:top w:type="dxa" w:w="100"/>
+              <w:left w:type="dxa" w:w="140"/>
+              <w:bottom w:type="dxa" w:w="100"/>
+              <w:right w:type="dxa" w:w="140"/>
+            </w:tcMar>
+            <w:vAlign w:val="center"/>
+          </w:tcPr>
+          <w:p>
+            <w:pPr>
+              <w:spacing w:after="40" w:before="40"/>
+              <w:jc w:val="left"/>
+            </w:pPr>
+            <w:r>
+              <w:rPr>
+                <w:rFonts w:ascii="Calibri" w:cs="Calibri" w:eastAsia="Calibri" w:hAnsi="Calibri"/>
+                <w:b/>
+                <w:bCs/>
+                <w:sz w:val="22"/>
+                <w:szCs w:val="22"/>
+              </w:rPr>
+              <w:t xml:space="preserve">Contact No.</w:t>
+            </w:r>
+          </w:p>
+        </w:tc>
+        <w:tc>
+          <w:tcPr>
+            <w:tcW w:type="dxa" w:w="6240"/>
+            <w:tcBorders>
+              <w:top w:val="single" w:color="BFBFBF" w:sz="4"/>
+              <w:left w:val="single" w:color="BFBFBF" w:sz="4"/>
+              <w:bottom w:val="single" w:color="BFBFBF" w:sz="4"/>
+              <w:right w:val="single" w:color="BFBFBF" w:sz="4"/>
+            </w:tcBorders>
+            <w:tcMar>
+              <w:top w:type="dxa" w:w="100"/>
+              <w:left w:type="dxa" w:w="140"/>
+              <w:bottom w:type="dxa" w:w="100"/>
+              <w:right w:type="dxa" w:w="140"/>
+            </w:tcMar>
+            <w:vAlign w:val="center"/>
+          </w:tcPr>
+          <w:p>
+            <w:pPr>
+              <w:spacing w:after="40" w:before="40"/>
+              <w:jc w:val="left"/>
+            </w:pPr>
+            <w:r>
+              <w:t>{{mobile_no}}</w:t>
+            </w:r>
+          </w:p>
+        </w:tc>
+      </w:tr>
+      <w:tr>
+        <w:tc>
+          <w:tcPr>
+            <w:tcW w:type="dxa" w:w="3120"/>
+            <w:tcBorders>
+              <w:top w:val="single" w:color="BFBFBF" w:sz="4"/>
+              <w:left w:val="single" w:color="BFBFBF" w:sz="4"/>
+              <w:bottom w:val="single" w:color="BFBFBF" w:sz="4"/>
+              <w:right w:val="single" w:color="BFBFBF" w:sz="4"/>
+            </w:tcBorders>
+            <w:shd w:fill="F3F4F6" w:val="clear"/>
+            <w:tcMar>
+              <w:top w:type="dxa" w:w="100"/>
+              <w:left w:type="dxa" w:w="140"/>
+              <w:bottom w:type="dxa" w:w="100"/>
+              <w:right w:type="dxa" w:w="140"/>
+            </w:tcMar>
+            <w:vAlign w:val="center"/>
+          </w:tcPr>
+          <w:p>
+            <w:pPr>
+              <w:spacing w:after="40" w:before="40"/>
+              <w:jc w:val="left"/>
+            </w:pPr>
+            <w:r>
+              <w:rPr>
+                <w:rFonts w:ascii="Calibri" w:cs="Calibri" w:eastAsia="Calibri" w:hAnsi="Calibri"/>
+                <w:b/>
+                <w:bCs/>
+                <w:sz w:val="22"/>
+                <w:szCs w:val="22"/>
+              </w:rPr>
+              <w:t xml:space="preserve">Email</w:t>
+            </w:r>
+          </w:p>
+        </w:tc>
+        <w:tc>
+          <w:tcPr>
+            <w:tcW w:type="dxa" w:w="6240"/>
+            <w:tcBorders>
+              <w:top w:val="single" w:color="BFBFBF" w:sz="4"/>
+              <w:left w:val="single" w:color="BFBFBF" w:sz="4"/>
+              <w:bottom w:val="single" w:color="BFBFBF" w:sz="4"/>
+              <w:right w:val="single" w:color="BFBFBF" w:sz="4"/>
+            </w:tcBorders>
+            <w:tcMar>
+              <w:top w:type="dxa" w:w="100"/>
+              <w:left w:type="dxa" w:w="140"/>
+              <w:bottom w:type="dxa" w:w="100"/>
+              <w:right w:type="dxa" w:w="140"/>
+            </w:tcMar>
+            <w:vAlign w:val="center"/>
+          </w:tcPr>
+          <w:p>
+            <w:pPr>
+              <w:spacing w:after="40" w:before="40"/>
+              <w:jc w:val="left"/>
+            </w:pPr>
+            <w:r>
+              <w:t>{{email}}</w:t>
+            </w:r>
+          </w:p>
+        </w:tc>
+      </w:tr>
+    </w:tbl>
+    <w:p>
+      <w:pPr>
+        <w:pStyle w:val="Heading3"/>
+        <w:spacing w:after="80" w:before="200"/>
+      </w:pPr>
+      <w:r>
+        <w:rPr>
+          <w:rFonts w:ascii="Calibri" w:cs="Calibri" w:eastAsia="Calibri" w:hAnsi="Calibri"/>
+          <w:b/>
+          <w:bCs/>
+          <w:color w:val="1F2937"/>
+          <w:sz w:val="22"/>
+          <w:szCs w:val="22"/>
+        </w:rPr>
+        <w:t>MARKETING PERSON DETAILS</w:t>
+      </w:r>
+    </w:p>
+    <w:tbl>
+      <w:tblPr>
+        <w:tblW w:type="dxa" w:w="9360"/>
+        <w:tblBorders>
+          <w:top w:val="single" w:color="auto" w:sz="4"/>
+          <w:left w:val="single" w:color="auto" w:sz="4"/>
+          <w:bottom w:val="single" w:color="auto" w:sz="4"/>
+          <w:right w:val="single" w:color="auto" w:sz="4"/>
+          <w:insideH w:val="single" w:color="auto" w:sz="4"/>
+          <w:insideV w:val="single" w:color="auto" w:sz="4"/>
+        </w:tblBorders>
+      </w:tblPr>
+      <w:tblGrid>
+        <w:gridCol w:w="3120"/>
+        <w:gridCol w:w="6240"/>
+      </w:tblGrid>
+      <w:tr>
+        <w:tc>
+          <w:tcPr>
+            <w:tcW w:type="dxa" w:w="3120"/>
+            <w:tcBorders>
+              <w:top w:val="single" w:color="BFBFBF" w:sz="4"/>
+              <w:left w:val="single" w:color="BFBFBF" w:sz="4"/>
+              <w:bottom w:val="single" w:color="BFBFBF" w:sz="4"/>
+              <w:right w:val="single" w:color="BFBFBF" w:sz="4"/>
+            </w:tcBorders>
+            <w:shd w:fill="F3F4F6" w:val="clear"/>
+            <w:tcMar>
+              <w:top w:type="dxa" w:w="100"/>
+              <w:left w:type="dxa" w:w="140"/>
+              <w:bottom w:type="dxa" w:w="100"/>
+              <w:right w:type="dxa" w:w="140"/>
+            </w:tcMar>
+            <w:vAlign w:val="center"/>
+          </w:tcPr>
+          <w:p>
+            <w:pPr>
+              <w:spacing w:after="40" w:before="40"/>
+              <w:jc w:val="left"/>
+            </w:pPr>
+            <w:r>
+              <w:rPr>
+                <w:rFonts w:ascii="Calibri" w:cs="Calibri" w:eastAsia="Calibri" w:hAnsi="Calibri"/>
+                <w:b/>
+                <w:bCs/>
+                <w:sz w:val="22"/>
+                <w:szCs w:val="22"/>
+              </w:rPr>
+              <w:t xml:space="preserve">Name</w:t>
+            </w:r>
+          </w:p>
+        </w:tc>
+        <w:tc>
+          <w:tcPr>
+            <w:tcW w:type="dxa" w:w="6240"/>
+            <w:tcBorders>
+              <w:top w:val="single" w:color="BFBFBF" w:sz="4"/>
+              <w:left w:val="single" w:color="BFBFBF" w:sz="4"/>
+              <w:bottom w:val="single" w:color="BFBFBF" w:sz="4"/>
+              <w:right w:val="single" w:color="BFBFBF" w:sz="4"/>
+            </w:tcBorders>
+            <w:tcMar>
+              <w:top w:type="dxa" w:w="100"/>
+              <w:left w:type="dxa" w:w="140"/>
+              <w:bottom w:type="dxa" w:w="100"/>
+              <w:right w:type="dxa" w:w="140"/>
+            </w:tcMar>
+            <w:vAlign w:val="center"/>
+          </w:tcPr>
+          <w:p>
+            <w:pPr>
+              <w:spacing w:after="40" w:before="40"/>
+              <w:jc w:val="left"/>
+            </w:pPr>
+            <w:r>
+              <w:t>{{marketing_person}}</w:t>
+            </w:r>
+          </w:p>
+        </w:tc>
+      </w:tr>
+      <w:tr>
+        <w:tc>
+          <w:tcPr>
+            <w:tcW w:type="dxa" w:w="3120"/>
+            <w:tcBorders>
+              <w:top w:val="single" w:color="BFBFBF" w:sz="4"/>
+              <w:left w:val="single" w:color="BFBFBF" w:sz="4"/>
+              <w:bottom w:val="single" w:color="BFBFBF" w:sz="4"/>
+              <w:right w:val="single" w:color="BFBFBF" w:sz="4"/>
+            </w:tcBorders>
+            <w:shd w:fill="F3F4F6" w:val="clear"/>
+            <w:tcMar>
+              <w:top w:type="dxa" w:w="100"/>
+              <w:left w:type="dxa" w:w="140"/>
+              <w:bottom w:type="dxa" w:w="100"/>
+              <w:right w:type="dxa" w:w="140"/>
+            </w:tcMar>
+            <w:vAlign w:val="center"/>
+          </w:tcPr>
+          <w:p>
+            <w:pPr>
+              <w:spacing w:after="40" w:before="40"/>
+              <w:jc w:val="left"/>
+            </w:pPr>
+            <w:r>
+              <w:rPr>
+                <w:rFonts w:ascii="Calibri" w:cs="Calibri" w:eastAsia="Calibri" w:hAnsi="Calibri"/>
+                <w:b/>
+                <w:bCs/>
+                <w:sz w:val="22"/>
+                <w:szCs w:val="22"/>
+              </w:rPr>
+              <w:t xml:space="preserve">Email</w:t>
+            </w:r>
+          </w:p>
+        </w:tc>
+        <w:tc>
+          <w:tcPr>
+            <w:tcW w:type="dxa" w:w="6240"/>
+            <w:tcBorders>
+              <w:top w:val="single" w:color="BFBFBF" w:sz="4"/>
+              <w:left w:val="single" w:color="BFBFBF" w:sz="4"/>
+              <w:bottom w:val="single" w:color="BFBFBF" w:sz="4"/>
+              <w:right w:val="single" w:color="BFBFBF" w:sz="4"/>
+            </w:tcBorders>
+            <w:tcMar>
+              <w:top w:type="dxa" w:w="100"/>
+              <w:left w:type="dxa" w:w="140"/>
+              <w:bottom w:type="dxa" w:w="100"/>
+              <w:right w:type="dxa" w:w="140"/>
+            </w:tcMar>
+            <w:vAlign w:val="center"/>
+          </w:tcPr>
+          <w:p>
+            <w:pPr>
+              <w:spacing w:after="40" w:before="40"/>
+              <w:jc w:val="left"/>
+            </w:pPr>
+            <w:r>
+              <w:t>{{marketing_email}}</w:t>
+            </w:r>
+          </w:p>
+        </w:tc>
+      </w:tr>
+      <w:tr>
+        <w:tc>
+          <w:tcPr>
+            <w:tcW w:type="dxa" w:w="3120"/>
+            <w:tcBorders>
+              <w:top w:val="single" w:color="BFBFBF" w:sz="4"/>
+              <w:left w:val="single" w:color="BFBFBF" w:sz="4"/>
+              <w:bottom w:val="single" w:color="BFBFBF" w:sz="4"/>
+              <w:right w:val="single" w:color="BFBFBF" w:sz="4"/>
+            </w:tcBorders>
+            <w:shd w:fill="F3F4F6" w:val="clear"/>
+            <w:tcMar>
+              <w:top w:type="dxa" w:w="100"/>
+              <w:left w:type="dxa" w:w="140"/>
+              <w:bottom w:type="dxa" w:w="100"/>
+              <w:right w:type="dxa" w:w="140"/>
+            </w:tcMar>
+            <w:vAlign w:val="center"/>
+          </w:tcPr>
+          <w:p>
+            <w:pPr>
+              <w:spacing w:after="40" w:before="40"/>
+              <w:jc w:val="left"/>
+            </w:pPr>
+            <w:r>
+              <w:rPr>
+                <w:rFonts w:ascii="Calibri" w:cs="Calibri" w:eastAsia="Calibri" w:hAnsi="Calibri"/>
+                <w:b/>
+                <w:bCs/>
+                <w:sz w:val="22"/>
+                <w:szCs w:val="22"/>
+              </w:rPr>
+              <w:t xml:space="preserve">Contact No.</w:t>
+            </w:r>
+          </w:p>
+        </w:tc>
+        <w:tc>
+          <w:tcPr>
+            <w:tcW w:type="dxa" w:w="6240"/>
+            <w:tcBorders>
+              <w:top w:val="single" w:color="BFBFBF" w:sz="4"/>
+              <w:left w:val="single" w:color="BFBFBF" w:sz="4"/>
+              <w:bottom w:val="single" w:color="BFBFBF" w:sz="4"/>
+              <w:right w:val="single" w:color="BFBFBF" w:sz="4"/>
+            </w:tcBorders>
+            <w:tcMar>
+              <w:top w:type="dxa" w:w="100"/>
+              <w:left w:type="dxa" w:w="140"/>
+              <w:bottom w:type="dxa" w:w="100"/>
+              <w:right w:type="dxa" w:w="140"/>
+            </w:tcMar>
+            <w:vAlign w:val="center"/>
+          </w:tcPr>
+          <w:p>
+            <w:pPr>
+              <w:spacing w:after="40" w:before="40"/>
+              <w:jc w:val="left"/>
+            </w:pPr>
+            <w:r>
+              <w:t>{{marketing_phone}}</w:t>
+            </w:r>
+          </w:p>
+        </w:tc>
+      </w:tr>
+    </w:tbl>
     <w:p>
       <w:pPr>
         <w:rPr>

</xml_diff>

<commit_message>
feat(regen): technical-data table after Client Details; GST/HSN/PAN in T&C
- New TECHNICAL DATA table (regenerator kW, burner kW, burner pairs, fuel,
  combustion-air blower size, ID-fan size) inserted after Client Details.
  Blower + ID-fan sizes come from the rigorous fan sizing on the burner kW;
  burner vs regenerator kW forwarded from the form via extra_context.
- Replace the T&C 'Taxes & Duties' row with GST, HSN Code and PAN/GST No.
  (form editor + template + regen defaults).

Co-Authored-By: Claude Opus 4.8 <noreply@anthropic.com>
</commit_message>
<xml_diff>
--- a/Regen_Offer_Template.docx
+++ b/Regen_Offer_Template.docx
@@ -2552,6 +2552,409 @@
       </w:pPr>
       <w:r>
         <w:rPr>
+          <w:rFonts w:ascii="Calibri" w:hAnsi="Calibri"/>
+          <w:b/>
+          <w:sz w:val="22"/>
+        </w:rPr>
+        <w:t>TECHNICAL DATA</w:t>
+      </w:r>
+    </w:p>
+    <w:tbl>
+      <w:tblPr>
+        <w:tblW w:type="dxa" w:w="9360"/>
+        <w:tblBorders>
+          <w:top w:val="single" w:color="auto" w:sz="4"/>
+          <w:left w:val="single" w:color="auto" w:sz="4"/>
+          <w:bottom w:val="single" w:color="auto" w:sz="4"/>
+          <w:right w:val="single" w:color="auto" w:sz="4"/>
+          <w:insideH w:val="single" w:color="auto" w:sz="4"/>
+          <w:insideV w:val="single" w:color="auto" w:sz="4"/>
+        </w:tblBorders>
+      </w:tblPr>
+      <w:tblGrid>
+        <w:gridCol w:w="3120"/>
+        <w:gridCol w:w="6240"/>
+      </w:tblGrid>
+      <w:tr>
+        <w:tc>
+          <w:tcPr>
+            <w:tcW w:type="dxa" w:w="3120"/>
+            <w:tcBorders>
+              <w:top w:val="single" w:color="BFBFBF" w:sz="4"/>
+              <w:left w:val="single" w:color="BFBFBF" w:sz="4"/>
+              <w:bottom w:val="single" w:color="BFBFBF" w:sz="4"/>
+              <w:right w:val="single" w:color="BFBFBF" w:sz="4"/>
+            </w:tcBorders>
+            <w:shd w:fill="F3F4F6" w:val="clear"/>
+            <w:tcMar>
+              <w:top w:type="dxa" w:w="100"/>
+              <w:left w:type="dxa" w:w="140"/>
+              <w:bottom w:type="dxa" w:w="100"/>
+              <w:right w:type="dxa" w:w="140"/>
+            </w:tcMar>
+            <w:vAlign w:val="center"/>
+          </w:tcPr>
+          <w:p>
+            <w:pPr>
+              <w:spacing w:after="40" w:before="40"/>
+              <w:jc w:val="left"/>
+            </w:pPr>
+            <w:r>
+              <w:rPr>
+                <w:rFonts w:ascii="Calibri" w:hAnsi="Calibri"/>
+                <w:b/>
+                <w:sz w:val="22"/>
+              </w:rPr>
+              <w:t>Regenerator Capacity</w:t>
+            </w:r>
+          </w:p>
+        </w:tc>
+        <w:tc>
+          <w:tcPr>
+            <w:tcW w:type="dxa" w:w="6240"/>
+            <w:tcBorders>
+              <w:top w:val="single" w:color="BFBFBF" w:sz="4"/>
+              <w:left w:val="single" w:color="BFBFBF" w:sz="4"/>
+              <w:bottom w:val="single" w:color="BFBFBF" w:sz="4"/>
+              <w:right w:val="single" w:color="BFBFBF" w:sz="4"/>
+            </w:tcBorders>
+            <w:tcMar>
+              <w:top w:type="dxa" w:w="100"/>
+              <w:left w:type="dxa" w:w="140"/>
+              <w:bottom w:type="dxa" w:w="100"/>
+              <w:right w:type="dxa" w:w="140"/>
+            </w:tcMar>
+            <w:vAlign w:val="center"/>
+          </w:tcPr>
+          <w:p>
+            <w:pPr>
+              <w:spacing w:after="40" w:before="40"/>
+              <w:jc w:val="left"/>
+            </w:pPr>
+            <w:r>
+              <w:t>{{ tbl_regen_kw }}</w:t>
+            </w:r>
+          </w:p>
+        </w:tc>
+      </w:tr>
+      <w:tr>
+        <w:tc>
+          <w:tcPr>
+            <w:tcW w:type="dxa" w:w="3120"/>
+            <w:tcBorders>
+              <w:top w:val="single" w:color="BFBFBF" w:sz="4"/>
+              <w:left w:val="single" w:color="BFBFBF" w:sz="4"/>
+              <w:bottom w:val="single" w:color="BFBFBF" w:sz="4"/>
+              <w:right w:val="single" w:color="BFBFBF" w:sz="4"/>
+            </w:tcBorders>
+            <w:shd w:fill="F3F4F6" w:val="clear"/>
+            <w:tcMar>
+              <w:top w:type="dxa" w:w="100"/>
+              <w:left w:type="dxa" w:w="140"/>
+              <w:bottom w:type="dxa" w:w="100"/>
+              <w:right w:type="dxa" w:w="140"/>
+            </w:tcMar>
+            <w:vAlign w:val="center"/>
+          </w:tcPr>
+          <w:p>
+            <w:pPr>
+              <w:spacing w:after="40" w:before="40"/>
+              <w:jc w:val="left"/>
+            </w:pPr>
+            <w:r>
+              <w:rPr>
+                <w:rFonts w:ascii="Calibri" w:hAnsi="Calibri"/>
+                <w:b/>
+                <w:sz w:val="22"/>
+              </w:rPr>
+              <w:t>Burner Capacity</w:t>
+            </w:r>
+          </w:p>
+        </w:tc>
+        <w:tc>
+          <w:tcPr>
+            <w:tcW w:type="dxa" w:w="6240"/>
+            <w:tcBorders>
+              <w:top w:val="single" w:color="BFBFBF" w:sz="4"/>
+              <w:left w:val="single" w:color="BFBFBF" w:sz="4"/>
+              <w:bottom w:val="single" w:color="BFBFBF" w:sz="4"/>
+              <w:right w:val="single" w:color="BFBFBF" w:sz="4"/>
+            </w:tcBorders>
+            <w:tcMar>
+              <w:top w:type="dxa" w:w="100"/>
+              <w:left w:type="dxa" w:w="140"/>
+              <w:bottom w:type="dxa" w:w="100"/>
+              <w:right w:type="dxa" w:w="140"/>
+            </w:tcMar>
+            <w:vAlign w:val="center"/>
+          </w:tcPr>
+          <w:p>
+            <w:pPr>
+              <w:spacing w:after="40" w:before="40"/>
+              <w:jc w:val="left"/>
+            </w:pPr>
+            <w:r>
+              <w:t>{{ tbl_burner_kw }}</w:t>
+            </w:r>
+          </w:p>
+        </w:tc>
+      </w:tr>
+      <w:tr>
+        <w:tc>
+          <w:tcPr>
+            <w:tcW w:type="dxa" w:w="3120"/>
+            <w:tcBorders>
+              <w:top w:val="single" w:color="BFBFBF" w:sz="4"/>
+              <w:left w:val="single" w:color="BFBFBF" w:sz="4"/>
+              <w:bottom w:val="single" w:color="BFBFBF" w:sz="4"/>
+              <w:right w:val="single" w:color="BFBFBF" w:sz="4"/>
+            </w:tcBorders>
+            <w:shd w:fill="F3F4F6" w:val="clear"/>
+            <w:tcMar>
+              <w:top w:type="dxa" w:w="100"/>
+              <w:left w:type="dxa" w:w="140"/>
+              <w:bottom w:type="dxa" w:w="100"/>
+              <w:right w:type="dxa" w:w="140"/>
+            </w:tcMar>
+            <w:vAlign w:val="center"/>
+          </w:tcPr>
+          <w:p>
+            <w:pPr>
+              <w:spacing w:after="40" w:before="40"/>
+              <w:jc w:val="left"/>
+            </w:pPr>
+            <w:r>
+              <w:rPr>
+                <w:rFonts w:ascii="Calibri" w:hAnsi="Calibri"/>
+                <w:b/>
+                <w:sz w:val="22"/>
+              </w:rPr>
+              <w:t>Number of Burner Pairs</w:t>
+            </w:r>
+          </w:p>
+        </w:tc>
+        <w:tc>
+          <w:tcPr>
+            <w:tcW w:type="dxa" w:w="6240"/>
+            <w:tcBorders>
+              <w:top w:val="single" w:color="BFBFBF" w:sz="4"/>
+              <w:left w:val="single" w:color="BFBFBF" w:sz="4"/>
+              <w:bottom w:val="single" w:color="BFBFBF" w:sz="4"/>
+              <w:right w:val="single" w:color="BFBFBF" w:sz="4"/>
+            </w:tcBorders>
+            <w:tcMar>
+              <w:top w:type="dxa" w:w="100"/>
+              <w:left w:type="dxa" w:w="140"/>
+              <w:bottom w:type="dxa" w:w="100"/>
+              <w:right w:type="dxa" w:w="140"/>
+            </w:tcMar>
+            <w:vAlign w:val="center"/>
+          </w:tcPr>
+          <w:p>
+            <w:pPr>
+              <w:spacing w:after="40" w:before="40"/>
+              <w:jc w:val="left"/>
+            </w:pPr>
+            <w:r>
+              <w:t>{{ tbl_pairs }}</w:t>
+            </w:r>
+          </w:p>
+        </w:tc>
+      </w:tr>
+      <w:tr>
+        <w:tc>
+          <w:tcPr>
+            <w:tcW w:type="dxa" w:w="3120"/>
+            <w:tcBorders>
+              <w:top w:val="single" w:color="BFBFBF" w:sz="4"/>
+              <w:left w:val="single" w:color="BFBFBF" w:sz="4"/>
+              <w:bottom w:val="single" w:color="BFBFBF" w:sz="4"/>
+              <w:right w:val="single" w:color="BFBFBF" w:sz="4"/>
+            </w:tcBorders>
+            <w:shd w:fill="F3F4F6" w:val="clear"/>
+            <w:tcMar>
+              <w:top w:type="dxa" w:w="100"/>
+              <w:left w:type="dxa" w:w="140"/>
+              <w:bottom w:type="dxa" w:w="100"/>
+              <w:right w:type="dxa" w:w="140"/>
+            </w:tcMar>
+            <w:vAlign w:val="center"/>
+          </w:tcPr>
+          <w:p>
+            <w:pPr>
+              <w:spacing w:after="40" w:before="40"/>
+              <w:jc w:val="left"/>
+            </w:pPr>
+            <w:r>
+              <w:rPr>
+                <w:rFonts w:ascii="Calibri" w:hAnsi="Calibri"/>
+                <w:b/>
+                <w:sz w:val="22"/>
+              </w:rPr>
+              <w:t>Fuel</w:t>
+            </w:r>
+          </w:p>
+        </w:tc>
+        <w:tc>
+          <w:tcPr>
+            <w:tcW w:type="dxa" w:w="6240"/>
+            <w:tcBorders>
+              <w:top w:val="single" w:color="BFBFBF" w:sz="4"/>
+              <w:left w:val="single" w:color="BFBFBF" w:sz="4"/>
+              <w:bottom w:val="single" w:color="BFBFBF" w:sz="4"/>
+              <w:right w:val="single" w:color="BFBFBF" w:sz="4"/>
+            </w:tcBorders>
+            <w:tcMar>
+              <w:top w:type="dxa" w:w="100"/>
+              <w:left w:type="dxa" w:w="140"/>
+              <w:bottom w:type="dxa" w:w="100"/>
+              <w:right w:type="dxa" w:w="140"/>
+            </w:tcMar>
+            <w:vAlign w:val="center"/>
+          </w:tcPr>
+          <w:p>
+            <w:pPr>
+              <w:spacing w:after="40" w:before="40"/>
+              <w:jc w:val="left"/>
+            </w:pPr>
+            <w:r>
+              <w:t>{{ tbl_fuel }}</w:t>
+            </w:r>
+          </w:p>
+        </w:tc>
+      </w:tr>
+      <w:tr>
+        <w:tc>
+          <w:tcPr>
+            <w:tcW w:type="dxa" w:w="3120"/>
+            <w:tcBorders>
+              <w:top w:val="single" w:color="BFBFBF" w:sz="4"/>
+              <w:left w:val="single" w:color="BFBFBF" w:sz="4"/>
+              <w:bottom w:val="single" w:color="BFBFBF" w:sz="4"/>
+              <w:right w:val="single" w:color="BFBFBF" w:sz="4"/>
+            </w:tcBorders>
+            <w:shd w:fill="F3F4F6" w:val="clear"/>
+            <w:tcMar>
+              <w:top w:type="dxa" w:w="100"/>
+              <w:left w:type="dxa" w:w="140"/>
+              <w:bottom w:type="dxa" w:w="100"/>
+              <w:right w:type="dxa" w:w="140"/>
+            </w:tcMar>
+            <w:vAlign w:val="center"/>
+          </w:tcPr>
+          <w:p>
+            <w:pPr>
+              <w:spacing w:after="40" w:before="40"/>
+              <w:jc w:val="left"/>
+            </w:pPr>
+            <w:r>
+              <w:rPr>
+                <w:rFonts w:ascii="Calibri" w:hAnsi="Calibri"/>
+                <w:b/>
+                <w:sz w:val="22"/>
+              </w:rPr>
+              <w:t>Combustion Air Blower</w:t>
+            </w:r>
+          </w:p>
+        </w:tc>
+        <w:tc>
+          <w:tcPr>
+            <w:tcW w:type="dxa" w:w="6240"/>
+            <w:tcBorders>
+              <w:top w:val="single" w:color="BFBFBF" w:sz="4"/>
+              <w:left w:val="single" w:color="BFBFBF" w:sz="4"/>
+              <w:bottom w:val="single" w:color="BFBFBF" w:sz="4"/>
+              <w:right w:val="single" w:color="BFBFBF" w:sz="4"/>
+            </w:tcBorders>
+            <w:tcMar>
+              <w:top w:type="dxa" w:w="100"/>
+              <w:left w:type="dxa" w:w="140"/>
+              <w:bottom w:type="dxa" w:w="100"/>
+              <w:right w:type="dxa" w:w="140"/>
+            </w:tcMar>
+            <w:vAlign w:val="center"/>
+          </w:tcPr>
+          <w:p>
+            <w:pPr>
+              <w:spacing w:after="40" w:before="40"/>
+              <w:jc w:val="left"/>
+            </w:pPr>
+            <w:r>
+              <w:t>{{ tbl_blower_size }}</w:t>
+            </w:r>
+          </w:p>
+        </w:tc>
+      </w:tr>
+      <w:tr>
+        <w:tc>
+          <w:tcPr>
+            <w:tcW w:type="dxa" w:w="3120"/>
+            <w:tcBorders>
+              <w:top w:val="single" w:color="BFBFBF" w:sz="4"/>
+              <w:left w:val="single" w:color="BFBFBF" w:sz="4"/>
+              <w:bottom w:val="single" w:color="BFBFBF" w:sz="4"/>
+              <w:right w:val="single" w:color="BFBFBF" w:sz="4"/>
+            </w:tcBorders>
+            <w:shd w:fill="F3F4F6" w:val="clear"/>
+            <w:tcMar>
+              <w:top w:type="dxa" w:w="100"/>
+              <w:left w:type="dxa" w:w="140"/>
+              <w:bottom w:type="dxa" w:w="100"/>
+              <w:right w:type="dxa" w:w="140"/>
+            </w:tcMar>
+            <w:vAlign w:val="center"/>
+          </w:tcPr>
+          <w:p>
+            <w:pPr>
+              <w:spacing w:after="40" w:before="40"/>
+              <w:jc w:val="left"/>
+            </w:pPr>
+            <w:r>
+              <w:rPr>
+                <w:rFonts w:ascii="Calibri" w:hAnsi="Calibri"/>
+                <w:b/>
+                <w:sz w:val="22"/>
+              </w:rPr>
+              <w:t>ID Fan (Flue Gas Suction)</w:t>
+            </w:r>
+          </w:p>
+        </w:tc>
+        <w:tc>
+          <w:tcPr>
+            <w:tcW w:type="dxa" w:w="6240"/>
+            <w:tcBorders>
+              <w:top w:val="single" w:color="BFBFBF" w:sz="4"/>
+              <w:left w:val="single" w:color="BFBFBF" w:sz="4"/>
+              <w:bottom w:val="single" w:color="BFBFBF" w:sz="4"/>
+              <w:right w:val="single" w:color="BFBFBF" w:sz="4"/>
+            </w:tcBorders>
+            <w:tcMar>
+              <w:top w:type="dxa" w:w="100"/>
+              <w:left w:type="dxa" w:w="140"/>
+              <w:bottom w:type="dxa" w:w="100"/>
+              <w:right w:type="dxa" w:w="140"/>
+            </w:tcMar>
+            <w:vAlign w:val="center"/>
+          </w:tcPr>
+          <w:p>
+            <w:pPr>
+              <w:spacing w:after="40" w:before="40"/>
+              <w:jc w:val="left"/>
+            </w:pPr>
+            <w:r>
+              <w:t>{{ tbl_idfan_size }}</w:t>
+            </w:r>
+          </w:p>
+        </w:tc>
+      </w:tr>
+    </w:tbl>
+    <w:p>
+      <w:pPr>
+        <w:pStyle w:val="Heading3"/>
+        <w:spacing w:after="80" w:before="200"/>
+      </w:pPr>
+      <w:r>
+        <w:rPr>
           <w:rFonts w:ascii="Calibri" w:cs="Calibri" w:eastAsia="Calibri" w:hAnsi="Calibri"/>
           <w:b/>
           <w:bCs/>
@@ -13773,10 +14176,9 @@
             <w:r>
               <w:rPr>
                 <w:b/>
-                <w:color w:val="1F2937"/>
                 <w:sz w:val="22"/>
               </w:rPr>
-              <w:t>Taxes &amp; Duties</w:t>
+              <w:t>GST</w:t>
             </w:r>
           </w:p>
         </w:tc>
@@ -13794,7 +14196,87 @@
               <w:rPr>
                 <w:sz w:val="22"/>
               </w:rPr>
-              <w:t>{{ tnc_regen_taxes }}</w:t>
+              <w:t>{{ tnc_regen_gst }}</w:t>
+            </w:r>
+          </w:p>
+        </w:tc>
+      </w:tr>
+      <w:tr>
+        <w:tc>
+          <w:tcPr>
+            <w:vAlign w:val="top"/>
+            <w:shd w:val="clear" w:color="auto" w:fill="F3F4F6"/>
+            <w:tcW w:w="2600" w:type="dxa"/>
+          </w:tcPr>
+          <w:p>
+            <w:pPr>
+              <w:spacing w:before="40" w:after="40" w:line="240" w:lineRule="auto"/>
+              <w:jc w:val="left"/>
+            </w:pPr>
+            <w:r>
+              <w:rPr>
+                <w:b/>
+                <w:sz w:val="22"/>
+              </w:rPr>
+              <w:t>HSN Code</w:t>
+            </w:r>
+          </w:p>
+        </w:tc>
+        <w:tc>
+          <w:tcPr>
+            <w:vAlign w:val="top"/>
+            <w:tcW w:w="7140" w:type="dxa"/>
+          </w:tcPr>
+          <w:p>
+            <w:pPr>
+              <w:spacing w:before="20" w:after="20" w:line="252" w:lineRule="auto"/>
+              <w:jc w:val="left"/>
+            </w:pPr>
+            <w:r>
+              <w:rPr>
+                <w:sz w:val="22"/>
+              </w:rPr>
+              <w:t>{{ tnc_regen_hsn }}</w:t>
+            </w:r>
+          </w:p>
+        </w:tc>
+      </w:tr>
+      <w:tr>
+        <w:tc>
+          <w:tcPr>
+            <w:vAlign w:val="top"/>
+            <w:shd w:val="clear" w:color="auto" w:fill="F3F4F6"/>
+            <w:tcW w:w="2600" w:type="dxa"/>
+          </w:tcPr>
+          <w:p>
+            <w:pPr>
+              <w:spacing w:before="40" w:after="40" w:line="240" w:lineRule="auto"/>
+              <w:jc w:val="left"/>
+            </w:pPr>
+            <w:r>
+              <w:rPr>
+                <w:b/>
+                <w:sz w:val="22"/>
+              </w:rPr>
+              <w:t>PAN / GST No.</w:t>
+            </w:r>
+          </w:p>
+        </w:tc>
+        <w:tc>
+          <w:tcPr>
+            <w:vAlign w:val="top"/>
+            <w:tcW w:w="7140" w:type="dxa"/>
+          </w:tcPr>
+          <w:p>
+            <w:pPr>
+              <w:spacing w:before="20" w:after="20" w:line="252" w:lineRule="auto"/>
+              <w:jc w:val="left"/>
+            </w:pPr>
+            <w:r>
+              <w:rPr>
+                <w:sz w:val="22"/>
+              </w:rPr>
+              <w:t>{{ tnc_regen_pan_gst }}</w:t>
             </w:r>
           </w:p>
         </w:tc>

</xml_diff>

<commit_message>
feat(regen): technical-data table after Marketing, double border; USD taxes
- Move TECHNICAL DATA table to after Marketing Person Details (was between
  Client and Marketing) and give it a prominent double-line outer border.
- Replace the T&C 'Taxes & Duties' row with GST / HSN Code / PAN-GST No.
  (INR offers). For USD (export) offers these India-specific rows collapse
  back to a single 'Taxes & Duties: Extra at actuals.' row at generation time.

Co-Authored-By: Claude Opus 4.8 <noreply@anthropic.com>
</commit_message>
<xml_diff>
--- a/Regen_Offer_Template.docx
+++ b/Regen_Offer_Template.docx
@@ -2552,11 +2552,14 @@
       </w:pPr>
       <w:r>
         <w:rPr>
-          <w:rFonts w:ascii="Calibri" w:hAnsi="Calibri"/>
+          <w:rFonts w:ascii="Calibri" w:cs="Calibri" w:eastAsia="Calibri" w:hAnsi="Calibri"/>
           <w:b/>
+          <w:bCs/>
+          <w:color w:val="1F2937"/>
           <w:sz w:val="22"/>
-        </w:rPr>
-        <w:t>TECHNICAL DATA</w:t>
+          <w:szCs w:val="22"/>
+        </w:rPr>
+        <w:t>MARKETING PERSON DETAILS</w:t>
       </w:r>
     </w:p>
     <w:tbl>
@@ -2601,11 +2604,13 @@
             </w:pPr>
             <w:r>
               <w:rPr>
-                <w:rFonts w:ascii="Calibri" w:hAnsi="Calibri"/>
+                <w:rFonts w:ascii="Calibri" w:cs="Calibri" w:eastAsia="Calibri" w:hAnsi="Calibri"/>
                 <w:b/>
+                <w:bCs/>
                 <w:sz w:val="22"/>
-              </w:rPr>
-              <w:t>Regenerator Capacity</w:t>
+                <w:szCs w:val="22"/>
+              </w:rPr>
+              <w:t xml:space="preserve">Name</w:t>
             </w:r>
           </w:p>
         </w:tc>
@@ -2632,7 +2637,7 @@
               <w:jc w:val="left"/>
             </w:pPr>
             <w:r>
-              <w:t>{{ tbl_regen_kw }}</w:t>
+              <w:t>{{marketing_person}}</w:t>
             </w:r>
           </w:p>
         </w:tc>
@@ -2663,11 +2668,13 @@
             </w:pPr>
             <w:r>
               <w:rPr>
-                <w:rFonts w:ascii="Calibri" w:hAnsi="Calibri"/>
+                <w:rFonts w:ascii="Calibri" w:cs="Calibri" w:eastAsia="Calibri" w:hAnsi="Calibri"/>
                 <w:b/>
+                <w:bCs/>
                 <w:sz w:val="22"/>
-              </w:rPr>
-              <w:t>Burner Capacity</w:t>
+                <w:szCs w:val="22"/>
+              </w:rPr>
+              <w:t xml:space="preserve">Email</w:t>
             </w:r>
           </w:p>
         </w:tc>
@@ -2694,7 +2701,7 @@
               <w:jc w:val="left"/>
             </w:pPr>
             <w:r>
-              <w:t>{{ tbl_burner_kw }}</w:t>
+              <w:t>{{marketing_email}}</w:t>
             </w:r>
           </w:p>
         </w:tc>
@@ -2725,11 +2732,13 @@
             </w:pPr>
             <w:r>
               <w:rPr>
-                <w:rFonts w:ascii="Calibri" w:hAnsi="Calibri"/>
+                <w:rFonts w:ascii="Calibri" w:cs="Calibri" w:eastAsia="Calibri" w:hAnsi="Calibri"/>
                 <w:b/>
+                <w:bCs/>
                 <w:sz w:val="22"/>
-              </w:rPr>
-              <w:t>Number of Burner Pairs</w:t>
+                <w:szCs w:val="22"/>
+              </w:rPr>
+              <w:t xml:space="preserve">Contact No.</w:t>
             </w:r>
           </w:p>
         </w:tc>
@@ -2756,11 +2765,42 @@
               <w:jc w:val="left"/>
             </w:pPr>
             <w:r>
-              <w:t>{{ tbl_pairs }}</w:t>
+              <w:t>{{marketing_phone}}</w:t>
             </w:r>
           </w:p>
         </w:tc>
       </w:tr>
+    </w:tbl>
+    <w:p>
+      <w:pPr>
+        <w:pStyle w:val="Heading3"/>
+        <w:spacing w:after="80" w:before="200"/>
+      </w:pPr>
+      <w:r>
+        <w:rPr>
+          <w:rFonts w:ascii="Calibri" w:hAnsi="Calibri"/>
+          <w:b/>
+          <w:sz w:val="22"/>
+        </w:rPr>
+        <w:t>TECHNICAL DATA</w:t>
+      </w:r>
+    </w:p>
+    <w:tbl>
+      <w:tblPr>
+        <w:tblW w:type="dxa" w:w="9360"/>
+        <w:tblBorders>
+          <w:top w:val="double" w:sz="18" w:space="0" w:color="000000"/>
+          <w:left w:val="double" w:sz="18" w:space="0" w:color="000000"/>
+          <w:bottom w:val="double" w:sz="18" w:space="0" w:color="000000"/>
+          <w:right w:val="double" w:sz="18" w:space="0" w:color="000000"/>
+          <w:insideH w:val="single" w:sz="6" w:space="0" w:color="000000"/>
+          <w:insideV w:val="single" w:sz="6" w:space="0" w:color="000000"/>
+        </w:tblBorders>
+      </w:tblPr>
+      <w:tblGrid>
+        <w:gridCol w:w="3120"/>
+        <w:gridCol w:w="6240"/>
+      </w:tblGrid>
       <w:tr>
         <w:tc>
           <w:tcPr>
@@ -2791,7 +2831,7 @@
                 <w:b/>
                 <w:sz w:val="22"/>
               </w:rPr>
-              <w:t>Fuel</w:t>
+              <w:t>Regenerator Capacity</w:t>
             </w:r>
           </w:p>
         </w:tc>
@@ -2818,7 +2858,7 @@
               <w:jc w:val="left"/>
             </w:pPr>
             <w:r>
-              <w:t>{{ tbl_fuel }}</w:t>
+              <w:t>{{ tbl_regen_kw }}</w:t>
             </w:r>
           </w:p>
         </w:tc>
@@ -2853,7 +2893,7 @@
                 <w:b/>
                 <w:sz w:val="22"/>
               </w:rPr>
-              <w:t>Combustion Air Blower</w:t>
+              <w:t>Burner Capacity</w:t>
             </w:r>
           </w:p>
         </w:tc>
@@ -2880,7 +2920,7 @@
               <w:jc w:val="left"/>
             </w:pPr>
             <w:r>
-              <w:t>{{ tbl_blower_size }}</w:t>
+              <w:t>{{ tbl_burner_kw }}</w:t>
             </w:r>
           </w:p>
         </w:tc>
@@ -2915,7 +2955,7 @@
                 <w:b/>
                 <w:sz w:val="22"/>
               </w:rPr>
-              <w:t>ID Fan (Flue Gas Suction)</w:t>
+              <w:t>Number of Burner Pairs</w:t>
             </w:r>
           </w:p>
         </w:tc>
@@ -2942,45 +2982,11 @@
               <w:jc w:val="left"/>
             </w:pPr>
             <w:r>
-              <w:t>{{ tbl_idfan_size }}</w:t>
+              <w:t>{{ tbl_pairs }}</w:t>
             </w:r>
           </w:p>
         </w:tc>
       </w:tr>
-    </w:tbl>
-    <w:p>
-      <w:pPr>
-        <w:pStyle w:val="Heading3"/>
-        <w:spacing w:after="80" w:before="200"/>
-      </w:pPr>
-      <w:r>
-        <w:rPr>
-          <w:rFonts w:ascii="Calibri" w:cs="Calibri" w:eastAsia="Calibri" w:hAnsi="Calibri"/>
-          <w:b/>
-          <w:bCs/>
-          <w:color w:val="1F2937"/>
-          <w:sz w:val="22"/>
-          <w:szCs w:val="22"/>
-        </w:rPr>
-        <w:t>MARKETING PERSON DETAILS</w:t>
-      </w:r>
-    </w:p>
-    <w:tbl>
-      <w:tblPr>
-        <w:tblW w:type="dxa" w:w="9360"/>
-        <w:tblBorders>
-          <w:top w:val="single" w:color="auto" w:sz="4"/>
-          <w:left w:val="single" w:color="auto" w:sz="4"/>
-          <w:bottom w:val="single" w:color="auto" w:sz="4"/>
-          <w:right w:val="single" w:color="auto" w:sz="4"/>
-          <w:insideH w:val="single" w:color="auto" w:sz="4"/>
-          <w:insideV w:val="single" w:color="auto" w:sz="4"/>
-        </w:tblBorders>
-      </w:tblPr>
-      <w:tblGrid>
-        <w:gridCol w:w="3120"/>
-        <w:gridCol w:w="6240"/>
-      </w:tblGrid>
       <w:tr>
         <w:tc>
           <w:tcPr>
@@ -3007,13 +3013,11 @@
             </w:pPr>
             <w:r>
               <w:rPr>
-                <w:rFonts w:ascii="Calibri" w:cs="Calibri" w:eastAsia="Calibri" w:hAnsi="Calibri"/>
+                <w:rFonts w:ascii="Calibri" w:hAnsi="Calibri"/>
                 <w:b/>
-                <w:bCs/>
                 <w:sz w:val="22"/>
-                <w:szCs w:val="22"/>
-              </w:rPr>
-              <w:t xml:space="preserve">Name</w:t>
+              </w:rPr>
+              <w:t>Fuel</w:t>
             </w:r>
           </w:p>
         </w:tc>
@@ -3040,7 +3044,7 @@
               <w:jc w:val="left"/>
             </w:pPr>
             <w:r>
-              <w:t>{{marketing_person}}</w:t>
+              <w:t>{{ tbl_fuel }}</w:t>
             </w:r>
           </w:p>
         </w:tc>
@@ -3071,13 +3075,11 @@
             </w:pPr>
             <w:r>
               <w:rPr>
-                <w:rFonts w:ascii="Calibri" w:cs="Calibri" w:eastAsia="Calibri" w:hAnsi="Calibri"/>
+                <w:rFonts w:ascii="Calibri" w:hAnsi="Calibri"/>
                 <w:b/>
-                <w:bCs/>
                 <w:sz w:val="22"/>
-                <w:szCs w:val="22"/>
-              </w:rPr>
-              <w:t xml:space="preserve">Email</w:t>
+              </w:rPr>
+              <w:t>Combustion Air Blower</w:t>
             </w:r>
           </w:p>
         </w:tc>
@@ -3104,7 +3106,7 @@
               <w:jc w:val="left"/>
             </w:pPr>
             <w:r>
-              <w:t>{{marketing_email}}</w:t>
+              <w:t>{{ tbl_blower_size }}</w:t>
             </w:r>
           </w:p>
         </w:tc>
@@ -3135,13 +3137,11 @@
             </w:pPr>
             <w:r>
               <w:rPr>
-                <w:rFonts w:ascii="Calibri" w:cs="Calibri" w:eastAsia="Calibri" w:hAnsi="Calibri"/>
+                <w:rFonts w:ascii="Calibri" w:hAnsi="Calibri"/>
                 <w:b/>
-                <w:bCs/>
                 <w:sz w:val="22"/>
-                <w:szCs w:val="22"/>
-              </w:rPr>
-              <w:t xml:space="preserve">Contact No.</w:t>
+              </w:rPr>
+              <w:t>ID Fan (Flue Gas Suction)</w:t>
             </w:r>
           </w:p>
         </w:tc>
@@ -3168,7 +3168,7 @@
               <w:jc w:val="left"/>
             </w:pPr>
             <w:r>
-              <w:t>{{marketing_phone}}</w:t>
+              <w:t>{{ tbl_idfan_size }}</w:t>
             </w:r>
           </w:p>
         </w:tc>

</xml_diff>

<commit_message>
feat(regen): sticky form (localStorage) + style TECHNICAL DATA table
- Regen costing form now remembers every input, textarea, select, and the
  kW/regenerator/fuel/currency selections in localStorage, restored on load
  (enquiry ref excluded so it stays freshly auto-generated). Added a
  'Clear saved data' button to start a fresh offer.
- TECHNICAL DATA table: light-blue label column + bold text for prominence.

Co-Authored-By: Claude Opus 4.8 <noreply@anthropic.com>
</commit_message>
<xml_diff>
--- a/Regen_Offer_Template.docx
+++ b/Regen_Offer_Template.docx
@@ -2811,7 +2811,6 @@
               <w:bottom w:val="single" w:color="BFBFBF" w:sz="4"/>
               <w:right w:val="single" w:color="BFBFBF" w:sz="4"/>
             </w:tcBorders>
-            <w:shd w:fill="F3F4F6" w:val="clear"/>
             <w:tcMar>
               <w:top w:type="dxa" w:w="100"/>
               <w:left w:type="dxa" w:w="140"/>
@@ -2819,6 +2818,7 @@
               <w:right w:type="dxa" w:w="140"/>
             </w:tcMar>
             <w:vAlign w:val="center"/>
+            <w:shd w:val="clear" w:color="auto" w:fill="DCE9F7"/>
           </w:tcPr>
           <w:p>
             <w:pPr>
@@ -2858,6 +2858,9 @@
               <w:jc w:val="left"/>
             </w:pPr>
             <w:r>
+              <w:rPr>
+                <w:b/>
+              </w:rPr>
               <w:t>{{ tbl_regen_kw }}</w:t>
             </w:r>
           </w:p>
@@ -2873,7 +2876,6 @@
               <w:bottom w:val="single" w:color="BFBFBF" w:sz="4"/>
               <w:right w:val="single" w:color="BFBFBF" w:sz="4"/>
             </w:tcBorders>
-            <w:shd w:fill="F3F4F6" w:val="clear"/>
             <w:tcMar>
               <w:top w:type="dxa" w:w="100"/>
               <w:left w:type="dxa" w:w="140"/>
@@ -2881,6 +2883,7 @@
               <w:right w:type="dxa" w:w="140"/>
             </w:tcMar>
             <w:vAlign w:val="center"/>
+            <w:shd w:val="clear" w:color="auto" w:fill="DCE9F7"/>
           </w:tcPr>
           <w:p>
             <w:pPr>
@@ -2920,6 +2923,9 @@
               <w:jc w:val="left"/>
             </w:pPr>
             <w:r>
+              <w:rPr>
+                <w:b/>
+              </w:rPr>
               <w:t>{{ tbl_burner_kw }}</w:t>
             </w:r>
           </w:p>
@@ -2935,7 +2941,6 @@
               <w:bottom w:val="single" w:color="BFBFBF" w:sz="4"/>
               <w:right w:val="single" w:color="BFBFBF" w:sz="4"/>
             </w:tcBorders>
-            <w:shd w:fill="F3F4F6" w:val="clear"/>
             <w:tcMar>
               <w:top w:type="dxa" w:w="100"/>
               <w:left w:type="dxa" w:w="140"/>
@@ -2943,6 +2948,7 @@
               <w:right w:type="dxa" w:w="140"/>
             </w:tcMar>
             <w:vAlign w:val="center"/>
+            <w:shd w:val="clear" w:color="auto" w:fill="DCE9F7"/>
           </w:tcPr>
           <w:p>
             <w:pPr>
@@ -2982,6 +2988,9 @@
               <w:jc w:val="left"/>
             </w:pPr>
             <w:r>
+              <w:rPr>
+                <w:b/>
+              </w:rPr>
               <w:t>{{ tbl_pairs }}</w:t>
             </w:r>
           </w:p>
@@ -2997,7 +3006,6 @@
               <w:bottom w:val="single" w:color="BFBFBF" w:sz="4"/>
               <w:right w:val="single" w:color="BFBFBF" w:sz="4"/>
             </w:tcBorders>
-            <w:shd w:fill="F3F4F6" w:val="clear"/>
             <w:tcMar>
               <w:top w:type="dxa" w:w="100"/>
               <w:left w:type="dxa" w:w="140"/>
@@ -3005,6 +3013,7 @@
               <w:right w:type="dxa" w:w="140"/>
             </w:tcMar>
             <w:vAlign w:val="center"/>
+            <w:shd w:val="clear" w:color="auto" w:fill="DCE9F7"/>
           </w:tcPr>
           <w:p>
             <w:pPr>
@@ -3044,6 +3053,9 @@
               <w:jc w:val="left"/>
             </w:pPr>
             <w:r>
+              <w:rPr>
+                <w:b/>
+              </w:rPr>
               <w:t>{{ tbl_fuel }}</w:t>
             </w:r>
           </w:p>
@@ -3059,7 +3071,6 @@
               <w:bottom w:val="single" w:color="BFBFBF" w:sz="4"/>
               <w:right w:val="single" w:color="BFBFBF" w:sz="4"/>
             </w:tcBorders>
-            <w:shd w:fill="F3F4F6" w:val="clear"/>
             <w:tcMar>
               <w:top w:type="dxa" w:w="100"/>
               <w:left w:type="dxa" w:w="140"/>
@@ -3067,6 +3078,7 @@
               <w:right w:type="dxa" w:w="140"/>
             </w:tcMar>
             <w:vAlign w:val="center"/>
+            <w:shd w:val="clear" w:color="auto" w:fill="DCE9F7"/>
           </w:tcPr>
           <w:p>
             <w:pPr>
@@ -3106,6 +3118,9 @@
               <w:jc w:val="left"/>
             </w:pPr>
             <w:r>
+              <w:rPr>
+                <w:b/>
+              </w:rPr>
               <w:t>{{ tbl_blower_size }}</w:t>
             </w:r>
           </w:p>
@@ -3121,7 +3136,6 @@
               <w:bottom w:val="single" w:color="BFBFBF" w:sz="4"/>
               <w:right w:val="single" w:color="BFBFBF" w:sz="4"/>
             </w:tcBorders>
-            <w:shd w:fill="F3F4F6" w:val="clear"/>
             <w:tcMar>
               <w:top w:type="dxa" w:w="100"/>
               <w:left w:type="dxa" w:w="140"/>
@@ -3129,6 +3143,7 @@
               <w:right w:type="dxa" w:w="140"/>
             </w:tcMar>
             <w:vAlign w:val="center"/>
+            <w:shd w:val="clear" w:color="auto" w:fill="DCE9F7"/>
           </w:tcPr>
           <w:p>
             <w:pPr>
@@ -3168,6 +3183,9 @@
               <w:jc w:val="left"/>
             </w:pPr>
             <w:r>
+              <w:rPr>
+                <w:b/>
+              </w:rPr>
               <w:t>{{ tbl_idfan_size }}</w:t>
             </w:r>
           </w:p>

</xml_diff>

<commit_message>
feat(regen): exclusion + T&C/pressure trims + standby(1W+1S)/VFD wording
- EXCLUSIONS: add 'All pipeline and electrical wiring for the regenerative
  burner system.'
- T&C: remove the 'Note' row (template, form editor, defaults).
- Gas train: drop the trailing pressure clause ('Pressure at top 2.1 bar.').
- Standby blower selected -> both blower section headings show '(1W+1S)'.
- VFD selected -> 'One VFD for the motor will be provided.' at the end of the
  combustion-air-blower paragraph (replaces the earlier combined sentence;
  standby is now conveyed by the heading).

Co-Authored-By: Claude Opus 4.8 <noreply@anthropic.com>
</commit_message>
<xml_diff>
--- a/Regen_Offer_Template.docx
+++ b/Regen_Offer_Template.docx
@@ -3488,7 +3488,6 @@
         <w:rPr>
           <w:rFonts w:ascii="Calibri" w:hAnsi="Calibri" w:cs="Calibri"/>
         </w:rPr>
-        <w:t xml:space="preserve"> </w:t>
       </w:r>
       <w:r>
         <w:rPr>
@@ -3496,7 +3495,6 @@
           <w:b/>
           <w:bCs/>
         </w:rPr>
-        <w:t>{{ pressure_clause }}</w:t>
       </w:r>
       <w:r>
         <w:rPr>
@@ -4090,7 +4088,15 @@
           <w:color w:val="1F2937"/>
           <w:sz w:val="30"/>
         </w:rPr>
-        <w:t xml:space="preserve">COMBUSTION AIR BLOWER </w:t>
+        <w:t>COMBUSTION AIR BLOWER</w:t>
+      </w:r>
+      <w:r>
+        <w:rPr>
+          <w:rFonts w:ascii="Calibri" w:hAnsi="Calibri"/>
+          <w:b/>
+          <w:sz w:val="30"/>
+        </w:rPr>
+        <w:t>{% if standby_blower %} (1W+1S){% endif %}</w:t>
       </w:r>
     </w:p>
     <w:p>
@@ -4215,7 +4221,7 @@
           <w:sz w:val="24"/>
           <w:szCs w:val="24"/>
         </w:rPr>
-        <w:t xml:space="preserve"> {% if standby_blower and vfd %}A standby blower and a Variable Frequency Drive (VFD) shall also be provided.{% elif standby_blower %}A standby blower shall also be provided.{% elif vfd %}A Variable Frequency Drive (VFD) shall also be provided.{% endif %}</w:t>
+        <w:t xml:space="preserve"> {% if vfd %}One VFD for the motor will be provided.{% endif %}</w:t>
       </w:r>
     </w:p>
     <w:p>
@@ -4234,7 +4240,15 @@
           <w:color w:val="1F2937"/>
           <w:sz w:val="30"/>
         </w:rPr>
-        <w:t xml:space="preserve">SUCTION BLOWER FOR FLUE GAS </w:t>
+        <w:t>SUCTION BLOWER FOR FLUE GAS</w:t>
+      </w:r>
+      <w:r>
+        <w:rPr>
+          <w:rFonts w:ascii="Calibri" w:hAnsi="Calibri"/>
+          <w:b/>
+          <w:sz w:val="30"/>
+        </w:rPr>
+        <w:t>{% if standby_blower %} (1W+1S){% endif %}</w:t>
       </w:r>
     </w:p>
     <w:p>
@@ -6066,6 +6080,25 @@
           <w:szCs w:val="24"/>
         </w:rPr>
         <w:t>:</w:t>
+      </w:r>
+    </w:p>
+    <w:p>
+      <w:pPr>
+        <w:pStyle w:val="NoSpacing"/>
+        <w:spacing w:before="60"/>
+        <w:jc w:val="both"/>
+        <w:rPr>
+          <w:rFonts w:ascii="Times New Roman" w:hAnsi="Times New Roman" w:cs="Times New Roman"/>
+          <w:sz w:val="24"/>
+          <w:szCs w:val="24"/>
+        </w:rPr>
+      </w:pPr>
+      <w:r>
+        <w:rPr>
+          <w:rFonts w:ascii="Calibri" w:hAnsi="Calibri"/>
+          <w:sz w:val="24"/>
+        </w:rPr>
+        <w:t>All pipeline and electrical wiring for the regenerative burner system.</w:t>
       </w:r>
     </w:p>
     <w:tbl>
@@ -14418,47 +14451,6 @@
                 <w:sz w:val="22"/>
               </w:rPr>
               <w:t>{{ tnc_regen_warranty }}</w:t>
-            </w:r>
-          </w:p>
-        </w:tc>
-      </w:tr>
-      <w:tr>
-        <w:tc>
-          <w:tcPr>
-            <w:vAlign w:val="top"/>
-            <w:shd w:val="clear" w:color="auto" w:fill="F3F4F6"/>
-            <w:tcW w:w="2600" w:type="dxa"/>
-          </w:tcPr>
-          <w:p>
-            <w:pPr>
-              <w:spacing w:before="40" w:after="40" w:line="240" w:lineRule="auto"/>
-              <w:jc w:val="left"/>
-            </w:pPr>
-            <w:r>
-              <w:rPr>
-                <w:b/>
-                <w:color w:val="1F2937"/>
-                <w:sz w:val="22"/>
-              </w:rPr>
-              <w:t>Note</w:t>
-            </w:r>
-          </w:p>
-        </w:tc>
-        <w:tc>
-          <w:tcPr>
-            <w:vAlign w:val="top"/>
-            <w:tcW w:w="7140" w:type="dxa"/>
-          </w:tcPr>
-          <w:p>
-            <w:pPr>
-              <w:spacing w:before="20" w:after="20" w:line="252" w:lineRule="auto"/>
-              <w:jc w:val="left"/>
-            </w:pPr>
-            <w:r>
-              <w:rPr>
-                <w:sz w:val="22"/>
-              </w:rPr>
-              <w:t>{{ tnc_regen_note }}</w:t>
             </w:r>
           </w:p>
         </w:tc>

</xml_diff>

<commit_message>
fix(regen T&C): rename 'Delivery & Erection Schedule' to 'Delivery Schedule'
Co-Authored-By: Claude Opus 4.8 <noreply@anthropic.com>
</commit_message>
<xml_diff>
--- a/Regen_Offer_Template.docx
+++ b/Regen_Offer_Template.docx
@@ -14144,11 +14144,9 @@
             </w:pPr>
             <w:r>
               <w:rPr>
-                <w:b/>
-                <w:color w:val="1F2937"/>
                 <w:sz w:val="22"/>
               </w:rPr>
-              <w:t>Delivery &amp; Erection Schedule</w:t>
+              <w:t>Delivery Schedule</w:t>
             </w:r>
           </w:p>
         </w:tc>

</xml_diff>

<commit_message>
fix(regen): remove GSTIN customer field and 'PART - A' heading
Co-Authored-By: Claude Opus 4.8 <noreply@anthropic.com>
</commit_message>
<xml_diff>
--- a/Regen_Offer_Template.docx
+++ b/Regen_Offer_Template.docx
@@ -817,58 +817,6 @@
             </a:graphic>
           </wp:inline>
         </w:drawing>
-      </w:r>
-    </w:p>
-    <w:p>
-      <w:pPr>
-        <w:spacing w:before="280" w:after="80"/>
-        <w:jc w:val="left"/>
-        <w:rPr>
-          <w:b/>
-          <w:bCs/>
-          <w:spacing w:val="-2"/>
-        </w:rPr>
-      </w:pPr>
-      <w:r>
-        <w:rPr>
-          <w:rFonts w:ascii="Calibri" w:hAnsi="Calibri"/>
-          <w:b/>
-          <w:bCs/>
-          <w:color w:val="1F2937"/>
-          <w:sz w:val="30"/>
-        </w:rPr>
-        <w:br w:type="page"/>
-      </w:r>
-      <w:r>
-        <w:rPr>
-          <w:rFonts w:ascii="Calibri" w:hAnsi="Calibri" w:cs="Calibri"/>
-          <w:b/>
-          <w:bCs/>
-          <w:color w:val="1F2937"/>
-          <w:sz w:val="30"/>
-        </w:rPr>
-        <w:t>PART</w:t>
-      </w:r>
-      <w:r>
-        <w:rPr>
-          <w:rFonts w:ascii="Calibri" w:hAnsi="Calibri" w:cs="Calibri"/>
-          <w:b/>
-          <w:bCs/>
-          <w:color w:val="1F2937"/>
-          <w:spacing w:val="-2"/>
-          <w:sz w:val="30"/>
-        </w:rPr>
-        <w:t xml:space="preserve"> </w:t>
-      </w:r>
-      <w:r>
-        <w:rPr>
-          <w:rFonts w:ascii="Calibri" w:hAnsi="Calibri" w:cs="Calibri"/>
-          <w:b/>
-          <w:bCs/>
-          <w:color w:val="1F2937"/>
-          <w:sz w:val="30"/>
-        </w:rPr>
-        <w:t>– A</w:t>
       </w:r>
     </w:p>
     <w:p>

</xml_diff>